<commit_message>
docs: change wording for section 1-2 for better readability
</commit_message>
<xml_diff>
--- a/deliverables/nny124-final-report.docx
+++ b/deliverables/nny124-final-report.docx
@@ -399,7 +399,31 @@
         <w:rPr>
           <w:color w:val="000000"/>
         </w:rPr>
-        <w:t>The origin of Mars's moons Phobos and Deimos remains unresolved. One proposed pathway is a close asteroid encounter with Mars. Differences in Martian gravity across the asteroid can stretch and break it apart. Some debris may escape, while some may remain gravitationally bound to Mars. This retained material could provide material for later orbital evolution and accretion into moons (Kegerreis et al., 2024).</w:t>
+        <w:t xml:space="preserve">The origin of Mars's moons Phobos and Deimos remains unresolved. </w:t>
+      </w:r>
+      <w:r>
+        <w:rPr>
+          <w:color w:val="000000"/>
+        </w:rPr>
+        <w:t>A</w:t>
+      </w:r>
+      <w:r>
+        <w:rPr>
+          <w:color w:val="000000"/>
+        </w:rPr>
+        <w:t xml:space="preserve"> close asteroid encounter with Mars</w:t>
+      </w:r>
+      <w:r>
+        <w:rPr>
+          <w:color w:val="000000"/>
+        </w:rPr>
+        <w:t xml:space="preserve"> is one suggested route</w:t>
+      </w:r>
+      <w:r>
+        <w:rPr>
+          <w:color w:val="000000"/>
+        </w:rPr>
+        <w:t>. Differences in Martian gravity across the asteroid can stretch and break it apart. Some debris may escape, while some may remain gravitationally bound to Mars. This retained material could provide material for later orbital evolution and accretion into moons (Kegerreis et al., 2024).</w:t>
       </w:r>
     </w:p>
     <w:p>
@@ -619,6 +643,7 @@
         <w:pStyle w:val="Heading2"/>
         <w:rPr>
           <w:rFonts w:ascii="Times New Roman" w:hAnsi="Times New Roman" w:cs="Times New Roman"/>
+          <w:color w:val="000000" w:themeColor="text1"/>
           <w:lang w:val="en-GB"/>
         </w:rPr>
       </w:pPr>
@@ -627,35 +652,12 @@
           <w:rFonts w:ascii="Times New Roman" w:eastAsia="Times New Roman" w:hAnsi="Times New Roman" w:cs="Times New Roman"/>
           <w:b/>
           <w:bCs/>
-          <w:color w:val="000000"/>
+          <w:color w:val="000000" w:themeColor="text1"/>
           <w:sz w:val="24"/>
           <w:szCs w:val="24"/>
           <w:lang w:val="en-GB"/>
         </w:rPr>
-        <w:t xml:space="preserve">2.1 </w:t>
-      </w:r>
-      <w:r>
-        <w:rPr>
-          <w:rFonts w:ascii="Times New Roman" w:eastAsia="Times New Roman" w:hAnsi="Times New Roman" w:cs="Times New Roman"/>
-          <w:b/>
-          <w:bCs/>
-          <w:sz w:val="24"/>
-          <w:szCs w:val="24"/>
-          <w:lang w:val="en-GB"/>
-        </w:rPr>
-        <w:t>Data</w:t>
-      </w:r>
-      <w:r>
-        <w:rPr>
-          <w:rFonts w:ascii="Times New Roman" w:eastAsia="Times New Roman" w:hAnsi="Times New Roman" w:cs="Times New Roman"/>
-          <w:b/>
-          <w:bCs/>
-          <w:color w:val="000000"/>
-          <w:sz w:val="24"/>
-          <w:szCs w:val="24"/>
-          <w:lang w:val="en-GB"/>
-        </w:rPr>
-        <w:t xml:space="preserve"> Archive, Inputs, and Post-Processing</w:t>
+        <w:t>2.1 Data Archive, Inputs, and Post-Processing</w:t>
       </w:r>
     </w:p>
     <w:p>
@@ -1761,6 +1763,11 @@
         <w:pStyle w:val="Heading2"/>
         <w:rPr>
           <w:rFonts w:ascii="Times New Roman" w:hAnsi="Times New Roman" w:cs="Times New Roman"/>
+          <w:b/>
+          <w:bCs/>
+          <w:color w:val="000000" w:themeColor="text1"/>
+          <w:sz w:val="24"/>
+          <w:szCs w:val="24"/>
           <w:lang w:val="en-GB"/>
         </w:rPr>
       </w:pPr>
@@ -1769,6 +1776,7 @@
           <w:rFonts w:ascii="Times New Roman" w:eastAsia="Times New Roman" w:hAnsi="Times New Roman" w:cs="Times New Roman"/>
           <w:b/>
           <w:bCs/>
+          <w:color w:val="000000" w:themeColor="text1"/>
           <w:sz w:val="24"/>
           <w:szCs w:val="24"/>
           <w:lang w:val="en-GB"/>
@@ -1778,6 +1786,11 @@
       <w:r>
         <w:rPr>
           <w:rFonts w:ascii="Times New Roman" w:hAnsi="Times New Roman" w:cs="Times New Roman"/>
+          <w:b/>
+          <w:bCs/>
+          <w:color w:val="000000" w:themeColor="text1"/>
+          <w:sz w:val="24"/>
+          <w:szCs w:val="24"/>
           <w:lang w:val="en-GB"/>
         </w:rPr>
         <w:t>ices and Rationale</w:t>
@@ -2243,7 +2256,7 @@
         <w:pStyle w:val="Heading2"/>
         <w:rPr>
           <w:rFonts w:ascii="Times New Roman" w:hAnsi="Times New Roman" w:cs="Times New Roman"/>
-          <w:color w:val="38761D"/>
+          <w:color w:val="000000" w:themeColor="text1"/>
           <w:lang w:val="en-GB"/>
         </w:rPr>
       </w:pPr>
@@ -2252,6 +2265,7 @@
           <w:rFonts w:ascii="Times New Roman" w:eastAsia="Times New Roman" w:hAnsi="Times New Roman" w:cs="Times New Roman"/>
           <w:b/>
           <w:bCs/>
+          <w:color w:val="000000" w:themeColor="text1"/>
           <w:sz w:val="24"/>
           <w:szCs w:val="24"/>
           <w:lang w:val="en-GB"/>
@@ -2379,109 +2393,6 @@
         <w:pStyle w:val="Heading2"/>
         <w:rPr>
           <w:rFonts w:ascii="Times New Roman" w:hAnsi="Times New Roman" w:cs="Times New Roman"/>
-          <w:color w:val="38761D"/>
-          <w:lang w:val="en-GB"/>
-        </w:rPr>
-      </w:pPr>
-      <w:r>
-        <w:rPr>
-          <w:rFonts w:ascii="Times New Roman" w:eastAsia="Times New Roman" w:hAnsi="Times New Roman" w:cs="Times New Roman"/>
-          <w:b/>
-          <w:bCs/>
-          <w:sz w:val="24"/>
-          <w:szCs w:val="24"/>
-          <w:lang w:val="en-GB"/>
-        </w:rPr>
-        <w:t>3.3 Model Performance and Screening Use</w:t>
-      </w:r>
-    </w:p>
-    <w:p>
-      <w:pPr>
-        <w:spacing w:before="240" w:after="240"/>
-      </w:pPr>
-      <w:r>
-        <w:t>The baseline model comparisons support the choice of Random Forest for continuous BMF prediction. Gradient Boosting achieves R² = 0.8840 and MAE = 0.0228, compared with R² = 0.8971, MAE = 0.0184 and RMSE = 0.0298 for Random Forest. Gradient Boosting therefore provides no improvement over Random Forest for this dataset.</w:t>
-      </w:r>
-    </w:p>
-    <w:p>
-      <w:pPr>
-        <w:spacing w:before="240" w:after="240"/>
-      </w:pPr>
-      <w:r>
-        <w:rPr>
-          <w:rFonts w:eastAsia="Gungsuh"/>
-        </w:rPr>
-        <w:t>Logistic Regression achieves grouped balanced accuracy of 0.849 and ROC AUC of 0.925 for the BMF ≥10% screening task, showing that the two retention classes are reasonably separable. The threshold is used only for prioritisation; continuous BMF remains the primary output.</w:t>
-      </w:r>
-    </w:p>
-    <w:p>
-      <w:pPr>
-        <w:spacing w:before="240" w:after="240"/>
-      </w:pPr>
-      <w:r>
-        <w:t>Tuning the Random Forest, by adjusting its model settings, produces no meaningful improvement, changing performance only from R² = 0.8971, MAE = 0.0184 and RMSE = 0.0298 to R² = 0.8983, MAE = 0.0186 and RMSE = 0.0297. In contrast, adding the physics-derived features calculated from the original simulation inputs (see Appendix A, Table A1) improves performance to R² = 0.9225, MAE = 0.0179 and RMSE = 0.0259, so this version is used as the main model. This is an overall average and does not mean that every individual prediction has the same error (see Appendix A for further details).</w:t>
-      </w:r>
-    </w:p>
-    <w:p>
-      <w:pPr>
-        <w:pStyle w:val="Heading2"/>
-        <w:rPr>
-          <w:rFonts w:ascii="Times New Roman" w:hAnsi="Times New Roman" w:cs="Times New Roman"/>
-          <w:lang w:val="en-GB"/>
-        </w:rPr>
-      </w:pPr>
-      <w:r>
-        <w:rPr>
-          <w:rFonts w:ascii="Times New Roman" w:eastAsia="Times New Roman" w:hAnsi="Times New Roman" w:cs="Times New Roman"/>
-          <w:b/>
-          <w:bCs/>
-          <w:sz w:val="24"/>
-          <w:szCs w:val="24"/>
-          <w:lang w:val="en-GB"/>
-        </w:rPr>
-        <w:t xml:space="preserve">3.4 Overall </w:t>
-      </w:r>
-      <w:r>
-        <w:rPr>
-          <w:rFonts w:ascii="Times New Roman" w:hAnsi="Times New Roman" w:cs="Times New Roman"/>
-          <w:lang w:val="en-GB"/>
-        </w:rPr>
-        <w:t>Physical Parameter Importance</w:t>
-      </w:r>
-    </w:p>
-    <w:p>
-      <w:pPr>
-        <w:spacing w:before="240" w:after="240"/>
-      </w:pPr>
-      <w:r>
-        <w:t xml:space="preserve">The input-removal test gives the clearest overall result for BMF. Each original parameter is removed together with derived features that contain the same information, and the resulting decrease in R² shows how much predictive information is lost. Removing periapsis causes the largest decrease, ΔR² = -0.504, making it the strongest overall input. Removing velocity gives ΔR² </w:t>
-      </w:r>
-      <w:r>
-        <w:lastRenderedPageBreak/>
-        <w:t>= -0.279, while removing spin gives ΔR² = -0.258. Asteroid mass has a smaller and less consistent overall effect. These values are overall averages and cannot simply be added together. They show how much the model depends on each input, not whether increasing that input raises or lowers BMF, or whether it directly causes the outcome. Overall, periapsis is strongest, followed by velocity and spin; this ranking can change locally.</w:t>
-      </w:r>
-    </w:p>
-    <w:p>
-      <w:pPr>
-        <w:spacing w:before="240" w:after="240"/>
-      </w:pPr>
-      <w:r>
-        <w:t xml:space="preserve">Fragmentation needs a separate answer. In the SPH data, very small periapsis is required for the most extreme fragmentation, but a close encounter does not guarantee strong breakup. Fragment count is also directly affected by </w:t>
-      </w:r>
-      <w:proofErr w:type="spellStart"/>
-      <w:r>
-        <w:t>FoF</w:t>
-      </w:r>
-      <w:proofErr w:type="spellEnd"/>
-      <w:r>
-        <w:t xml:space="preserve"> linking length. For that reason, this report does not give one simple global ranking for fragmentation. Periapsis defines where the strongest disruption can occur, while the actual fragment pattern depends on the full encounter and on how fragments are grouped during post-processing.</w:t>
-      </w:r>
-    </w:p>
-    <w:p>
-      <w:pPr>
-        <w:pStyle w:val="Heading2"/>
-        <w:rPr>
-          <w:rFonts w:ascii="Times New Roman" w:hAnsi="Times New Roman" w:cs="Times New Roman"/>
           <w:color w:val="000000" w:themeColor="text1"/>
           <w:lang w:val="en-GB"/>
         </w:rPr>
@@ -2496,12 +2407,135 @@
           <w:szCs w:val="24"/>
           <w:lang w:val="en-GB"/>
         </w:rPr>
+        <w:t>3.3 Model Performance and Screening Use</w:t>
+      </w:r>
+    </w:p>
+    <w:p>
+      <w:pPr>
+        <w:spacing w:before="240" w:after="240"/>
+      </w:pPr>
+      <w:r>
+        <w:t>The baseline model comparisons support the choice of Random Forest for continuous BMF prediction. Gradient Boosting achieves R² = 0.8840 and MAE = 0.0228, compared with R² = 0.8971, MAE = 0.0184 and RMSE = 0.0298 for Random Forest. Gradient Boosting therefore provides no improvement over Random Forest for this dataset.</w:t>
+      </w:r>
+    </w:p>
+    <w:p>
+      <w:pPr>
+        <w:spacing w:before="240" w:after="240"/>
+      </w:pPr>
+      <w:r>
+        <w:rPr>
+          <w:rFonts w:eastAsia="Gungsuh"/>
+        </w:rPr>
+        <w:t>Logistic Regression achieves grouped balanced accuracy of 0.849 and ROC AUC of 0.925 for the BMF ≥10% screening task, showing that the two retention classes are reasonably separable. The threshold is used only for prioritisation; continuous BMF remains the primary output.</w:t>
+      </w:r>
+    </w:p>
+    <w:p>
+      <w:pPr>
+        <w:spacing w:before="240" w:after="240"/>
+      </w:pPr>
+      <w:r>
+        <w:t>Tuning the Random Forest, by adjusting its model settings, produces no meaningful improvement, changing performance only from R² = 0.8971, MAE = 0.0184 and RMSE = 0.0298 to R² = 0.8983, MAE = 0.0186 and RMSE = 0.0297. In contrast, adding the physics-derived features calculated from the original simulation inputs (see Appendix A, Table A1) improves performance to R² = 0.9225, MAE = 0.0179 and RMSE = 0.0259, so this version is used as the main model. This is an overall average and does not mean that every individual prediction has the same error (see Appendix A for further details).</w:t>
+      </w:r>
+    </w:p>
+    <w:p>
+      <w:pPr>
+        <w:pStyle w:val="Heading2"/>
+        <w:rPr>
+          <w:rFonts w:ascii="Times New Roman" w:hAnsi="Times New Roman" w:cs="Times New Roman"/>
+          <w:b/>
+          <w:bCs/>
+          <w:color w:val="000000" w:themeColor="text1"/>
+          <w:sz w:val="24"/>
+          <w:szCs w:val="24"/>
+          <w:lang w:val="en-GB"/>
+        </w:rPr>
+      </w:pPr>
+      <w:r>
+        <w:rPr>
+          <w:rFonts w:ascii="Times New Roman" w:eastAsia="Times New Roman" w:hAnsi="Times New Roman" w:cs="Times New Roman"/>
+          <w:b/>
+          <w:bCs/>
+          <w:color w:val="000000" w:themeColor="text1"/>
+          <w:sz w:val="24"/>
+          <w:szCs w:val="24"/>
+          <w:lang w:val="en-GB"/>
+        </w:rPr>
+        <w:t xml:space="preserve">3.4 Overall </w:t>
+      </w:r>
+      <w:r>
+        <w:rPr>
+          <w:rFonts w:ascii="Times New Roman" w:hAnsi="Times New Roman" w:cs="Times New Roman"/>
+          <w:b/>
+          <w:bCs/>
+          <w:color w:val="000000" w:themeColor="text1"/>
+          <w:sz w:val="24"/>
+          <w:szCs w:val="24"/>
+          <w:lang w:val="en-GB"/>
+        </w:rPr>
+        <w:t>Physical Parameter Importance</w:t>
+      </w:r>
+    </w:p>
+    <w:p>
+      <w:pPr>
+        <w:spacing w:before="240" w:after="240"/>
+      </w:pPr>
+      <w:r>
+        <w:t xml:space="preserve">The input-removal test gives the clearest overall result for BMF. Each original parameter is removed together with derived features that contain the same information, and the resulting decrease in R² shows how much predictive information is lost. Removing periapsis causes the largest decrease, ΔR² = -0.504, making it the strongest overall input. Removing velocity gives ΔR² </w:t>
+      </w:r>
+      <w:r>
+        <w:lastRenderedPageBreak/>
+        <w:t>= -0.279, while removing spin gives ΔR² = -0.258. Asteroid mass has a smaller and less consistent overall effect. These values are overall averages and cannot simply be added together. They show how much the model depends on each input, not whether increasing that input raises or lowers BMF, or whether it directly causes the outcome. Overall, periapsis is strongest, followed by velocity and spin; this ranking can change locally.</w:t>
+      </w:r>
+    </w:p>
+    <w:p>
+      <w:pPr>
+        <w:spacing w:before="240" w:after="240"/>
+      </w:pPr>
+      <w:r>
+        <w:t xml:space="preserve">Fragmentation needs a separate answer. In the SPH data, very small periapsis is required for the most extreme fragmentation, but a close encounter does not guarantee strong breakup. Fragment count is also directly affected by </w:t>
+      </w:r>
+      <w:proofErr w:type="spellStart"/>
+      <w:r>
+        <w:t>FoF</w:t>
+      </w:r>
+      <w:proofErr w:type="spellEnd"/>
+      <w:r>
+        <w:t xml:space="preserve"> linking length. For that reason, this report does not give one simple global ranking for fragmentation. Periapsis defines where the strongest disruption can occur, while the actual fragment pattern depends on the full encounter and on how fragments are grouped during post-processing.</w:t>
+      </w:r>
+    </w:p>
+    <w:p>
+      <w:pPr>
+        <w:pStyle w:val="Heading2"/>
+        <w:rPr>
+          <w:rFonts w:ascii="Times New Roman" w:hAnsi="Times New Roman" w:cs="Times New Roman"/>
+          <w:b/>
+          <w:bCs/>
+          <w:color w:val="000000" w:themeColor="text1"/>
+          <w:sz w:val="24"/>
+          <w:szCs w:val="24"/>
+          <w:lang w:val="en-GB"/>
+        </w:rPr>
+      </w:pPr>
+      <w:r>
+        <w:rPr>
+          <w:rFonts w:ascii="Times New Roman" w:eastAsia="Times New Roman" w:hAnsi="Times New Roman" w:cs="Times New Roman"/>
+          <w:b/>
+          <w:bCs/>
+          <w:color w:val="000000" w:themeColor="text1"/>
+          <w:sz w:val="24"/>
+          <w:szCs w:val="24"/>
+          <w:lang w:val="en-GB"/>
+        </w:rPr>
         <w:t xml:space="preserve">3.5 </w:t>
       </w:r>
       <w:r>
         <w:rPr>
           <w:rFonts w:ascii="Times New Roman" w:hAnsi="Times New Roman" w:cs="Times New Roman"/>
+          <w:b/>
+          <w:bCs/>
           <w:color w:val="000000" w:themeColor="text1"/>
+          <w:sz w:val="24"/>
+          <w:szCs w:val="24"/>
           <w:lang w:val="en-GB"/>
         </w:rPr>
         <w:t>Checking Physical Trends and Condition-Dependent Effects</w:t>
@@ -2602,15 +2636,7 @@
         <w:spacing w:before="240" w:after="240"/>
       </w:pPr>
       <w:r>
-        <w:t xml:space="preserve">The mass plot has much weaker support. Only about two asteroid-mass values have exact SPH cases where all the other chosen conditions are identical. The available higher-mass SPH cases are also concentrated at low periapsis and low velocity, so there is not enough matched data to establish a reliable mass trend. The sharp increase in the Random Forest curve should therefore be treated as model-dependent rather than as a physical threshold. The spin-period panel is nearly flat for the displayed z-axis case, showing that changing spin period has little effect under this </w:t>
-      </w:r>
-      <w:proofErr w:type="gramStart"/>
-      <w:r>
-        <w:t>particular setup</w:t>
-      </w:r>
-      <w:proofErr w:type="gramEnd"/>
-      <w:r>
-        <w:t>. This does not contradict the overall importance of spin in Section 3.4: it instead shows that an input that is important across the full dataset can have only a small effect under one specific set of encounter conditions.</w:t>
+        <w:t>The mass plot has much weaker support. Only about two asteroid-mass values have exact SPH cases where all the other chosen conditions are identical. The available higher-mass SPH cases are also concentrated at low periapsis and low velocity, so there is not enough matched data to establish a reliable mass trend. The sharp increase in the Random Forest curve should therefore be treated as model-dependent rather than as a physical threshold. The spin-period panel is nearly flat for the displayed z-axis case, showing that changing spin period has little effect under this particular setup. This does not contradict the overall importance of spin in Section 3.4: it instead shows that an input that is important across the full dataset can have only a small effect under one specific set of encounter conditions.</w:t>
       </w:r>
     </w:p>
     <w:p>
@@ -4526,12 +4552,22 @@
         <w:pStyle w:val="Heading1"/>
         <w:rPr>
           <w:rFonts w:ascii="Times New Roman" w:hAnsi="Times New Roman" w:cs="Times New Roman"/>
+          <w:b/>
+          <w:bCs/>
+          <w:color w:val="000000" w:themeColor="text1"/>
+          <w:sz w:val="28"/>
+          <w:szCs w:val="28"/>
           <w:lang w:val="en-GB"/>
         </w:rPr>
       </w:pPr>
       <w:r>
         <w:rPr>
           <w:rFonts w:ascii="Times New Roman" w:hAnsi="Times New Roman" w:cs="Times New Roman"/>
+          <w:b/>
+          <w:bCs/>
+          <w:color w:val="000000" w:themeColor="text1"/>
+          <w:sz w:val="28"/>
+          <w:szCs w:val="28"/>
           <w:lang w:val="en-GB"/>
         </w:rPr>
         <w:lastRenderedPageBreak/>
@@ -4542,6 +4578,7 @@
           <w:rFonts w:ascii="Times New Roman" w:eastAsia="Times New Roman" w:hAnsi="Times New Roman" w:cs="Times New Roman"/>
           <w:b/>
           <w:bCs/>
+          <w:color w:val="000000" w:themeColor="text1"/>
           <w:sz w:val="28"/>
           <w:szCs w:val="28"/>
           <w:lang w:val="en-GB"/>
@@ -5367,15 +5404,13 @@
         </w:rPr>
         <w:t xml:space="preserve">Figure A1. Change in held-out R² when different derived features are added. Using the setup-derived features together improves R² by about +0.023. Individual features can help, add little new information, or reduce performance. The experiment that uses an outcome-derived feature is not </w:t>
       </w:r>
-      <w:proofErr w:type="gramStart"/>
       <w:r>
         <w:rPr>
           <w:i/>
           <w:iCs/>
         </w:rPr>
-        <w:t>the  model</w:t>
-      </w:r>
-      <w:proofErr w:type="gramEnd"/>
+        <w:t>the model</w:t>
+      </w:r>
       <w:r>
         <w:rPr>
           <w:i/>
@@ -7060,6 +7095,11 @@
         <w:pStyle w:val="Heading1"/>
         <w:rPr>
           <w:rFonts w:ascii="Times New Roman" w:hAnsi="Times New Roman" w:cs="Times New Roman"/>
+          <w:b/>
+          <w:bCs/>
+          <w:color w:val="000000" w:themeColor="text1"/>
+          <w:sz w:val="28"/>
+          <w:szCs w:val="28"/>
           <w:lang w:val="en-GB"/>
         </w:rPr>
       </w:pPr>
@@ -7068,6 +7108,11 @@
       <w:r>
         <w:rPr>
           <w:rFonts w:ascii="Times New Roman" w:hAnsi="Times New Roman" w:cs="Times New Roman"/>
+          <w:b/>
+          <w:bCs/>
+          <w:color w:val="000000" w:themeColor="text1"/>
+          <w:sz w:val="28"/>
+          <w:szCs w:val="28"/>
           <w:lang w:val="en-GB"/>
         </w:rPr>
         <w:lastRenderedPageBreak/>
@@ -7203,6 +7248,11 @@
         <w:spacing w:after="0"/>
         <w:rPr>
           <w:rFonts w:ascii="Times New Roman" w:hAnsi="Times New Roman" w:cs="Times New Roman"/>
+          <w:b/>
+          <w:bCs/>
+          <w:color w:val="000000" w:themeColor="text1"/>
+          <w:sz w:val="28"/>
+          <w:szCs w:val="28"/>
           <w:lang w:val="en-GB"/>
         </w:rPr>
       </w:pPr>
@@ -7211,6 +7261,11 @@
       <w:r>
         <w:rPr>
           <w:rFonts w:ascii="Times New Roman" w:hAnsi="Times New Roman" w:cs="Times New Roman"/>
+          <w:b/>
+          <w:bCs/>
+          <w:color w:val="000000" w:themeColor="text1"/>
+          <w:sz w:val="28"/>
+          <w:szCs w:val="28"/>
           <w:lang w:val="en-GB"/>
         </w:rPr>
         <w:lastRenderedPageBreak/>

</xml_diff>

<commit_message>
docs: change woring in intro section
</commit_message>
<xml_diff>
--- a/deliverables/nny124-final-report.docx
+++ b/deliverables/nny124-final-report.docx
@@ -395,35 +395,16 @@
       </w:r>
     </w:p>
     <w:p>
-      <w:r>
-        <w:rPr>
-          <w:color w:val="000000"/>
-        </w:rPr>
-        <w:t xml:space="preserve">The origin of Mars's moons Phobos and Deimos remains unresolved. </w:t>
-      </w:r>
-      <w:r>
-        <w:rPr>
-          <w:color w:val="000000"/>
-        </w:rPr>
-        <w:t>A</w:t>
-      </w:r>
-      <w:r>
-        <w:rPr>
-          <w:color w:val="000000"/>
-        </w:rPr>
-        <w:t xml:space="preserve"> close asteroid encounter with Mars</w:t>
-      </w:r>
-      <w:r>
-        <w:rPr>
-          <w:color w:val="000000"/>
-        </w:rPr>
-        <w:t xml:space="preserve"> is one suggested route</w:t>
-      </w:r>
-      <w:r>
-        <w:rPr>
-          <w:color w:val="000000"/>
-        </w:rPr>
-        <w:t>. Differences in Martian gravity across the asteroid can stretch and break it apart. Some debris may escape, while some may remain gravitationally bound to Mars. This retained material could provide material for later orbital evolution and accretion into moons (Kegerreis et al., 2024).</w:t>
+      <w:pPr>
+        <w:rPr>
+          <w:color w:val="000000"/>
+        </w:rPr>
+      </w:pPr>
+      <w:r>
+        <w:rPr>
+          <w:color w:val="000000"/>
+        </w:rPr>
+        <w:t>The origin of Phobos and Deimos, the moons of Mars, is still a mystery. A close asteroid contact with Mars is one suggested route. The asteroid may be stretched or broken apart by variations in Martian gravity. While some debris might escape, others might stay gravitationally attached to Mars. Later orbital evolution and accretion into moons may benefit from this retained material (Kegerreis et al., 2024).</w:t>
       </w:r>
     </w:p>
     <w:p>
@@ -451,7 +432,13 @@
         <w:rPr>
           <w:color w:val="000000"/>
         </w:rPr>
-        <w:t>The report addresses three research questions: (1) how do orbital and physical parameters affect disruption and bound retention; (2) which inputs matter most for fragment formation and retained debris; and (3) can machine-learning models predict outcomes within the sampled data while showing when a prediction should or should not be trusted?</w:t>
+        <w:t xml:space="preserve">Three research questions are addressed in the report: </w:t>
+      </w:r>
+      <w:r>
+        <w:rPr>
+          <w:color w:val="000000"/>
+        </w:rPr>
+        <w:t>(1) how do orbital and physical parameters affect disruption and bound retention; (2) which inputs matter most for fragment formation and retained debris; and (3) can machine-learning models predict outcomes within the sampled data while showing when a prediction should or should not be trusted?</w:t>
       </w:r>
     </w:p>
     <w:p>
@@ -486,7 +473,25 @@
     </w:p>
     <w:p>
       <w:r>
-        <w:t xml:space="preserve">The main contribution is combining physical interpretation with clear checks for when an ML prediction is reliable. The workflow converts particle-level SPH outputs into one set of results for each simulation, tests the model on physical simulations that were not used for training, compares controlled and matched cases, measures how much similar SPH data exist nearby, and uses these checks to recommend whether a new SPH run is needed. </w:t>
+        <w:t xml:space="preserve">The </w:t>
+      </w:r>
+      <w:r>
+        <w:t>primary</w:t>
+      </w:r>
+      <w:r>
+        <w:t xml:space="preserve"> contribution is </w:t>
+      </w:r>
+      <w:r>
+        <w:t xml:space="preserve">the </w:t>
+      </w:r>
+      <w:r>
+        <w:t>integration</w:t>
+      </w:r>
+      <w:r>
+        <w:t xml:space="preserve"> of</w:t>
+      </w:r>
+      <w:r>
+        <w:t xml:space="preserve"> physical interpretation with clear checks for when an ML prediction is reliable. The workflow converts particle-level SPH outputs into one set of results for each simulation, tests the model on physical simulations that were not used for training, compares controlled and matched cases, measures how much similar SPH data exist nearby, and uses these checks to recommend whether a new SPH run is needed. </w:t>
       </w:r>
     </w:p>
     <w:p>
@@ -528,93 +533,136 @@
       </w:r>
     </w:p>
     <w:p>
-      <w:r>
-        <w:rPr>
-          <w:color w:val="000000"/>
-        </w:rPr>
-        <w:t xml:space="preserve">Several explanations have been proposed for Phobos and Deimos. Giant-impact simulations can produce debris disks around Mars (Citron et al., 2015; Canup &amp; Salmon, 2018). Temporary inner moons may affect how material in the outer disk accretes (Rosenblatt et al., 2016), and orbital studies have suggested that Phobos and Deimos may come from a disrupted common parent body (Bagheri et al., 2021). </w:t>
-      </w:r>
-      <w:r>
-        <w:t xml:space="preserve">However, the processes that produce and retain debris around Mars are still not fully explored. Kegerreis et al. (2024) therefore provides an important alternative formation pathway by showing that a close asteroid encounter with Mars can tidally disrupt the asteroid while capturing part of its debris. This directly motivates the present project. </w:t>
-      </w:r>
-      <w:r>
-        <w:rPr>
-          <w:color w:val="000000"/>
-        </w:rPr>
-        <w:t>Their simulations show meaningful amounts of bound debris across different periapsis, velocity, mass and spin settings, but every new setup still requires another simulation. This project asks whether the existing archive can be used to train an ML model that screens new setups before SPH is run.</w:t>
-      </w:r>
-    </w:p>
-    <w:p>
-      <w:r>
-        <w:t xml:space="preserve">Because these tidal-disruption cases are simulated using SPH, it is also important to understand how the simulation data are produced and processed. </w:t>
-      </w:r>
-      <w:r>
-        <w:rPr>
-          <w:color w:val="000000"/>
-        </w:rPr>
-        <w:t xml:space="preserve">SPH is a mesh-free </w:t>
+      <w:pPr>
+        <w:rPr>
+          <w:color w:val="000000"/>
+        </w:rPr>
+      </w:pPr>
+      <w:r>
+        <w:rPr>
+          <w:color w:val="000000"/>
+        </w:rPr>
+        <w:t xml:space="preserve">Phobos and Deimos have been explained in </w:t>
+      </w:r>
+      <w:proofErr w:type="gramStart"/>
+      <w:r>
+        <w:rPr>
+          <w:color w:val="000000"/>
+        </w:rPr>
+        <w:t>a number of</w:t>
+      </w:r>
+      <w:proofErr w:type="gramEnd"/>
+      <w:r>
+        <w:rPr>
+          <w:color w:val="000000"/>
+        </w:rPr>
+        <w:t xml:space="preserve"> ways. Debris disks surrounding Mars can be created by giant-impact simulations (Citron et al., 2015; Canup &amp; Salmon, 2018). Phobos and Deimos may originate from a disrupted shared parent body, according to orbital studies, and temporary inner moons may influence how material in the outer disk accretes (Rosenblatt et al., 2016; Bagheri et al., 2021). Nevertheless, little is known about the mechanisms that create and hold onto debris in the vicinity of Mars. Therefore, by demonstrating that a close asteroid contact with Mars can tidally destroy the asteroid while trapping part of its debris, Kegerreis et al. (2024) offer a significant alternative creation pathway. The current project is directly motivated by this. Although their simulations demonstrate significant amounts of bound debris across various periapsis, velocity, mass, and spin settings, each new configuration necessitates a new simulation. This study investigates whether an ML model that screens new configurations prior to SPH execution can be trained using the current archive.</w:t>
+      </w:r>
+    </w:p>
+    <w:p>
+      <w:r>
+        <w:t xml:space="preserve">Since SPH is used to simulate these tidal-disruption scenarios, it is also crucial to comprehend how the simulation data are generated and handled. Because SPH is a mesh-free </w:t>
       </w:r>
       <w:proofErr w:type="spellStart"/>
       <w:r>
-        <w:rPr>
-          <w:color w:val="000000"/>
-        </w:rPr>
         <w:t>Lagrangian</w:t>
       </w:r>
       <w:proofErr w:type="spellEnd"/>
       <w:r>
-        <w:rPr>
-          <w:color w:val="000000"/>
-        </w:rPr>
-        <w:t xml:space="preserve"> method, meaning that computational particles move with the material they represent (Price, 2012). This makes it suitable for large deformation and fragmentation. However, the measured fragments also depend on how the simulation is processed afterwards. Here, post-processing </w:t>
-      </w:r>
-      <w:r>
-        <w:t>algorithms such as</w:t>
-      </w:r>
-      <w:r>
-        <w:rPr>
-          <w:color w:val="000000"/>
-        </w:rPr>
-        <w:t xml:space="preserve"> friends-of-friends (</w:t>
+        <w:t xml:space="preserve"> approach, computational particles follow the motion of the material they represent (Price, 2012). It is therefore appropriate for significant deformation and fragmentation. However, the subsequent processing of the simulation also affects the measured pieces. Here, post-processing techniques like friends-of-friends (</w:t>
       </w:r>
       <w:proofErr w:type="spellStart"/>
       <w:r>
-        <w:rPr>
-          <w:color w:val="000000"/>
-        </w:rPr>
         <w:t>FoF</w:t>
       </w:r>
       <w:proofErr w:type="spellEnd"/>
       <w:r>
-        <w:rPr>
-          <w:color w:val="000000"/>
-        </w:rPr>
-        <w:t>) groups nearby particles using a chosen linking length, so the reported number and mass of fragments depend partly on that processing choice as well as on the encounter physics (More et al., 2011). Bound mass is treated separately: a fragment is classed as bound or unbound using its orbital energy relative to Mars.</w:t>
-      </w:r>
-    </w:p>
-    <w:p>
-      <w:r>
-        <w:t>Post-processing converts the particle-level SPH outputs into scalar outcomes, producing a small tabular dataset suitable for ML. This makes the problem suitable for ML, particularly tree-based models, which work well with small, nonlinear tabular datasets (</w:t>
+        <w:t xml:space="preserve">) use a selected connecting length to group </w:t>
+      </w:r>
+      <w:r>
+        <w:t>neighbouring</w:t>
+      </w:r>
+      <w:r>
+        <w:t xml:space="preserve"> particles; therefore, the reported number and mass of fragments depend in part on the encounter physics as well as that processing option (More et al., 2011). Bound mass is handled differently: a fragment's orbital energy in relation to Mars determines whether it is bound or unbound.</w:t>
+      </w:r>
+    </w:p>
+    <w:p>
+      <w:pPr>
+        <w:pStyle w:val="Heading1"/>
+        <w:rPr>
+          <w:rFonts w:ascii="Times New Roman" w:eastAsia="Times New Roman" w:hAnsi="Times New Roman" w:cs="Times New Roman"/>
+          <w:color w:val="auto"/>
+          <w:kern w:val="0"/>
+          <w:sz w:val="24"/>
+          <w:szCs w:val="24"/>
+          <w:lang w:val="en-GB"/>
+          <w14:ligatures w14:val="none"/>
+        </w:rPr>
+      </w:pPr>
+      <w:r>
+        <w:rPr>
+          <w:rFonts w:ascii="Times New Roman" w:eastAsia="Times New Roman" w:hAnsi="Times New Roman" w:cs="Times New Roman"/>
+          <w:color w:val="auto"/>
+          <w:kern w:val="0"/>
+          <w:sz w:val="24"/>
+          <w:szCs w:val="24"/>
+          <w:lang w:val="en-GB"/>
+          <w14:ligatures w14:val="none"/>
+        </w:rPr>
+        <w:lastRenderedPageBreak/>
+        <w:t>The particle-level SPH outputs are transformed into scalar outcomes through post-processing, creating a compact tabular dataset appropriate for machine learning. Because tree-based models perform well with tiny, nonlinear tabular datasets, this makes the problem a good fit for machine learning (ML) (</w:t>
       </w:r>
       <w:proofErr w:type="spellStart"/>
       <w:r>
+        <w:rPr>
+          <w:rFonts w:ascii="Times New Roman" w:eastAsia="Times New Roman" w:hAnsi="Times New Roman" w:cs="Times New Roman"/>
+          <w:color w:val="auto"/>
+          <w:kern w:val="0"/>
+          <w:sz w:val="24"/>
+          <w:szCs w:val="24"/>
+          <w:lang w:val="en-GB"/>
+          <w14:ligatures w14:val="none"/>
+        </w:rPr>
         <w:t>Grinsztajn</w:t>
       </w:r>
       <w:proofErr w:type="spellEnd"/>
       <w:r>
-        <w:t xml:space="preserve"> et al., 2022). Tree-based ML surrogate models have also previously been used to predict outcomes from related SPH </w:t>
-      </w:r>
-      <w:r>
-        <w:lastRenderedPageBreak/>
-        <w:t>collision and giant-impact simulations (</w:t>
+        <w:rPr>
+          <w:rFonts w:ascii="Times New Roman" w:eastAsia="Times New Roman" w:hAnsi="Times New Roman" w:cs="Times New Roman"/>
+          <w:color w:val="auto"/>
+          <w:kern w:val="0"/>
+          <w:sz w:val="24"/>
+          <w:szCs w:val="24"/>
+          <w:lang w:val="en-GB"/>
+          <w14:ligatures w14:val="none"/>
+        </w:rPr>
+        <w:t xml:space="preserve"> et al., 2022). In the past, outcomes from comparable SPH collision and giant-impact simulations have also been predicted using tree-based ML surrogate models (</w:t>
       </w:r>
       <w:proofErr w:type="spellStart"/>
       <w:r>
+        <w:rPr>
+          <w:rFonts w:ascii="Times New Roman" w:eastAsia="Times New Roman" w:hAnsi="Times New Roman" w:cs="Times New Roman"/>
+          <w:color w:val="auto"/>
+          <w:kern w:val="0"/>
+          <w:sz w:val="24"/>
+          <w:szCs w:val="24"/>
+          <w:lang w:val="en-GB"/>
+          <w14:ligatures w14:val="none"/>
+        </w:rPr>
         <w:t>Cambioni</w:t>
       </w:r>
       <w:proofErr w:type="spellEnd"/>
       <w:r>
-        <w:t xml:space="preserve"> et al., 2019; Timpe et al., 2020). However, their use for asteroid tidal-disruption encounters is still limited. </w:t>
+        <w:rPr>
+          <w:rFonts w:ascii="Times New Roman" w:eastAsia="Times New Roman" w:hAnsi="Times New Roman" w:cs="Times New Roman"/>
+          <w:color w:val="auto"/>
+          <w:kern w:val="0"/>
+          <w:sz w:val="24"/>
+          <w:szCs w:val="24"/>
+          <w:lang w:val="en-GB"/>
+          <w14:ligatures w14:val="none"/>
+        </w:rPr>
+        <w:t xml:space="preserve"> et al., 2019; Timpe et al., 2020). They are still not widely used for asteroid tidal-disruption encounters, though.</w:t>
       </w:r>
     </w:p>
     <w:p>

</xml_diff>

<commit_message>
docs: revise section 2 method
</commit_message>
<xml_diff>
--- a/deliverables/nny124-final-report.docx
+++ b/deliverables/nny124-final-report.docx
@@ -544,14 +544,12 @@
         </w:rPr>
         <w:t xml:space="preserve">Phobos and Deimos have been explained in </w:t>
       </w:r>
-      <w:proofErr w:type="gramStart"/>
-      <w:r>
-        <w:rPr>
-          <w:color w:val="000000"/>
-        </w:rPr>
-        <w:t>a number of</w:t>
-      </w:r>
-      <w:proofErr w:type="gramEnd"/>
+      <w:r>
+        <w:rPr>
+          <w:color w:val="000000"/>
+        </w:rPr>
+        <w:t>several</w:t>
+      </w:r>
       <w:r>
         <w:rPr>
           <w:color w:val="000000"/>
@@ -710,15 +708,27 @@
     </w:p>
     <w:p>
       <w:r>
-        <w:t xml:space="preserve">The archive contains 489 SPH outputs totalling about 218 GB of HDF5 particle data. Post-processing converts these particle outputs into fragment and </w:t>
-      </w:r>
-      <w:proofErr w:type="gramStart"/>
-      <w:r>
-        <w:t>bound</w:t>
-      </w:r>
-      <w:proofErr w:type="gramEnd"/>
-      <w:r>
-        <w:t xml:space="preserve">-mass measurements. The primary target is bound mass fraction (BMF), the fraction of the original asteroid mass gravitationally bound to Mars after the encounter. The simulation setup gives the asteroid and input parameter values, while post-processing converts the particle data into fragments and then calculates bound-mass results. The main outcome used in this project is the bound mass fraction, represented by </w:t>
+        <w:t xml:space="preserve">489 SPH outputs </w:t>
+      </w:r>
+      <w:proofErr w:type="spellStart"/>
+      <w:r>
+        <w:t>totaling</w:t>
+      </w:r>
+      <w:proofErr w:type="spellEnd"/>
+      <w:r>
+        <w:t xml:space="preserve"> over 218 GB of HDF5 particle data are included in the collection. These particle outputs are transformed into fragment and bound-mass measurements through post-processing. bonded mass fraction (BMF), or the portion of the initial asteroid mass that is gravitationally bonded to Mars following the contact, is the main aim. The asteroid and input parameter values are provided by the simulation </w:t>
+      </w:r>
+      <w:r>
+        <w:t>setup and</w:t>
+      </w:r>
+      <w:r>
+        <w:t xml:space="preserve"> bound-mass findings are computed after post-processing breaks up the particle data.</w:t>
+      </w:r>
+      <w:r>
+        <w:t xml:space="preserve"> </w:t>
+      </w:r>
+      <w:r>
+        <w:t xml:space="preserve">The main outcome used in this project is the bound mass fraction, represented by </w:t>
       </w:r>
       <w:proofErr w:type="spellStart"/>
       <w:r>
@@ -1738,14 +1748,12 @@
         </w:rPr>
         <w:t xml:space="preserve">. The group's </w:t>
       </w:r>
-      <w:proofErr w:type="spellStart"/>
-      <w:r>
-        <w:rPr>
-          <w:color w:val="000000"/>
-        </w:rPr>
-        <w:t>center</w:t>
-      </w:r>
-      <w:proofErr w:type="spellEnd"/>
+      <w:r>
+        <w:rPr>
+          <w:color w:val="000000"/>
+        </w:rPr>
+        <w:t>centre</w:t>
+      </w:r>
       <w:r>
         <w:rPr>
           <w:color w:val="000000"/>
@@ -1849,18 +1857,47 @@
         <w:spacing w:before="240" w:after="240"/>
       </w:pPr>
       <w:r>
-        <w:t>The main ML task is to predict the BMF value, or what percentage of the original asteroid mass is likely to remain bound to Mars. This keeps the difference between small, medium, and large retained fractions. In addition, a 10% BMF threshold is chosen as a simple screening level for higher-retention cases, motivated by Kegerreis et al. (2024), who found that “tens of percent of an unbound asteroid’s mass can be captured and survive beyond collisional timescales”. The 10% threshold is therefore used only to categorise and prioritise cases, not as an actual physical threshold for moon formation.</w:t>
+        <w:t xml:space="preserve">The main ML task is to predict the BMF value, </w:t>
+      </w:r>
+      <w:r>
+        <w:t>or the proportion of the initial asteroid mass that is expected to stay bound to Mars, is the primary machine learning job. This maintains the distinction between retained fractions that are tiny, medium, and big. Furthermore, because Kegerreis et al. (2024) discovered that "tens of percent of an unbound asteroid's mass can be captured and survive beyond collisional timescales," a 10% BMF threshold is used as a straightforward screening criterion for higher-retention instances. Therefore, the 10% barrier is not a real physical limitation for moon formation</w:t>
+      </w:r>
+      <w:r>
+        <w:t>,</w:t>
+      </w:r>
+      <w:r>
+        <w:t xml:space="preserve"> rather it is only utilized to classify and prioritize occurrences.</w:t>
+      </w:r>
+      <w:r>
+        <w:t xml:space="preserve"> </w:t>
       </w:r>
     </w:p>
     <w:p>
       <w:pPr>
         <w:spacing w:before="240" w:after="240"/>
-      </w:pPr>
-      <w:r>
         <w:rPr>
           <w:rFonts w:eastAsia="Gungsuh"/>
         </w:rPr>
-        <w:t>Several baseline models were selected for the prediction tasks. Although tree-based models are the main focus of this project, Logistic Regression is also used for the BMF ≥ 10% classification task because it provides a simple baseline for testing whether lower- and higher-retention cases can already be separated using a relatively simple combination of the inputs (Knauer et al., 2024). For continuous BMF prediction, Random Forest is tested because it can capture nonlinear relationships and interactions between the simulation parameters while averaging many trees to reduce sensitivity to individual cases (</w:t>
+      </w:pPr>
+      <w:r>
+        <w:rPr>
+          <w:rFonts w:eastAsia="Gungsuh"/>
+        </w:rPr>
+        <w:t xml:space="preserve">For the prediction tasks, </w:t>
+      </w:r>
+      <w:proofErr w:type="gramStart"/>
+      <w:r>
+        <w:rPr>
+          <w:rFonts w:eastAsia="Gungsuh"/>
+        </w:rPr>
+        <w:t>a number of</w:t>
+      </w:r>
+      <w:proofErr w:type="gramEnd"/>
+      <w:r>
+        <w:rPr>
+          <w:rFonts w:eastAsia="Gungsuh"/>
+        </w:rPr>
+        <w:t xml:space="preserve"> baseline models were used. While this project primarily focuses on tree-based models, Logistic Regression is also used for the BMF ≥ 10% classification task because it offers a straightforward baseline for testing whether lower- and higher-retention cases can already be separated using a relatively simple combination of the inputs (Knauer et al., 2024). Because Random Forest can capture nonlinear correlations and interactions between the simulation parameters while averaging numerous trees to lessen susceptibility to specific cases, it is tried for continuous BMF prediction (</w:t>
       </w:r>
       <w:proofErr w:type="spellStart"/>
       <w:r>
@@ -1888,30 +1925,98 @@
         <w:rPr>
           <w:rFonts w:eastAsia="Gungsuh"/>
         </w:rPr>
-        <w:t xml:space="preserve"> et al., 2019). Gradient Boosting is also tested because it builds trees sequentially, with each new tree correcting errors made by the previous ones, which may help capture sharper changes between different encounter conditions (Friedman, 2001; Valencia et al., 2019; Timpe et al., 2020).</w:t>
-      </w:r>
-    </w:p>
-    <w:p>
-      <w:pPr>
-        <w:spacing w:before="240" w:after="240"/>
-      </w:pPr>
-      <w:r>
-        <w:t xml:space="preserve">Further model development after the baseline included tuning the model settings and adding physics-derived features calculated from the original simulation inputs, to test whether these changes improved prediction performance. Other more complex model variants were also explored, including </w:t>
+        <w:t xml:space="preserve"> et al., 2019). Additionally, Gradient Boosting is evaluated since it constructs trees in a sequential manner, with each subsequent tree fixing mistakes produced by the ones before it. This could assist capture more precise changes between various encounter settings (Friedman, 2001; Valencia et al., 2019; Timpe et al., 2020).</w:t>
+      </w:r>
+    </w:p>
+    <w:p>
+      <w:pPr>
+        <w:pStyle w:val="Heading2"/>
+        <w:jc w:val="both"/>
+        <w:rPr>
+          <w:rFonts w:ascii="Times New Roman" w:eastAsia="Times New Roman" w:hAnsi="Times New Roman" w:cs="Times New Roman"/>
+          <w:color w:val="auto"/>
+          <w:kern w:val="0"/>
+          <w:sz w:val="24"/>
+          <w:szCs w:val="24"/>
+          <w:lang w:val="en-GB"/>
+          <w14:ligatures w14:val="none"/>
+        </w:rPr>
+      </w:pPr>
+      <w:r>
+        <w:rPr>
+          <w:rFonts w:ascii="Times New Roman" w:eastAsia="Times New Roman" w:hAnsi="Times New Roman" w:cs="Times New Roman"/>
+          <w:color w:val="auto"/>
+          <w:kern w:val="0"/>
+          <w:sz w:val="24"/>
+          <w:szCs w:val="24"/>
+          <w:lang w:val="en-GB"/>
+          <w14:ligatures w14:val="none"/>
+        </w:rPr>
+        <w:lastRenderedPageBreak/>
+        <w:t>To</w:t>
+      </w:r>
+      <w:r>
+        <w:rPr>
+          <w:rFonts w:ascii="Times New Roman" w:eastAsia="Times New Roman" w:hAnsi="Times New Roman" w:cs="Times New Roman"/>
+          <w:color w:val="auto"/>
+          <w:kern w:val="0"/>
+          <w:sz w:val="24"/>
+          <w:szCs w:val="24"/>
+          <w:lang w:val="en-GB"/>
+          <w14:ligatures w14:val="none"/>
+        </w:rPr>
+        <w:t xml:space="preserve"> determine whether these modifications enhanced prediction performance, the model was further developed after the baseline by adjusting the model's parameters and incorporating physics-derived attributes computed from the first simulation inputs. Other more sophisticated model variations, such as </w:t>
       </w:r>
       <w:proofErr w:type="spellStart"/>
       <w:r>
+        <w:rPr>
+          <w:rFonts w:ascii="Times New Roman" w:eastAsia="Times New Roman" w:hAnsi="Times New Roman" w:cs="Times New Roman"/>
+          <w:color w:val="auto"/>
+          <w:kern w:val="0"/>
+          <w:sz w:val="24"/>
+          <w:szCs w:val="24"/>
+          <w:lang w:val="en-GB"/>
+          <w14:ligatures w14:val="none"/>
+        </w:rPr>
         <w:t>XGBoost</w:t>
       </w:r>
       <w:proofErr w:type="spellEnd"/>
       <w:r>
-        <w:t xml:space="preserve"> and two-stage hurdle models, however these remained exploratory and are not discussed further in detail in this project, as they were mainly used to show the potential for further model improvement in future work rather than as the main result of this project. More complex approaches such as physics-informed neural networks were not explored because they are mainly designed to learn continuous spatial or time-dependent fields while enforcing physical equations, whereas this project uses a small tabular dataset of simulation inputs and numerical outcomes (</w:t>
+        <w:rPr>
+          <w:rFonts w:ascii="Times New Roman" w:eastAsia="Times New Roman" w:hAnsi="Times New Roman" w:cs="Times New Roman"/>
+          <w:color w:val="auto"/>
+          <w:kern w:val="0"/>
+          <w:sz w:val="24"/>
+          <w:szCs w:val="24"/>
+          <w:lang w:val="en-GB"/>
+          <w14:ligatures w14:val="none"/>
+        </w:rPr>
+        <w:t xml:space="preserve"> and two-stage hurdle models, were also investigated; however, they remained exploratory and are not covered in more detail in this project because their primary purpose was to demonstrate the possibility of further model improvement in subsequent work rather than to serve as the project's primary outcome. Since this project uses a small tabular dataset of simulation inputs and numerical results, more sophisticated methods like physics-informed neural networks, which are primarily intended to learn continuous spatial or time-dependent fields while enforcing physical equations, were not investigated (</w:t>
       </w:r>
       <w:proofErr w:type="spellStart"/>
       <w:r>
+        <w:rPr>
+          <w:rFonts w:ascii="Times New Roman" w:eastAsia="Times New Roman" w:hAnsi="Times New Roman" w:cs="Times New Roman"/>
+          <w:color w:val="auto"/>
+          <w:kern w:val="0"/>
+          <w:sz w:val="24"/>
+          <w:szCs w:val="24"/>
+          <w:lang w:val="en-GB"/>
+          <w14:ligatures w14:val="none"/>
+        </w:rPr>
         <w:t>Raissi</w:t>
       </w:r>
       <w:proofErr w:type="spellEnd"/>
       <w:r>
+        <w:rPr>
+          <w:rFonts w:ascii="Times New Roman" w:eastAsia="Times New Roman" w:hAnsi="Times New Roman" w:cs="Times New Roman"/>
+          <w:color w:val="auto"/>
+          <w:kern w:val="0"/>
+          <w:sz w:val="24"/>
+          <w:szCs w:val="24"/>
+          <w:lang w:val="en-GB"/>
+          <w14:ligatures w14:val="none"/>
+        </w:rPr>
         <w:t xml:space="preserve"> et al., 2019).</w:t>
       </w:r>
     </w:p>
@@ -1937,9 +2042,6 @@
       </w:r>
     </w:p>
     <w:p>
-      <w:pPr>
-        <w:spacing w:before="240" w:after="240"/>
-      </w:pPr>
       <w:r>
         <w:t xml:space="preserve">One of the main issues with the archive is that it contains repeated rows from the same physical SPH simulation, for example when the same simulation is post-processed using different </w:t>
       </w:r>
@@ -1949,11 +2051,7 @@
       </w:r>
       <w:proofErr w:type="spellEnd"/>
       <w:r>
-        <w:t xml:space="preserve"> </w:t>
-      </w:r>
-      <w:r>
-        <w:lastRenderedPageBreak/>
-        <w:t xml:space="preserve">linking lengths. A random row split could therefore allow the model to train on one processed version of a simulation and test on another version of the same simulation. To avoid this, 5-fold </w:t>
+        <w:t xml:space="preserve"> linking lengths. Therefore, the model might be trained on one processed version of a simulation and tested on another version of the same simulation using a random row split. 5-fold </w:t>
       </w:r>
       <w:proofErr w:type="spellStart"/>
       <w:r>
@@ -1961,7 +2059,7 @@
       </w:r>
       <w:proofErr w:type="spellEnd"/>
       <w:r>
-        <w:t xml:space="preserve"> cross-validation was used. All rows from the same physical simulation file are kept in the same fold, so each out-of-fold (OOF) prediction is made by a model that has not trained on that physical simulation.</w:t>
+        <w:t xml:space="preserve"> cross-validation was employed to prevent this. Every out-of-fold (OOF) prediction is made by a model that has not been trained on that physical simulation since all rows from the same physical simulation file are stored in the same fold. </w:t>
       </w:r>
     </w:p>
     <w:p>
@@ -2006,8 +2104,126 @@
       </w:r>
     </w:p>
     <w:p>
-      <w:r>
-        <w:t xml:space="preserve">Overall scores are useful, but they do not show whether the model follows sensible physical behaviour in different cases. To check this, three complementary analyses are used. First, an input-removal test, also called ablation, removes one original input together with related derived features and measures how much model performance decreases, as this gives an overall measure of how strongly the model depends on each physical input across the dataset (Section 3.4). Second, controlled tests change one input while keeping the others fixed to show the direction and shape of the model response (Section 3.5, Figure 3). Third, matched SPH comparisons test whether the importance of an input changes under different encounter conditions (Section 3.5, Figure 4). </w:t>
+      <w:pPr>
+        <w:pStyle w:val="Heading2"/>
+        <w:jc w:val="both"/>
+        <w:rPr>
+          <w:rFonts w:ascii="Times New Roman" w:eastAsia="Times New Roman" w:hAnsi="Times New Roman" w:cs="Times New Roman"/>
+          <w:color w:val="auto"/>
+          <w:kern w:val="0"/>
+          <w:sz w:val="24"/>
+          <w:szCs w:val="24"/>
+          <w:lang w:val="en-GB"/>
+          <w14:ligatures w14:val="none"/>
+        </w:rPr>
+      </w:pPr>
+      <w:r>
+        <w:rPr>
+          <w:rFonts w:ascii="Times New Roman" w:eastAsia="Times New Roman" w:hAnsi="Times New Roman" w:cs="Times New Roman"/>
+          <w:color w:val="auto"/>
+          <w:kern w:val="0"/>
+          <w:sz w:val="24"/>
+          <w:szCs w:val="24"/>
+          <w:lang w:val="en-GB"/>
+          <w14:ligatures w14:val="none"/>
+        </w:rPr>
+        <w:t xml:space="preserve">Although overall scores are helpful, they do not demonstrate whether the model exhibits reasonable physical </w:t>
+      </w:r>
+      <w:r>
+        <w:rPr>
+          <w:rFonts w:ascii="Times New Roman" w:eastAsia="Times New Roman" w:hAnsi="Times New Roman" w:cs="Times New Roman"/>
+          <w:color w:val="auto"/>
+          <w:kern w:val="0"/>
+          <w:sz w:val="24"/>
+          <w:szCs w:val="24"/>
+          <w:lang w:val="en-GB"/>
+          <w14:ligatures w14:val="none"/>
+        </w:rPr>
+        <w:t>behaviour</w:t>
+      </w:r>
+      <w:r>
+        <w:rPr>
+          <w:rFonts w:ascii="Times New Roman" w:eastAsia="Times New Roman" w:hAnsi="Times New Roman" w:cs="Times New Roman"/>
+          <w:color w:val="auto"/>
+          <w:kern w:val="0"/>
+          <w:sz w:val="24"/>
+          <w:szCs w:val="24"/>
+          <w:lang w:val="en-GB"/>
+          <w14:ligatures w14:val="none"/>
+        </w:rPr>
+        <w:t xml:space="preserve"> in various scenarios. Three complimentary </w:t>
+      </w:r>
+      <w:r>
+        <w:rPr>
+          <w:rFonts w:ascii="Times New Roman" w:eastAsia="Times New Roman" w:hAnsi="Times New Roman" w:cs="Times New Roman"/>
+          <w:color w:val="auto"/>
+          <w:kern w:val="0"/>
+          <w:sz w:val="24"/>
+          <w:szCs w:val="24"/>
+          <w:lang w:val="en-GB"/>
+          <w14:ligatures w14:val="none"/>
+        </w:rPr>
+        <w:t>analyses</w:t>
+      </w:r>
+      <w:r>
+        <w:rPr>
+          <w:rFonts w:ascii="Times New Roman" w:eastAsia="Times New Roman" w:hAnsi="Times New Roman" w:cs="Times New Roman"/>
+          <w:color w:val="auto"/>
+          <w:kern w:val="0"/>
+          <w:sz w:val="24"/>
+          <w:szCs w:val="24"/>
+          <w:lang w:val="en-GB"/>
+          <w14:ligatures w14:val="none"/>
+        </w:rPr>
+        <w:t xml:space="preserve"> are employed to verify this. </w:t>
+      </w:r>
+      <w:r>
+        <w:rPr>
+          <w:rFonts w:ascii="Times New Roman" w:eastAsia="Times New Roman" w:hAnsi="Times New Roman" w:cs="Times New Roman"/>
+          <w:color w:val="auto"/>
+          <w:kern w:val="0"/>
+          <w:sz w:val="24"/>
+          <w:szCs w:val="24"/>
+          <w:lang w:val="en-GB"/>
+          <w14:ligatures w14:val="none"/>
+        </w:rPr>
+        <w:t>To</w:t>
+      </w:r>
+      <w:r>
+        <w:rPr>
+          <w:rFonts w:ascii="Times New Roman" w:eastAsia="Times New Roman" w:hAnsi="Times New Roman" w:cs="Times New Roman"/>
+          <w:color w:val="auto"/>
+          <w:kern w:val="0"/>
+          <w:sz w:val="24"/>
+          <w:szCs w:val="24"/>
+          <w:lang w:val="en-GB"/>
+          <w14:ligatures w14:val="none"/>
+        </w:rPr>
+        <w:t xml:space="preserve"> determine how heavily the model depends on each physical input across the dataset, an input-removal test, also known as ablation, first eliminates one original input along with related derived features and </w:t>
+      </w:r>
+      <w:r>
+        <w:rPr>
+          <w:rFonts w:ascii="Times New Roman" w:eastAsia="Times New Roman" w:hAnsi="Times New Roman" w:cs="Times New Roman"/>
+          <w:color w:val="auto"/>
+          <w:kern w:val="0"/>
+          <w:sz w:val="24"/>
+          <w:szCs w:val="24"/>
+          <w:lang w:val="en-GB"/>
+          <w14:ligatures w14:val="none"/>
+        </w:rPr>
+        <w:t>analyses</w:t>
+      </w:r>
+      <w:r>
+        <w:rPr>
+          <w:rFonts w:ascii="Times New Roman" w:eastAsia="Times New Roman" w:hAnsi="Times New Roman" w:cs="Times New Roman"/>
+          <w:color w:val="auto"/>
+          <w:kern w:val="0"/>
+          <w:sz w:val="24"/>
+          <w:szCs w:val="24"/>
+          <w:lang w:val="en-GB"/>
+          <w14:ligatures w14:val="none"/>
+        </w:rPr>
+        <w:t xml:space="preserve"> how much model performance declines (Section 3.4). Second, to illustrate the direction and form of the model response, controlled tests alter one input while maintaining the others constant (Section 3.5, Figure 3). Third, matched SPH comparisons examine whether an input's significance varies depending on encounter circumstances (Section 3.5, Figure 4).</w:t>
       </w:r>
     </w:p>
     <w:p>
@@ -2033,15 +2249,11 @@
     </w:p>
     <w:p>
       <w:r>
-        <w:t xml:space="preserve">Model accuracy alone cannot show whether every individual prediction is reliable, because an overall score can hide regions where the model has little data or makes larger errors, so the workflow also checks whether a new setup is </w:t>
-      </w:r>
-      <w:proofErr w:type="gramStart"/>
-      <w:r>
-        <w:t>similar to</w:t>
-      </w:r>
-      <w:proofErr w:type="gramEnd"/>
-      <w:r>
-        <w:t xml:space="preserve"> SPH simulations already present in the archive. Predictions are trusted more when the surrounding region has several independent SPH simulations and low held-out prediction error. Predictions are treated as less reliable when the input combination is sparsely sampled, near the edge of the available data, or outside the sampled region. These checks are analysed in section 3.6 and figure 5.</w:t>
+        <w:t xml:space="preserve">The method also determines whether a new setup is comparable to SPH simulations that are already in the archive because model accuracy alone cannot demonstrate the reliability of each individual forecast because an overall score can conceal areas where the model has insufficient data or produces larger errors. When there are multiple independent SPH simulations and a low held-out prediction error in the surrounding area, predictions are more reliable. When the input </w:t>
+      </w:r>
+      <w:r>
+        <w:lastRenderedPageBreak/>
+        <w:t>combination is outside the sampled region, close to the edge of the available data, or poorly sampled, predictions are deemed less accurate. Figure 5 and section 3.6 provide an analysis of these inspections.</w:t>
       </w:r>
     </w:p>
     <w:p>
@@ -2193,7 +2405,6 @@
           <w:szCs w:val="28"/>
           <w:lang w:val="en-GB"/>
         </w:rPr>
-        <w:lastRenderedPageBreak/>
         <w:t>3. Results</w:t>
       </w:r>
     </w:p>
@@ -2296,7 +2507,11 @@
         <w:t>and</w:t>
       </w:r>
       <w:r>
-        <w:t xml:space="preserve"> decreases as encounter speed increases. The relative effects also change across the sampled range: velocity differences are prominent at about 1.1-1.6 Mars radii, while separation between spin states becomes more visible around 1.7-2.0 Mars radii. One prograde-spin case retains about 3-4% BMF at 2.6 Mars radii while the other sampled cases are near zero, although the region is too sparsely sampled for a strong conclusion. The effect of asteroid mass also changes in size and direction with the other encounter conditions. Overall, the results indicate regime-dependent behaviour, where the relative effects of parameters vary across the parameter space and lead to different bound-mass outcomes.</w:t>
+        <w:t xml:space="preserve"> decreases as encounter speed increases. The relative effects also change across the sampled range: velocity differences are prominent at about 1.1-1.6 Mars radii, while separation between spin states becomes more visible around 1.7-2.0 Mars radii. One prograde-spin case retains about 3-4% BMF at 2.6 Mars radii while the other sampled cases are near zero, although the region is too sparsely sampled for a strong conclusion. The effect of asteroid mass also changes in size and direction with the other encounter conditions. Overall, the </w:t>
+      </w:r>
+      <w:r>
+        <w:lastRenderedPageBreak/>
+        <w:t>results indicate regime-dependent behaviour, where the relative effects of parameters vary across the parameter space and lead to different bound-mass outcomes.</w:t>
       </w:r>
     </w:p>
     <w:p>
@@ -2340,14 +2555,7 @@
         <w:rPr>
           <w:rFonts w:eastAsia="Gungsuh"/>
         </w:rPr>
-        <w:t xml:space="preserve">Strong retention (BMF ≥ 0.10) appears only up to a proxy of about 1.057, while any non-zero BMF extends to about 1.127. Figure 2 shows this directly: the points collapse toward </w:t>
-      </w:r>
-      <w:r>
-        <w:rPr>
-          <w:rFonts w:eastAsia="Gungsuh"/>
-        </w:rPr>
-        <w:lastRenderedPageBreak/>
-        <w:t>BMF = 0 as the encounter becomes more hyperbolic. Faster, more hyperbolic fly-bys spend less time under conditions that favour capture and therefore leave less material bound to Mars.</w:t>
+        <w:t>Strong retention (BMF ≥ 0.10) appears only up to a proxy of about 1.057, while any non-zero BMF extends to about 1.127. Figure 2 shows this directly: the points collapse toward BMF = 0 as the encounter becomes more hyperbolic. Faster, more hyperbolic fly-bys spend less time under conditions that favour capture and therefore leave less material bound to Mars.</w:t>
       </w:r>
     </w:p>
     <w:p>
@@ -2482,6 +2690,7 @@
         <w:spacing w:before="240" w:after="240"/>
       </w:pPr>
       <w:r>
+        <w:lastRenderedPageBreak/>
         <w:t>Tuning the Random Forest, by adjusting its model settings, produces no meaningful improvement, changing performance only from R² = 0.8971, MAE = 0.0184 and RMSE = 0.0298 to R² = 0.8983, MAE = 0.0186 and RMSE = 0.0297. In contrast, adding the physics-derived features calculated from the original simulation inputs (see Appendix A, Table A1) improves performance to R² = 0.9225, MAE = 0.0179 and RMSE = 0.0259, so this version is used as the main model. This is an overall average and does not mean that every individual prediction has the same error (see Appendix A for further details).</w:t>
       </w:r>
     </w:p>
@@ -2528,11 +2737,7 @@
         <w:spacing w:before="240" w:after="240"/>
       </w:pPr>
       <w:r>
-        <w:t xml:space="preserve">The input-removal test gives the clearest overall result for BMF. Each original parameter is removed together with derived features that contain the same information, and the resulting decrease in R² shows how much predictive information is lost. Removing periapsis causes the largest decrease, ΔR² = -0.504, making it the strongest overall input. Removing velocity gives ΔR² </w:t>
-      </w:r>
-      <w:r>
-        <w:lastRenderedPageBreak/>
-        <w:t>= -0.279, while removing spin gives ΔR² = -0.258. Asteroid mass has a smaller and less consistent overall effect. These values are overall averages and cannot simply be added together. They show how much the model depends on each input, not whether increasing that input raises or lowers BMF, or whether it directly causes the outcome. Overall, periapsis is strongest, followed by velocity and spin; this ranking can change locally.</w:t>
+        <w:t>The input-removal test gives the clearest overall result for BMF. Each original parameter is removed together with derived features that contain the same information, and the resulting decrease in R² shows how much predictive information is lost. Removing periapsis causes the largest decrease, ΔR² = -0.504, making it the strongest overall input. Removing velocity gives ΔR² = -0.279, while removing spin gives ΔR² = -0.258. Asteroid mass has a smaller and less consistent overall effect. These values are overall averages and cannot simply be added together. They show how much the model depends on each input, not whether increasing that input raises or lowers BMF, or whether it directly causes the outcome. Overall, periapsis is strongest, followed by velocity and spin; this ranking can change locally.</w:t>
       </w:r>
     </w:p>
     <w:p>
@@ -2606,6 +2811,7 @@
         <w:rPr>
           <w:noProof/>
         </w:rPr>
+        <w:lastRenderedPageBreak/>
         <w:drawing>
           <wp:inline distT="114300" distB="114300" distL="114300" distR="114300" wp14:anchorId="29C2306D" wp14:editId="19C87D46">
             <wp:extent cx="4224338" cy="3670931"/>
@@ -2651,7 +2857,6 @@
           <w:i/>
           <w:iCs/>
         </w:rPr>
-        <w:lastRenderedPageBreak/>
         <w:t xml:space="preserve">Figure 3. BMF checks where one input changes at a time. Dots are available SPH cases and curves are Random Forest predictions with the other inputs fixed. Blue background shows interpolation range, </w:t>
       </w:r>
       <w:proofErr w:type="gramStart"/>
@@ -2696,6 +2901,7 @@
         <w:rPr>
           <w:noProof/>
         </w:rPr>
+        <w:lastRenderedPageBreak/>
         <w:drawing>
           <wp:inline distT="0" distB="0" distL="114300" distR="114300" wp14:anchorId="3B7A9855" wp14:editId="6932CDAB">
             <wp:extent cx="5810250" cy="2413862"/>
@@ -2813,11 +3019,7 @@
         <w:t xml:space="preserve">​ </w:t>
       </w:r>
       <w:r>
-        <w:t xml:space="preserve">is the difference between </w:t>
-      </w:r>
-      <w:r>
-        <w:lastRenderedPageBreak/>
-        <w:t xml:space="preserve">the largest and smallest BMF across available spin states while velocity is fixed. In the right panel, </w:t>
+        <w:t xml:space="preserve">is the difference between the largest and smallest BMF across available spin states while velocity is fixed. In the right panel, </w:t>
       </w:r>
       <w:proofErr w:type="spellStart"/>
       <w:r>
@@ -2951,7 +3153,14 @@
         <w:rPr>
           <w:color w:val="000000"/>
         </w:rPr>
-        <w:t xml:space="preserve"> rows, then compare that count with the average held-out absolute error in the same region. Regions with more simulations often have lower error, while sparse or edge regions can be much worse. Low error alone is not enough: some poorly sampled regions look easy only because the true BMF is usually zero.</w:t>
+        <w:t xml:space="preserve"> rows, then compare that count with the average held-out absolute error in the same region. Regions with more simulations often </w:t>
+      </w:r>
+      <w:r>
+        <w:rPr>
+          <w:color w:val="000000"/>
+        </w:rPr>
+        <w:lastRenderedPageBreak/>
+        <w:t>have lower error, while sparse or edge regions can be much worse. Low error alone is not enough: some poorly sampled regions look easy only because the true BMF is usually zero.</w:t>
       </w:r>
     </w:p>
     <w:p>
@@ -3399,7 +3608,6 @@
     </w:p>
     <w:p>
       <w:r>
-        <w:lastRenderedPageBreak/>
         <w:t>This shows that the held-out model underpredicts the 1.2 Mars-radii case by 0.0779 BMF and overpredicts the 1.6 Mars-radii case by 0.0825. Because the errors are both large and have opposite signs, the local relationship has not been learned reliably. A new case in this region should therefore be checked with additional SPH rather than trusted only because its mass lies between sampled masses.</w:t>
       </w:r>
     </w:p>

</xml_diff>

<commit_message>
docs: revise chapter 1-2
</commit_message>
<xml_diff>
--- a/deliverables/nny124-final-report.docx
+++ b/deliverables/nny124-final-report.docx
@@ -408,23 +408,28 @@
       </w:r>
     </w:p>
     <w:p>
-      <w:r>
-        <w:rPr>
-          <w:color w:val="000000"/>
-        </w:rPr>
-        <w:t xml:space="preserve">Smoothed-particle hydrodynamics (SPH) is well suited to this problem because its particles move with the material as it deforms, fragments and interacts gravitationally. However, each new setup is </w:t>
-      </w:r>
-      <w:r>
-        <w:t xml:space="preserve">computationally </w:t>
-      </w:r>
-      <w:r>
-        <w:rPr>
-          <w:color w:val="000000"/>
-        </w:rPr>
-        <w:t xml:space="preserve">expensive to simulate. Testing every combination of asteroid mass, closest approach, encounter speed, spin and numerical settings is therefore impractical. </w:t>
-      </w:r>
-      <w:r>
-        <w:t>This project uses the existing simulation archive to build a machine learning (ML) surrogate for screening promising cases and identifying when new SPH simulations are needed.</w:t>
+      <w:pPr>
+        <w:rPr>
+          <w:color w:val="000000"/>
+        </w:rPr>
+      </w:pPr>
+      <w:r>
+        <w:rPr>
+          <w:color w:val="000000"/>
+        </w:rPr>
+        <w:t xml:space="preserve">Because its particles move with the material as it deforms, fragments, and interacts gravitationally, smoothed-particle hydrodynamics (SPH) is a good fit for this situation. Nevertheless, simulating each new configuration is computationally costly. It is simply not feasible to test every possible combination of asteroid mass, closest approach, encounter speed, spin, and numerical settings. </w:t>
+      </w:r>
+      <w:r>
+        <w:rPr>
+          <w:color w:val="000000"/>
+        </w:rPr>
+        <w:t>To</w:t>
+      </w:r>
+      <w:r>
+        <w:rPr>
+          <w:color w:val="000000"/>
+        </w:rPr>
+        <w:t xml:space="preserve"> filter potential situations and determine when fresh SPH simulations are required, this research builds a machine learning (ML) surrogate using the current simulation archive.</w:t>
       </w:r>
     </w:p>
     <w:p>
@@ -472,26 +477,29 @@
       </w:r>
     </w:p>
     <w:p>
-      <w:r>
-        <w:t xml:space="preserve">The </w:t>
-      </w:r>
-      <w:r>
-        <w:t>primary</w:t>
-      </w:r>
-      <w:r>
-        <w:t xml:space="preserve"> contribution is </w:t>
-      </w:r>
-      <w:r>
-        <w:t xml:space="preserve">the </w:t>
-      </w:r>
-      <w:r>
-        <w:t>integration</w:t>
-      </w:r>
-      <w:r>
-        <w:t xml:space="preserve"> of</w:t>
-      </w:r>
-      <w:r>
-        <w:t xml:space="preserve"> physical interpretation with clear checks for when an ML prediction is reliable. The workflow converts particle-level SPH outputs into one set of results for each simulation, tests the model on physical simulations that were not used for training, compares controlled and matched cases, measures how much similar SPH data exist nearby, and uses these checks to recommend whether a new SPH run is needed. </w:t>
+      <w:pPr>
+        <w:pStyle w:val="Heading2"/>
+        <w:rPr>
+          <w:rFonts w:ascii="Times New Roman" w:eastAsia="Times New Roman" w:hAnsi="Times New Roman" w:cs="Times New Roman"/>
+          <w:color w:val="auto"/>
+          <w:kern w:val="0"/>
+          <w:sz w:val="24"/>
+          <w:szCs w:val="24"/>
+          <w:lang w:val="en-GB"/>
+          <w14:ligatures w14:val="none"/>
+        </w:rPr>
+      </w:pPr>
+      <w:r>
+        <w:rPr>
+          <w:rFonts w:ascii="Times New Roman" w:eastAsia="Times New Roman" w:hAnsi="Times New Roman" w:cs="Times New Roman"/>
+          <w:color w:val="auto"/>
+          <w:kern w:val="0"/>
+          <w:sz w:val="24"/>
+          <w:szCs w:val="24"/>
+          <w:lang w:val="en-GB"/>
+          <w14:ligatures w14:val="none"/>
+        </w:rPr>
+        <w:t>The primary contribution is the integration of physical interpretation with unambiguous testing for the reliability of an ML prediction. Each simulation's particle-level SPH outputs are combined into a single set of results by the workflow, which also tests the model on physical simulations that weren't used for training, compares matched and controlled cases, calculates the amount of similar SPH data that is present nearby, and uses these checks to suggest whether a new SPH run is necessary.</w:t>
       </w:r>
     </w:p>
     <w:p>
@@ -559,23 +567,7 @@
     </w:p>
     <w:p>
       <w:r>
-        <w:t xml:space="preserve">Since SPH is used to simulate these tidal-disruption scenarios, it is also crucial to comprehend how the simulation data are generated and handled. Because SPH is a mesh-free </w:t>
-      </w:r>
-      <w:proofErr w:type="spellStart"/>
-      <w:r>
-        <w:t>Lagrangian</w:t>
-      </w:r>
-      <w:proofErr w:type="spellEnd"/>
-      <w:r>
-        <w:t xml:space="preserve"> approach, computational particles follow the motion of the material they represent (Price, 2012). It is therefore appropriate for significant deformation and fragmentation. However, the subsequent processing of the simulation also affects the measured pieces. Here, post-processing techniques like friends-of-friends (</w:t>
-      </w:r>
-      <w:proofErr w:type="spellStart"/>
-      <w:r>
-        <w:t>FoF</w:t>
-      </w:r>
-      <w:proofErr w:type="spellEnd"/>
-      <w:r>
-        <w:t xml:space="preserve">) use a selected connecting length to group </w:t>
+        <w:t xml:space="preserve">Since SPH is used to simulate these tidal-disruption scenarios, it is also crucial to comprehend how the simulation data are generated and handled. Because SPH is a mesh-free Lagrangian approach, computational particles follow the motion of the material they represent (Price, 2012). It is therefore appropriate for significant deformation and fragmentation. However, the subsequent processing of the simulation also affects the measured pieces. Here, post-processing techniques like friends-of-friends (FoF) use a selected connecting length to group </w:t>
       </w:r>
       <w:r>
         <w:t>neighbouring</w:t>
@@ -710,11 +702,9 @@
       <w:r>
         <w:t xml:space="preserve">489 SPH outputs </w:t>
       </w:r>
-      <w:proofErr w:type="spellStart"/>
-      <w:r>
-        <w:t>totaling</w:t>
-      </w:r>
-      <w:proofErr w:type="spellEnd"/>
+      <w:r>
+        <w:t>totalling</w:t>
+      </w:r>
       <w:r>
         <w:t xml:space="preserve"> over 218 GB of HDF5 particle data are included in the collection. These particle outputs are transformed into fragment and bound-mass measurements through post-processing. bonded mass fraction (BMF), or the portion of the initial asteroid mass that is gravitationally bonded to Mars following the contact, is the main aim. The asteroid and input parameter values are provided by the simulation </w:t>
       </w:r>
@@ -1388,15 +1378,7 @@
               </w:rPr>
             </w:pPr>
             <w:r>
-              <w:t xml:space="preserve">none, x, y, z, </w:t>
-            </w:r>
-            <w:proofErr w:type="spellStart"/>
-            <w:r>
-              <w:t>mz</w:t>
-            </w:r>
-            <w:proofErr w:type="spellEnd"/>
-            <w:r>
-              <w:t>; unevenly sampled</w:t>
+              <w:t>none, x, y, z, mz; unevenly sampled</w:t>
             </w:r>
           </w:p>
         </w:tc>
@@ -1423,15 +1405,7 @@
               <w:jc w:val="left"/>
             </w:pPr>
             <w:r>
-              <w:t xml:space="preserve">Rotation of the asteroid and the direction of its spin axis: none means no spin, x or y means equatorial spin, z means prograde z-spin, and </w:t>
-            </w:r>
-            <w:proofErr w:type="spellStart"/>
-            <w:r>
-              <w:t>mz</w:t>
-            </w:r>
-            <w:proofErr w:type="spellEnd"/>
-            <w:r>
-              <w:t xml:space="preserve"> means retrograde z-spin. Spin can change how the asteroid breaks up, but the different spin settings are unevenly sampled.</w:t>
+              <w:t>Rotation of the asteroid and the direction of its spin axis: none means no spin, x or y means equatorial spin, z means prograde z-spin, and mz means retrograde z-spin. Spin can change how the asteroid breaks up, but the different spin settings are unevenly sampled.</w:t>
             </w:r>
           </w:p>
         </w:tc>
@@ -1593,13 +1567,8 @@
               <w:spacing w:after="0"/>
               <w:jc w:val="left"/>
             </w:pPr>
-            <w:proofErr w:type="spellStart"/>
-            <w:r>
-              <w:t>FoF</w:t>
-            </w:r>
-            <w:proofErr w:type="spellEnd"/>
-            <w:r>
-              <w:t xml:space="preserve"> linking length </w:t>
+            <w:r>
+              <w:t xml:space="preserve">FoF linking length </w:t>
             </w:r>
             <w:r>
               <w:rPr>
@@ -1660,7 +1629,31 @@
               <w:jc w:val="left"/>
             </w:pPr>
             <w:r>
-              <w:t>Maximum distance used to decide whether nearby particles belong to the same fragment. It can change the measured fragments, but it does not change the physical encounter itself.</w:t>
+              <w:t>The m</w:t>
+            </w:r>
+            <w:r>
+              <w:t xml:space="preserve">aximum distance used to decide </w:t>
+            </w:r>
+            <w:r>
+              <w:t>if</w:t>
+            </w:r>
+            <w:r>
+              <w:t xml:space="preserve"> nearby particles belong to the same fragment</w:t>
+            </w:r>
+            <w:r>
+              <w:t xml:space="preserve"> or not</w:t>
+            </w:r>
+            <w:r>
+              <w:t xml:space="preserve">. </w:t>
+            </w:r>
+            <w:r>
+              <w:t>C</w:t>
+            </w:r>
+            <w:r>
+              <w:t>an change the measured fragments, does not change the physical encounter</w:t>
+            </w:r>
+            <w:r>
+              <w:t>.</w:t>
             </w:r>
           </w:p>
         </w:tc>
@@ -1671,27 +1664,30 @@
         <w:spacing w:before="200"/>
       </w:pPr>
       <w:r>
-        <w:t xml:space="preserve">How the post-processing works is that </w:t>
-      </w:r>
-      <w:proofErr w:type="spellStart"/>
-      <w:r>
-        <w:t>FoF</w:t>
-      </w:r>
-      <w:proofErr w:type="spellEnd"/>
-      <w:r>
-        <w:t xml:space="preserve"> first groups nearby debris particles into fragments. </w:t>
-      </w:r>
-      <w:r>
-        <w:rPr>
-          <w:color w:val="000000"/>
-        </w:rPr>
-        <w:t xml:space="preserve">For each group </w:t>
-      </w:r>
-      <w:r>
-        <w:rPr>
-          <w:i/>
-          <w:iCs/>
-          <w:color w:val="000000"/>
+        <w:t xml:space="preserve">How the post-processing works is that FoF first groups nearby debris particles into fragments. </w:t>
+      </w:r>
+      <w:r>
+        <w:rPr>
+          <w:color w:val="000000"/>
+        </w:rPr>
+        <w:t>The mass of each group g is equal to the sum of the particle masses,</w:t>
+      </w:r>
+      <w:r>
+        <w:rPr>
+          <w:color w:val="000000"/>
+        </w:rPr>
+        <w:t xml:space="preserve"> </w:t>
+      </w:r>
+      <w:r>
+        <w:rPr>
+          <w:color w:val="000000"/>
+        </w:rPr>
+        <w:t>M</w:t>
+      </w:r>
+      <w:r>
+        <w:rPr>
+          <w:color w:val="000000"/>
+          <w:vertAlign w:val="subscript"/>
         </w:rPr>
         <w:t>g</w:t>
       </w:r>
@@ -1699,131 +1695,329 @@
         <w:rPr>
           <w:color w:val="000000"/>
         </w:rPr>
-        <w:t>, its mass is the sum of the particle masses, M</w:t>
+        <w:t xml:space="preserve"> = Σ</w:t>
       </w:r>
       <w:r>
         <w:rPr>
           <w:color w:val="000000"/>
           <w:vertAlign w:val="subscript"/>
         </w:rPr>
+        <w:t>i</w:t>
+      </w:r>
+      <w:r>
+        <w:rPr>
+          <w:color w:val="000000"/>
+        </w:rPr>
+        <w:t>m</w:t>
+      </w:r>
+      <w:r>
+        <w:rPr>
+          <w:color w:val="000000"/>
+          <w:vertAlign w:val="subscript"/>
+        </w:rPr>
+        <w:t>i</w:t>
+      </w:r>
+      <w:r>
+        <w:rPr>
+          <w:color w:val="000000"/>
+        </w:rPr>
+        <w:t xml:space="preserve">. </w:t>
+      </w:r>
+      <w:r>
+        <w:rPr>
+          <w:color w:val="000000"/>
+        </w:rPr>
+        <w:t xml:space="preserve">The group's particular orbital energy with respect to Mars is then determined using its </w:t>
+      </w:r>
+      <w:r>
+        <w:rPr>
+          <w:color w:val="000000"/>
+        </w:rPr>
+        <w:t>centre</w:t>
+      </w:r>
+      <w:r>
+        <w:rPr>
+          <w:color w:val="000000"/>
+        </w:rPr>
+        <w:t xml:space="preserve">-of-mass position and </w:t>
+      </w:r>
+      <w:r>
+        <w:rPr>
+          <w:color w:val="000000"/>
+        </w:rPr>
+        <w:lastRenderedPageBreak/>
+        <w:t xml:space="preserve">velocity. </w:t>
+      </w:r>
+      <w:r>
+        <w:rPr>
+          <w:color w:val="000000"/>
+        </w:rPr>
+        <w:t>A group is bound when ε</w:t>
+      </w:r>
+      <w:r>
+        <w:rPr>
+          <w:color w:val="000000"/>
+          <w:vertAlign w:val="subscript"/>
+        </w:rPr>
         <w:t>g</w:t>
       </w:r>
       <w:r>
         <w:rPr>
           <w:color w:val="000000"/>
         </w:rPr>
-        <w:t xml:space="preserve"> = </w:t>
-      </w:r>
-      <w:proofErr w:type="spellStart"/>
-      <w:r>
-        <w:rPr>
-          <w:color w:val="000000"/>
-        </w:rPr>
-        <w:t>Σ</w:t>
+        <w:t xml:space="preserve"> &lt; 0 and unbound when ε</w:t>
       </w:r>
       <w:r>
         <w:rPr>
           <w:color w:val="000000"/>
           <w:vertAlign w:val="subscript"/>
         </w:rPr>
-        <w:t>i</w:t>
-      </w:r>
-      <w:r>
-        <w:rPr>
-          <w:color w:val="000000"/>
-        </w:rPr>
-        <w:t>m</w:t>
-      </w:r>
-      <w:r>
-        <w:rPr>
-          <w:color w:val="000000"/>
-          <w:vertAlign w:val="subscript"/>
-        </w:rPr>
-        <w:t>i</w:t>
-      </w:r>
-      <w:proofErr w:type="spellEnd"/>
-      <w:r>
-        <w:rPr>
-          <w:color w:val="000000"/>
-        </w:rPr>
-        <w:t xml:space="preserve">. The group's </w:t>
-      </w:r>
-      <w:r>
-        <w:rPr>
-          <w:color w:val="000000"/>
-        </w:rPr>
-        <w:t>centre</w:t>
-      </w:r>
-      <w:r>
-        <w:rPr>
-          <w:color w:val="000000"/>
-        </w:rPr>
-        <w:t xml:space="preserve">-of-mass position and velocity are then used to calculate its specific orbital energy relative to Mars. A group </w:t>
-      </w:r>
-      <w:r>
-        <w:rPr>
-          <w:color w:val="000000"/>
-        </w:rPr>
-        <w:lastRenderedPageBreak/>
-        <w:t xml:space="preserve">is bound when </w:t>
-      </w:r>
-      <w:proofErr w:type="spellStart"/>
-      <w:r>
-        <w:rPr>
-          <w:color w:val="000000"/>
-        </w:rPr>
-        <w:t>ε</w:t>
-      </w:r>
-      <w:r>
-        <w:rPr>
-          <w:color w:val="000000"/>
-          <w:vertAlign w:val="subscript"/>
-        </w:rPr>
         <w:t>g</w:t>
       </w:r>
-      <w:proofErr w:type="spellEnd"/>
-      <w:r>
-        <w:rPr>
-          <w:color w:val="000000"/>
-        </w:rPr>
-        <w:t xml:space="preserve"> &lt; 0 and unbound when </w:t>
-      </w:r>
-      <w:proofErr w:type="spellStart"/>
-      <w:r>
-        <w:rPr>
-          <w:color w:val="000000"/>
-        </w:rPr>
-        <w:t>ε</w:t>
-      </w:r>
-      <w:r>
-        <w:rPr>
-          <w:color w:val="000000"/>
-          <w:vertAlign w:val="subscript"/>
-        </w:rPr>
-        <w:t>g</w:t>
-      </w:r>
-      <w:proofErr w:type="spellEnd"/>
       <w:r>
         <w:rPr>
           <w:rFonts w:eastAsia="Gungsuh"/>
           <w:color w:val="000000"/>
         </w:rPr>
-        <w:t xml:space="preserve"> ≥ 0. </w:t>
-      </w:r>
-      <w:r>
-        <w:t>The main recorded output is BMF, while other exploratory outputs include the number of bound fragments, the largest and average bound-fragment mass, total fragment count, and largest-remnant measures. It is also important to note that BMF only measures gravitational retention and does not yet establish later disk or moon formation.</w:t>
-      </w:r>
-    </w:p>
-    <w:p>
-      <w:pPr>
-        <w:pStyle w:val="Heading2"/>
-        <w:rPr>
-          <w:rFonts w:ascii="Times New Roman" w:hAnsi="Times New Roman" w:cs="Times New Roman"/>
+        <w:t xml:space="preserve"> ≥ 0.</w:t>
+      </w:r>
+      <w:r>
+        <w:rPr>
+          <w:rFonts w:eastAsia="Gungsuh"/>
+          <w:color w:val="000000"/>
+        </w:rPr>
+        <w:t xml:space="preserve"> </w:t>
+      </w:r>
+      <w:r>
+        <w:t>The number of bound fragments, the greatest and average bound-fragment mass, the total fragment count, and the largest-remnant measurements are among the exploratory outputs; BMF is the primary recorded output. It's also crucial to remember that BMF does not yet determine later disk or moon development</w:t>
+      </w:r>
+      <w:r>
+        <w:t>,</w:t>
+      </w:r>
+      <w:r>
+        <w:t xml:space="preserve"> it merely measures gravitational retention.</w:t>
+      </w:r>
+    </w:p>
+    <w:p>
+      <w:pPr>
+        <w:spacing w:before="200"/>
+        <w:rPr>
           <w:b/>
           <w:bCs/>
           <w:color w:val="000000" w:themeColor="text1"/>
+        </w:rPr>
+      </w:pPr>
+      <w:r>
+        <w:rPr>
+          <w:b/>
+          <w:bCs/>
+          <w:color w:val="000000" w:themeColor="text1"/>
+        </w:rPr>
+        <w:t>2.2 Prediction Model Choices and Rationale</w:t>
+      </w:r>
+    </w:p>
+    <w:p>
+      <w:pPr>
+        <w:spacing w:before="240" w:after="240"/>
+      </w:pPr>
+      <w:r>
+        <w:t xml:space="preserve">The main ML task is to predict the BMF value, </w:t>
+      </w:r>
+      <w:r>
+        <w:t>or the proportion of the initial asteroid mass that is expected to stay bound to Mars, is the primary machine learning job. This maintains the distinction between retained fractions that are tiny, medium, and big. Furthermore, because Kegerreis et al. (2024) discovered that "tens of percent of an unbound asteroid's mass can be captured and survive beyond collisional timescales," a 10% BMF threshold is used as a straightforward screening criterion for higher-retention instances. Therefore, the 10% barrier is not a real physical limitation for moon formation</w:t>
+      </w:r>
+      <w:r>
+        <w:t>,</w:t>
+      </w:r>
+      <w:r>
+        <w:t xml:space="preserve"> rather it is only utilized to classify and prioritize occurrences.</w:t>
+      </w:r>
+      <w:r>
+        <w:t xml:space="preserve"> </w:t>
+      </w:r>
+    </w:p>
+    <w:p>
+      <w:pPr>
+        <w:spacing w:before="240" w:after="240"/>
+        <w:rPr>
+          <w:rFonts w:eastAsia="Gungsuh"/>
+        </w:rPr>
+      </w:pPr>
+      <w:r>
+        <w:rPr>
+          <w:rFonts w:eastAsia="Gungsuh"/>
+        </w:rPr>
+        <w:t xml:space="preserve">For the prediction tasks, </w:t>
+      </w:r>
+      <w:r>
+        <w:rPr>
+          <w:rFonts w:eastAsia="Gungsuh"/>
+        </w:rPr>
+        <w:t>several</w:t>
+      </w:r>
+      <w:r>
+        <w:rPr>
+          <w:rFonts w:eastAsia="Gungsuh"/>
+        </w:rPr>
+        <w:t xml:space="preserve"> baseline models were used. While this project primarily focuses on tree-based models, Logistic Regression is also used for the BMF ≥ 10% classification task because it offers a straightforward baseline for testing whether lower- and higher-retention cases can already be separated using a relatively simple combination of the inputs (Knauer et al., 2024). Because Random Forest can capture nonlinear correlations and interactions between the simulation parameters while averaging numerous trees to lessen susceptibility to specific cases, it is tried for continuous BMF prediction (</w:t>
+      </w:r>
+      <w:proofErr w:type="spellStart"/>
+      <w:r>
+        <w:rPr>
+          <w:rFonts w:eastAsia="Gungsuh"/>
+        </w:rPr>
+        <w:t>Breiman</w:t>
+      </w:r>
+      <w:proofErr w:type="spellEnd"/>
+      <w:r>
+        <w:rPr>
+          <w:rFonts w:eastAsia="Gungsuh"/>
+        </w:rPr>
+        <w:t xml:space="preserve">, 2001; </w:t>
+      </w:r>
+      <w:proofErr w:type="spellStart"/>
+      <w:r>
+        <w:rPr>
+          <w:rFonts w:eastAsia="Gungsuh"/>
+        </w:rPr>
+        <w:t>Cambioni</w:t>
+      </w:r>
+      <w:proofErr w:type="spellEnd"/>
+      <w:r>
+        <w:rPr>
+          <w:rFonts w:eastAsia="Gungsuh"/>
+        </w:rPr>
+        <w:t xml:space="preserve"> et al., 2019). Additionally, Gradient Boosting is evaluated since it constructs trees in a sequential manner, with each subsequent tree fixing mistakes produced by the ones before it. This could assist capture more precise changes between various encounter settings (Friedman, 2001; Valencia et al., 2019; Timpe et al., 2020).</w:t>
+      </w:r>
+    </w:p>
+    <w:p>
+      <w:pPr>
+        <w:pStyle w:val="Heading2"/>
+        <w:jc w:val="both"/>
+        <w:rPr>
+          <w:rFonts w:ascii="Times New Roman" w:eastAsia="Times New Roman" w:hAnsi="Times New Roman" w:cs="Times New Roman"/>
+          <w:color w:val="auto"/>
+          <w:kern w:val="0"/>
           <w:sz w:val="24"/>
           <w:szCs w:val="24"/>
+          <w:lang w:val="en-GB"/>
+          <w14:ligatures w14:val="none"/>
+        </w:rPr>
+      </w:pPr>
+      <w:r>
+        <w:rPr>
+          <w:rFonts w:ascii="Times New Roman" w:eastAsia="Times New Roman" w:hAnsi="Times New Roman" w:cs="Times New Roman"/>
+          <w:color w:val="auto"/>
+          <w:kern w:val="0"/>
+          <w:sz w:val="24"/>
+          <w:szCs w:val="24"/>
+          <w:lang w:val="en-GB"/>
+          <w14:ligatures w14:val="none"/>
+        </w:rPr>
+        <w:t>To</w:t>
+      </w:r>
+      <w:r>
+        <w:rPr>
+          <w:rFonts w:ascii="Times New Roman" w:eastAsia="Times New Roman" w:hAnsi="Times New Roman" w:cs="Times New Roman"/>
+          <w:color w:val="auto"/>
+          <w:kern w:val="0"/>
+          <w:sz w:val="24"/>
+          <w:szCs w:val="24"/>
+          <w:lang w:val="en-GB"/>
+          <w14:ligatures w14:val="none"/>
+        </w:rPr>
+        <w:t xml:space="preserve"> determine whether these modifications enhanced prediction performance, the model was further developed after the baseline by adjusting the model's parameters and incorporating physics-derived attributes computed from the first simulation inputs. Other more sophisticated model variations, such as XGBoost and two-stage hurdle models, were also investigated; however, they remained exploratory and are not covered in more detail in this project because their primary purpose was to demonstrate the possibility of further model improvement in subsequent work rather than to serve as the project's primary outcome. Since this project uses a small tabular dataset of simulation inputs and numerical results, more sophisticated methods like physics-informed neural networks, which are primarily intended to learn continuous spatial or time-dependent fields while enforcing physical equations, were not investigated (</w:t>
+      </w:r>
+      <w:proofErr w:type="spellStart"/>
+      <w:r>
+        <w:rPr>
+          <w:rFonts w:ascii="Times New Roman" w:eastAsia="Times New Roman" w:hAnsi="Times New Roman" w:cs="Times New Roman"/>
+          <w:color w:val="auto"/>
+          <w:kern w:val="0"/>
+          <w:sz w:val="24"/>
+          <w:szCs w:val="24"/>
+          <w:lang w:val="en-GB"/>
+          <w14:ligatures w14:val="none"/>
+        </w:rPr>
+        <w:t>Raissi</w:t>
+      </w:r>
+      <w:proofErr w:type="spellEnd"/>
+      <w:r>
+        <w:rPr>
+          <w:rFonts w:ascii="Times New Roman" w:eastAsia="Times New Roman" w:hAnsi="Times New Roman" w:cs="Times New Roman"/>
+          <w:color w:val="auto"/>
+          <w:kern w:val="0"/>
+          <w:sz w:val="24"/>
+          <w:szCs w:val="24"/>
+          <w:lang w:val="en-GB"/>
+          <w14:ligatures w14:val="none"/>
+        </w:rPr>
+        <w:t xml:space="preserve"> et al., 2019).</w:t>
+      </w:r>
+    </w:p>
+    <w:p>
+      <w:pPr>
+        <w:pStyle w:val="Heading2"/>
+        <w:rPr>
+          <w:rFonts w:ascii="Times New Roman" w:hAnsi="Times New Roman" w:cs="Times New Roman"/>
+          <w:lang w:val="en-GB"/>
+        </w:rPr>
+      </w:pPr>
+      <w:r>
+        <w:rPr>
+          <w:rFonts w:ascii="Times New Roman" w:eastAsia="Times New Roman" w:hAnsi="Times New Roman" w:cs="Times New Roman"/>
+          <w:b/>
+          <w:bCs/>
+          <w:color w:val="000000"/>
+          <w:sz w:val="24"/>
+          <w:szCs w:val="24"/>
+          <w:lang w:val="en-GB"/>
+        </w:rPr>
+        <w:t>2.3 Model Testing and Performance Metrics</w:t>
+      </w:r>
+    </w:p>
+    <w:p>
+      <w:r>
+        <w:t xml:space="preserve">One of the main issues with the archive is that it contains repeated rows from the same physical SPH simulation, for example when the same simulation is post-processed using different FoF </w:t>
+      </w:r>
+      <w:r>
+        <w:lastRenderedPageBreak/>
+        <w:t xml:space="preserve">linking lengths. Therefore, the model might be trained on one processed version of a simulation and tested on another version of the same simulation using a random row split. 5-fold </w:t>
+      </w:r>
+      <w:proofErr w:type="spellStart"/>
+      <w:r>
+        <w:t>GroupKFold</w:t>
+      </w:r>
+      <w:proofErr w:type="spellEnd"/>
+      <w:r>
+        <w:t xml:space="preserve"> cross-validation was employed to prevent this. Every out-of-fold (OOF) prediction is made by a model that has not been trained on that physical simulation since all rows from the same physical simulation file are stored in the same fold. </w:t>
+      </w:r>
+    </w:p>
+    <w:p>
+      <w:pPr>
+        <w:rPr>
+          <w:color w:val="FF0000"/>
+        </w:rPr>
+      </w:pPr>
+      <w:r>
+        <w:t>Regression performance is measured using R</w:t>
+      </w:r>
+      <w:r>
+        <w:rPr>
+          <w:vertAlign w:val="superscript"/>
+        </w:rPr>
+        <w:t>2</w:t>
+      </w:r>
+      <w:r>
+        <w:t xml:space="preserve">, mean absolute error (MAE), and root mean squared error (RMSE). Classification performance is measured using balanced accuracy, F1, and ROC AUC. </w:t>
+      </w:r>
+    </w:p>
+    <w:p>
+      <w:pPr>
+        <w:pStyle w:val="Heading2"/>
+        <w:rPr>
+          <w:rFonts w:ascii="Times New Roman" w:hAnsi="Times New Roman" w:cs="Times New Roman"/>
+          <w:color w:val="000000" w:themeColor="text1"/>
           <w:lang w:val="en-GB"/>
         </w:rPr>
       </w:pPr>
@@ -1837,95 +2031,7 @@
           <w:szCs w:val="24"/>
           <w:lang w:val="en-GB"/>
         </w:rPr>
-        <w:t>2.2 Prediction Model Cho</w:t>
-      </w:r>
-      <w:r>
-        <w:rPr>
-          <w:rFonts w:ascii="Times New Roman" w:hAnsi="Times New Roman" w:cs="Times New Roman"/>
-          <w:b/>
-          <w:bCs/>
-          <w:color w:val="000000" w:themeColor="text1"/>
-          <w:sz w:val="24"/>
-          <w:szCs w:val="24"/>
-          <w:lang w:val="en-GB"/>
-        </w:rPr>
-        <w:t>ices and Rationale</w:t>
-      </w:r>
-    </w:p>
-    <w:p>
-      <w:pPr>
-        <w:spacing w:before="240" w:after="240"/>
-      </w:pPr>
-      <w:r>
-        <w:t xml:space="preserve">The main ML task is to predict the BMF value, </w:t>
-      </w:r>
-      <w:r>
-        <w:t>or the proportion of the initial asteroid mass that is expected to stay bound to Mars, is the primary machine learning job. This maintains the distinction between retained fractions that are tiny, medium, and big. Furthermore, because Kegerreis et al. (2024) discovered that "tens of percent of an unbound asteroid's mass can be captured and survive beyond collisional timescales," a 10% BMF threshold is used as a straightforward screening criterion for higher-retention instances. Therefore, the 10% barrier is not a real physical limitation for moon formation</w:t>
-      </w:r>
-      <w:r>
-        <w:t>,</w:t>
-      </w:r>
-      <w:r>
-        <w:t xml:space="preserve"> rather it is only utilized to classify and prioritize occurrences.</w:t>
-      </w:r>
-      <w:r>
-        <w:t xml:space="preserve"> </w:t>
-      </w:r>
-    </w:p>
-    <w:p>
-      <w:pPr>
-        <w:spacing w:before="240" w:after="240"/>
-        <w:rPr>
-          <w:rFonts w:eastAsia="Gungsuh"/>
-        </w:rPr>
-      </w:pPr>
-      <w:r>
-        <w:rPr>
-          <w:rFonts w:eastAsia="Gungsuh"/>
-        </w:rPr>
-        <w:t xml:space="preserve">For the prediction tasks, </w:t>
-      </w:r>
-      <w:proofErr w:type="gramStart"/>
-      <w:r>
-        <w:rPr>
-          <w:rFonts w:eastAsia="Gungsuh"/>
-        </w:rPr>
-        <w:t>a number of</w:t>
-      </w:r>
-      <w:proofErr w:type="gramEnd"/>
-      <w:r>
-        <w:rPr>
-          <w:rFonts w:eastAsia="Gungsuh"/>
-        </w:rPr>
-        <w:t xml:space="preserve"> baseline models were used. While this project primarily focuses on tree-based models, Logistic Regression is also used for the BMF ≥ 10% classification task because it offers a straightforward baseline for testing whether lower- and higher-retention cases can already be separated using a relatively simple combination of the inputs (Knauer et al., 2024). Because Random Forest can capture nonlinear correlations and interactions between the simulation parameters while averaging numerous trees to lessen susceptibility to specific cases, it is tried for continuous BMF prediction (</w:t>
-      </w:r>
-      <w:proofErr w:type="spellStart"/>
-      <w:r>
-        <w:rPr>
-          <w:rFonts w:eastAsia="Gungsuh"/>
-        </w:rPr>
-        <w:t>Breiman</w:t>
-      </w:r>
-      <w:proofErr w:type="spellEnd"/>
-      <w:r>
-        <w:rPr>
-          <w:rFonts w:eastAsia="Gungsuh"/>
-        </w:rPr>
-        <w:t xml:space="preserve">, 2001; </w:t>
-      </w:r>
-      <w:proofErr w:type="spellStart"/>
-      <w:r>
-        <w:rPr>
-          <w:rFonts w:eastAsia="Gungsuh"/>
-        </w:rPr>
-        <w:t>Cambioni</w:t>
-      </w:r>
-      <w:proofErr w:type="spellEnd"/>
-      <w:r>
-        <w:rPr>
-          <w:rFonts w:eastAsia="Gungsuh"/>
-        </w:rPr>
-        <w:t xml:space="preserve"> et al., 2019). Additionally, Gradient Boosting is evaluated since it constructs trees in a sequential manner, with each subsequent tree fixing mistakes produced by the ones before it. This could assist capture more precise changes between various encounter settings (Friedman, 2001; Valencia et al., 2019; Timpe et al., 2020).</w:t>
+        <w:t>2.4 How the Physical Effects Were Analysed</w:t>
       </w:r>
     </w:p>
     <w:p>
@@ -1952,8 +2058,7 @@
           <w:lang w:val="en-GB"/>
           <w14:ligatures w14:val="none"/>
         </w:rPr>
-        <w:lastRenderedPageBreak/>
-        <w:t>To</w:t>
+        <w:t xml:space="preserve">Although overall scores are helpful, they do not demonstrate whether the model exhibits reasonable physical </w:t>
       </w:r>
       <w:r>
         <w:rPr>
@@ -1965,9 +2070,8 @@
           <w:lang w:val="en-GB"/>
           <w14:ligatures w14:val="none"/>
         </w:rPr>
-        <w:t xml:space="preserve"> determine whether these modifications enhanced prediction performance, the model was further developed after the baseline by adjusting the model's parameters and incorporating physics-derived attributes computed from the first simulation inputs. Other more sophisticated model variations, such as </w:t>
-      </w:r>
-      <w:proofErr w:type="spellStart"/>
+        <w:t>behaviour</w:t>
+      </w:r>
       <w:r>
         <w:rPr>
           <w:rFonts w:ascii="Times New Roman" w:eastAsia="Times New Roman" w:hAnsi="Times New Roman" w:cs="Times New Roman"/>
@@ -1978,9 +2082,8 @@
           <w:lang w:val="en-GB"/>
           <w14:ligatures w14:val="none"/>
         </w:rPr>
-        <w:t>XGBoost</w:t>
-      </w:r>
-      <w:proofErr w:type="spellEnd"/>
+        <w:t xml:space="preserve"> in various scenarios. Three complimentary </w:t>
+      </w:r>
       <w:r>
         <w:rPr>
           <w:rFonts w:ascii="Times New Roman" w:eastAsia="Times New Roman" w:hAnsi="Times New Roman" w:cs="Times New Roman"/>
@@ -1991,9 +2094,8 @@
           <w:lang w:val="en-GB"/>
           <w14:ligatures w14:val="none"/>
         </w:rPr>
-        <w:t xml:space="preserve"> and two-stage hurdle models, were also investigated; however, they remained exploratory and are not covered in more detail in this project because their primary purpose was to demonstrate the possibility of further model improvement in subsequent work rather than to serve as the project's primary outcome. Since this project uses a small tabular dataset of simulation inputs and numerical results, more sophisticated methods like physics-informed neural networks, which are primarily intended to learn continuous spatial or time-dependent fields while enforcing physical equations, were not investigated (</w:t>
-      </w:r>
-      <w:proofErr w:type="spellStart"/>
+        <w:t>analyses</w:t>
+      </w:r>
       <w:r>
         <w:rPr>
           <w:rFonts w:ascii="Times New Roman" w:eastAsia="Times New Roman" w:hAnsi="Times New Roman" w:cs="Times New Roman"/>
@@ -2004,9 +2106,8 @@
           <w:lang w:val="en-GB"/>
           <w14:ligatures w14:val="none"/>
         </w:rPr>
-        <w:t>Raissi</w:t>
-      </w:r>
-      <w:proofErr w:type="spellEnd"/>
+        <w:t xml:space="preserve"> are employed to verify this. </w:t>
+      </w:r>
       <w:r>
         <w:rPr>
           <w:rFonts w:ascii="Times New Roman" w:eastAsia="Times New Roman" w:hAnsi="Times New Roman" w:cs="Times New Roman"/>
@@ -2017,96 +2118,9 @@
           <w:lang w:val="en-GB"/>
           <w14:ligatures w14:val="none"/>
         </w:rPr>
-        <w:t xml:space="preserve"> et al., 2019).</w:t>
-      </w:r>
-    </w:p>
-    <w:p>
-      <w:pPr>
-        <w:pStyle w:val="Heading2"/>
-        <w:rPr>
-          <w:rFonts w:ascii="Times New Roman" w:hAnsi="Times New Roman" w:cs="Times New Roman"/>
-          <w:lang w:val="en-GB"/>
-        </w:rPr>
-      </w:pPr>
-      <w:r>
-        <w:rPr>
-          <w:rFonts w:ascii="Times New Roman" w:eastAsia="Times New Roman" w:hAnsi="Times New Roman" w:cs="Times New Roman"/>
-          <w:b/>
-          <w:bCs/>
-          <w:color w:val="000000"/>
-          <w:sz w:val="24"/>
-          <w:szCs w:val="24"/>
-          <w:lang w:val="en-GB"/>
-        </w:rPr>
-        <w:t>2.3 Model Testing and Performance Metrics</w:t>
-      </w:r>
-    </w:p>
-    <w:p>
-      <w:r>
-        <w:t xml:space="preserve">One of the main issues with the archive is that it contains repeated rows from the same physical SPH simulation, for example when the same simulation is post-processed using different </w:t>
-      </w:r>
-      <w:proofErr w:type="spellStart"/>
-      <w:r>
-        <w:t>FoF</w:t>
-      </w:r>
-      <w:proofErr w:type="spellEnd"/>
-      <w:r>
-        <w:t xml:space="preserve"> linking lengths. Therefore, the model might be trained on one processed version of a simulation and tested on another version of the same simulation using a random row split. 5-fold </w:t>
-      </w:r>
-      <w:proofErr w:type="spellStart"/>
-      <w:r>
-        <w:t>GroupKFold</w:t>
-      </w:r>
-      <w:proofErr w:type="spellEnd"/>
-      <w:r>
-        <w:t xml:space="preserve"> cross-validation was employed to prevent this. Every out-of-fold (OOF) prediction is made by a model that has not been trained on that physical simulation since all rows from the same physical simulation file are stored in the same fold. </w:t>
-      </w:r>
-    </w:p>
-    <w:p>
-      <w:pPr>
-        <w:rPr>
-          <w:color w:val="FF0000"/>
-        </w:rPr>
-      </w:pPr>
-      <w:r>
-        <w:t>Regression performance is measured using R</w:t>
-      </w:r>
-      <w:r>
-        <w:rPr>
-          <w:vertAlign w:val="superscript"/>
-        </w:rPr>
-        <w:t>2</w:t>
-      </w:r>
-      <w:r>
-        <w:t xml:space="preserve">, mean absolute error (MAE), and root mean squared error (RMSE). Classification performance is measured using balanced accuracy, F1, and ROC AUC. </w:t>
-      </w:r>
-    </w:p>
-    <w:p>
-      <w:pPr>
-        <w:pStyle w:val="Heading2"/>
-        <w:rPr>
-          <w:rFonts w:ascii="Times New Roman" w:hAnsi="Times New Roman" w:cs="Times New Roman"/>
-          <w:color w:val="000000" w:themeColor="text1"/>
-          <w:lang w:val="en-GB"/>
-        </w:rPr>
-      </w:pPr>
-      <w:r>
-        <w:rPr>
-          <w:rFonts w:ascii="Times New Roman" w:eastAsia="Times New Roman" w:hAnsi="Times New Roman" w:cs="Times New Roman"/>
-          <w:b/>
-          <w:bCs/>
-          <w:color w:val="000000" w:themeColor="text1"/>
-          <w:sz w:val="24"/>
-          <w:szCs w:val="24"/>
-          <w:lang w:val="en-GB"/>
-        </w:rPr>
-        <w:t>2.4 How the Physical Effects Were Analysed</w:t>
-      </w:r>
-    </w:p>
-    <w:p>
-      <w:pPr>
-        <w:pStyle w:val="Heading2"/>
-        <w:jc w:val="both"/>
+        <w:t>To</w:t>
+      </w:r>
+      <w:r>
         <w:rPr>
           <w:rFonts w:ascii="Times New Roman" w:eastAsia="Times New Roman" w:hAnsi="Times New Roman" w:cs="Times New Roman"/>
           <w:color w:val="auto"/>
@@ -2116,7 +2130,8 @@
           <w:lang w:val="en-GB"/>
           <w14:ligatures w14:val="none"/>
         </w:rPr>
-      </w:pPr>
+        <w:t xml:space="preserve"> determine how heavily the model depends on each physical input across the dataset, an input-removal test, also known as ablation, first eliminates one original input along with related derived features and </w:t>
+      </w:r>
       <w:r>
         <w:rPr>
           <w:rFonts w:ascii="Times New Roman" w:eastAsia="Times New Roman" w:hAnsi="Times New Roman" w:cs="Times New Roman"/>
@@ -2127,7 +2142,7 @@
           <w:lang w:val="en-GB"/>
           <w14:ligatures w14:val="none"/>
         </w:rPr>
-        <w:t xml:space="preserve">Although overall scores are helpful, they do not demonstrate whether the model exhibits reasonable physical </w:t>
+        <w:t>analyses</w:t>
       </w:r>
       <w:r>
         <w:rPr>
@@ -2139,90 +2154,6 @@
           <w:lang w:val="en-GB"/>
           <w14:ligatures w14:val="none"/>
         </w:rPr>
-        <w:t>behaviour</w:t>
-      </w:r>
-      <w:r>
-        <w:rPr>
-          <w:rFonts w:ascii="Times New Roman" w:eastAsia="Times New Roman" w:hAnsi="Times New Roman" w:cs="Times New Roman"/>
-          <w:color w:val="auto"/>
-          <w:kern w:val="0"/>
-          <w:sz w:val="24"/>
-          <w:szCs w:val="24"/>
-          <w:lang w:val="en-GB"/>
-          <w14:ligatures w14:val="none"/>
-        </w:rPr>
-        <w:t xml:space="preserve"> in various scenarios. Three complimentary </w:t>
-      </w:r>
-      <w:r>
-        <w:rPr>
-          <w:rFonts w:ascii="Times New Roman" w:eastAsia="Times New Roman" w:hAnsi="Times New Roman" w:cs="Times New Roman"/>
-          <w:color w:val="auto"/>
-          <w:kern w:val="0"/>
-          <w:sz w:val="24"/>
-          <w:szCs w:val="24"/>
-          <w:lang w:val="en-GB"/>
-          <w14:ligatures w14:val="none"/>
-        </w:rPr>
-        <w:t>analyses</w:t>
-      </w:r>
-      <w:r>
-        <w:rPr>
-          <w:rFonts w:ascii="Times New Roman" w:eastAsia="Times New Roman" w:hAnsi="Times New Roman" w:cs="Times New Roman"/>
-          <w:color w:val="auto"/>
-          <w:kern w:val="0"/>
-          <w:sz w:val="24"/>
-          <w:szCs w:val="24"/>
-          <w:lang w:val="en-GB"/>
-          <w14:ligatures w14:val="none"/>
-        </w:rPr>
-        <w:t xml:space="preserve"> are employed to verify this. </w:t>
-      </w:r>
-      <w:r>
-        <w:rPr>
-          <w:rFonts w:ascii="Times New Roman" w:eastAsia="Times New Roman" w:hAnsi="Times New Roman" w:cs="Times New Roman"/>
-          <w:color w:val="auto"/>
-          <w:kern w:val="0"/>
-          <w:sz w:val="24"/>
-          <w:szCs w:val="24"/>
-          <w:lang w:val="en-GB"/>
-          <w14:ligatures w14:val="none"/>
-        </w:rPr>
-        <w:t>To</w:t>
-      </w:r>
-      <w:r>
-        <w:rPr>
-          <w:rFonts w:ascii="Times New Roman" w:eastAsia="Times New Roman" w:hAnsi="Times New Roman" w:cs="Times New Roman"/>
-          <w:color w:val="auto"/>
-          <w:kern w:val="0"/>
-          <w:sz w:val="24"/>
-          <w:szCs w:val="24"/>
-          <w:lang w:val="en-GB"/>
-          <w14:ligatures w14:val="none"/>
-        </w:rPr>
-        <w:t xml:space="preserve"> determine how heavily the model depends on each physical input across the dataset, an input-removal test, also known as ablation, first eliminates one original input along with related derived features and </w:t>
-      </w:r>
-      <w:r>
-        <w:rPr>
-          <w:rFonts w:ascii="Times New Roman" w:eastAsia="Times New Roman" w:hAnsi="Times New Roman" w:cs="Times New Roman"/>
-          <w:color w:val="auto"/>
-          <w:kern w:val="0"/>
-          <w:sz w:val="24"/>
-          <w:szCs w:val="24"/>
-          <w:lang w:val="en-GB"/>
-          <w14:ligatures w14:val="none"/>
-        </w:rPr>
-        <w:t>analyses</w:t>
-      </w:r>
-      <w:r>
-        <w:rPr>
-          <w:rFonts w:ascii="Times New Roman" w:eastAsia="Times New Roman" w:hAnsi="Times New Roman" w:cs="Times New Roman"/>
-          <w:color w:val="auto"/>
-          <w:kern w:val="0"/>
-          <w:sz w:val="24"/>
-          <w:szCs w:val="24"/>
-          <w:lang w:val="en-GB"/>
-          <w14:ligatures w14:val="none"/>
-        </w:rPr>
         <w:t xml:space="preserve"> how much model performance declines (Section 3.4). Second, to illustrate the direction and form of the model response, controlled tests alter one input while maintaining the others constant (Section 3.5, Figure 3). Third, matched SPH comparisons examine whether an input's significance varies depending on encounter circumstances (Section 3.5, Figure 4).</w:t>
       </w:r>
     </w:p>
@@ -2249,11 +2180,7 @@
     </w:p>
     <w:p>
       <w:r>
-        <w:t xml:space="preserve">The method also determines whether a new setup is comparable to SPH simulations that are already in the archive because model accuracy alone cannot demonstrate the reliability of each individual forecast because an overall score can conceal areas where the model has insufficient data or produces larger errors. When there are multiple independent SPH simulations and a low held-out prediction error in the surrounding area, predictions are more reliable. When the input </w:t>
-      </w:r>
-      <w:r>
-        <w:lastRenderedPageBreak/>
-        <w:t>combination is outside the sampled region, close to the edge of the available data, or poorly sampled, predictions are deemed less accurate. Figure 5 and section 3.6 provide an analysis of these inspections.</w:t>
+        <w:t>The method also determines whether a new setup is comparable to SPH simulations that are already in the archive because model accuracy alone cannot demonstrate the reliability of each individual forecast because an overall score can conceal areas where the model has insufficient data or produces larger errors. When there are multiple independent SPH simulations and a low held-out prediction error in the surrounding area, predictions are more reliable. When the input combination is outside the sampled region, close to the edge of the available data, or poorly sampled, predictions are deemed less accurate. Figure 5 and section 3.6 provide an analysis of these inspections.</w:t>
       </w:r>
     </w:p>
     <w:p>
@@ -2405,6 +2332,7 @@
           <w:szCs w:val="28"/>
           <w:lang w:val="en-GB"/>
         </w:rPr>
+        <w:lastRenderedPageBreak/>
         <w:t>3. Results</w:t>
       </w:r>
     </w:p>
@@ -2523,7 +2451,6 @@
           <w:lang w:val="en-GB"/>
           <w14:ligatures w14:val="none"/>
         </w:rPr>
-        <w:lastRenderedPageBreak/>
         <w:t>Although close interactions do not always result in strong fragmentation or high BMF, Figure 1 illustrates that both fragmentation and bound retention typically decrease as periapsis increases. The mean BMF rises with tiny periapsis and falls with increasing encounter speed. The relative impacts also vary throughout the sampling range: separation between spin states becomes more apparent around 1.7</w:t>
       </w:r>
       <w:r>
@@ -2670,7 +2597,11 @@
     </w:p>
     <w:p>
       <w:r>
-        <w:t>The outcome demonstrates that retention is concentrated close to the parabolic limit, where the eccentricity proxy is almost equal to 1. Any non-zero BMF extends to around 1.127, although strong retention (BMF &gt; 0.10) only manifests up to a proxy of roughly 1.057. As the encounter gets more hyperbolic, the points compress toward BMF = 0, as Figure 2 clearly illustrates. Faster, more hyperbolic fly-bys leave less material bound to Mars because they spend less time in capture-friendly conditions.</w:t>
+        <w:t xml:space="preserve">The outcome demonstrates that retention is concentrated close to the parabolic limit, where the eccentricity proxy is almost equal to 1. Any non-zero BMF extends to around 1.127, although </w:t>
+      </w:r>
+      <w:r>
+        <w:lastRenderedPageBreak/>
+        <w:t>strong retention (BMF &gt; 0.10) only manifests up to a proxy of roughly 1.057. As the encounter gets more hyperbolic, the points compress toward BMF = 0, as Figure 2 clearly illustrates. Faster, more hyperbolic fly-bys leave less material bound to Mars because they spend less time in capture-friendly conditions.</w:t>
       </w:r>
     </w:p>
     <w:p>
@@ -2778,7 +2709,6 @@
           <w:szCs w:val="24"/>
           <w:lang w:val="en-GB"/>
         </w:rPr>
-        <w:lastRenderedPageBreak/>
         <w:t>3.3 Model Performance and Screening Use</w:t>
       </w:r>
     </w:p>
@@ -2873,23 +2803,41 @@
         <w:spacing w:before="240" w:after="240"/>
       </w:pPr>
       <w:r>
-        <w:t>The input-removal test gives the clearest overall result for BMF. Each original parameter is removed together with derived features that contain the same information, and the resulting decrease in R² shows how much predictive information is lost. Removing periapsis causes the largest decrease, ΔR² = -0.504, making it the strongest overall input. Removing velocity gives ΔR² = -0.279, while removing spin gives ΔR² = -0.258. Asteroid mass has a smaller and less consistent overall effect. These values are overall averages and cannot simply be added together. They show how much the model depends on each input, not whether increasing that input raises or lowers BMF, or whether it directly causes the outcome. Overall, periapsis is strongest, followed by velocity and spin; this ranking can change locally.</w:t>
-      </w:r>
-    </w:p>
-    <w:p>
-      <w:pPr>
-        <w:spacing w:before="240" w:after="240"/>
-      </w:pPr>
-      <w:r>
-        <w:t xml:space="preserve">Fragmentation needs a separate answer. In the SPH data, very small periapsis is required for the most extreme fragmentation, but a close encounter does not guarantee strong breakup. Fragment count is also directly affected by </w:t>
-      </w:r>
-      <w:proofErr w:type="spellStart"/>
-      <w:r>
-        <w:t>FoF</w:t>
-      </w:r>
-      <w:proofErr w:type="spellEnd"/>
-      <w:r>
-        <w:t xml:space="preserve"> linking length. For that reason, this report does not give one simple global ranking for fragmentation. Periapsis defines where the strongest disruption can occur, while the actual fragment pattern depends on the full encounter and on how fragments are grouped during post-processing.</w:t>
+        <w:t xml:space="preserve">The input-removal test </w:t>
+      </w:r>
+      <w:r>
+        <w:t xml:space="preserve">yields the most understandable overall result. The amount of predictive information lost is indicated by the decrease in R2 that results from removing each original </w:t>
+      </w:r>
+      <w:r>
+        <w:lastRenderedPageBreak/>
+        <w:t>parameter along with derived features that carry the same information. The strongest overall input is the removal of periapsis, which results in the biggest drop (ΔR² = -0.504). When velocity is eliminated, ΔR² = -0.279, and when spin is eliminated, ΔR² = -0.258. The overall effect of asteroid mass is smaller and less reliable. These numbers cannot be simply joined together because they represent overall averages. They display the degree to which the model is dependent on each input, not whether increasing that input directly produces the result or rises or lowers BMF. Periapsis is the strongest overall, followed by spin and velocity, however this order may vary locally.</w:t>
+      </w:r>
+    </w:p>
+    <w:p>
+      <w:pPr>
+        <w:pStyle w:val="Heading2"/>
+        <w:jc w:val="both"/>
+        <w:rPr>
+          <w:rFonts w:ascii="Times New Roman" w:eastAsia="Times New Roman" w:hAnsi="Times New Roman" w:cs="Times New Roman"/>
+          <w:color w:val="auto"/>
+          <w:kern w:val="0"/>
+          <w:sz w:val="24"/>
+          <w:szCs w:val="24"/>
+          <w:lang w:val="en-GB"/>
+          <w14:ligatures w14:val="none"/>
+        </w:rPr>
+      </w:pPr>
+      <w:r>
+        <w:rPr>
+          <w:rFonts w:ascii="Times New Roman" w:eastAsia="Times New Roman" w:hAnsi="Times New Roman" w:cs="Times New Roman"/>
+          <w:color w:val="auto"/>
+          <w:kern w:val="0"/>
+          <w:sz w:val="24"/>
+          <w:szCs w:val="24"/>
+          <w:lang w:val="en-GB"/>
+          <w14:ligatures w14:val="none"/>
+        </w:rPr>
+        <w:t>A different response is required for fragmentation. The most extreme fragmentation in the SPH data requires very small periapsis, yet a close encounter does not ensure significant breakdown. FoF connecting length has a direct impact on fragment count as well. This analysis does not provide a single, straightforward global ranking for fragmentation because of this. While the actual fragment pattern depends on the entire encounter and how fragments are gathered during post-processing, periapsis indicates where the largest disruption may occur.</w:t>
       </w:r>
     </w:p>
     <w:p>
@@ -2933,13 +2881,10 @@
     <w:p>
       <w:pPr>
         <w:spacing w:before="240" w:after="240"/>
-      </w:pPr>
-      <w:r>
-        <w:t xml:space="preserve">Overall ranking of which inputs the model depends on most, but it does not show how BMF changes with each input or whether the importance of an input remains the same under different </w:t>
-      </w:r>
-      <w:r>
-        <w:lastRenderedPageBreak/>
-        <w:t>encounter conditions. This section asks two follow-up questions: (1) how does BMF change when one input is varied while the others are fixed, and (2) do the effects of important inputs remain equally strong under different encounter conditions?</w:t>
+        <w:jc w:val="left"/>
+      </w:pPr>
+      <w:r>
+        <w:t>The overall ranking of the inputs on which the model is most dependent does not demonstrate how BMF varies with each input or whether an input's significance stays constant under various encounter circumstances. Two follow-up issues are posed in this section: (1) how does BMF change when one input is changed while the others remain unchanged, and (2) do the impacts of significant inputs hold true under various encounter conditions?</w:t>
       </w:r>
     </w:p>
     <w:p>
@@ -2996,6 +2941,7 @@
           <w:i/>
           <w:iCs/>
         </w:rPr>
+        <w:lastRenderedPageBreak/>
         <w:t xml:space="preserve">Figure 3. BMF checks where one input changes at a time. Dots are available SPH cases and curves are Random Forest predictions with the other inputs fixed. Blue background shows interpolation range, </w:t>
       </w:r>
       <w:proofErr w:type="gramStart"/>
@@ -3034,11 +2980,7 @@
         <w:spacing w:before="240" w:after="240"/>
       </w:pPr>
       <w:r>
-        <w:t xml:space="preserve">The mass plot has much weaker support. Only about two asteroid-mass values have exact SPH cases where all the other chosen conditions are identical. The available higher-mass SPH cases are also concentrated at low periapsis and low velocity, so there is not enough matched data to establish a reliable mass trend. The sharp increase in the Random Forest curve should therefore be treated as model-dependent rather than as a physical threshold. The spin-period panel is nearly flat for the displayed z-axis case, showing that changing spin period has little effect under this particular setup. This does not contradict the overall importance of spin in Section 3.4: it instead </w:t>
-      </w:r>
-      <w:r>
-        <w:lastRenderedPageBreak/>
-        <w:t>shows that an input that is important across the full dataset can have only a small effect under one specific set of encounter conditions.</w:t>
+        <w:t>The mass plot has much weaker support. Only about two asteroid-mass values have exact SPH cases where all the other chosen conditions are identical. The available higher-mass SPH cases are also concentrated at low periapsis and low velocity, so there is not enough matched data to establish a reliable mass trend. The sharp increase in the Random Forest curve should therefore be treated as model-dependent rather than as a physical threshold. The spin-period panel is nearly flat for the displayed z-axis case, showing that changing spin period has little effect under this particular setup. This does not contradict the overall importance of spin in Section 3.4: it instead shows that an input that is important across the full dataset can have only a small effect under one specific set of encounter conditions.</w:t>
       </w:r>
     </w:p>
     <w:p>
@@ -3126,48 +3068,36 @@
           <w:i/>
           <w:iCs/>
         </w:rPr>
-        <w:t xml:space="preserve"> subset at timestep 90000 and </w:t>
+        <w:t xml:space="preserve"> subset at timestep 90000 and FoF linking length 0.004. Left: BMF range across spin states with velocity fixed. Right: BMF range across velocities with spin fixed. These ranges show how strongly outcomes differ within this subset; they do not show direction or prove causation.</w:t>
+      </w:r>
+    </w:p>
+    <w:p>
+      <w:r>
+        <w:t xml:space="preserve">In Figure 4, spin and velocity are used because the archive contains matched cases where these parameters can be varied while mass and key numerical and post-processing settings are kept fixed. Periapsis is then varied across the comparison. In the left panel, </w:t>
       </w:r>
       <w:proofErr w:type="spellStart"/>
       <w:r>
-        <w:rPr>
-          <w:i/>
-          <w:iCs/>
-        </w:rPr>
-        <w:t>FoF</w:t>
+        <w:t>ΔBMF</w:t>
+      </w:r>
+      <w:r>
+        <w:rPr>
+          <w:vertAlign w:val="subscript"/>
+        </w:rPr>
+        <w:t>spin</w:t>
       </w:r>
       <w:proofErr w:type="spellEnd"/>
       <w:r>
         <w:rPr>
-          <w:i/>
-          <w:iCs/>
-        </w:rPr>
-        <w:t xml:space="preserve"> linking length 0.004. Left: BMF range across spin states with velocity fixed. Right: BMF range across velocities with spin fixed. These ranges show how strongly outcomes differ within this subset; they do not show direction or prove causation.</w:t>
-      </w:r>
-    </w:p>
-    <w:p>
-      <w:r>
-        <w:t xml:space="preserve">In Figure 4, spin and velocity are used because the archive contains matched cases where these parameters can be varied while mass and key numerical and post-processing settings are kept fixed. Periapsis is then varied across the comparison. In the left panel, </w:t>
-      </w:r>
-      <w:proofErr w:type="spellStart"/>
-      <w:r>
-        <w:t>ΔBMF</w:t>
-      </w:r>
-      <w:r>
-        <w:rPr>
           <w:vertAlign w:val="subscript"/>
         </w:rPr>
-        <w:t>spin</w:t>
-      </w:r>
-      <w:proofErr w:type="spellEnd"/>
-      <w:r>
-        <w:rPr>
-          <w:vertAlign w:val="subscript"/>
-        </w:rPr>
         <w:t xml:space="preserve">​ </w:t>
       </w:r>
       <w:r>
-        <w:t xml:space="preserve">is the difference between the largest and smallest BMF across available spin states while velocity is fixed. In the right panel, </w:t>
+        <w:t xml:space="preserve">is the difference between </w:t>
+      </w:r>
+      <w:r>
+        <w:lastRenderedPageBreak/>
+        <w:t xml:space="preserve">the largest and smallest BMF across available spin states while velocity is fixed. In the right panel, </w:t>
       </w:r>
       <w:proofErr w:type="spellStart"/>
       <w:r>
@@ -3279,7 +3209,6 @@
           <w:szCs w:val="24"/>
           <w:lang w:val="en-GB"/>
         </w:rPr>
-        <w:lastRenderedPageBreak/>
         <w:t>3.6 Where the Model Can and Cannot Be Trusted</w:t>
       </w:r>
     </w:p>
@@ -3288,21 +3217,7 @@
         <w:rPr>
           <w:color w:val="000000"/>
         </w:rPr>
-        <w:t xml:space="preserve">Trust depends on both prediction error and the amount of nearby SPH data. The coverage-error maps count unique physical simulations rather than repeated </w:t>
-      </w:r>
-      <w:proofErr w:type="spellStart"/>
-      <w:r>
-        <w:rPr>
-          <w:color w:val="000000"/>
-        </w:rPr>
-        <w:t>FoF</w:t>
-      </w:r>
-      <w:proofErr w:type="spellEnd"/>
-      <w:r>
-        <w:rPr>
-          <w:color w:val="000000"/>
-        </w:rPr>
-        <w:t xml:space="preserve"> rows, then compare that count with the average held-out absolute error in the same region. Regions with more simulations often have lower error, while sparse or edge regions can be much worse. Low error alone is not enough: some poorly sampled regions look easy only because the true BMF is usually zero.</w:t>
+        <w:t>Trust depends on both prediction error and the amount of nearby SPH data. The coverage-error maps count unique physical simulations rather than repeated FoF rows, then compare that count with the average held-out absolute error in the same region. Regions with more simulations often have lower error, while sparse or edge regions can be much worse. Low error alone is not enough: some poorly sampled regions look easy only because the true BMF is usually zero.</w:t>
       </w:r>
     </w:p>
     <w:p>
@@ -3750,6 +3665,7 @@
     </w:p>
     <w:p>
       <w:r>
+        <w:lastRenderedPageBreak/>
         <w:t>This shows that the held-out model underpredicts the 1.2 Mars-radii case by 0.0779 BMF and overpredicts the 1.6 Mars-radii case by 0.0825. Because the errors are both large and have opposite signs, the local relationship has not been learned reliably. A new case in this region should therefore be checked with additional SPH rather than trusted only because its mass lies between sampled masses.</w:t>
       </w:r>
     </w:p>
@@ -3974,15 +3890,7 @@
     </w:p>
     <w:p>
       <w:r>
-        <w:t xml:space="preserve">Fragmentation needs more caution than BMF. Close periapsis allows very strong fragmentation but does not guarantee it, and </w:t>
-      </w:r>
-      <w:proofErr w:type="spellStart"/>
-      <w:r>
-        <w:t>FoF</w:t>
-      </w:r>
-      <w:proofErr w:type="spellEnd"/>
-      <w:r>
-        <w:t xml:space="preserve"> linking length directly changes how many fragments are counted. Fragment count and largest-remnant measures therefore provide extra information rather than replacing BMF. The workflow keeps breakup severity and Mars-bound retention separate because strong breakup does not necessarily produce much bound debris.</w:t>
+        <w:t>Fragmentation needs more caution than BMF. Close periapsis allows very strong fragmentation but does not guarantee it, and FoF linking length directly changes how many fragments are counted. Fragment count and largest-remnant measures therefore provide extra information rather than replacing BMF. The workflow keeps breakup severity and Mars-bound retention separate because strong breakup does not necessarily produce much bound debris.</w:t>
       </w:r>
     </w:p>
     <w:p>
@@ -4064,15 +3972,7 @@
         <w:t>Q2. Which parameters most strongly control fragment formation and retained debris?</w:t>
       </w:r>
       <w:r>
-        <w:t xml:space="preserve"> There is no single winner under every condition. Periapsis is the strongest overall input for BMF, while velocity, mass and spin change the outcome within that broad setting. In matched A2000, n65 cases, changing spin gives a BMF range of about 0.06-0.09 below 1.5 Mars radii and reaches up to about 0.24 at larger periapsis. Velocity differences also change with spin state. Fragmentation needs separate fragment and largest-remnant measures because BMF measures retained debris, not breakup alone, and fragment count depends on the </w:t>
-      </w:r>
-      <w:proofErr w:type="spellStart"/>
-      <w:r>
-        <w:t>FoF</w:t>
-      </w:r>
-      <w:proofErr w:type="spellEnd"/>
-      <w:r>
-        <w:t xml:space="preserve"> definition.</w:t>
+        <w:t xml:space="preserve"> There is no single winner under every condition. Periapsis is the strongest overall input for BMF, while velocity, mass and spin change the outcome within that broad setting. In matched A2000, n65 cases, changing spin gives a BMF range of about 0.06-0.09 below 1.5 Mars radii and reaches up to about 0.24 at larger periapsis. Velocity differences also change with spin state. Fragmentation needs separate fragment and largest-remnant measures because BMF measures retained debris, not breakup alone, and fragment count depends on the FoF definition.</w:t>
       </w:r>
     </w:p>
     <w:p>
@@ -4148,34 +4048,12 @@
         <w:rPr>
           <w:color w:val="000000"/>
         </w:rPr>
-        <w:t xml:space="preserve">The ML model also learns patterns from SPH results rather than directly solving the physical laws. It does not enforce conservation of mass, momentum, energy or angular momentum, and it does not follow the later orbits of fragments. A good BMF prediction therefore cannot answer whether debris survives long term, forms a disk or accretes into moons. Fragment measures are also noisier than BMF and more sensitive to the </w:t>
-      </w:r>
-      <w:proofErr w:type="spellStart"/>
-      <w:r>
-        <w:rPr>
-          <w:color w:val="000000"/>
-        </w:rPr>
-        <w:t>FoF</w:t>
-      </w:r>
-      <w:proofErr w:type="spellEnd"/>
-      <w:r>
-        <w:rPr>
-          <w:color w:val="000000"/>
-        </w:rPr>
-        <w:t xml:space="preserve"> linking length used in post-processing.</w:t>
-      </w:r>
-    </w:p>
-    <w:p>
-      <w:r>
-        <w:t xml:space="preserve">Exploratory </w:t>
-      </w:r>
-      <w:proofErr w:type="spellStart"/>
-      <w:r>
-        <w:t>XGBoost</w:t>
-      </w:r>
-      <w:proofErr w:type="spellEnd"/>
-      <w:r>
-        <w:t xml:space="preserve"> and hurdle models achieve higher grouped-validation scores but require further testing before replacing the main Random Forest. Models using outcome-derived quantities are unsuitable for pre-SPH screening because those values are unavailable before simulation.</w:t>
+        <w:t>The ML model also learns patterns from SPH results rather than directly solving the physical laws. It does not enforce conservation of mass, momentum, energy or angular momentum, and it does not follow the later orbits of fragments. A good BMF prediction therefore cannot answer whether debris survives long term, forms a disk or accretes into moons. Fragment measures are also noisier than BMF and more sensitive to the FoF linking length used in post-processing.</w:t>
+      </w:r>
+    </w:p>
+    <w:p>
+      <w:r>
+        <w:t>Exploratory XGBoost and hurdle models achieve higher grouped-validation scores but require further testing before replacing the main Random Forest. Models using outcome-derived quantities are unsuitable for pre-SPH screening because those values are unavailable before simulation.</w:t>
       </w:r>
     </w:p>
     <w:p>
@@ -4224,15 +4102,7 @@
     </w:p>
     <w:p>
       <w:r>
-        <w:t xml:space="preserve">Future work should improve per-prediction reliability estimates and automatic detection of poorly supported input combinations. Exploratory </w:t>
-      </w:r>
-      <w:proofErr w:type="spellStart"/>
-      <w:r>
-        <w:t>XGBoost</w:t>
-      </w:r>
-      <w:proofErr w:type="spellEnd"/>
-      <w:r>
-        <w:t xml:space="preserve"> and hurdle models should also be tested on </w:t>
+        <w:t xml:space="preserve">Future work should improve per-prediction reliability estimates and automatic detection of poorly supported input combinations. Exploratory XGBoost and hurdle models should also be tested on </w:t>
       </w:r>
       <w:r>
         <w:lastRenderedPageBreak/>
@@ -4390,21 +4260,7 @@
         <w:rPr>
           <w:color w:val="000000"/>
         </w:rPr>
-        <w:t xml:space="preserve">, C. (2016). </w:t>
-      </w:r>
-      <w:proofErr w:type="spellStart"/>
-      <w:r>
-        <w:rPr>
-          <w:color w:val="000000"/>
-        </w:rPr>
-        <w:t>XGBoost</w:t>
-      </w:r>
-      <w:proofErr w:type="spellEnd"/>
-      <w:r>
-        <w:rPr>
-          <w:color w:val="000000"/>
-        </w:rPr>
-        <w:t>: A scalable tree boosting system. Proceedings of the 22nd ACM SIGKDD International Conference on Knowledge Discovery and Data Mining, 785</w:t>
+        <w:t>, C. (2016). XGBoost: A scalable tree boosting system. Proceedings of the 22nd ACM SIGKDD International Conference on Knowledge Discovery and Data Mining, 785</w:t>
       </w:r>
       <w:r>
         <w:t>-</w:t>
@@ -6874,7 +6730,6 @@
                 <w:szCs w:val="20"/>
               </w:rPr>
             </w:pPr>
-            <w:proofErr w:type="spellStart"/>
             <w:r>
               <w:rPr>
                 <w:sz w:val="22"/>
@@ -6882,7 +6737,6 @@
               </w:rPr>
               <w:t>XGBoost</w:t>
             </w:r>
-            <w:proofErr w:type="spellEnd"/>
           </w:p>
         </w:tc>
         <w:tc>

</xml_diff>

<commit_message>
docs: ai acknowledgment section
</commit_message>
<xml_diff>
--- a/deliverables/nny124-final-report.docx
+++ b/deliverables/nny124-final-report.docx
@@ -214,7 +214,7 @@
       <w:r>
         <w:t xml:space="preserve">Repository: </w:t>
       </w:r>
-      <w:hyperlink r:id="rId6">
+      <w:hyperlink r:id="rId7">
         <w:r>
           <w:rPr>
             <w:color w:val="1155CC"/>
@@ -469,36 +469,50 @@
       </w:r>
     </w:p>
     <w:p>
-      <w:r>
-        <w:rPr>
-          <w:color w:val="000000"/>
-        </w:rPr>
-        <w:t>The work is useful both scientifically and computationally. Scientifically, the SPH archive contains simulations of a mechanism that could supply debris to the Martian system. Computationally, it addresses a common problem in simulation-based science: a detailed solver can model one setup well, but running many setups is computationally expensive. Once trained, an ML model can examine many combinations quickly, so full SPH simulations can be focused on cases where they are most useful.</w:t>
-      </w:r>
-    </w:p>
-    <w:p>
-      <w:pPr>
-        <w:pStyle w:val="Heading2"/>
-        <w:rPr>
-          <w:rFonts w:ascii="Times New Roman" w:eastAsia="Times New Roman" w:hAnsi="Times New Roman" w:cs="Times New Roman"/>
-          <w:color w:val="auto"/>
-          <w:kern w:val="0"/>
-          <w:sz w:val="24"/>
-          <w:szCs w:val="24"/>
-          <w:lang w:val="en-GB"/>
-          <w14:ligatures w14:val="none"/>
-        </w:rPr>
-      </w:pPr>
-      <w:r>
-        <w:rPr>
-          <w:rFonts w:ascii="Times New Roman" w:eastAsia="Times New Roman" w:hAnsi="Times New Roman" w:cs="Times New Roman"/>
-          <w:color w:val="auto"/>
-          <w:kern w:val="0"/>
-          <w:sz w:val="24"/>
-          <w:szCs w:val="24"/>
-          <w:lang w:val="en-GB"/>
-          <w14:ligatures w14:val="none"/>
-        </w:rPr>
+      <w:pPr>
+        <w:rPr>
+          <w:color w:val="000000"/>
+        </w:rPr>
+      </w:pPr>
+      <w:r>
+        <w:rPr>
+          <w:color w:val="000000"/>
+        </w:rPr>
+        <w:t xml:space="preserve">The work is useful both scientifically and computationally. </w:t>
+      </w:r>
+      <w:r>
+        <w:rPr>
+          <w:color w:val="000000"/>
+        </w:rPr>
+        <w:t xml:space="preserve">From a scientific perspective, simulations of a mechanism that might provide debris to the Martian system can be found in the SPH archive. It solves a frequent computational issue in simulation-based science: while a thorough solver can accurately simulate one setup, it is computationally costly to run multiple setups. Full SPH simulations can be concentrated on situations where ML models are most helpful because, once trained, they can swiftly </w:t>
+      </w:r>
+      <w:r>
+        <w:rPr>
+          <w:color w:val="000000"/>
+        </w:rPr>
+        <w:t>analyse</w:t>
+      </w:r>
+      <w:r>
+        <w:rPr>
+          <w:color w:val="000000"/>
+        </w:rPr>
+        <w:t xml:space="preserve"> </w:t>
+      </w:r>
+      <w:r>
+        <w:rPr>
+          <w:color w:val="000000"/>
+        </w:rPr>
+        <w:t>many</w:t>
+      </w:r>
+      <w:r>
+        <w:rPr>
+          <w:color w:val="000000"/>
+        </w:rPr>
+        <w:t xml:space="preserve"> combinations.</w:t>
+      </w:r>
+    </w:p>
+    <w:p>
+      <w:r>
         <w:t>The primary contribution is the integration of physical interpretation with unambiguous testing for the reliability of an ML prediction. Each simulation's particle-level SPH outputs are combined into a single set of results by the workflow, which also tests the model on physical simulations that weren't used for training, compares matched and controlled cases, calculates the amount of similar SPH data that is present nearby, and uses these checks to suggest whether a new SPH run is necessary.</w:t>
       </w:r>
     </w:p>
@@ -1982,15 +1996,7 @@
       </w:r>
       <w:r>
         <w:lastRenderedPageBreak/>
-        <w:t xml:space="preserve">linking lengths. Therefore, the model might be trained on one processed version of a simulation and tested on another version of the same simulation using a random row split. 5-fold </w:t>
-      </w:r>
-      <w:proofErr w:type="spellStart"/>
-      <w:r>
-        <w:t>GroupKFold</w:t>
-      </w:r>
-      <w:proofErr w:type="spellEnd"/>
-      <w:r>
-        <w:t xml:space="preserve"> cross-validation was employed to prevent this. Every out-of-fold (OOF) prediction is made by a model that has not been trained on that physical simulation since all rows from the same physical simulation file are stored in the same fold. </w:t>
+        <w:t xml:space="preserve">linking lengths. Therefore, the model might be trained on one processed version of a simulation and tested on another version of the same simulation using a random row split. 5-fold GroupKFold cross-validation was employed to prevent this. Every out-of-fold (OOF) prediction is made by a model that has not been trained on that physical simulation since all rows from the same physical simulation file are stored in the same fold. </w:t>
       </w:r>
     </w:p>
     <w:p>
@@ -2381,7 +2387,7 @@
                     <pic:cNvPicPr/>
                   </pic:nvPicPr>
                   <pic:blipFill>
-                    <a:blip r:embed="rId7"/>
+                    <a:blip r:embed="rId8"/>
                     <a:stretch>
                       <a:fillRect/>
                     </a:stretch>
@@ -2628,7 +2634,7 @@
                     <pic:cNvPicPr/>
                   </pic:nvPicPr>
                   <pic:blipFill>
-                    <a:blip r:embed="rId8"/>
+                    <a:blip r:embed="rId9"/>
                     <a:stretch>
                       <a:fillRect/>
                     </a:stretch>
@@ -2717,7 +2723,7 @@
         <w:spacing w:before="240" w:after="240"/>
       </w:pPr>
       <w:r>
-        <w:t>The baseline model comparisons support the choice of Random Forest for continuous BMF prediction. Gradient Boosting achieves R² = 0.8840 and MAE = 0.0228, compared with R² = 0.8971, MAE = 0.0184 and RMSE = 0.0298 for Random Forest. Gradient Boosting therefore provides no improvement over Random Forest for this dataset.</w:t>
+        <w:t>The selection of Random Forest for continuous BMF prediction is supported by the baseline model comparisons. While Random Forest produces R² = 0.8971, MAE = 0.0184, and RMSE = 0.0298, Gradient Boosting achieves R² = 0.8840 and MAE = 0.0228. For this dataset, Gradient Boosting is therefore no better than Random Forest.</w:t>
       </w:r>
     </w:p>
     <w:p>
@@ -2757,7 +2763,13 @@
         <w:spacing w:before="240" w:after="240"/>
       </w:pPr>
       <w:r>
-        <w:t>Tuning the Random Forest, by adjusting its model settings, produces no meaningful improvement, changing performance only from R² = 0.8971, MAE = 0.0184 and RMSE = 0.0298 to R² = 0.8983, MAE = 0.0186 and RMSE = 0.0297. In contrast, adding the physics-derived features calculated from the original simulation inputs (see Appendix A, Table A1) improves performance to R² = 0.9225, MAE = 0.0179 and RMSE = 0.0259, so this version is used as the main model. This is an overall average and does not mean that every individual prediction has the same error (see Appendix A for further details).</w:t>
+        <w:t>Tuning the Random Forest by adjusting its model settings</w:t>
+      </w:r>
+      <w:r>
+        <w:t xml:space="preserve"> </w:t>
+      </w:r>
+      <w:r>
+        <w:t>only changes from R² = 0.8971, MAE = 0.0184, and RMSE = 0.0298 to R² = 0.8983, MAE = 0.0186, and RMSE = 0.0297. On the other hand, performance is improved to R² = 0.9225, MAE = 0.0179, and RMSE = 0.0259 when the physics-derived features computed from the original simulation inputs are added (see Appendix A, Table A1). This version is utilized as the primary model. This is an overall average and does not imply that the error of each individual forecast is the same (see Appendix A for more information).</w:t>
       </w:r>
     </w:p>
     <w:p>
@@ -2910,7 +2922,7 @@
                     <pic:cNvPicPr/>
                   </pic:nvPicPr>
                   <pic:blipFill>
-                    <a:blip r:embed="rId9"/>
+                    <a:blip r:embed="rId10"/>
                     <a:stretch>
                       <a:fillRect/>
                     </a:stretch>
@@ -2944,15 +2956,13 @@
         <w:lastRenderedPageBreak/>
         <w:t xml:space="preserve">Figure 3. BMF checks where one input changes at a time. Dots are available SPH cases and curves are Random Forest predictions with the other inputs fixed. Blue background shows interpolation range, </w:t>
       </w:r>
-      <w:proofErr w:type="gramStart"/>
       <w:r>
         <w:rPr>
           <w:i/>
           <w:iCs/>
         </w:rPr>
-        <w:t>meanwhile</w:t>
-      </w:r>
-      <w:proofErr w:type="gramEnd"/>
+        <w:t>meanwhile,</w:t>
+      </w:r>
       <w:r>
         <w:rPr>
           <w:i/>
@@ -2966,13 +2976,7 @@
         <w:spacing w:before="240" w:after="240"/>
       </w:pPr>
       <w:r>
-        <w:t>Figure 3 varies one input at a time while keeping the others fixed and compares the Random Forest response with available SPH cases. Under the setup shown here, increasing periapsis generally reduces predicted BMF from about 0.25 at 1.2</w:t>
-      </w:r>
-      <w:r>
-        <w:t xml:space="preserve"> </w:t>
-      </w:r>
-      <w:r>
-        <w:t>Mars-radii​ to about 0.10 at 3.0 Mars-radii​, although the available SPH cases fall to approximately zero beyond about 2.2 Mars-radii​. Increasing encounter velocity produces a clearer decrease, from about 0.25 at 0 km/s to approximately zero above 1 km/s.</w:t>
+        <w:t>Figure 3 compares the Random Forest response with available SPH scenarios by changing one input at a time while holding the others constant. Although the available SPH examples drop to around zero beyond about 2.2 Mars-radii, increasing periapsis generally lowers expected BMF under the setup provided here, from about 0.25 at 1.2 Mars-radii to about 0.10 at 3.0 Mars-radii. A more pronounced decline occurs as encounter velocity increases, from roughly 0.25 at 0 km/s to roughly zero above 1 km/s.</w:t>
       </w:r>
     </w:p>
     <w:p>
@@ -2980,7 +2984,13 @@
         <w:spacing w:before="240" w:after="240"/>
       </w:pPr>
       <w:r>
-        <w:t>The mass plot has much weaker support. Only about two asteroid-mass values have exact SPH cases where all the other chosen conditions are identical. The available higher-mass SPH cases are also concentrated at low periapsis and low velocity, so there is not enough matched data to establish a reliable mass trend. The sharp increase in the Random Forest curve should therefore be treated as model-dependent rather than as a physical threshold. The spin-period panel is nearly flat for the displayed z-axis case, showing that changing spin period has little effect under this particular setup. This does not contradict the overall importance of spin in Section 3.4: it instead shows that an input that is important across the full dataset can have only a small effect under one specific set of encounter conditions.</w:t>
+        <w:t xml:space="preserve">Support for the mass plot is far weaker. There are only roughly two asteroid-mass values with exact SPH scenarios in which every other selected condition is the same. There is insufficient matched data to construct a trustworthy mass trend because the available higher-mass SPH examples are likewise concentrated at low periapsis and low velocity. Therefore, rather of being viewed as a physical threshold, the sharp increase in the Random Forest curve should be considered </w:t>
+      </w:r>
+      <w:r>
+        <w:t>model dependent</w:t>
+      </w:r>
+      <w:r>
+        <w:t>. For the z-axis scenario that is shown, the spin-period panel is almost flat, indicating that altering the spin period has minimal impact in this specific configuration. This demonstrates that an input that is significant throughout the whole dataset can only have a minor impact given a particular set of encounter conditions, which does not contradict the overall significance of spin in Section 3.4.</w:t>
       </w:r>
     </w:p>
     <w:p>
@@ -3006,7 +3016,7 @@
                     <pic:cNvPicPr/>
                   </pic:nvPicPr>
                   <pic:blipFill>
-                    <a:blip r:embed="rId10"/>
+                    <a:blip r:embed="rId11"/>
                     <a:srcRect t="16637"/>
                     <a:stretch>
                       <a:fillRect/>
@@ -3071,13 +3081,11 @@
         <w:t xml:space="preserve"> subset at timestep 90000 and FoF linking length 0.004. Left: BMF range across spin states with velocity fixed. Right: BMF range across velocities with spin fixed. These ranges show how strongly outcomes differ within this subset; they do not show direction or prove causation.</w:t>
       </w:r>
     </w:p>
-    <w:p>
-      <w:r>
-        <w:t xml:space="preserve">In Figure 4, spin and velocity are used because the archive contains matched cases where these parameters can be varied while mass and key numerical and post-processing settings are kept fixed. Periapsis is then varied across the comparison. In the left panel, </w:t>
-      </w:r>
-      <w:proofErr w:type="spellStart"/>
-      <w:r>
-        <w:t>ΔBMF</w:t>
+    <w:p/>
+    <w:p>
+      <w:r>
+        <w:lastRenderedPageBreak/>
+        <w:t>Because the archive contains matching situations where these parameters can be changed while mass and other numerical and post-processing settings remain unchanged, spin and velocity are used in Figure 4. Next, periapsis is changed throughout the comparison. When velocity is fixed, the difference between the largest and smallest BMF over all possible spin states is represented by ΔBMF</w:t>
       </w:r>
       <w:r>
         <w:rPr>
@@ -3085,110 +3093,93 @@
         </w:rPr>
         <w:t>spin</w:t>
       </w:r>
-      <w:proofErr w:type="spellEnd"/>
+      <w:r>
+        <w:t xml:space="preserve"> in the left panel. In the right panel, spin is fixed and ΔBMF</w:t>
+      </w:r>
       <w:r>
         <w:rPr>
           <w:vertAlign w:val="subscript"/>
         </w:rPr>
-        <w:t xml:space="preserve">​ </w:t>
-      </w:r>
-      <w:r>
-        <w:t xml:space="preserve">is the difference between </w:t>
-      </w:r>
-      <w:r>
-        <w:lastRenderedPageBreak/>
-        <w:t xml:space="preserve">the largest and smallest BMF across available spin states while velocity is fixed. In the right panel, </w:t>
-      </w:r>
-      <w:proofErr w:type="spellStart"/>
-      <w:r>
-        <w:t>ΔBMF</w:t>
+        <w:t>velocity</w:t>
+      </w:r>
+      <w:r>
+        <w:t xml:space="preserve"> falls within the same range across all possible velocities. A higher ΔBMF indicates that, in certain circumstances, altering that parameter has a greater impact on the retained mass. </w:t>
+      </w:r>
+    </w:p>
+    <w:p>
+      <w:r>
+        <w:t>In Figure 4, spin and velocity are used because the archive contains matched cases where these parameters can be varied while mass and key numerical and post-processing settings are kept fixed. Periapsis is then varied across the comparison. In the left panel, ΔBMF</w:t>
       </w:r>
       <w:r>
         <w:rPr>
           <w:vertAlign w:val="subscript"/>
         </w:rPr>
-        <w:t>velocity</w:t>
-      </w:r>
-      <w:proofErr w:type="spellEnd"/>
+        <w:t xml:space="preserve">spin​ </w:t>
+      </w:r>
+      <w:r>
+        <w:t>is the difference between the largest and smallest BMF across available spin states while velocity is fixed. In the right panel, ΔBMF</w:t>
+      </w:r>
       <w:r>
         <w:rPr>
           <w:vertAlign w:val="subscript"/>
         </w:rPr>
-        <w:t xml:space="preserve">​ </w:t>
+        <w:t xml:space="preserve">velocity​ </w:t>
       </w:r>
       <w:r>
         <w:t>is the same range across available velocities while spin is fixed. A larger ΔBMF means that changing that parameter makes a larger difference to the retained mass under those conditions.</w:t>
       </w:r>
     </w:p>
     <w:p>
-      <w:pPr>
-        <w:spacing w:before="240" w:after="240"/>
-      </w:pPr>
-      <w:r>
-        <w:t>The result shows clearly that the strength of each parameter is not constant. Below about 1.5 Mars-radii</w:t>
+      <w:r>
+        <w:t>The outcome makes it abundantly evident that each parameter's intensity varies. Changing spin results in a BMF range of around 0.06-0.09 below about 1.5 Mars-radii. This can grow much stronger at bigger periapsis: the spin-related range increases to around 0.24 at 1.8 Mars-radii for v</w:t>
       </w:r>
       <w:r>
         <w:rPr>
           <w:vertAlign w:val="subscript"/>
         </w:rPr>
-        <w:t>​</w:t>
-      </w:r>
-      <w:r>
-        <w:t>, changing spin gives a BMF range of roughly 0.06-0.09. At larger periapsis, this can become much stronger: for v</w:t>
-      </w:r>
-      <w:r>
-        <w:rPr>
-          <w:rFonts w:eastAsia="Gungsuh"/>
-          <w:vertAlign w:val="subscript"/>
-        </w:rPr>
         <w:t>∞</w:t>
       </w:r>
       <w:r>
-        <w:t>​=0, the spin-related range rises to about 0.24 at 1.8 Mars-radii</w:t>
-      </w:r>
-      <w:r>
-        <w:rPr>
-          <w:vertAlign w:val="subscript"/>
-        </w:rPr>
-        <w:t>​</w:t>
-      </w:r>
-      <w:r>
-        <w:t>, while several other velocity groups reach about 0.14-0.22 between 1.6 and 2.0 Mars-radii​. Velocity shows a different pattern. For the no-spin cases, the velocity-related BMF range is about 0.18 at 1.2-1.4 Mars-radii</w:t>
-      </w:r>
-      <w:r>
-        <w:rPr>
-          <w:vertAlign w:val="subscript"/>
-        </w:rPr>
-        <w:t>​</w:t>
-      </w:r>
-      <w:r>
-        <w:t>, falls to about 0.14 at 1.6 Mars-radii</w:t>
-      </w:r>
-      <w:r>
-        <w:rPr>
-          <w:vertAlign w:val="subscript"/>
-        </w:rPr>
-        <w:t>​</w:t>
-      </w:r>
-      <w:r>
-        <w:t>, and reaches zero by 1.8 Mars-radii</w:t>
-      </w:r>
-      <w:r>
-        <w:rPr>
-          <w:vertAlign w:val="subscript"/>
-        </w:rPr>
-        <w:t>​</w:t>
-      </w:r>
-      <w:r>
-        <w:t>. In contrast, the sampled prograde z-spin cases still show velocity-related ranges of about 0.15-0.19 between 1.6 and 2.0 Mars-radii​.</w:t>
-      </w:r>
-    </w:p>
-    <w:p>
-      <w:pPr>
-        <w:spacing w:before="240" w:after="240"/>
-      </w:pPr>
-      <w:r>
-        <w:t>These results confirm regime-dependent parameter importance: spin dominates some conditions while velocity dominates others, so the overall ablation ranking is not universal.</w:t>
+        <w:t>=0, while various other velocity groups reach approximately 0.14</w:t>
+      </w:r>
+      <w:r>
+        <w:t>-</w:t>
+      </w:r>
+      <w:r>
+        <w:t>0.22 between 1.6 and 2.0 Mars-radii. The pattern of velocity is distinct. The velocity-related BMF range for the no-spin instances is approximately 0.18 at 1.2</w:t>
+      </w:r>
+      <w:r>
+        <w:t>-</w:t>
+      </w:r>
+      <w:r>
+        <w:t>1.4 Mars radii, decreases to approximately 0.14 at 1.6 Mars radii, and reaches zero by 1.8 Mars radii. On the other hand, velocity-related ranges of roughly 0.15-0.19 between 1.6 and 2.0 Mars-radii are still seen in the sampled prograde z-spin situations.</w:t>
+      </w:r>
+    </w:p>
+    <w:p>
+      <w:pPr>
+        <w:pStyle w:val="Heading2"/>
+        <w:jc w:val="both"/>
+        <w:rPr>
+          <w:rFonts w:ascii="Times New Roman" w:eastAsia="Times New Roman" w:hAnsi="Times New Roman" w:cs="Times New Roman"/>
+          <w:color w:val="auto"/>
+          <w:kern w:val="0"/>
+          <w:sz w:val="24"/>
+          <w:szCs w:val="24"/>
+          <w:lang w:val="en-GB"/>
+          <w14:ligatures w14:val="none"/>
+        </w:rPr>
+      </w:pPr>
+      <w:r>
+        <w:rPr>
+          <w:rFonts w:ascii="Times New Roman" w:eastAsia="Times New Roman" w:hAnsi="Times New Roman" w:cs="Times New Roman"/>
+          <w:color w:val="auto"/>
+          <w:kern w:val="0"/>
+          <w:sz w:val="24"/>
+          <w:szCs w:val="24"/>
+          <w:lang w:val="en-GB"/>
+          <w14:ligatures w14:val="none"/>
+        </w:rPr>
+        <w:t>These findings support the importance of regime-dependent parameters: the overall ablation ranking is not universal because spin predominates under some situations while velocity predominates under others.</w:t>
       </w:r>
     </w:p>
     <w:p>
@@ -3222,15 +3213,109 @@
     </w:p>
     <w:p>
       <w:r>
-        <w:t xml:space="preserve">A case can lie within the range of every individual input and still be poorly supported because the model depends on input combinations. Figure 5 therefore compares local simulation coverage </w:t>
-      </w:r>
-      <w:proofErr w:type="spellStart"/>
-      <w:r>
-        <w:t>with held</w:t>
-      </w:r>
-      <w:proofErr w:type="spellEnd"/>
-      <w:r>
-        <w:t>-out error and pairwise parameter coverage. The pairwise maps reveal unsampled combinations that are hidden by individual input ranges. A prediction is treated as interpolation only when similar SPH cases exist nearby in the input space.</w:t>
+        <w:t>A case can lie within the range of every individual input and still be poorly supported because the model depends on input combinations. Figure 5 therefore compares local simulation coverage with held-out error and pairwise parameter coverage. The pairwise maps reveal unsampled combinations that are hidden by individual input ranges. A prediction is treated as interpolation only when similar SPH cases exist nearby in the input space.</w:t>
+      </w:r>
+    </w:p>
+    <w:p>
+      <w:pPr>
+        <w:keepNext/>
+        <w:spacing w:after="0"/>
+        <w:jc w:val="center"/>
+      </w:pPr>
+      <w:r>
+        <w:rPr>
+          <w:noProof/>
+        </w:rPr>
+        <w:lastRenderedPageBreak/>
+        <w:drawing>
+          <wp:inline distT="0" distB="0" distL="114300" distR="114300" wp14:anchorId="5D08FC53" wp14:editId="3CC4E8E0">
+            <wp:extent cx="4268788" cy="6836818"/>
+            <wp:effectExtent l="0" t="0" r="0" b="0"/>
+            <wp:docPr id="6" name="image6.png"/>
+            <wp:cNvGraphicFramePr/>
+            <a:graphic xmlns:a="http://schemas.openxmlformats.org/drawingml/2006/main">
+              <a:graphicData uri="http://schemas.openxmlformats.org/drawingml/2006/picture">
+                <pic:pic xmlns:pic="http://schemas.openxmlformats.org/drawingml/2006/picture">
+                  <pic:nvPicPr>
+                    <pic:cNvPr id="6" name="image6.png"/>
+                    <pic:cNvPicPr/>
+                  </pic:nvPicPr>
+                  <pic:blipFill>
+                    <a:blip r:embed="rId12"/>
+                    <a:stretch>
+                      <a:fillRect/>
+                    </a:stretch>
+                  </pic:blipFill>
+                  <pic:spPr>
+                    <a:xfrm>
+                      <a:off x="0" y="0"/>
+                      <a:ext cx="4268788" cy="6836818"/>
+                    </a:xfrm>
+                    <a:prstGeom prst="rect">
+                      <a:avLst/>
+                    </a:prstGeom>
+                  </pic:spPr>
+                </pic:pic>
+              </a:graphicData>
+            </a:graphic>
+          </wp:inline>
+        </w:drawing>
+      </w:r>
+    </w:p>
+    <w:p>
+      <w:pPr>
+        <w:keepLines/>
+        <w:pBdr>
+          <w:top w:val="nil"/>
+          <w:left w:val="nil"/>
+          <w:bottom w:val="nil"/>
+          <w:right w:val="nil"/>
+          <w:between w:val="nil"/>
+        </w:pBdr>
+        <w:jc w:val="center"/>
+      </w:pPr>
+      <w:r>
+        <w:rPr>
+          <w:i/>
+          <w:iCs/>
+        </w:rPr>
+        <w:t xml:space="preserve">Figure 5. Checks used to judge prediction trust. </w:t>
+      </w:r>
+      <w:r>
+        <w:rPr>
+          <w:i/>
+          <w:iCs/>
+        </w:rPr>
+        <w:br/>
+        <w:t xml:space="preserve">(Top: the number of unique SPH simulations and the mean held-out absolute error provide different information. Bottom: pairwise coverage shows input combinations that are missing even when each individual value is within its sampled range.) Grey means no SPH data in that bin, light blue means SPH data </w:t>
+      </w:r>
+      <w:r>
+        <w:rPr>
+          <w:i/>
+          <w:iCs/>
+        </w:rPr>
+        <w:t>exists,</w:t>
+      </w:r>
+      <w:r>
+        <w:rPr>
+          <w:i/>
+          <w:iCs/>
+        </w:rPr>
+        <w:t xml:space="preserve"> but the mean observed BMF is 0, while other coloured cells </w:t>
+      </w:r>
+      <w:r>
+        <w:rPr>
+          <w:i/>
+          <w:iCs/>
+        </w:rPr>
+        <w:t>mean</w:t>
+      </w:r>
+      <w:r>
+        <w:rPr>
+          <w:i/>
+          <w:iCs/>
+        </w:rPr>
+        <w:t xml:space="preserve"> that SPH data exists and mean observed BMF is &gt; 0.</w:t>
       </w:r>
     </w:p>
     <w:p>
@@ -3240,6 +3325,7 @@
         <w:jc w:val="left"/>
       </w:pPr>
       <w:r>
+        <w:lastRenderedPageBreak/>
         <w:t>Table 2 gives a concrete example of this problem for the sparsely sampled 10</w:t>
       </w:r>
       <w:r>
@@ -3665,110 +3751,7 @@
     </w:p>
     <w:p>
       <w:r>
-        <w:lastRenderedPageBreak/>
         <w:t>This shows that the held-out model underpredicts the 1.2 Mars-radii case by 0.0779 BMF and overpredicts the 1.6 Mars-radii case by 0.0825. Because the errors are both large and have opposite signs, the local relationship has not been learned reliably. A new case in this region should therefore be checked with additional SPH rather than trusted only because its mass lies between sampled masses.</w:t>
-      </w:r>
-    </w:p>
-    <w:p>
-      <w:pPr>
-        <w:keepNext/>
-        <w:spacing w:after="0"/>
-        <w:jc w:val="center"/>
-      </w:pPr>
-      <w:r>
-        <w:rPr>
-          <w:noProof/>
-        </w:rPr>
-        <w:lastRenderedPageBreak/>
-        <w:drawing>
-          <wp:inline distT="0" distB="0" distL="114300" distR="114300" wp14:anchorId="5D08FC53" wp14:editId="3CC4E8E0">
-            <wp:extent cx="4268788" cy="6836818"/>
-            <wp:effectExtent l="0" t="0" r="0" b="0"/>
-            <wp:docPr id="6" name="image6.png"/>
-            <wp:cNvGraphicFramePr/>
-            <a:graphic xmlns:a="http://schemas.openxmlformats.org/drawingml/2006/main">
-              <a:graphicData uri="http://schemas.openxmlformats.org/drawingml/2006/picture">
-                <pic:pic xmlns:pic="http://schemas.openxmlformats.org/drawingml/2006/picture">
-                  <pic:nvPicPr>
-                    <pic:cNvPr id="6" name="image6.png"/>
-                    <pic:cNvPicPr/>
-                  </pic:nvPicPr>
-                  <pic:blipFill>
-                    <a:blip r:embed="rId11"/>
-                    <a:stretch>
-                      <a:fillRect/>
-                    </a:stretch>
-                  </pic:blipFill>
-                  <pic:spPr>
-                    <a:xfrm>
-                      <a:off x="0" y="0"/>
-                      <a:ext cx="4268788" cy="6836818"/>
-                    </a:xfrm>
-                    <a:prstGeom prst="rect">
-                      <a:avLst/>
-                    </a:prstGeom>
-                  </pic:spPr>
-                </pic:pic>
-              </a:graphicData>
-            </a:graphic>
-          </wp:inline>
-        </w:drawing>
-      </w:r>
-    </w:p>
-    <w:p>
-      <w:pPr>
-        <w:keepLines/>
-        <w:pBdr>
-          <w:top w:val="nil"/>
-          <w:left w:val="nil"/>
-          <w:bottom w:val="nil"/>
-          <w:right w:val="nil"/>
-          <w:between w:val="nil"/>
-        </w:pBdr>
-        <w:jc w:val="center"/>
-      </w:pPr>
-      <w:r>
-        <w:rPr>
-          <w:i/>
-          <w:iCs/>
-        </w:rPr>
-        <w:t xml:space="preserve">Figure 5. Checks used to judge prediction trust. </w:t>
-      </w:r>
-      <w:r>
-        <w:rPr>
-          <w:i/>
-          <w:iCs/>
-        </w:rPr>
-        <w:br/>
-        <w:t xml:space="preserve">(Top: the number of unique SPH simulations and the mean held-out absolute error provide different information. Bottom: pairwise coverage shows input combinations that are missing even when each individual value is within its sampled range.) Grey means no SPH data in that bin, light blue means SPH data </w:t>
-      </w:r>
-      <w:r>
-        <w:rPr>
-          <w:i/>
-          <w:iCs/>
-        </w:rPr>
-        <w:t>exists,</w:t>
-      </w:r>
-      <w:r>
-        <w:rPr>
-          <w:i/>
-          <w:iCs/>
-        </w:rPr>
-        <w:t xml:space="preserve"> but the mean observed BMF is 0, while other coloured cells </w:t>
-      </w:r>
-      <w:r>
-        <w:rPr>
-          <w:i/>
-          <w:iCs/>
-        </w:rPr>
-        <w:t>mean</w:t>
-      </w:r>
-      <w:r>
-        <w:rPr>
-          <w:i/>
-          <w:iCs/>
-        </w:rPr>
-        <w:t xml:space="preserve"> that SPH data exists and mean observed BMF is &gt; 0.</w:t>
       </w:r>
     </w:p>
     <w:p>
@@ -3789,7 +3772,6 @@
           <w:szCs w:val="24"/>
           <w:lang w:val="en-GB"/>
         </w:rPr>
-        <w:lastRenderedPageBreak/>
         <w:t>3.7 How the Model Supports SPH Decisions</w:t>
       </w:r>
     </w:p>
@@ -3852,7 +3834,11 @@
     </w:p>
     <w:p>
       <w:r>
-        <w:t>The main physical result is that the effect of each parameter depends on the other encounter conditions. Periapsis sets the broad strength of the tidal encounter, encounter speed affects how long the interaction lasts and how favourable capture is, and mass and spin modify the result within those conditions. The controlled tests show the clearest directions for periapsis and speed. The matched simulations show that the size of the spin and velocity effects changes with periapsis and spin state.</w:t>
+        <w:t xml:space="preserve">The main physical result is that the effect of each parameter depends on the other encounter conditions. Periapsis sets the broad strength of the tidal encounter, encounter speed affects how </w:t>
+      </w:r>
+      <w:r>
+        <w:lastRenderedPageBreak/>
+        <w:t>long the interaction lasts and how favourable capture is, and mass and spin modify the result within those conditions. The controlled tests show the clearest directions for periapsis and speed. The matched simulations show that the size of the spin and velocity effects changes with periapsis and spin state.</w:t>
       </w:r>
     </w:p>
     <w:p>
@@ -3876,7 +3862,6 @@
     </w:p>
     <w:p>
       <w:r>
-        <w:lastRenderedPageBreak/>
         <w:t xml:space="preserve">The ablation and matched analyses answer different questions. Periapsis is strongest overall, but matched cases show that spin or velocity can become more influential under </w:t>
       </w:r>
       <w:proofErr w:type="gramStart"/>
@@ -3960,7 +3945,11 @@
         <w:t xml:space="preserve">Q1. How do orbital and physical parameters influence disruption and bound mass? </w:t>
       </w:r>
       <w:r>
-        <w:t>Closer and slower encounters generally retain more debris, but the effect depends on the other inputs. In the representative controlled test, predicted BMF decreases from about 25% as periapsis increases from 1.2 Mars radii, while the available SPH cases fall to approximately zero beyond about 2.2 Mars radii. Increasing encounter speed gives a clearer decrease, from about 25% at 0 km/s to approximately zero above 1 km/s. These are condition-specific responses rather than universal thresholds. Periapsis controls tidal strength, speed changes the encounter and capture conditions, and mass and spin modify the result.</w:t>
+        <w:t xml:space="preserve">Closer and slower encounters generally retain more debris, but the effect depends on the other inputs. In the representative controlled test, predicted BMF decreases from about 25% as periapsis increases </w:t>
+      </w:r>
+      <w:r>
+        <w:lastRenderedPageBreak/>
+        <w:t>from 1.2 Mars radii, while the available SPH cases fall to approximately zero beyond about 2.2 Mars radii. Increasing encounter speed gives a clearer decrease, from about 25% at 0 km/s to approximately zero above 1 km/s. These are condition-specific responses rather than universal thresholds. Periapsis controls tidal strength, speed changes the encounter and capture conditions, and mass and spin modify the result.</w:t>
       </w:r>
     </w:p>
     <w:p>
@@ -3993,11 +3982,7 @@
         <w:t>2</w:t>
       </w:r>
       <w:r>
-        <w:t xml:space="preserve"> of 0.9225, </w:t>
-      </w:r>
-      <w:r>
-        <w:lastRenderedPageBreak/>
-        <w:t>MAE of 0.0179, and RMSE of 0.0259. However, performance is not equally reliable everywhere. In the sparsely sampled 10</w:t>
+        <w:t xml:space="preserve"> of 0.9225, MAE of 0.0179, and RMSE of 0.0259. However, performance is not equally reliable everywhere. In the sparsely sampled 10</w:t>
       </w:r>
       <w:r>
         <w:rPr>
@@ -4048,7 +4033,14 @@
         <w:rPr>
           <w:color w:val="000000"/>
         </w:rPr>
-        <w:t>The ML model also learns patterns from SPH results rather than directly solving the physical laws. It does not enforce conservation of mass, momentum, energy or angular momentum, and it does not follow the later orbits of fragments. A good BMF prediction therefore cannot answer whether debris survives long term, forms a disk or accretes into moons. Fragment measures are also noisier than BMF and more sensitive to the FoF linking length used in post-processing.</w:t>
+        <w:t xml:space="preserve">The ML model also learns patterns from SPH results rather than directly solving the physical laws. It does not enforce conservation of mass, momentum, energy or angular momentum, and it does not follow the later orbits of fragments. A good BMF prediction therefore cannot answer whether </w:t>
+      </w:r>
+      <w:r>
+        <w:rPr>
+          <w:color w:val="000000"/>
+        </w:rPr>
+        <w:lastRenderedPageBreak/>
+        <w:t>debris survives long term, forms a disk or accretes into moons. Fragment measures are also noisier than BMF and more sensitive to the FoF linking length used in post-processing.</w:t>
       </w:r>
     </w:p>
     <w:p>
@@ -4102,11 +4094,7 @@
     </w:p>
     <w:p>
       <w:r>
-        <w:t xml:space="preserve">Future work should improve per-prediction reliability estimates and automatic detection of poorly supported input combinations. Exploratory XGBoost and hurdle models should also be tested on </w:t>
-      </w:r>
-      <w:r>
-        <w:lastRenderedPageBreak/>
-        <w:t>newly generated SPH simulations before replacing the current model. Further extensions could include uncertainty estimation, multi-output prediction and stronger physical constraints.</w:t>
+        <w:t>Future work should improve per-prediction reliability estimates and automatic detection of poorly supported input combinations. Exploratory XGBoost and hurdle models should also be tested on newly generated SPH simulations before replacing the current model. Further extensions could include uncertainty estimation, multi-output prediction and stronger physical constraints.</w:t>
       </w:r>
     </w:p>
     <w:p/>
@@ -4314,6 +4302,7 @@
         <w:rPr>
           <w:color w:val="000000"/>
         </w:rPr>
+        <w:lastRenderedPageBreak/>
         <w:t xml:space="preserve">Duan, T., Anand, A., Ding, D. Y., Thai, K. K., Basu, S., Ng, A. &amp; Schuler, A. (2020). </w:t>
       </w:r>
       <w:proofErr w:type="spellStart"/>
@@ -4507,7 +4496,6 @@
         <w:rPr>
           <w:color w:val="000000"/>
         </w:rPr>
-        <w:lastRenderedPageBreak/>
         <w:t>Price, D. J. (2012). Smoothed particle hydrodynamics and magnetohydrodynamics. Journal of Computational Physics, 231(3), 759</w:t>
       </w:r>
       <w:r>
@@ -4763,36 +4751,6 @@
         </w:rPr>
         <w:t>.2005.08.015.</w:t>
       </w:r>
-    </w:p>
-    <w:p>
-      <w:pPr>
-        <w:jc w:val="left"/>
-      </w:pPr>
-    </w:p>
-    <w:p>
-      <w:pPr>
-        <w:jc w:val="left"/>
-      </w:pPr>
-    </w:p>
-    <w:p>
-      <w:pPr>
-        <w:jc w:val="left"/>
-      </w:pPr>
-    </w:p>
-    <w:p>
-      <w:pPr>
-        <w:jc w:val="left"/>
-      </w:pPr>
-    </w:p>
-    <w:p>
-      <w:pPr>
-        <w:jc w:val="left"/>
-      </w:pPr>
-    </w:p>
-    <w:p>
-      <w:pPr>
-        <w:jc w:val="left"/>
-      </w:pPr>
     </w:p>
     <w:p>
       <w:pPr>
@@ -5426,11 +5384,9 @@
             <w:r>
               <w:t xml:space="preserve">Combines periapsis and speed into one description of the encounter orbit, helping distinguish </w:t>
             </w:r>
-            <w:proofErr w:type="gramStart"/>
-            <w:r>
-              <w:t>near-parabolic</w:t>
-            </w:r>
-            <w:proofErr w:type="gramEnd"/>
+            <w:r>
+              <w:t>near parabolic</w:t>
+            </w:r>
             <w:r>
               <w:t xml:space="preserve"> from more hyperbolic fly-bys.</w:t>
             </w:r>
@@ -5618,7 +5574,7 @@
                     <pic:cNvPicPr/>
                   </pic:nvPicPr>
                   <pic:blipFill>
-                    <a:blip r:embed="rId12"/>
+                    <a:blip r:embed="rId13"/>
                     <a:stretch>
                       <a:fillRect/>
                     </a:stretch>
@@ -5671,15 +5627,7 @@
         <w:keepNext/>
       </w:pPr>
       <w:r>
-        <w:t xml:space="preserve">Table A2. Comparison of BMF regression models using five-fold </w:t>
-      </w:r>
-      <w:proofErr w:type="spellStart"/>
-      <w:r>
-        <w:t>GroupKFold</w:t>
-      </w:r>
-      <w:proofErr w:type="spellEnd"/>
-      <w:r>
-        <w:t xml:space="preserve"> by physical SPH simulation, including exploratory advanced models to show the potential for further performance improvement in future work.</w:t>
+        <w:t>Table A2. Comparison of BMF regression models using five-fold GroupKFold by physical SPH simulation, including exploratory advanced models to show the potential for further performance improvement in future work.</w:t>
       </w:r>
     </w:p>
     <w:tbl>
@@ -7093,23 +7041,7 @@
                 <w:sz w:val="22"/>
                 <w:szCs w:val="22"/>
               </w:rPr>
-              <w:t xml:space="preserve">Exploratory </w:t>
-            </w:r>
-            <w:proofErr w:type="gramStart"/>
-            <w:r>
-              <w:rPr>
-                <w:sz w:val="22"/>
-                <w:szCs w:val="22"/>
-              </w:rPr>
-              <w:t>only;  lowest</w:t>
-            </w:r>
-            <w:proofErr w:type="gramEnd"/>
-            <w:r>
-              <w:rPr>
-                <w:sz w:val="22"/>
-                <w:szCs w:val="22"/>
-              </w:rPr>
-              <w:t xml:space="preserve"> MAE in two-stage tests</w:t>
+              <w:t>Exploratory only; lowest MAE in two-stage tests</w:t>
             </w:r>
           </w:p>
         </w:tc>
@@ -7387,7 +7319,7 @@
                     <pic:cNvPicPr/>
                   </pic:nvPicPr>
                   <pic:blipFill>
-                    <a:blip r:embed="rId13"/>
+                    <a:blip r:embed="rId14"/>
                     <a:stretch>
                       <a:fillRect/>
                     </a:stretch>
@@ -7532,25 +7464,50 @@
       </w:pPr>
     </w:p>
     <w:p>
-      <w:pPr>
-        <w:widowControl w:val="0"/>
-        <w:pBdr>
-          <w:top w:val="nil"/>
-          <w:left w:val="nil"/>
-          <w:bottom w:val="nil"/>
-          <w:right w:val="nil"/>
-          <w:between w:val="nil"/>
-        </w:pBdr>
-        <w:spacing w:after="0"/>
-      </w:pPr>
-      <w:r>
-        <w:t>No AI was used to write this report. Codex was used for some debugging during the project. I independently reviewed and verified the outputs used in the project, and I take full responsibility for the final analysis, results, code, and submitted work.</w:t>
-      </w:r>
-    </w:p>
-    <w:p/>
-    <w:p/>
+      <w:r>
+        <w:t xml:space="preserve">I used OpenAI Codex (https://chatgpt.com/codex) throughout the project for targeted </w:t>
+      </w:r>
+      <w:r>
+        <w:t>code-</w:t>
+      </w:r>
+      <w:r>
+        <w:t>development support. This included producing initial implementation drafts for data extraction and processing, exploratory data analysis, feature engineering, diagnostic and visualisation scripts</w:t>
+      </w:r>
+      <w:r>
+        <w:t xml:space="preserve">, </w:t>
+      </w:r>
+      <w:r>
+        <w:t>refactoring, debugging, repository documentation, and some commit messages.</w:t>
+      </w:r>
+      <w:r>
+        <w:t xml:space="preserve"> </w:t>
+      </w:r>
+      <w:r>
+        <w:t>All AI-assisted code and documentation were reviewed, modified, tested, and verified by me before inclusion. I specified the scientific questions, modelling targets, physics-derived features, thresholds, evaluation strategy, plot selection, interpretation, and final project decisions, and I can explain, modify, and reproduce the submitted implementation. AI was not used to write the Project Plan or Final Report</w:t>
+      </w:r>
+      <w:r>
+        <w:t xml:space="preserve">. </w:t>
+      </w:r>
+      <w:r>
+        <w:t xml:space="preserve">The scientific conclusions, design decisions, and submitted report </w:t>
+      </w:r>
+      <w:r>
+        <w:t>are made by me and</w:t>
+      </w:r>
+      <w:r>
+        <w:t xml:space="preserve"> reflect my own work and understanding. Further details of AI us</w:t>
+      </w:r>
+      <w:r>
+        <w:t>age</w:t>
+      </w:r>
+      <w:r>
+        <w:t xml:space="preserve"> are documented in docs/ai_usage.md</w:t>
+      </w:r>
+      <w:r>
+        <w:t>.</w:t>
+      </w:r>
+    </w:p>
     <w:sectPr>
-      <w:headerReference w:type="default" r:id="rId14"/>
       <w:footerReference w:type="default" r:id="rId15"/>
       <w:pgSz w:w="12240" w:h="15840"/>
       <w:pgMar w:top="1440" w:right="1440" w:bottom="1440" w:left="1440" w:header="720" w:footer="720" w:gutter="0"/>
@@ -7634,19 +7591,6 @@
     </w:p>
   </w:footnote>
 </w:footnotes>
-</file>
-
-<file path=word/header1.xml><?xml version="1.0" encoding="utf-8"?>
-<w:hdr xmlns:wpc="http://schemas.microsoft.com/office/word/2010/wordprocessingCanvas" xmlns:cx="http://schemas.microsoft.com/office/drawing/2014/chartex" xmlns:cx1="http://schemas.microsoft.com/office/drawing/2015/9/8/chartex" xmlns:cx2="http://schemas.microsoft.com/office/drawing/2015/10/21/chartex" xmlns:cx3="http://schemas.microsoft.com/office/drawing/2016/5/9/chartex" xmlns:cx4="http://schemas.microsoft.com/office/drawing/2016/5/10/chartex" xmlns:cx5="http://schemas.microsoft.com/office/drawing/2016/5/11/chartex" xmlns:cx6="http://schemas.microsoft.com/office/drawing/2016/5/12/chartex" xmlns:cx7="http://schemas.microsoft.com/office/drawing/2016/5/13/chartex" xmlns:cx8="http://schemas.microsoft.com/office/drawing/2016/5/14/chartex" xmlns:mc="http://schemas.openxmlformats.org/markup-compatibility/2006" xmlns:m="http://schemas.openxmlformats.org/officeDocument/2006/math" xmlns:aink="http://schemas.microsoft.com/office/drawing/2016/ink" xmlns:am3d="http://schemas.microsoft.com/office/drawing/2017/model3d" xmlns:oel="http://schemas.microsoft.com/office/2019/extlst" xmlns:r="http://schemas.openxmlformats.org/officeDocument/2006/relationships" xmlns:wp14="http://schemas.microsoft.com/office/word/2010/wordprocessingDrawing" xmlns:wp="http://schemas.openxmlformats.org/drawingml/2006/wordprocessingDrawing" xmlns:wpg="http://schemas.microsoft.com/office/word/2010/wordprocessingGroup" xmlns:wpi="http://schemas.microsoft.com/office/word/2010/wordprocessingInk" xmlns:wps="http://schemas.microsoft.com/office/word/2010/wordprocessingShape" xmlns:o="urn:schemas-microsoft-com:office:office" xmlns:v="urn:schemas-microsoft-com:vml" xmlns:w10="urn:schemas-microsoft-com:office:word" xmlns:w="http://schemas.openxmlformats.org/wordprocessingml/2006/main" xmlns:w14="http://schemas.microsoft.com/office/word/2010/wordml" xmlns:w15="http://schemas.microsoft.com/office/word/2012/wordml" xmlns:w16cex="http://schemas.microsoft.com/office/word/2018/wordml/cex" xmlns:w16cid="http://schemas.microsoft.com/office/word/2016/wordml/cid" xmlns:w16="http://schemas.microsoft.com/office/word/2018/wordml" xmlns:w16sdtdh="http://schemas.microsoft.com/office/word/2020/wordml/sdtdatahash" xmlns:w16sdtfl="http://schemas.microsoft.com/office/word/2024/wordml/sdtformatlock" xmlns:w16se="http://schemas.microsoft.com/office/word/2015/wordml/symex" xmlns:w16du="http://schemas.microsoft.com/office/word/2023/wordml/word16du" xmlns:wne="http://schemas.microsoft.com/office/word/2006/wordml" mc:Ignorable="w14 w15 w16se w16cid w16 w16cex w16sdtdh w16sdtfl w16du wp14">
-  <w:p>
-    <w:pPr>
-      <w:rPr>
-        <w:sz w:val="22"/>
-        <w:szCs w:val="22"/>
-      </w:rPr>
-    </w:pPr>
-  </w:p>
-</w:hdr>
 </file>
 
 <file path=word/styles.xml><?xml version="1.0" encoding="utf-8"?>
@@ -8635,6 +8579,62 @@
       <w:spacing w:val="5"/>
     </w:rPr>
   </w:style>
+  <w:style w:type="paragraph" w:styleId="Header">
+    <w:name w:val="header"/>
+    <w:basedOn w:val="Normal"/>
+    <w:link w:val="HeaderChar"/>
+    <w:uiPriority w:val="99"/>
+    <w:unhideWhenUsed/>
+    <w:rsid w:val="0089118D"/>
+    <w:pPr>
+      <w:tabs>
+        <w:tab w:val="center" w:pos="4680"/>
+        <w:tab w:val="right" w:pos="9360"/>
+      </w:tabs>
+      <w:spacing w:after="0" w:line="240" w:lineRule="auto"/>
+    </w:pPr>
+  </w:style>
+  <w:style w:type="character" w:customStyle="1" w:styleId="HeaderChar">
+    <w:name w:val="Header Char"/>
+    <w:basedOn w:val="DefaultParagraphFont"/>
+    <w:link w:val="Header"/>
+    <w:uiPriority w:val="99"/>
+    <w:rsid w:val="0089118D"/>
+    <w:rPr>
+      <w:rFonts w:ascii="Times New Roman" w:eastAsia="Times New Roman" w:hAnsi="Times New Roman" w:cs="Times New Roman"/>
+      <w:kern w:val="0"/>
+      <w:lang w:val="en-GB"/>
+      <w14:ligatures w14:val="none"/>
+    </w:rPr>
+  </w:style>
+  <w:style w:type="paragraph" w:styleId="Footer">
+    <w:name w:val="footer"/>
+    <w:basedOn w:val="Normal"/>
+    <w:link w:val="FooterChar"/>
+    <w:uiPriority w:val="99"/>
+    <w:unhideWhenUsed/>
+    <w:rsid w:val="0089118D"/>
+    <w:pPr>
+      <w:tabs>
+        <w:tab w:val="center" w:pos="4680"/>
+        <w:tab w:val="right" w:pos="9360"/>
+      </w:tabs>
+      <w:spacing w:after="0" w:line="240" w:lineRule="auto"/>
+    </w:pPr>
+  </w:style>
+  <w:style w:type="character" w:customStyle="1" w:styleId="FooterChar">
+    <w:name w:val="Footer Char"/>
+    <w:basedOn w:val="DefaultParagraphFont"/>
+    <w:link w:val="Footer"/>
+    <w:uiPriority w:val="99"/>
+    <w:rsid w:val="0089118D"/>
+    <w:rPr>
+      <w:rFonts w:ascii="Times New Roman" w:eastAsia="Times New Roman" w:hAnsi="Times New Roman" w:cs="Times New Roman"/>
+      <w:kern w:val="0"/>
+      <w:lang w:val="en-GB"/>
+      <w14:ligatures w14:val="none"/>
+    </w:rPr>
+  </w:style>
 </w:styles>
 </file>
 
@@ -8951,4 +8951,16 @@
     </a:ext>
   </a:extLst>
 </a:theme>
+</file>
+
+<file path=customXml/item1.xml><?xml version="1.0" encoding="utf-8"?>
+<b:Sources xmlns:b="http://schemas.openxmlformats.org/officeDocument/2006/bibliography" xmlns="http://schemas.openxmlformats.org/officeDocument/2006/bibliography" SelectedStyle="/APASixthEditionOfficeOnline.xsl" StyleName="APA" Version="6"/>
+</file>
+
+<file path=customXml/itemProps1.xml><?xml version="1.0" encoding="utf-8"?>
+<ds:datastoreItem xmlns:ds="http://schemas.openxmlformats.org/officeDocument/2006/customXml" ds:itemID="{72E1076B-F5DB-F641-BAC0-AEE9907DFEDE}">
+  <ds:schemaRefs>
+    <ds:schemaRef ds:uri="http://schemas.openxmlformats.org/officeDocument/2006/bibliography"/>
+  </ds:schemaRefs>
+</ds:datastoreItem>
 </file>
</xml_diff>

<commit_message>
docs: revise discussion & conclusion
</commit_message>
<xml_diff>
--- a/deliverables/nny124-final-report.docx
+++ b/deliverables/nny124-final-report.docx
@@ -4007,43 +4007,132 @@
     </w:p>
     <w:p>
       <w:r>
-        <w:t>This research asked how orbital and physical parameters affect disruption and bound retention, which inputs matter most for fragment formation and retained debris, and whether ML can predict outcomes while showing when its predictions should be trusted. The answers are summarised below.</w:t>
-      </w:r>
-    </w:p>
+        <w:t>This study sought to determine which inputs are most important for fragment creation and retained debris, how orbital and physical characteristics affect disruption and bound retention, and whether machine learning (ML) can forecast outcomes while indicating when its predictions should be believed. Below is a summary of the responses.</w:t>
+      </w:r>
+    </w:p>
+    <w:p/>
+    <w:p>
+      <w:r>
+        <w:rPr>
+          <w:color w:val="000000"/>
+        </w:rPr>
+        <w:t>(1) how do orbital and physical parameters affect disruption and bound retention; (2) which inputs matter most for fragment formation and retained debris; and (3) can machine-learning models predict outcomes within the sampled data while showing when a prediction should or should not be trusted?</w:t>
+      </w:r>
+    </w:p>
+    <w:p/>
     <w:p>
       <w:r>
         <w:rPr>
           <w:b/>
           <w:bCs/>
         </w:rPr>
-        <w:t xml:space="preserve">Q1. How do orbital and physical parameters influence disruption and bound mass? </w:t>
-      </w:r>
-      <w:r>
-        <w:t>Closer and slower encounters generally retain more debris, but the effect depends on the other inputs. In the representative controlled test, predicted BMF decreases from about 25% as periapsis increases from 1.2 Mars radii, while the available SPH cases fall to approximately zero beyond about 2.2 Mars radii. Increasing encounter speed gives a clearer decrease, from about 25% at 0 km/s to approximately zero above 1 km/s. These are condition-specific responses rather than universal thresholds. Periapsis controls tidal strength, speed changes the encounter and capture conditions, and mass and spin modify the result.</w:t>
-      </w:r>
-    </w:p>
-    <w:p>
+        <w:t xml:space="preserve">Q1. How do orbital and physical parameters </w:t>
+      </w:r>
       <w:r>
         <w:rPr>
           <w:b/>
           <w:bCs/>
         </w:rPr>
-        <w:t>Q2. Which parameters most strongly control fragment formation and retained debris?</w:t>
-      </w:r>
-      <w:r>
-        <w:t xml:space="preserve"> There is no single winner under every condition. Periapsis is the strongest overall input for BMF, while velocity, mass and spin change the outcome within that broad setting. In matched A2000, n65 cases, changing spin gives a BMF range of about 0.06-0.09 below 1.5 Mars radii and reaches up to about 0.24 at larger periapsis. Velocity differences also change with spin state. Fragmentation needs separate fragment and largest-remnant measures because BMF measures retained debris, not breakup alone, and fragment count depends on the FoF definition.</w:t>
-      </w:r>
-    </w:p>
-    <w:p>
+        <w:t>affect disruption and bound retention</w:t>
+      </w:r>
       <w:r>
         <w:rPr>
           <w:b/>
           <w:bCs/>
         </w:rPr>
-        <w:t>Q3. Can machine learning predict outcomes across the sampled domain with useful trust checks?</w:t>
-      </w:r>
-      <w:r>
-        <w:t xml:space="preserve"> Yes, when similar input combinations are supported by the SPH archive. The main Random Forest with physics-derived features achieves a grouped cross-validated R</w:t>
+        <w:t xml:space="preserve">? </w:t>
+      </w:r>
+      <w:r>
+        <w:t xml:space="preserve">Although the impact varies depending on the other inputs, closer and slower contacts typically retain more debris. In the representative controlled test, the available SPH cases drop to roughly zero beyond about 2.2 Mars radii, while the anticipated BMF drops from roughly 25% as periapsis increases from 1.2 Mars radii. A more pronounced decline occurs as encounter speed increases, from roughly 25% at 0 km/s to roughly zero above 1 km/s. Rather than being universal thresholds, these reactions are </w:t>
+      </w:r>
+      <w:r>
+        <w:t>condition specific</w:t>
+      </w:r>
+      <w:r>
+        <w:t>. Mass and spin alter the outcome, speed alters the encounter and capture conditions, and periapsis regulates tidal power.</w:t>
+      </w:r>
+    </w:p>
+    <w:p>
+      <w:r>
+        <w:rPr>
+          <w:b/>
+          <w:bCs/>
+        </w:rPr>
+        <w:t>Q2. Which</w:t>
+      </w:r>
+      <w:r>
+        <w:t xml:space="preserve"> </w:t>
+      </w:r>
+      <w:r>
+        <w:rPr>
+          <w:b/>
+          <w:bCs/>
+        </w:rPr>
+        <w:t>inputs matter most for fragment formation and retained debris</w:t>
+      </w:r>
+      <w:r>
+        <w:rPr>
+          <w:b/>
+          <w:bCs/>
+        </w:rPr>
+        <w:t xml:space="preserve">? </w:t>
+      </w:r>
+      <w:r>
+        <w:t>Under</w:t>
+      </w:r>
+      <w:r>
+        <w:t xml:space="preserve"> </w:t>
+      </w:r>
+      <w:r>
+        <w:t xml:space="preserve">all circumstances, there is no one winner. While velocity, mass, and spin alter the result within that general setting, periapsis is the strongest overall input for BMF. Changing spin in matched A2000, n65 examples </w:t>
+      </w:r>
+      <w:r>
+        <w:t>result</w:t>
+      </w:r>
+      <w:r>
+        <w:t xml:space="preserve"> in a BMF range of roughly 0.06</w:t>
+      </w:r>
+      <w:r>
+        <w:t>-</w:t>
+      </w:r>
+      <w:r>
+        <w:t>0.09 below 1.5 Mars radii and up to roughly 0.24 for bigger periapsis. Spin state also affects velocity disparities. Because fragment count depends on the FoF definition and BMF counts retained debris rather than breakup alone, fragmentation requires independent fragment and largest-remnant metrics.</w:t>
+      </w:r>
+    </w:p>
+    <w:p>
+      <w:r>
+        <w:rPr>
+          <w:b/>
+          <w:bCs/>
+        </w:rPr>
+        <w:t xml:space="preserve">Q3. </w:t>
+      </w:r>
+      <w:r>
+        <w:rPr>
+          <w:b/>
+          <w:bCs/>
+        </w:rPr>
+        <w:t>C</w:t>
+      </w:r>
+      <w:r>
+        <w:rPr>
+          <w:b/>
+          <w:bCs/>
+        </w:rPr>
+        <w:t>an machine-learning models predict outcomes within the sampled data while showing when a prediction should or should not be trusted</w:t>
+      </w:r>
+      <w:r>
+        <w:rPr>
+          <w:b/>
+          <w:bCs/>
+        </w:rPr>
+        <w:t>?</w:t>
+      </w:r>
+      <w:r>
+        <w:t xml:space="preserve"> </w:t>
+      </w:r>
+      <w:r>
+        <w:t>Yes, in cases where the SPH archive supports comparable input combinations. A grouped cross-validated R</w:t>
       </w:r>
       <w:r>
         <w:rPr>
@@ -4052,7 +4141,11 @@
         <w:t>2</w:t>
       </w:r>
       <w:r>
-        <w:t xml:space="preserve"> of 0.9225, MAE of 0.0179, and RMSE of 0.0259. However, performance is not equally reliable everywhere. In the sparsely sampled 10</w:t>
+        <w:t xml:space="preserve"> of 0.9225, an MAE of 0.0179, and an RMSE of 0.0259 are obtained by the primary Random Forest using physics-derived features. Performance isn't always as dependable, though. Despite the input values falling within </w:t>
+      </w:r>
+      <w:r>
+        <w:lastRenderedPageBreak/>
+        <w:t>the numerical training ranges, held-out errors increase to roughly 0.08 BMF, or 8 percentage points, in the sparsely sampled 10</w:t>
       </w:r>
       <w:r>
         <w:rPr>
@@ -4061,16 +4154,12 @@
         <w:t>19.5</w:t>
       </w:r>
       <w:r>
-        <w:t xml:space="preserve"> kg case, held-out errors rise to about 0.08 BMF, or 8 percentage points, despite the input values lying within the numerical training ranges. This shows that being within the overall input range is not enough; reliable predictions also require similar SPH cases nearby. ML can therefore support fast screening and simulation prioritisation, while sparse, edge, transition, or poorly supported cases still require further SPH study.</w:t>
-      </w:r>
-    </w:p>
-    <w:p>
-      <w:r>
-        <w:t xml:space="preserve">Overall, the project shows that tidal-disruption outcomes depend on interacting physical conditions rather than one universal ranking of parameters. Machine learning makes the existing SPH archive faster to explore, shows where predictions are well supported, and highlights where new </w:t>
-      </w:r>
-      <w:r>
-        <w:lastRenderedPageBreak/>
-        <w:t>simulations would be most useful. It complements SPH rather than replacing the simulation physics.</w:t>
+        <w:t xml:space="preserve"> kg example. This demonstrates that being within the entire input range is insufficient for accurate predictions; comparable SPH examples must also be close by. Thus, ML can facilitate quick screening and simulation prioritization; nevertheless, additional SPH research is still needed for sparse, edge, transition, or poorly supported instances.</w:t>
+      </w:r>
+    </w:p>
+    <w:p>
+      <w:r>
+        <w:t>Overall, the project shows that tidal-disruption outcomes depend on interacting physical conditions rather than one universal ranking of parameters. Machine learning makes the existing SPH archive faster to explore, shows where predictions are well supported, and highlights where new simulations would be most useful. It complements SPH rather than replacing the simulation physics.</w:t>
       </w:r>
     </w:p>
     <w:p>
@@ -4095,24 +4184,93 @@
       </w:r>
     </w:p>
     <w:p>
-      <w:r>
-        <w:rPr>
-          <w:color w:val="000000"/>
-        </w:rPr>
-        <w:t>The main limitation is that the simulation archive is small and unevenly sampled. Many rows are not independent physical evidence because one SPH simulation can be processed several ways. Grouped validation prevents this from making the test score unrealistically optimistic, but it cannot create missing simulations. Predictions remain uncertain for poorly sampled combinations, near the edges of the data, or outside combinations seen during training, even when every individual input value lies within its observed minimum and maximum.</w:t>
-      </w:r>
-    </w:p>
-    <w:p>
-      <w:r>
-        <w:rPr>
-          <w:color w:val="000000"/>
-        </w:rPr>
-        <w:t>The ML model also learns patterns from SPH results rather than directly solving the physical laws. It does not enforce conservation of mass, momentum, energy or angular momentum, and it does not follow the later orbits of fragments. A good BMF prediction therefore cannot answer whether debris survives long term, forms a disk or accretes into moons. Fragment measures are also noisier than BMF and more sensitive to the FoF linking length used in post-processing.</w:t>
-      </w:r>
-    </w:p>
-    <w:p>
-      <w:r>
-        <w:t>Exploratory XGBoost and hurdle models achieve higher grouped-validation scores but require further testing before replacing the main Random Forest. Models using outcome-derived quantities are unsuitable for pre-SPH screening because those values are unavailable before simulation.</w:t>
+      <w:pPr>
+        <w:rPr>
+          <w:color w:val="000000"/>
+        </w:rPr>
+      </w:pPr>
+      <w:r>
+        <w:rPr>
+          <w:color w:val="000000"/>
+        </w:rPr>
+        <w:t xml:space="preserve">The simulation archive's short size and uneven sampling are its primary drawbacks. A single SPH simulation can be </w:t>
+      </w:r>
+      <w:r>
+        <w:rPr>
+          <w:color w:val="000000"/>
+        </w:rPr>
+        <w:t>analysed</w:t>
+      </w:r>
+      <w:r>
+        <w:rPr>
+          <w:color w:val="000000"/>
+        </w:rPr>
+        <w:t xml:space="preserve"> in multiple </w:t>
+      </w:r>
+      <w:proofErr w:type="gramStart"/>
+      <w:r>
+        <w:rPr>
+          <w:color w:val="000000"/>
+        </w:rPr>
+        <w:t>way</w:t>
+      </w:r>
+      <w:r>
+        <w:rPr>
+          <w:color w:val="000000"/>
+        </w:rPr>
+        <w:t>s,</w:t>
+      </w:r>
+      <w:proofErr w:type="gramEnd"/>
+      <w:r>
+        <w:rPr>
+          <w:color w:val="000000"/>
+        </w:rPr>
+        <w:t xml:space="preserve"> h</w:t>
+      </w:r>
+      <w:r>
+        <w:rPr>
+          <w:color w:val="000000"/>
+        </w:rPr>
+        <w:t>ence many rows are not independent physical evidence. Although it is unable to produce missing simulations, group validation keeps the test score from becoming unduly optimistic. Even when each individual input value falls between its reported minimum and maximum, predictions are still unclear for combinations that are poorly sampled, close to the data's edges, or outside the combinations observed during training.</w:t>
+      </w:r>
+    </w:p>
+    <w:p>
+      <w:pPr>
+        <w:rPr>
+          <w:color w:val="000000"/>
+        </w:rPr>
+      </w:pPr>
+      <w:r>
+        <w:rPr>
+          <w:color w:val="000000"/>
+        </w:rPr>
+        <w:t xml:space="preserve">Additionally, instead of solving the physical laws directly, the ML model learns patterns from SPH results. It does not follow the subsequent orbits of fragments and does not impose conservation of mass, momentum, energy, or angular momentum. Therefore, a reliable BMF prediction cannot determine whether debris accumulates into moons, forms a disk, or endures for a long time. Additionally, fragment measurements are more sensitive to the FoF connecting length employed in post-processing and are noisier than BMF. </w:t>
+      </w:r>
+    </w:p>
+    <w:p>
+      <w:pPr>
+        <w:pStyle w:val="Heading2"/>
+        <w:rPr>
+          <w:rFonts w:ascii="Times New Roman" w:eastAsia="Times New Roman" w:hAnsi="Times New Roman" w:cs="Times New Roman"/>
+          <w:color w:val="auto"/>
+          <w:kern w:val="0"/>
+          <w:sz w:val="24"/>
+          <w:szCs w:val="24"/>
+          <w:lang w:val="en-GB"/>
+          <w14:ligatures w14:val="none"/>
+        </w:rPr>
+      </w:pPr>
+      <w:r>
+        <w:rPr>
+          <w:rFonts w:ascii="Times New Roman" w:eastAsia="Times New Roman" w:hAnsi="Times New Roman" w:cs="Times New Roman"/>
+          <w:color w:val="auto"/>
+          <w:kern w:val="0"/>
+          <w:sz w:val="24"/>
+          <w:szCs w:val="24"/>
+          <w:lang w:val="en-GB"/>
+          <w14:ligatures w14:val="none"/>
+        </w:rPr>
+        <w:t>Higher grouped-validation scores are obtained by exploratory XGBoost and hurdle models, but more testing is necessary before they can take the place of the primary Random Forest. Because outcome-derived quantities are not known prior to simulation, models that employ them are not appropriate for pre-SPH screening.</w:t>
       </w:r>
     </w:p>
     <w:p>
@@ -4156,15 +4314,21 @@
         <w:t>65</w:t>
       </w:r>
       <w:r>
-        <w:t xml:space="preserve"> comparison at other masses and resolutions while keeping processing choices fixed. Reporting the BMF range together with the actual BMF values and the number of independent simulations would show whether the stronger spin differences also appear in other groups. Testing the model on completely new SPH runs made after training would be a stronger test than repeatedly splitting the existing archive.</w:t>
-      </w:r>
-    </w:p>
-    <w:p>
-      <w:r>
-        <w:t>Future work should improve per-prediction reliability estimates and automatic detection of poorly supported input combinations. Exploratory XGBoost and hurdle models should also be tested on newly generated SPH simulations before replacing the current model. Further extensions could include uncertainty estimation, multi-output prediction and stronger physical constraints.</w:t>
-      </w:r>
-    </w:p>
-    <w:p/>
+        <w:t xml:space="preserve"> comparison at other masses and resolutions while keeping processing choices fixed. </w:t>
+      </w:r>
+      <w:r>
+        <w:t>It would be possible to determine whether the stronger spin disparities also occur in other groups by reporting the BMF range together with the actual BMF values and the number of independent simulations. It would be more robust to test the model on whole new SPH runs created after training rather than repeatedly dividing the current library.</w:t>
+      </w:r>
+    </w:p>
+    <w:p>
+      <w:r>
+        <w:lastRenderedPageBreak/>
+        <w:t>Future research should enhance automatic identification of input combinations with inadequate support and per-prediction reliability estimates. Before updating the current model, new SPH simulations should be used to test exploratory XGBoost and hurdle models. Stronger physical limitations, multi-output prediction, and uncertainty estimates are possible additional enhancements</w:t>
+      </w:r>
+      <w:r>
+        <w:t>.</w:t>
+      </w:r>
+    </w:p>
     <w:p>
       <w:pPr>
         <w:pStyle w:val="Heading1"/>
@@ -4215,15 +4379,472 @@
         <w:rPr>
           <w:color w:val="000000"/>
         </w:rPr>
+        <w:t>Breiman</w:t>
+      </w:r>
+      <w:proofErr w:type="spellEnd"/>
+      <w:r>
+        <w:rPr>
+          <w:color w:val="000000"/>
+        </w:rPr>
+        <w:t>, L. (2001). Random forests. Machine Learning, 45, 5</w:t>
+      </w:r>
+      <w:r>
+        <w:t>-</w:t>
+      </w:r>
+      <w:r>
+        <w:rPr>
+          <w:color w:val="000000"/>
+        </w:rPr>
+        <w:t>32. doi:10.1023/A:1010933404324.</w:t>
+      </w:r>
+    </w:p>
+    <w:p>
+      <w:pPr>
+        <w:ind w:left="340" w:hanging="340"/>
+      </w:pPr>
+      <w:r>
+        <w:rPr>
+          <w:color w:val="000000"/>
+        </w:rPr>
+        <w:t xml:space="preserve">Brunton, S. L., Noack, B. R. &amp; </w:t>
+      </w:r>
+      <w:proofErr w:type="spellStart"/>
+      <w:r>
+        <w:rPr>
+          <w:color w:val="000000"/>
+        </w:rPr>
+        <w:t>Koumoutsakos</w:t>
+      </w:r>
+      <w:proofErr w:type="spellEnd"/>
+      <w:r>
+        <w:rPr>
+          <w:color w:val="000000"/>
+        </w:rPr>
+        <w:t>, P. (2020). Machine learning for fluid mechanics. Annual Review of Fluid Mechanics, 52, 477</w:t>
+      </w:r>
+      <w:r>
+        <w:t>-</w:t>
+      </w:r>
+      <w:r>
+        <w:rPr>
+          <w:color w:val="000000"/>
+        </w:rPr>
+        <w:t>508. doi:10.1146/annurev-fluid-010719-060214.</w:t>
+      </w:r>
+    </w:p>
+    <w:p>
+      <w:pPr>
+        <w:ind w:left="340" w:hanging="340"/>
+      </w:pPr>
+      <w:r>
+        <w:rPr>
+          <w:color w:val="000000"/>
+        </w:rPr>
+        <w:t>Canup, R. M. &amp; Salmon, J. (2018). Origin of Phobos and Deimos by the impact of a Vesta-to-Ceres sized body with Mars. Science Advances, 4(4), eaar6887. doi:10.1126/</w:t>
+      </w:r>
+      <w:proofErr w:type="gramStart"/>
+      <w:r>
+        <w:rPr>
+          <w:color w:val="000000"/>
+        </w:rPr>
+        <w:t>sciadv.aar</w:t>
+      </w:r>
+      <w:proofErr w:type="gramEnd"/>
+      <w:r>
+        <w:rPr>
+          <w:color w:val="000000"/>
+        </w:rPr>
+        <w:t>6887.</w:t>
+      </w:r>
+    </w:p>
+    <w:p>
+      <w:pPr>
+        <w:ind w:left="340" w:hanging="340"/>
+      </w:pPr>
+      <w:r>
+        <w:rPr>
+          <w:color w:val="000000"/>
+        </w:rPr>
+        <w:t xml:space="preserve">Chen, T. &amp; </w:t>
+      </w:r>
+      <w:proofErr w:type="spellStart"/>
+      <w:r>
+        <w:rPr>
+          <w:color w:val="000000"/>
+        </w:rPr>
+        <w:t>Guestrin</w:t>
+      </w:r>
+      <w:proofErr w:type="spellEnd"/>
+      <w:r>
+        <w:rPr>
+          <w:color w:val="000000"/>
+        </w:rPr>
+        <w:t>, C. (2016). XGBoost: A scalable tree boosting system. Proceedings of the 22nd ACM SIGKDD International Conference on Knowledge Discovery and Data Mining, 785</w:t>
+      </w:r>
+      <w:r>
+        <w:t>-</w:t>
+      </w:r>
+      <w:r>
+        <w:rPr>
+          <w:color w:val="000000"/>
+        </w:rPr>
+        <w:t>794.</w:t>
+      </w:r>
+    </w:p>
+    <w:p>
+      <w:pPr>
+        <w:ind w:left="340" w:hanging="340"/>
+      </w:pPr>
+      <w:r>
+        <w:rPr>
+          <w:color w:val="000000"/>
+        </w:rPr>
+        <w:t>Citron, R. I., Genda, H. &amp; Ida, S. (2015). Formation of Phobos and Deimos via a giant impact. Icarus, 252, 334</w:t>
+      </w:r>
+      <w:r>
+        <w:t>-</w:t>
+      </w:r>
+      <w:r>
+        <w:rPr>
+          <w:color w:val="000000"/>
+        </w:rPr>
+        <w:t xml:space="preserve">338. </w:t>
+      </w:r>
+      <w:proofErr w:type="gramStart"/>
+      <w:r>
+        <w:rPr>
+          <w:color w:val="000000"/>
+        </w:rPr>
+        <w:t>doi:10.1016/j.icarus</w:t>
+      </w:r>
+      <w:proofErr w:type="gramEnd"/>
+      <w:r>
+        <w:rPr>
+          <w:color w:val="000000"/>
+        </w:rPr>
+        <w:t>.2015.02.011.</w:t>
+      </w:r>
+    </w:p>
+    <w:p>
+      <w:pPr>
+        <w:ind w:left="340" w:hanging="340"/>
+      </w:pPr>
+      <w:r>
+        <w:rPr>
+          <w:color w:val="000000"/>
+        </w:rPr>
+        <w:t xml:space="preserve">Duan, T., Anand, A., Ding, D. Y., Thai, K. K., Basu, S., Ng, A. &amp; Schuler, A. (2020). </w:t>
+      </w:r>
+      <w:proofErr w:type="spellStart"/>
+      <w:r>
+        <w:rPr>
+          <w:color w:val="000000"/>
+        </w:rPr>
+        <w:t>NGBoost</w:t>
+      </w:r>
+      <w:proofErr w:type="spellEnd"/>
+      <w:r>
+        <w:rPr>
+          <w:color w:val="000000"/>
+        </w:rPr>
+        <w:t>: Natural Gradient Boosting for Probabilistic Prediction. Proceedings of the 37th International Conference on Machine Learning, PMLR 119, 2690</w:t>
+      </w:r>
+      <w:r>
+        <w:t>-</w:t>
+      </w:r>
+      <w:r>
+        <w:rPr>
+          <w:color w:val="000000"/>
+        </w:rPr>
+        <w:t>2700.</w:t>
+      </w:r>
+    </w:p>
+    <w:p>
+      <w:pPr>
+        <w:ind w:left="340" w:hanging="340"/>
+      </w:pPr>
+      <w:r>
+        <w:rPr>
+          <w:color w:val="000000"/>
+        </w:rPr>
+        <w:t>Friedman, J. H. (2001). Greedy function approximation: A gradient boosting machine. Annals of Statistics, 29(5), 1189</w:t>
+      </w:r>
+      <w:r>
+        <w:t>-</w:t>
+      </w:r>
+      <w:r>
+        <w:rPr>
+          <w:color w:val="000000"/>
+        </w:rPr>
+        <w:t>1232. doi:10.1214/</w:t>
+      </w:r>
+      <w:proofErr w:type="spellStart"/>
+      <w:r>
+        <w:rPr>
+          <w:color w:val="000000"/>
+        </w:rPr>
+        <w:t>aos</w:t>
+      </w:r>
+      <w:proofErr w:type="spellEnd"/>
+      <w:r>
+        <w:rPr>
+          <w:color w:val="000000"/>
+        </w:rPr>
+        <w:t>/1013203451.</w:t>
+      </w:r>
+    </w:p>
+    <w:p>
+      <w:pPr>
+        <w:ind w:left="340" w:hanging="340"/>
+      </w:pPr>
+      <w:proofErr w:type="spellStart"/>
+      <w:r>
+        <w:rPr>
+          <w:color w:val="000000"/>
+        </w:rPr>
+        <w:t>Grinsztajn</w:t>
+      </w:r>
+      <w:proofErr w:type="spellEnd"/>
+      <w:r>
+        <w:rPr>
+          <w:color w:val="000000"/>
+        </w:rPr>
+        <w:t xml:space="preserve">, L., </w:t>
+      </w:r>
+      <w:proofErr w:type="spellStart"/>
+      <w:r>
+        <w:rPr>
+          <w:color w:val="000000"/>
+        </w:rPr>
+        <w:t>Oyallon</w:t>
+      </w:r>
+      <w:proofErr w:type="spellEnd"/>
+      <w:r>
+        <w:rPr>
+          <w:color w:val="000000"/>
+        </w:rPr>
+        <w:t xml:space="preserve">, E. &amp; </w:t>
+      </w:r>
+      <w:proofErr w:type="spellStart"/>
+      <w:r>
+        <w:rPr>
+          <w:color w:val="000000"/>
+        </w:rPr>
+        <w:t>Varoquaux</w:t>
+      </w:r>
+      <w:proofErr w:type="spellEnd"/>
+      <w:r>
+        <w:rPr>
+          <w:color w:val="000000"/>
+        </w:rPr>
+        <w:t>, G. (2022). Why do tree-based models still outperform deep learning on tabular data? Advances in Neural Information Processing Systems, 35.</w:t>
+      </w:r>
+    </w:p>
+    <w:p>
+      <w:pPr>
+        <w:ind w:left="340" w:hanging="340"/>
+      </w:pPr>
+      <w:r>
+        <w:rPr>
+          <w:color w:val="000000"/>
+        </w:rPr>
+        <w:t xml:space="preserve">Kegerreis, J. A., Lissauer, J. J., Eke, V. R., Sandnes, T. D. &amp; </w:t>
+      </w:r>
+      <w:proofErr w:type="spellStart"/>
+      <w:r>
+        <w:rPr>
+          <w:color w:val="000000"/>
+        </w:rPr>
+        <w:t>Elphic</w:t>
+      </w:r>
+      <w:proofErr w:type="spellEnd"/>
+      <w:r>
+        <w:rPr>
+          <w:color w:val="000000"/>
+        </w:rPr>
+        <w:t xml:space="preserve">, R. C. (2024). Origin of Mars’s moons by disruptive partial capture of an asteroid. Icarus, Article 116337. </w:t>
+      </w:r>
+      <w:proofErr w:type="gramStart"/>
+      <w:r>
+        <w:rPr>
+          <w:color w:val="000000"/>
+        </w:rPr>
+        <w:t>doi:10.1016/j.icarus</w:t>
+      </w:r>
+      <w:proofErr w:type="gramEnd"/>
+      <w:r>
+        <w:rPr>
+          <w:color w:val="000000"/>
+        </w:rPr>
+        <w:t>.2024.116337.</w:t>
+      </w:r>
+    </w:p>
+    <w:p>
+      <w:pPr>
+        <w:ind w:left="340" w:hanging="340"/>
+      </w:pPr>
+      <w:r>
+        <w:rPr>
+          <w:color w:val="000000"/>
+        </w:rPr>
+        <w:t xml:space="preserve">More, S., Kravtsov, A. V., Dalal, N. &amp; </w:t>
+      </w:r>
+      <w:proofErr w:type="spellStart"/>
+      <w:r>
+        <w:rPr>
+          <w:color w:val="000000"/>
+        </w:rPr>
+        <w:t>Gottlöber</w:t>
+      </w:r>
+      <w:proofErr w:type="spellEnd"/>
+      <w:r>
+        <w:rPr>
+          <w:color w:val="000000"/>
+        </w:rPr>
+        <w:t xml:space="preserve">, S. (2011). The </w:t>
+      </w:r>
+      <w:proofErr w:type="spellStart"/>
+      <w:r>
+        <w:rPr>
+          <w:color w:val="000000"/>
+        </w:rPr>
+        <w:t>overdensity</w:t>
+      </w:r>
+      <w:proofErr w:type="spellEnd"/>
+      <w:r>
+        <w:rPr>
+          <w:color w:val="000000"/>
+        </w:rPr>
+        <w:t xml:space="preserve"> and masses of the friends-of-friends halos and universality of the halo mass function. The Astrophysical Journal Supplement Series, 195(1), 4. doi:10.1088/0067-0049/195/1/4.</w:t>
+      </w:r>
+    </w:p>
+    <w:p>
+      <w:pPr>
+        <w:ind w:left="340" w:hanging="340"/>
+      </w:pPr>
+      <w:r>
+        <w:rPr>
+          <w:color w:val="000000"/>
+        </w:rPr>
         <w:lastRenderedPageBreak/>
-        <w:t>Breiman</w:t>
+        <w:t>Price, D. J. (2012). Smoothed particle hydrodynamics and magnetohydrodynamics. Journal of Computational Physics, 231(3), 759</w:t>
+      </w:r>
+      <w:r>
+        <w:t>-</w:t>
+      </w:r>
+      <w:r>
+        <w:rPr>
+          <w:color w:val="000000"/>
+        </w:rPr>
+        <w:t xml:space="preserve">794. </w:t>
+      </w:r>
+      <w:proofErr w:type="gramStart"/>
+      <w:r>
+        <w:rPr>
+          <w:color w:val="000000"/>
+        </w:rPr>
+        <w:t>doi:10.1016/j.jcp</w:t>
+      </w:r>
+      <w:proofErr w:type="gramEnd"/>
+      <w:r>
+        <w:rPr>
+          <w:color w:val="000000"/>
+        </w:rPr>
+        <w:t>.2010.12.011.</w:t>
+      </w:r>
+    </w:p>
+    <w:p>
+      <w:pPr>
+        <w:ind w:left="340" w:hanging="340"/>
+      </w:pPr>
+      <w:proofErr w:type="spellStart"/>
+      <w:r>
+        <w:rPr>
+          <w:color w:val="000000"/>
+        </w:rPr>
+        <w:t>Prokhorenkova</w:t>
       </w:r>
       <w:proofErr w:type="spellEnd"/>
       <w:r>
         <w:rPr>
           <w:color w:val="000000"/>
         </w:rPr>
-        <w:t>, L. (2001). Random forests. Machine Learning, 45, 5</w:t>
+        <w:t xml:space="preserve">, L., Gusev, G., Vorobev, A., </w:t>
+      </w:r>
+      <w:proofErr w:type="spellStart"/>
+      <w:r>
+        <w:rPr>
+          <w:color w:val="000000"/>
+        </w:rPr>
+        <w:t>Dorogush</w:t>
+      </w:r>
+      <w:proofErr w:type="spellEnd"/>
+      <w:r>
+        <w:rPr>
+          <w:color w:val="000000"/>
+        </w:rPr>
+        <w:t xml:space="preserve">, A. V. &amp; Gulin, A. (2018). </w:t>
+      </w:r>
+      <w:proofErr w:type="spellStart"/>
+      <w:r>
+        <w:rPr>
+          <w:color w:val="000000"/>
+        </w:rPr>
+        <w:t>CatBoost</w:t>
+      </w:r>
+      <w:proofErr w:type="spellEnd"/>
+      <w:r>
+        <w:rPr>
+          <w:color w:val="000000"/>
+        </w:rPr>
+        <w:t>: unbiased boosting with categorical features. Advances in Neural Information Processing Systems, 31.</w:t>
+      </w:r>
+    </w:p>
+    <w:p>
+      <w:pPr>
+        <w:ind w:left="340" w:hanging="340"/>
+      </w:pPr>
+      <w:proofErr w:type="spellStart"/>
+      <w:r>
+        <w:rPr>
+          <w:color w:val="000000"/>
+        </w:rPr>
+        <w:t>Raissi</w:t>
+      </w:r>
+      <w:proofErr w:type="spellEnd"/>
+      <w:r>
+        <w:rPr>
+          <w:color w:val="000000"/>
+        </w:rPr>
+        <w:t xml:space="preserve">, M., </w:t>
+      </w:r>
+      <w:proofErr w:type="spellStart"/>
+      <w:r>
+        <w:rPr>
+          <w:color w:val="000000"/>
+        </w:rPr>
+        <w:t>Perdikaris</w:t>
+      </w:r>
+      <w:proofErr w:type="spellEnd"/>
+      <w:r>
+        <w:rPr>
+          <w:color w:val="000000"/>
+        </w:rPr>
+        <w:t xml:space="preserve">, P. &amp; </w:t>
+      </w:r>
+      <w:proofErr w:type="spellStart"/>
+      <w:r>
+        <w:rPr>
+          <w:color w:val="000000"/>
+        </w:rPr>
+        <w:t>Karniadakis</w:t>
+      </w:r>
+      <w:proofErr w:type="spellEnd"/>
+      <w:r>
+        <w:rPr>
+          <w:color w:val="000000"/>
+        </w:rPr>
+        <w:t>, G. E. (2019). Physics-informed neural networks: A deep learning framework for solving forward and inverse problems involving nonlinear partial differential equations. Journal of Computational Physics, 378, 686</w:t>
       </w:r>
       <w:r>
         <w:t>-</w:t>
@@ -4232,7 +4853,21 @@
         <w:rPr>
           <w:color w:val="000000"/>
         </w:rPr>
-        <w:t>32. doi:10.1023/A:1010933404324.</w:t>
+        <w:t xml:space="preserve">707. </w:t>
+      </w:r>
+      <w:proofErr w:type="gramStart"/>
+      <w:r>
+        <w:rPr>
+          <w:color w:val="000000"/>
+        </w:rPr>
+        <w:t>doi:10.1016/j.jcp</w:t>
+      </w:r>
+      <w:proofErr w:type="gramEnd"/>
+      <w:r>
+        <w:rPr>
+          <w:color w:val="000000"/>
+        </w:rPr>
+        <w:t>.2018.10.045.</w:t>
       </w:r>
     </w:p>
     <w:p>
@@ -4243,478 +4878,6 @@
         <w:rPr>
           <w:color w:val="000000"/>
         </w:rPr>
-        <w:t xml:space="preserve">Brunton, S. L., Noack, B. R. &amp; </w:t>
-      </w:r>
-      <w:proofErr w:type="spellStart"/>
-      <w:r>
-        <w:rPr>
-          <w:color w:val="000000"/>
-        </w:rPr>
-        <w:t>Koumoutsakos</w:t>
-      </w:r>
-      <w:proofErr w:type="spellEnd"/>
-      <w:r>
-        <w:rPr>
-          <w:color w:val="000000"/>
-        </w:rPr>
-        <w:t>, P. (2020). Machine learning for fluid mechanics. Annual Review of Fluid Mechanics, 52, 477</w:t>
-      </w:r>
-      <w:r>
-        <w:t>-</w:t>
-      </w:r>
-      <w:r>
-        <w:rPr>
-          <w:color w:val="000000"/>
-        </w:rPr>
-        <w:t>508. doi:10.1146/annurev-fluid-010719-060214.</w:t>
-      </w:r>
-    </w:p>
-    <w:p>
-      <w:pPr>
-        <w:ind w:left="340" w:hanging="340"/>
-      </w:pPr>
-      <w:r>
-        <w:rPr>
-          <w:color w:val="000000"/>
-        </w:rPr>
-        <w:t>Canup, R. M. &amp; Salmon, J. (2018). Origin of Phobos and Deimos by the impact of a Vesta-to-Ceres sized body with Mars. Science Advances, 4(4), eaar6887. doi:10.1126/</w:t>
-      </w:r>
-      <w:proofErr w:type="gramStart"/>
-      <w:r>
-        <w:rPr>
-          <w:color w:val="000000"/>
-        </w:rPr>
-        <w:t>sciadv.aar</w:t>
-      </w:r>
-      <w:proofErr w:type="gramEnd"/>
-      <w:r>
-        <w:rPr>
-          <w:color w:val="000000"/>
-        </w:rPr>
-        <w:t>6887.</w:t>
-      </w:r>
-    </w:p>
-    <w:p>
-      <w:pPr>
-        <w:ind w:left="340" w:hanging="340"/>
-      </w:pPr>
-      <w:r>
-        <w:rPr>
-          <w:color w:val="000000"/>
-        </w:rPr>
-        <w:t xml:space="preserve">Chen, T. &amp; </w:t>
-      </w:r>
-      <w:proofErr w:type="spellStart"/>
-      <w:r>
-        <w:rPr>
-          <w:color w:val="000000"/>
-        </w:rPr>
-        <w:t>Guestrin</w:t>
-      </w:r>
-      <w:proofErr w:type="spellEnd"/>
-      <w:r>
-        <w:rPr>
-          <w:color w:val="000000"/>
-        </w:rPr>
-        <w:t>, C. (2016). XGBoost: A scalable tree boosting system. Proceedings of the 22nd ACM SIGKDD International Conference on Knowledge Discovery and Data Mining, 785</w:t>
-      </w:r>
-      <w:r>
-        <w:t>-</w:t>
-      </w:r>
-      <w:r>
-        <w:rPr>
-          <w:color w:val="000000"/>
-        </w:rPr>
-        <w:t>794.</w:t>
-      </w:r>
-    </w:p>
-    <w:p>
-      <w:pPr>
-        <w:ind w:left="340" w:hanging="340"/>
-      </w:pPr>
-      <w:r>
-        <w:rPr>
-          <w:color w:val="000000"/>
-        </w:rPr>
-        <w:t>Citron, R. I., Genda, H. &amp; Ida, S. (2015). Formation of Phobos and Deimos via a giant impact. Icarus, 252, 334</w:t>
-      </w:r>
-      <w:r>
-        <w:t>-</w:t>
-      </w:r>
-      <w:r>
-        <w:rPr>
-          <w:color w:val="000000"/>
-        </w:rPr>
-        <w:t xml:space="preserve">338. </w:t>
-      </w:r>
-      <w:proofErr w:type="gramStart"/>
-      <w:r>
-        <w:rPr>
-          <w:color w:val="000000"/>
-        </w:rPr>
-        <w:t>doi:10.1016/j.icarus</w:t>
-      </w:r>
-      <w:proofErr w:type="gramEnd"/>
-      <w:r>
-        <w:rPr>
-          <w:color w:val="000000"/>
-        </w:rPr>
-        <w:t>.2015.02.011.</w:t>
-      </w:r>
-    </w:p>
-    <w:p>
-      <w:pPr>
-        <w:ind w:left="340" w:hanging="340"/>
-      </w:pPr>
-      <w:r>
-        <w:rPr>
-          <w:color w:val="000000"/>
-        </w:rPr>
-        <w:t xml:space="preserve">Duan, T., Anand, A., Ding, D. Y., Thai, K. K., Basu, S., Ng, A. &amp; Schuler, A. (2020). </w:t>
-      </w:r>
-      <w:proofErr w:type="spellStart"/>
-      <w:r>
-        <w:rPr>
-          <w:color w:val="000000"/>
-        </w:rPr>
-        <w:t>NGBoost</w:t>
-      </w:r>
-      <w:proofErr w:type="spellEnd"/>
-      <w:r>
-        <w:rPr>
-          <w:color w:val="000000"/>
-        </w:rPr>
-        <w:t>: Natural Gradient Boosting for Probabilistic Prediction. Proceedings of the 37th International Conference on Machine Learning, PMLR 119, 2690</w:t>
-      </w:r>
-      <w:r>
-        <w:t>-</w:t>
-      </w:r>
-      <w:r>
-        <w:rPr>
-          <w:color w:val="000000"/>
-        </w:rPr>
-        <w:t>2700.</w:t>
-      </w:r>
-    </w:p>
-    <w:p>
-      <w:pPr>
-        <w:ind w:left="340" w:hanging="340"/>
-      </w:pPr>
-      <w:r>
-        <w:rPr>
-          <w:color w:val="000000"/>
-        </w:rPr>
-        <w:t>Friedman, J. H. (2001). Greedy function approximation: A gradient boosting machine. Annals of Statistics, 29(5), 1189</w:t>
-      </w:r>
-      <w:r>
-        <w:t>-</w:t>
-      </w:r>
-      <w:r>
-        <w:rPr>
-          <w:color w:val="000000"/>
-        </w:rPr>
-        <w:t>1232. doi:10.1214/</w:t>
-      </w:r>
-      <w:proofErr w:type="spellStart"/>
-      <w:r>
-        <w:rPr>
-          <w:color w:val="000000"/>
-        </w:rPr>
-        <w:t>aos</w:t>
-      </w:r>
-      <w:proofErr w:type="spellEnd"/>
-      <w:r>
-        <w:rPr>
-          <w:color w:val="000000"/>
-        </w:rPr>
-        <w:t>/1013203451.</w:t>
-      </w:r>
-    </w:p>
-    <w:p>
-      <w:pPr>
-        <w:ind w:left="340" w:hanging="340"/>
-      </w:pPr>
-      <w:proofErr w:type="spellStart"/>
-      <w:r>
-        <w:rPr>
-          <w:color w:val="000000"/>
-        </w:rPr>
-        <w:t>Grinsztajn</w:t>
-      </w:r>
-      <w:proofErr w:type="spellEnd"/>
-      <w:r>
-        <w:rPr>
-          <w:color w:val="000000"/>
-        </w:rPr>
-        <w:t xml:space="preserve">, L., </w:t>
-      </w:r>
-      <w:proofErr w:type="spellStart"/>
-      <w:r>
-        <w:rPr>
-          <w:color w:val="000000"/>
-        </w:rPr>
-        <w:t>Oyallon</w:t>
-      </w:r>
-      <w:proofErr w:type="spellEnd"/>
-      <w:r>
-        <w:rPr>
-          <w:color w:val="000000"/>
-        </w:rPr>
-        <w:t xml:space="preserve">, E. &amp; </w:t>
-      </w:r>
-      <w:proofErr w:type="spellStart"/>
-      <w:r>
-        <w:rPr>
-          <w:color w:val="000000"/>
-        </w:rPr>
-        <w:t>Varoquaux</w:t>
-      </w:r>
-      <w:proofErr w:type="spellEnd"/>
-      <w:r>
-        <w:rPr>
-          <w:color w:val="000000"/>
-        </w:rPr>
-        <w:t>, G. (2022). Why do tree-based models still outperform deep learning on tabular data? Advances in Neural Information Processing Systems, 35.</w:t>
-      </w:r>
-    </w:p>
-    <w:p>
-      <w:pPr>
-        <w:ind w:left="340" w:hanging="340"/>
-      </w:pPr>
-      <w:r>
-        <w:rPr>
-          <w:color w:val="000000"/>
-        </w:rPr>
-        <w:t xml:space="preserve">Kegerreis, J. A., Lissauer, J. J., Eke, V. R., Sandnes, T. D. &amp; </w:t>
-      </w:r>
-      <w:proofErr w:type="spellStart"/>
-      <w:r>
-        <w:rPr>
-          <w:color w:val="000000"/>
-        </w:rPr>
-        <w:t>Elphic</w:t>
-      </w:r>
-      <w:proofErr w:type="spellEnd"/>
-      <w:r>
-        <w:rPr>
-          <w:color w:val="000000"/>
-        </w:rPr>
-        <w:t xml:space="preserve">, R. C. (2024). Origin of Mars’s moons by disruptive partial capture of an asteroid. Icarus, Article 116337. </w:t>
-      </w:r>
-      <w:proofErr w:type="gramStart"/>
-      <w:r>
-        <w:rPr>
-          <w:color w:val="000000"/>
-        </w:rPr>
-        <w:t>doi:10.1016/j.icarus</w:t>
-      </w:r>
-      <w:proofErr w:type="gramEnd"/>
-      <w:r>
-        <w:rPr>
-          <w:color w:val="000000"/>
-        </w:rPr>
-        <w:t>.2024.116337.</w:t>
-      </w:r>
-    </w:p>
-    <w:p>
-      <w:pPr>
-        <w:ind w:left="340" w:hanging="340"/>
-      </w:pPr>
-      <w:r>
-        <w:rPr>
-          <w:color w:val="000000"/>
-        </w:rPr>
-        <w:t xml:space="preserve">More, S., Kravtsov, A. V., Dalal, N. &amp; </w:t>
-      </w:r>
-      <w:proofErr w:type="spellStart"/>
-      <w:r>
-        <w:rPr>
-          <w:color w:val="000000"/>
-        </w:rPr>
-        <w:t>Gottlöber</w:t>
-      </w:r>
-      <w:proofErr w:type="spellEnd"/>
-      <w:r>
-        <w:rPr>
-          <w:color w:val="000000"/>
-        </w:rPr>
-        <w:t xml:space="preserve">, S. (2011). The </w:t>
-      </w:r>
-      <w:proofErr w:type="spellStart"/>
-      <w:r>
-        <w:rPr>
-          <w:color w:val="000000"/>
-        </w:rPr>
-        <w:t>overdensity</w:t>
-      </w:r>
-      <w:proofErr w:type="spellEnd"/>
-      <w:r>
-        <w:rPr>
-          <w:color w:val="000000"/>
-        </w:rPr>
-        <w:t xml:space="preserve"> and masses of the friends-of-friends halos and universality of the halo mass function. The Astrophysical Journal Supplement Series, 195(1), 4. doi:10.1088/0067-0049/195/1/4.</w:t>
-      </w:r>
-    </w:p>
-    <w:p>
-      <w:pPr>
-        <w:ind w:left="340" w:hanging="340"/>
-      </w:pPr>
-      <w:r>
-        <w:rPr>
-          <w:color w:val="000000"/>
-        </w:rPr>
-        <w:t>Price, D. J. (2012). Smoothed particle hydrodynamics and magnetohydrodynamics. Journal of Computational Physics, 231(3), 759</w:t>
-      </w:r>
-      <w:r>
-        <w:t>-</w:t>
-      </w:r>
-      <w:r>
-        <w:rPr>
-          <w:color w:val="000000"/>
-        </w:rPr>
-        <w:t xml:space="preserve">794. </w:t>
-      </w:r>
-      <w:proofErr w:type="gramStart"/>
-      <w:r>
-        <w:rPr>
-          <w:color w:val="000000"/>
-        </w:rPr>
-        <w:t>doi:10.1016/j.jcp</w:t>
-      </w:r>
-      <w:proofErr w:type="gramEnd"/>
-      <w:r>
-        <w:rPr>
-          <w:color w:val="000000"/>
-        </w:rPr>
-        <w:t>.2010.12.011.</w:t>
-      </w:r>
-    </w:p>
-    <w:p>
-      <w:pPr>
-        <w:ind w:left="340" w:hanging="340"/>
-      </w:pPr>
-      <w:proofErr w:type="spellStart"/>
-      <w:r>
-        <w:rPr>
-          <w:color w:val="000000"/>
-        </w:rPr>
-        <w:t>Prokhorenkova</w:t>
-      </w:r>
-      <w:proofErr w:type="spellEnd"/>
-      <w:r>
-        <w:rPr>
-          <w:color w:val="000000"/>
-        </w:rPr>
-        <w:t xml:space="preserve">, L., Gusev, G., Vorobev, A., </w:t>
-      </w:r>
-      <w:proofErr w:type="spellStart"/>
-      <w:r>
-        <w:rPr>
-          <w:color w:val="000000"/>
-        </w:rPr>
-        <w:t>Dorogush</w:t>
-      </w:r>
-      <w:proofErr w:type="spellEnd"/>
-      <w:r>
-        <w:rPr>
-          <w:color w:val="000000"/>
-        </w:rPr>
-        <w:t xml:space="preserve">, A. V. &amp; Gulin, A. (2018). </w:t>
-      </w:r>
-      <w:proofErr w:type="spellStart"/>
-      <w:r>
-        <w:rPr>
-          <w:color w:val="000000"/>
-        </w:rPr>
-        <w:t>CatBoost</w:t>
-      </w:r>
-      <w:proofErr w:type="spellEnd"/>
-      <w:r>
-        <w:rPr>
-          <w:color w:val="000000"/>
-        </w:rPr>
-        <w:t>: unbiased boosting with categorical features. Advances in Neural Information Processing Systems, 31.</w:t>
-      </w:r>
-    </w:p>
-    <w:p>
-      <w:pPr>
-        <w:ind w:left="340" w:hanging="340"/>
-      </w:pPr>
-      <w:proofErr w:type="spellStart"/>
-      <w:r>
-        <w:rPr>
-          <w:color w:val="000000"/>
-        </w:rPr>
-        <w:t>Raissi</w:t>
-      </w:r>
-      <w:proofErr w:type="spellEnd"/>
-      <w:r>
-        <w:rPr>
-          <w:color w:val="000000"/>
-        </w:rPr>
-        <w:t xml:space="preserve">, M., </w:t>
-      </w:r>
-      <w:proofErr w:type="spellStart"/>
-      <w:r>
-        <w:rPr>
-          <w:color w:val="000000"/>
-        </w:rPr>
-        <w:t>Perdikaris</w:t>
-      </w:r>
-      <w:proofErr w:type="spellEnd"/>
-      <w:r>
-        <w:rPr>
-          <w:color w:val="000000"/>
-        </w:rPr>
-        <w:t xml:space="preserve">, P. &amp; </w:t>
-      </w:r>
-      <w:proofErr w:type="spellStart"/>
-      <w:r>
-        <w:rPr>
-          <w:color w:val="000000"/>
-        </w:rPr>
-        <w:t>Karniadakis</w:t>
-      </w:r>
-      <w:proofErr w:type="spellEnd"/>
-      <w:r>
-        <w:rPr>
-          <w:color w:val="000000"/>
-        </w:rPr>
-        <w:t>, G. E. (2019). Physics-informed neural networks: A deep learning framework for solving forward and inverse problems involving nonlinear partial differential equations. Journal of Computational Physics, 378, 686</w:t>
-      </w:r>
-      <w:r>
-        <w:t>-</w:t>
-      </w:r>
-      <w:r>
-        <w:rPr>
-          <w:color w:val="000000"/>
-        </w:rPr>
-        <w:t xml:space="preserve">707. </w:t>
-      </w:r>
-      <w:proofErr w:type="gramStart"/>
-      <w:r>
-        <w:rPr>
-          <w:color w:val="000000"/>
-        </w:rPr>
-        <w:t>doi:10.1016/j.jcp</w:t>
-      </w:r>
-      <w:proofErr w:type="gramEnd"/>
-      <w:r>
-        <w:rPr>
-          <w:color w:val="000000"/>
-        </w:rPr>
-        <w:t>.2018.10.045.</w:t>
-      </w:r>
-    </w:p>
-    <w:p>
-      <w:pPr>
-        <w:ind w:left="340" w:hanging="340"/>
-      </w:pPr>
-      <w:r>
-        <w:rPr>
-          <w:color w:val="000000"/>
-        </w:rPr>
-        <w:lastRenderedPageBreak/>
         <w:t>Richardson, D. C., Bottke, W. F. Jr. &amp; Love, S. G. (1998). Tidal distortion and disruption of Earth-crossing asteroids. Icarus, 134, 47</w:t>
       </w:r>
       <w:r>
@@ -5255,6 +5418,7 @@
               <w:rPr>
                 <w:color w:val="000000"/>
               </w:rPr>
+              <w:lastRenderedPageBreak/>
               <w:t>1/</w:t>
             </w:r>
             <w:proofErr w:type="spellStart"/>
@@ -5486,7 +5650,6 @@
               <w:rPr>
                 <w:color w:val="000000"/>
               </w:rPr>
-              <w:lastRenderedPageBreak/>
               <w:t>Time within 2 R</w:t>
             </w:r>
             <w:r>
@@ -5695,6 +5858,7 @@
         <w:keepNext/>
       </w:pPr>
       <w:r>
+        <w:lastRenderedPageBreak/>
         <w:t>Table A2. Comparison of BMF regression models using five-fold GroupKFold by physical SPH simulation, including exploratory advanced models to show the potential for further performance improvement in future work.</w:t>
       </w:r>
     </w:p>
@@ -6949,7 +7113,6 @@
                 <w:sz w:val="22"/>
                 <w:szCs w:val="22"/>
               </w:rPr>
-              <w:lastRenderedPageBreak/>
               <w:t>CatBoost</w:t>
             </w:r>
             <w:proofErr w:type="spellEnd"/>
@@ -7361,6 +7524,7 @@
           <w:szCs w:val="28"/>
           <w:lang w:val="en-GB"/>
         </w:rPr>
+        <w:lastRenderedPageBreak/>
         <w:t>Appendix B. Decision-Support Prototype</w:t>
       </w:r>
     </w:p>
@@ -7427,7 +7591,6 @@
     </w:p>
     <w:p>
       <w:r>
-        <w:lastRenderedPageBreak/>
         <w:t>A demonstration implementation of the screening workflow was developed as a dashboard and API package. It packages the model, input processing, coverage checks and screening rules into a runnable interface. The application can be downloaded and run locally by cloning the project repository.</w:t>
       </w:r>
     </w:p>
@@ -7514,6 +7677,7 @@
           <w:szCs w:val="28"/>
           <w:lang w:val="en-GB"/>
         </w:rPr>
+        <w:lastRenderedPageBreak/>
         <w:t>Appendix C. AI acknowledgement Statement</w:t>
       </w:r>
     </w:p>
@@ -9026,7 +9190,7 @@
 </file>
 
 <file path=customXml/itemProps1.xml><?xml version="1.0" encoding="utf-8"?>
-<ds:datastoreItem xmlns:ds="http://schemas.openxmlformats.org/officeDocument/2006/customXml" ds:itemID="{B99E923A-917A-794D-98B7-F6B1CD257000}">
+<ds:datastoreItem xmlns:ds="http://schemas.openxmlformats.org/officeDocument/2006/customXml" ds:itemID="{FB57911D-2D21-0C4A-BDFB-F0B4B3F2E0BD}">
   <ds:schemaRefs>
     <ds:schemaRef ds:uri="http://schemas.openxmlformats.org/officeDocument/2006/bibliography"/>
   </ds:schemaRefs>

</xml_diff>

<commit_message>
docs: abstract + format check
</commit_message>
<xml_diff>
--- a/deliverables/nny124-final-report.docx
+++ b/deliverables/nny124-final-report.docx
@@ -287,8 +287,11 @@
     <w:p>
       <w:pPr>
         <w:pStyle w:val="Heading1"/>
+        <w:spacing w:before="0" w:after="0"/>
         <w:rPr>
           <w:rFonts w:ascii="Times New Roman" w:hAnsi="Times New Roman" w:cs="Times New Roman"/>
+          <w:sz w:val="24"/>
+          <w:szCs w:val="24"/>
           <w:lang w:val="en-GB"/>
         </w:rPr>
       </w:pPr>
@@ -298,8 +301,8 @@
           <w:b/>
           <w:bCs/>
           <w:color w:val="000000"/>
-          <w:sz w:val="28"/>
-          <w:szCs w:val="28"/>
+          <w:sz w:val="24"/>
+          <w:szCs w:val="24"/>
           <w:lang w:val="en-GB"/>
         </w:rPr>
         <w:lastRenderedPageBreak/>
@@ -308,48 +311,97 @@
     </w:p>
     <w:p>
       <w:pPr>
-        <w:spacing w:before="240" w:after="240"/>
-        <w:rPr>
-          <w:sz w:val="22"/>
-          <w:szCs w:val="22"/>
-        </w:rPr>
-      </w:pPr>
-      <w:r>
-        <w:rPr>
-          <w:sz w:val="22"/>
-          <w:szCs w:val="22"/>
-        </w:rPr>
-        <w:t>Close encounters between asteroids and Mars can tidally disrupt the asteroid and leave some debris bound to the planet, a process that has been proposed as one possible pathway toward the formation of Mars’s moons, Phobos and Deimos. Smoothed-particle hydrodynamics (SPH) models this process in detail, but testing every input combination is computationally expensive. In this project, SPH outputs are processed into fragmentation measures, and machine learning models are then used to predict bound mass fraction (BMF) from the simulation inputs. The models are evaluated using grouped cross-validation, and the main model is a Random Forest using physics-derived features calculated from the raw simulation inputs, achieving a grouped cross-validated R</w:t>
-      </w:r>
-      <w:r>
-        <w:rPr>
-          <w:sz w:val="22"/>
-          <w:szCs w:val="22"/>
+        <w:pStyle w:val="Heading1"/>
+        <w:jc w:val="both"/>
+        <w:rPr>
+          <w:rFonts w:ascii="Times New Roman" w:hAnsi="Times New Roman" w:cs="Times New Roman"/>
+          <w:lang w:val="en-GB"/>
+        </w:rPr>
+      </w:pPr>
+      <w:r>
+        <w:rPr>
+          <w:rFonts w:ascii="Times New Roman" w:eastAsia="Times New Roman" w:hAnsi="Times New Roman" w:cs="Times New Roman"/>
+          <w:color w:val="auto"/>
+          <w:kern w:val="0"/>
+          <w:sz w:val="20"/>
+          <w:szCs w:val="20"/>
+          <w:lang w:val="en-GB"/>
+          <w14:ligatures w14:val="none"/>
+        </w:rPr>
+        <w:t xml:space="preserve">One theory for the </w:t>
+      </w:r>
+      <w:r>
+        <w:rPr>
+          <w:rFonts w:ascii="Times New Roman" w:eastAsia="Times New Roman" w:hAnsi="Times New Roman" w:cs="Times New Roman"/>
+          <w:color w:val="auto"/>
+          <w:kern w:val="0"/>
+          <w:sz w:val="20"/>
+          <w:szCs w:val="20"/>
+          <w:lang w:val="en-GB"/>
+          <w14:ligatures w14:val="none"/>
+        </w:rPr>
+        <w:t>formation</w:t>
+      </w:r>
+      <w:r>
+        <w:rPr>
+          <w:rFonts w:ascii="Times New Roman" w:eastAsia="Times New Roman" w:hAnsi="Times New Roman" w:cs="Times New Roman"/>
+          <w:color w:val="auto"/>
+          <w:kern w:val="0"/>
+          <w:sz w:val="20"/>
+          <w:szCs w:val="20"/>
+          <w:lang w:val="en-GB"/>
+          <w14:ligatures w14:val="none"/>
+        </w:rPr>
+        <w:t xml:space="preserve"> of Mars's moons, Phobos and Deimos, is that close collisions between asteroids and Mars can tidally damage the asteroid and leave some debris bonded to the planet. This process is thoroughly </w:t>
+      </w:r>
+      <w:r>
+        <w:rPr>
+          <w:rFonts w:ascii="Times New Roman" w:eastAsia="Times New Roman" w:hAnsi="Times New Roman" w:cs="Times New Roman"/>
+          <w:color w:val="auto"/>
+          <w:kern w:val="0"/>
+          <w:sz w:val="20"/>
+          <w:szCs w:val="20"/>
+          <w:lang w:val="en-GB"/>
+          <w14:ligatures w14:val="none"/>
+        </w:rPr>
+        <w:t>modelled</w:t>
+      </w:r>
+      <w:r>
+        <w:rPr>
+          <w:rFonts w:ascii="Times New Roman" w:eastAsia="Times New Roman" w:hAnsi="Times New Roman" w:cs="Times New Roman"/>
+          <w:color w:val="auto"/>
+          <w:kern w:val="0"/>
+          <w:sz w:val="20"/>
+          <w:szCs w:val="20"/>
+          <w:lang w:val="en-GB"/>
+          <w14:ligatures w14:val="none"/>
+        </w:rPr>
+        <w:t xml:space="preserve"> by smoothed-particle hydrodynamics (SPH), but testing every possible combination of inputs is computationally costly. In this study, bound mass fraction (BMF) is predicted from the simulation inputs using machine learning models after SPH outputs are converted into fragmentation measurements. The primary model, a Random Forest using physics-derived features computed from the raw simulation inputs, achieves a grouped cross-validated R</w:t>
+      </w:r>
+      <w:r>
+        <w:rPr>
+          <w:rFonts w:ascii="Times New Roman" w:eastAsia="Times New Roman" w:hAnsi="Times New Roman" w:cs="Times New Roman"/>
+          <w:color w:val="auto"/>
+          <w:kern w:val="0"/>
+          <w:sz w:val="20"/>
+          <w:szCs w:val="20"/>
           <w:vertAlign w:val="superscript"/>
+          <w:lang w:val="en-GB"/>
+          <w14:ligatures w14:val="none"/>
         </w:rPr>
         <w:t>2</w:t>
       </w:r>
       <w:r>
         <w:rPr>
-          <w:sz w:val="22"/>
-          <w:szCs w:val="22"/>
-        </w:rPr>
-        <w:t xml:space="preserve"> of 0.9225, MAE of 0.0179, and RMSE of 0.0259. In controlled tests, predicted BMF decreases from about 0.25 at 1.2 Mars radii as periapsis increases, while the available SPH cases fall to approximately zero beyond about 2.2 Mars radii. Increasing encounter speed produces a clearer decrease from about 0.25 at 0 km/s to approximately zero above 1 km/s. Periapsis is the strongest overall physical input, while the effects of spin and velocity depend on the encounter conditions, meaning that different physical inputs can become more influential in different parts of the sampled parameter range. In matched cases, changing spin produces BMF differences of about 0.06-0.09 below 1.5 Mars radii and up to about 0.24 at larger periapsis. A sparsely sampled 10</w:t>
-      </w:r>
-      <w:r>
-        <w:rPr>
-          <w:sz w:val="22"/>
-          <w:szCs w:val="22"/>
-          <w:vertAlign w:val="superscript"/>
-        </w:rPr>
-        <w:t>19.5</w:t>
-      </w:r>
-      <w:r>
-        <w:rPr>
-          <w:sz w:val="22"/>
-          <w:szCs w:val="22"/>
-        </w:rPr>
-        <w:t xml:space="preserve"> kg case gives held-out errors near 0.08 BMF despite lying within the numerical training ranges, showing that being within the input range does not guarantee a reliable prediction. The model is therefore useful for rapidly screening well-supported encounter conditions and identifying parameter interactions that warrant further SPH study, but it does not replace SPH or establish physical causation.</w:t>
+          <w:rFonts w:ascii="Times New Roman" w:eastAsia="Times New Roman" w:hAnsi="Times New Roman" w:cs="Times New Roman"/>
+          <w:color w:val="auto"/>
+          <w:kern w:val="0"/>
+          <w:sz w:val="20"/>
+          <w:szCs w:val="20"/>
+          <w:lang w:val="en-GB"/>
+          <w14:ligatures w14:val="none"/>
+        </w:rPr>
+        <w:t xml:space="preserve"> of 0.9225, MAE of 0.0179, and RMSE of 0.0259. The models are assessed using grouped cross-validation. In controlled experiments, the available SPH cases drop to roughly zero beyond around 2.2 Mars radii, while the anticipated BMF drops from roughly 0.25 at 1.2 Mars radii as periapsis increases. A more noticeable decline occurs as encounter speed increases, from roughly 0.25 at 0 km/s to roughly zero above 1 km/s. While the impacts of spin and velocity depend on the encounter conditions, periapsis is the strongest overall physical input. As a result, distinct physical inputs may become more significant in different regions of the measured parameter range. Changes in spin in matched cases result in BMF discrepancies of up to 0.24 at bigger periapsis and between 0.06 and 0.09 below 1.5 Mars radii. Despite falling within the numerical training ranges, a sparsely sampled 1019.5 kg instance yields held-out errors close to 0.08 BMF, demonstrating that being within the input range does not ensure a trustworthy prediction. Therefore, the model does not replace SPH or prove physical causality, but it is helpful for quickly screening well-supported encounter circumstances and highlighting parameter correlations that call for additional SPH research.</w:t>
       </w:r>
     </w:p>
     <w:p>
@@ -464,27 +516,33 @@
           <w:szCs w:val="24"/>
           <w:lang w:val="en-GB"/>
         </w:rPr>
+        <w:t>1.2 Significance and Originality</w:t>
+      </w:r>
+    </w:p>
+    <w:p>
+      <w:pPr>
+        <w:rPr>
+          <w:color w:val="000000"/>
+        </w:rPr>
+      </w:pPr>
+      <w:r>
+        <w:rPr>
+          <w:color w:val="000000"/>
+        </w:rPr>
+        <w:t xml:space="preserve">The work is useful both scientifically and computationally. </w:t>
+      </w:r>
+      <w:r>
+        <w:rPr>
+          <w:color w:val="000000"/>
+        </w:rPr>
+        <w:t xml:space="preserve">From a scientific perspective, simulations of a mechanism that might provide debris to the Martian system can be found in the </w:t>
+      </w:r>
+      <w:r>
+        <w:rPr>
+          <w:color w:val="000000"/>
+        </w:rPr>
         <w:lastRenderedPageBreak/>
-        <w:t>1.2 Significance and Originality</w:t>
-      </w:r>
-    </w:p>
-    <w:p>
-      <w:pPr>
-        <w:rPr>
-          <w:color w:val="000000"/>
-        </w:rPr>
-      </w:pPr>
-      <w:r>
-        <w:rPr>
-          <w:color w:val="000000"/>
-        </w:rPr>
-        <w:t xml:space="preserve">The work is useful both scientifically and computationally. </w:t>
-      </w:r>
-      <w:r>
-        <w:rPr>
-          <w:color w:val="000000"/>
-        </w:rPr>
-        <w:t xml:space="preserve">From a scientific perspective, simulations of a mechanism that might provide debris to the Martian system can be found in the SPH archive. It solves a frequent computational issue in simulation-based science: while a thorough solver can accurately simulate one setup, it is computationally costly to run multiple setups. Full SPH simulations can be concentrated on situations where ML models are most helpful because, once trained, they can swiftly </w:t>
+        <w:t xml:space="preserve">SPH archive. It solves a frequent computational issue in simulation-based science: while a thorough solver can accurately simulate one setup, it is computationally costly to run multiple setups. Full SPH simulations can be concentrated on situations where ML models are most helpful because, once trained, they can swiftly </w:t>
       </w:r>
       <w:r>
         <w:rPr>
@@ -593,6 +651,7 @@
     <w:p>
       <w:pPr>
         <w:pStyle w:val="Heading1"/>
+        <w:jc w:val="both"/>
         <w:rPr>
           <w:rFonts w:ascii="Times New Roman" w:eastAsia="Times New Roman" w:hAnsi="Times New Roman" w:cs="Times New Roman"/>
           <w:color w:val="auto"/>
@@ -732,24 +791,13 @@
         <w:t xml:space="preserve"> </w:t>
       </w:r>
       <w:r>
-        <w:t xml:space="preserve">The main outcome used in this project is the bound mass fraction, represented by </w:t>
-      </w:r>
-      <w:proofErr w:type="spellStart"/>
-      <w:r>
-        <w:t>f</w:t>
+        <w:t>The main outcome used in this project is the bound mass fraction, represented by f</w:t>
       </w:r>
       <w:r>
         <w:rPr>
           <w:vertAlign w:val="subscript"/>
         </w:rPr>
-        <w:t>bound</w:t>
-      </w:r>
-      <w:proofErr w:type="spellEnd"/>
-      <w:r>
-        <w:rPr>
-          <w:vertAlign w:val="subscript"/>
-        </w:rPr>
-        <w:t>​</w:t>
+        <w:t>bound​</w:t>
       </w:r>
       <w:r>
         <w:t xml:space="preserve">, which is the fraction of the original asteroid mass that remains gravitationally bound to Mars after the encounter, this will be referred to as BMF throughout this report. </w:t>
@@ -2197,14 +2245,7 @@
         <w:rPr>
           <w:color w:val="000000"/>
         </w:rPr>
-        <w:t xml:space="preserve">Breakup is described by the largest-remnant fraction </w:t>
-      </w:r>
-      <w:proofErr w:type="spellStart"/>
-      <w:r>
-        <w:rPr>
-          <w:color w:val="000000"/>
-        </w:rPr>
-        <w:t>f</w:t>
+        <w:t>Breakup is described by the largest-remnant fraction f</w:t>
       </w:r>
       <w:r>
         <w:rPr>
@@ -2213,19 +2254,11 @@
         </w:rPr>
         <w:t>LR</w:t>
       </w:r>
-      <w:proofErr w:type="spellEnd"/>
-      <w:r>
-        <w:rPr>
-          <w:color w:val="000000"/>
-        </w:rPr>
-        <w:t xml:space="preserve"> = </w:t>
-      </w:r>
-      <w:proofErr w:type="spellStart"/>
-      <w:r>
-        <w:rPr>
-          <w:color w:val="000000"/>
-        </w:rPr>
-        <w:t>M</w:t>
+      <w:r>
+        <w:rPr>
+          <w:color w:val="000000"/>
+        </w:rPr>
+        <w:t xml:space="preserve"> = M</w:t>
       </w:r>
       <w:r>
         <w:rPr>
@@ -2234,19 +2267,11 @@
         </w:rPr>
         <w:t>largest</w:t>
       </w:r>
-      <w:proofErr w:type="spellEnd"/>
-      <w:r>
-        <w:rPr>
-          <w:color w:val="000000"/>
-        </w:rPr>
-        <w:t>/</w:t>
-      </w:r>
-      <w:proofErr w:type="spellStart"/>
-      <w:r>
-        <w:rPr>
-          <w:color w:val="000000"/>
-        </w:rPr>
-        <w:t>M</w:t>
+      <w:r>
+        <w:rPr>
+          <w:color w:val="000000"/>
+        </w:rPr>
+        <w:t>/M</w:t>
       </w:r>
       <w:r>
         <w:rPr>
@@ -2255,7 +2280,6 @@
         </w:rPr>
         <w:t>parent</w:t>
       </w:r>
-      <w:proofErr w:type="spellEnd"/>
       <w:r>
         <w:t xml:space="preserve"> where score</w:t>
       </w:r>
@@ -2263,14 +2287,7 @@
         <w:rPr>
           <w:color w:val="000000"/>
         </w:rPr>
-        <w:t xml:space="preserve"> above 0.90 is mostly intact, 0.50-0.90 is partial breakup, and at or below 0.50 is severe disruption. Retention is measured separately with BMF and Mars-bound mass, </w:t>
-      </w:r>
-      <w:proofErr w:type="spellStart"/>
-      <w:r>
-        <w:rPr>
-          <w:color w:val="000000"/>
-        </w:rPr>
-        <w:t>M</w:t>
+        <w:t xml:space="preserve"> above 0.90 is mostly intact, 0.50-0.90 is partial breakup, and at or below 0.50 is severe disruption. Retention is measured separately with BMF and Mars-bound mass, M</w:t>
       </w:r>
       <w:r>
         <w:rPr>
@@ -2279,19 +2296,11 @@
         </w:rPr>
         <w:t>bound</w:t>
       </w:r>
-      <w:proofErr w:type="spellEnd"/>
-      <w:r>
-        <w:rPr>
-          <w:color w:val="000000"/>
-        </w:rPr>
-        <w:t xml:space="preserve"> = BMF × </w:t>
-      </w:r>
-      <w:proofErr w:type="spellStart"/>
-      <w:r>
-        <w:rPr>
-          <w:color w:val="000000"/>
-        </w:rPr>
-        <w:t>M</w:t>
+      <w:r>
+        <w:rPr>
+          <w:color w:val="000000"/>
+        </w:rPr>
+        <w:t xml:space="preserve"> = BMF × M</w:t>
       </w:r>
       <w:r>
         <w:rPr>
@@ -2300,7 +2309,6 @@
         </w:rPr>
         <w:t>parent</w:t>
       </w:r>
-      <w:proofErr w:type="spellEnd"/>
       <w:r>
         <w:t>, t</w:t>
       </w:r>
@@ -2737,7 +2745,31 @@
         <w:rPr>
           <w:rFonts w:eastAsia="Gungsuh"/>
         </w:rPr>
-        <w:t>For the BMF ≥10% screening task, Logistic Regression obtains aggregated balanced accuracy of 0.849 and ROC AUC of 0.925, indicating that the two retention groups are reasonably separable. Continuous BMF continues to be the main output; the threshold is simply utilized for prioriti</w:t>
+        <w:t>For the BMF</w:t>
+      </w:r>
+      <w:r>
+        <w:rPr>
+          <w:rFonts w:eastAsia="Gungsuh"/>
+        </w:rPr>
+        <w:t xml:space="preserve"> </w:t>
+      </w:r>
+      <w:r>
+        <w:rPr>
+          <w:rFonts w:eastAsia="Gungsuh"/>
+        </w:rPr>
+        <w:t>≥</w:t>
+      </w:r>
+      <w:r>
+        <w:rPr>
+          <w:rFonts w:eastAsia="Gungsuh"/>
+        </w:rPr>
+        <w:t xml:space="preserve"> </w:t>
+      </w:r>
+      <w:r>
+        <w:rPr>
+          <w:rFonts w:eastAsia="Gungsuh"/>
+        </w:rPr>
+        <w:t>10% screening task, Logistic Regression obtains aggregated balanced accuracy of 0.849 and ROC AUC of 0.925, indicating that the two retention groups are reasonably separable. Continuous BMF continues to be the main output; the threshold is simply utilized for prioriti</w:t>
       </w:r>
       <w:r>
         <w:rPr>
@@ -2818,7 +2850,16 @@
         <w:t xml:space="preserve">The input-removal test </w:t>
       </w:r>
       <w:r>
-        <w:t xml:space="preserve">yields the most understandable overall result. The amount of predictive information lost is indicated by the decrease in R2 that results from removing each original </w:t>
+        <w:t>yields the most understandable overall result. The amount of predictive information lost is indicated by the decrease in R</w:t>
+      </w:r>
+      <w:r>
+        <w:rPr>
+          <w:vertAlign w:val="superscript"/>
+        </w:rPr>
+        <w:t>2</w:t>
+      </w:r>
+      <w:r>
+        <w:t xml:space="preserve"> that results from removing each original </w:t>
       </w:r>
       <w:r>
         <w:lastRenderedPageBreak/>
@@ -2893,7 +2934,6 @@
     <w:p>
       <w:pPr>
         <w:spacing w:before="240" w:after="240"/>
-        <w:jc w:val="left"/>
       </w:pPr>
       <w:r>
         <w:t>The overall ranking of the inputs on which the model is most dependent does not demonstrate how BMF varies with each input or whether an input's significance stays constant under various encounter circumstances. Two follow-up issues are posed in this section: (1) how does BMF change when one input is changed while the others remain unchanged, and (2) do the impacts of significant inputs hold true under various encounter conditions?</w:t>
@@ -3758,6 +3798,7 @@
     <w:p>
       <w:pPr>
         <w:pStyle w:val="Heading2"/>
+        <w:jc w:val="both"/>
         <w:rPr>
           <w:rFonts w:ascii="Times New Roman" w:eastAsia="Times New Roman" w:hAnsi="Times New Roman" w:cs="Times New Roman"/>
           <w:color w:val="auto"/>
@@ -3842,6 +3883,7 @@
     <w:p>
       <w:pPr>
         <w:pStyle w:val="Heading1"/>
+        <w:jc w:val="both"/>
         <w:rPr>
           <w:rFonts w:ascii="Times New Roman" w:eastAsia="Times New Roman" w:hAnsi="Times New Roman" w:cs="Times New Roman"/>
           <w:color w:val="auto"/>
@@ -3939,6 +3981,7 @@
     <w:p>
       <w:pPr>
         <w:pStyle w:val="Heading1"/>
+        <w:jc w:val="both"/>
         <w:rPr>
           <w:rFonts w:ascii="Times New Roman" w:eastAsia="Times New Roman" w:hAnsi="Times New Roman" w:cs="Times New Roman"/>
           <w:color w:val="auto"/>
@@ -9190,7 +9233,7 @@
 </file>
 
 <file path=customXml/itemProps1.xml><?xml version="1.0" encoding="utf-8"?>
-<ds:datastoreItem xmlns:ds="http://schemas.openxmlformats.org/officeDocument/2006/customXml" ds:itemID="{FB57911D-2D21-0C4A-BDFB-F0B4B3F2E0BD}">
+<ds:datastoreItem xmlns:ds="http://schemas.openxmlformats.org/officeDocument/2006/customXml" ds:itemID="{73CD66E5-88F6-C946-BAC5-CA3DABE315AB}">
   <ds:schemaRefs>
     <ds:schemaRef ds:uri="http://schemas.openxmlformats.org/officeDocument/2006/bibliography"/>
   </ds:schemaRefs>

</xml_diff>

<commit_message>
docs: formatting final report
</commit_message>
<xml_diff>
--- a/deliverables/nny124-final-report.docx
+++ b/deliverables/nny124-final-report.docx
@@ -4053,16 +4053,6 @@
         <w:t>This study sought to determine which inputs are most important for fragment creation and retained debris, how orbital and physical characteristics affect disruption and bound retention, and whether machine learning (ML) can forecast outcomes while indicating when its predictions should be believed. Below is a summary of the responses.</w:t>
       </w:r>
     </w:p>
-    <w:p/>
-    <w:p>
-      <w:r>
-        <w:rPr>
-          <w:color w:val="000000"/>
-        </w:rPr>
-        <w:t>(1) how do orbital and physical parameters affect disruption and bound retention; (2) which inputs matter most for fragment formation and retained debris; and (3) can machine-learning models predict outcomes within the sampled data while showing when a prediction should or should not be trusted?</w:t>
-      </w:r>
-    </w:p>
-    <w:p/>
     <w:p>
       <w:r>
         <w:rPr>
@@ -4184,25 +4174,25 @@
         <w:t>2</w:t>
       </w:r>
       <w:r>
-        <w:t xml:space="preserve"> of 0.9225, an MAE of 0.0179, and an RMSE of 0.0259 are obtained by the primary Random Forest using physics-derived features. Performance isn't always as dependable, though. Despite the input values falling within </w:t>
+        <w:t xml:space="preserve"> of 0.9225, an MAE of 0.0179, and an RMSE of 0.0259 are obtained by the primary Random Forest using physics-derived features. Performance isn't always as dependable, though. Despite the input values falling within the numerical training ranges, held-out errors increase to roughly 0.08 BMF, or 8 percentage points, in the sparsely sampled 10</w:t>
+      </w:r>
+      <w:r>
+        <w:rPr>
+          <w:vertAlign w:val="superscript"/>
+        </w:rPr>
+        <w:t>19.5</w:t>
+      </w:r>
+      <w:r>
+        <w:t xml:space="preserve"> kg example. This demonstrates that being within the entire input range is insufficient for accurate predictions; comparable SPH examples must also be close by. Thus, ML can facilitate quick screening and simulation prioritization; nevertheless, additional SPH research is still needed for sparse, edge, transition, or poorly supported instances.</w:t>
+      </w:r>
+    </w:p>
+    <w:p>
+      <w:r>
+        <w:t xml:space="preserve">Overall, the project shows that tidal-disruption outcomes depend on interacting physical conditions rather than one universal ranking of parameters. Machine learning makes the existing SPH archive </w:t>
       </w:r>
       <w:r>
         <w:lastRenderedPageBreak/>
-        <w:t>the numerical training ranges, held-out errors increase to roughly 0.08 BMF, or 8 percentage points, in the sparsely sampled 10</w:t>
-      </w:r>
-      <w:r>
-        <w:rPr>
-          <w:vertAlign w:val="superscript"/>
-        </w:rPr>
-        <w:t>19.5</w:t>
-      </w:r>
-      <w:r>
-        <w:t xml:space="preserve"> kg example. This demonstrates that being within the entire input range is insufficient for accurate predictions; comparable SPH examples must also be close by. Thus, ML can facilitate quick screening and simulation prioritization; nevertheless, additional SPH research is still needed for sparse, edge, transition, or poorly supported instances.</w:t>
-      </w:r>
-    </w:p>
-    <w:p>
-      <w:r>
-        <w:t>Overall, the project shows that tidal-disruption outcomes depend on interacting physical conditions rather than one universal ranking of parameters. Machine learning makes the existing SPH archive faster to explore, shows where predictions are well supported, and highlights where new simulations would be most useful. It complements SPH rather than replacing the simulation physics.</w:t>
+        <w:t>faster to explore, shows where predictions are well supported, and highlights where new simulations would be most useful. It complements SPH rather than replacing the simulation physics.</w:t>
       </w:r>
     </w:p>
     <w:p>
@@ -4293,6 +4283,7 @@
     <w:p>
       <w:pPr>
         <w:pStyle w:val="Heading2"/>
+        <w:jc w:val="both"/>
         <w:rPr>
           <w:rFonts w:ascii="Times New Roman" w:eastAsia="Times New Roman" w:hAnsi="Times New Roman" w:cs="Times New Roman"/>
           <w:color w:val="auto"/>
@@ -4365,7 +4356,6 @@
     </w:p>
     <w:p>
       <w:r>
-        <w:lastRenderedPageBreak/>
         <w:t>Future research should enhance automatic identification of input combinations with inadequate support and per-prediction reliability estimates. Before updating the current model, new SPH simulations should be used to test exploratory XGBoost and hurdle models. Stronger physical limitations, multi-output prediction, and uncertainty estimates are possible additional enhancements</w:t>
       </w:r>
       <w:r>
@@ -4390,6 +4380,7 @@
           <w:szCs w:val="28"/>
           <w:lang w:val="en-GB"/>
         </w:rPr>
+        <w:lastRenderedPageBreak/>
         <w:t>References</w:t>
       </w:r>
     </w:p>
@@ -4769,8 +4760,125 @@
         <w:rPr>
           <w:color w:val="000000"/>
         </w:rPr>
+        <w:t>Price, D. J. (2012). Smoothed particle hydrodynamics and magnetohydrodynamics. Journal of Computational Physics, 231(3), 759</w:t>
+      </w:r>
+      <w:r>
+        <w:t>-</w:t>
+      </w:r>
+      <w:r>
+        <w:rPr>
+          <w:color w:val="000000"/>
+        </w:rPr>
+        <w:t xml:space="preserve">794. </w:t>
+      </w:r>
+      <w:proofErr w:type="gramStart"/>
+      <w:r>
+        <w:rPr>
+          <w:color w:val="000000"/>
+        </w:rPr>
+        <w:t>doi:10.1016/j.jcp</w:t>
+      </w:r>
+      <w:proofErr w:type="gramEnd"/>
+      <w:r>
+        <w:rPr>
+          <w:color w:val="000000"/>
+        </w:rPr>
+        <w:t>.2010.12.011.</w:t>
+      </w:r>
+    </w:p>
+    <w:p>
+      <w:pPr>
+        <w:ind w:left="340" w:hanging="340"/>
+      </w:pPr>
+      <w:proofErr w:type="spellStart"/>
+      <w:r>
+        <w:rPr>
+          <w:color w:val="000000"/>
+        </w:rPr>
+        <w:t>Prokhorenkova</w:t>
+      </w:r>
+      <w:proofErr w:type="spellEnd"/>
+      <w:r>
+        <w:rPr>
+          <w:color w:val="000000"/>
+        </w:rPr>
+        <w:t xml:space="preserve">, L., Gusev, G., Vorobev, A., </w:t>
+      </w:r>
+      <w:proofErr w:type="spellStart"/>
+      <w:r>
+        <w:rPr>
+          <w:color w:val="000000"/>
+        </w:rPr>
+        <w:t>Dorogush</w:t>
+      </w:r>
+      <w:proofErr w:type="spellEnd"/>
+      <w:r>
+        <w:rPr>
+          <w:color w:val="000000"/>
+        </w:rPr>
+        <w:t xml:space="preserve">, A. V. &amp; Gulin, A. (2018). </w:t>
+      </w:r>
+      <w:proofErr w:type="spellStart"/>
+      <w:r>
+        <w:rPr>
+          <w:color w:val="000000"/>
+        </w:rPr>
+        <w:t>CatBoost</w:t>
+      </w:r>
+      <w:proofErr w:type="spellEnd"/>
+      <w:r>
+        <w:rPr>
+          <w:color w:val="000000"/>
+        </w:rPr>
+        <w:t>: unbiased boosting with categorical features. Advances in Neural Information Processing Systems, 31.</w:t>
+      </w:r>
+    </w:p>
+    <w:p>
+      <w:pPr>
+        <w:ind w:left="340" w:hanging="340"/>
+      </w:pPr>
+      <w:proofErr w:type="spellStart"/>
+      <w:r>
+        <w:rPr>
+          <w:color w:val="000000"/>
+        </w:rPr>
         <w:lastRenderedPageBreak/>
-        <w:t>Price, D. J. (2012). Smoothed particle hydrodynamics and magnetohydrodynamics. Journal of Computational Physics, 231(3), 759</w:t>
+        <w:t>Raissi</w:t>
+      </w:r>
+      <w:proofErr w:type="spellEnd"/>
+      <w:r>
+        <w:rPr>
+          <w:color w:val="000000"/>
+        </w:rPr>
+        <w:t xml:space="preserve">, M., </w:t>
+      </w:r>
+      <w:proofErr w:type="spellStart"/>
+      <w:r>
+        <w:rPr>
+          <w:color w:val="000000"/>
+        </w:rPr>
+        <w:t>Perdikaris</w:t>
+      </w:r>
+      <w:proofErr w:type="spellEnd"/>
+      <w:r>
+        <w:rPr>
+          <w:color w:val="000000"/>
+        </w:rPr>
+        <w:t xml:space="preserve">, P. &amp; </w:t>
+      </w:r>
+      <w:proofErr w:type="spellStart"/>
+      <w:r>
+        <w:rPr>
+          <w:color w:val="000000"/>
+        </w:rPr>
+        <w:t>Karniadakis</w:t>
+      </w:r>
+      <w:proofErr w:type="spellEnd"/>
+      <w:r>
+        <w:rPr>
+          <w:color w:val="000000"/>
+        </w:rPr>
+        <w:t>, G. E. (2019). Physics-informed neural networks: A deep learning framework for solving forward and inverse problems involving nonlinear partial differential equations. Journal of Computational Physics, 378, 686</w:t>
       </w:r>
       <w:r>
         <w:t>-</w:t>
@@ -4779,7 +4887,7 @@
         <w:rPr>
           <w:color w:val="000000"/>
         </w:rPr>
-        <w:t xml:space="preserve">794. </w:t>
+        <w:t xml:space="preserve">707. </w:t>
       </w:r>
       <w:proofErr w:type="gramStart"/>
       <w:r>
@@ -4793,101 +4901,100 @@
         <w:rPr>
           <w:color w:val="000000"/>
         </w:rPr>
-        <w:t>.2010.12.011.</w:t>
+        <w:t>.2018.10.045.</w:t>
       </w:r>
     </w:p>
     <w:p>
       <w:pPr>
         <w:ind w:left="340" w:hanging="340"/>
       </w:pPr>
+      <w:r>
+        <w:rPr>
+          <w:color w:val="000000"/>
+        </w:rPr>
+        <w:t>Richardson, D. C., Bottke, W. F. Jr. &amp; Love, S. G. (1998). Tidal distortion and disruption of Earth-crossing asteroids. Icarus, 134, 47</w:t>
+      </w:r>
+      <w:r>
+        <w:t>-</w:t>
+      </w:r>
+      <w:r>
+        <w:rPr>
+          <w:color w:val="000000"/>
+        </w:rPr>
+        <w:t>76.</w:t>
+      </w:r>
+    </w:p>
+    <w:p>
+      <w:pPr>
+        <w:ind w:left="340" w:hanging="340"/>
+      </w:pPr>
+      <w:r>
+        <w:rPr>
+          <w:color w:val="000000"/>
+        </w:rPr>
+        <w:t xml:space="preserve">Rosenblatt, P., </w:t>
+      </w:r>
       <w:proofErr w:type="spellStart"/>
       <w:r>
         <w:rPr>
           <w:color w:val="000000"/>
         </w:rPr>
-        <w:t>Prokhorenkova</w:t>
+        <w:t>Charnoz</w:t>
       </w:r>
       <w:proofErr w:type="spellEnd"/>
       <w:r>
         <w:rPr>
           <w:color w:val="000000"/>
         </w:rPr>
-        <w:t xml:space="preserve">, L., Gusev, G., Vorobev, A., </w:t>
+        <w:t>, S., Dunseath, K. M., Terao-Dunseath, M. &amp; Trinh, A. (2016). Accretion of Phobos and Deimos in an extended debris disc stirred by transient moons. Nature Geoscience, 9, 581</w:t>
+      </w:r>
+      <w:r>
+        <w:t>-</w:t>
+      </w:r>
+      <w:r>
+        <w:rPr>
+          <w:color w:val="000000"/>
+        </w:rPr>
+        <w:t>583. doi:10.1038/ngeo2742.</w:t>
+      </w:r>
+    </w:p>
+    <w:p>
+      <w:pPr>
+        <w:ind w:left="340" w:hanging="340"/>
+      </w:pPr>
+      <w:r>
+        <w:rPr>
+          <w:color w:val="000000"/>
+        </w:rPr>
+        <w:t xml:space="preserve">Villaescusa-Navarro, F. et al. (2021). The CAMELS project: Cosmology and Astrophysics with </w:t>
       </w:r>
       <w:proofErr w:type="spellStart"/>
       <w:r>
         <w:rPr>
           <w:color w:val="000000"/>
         </w:rPr>
-        <w:t>Dorogush</w:t>
+        <w:t>MachinE</w:t>
       </w:r>
       <w:proofErr w:type="spellEnd"/>
       <w:r>
         <w:rPr>
           <w:color w:val="000000"/>
         </w:rPr>
-        <w:t xml:space="preserve">, A. V. &amp; Gulin, A. (2018). </w:t>
-      </w:r>
-      <w:proofErr w:type="spellStart"/>
-      <w:r>
-        <w:rPr>
-          <w:color w:val="000000"/>
-        </w:rPr>
-        <w:t>CatBoost</w:t>
-      </w:r>
-      <w:proofErr w:type="spellEnd"/>
-      <w:r>
-        <w:rPr>
-          <w:color w:val="000000"/>
-        </w:rPr>
-        <w:t>: unbiased boosting with categorical features. Advances in Neural Information Processing Systems, 31.</w:t>
+        <w:t xml:space="preserve"> Learning Simulations. arXiv:2010.00619.</w:t>
       </w:r>
     </w:p>
     <w:p>
       <w:pPr>
         <w:ind w:left="340" w:hanging="340"/>
-      </w:pPr>
-      <w:proofErr w:type="spellStart"/>
-      <w:r>
-        <w:rPr>
-          <w:color w:val="000000"/>
-        </w:rPr>
-        <w:t>Raissi</w:t>
-      </w:r>
-      <w:proofErr w:type="spellEnd"/>
-      <w:r>
-        <w:rPr>
-          <w:color w:val="000000"/>
-        </w:rPr>
-        <w:t xml:space="preserve">, M., </w:t>
-      </w:r>
-      <w:proofErr w:type="spellStart"/>
-      <w:r>
-        <w:rPr>
-          <w:color w:val="000000"/>
-        </w:rPr>
-        <w:t>Perdikaris</w:t>
-      </w:r>
-      <w:proofErr w:type="spellEnd"/>
-      <w:r>
-        <w:rPr>
-          <w:color w:val="000000"/>
-        </w:rPr>
-        <w:t xml:space="preserve">, P. &amp; </w:t>
-      </w:r>
-      <w:proofErr w:type="spellStart"/>
-      <w:r>
-        <w:rPr>
-          <w:color w:val="000000"/>
-        </w:rPr>
-        <w:t>Karniadakis</w:t>
-      </w:r>
-      <w:proofErr w:type="spellEnd"/>
-      <w:r>
-        <w:rPr>
-          <w:color w:val="000000"/>
-        </w:rPr>
-        <w:t>, G. E. (2019). Physics-informed neural networks: A deep learning framework for solving forward and inverse problems involving nonlinear partial differential equations. Journal of Computational Physics, 378, 686</w:t>
+        <w:rPr>
+          <w:color w:val="000000"/>
+        </w:rPr>
+      </w:pPr>
+      <w:r>
+        <w:rPr>
+          <w:color w:val="000000"/>
+        </w:rPr>
+        <w:t>Walsh, K. J. &amp; Richardson, D. C. (2006). Binary near-Earth asteroid formation: Rubble pile model of tidal disruptions. Icarus, 180(1), 201</w:t>
       </w:r>
       <w:r>
         <w:t>-</w:t>
@@ -4896,134 +5003,47 @@
         <w:rPr>
           <w:color w:val="000000"/>
         </w:rPr>
-        <w:t xml:space="preserve">707. </w:t>
+        <w:t xml:space="preserve">216. </w:t>
       </w:r>
       <w:proofErr w:type="gramStart"/>
       <w:r>
         <w:rPr>
           <w:color w:val="000000"/>
         </w:rPr>
-        <w:t>doi:10.1016/j.jcp</w:t>
+        <w:t>doi:10.1016/j.icarus</w:t>
       </w:r>
       <w:proofErr w:type="gramEnd"/>
       <w:r>
         <w:rPr>
           <w:color w:val="000000"/>
         </w:rPr>
-        <w:t>.2018.10.045.</w:t>
-      </w:r>
-    </w:p>
-    <w:p>
-      <w:pPr>
-        <w:ind w:left="340" w:hanging="340"/>
-      </w:pPr>
-      <w:r>
-        <w:rPr>
-          <w:color w:val="000000"/>
-        </w:rPr>
-        <w:t>Richardson, D. C., Bottke, W. F. Jr. &amp; Love, S. G. (1998). Tidal distortion and disruption of Earth-crossing asteroids. Icarus, 134, 47</w:t>
-      </w:r>
-      <w:r>
-        <w:t>-</w:t>
-      </w:r>
-      <w:r>
-        <w:rPr>
-          <w:color w:val="000000"/>
-        </w:rPr>
-        <w:t>76.</w:t>
-      </w:r>
-    </w:p>
-    <w:p>
-      <w:pPr>
-        <w:ind w:left="340" w:hanging="340"/>
-      </w:pPr>
-      <w:r>
-        <w:rPr>
-          <w:color w:val="000000"/>
-        </w:rPr>
-        <w:t xml:space="preserve">Rosenblatt, P., </w:t>
-      </w:r>
-      <w:proofErr w:type="spellStart"/>
-      <w:r>
-        <w:rPr>
-          <w:color w:val="000000"/>
-        </w:rPr>
-        <w:t>Charnoz</w:t>
-      </w:r>
-      <w:proofErr w:type="spellEnd"/>
-      <w:r>
-        <w:rPr>
-          <w:color w:val="000000"/>
-        </w:rPr>
-        <w:t>, S., Dunseath, K. M., Terao-Dunseath, M. &amp; Trinh, A. (2016). Accretion of Phobos and Deimos in an extended debris disc stirred by transient moons. Nature Geoscience, 9, 581</w:t>
-      </w:r>
-      <w:r>
-        <w:t>-</w:t>
-      </w:r>
-      <w:r>
-        <w:rPr>
-          <w:color w:val="000000"/>
-        </w:rPr>
-        <w:t>583. doi:10.1038/ngeo2742.</w:t>
-      </w:r>
-    </w:p>
-    <w:p>
-      <w:pPr>
-        <w:ind w:left="340" w:hanging="340"/>
-      </w:pPr>
-      <w:r>
-        <w:rPr>
-          <w:color w:val="000000"/>
-        </w:rPr>
-        <w:t xml:space="preserve">Villaescusa-Navarro, F. et al. (2021). The CAMELS project: Cosmology and Astrophysics with </w:t>
-      </w:r>
-      <w:proofErr w:type="spellStart"/>
-      <w:r>
-        <w:rPr>
-          <w:color w:val="000000"/>
-        </w:rPr>
-        <w:t>MachinE</w:t>
-      </w:r>
-      <w:proofErr w:type="spellEnd"/>
-      <w:r>
-        <w:rPr>
-          <w:color w:val="000000"/>
-        </w:rPr>
-        <w:t xml:space="preserve"> Learning Simulations. arXiv:2010.00619.</w:t>
-      </w:r>
-    </w:p>
-    <w:p>
-      <w:pPr>
-        <w:ind w:left="340" w:hanging="340"/>
-      </w:pPr>
-      <w:r>
-        <w:rPr>
-          <w:color w:val="000000"/>
-        </w:rPr>
-        <w:t>Walsh, K. J. &amp; Richardson, D. C. (2006). Binary near-Earth asteroid formation: Rubble pile model of tidal disruptions. Icarus, 180(1), 201</w:t>
-      </w:r>
-      <w:r>
-        <w:t>-</w:t>
-      </w:r>
-      <w:r>
-        <w:rPr>
-          <w:color w:val="000000"/>
-        </w:rPr>
-        <w:t xml:space="preserve">216. </w:t>
-      </w:r>
-      <w:proofErr w:type="gramStart"/>
-      <w:r>
-        <w:rPr>
-          <w:color w:val="000000"/>
-        </w:rPr>
-        <w:t>doi:10.1016/j.icarus</w:t>
-      </w:r>
-      <w:proofErr w:type="gramEnd"/>
-      <w:r>
-        <w:rPr>
-          <w:color w:val="000000"/>
-        </w:rPr>
         <w:t>.2005.08.015.</w:t>
+      </w:r>
+    </w:p>
+    <w:p>
+      <w:pPr>
+        <w:spacing w:after="160" w:line="278" w:lineRule="auto"/>
+        <w:jc w:val="left"/>
+        <w:rPr>
+          <w:rFonts w:eastAsiaTheme="majorEastAsia"/>
+          <w:b/>
+          <w:bCs/>
+          <w:color w:val="000000" w:themeColor="text1"/>
+          <w:kern w:val="2"/>
+          <w:sz w:val="28"/>
+          <w:szCs w:val="28"/>
+          <w14:ligatures w14:val="standardContextual"/>
+        </w:rPr>
+      </w:pPr>
+      <w:r>
+        <w:rPr>
+          <w:b/>
+          <w:bCs/>
+          <w:color w:val="000000" w:themeColor="text1"/>
+          <w:sz w:val="28"/>
+          <w:szCs w:val="28"/>
+        </w:rPr>
+        <w:br w:type="page"/>
       </w:r>
     </w:p>
     <w:p>
@@ -5049,6 +5069,7 @@
           <w:szCs w:val="28"/>
           <w:lang w:val="en-GB"/>
         </w:rPr>
+        <w:lastRenderedPageBreak/>
         <w:t>Appendix A</w:t>
       </w:r>
       <w:r>
@@ -5461,7 +5482,6 @@
               <w:rPr>
                 <w:color w:val="000000"/>
               </w:rPr>
-              <w:lastRenderedPageBreak/>
               <w:t>1/</w:t>
             </w:r>
             <w:proofErr w:type="spellStart"/>
@@ -5823,17 +5843,11 @@
         <w:spacing w:after="0"/>
         <w:jc w:val="left"/>
       </w:pPr>
-    </w:p>
-    <w:p>
-      <w:pPr>
-        <w:keepNext/>
-        <w:spacing w:after="0"/>
-        <w:jc w:val="left"/>
-      </w:pPr>
       <w:r>
         <w:rPr>
           <w:noProof/>
         </w:rPr>
+        <w:lastRenderedPageBreak/>
         <w:drawing>
           <wp:inline distT="114300" distB="114300" distL="114300" distR="114300" wp14:anchorId="6926A25A" wp14:editId="0A2F53C1">
             <wp:extent cx="5900738" cy="1560291"/>
@@ -5901,7 +5915,6 @@
         <w:keepNext/>
       </w:pPr>
       <w:r>
-        <w:lastRenderedPageBreak/>
         <w:t>Table A2. Comparison of BMF regression models using five-fold GroupKFold by physical SPH simulation, including exploratory advanced models to show the potential for further performance improvement in future work.</w:t>
       </w:r>
     </w:p>
@@ -9233,7 +9246,7 @@
 </file>
 
 <file path=customXml/itemProps1.xml><?xml version="1.0" encoding="utf-8"?>
-<ds:datastoreItem xmlns:ds="http://schemas.openxmlformats.org/officeDocument/2006/customXml" ds:itemID="{73CD66E5-88F6-C946-BAC5-CA3DABE315AB}">
+<ds:datastoreItem xmlns:ds="http://schemas.openxmlformats.org/officeDocument/2006/customXml" ds:itemID="{CF051D62-B0E8-0448-ACBD-DF9ACD591E44}">
   <ds:schemaRefs>
     <ds:schemaRef ds:uri="http://schemas.openxmlformats.org/officeDocument/2006/bibliography"/>
   </ds:schemaRefs>

</xml_diff>

<commit_message>
docs: recheck section 1
</commit_message>
<xml_diff>
--- a/deliverables/nny124-final-report.docx
+++ b/deliverables/nny124-final-report.docx
@@ -469,27 +469,51 @@
         <w:rPr>
           <w:color w:val="000000"/>
         </w:rPr>
-        <w:t xml:space="preserve">Because its particles move with the material as it deforms, fragments, and interacts gravitationally, smoothed-particle hydrodynamics (SPH) is a good fit for this situation. Nevertheless, simulating each new configuration is computationally costly. It is simply not feasible to test every possible combination of asteroid mass, closest approach, encounter speed, spin, and numerical settings. </w:t>
-      </w:r>
-      <w:r>
-        <w:rPr>
-          <w:color w:val="000000"/>
-        </w:rPr>
-        <w:t>To</w:t>
-      </w:r>
-      <w:r>
-        <w:rPr>
-          <w:color w:val="000000"/>
-        </w:rPr>
-        <w:t xml:space="preserve"> filter potential situations and determine when fresh SPH simulations are required, this research builds a machine learning (ML) surrogate using the current simulation archive.</w:t>
-      </w:r>
-    </w:p>
-    <w:p>
-      <w:r>
-        <w:rPr>
-          <w:color w:val="000000"/>
-        </w:rPr>
-        <w:t xml:space="preserve">Three research questions are addressed in the report: </w:t>
+        <w:t>Smoothed-particle hydrodynamics (SPH) works well in this case because its particles move with the material as it deforms, fragments, and interacts gravitationally. However, simulating each new arrangement is computationally expensive. It is simply not practical to test every possible combination of asteroid mass, closest approach, encounter speed, spin, and numerical parameters. Using the present simulation archive, this study creates a machine learning (ML) surrogate to filter probable scenarios and identify whether new SPH simulations are necessary.</w:t>
+      </w:r>
+    </w:p>
+    <w:p>
+      <w:r>
+        <w:rPr>
+          <w:color w:val="000000"/>
+        </w:rPr>
+        <w:t>Th</w:t>
+      </w:r>
+      <w:r>
+        <w:rPr>
+          <w:color w:val="000000"/>
+        </w:rPr>
+        <w:t>ere a</w:t>
+      </w:r>
+      <w:r>
+        <w:rPr>
+          <w:color w:val="000000"/>
+        </w:rPr>
+        <w:t>re</w:t>
+      </w:r>
+      <w:r>
+        <w:rPr>
+          <w:color w:val="000000"/>
+        </w:rPr>
+        <w:t xml:space="preserve"> three</w:t>
+      </w:r>
+      <w:r>
+        <w:rPr>
+          <w:color w:val="000000"/>
+        </w:rPr>
+        <w:t xml:space="preserve"> research questions addressed </w:t>
+      </w:r>
+      <w:r>
+        <w:rPr>
+          <w:color w:val="000000"/>
+        </w:rPr>
+        <w:t>here</w:t>
+      </w:r>
+      <w:r>
+        <w:rPr>
+          <w:color w:val="000000"/>
+        </w:rPr>
+        <w:t xml:space="preserve">: </w:t>
       </w:r>
       <w:r>
         <w:rPr>
@@ -529,7 +553,31 @@
         <w:rPr>
           <w:color w:val="000000"/>
         </w:rPr>
-        <w:t xml:space="preserve">The work is useful both scientifically and computationally. </w:t>
+        <w:t xml:space="preserve">The work </w:t>
+      </w:r>
+      <w:r>
+        <w:rPr>
+          <w:color w:val="000000"/>
+        </w:rPr>
+        <w:t>has</w:t>
+      </w:r>
+      <w:r>
+        <w:rPr>
+          <w:color w:val="000000"/>
+        </w:rPr>
+        <w:t xml:space="preserve"> both scientific and computationa</w:t>
+      </w:r>
+      <w:r>
+        <w:rPr>
+          <w:color w:val="000000"/>
+        </w:rPr>
+        <w:t>l significance.</w:t>
+      </w:r>
+      <w:r>
+        <w:rPr>
+          <w:color w:val="000000"/>
+        </w:rPr>
+        <w:t xml:space="preserve"> </w:t>
       </w:r>
       <w:r>
         <w:rPr>
@@ -622,7 +670,25 @@
         <w:rPr>
           <w:color w:val="000000"/>
         </w:rPr>
-        <w:t xml:space="preserve">Phobos and Deimos have been explained in </w:t>
+        <w:t xml:space="preserve">The formation of Mars’ moons, </w:t>
+      </w:r>
+      <w:r>
+        <w:rPr>
+          <w:color w:val="000000"/>
+        </w:rPr>
+        <w:t>Phobos and Deimos</w:t>
+      </w:r>
+      <w:r>
+        <w:rPr>
+          <w:color w:val="000000"/>
+        </w:rPr>
+        <w:t>,</w:t>
+      </w:r>
+      <w:r>
+        <w:rPr>
+          <w:color w:val="000000"/>
+        </w:rPr>
+        <w:t xml:space="preserve"> have been explained in </w:t>
       </w:r>
       <w:r>
         <w:rPr>
@@ -634,7 +700,19 @@
         <w:rPr>
           <w:color w:val="000000"/>
         </w:rPr>
-        <w:t xml:space="preserve"> ways. Debris disks surrounding Mars can be created by giant-impact simulations (Citron et al., 2015; Canup &amp; Salmon, 2018). Phobos and Deimos may originate from a disrupted shared parent body, according to orbital studies, and temporary inner moons may influence how material in the outer disk accretes (Rosenblatt et al., 2016; Bagheri et al., 2021). Nevertheless, little is known about the mechanisms that create and hold onto debris in the vicinity of Mars. Therefore, by demonstrating that a close asteroid contact with Mars can tidally destroy the asteroid while trapping part of its debris, Kegerreis et al. (2024) offer a significant alternative creation pathway. The current project is directly motivated by this. Although their simulations demonstrate significant amounts of bound debris across various periapsis, velocity, mass, and spin settings, each new configuration necessitates a new simulation. This study investigates whether an ML model that screens new configurations prior to SPH execution can be trained using the current archive.</w:t>
+        <w:t xml:space="preserve"> ways. Debris disks surrounding Mars can be created by giant-impact simulations (Citron et al., 2015; Canup &amp; Salmon, 2018). Phobos and Deimos may originate from a disrupted shared parent body, according to orbital studies, and temporary inner moons may influence how material in the outer disk accretes (Rosenblatt et al., 2016; Bagheri et al., 2021). Nevertheless, little is known about the mechanisms that create and hold onto debris in the vicinity of Mars. </w:t>
+      </w:r>
+      <w:r>
+        <w:rPr>
+          <w:color w:val="000000"/>
+        </w:rPr>
+        <w:t>So, by</w:t>
+      </w:r>
+      <w:r>
+        <w:rPr>
+          <w:color w:val="000000"/>
+        </w:rPr>
+        <w:t xml:space="preserve"> demonstrating that a close asteroid contact with Mars can tidally destroy the asteroid while trapping part of its debris, Kegerreis et al. (2024) offer a significant alternative creation pathway. The current project is directly motivated by this. Although their simulations demonstrate significant amounts of bound debris across various periapsis, velocity, mass, and spin settings, each new configuration necessitates a new simulation. This study investigates whether an ML model that screens new configurations prior to SPH execution can be trained using the current archive.</w:t>
       </w:r>
     </w:p>
     <w:p>
@@ -779,7 +857,7 @@
         <w:t>totalling</w:t>
       </w:r>
       <w:r>
-        <w:t xml:space="preserve"> over 218 GB of HDF5 particle data are included in the collection. These particle outputs are transformed into fragment and bound-mass measurements through post-processing. bonded mass fraction (BMF), or the portion of the initial asteroid mass that is gravitationally bonded to Mars following the contact, is the main aim. The asteroid and input parameter values are provided by the simulation </w:t>
+        <w:t xml:space="preserve"> over 218 GB of HDF5 particle data are included in the collection. These particle outputs are transformed into fragment and bound-mass measurements through post-processing. The asteroid and input parameter values are provided by the simulation </w:t>
       </w:r>
       <w:r>
         <w:t>setup and</w:t>
@@ -791,7 +869,13 @@
         <w:t xml:space="preserve"> </w:t>
       </w:r>
       <w:r>
-        <w:t>The main outcome used in this project is the bound mass fraction, represented by f</w:t>
+        <w:t>The main outcome</w:t>
+      </w:r>
+      <w:r>
+        <w:t xml:space="preserve">/model target </w:t>
+      </w:r>
+      <w:r>
+        <w:t>in this project is the bound mass fraction, represented by f</w:t>
       </w:r>
       <w:r>
         <w:rPr>
@@ -800,7 +884,15 @@
         <w:t>bound​</w:t>
       </w:r>
       <w:r>
-        <w:t xml:space="preserve">, which is the fraction of the original asteroid mass that remains gravitationally bound to Mars after the encounter, this will be referred to as BMF throughout this report. </w:t>
+        <w:t xml:space="preserve">, which is the fraction of the original asteroid mass that remains </w:t>
+      </w:r>
+      <w:proofErr w:type="spellStart"/>
+      <w:r>
+        <w:t>gravitationaly</w:t>
+      </w:r>
+      <w:proofErr w:type="spellEnd"/>
+      <w:r>
+        <w:t xml:space="preserve"> bound to Mars after the encounter, this will be referred to as BMF throughout this report. </w:t>
       </w:r>
     </w:p>
     <w:p>
@@ -1377,7 +1469,10 @@
               <w:t xml:space="preserve">00 </w:t>
             </w:r>
             <w:r>
-              <w:t>is the lowest-speed case, while higher v codes represent faster encounters. Higher speeds generally make capture less likely.</w:t>
+              <w:t xml:space="preserve">is the lowest-speed case, while higher v codes represent faster encounters. Higher speeds </w:t>
+            </w:r>
+            <w:r>
+              <w:t>cause less capture.</w:t>
             </w:r>
           </w:p>
         </w:tc>
@@ -9246,7 +9341,7 @@
 </file>
 
 <file path=customXml/itemProps1.xml><?xml version="1.0" encoding="utf-8"?>
-<ds:datastoreItem xmlns:ds="http://schemas.openxmlformats.org/officeDocument/2006/customXml" ds:itemID="{CF051D62-B0E8-0448-ACBD-DF9ACD591E44}">
+<ds:datastoreItem xmlns:ds="http://schemas.openxmlformats.org/officeDocument/2006/customXml" ds:itemID="{EE65C99C-2AA9-4945-A74F-A8B37AB63811}">
   <ds:schemaRefs>
     <ds:schemaRef ds:uri="http://schemas.openxmlformats.org/officeDocument/2006/bibliography"/>
   </ds:schemaRefs>

</xml_diff>

<commit_message>
docs: fix value revise
</commit_message>
<xml_diff>
--- a/deliverables/nny124-final-report.docx
+++ b/deliverables/nny124-final-report.docx
@@ -751,59 +751,7 @@
           <w14:ligatures w14:val="none"/>
         </w:rPr>
         <w:lastRenderedPageBreak/>
-        <w:t>The particle-level SPH outputs are transformed into scalar outcomes through post-processing, creating a compact tabular dataset appropriate for machine learning. Because tree-based models perform well with tiny, nonlinear tabular datasets, this makes the problem a good fit for machine learning (ML) (</w:t>
-      </w:r>
-      <w:proofErr w:type="spellStart"/>
-      <w:r>
-        <w:rPr>
-          <w:rFonts w:ascii="Times New Roman" w:eastAsia="Times New Roman" w:hAnsi="Times New Roman" w:cs="Times New Roman"/>
-          <w:color w:val="auto"/>
-          <w:kern w:val="0"/>
-          <w:sz w:val="24"/>
-          <w:szCs w:val="24"/>
-          <w:lang w:val="en-GB"/>
-          <w14:ligatures w14:val="none"/>
-        </w:rPr>
-        <w:t>Grinsztajn</w:t>
-      </w:r>
-      <w:proofErr w:type="spellEnd"/>
-      <w:r>
-        <w:rPr>
-          <w:rFonts w:ascii="Times New Roman" w:eastAsia="Times New Roman" w:hAnsi="Times New Roman" w:cs="Times New Roman"/>
-          <w:color w:val="auto"/>
-          <w:kern w:val="0"/>
-          <w:sz w:val="24"/>
-          <w:szCs w:val="24"/>
-          <w:lang w:val="en-GB"/>
-          <w14:ligatures w14:val="none"/>
-        </w:rPr>
-        <w:t xml:space="preserve"> et al., 2022). In the past, outcomes from comparable SPH collision and giant-impact simulations have also been predicted using tree-based ML surrogate models (</w:t>
-      </w:r>
-      <w:proofErr w:type="spellStart"/>
-      <w:r>
-        <w:rPr>
-          <w:rFonts w:ascii="Times New Roman" w:eastAsia="Times New Roman" w:hAnsi="Times New Roman" w:cs="Times New Roman"/>
-          <w:color w:val="auto"/>
-          <w:kern w:val="0"/>
-          <w:sz w:val="24"/>
-          <w:szCs w:val="24"/>
-          <w:lang w:val="en-GB"/>
-          <w14:ligatures w14:val="none"/>
-        </w:rPr>
-        <w:t>Cambioni</w:t>
-      </w:r>
-      <w:proofErr w:type="spellEnd"/>
-      <w:r>
-        <w:rPr>
-          <w:rFonts w:ascii="Times New Roman" w:eastAsia="Times New Roman" w:hAnsi="Times New Roman" w:cs="Times New Roman"/>
-          <w:color w:val="auto"/>
-          <w:kern w:val="0"/>
-          <w:sz w:val="24"/>
-          <w:szCs w:val="24"/>
-          <w:lang w:val="en-GB"/>
-          <w14:ligatures w14:val="none"/>
-        </w:rPr>
-        <w:t xml:space="preserve"> et al., 2019; Timpe et al., 2020). They are still not widely used for asteroid tidal-disruption encounters, though.</w:t>
+        <w:t>The particle-level SPH outputs are transformed into scalar outcomes through post-processing, creating a compact tabular dataset appropriate for machine learning. Because tree-based models perform well with tiny, nonlinear tabular datasets, this makes the problem a good fit for machine learning (ML) (Grinsztajn et al., 2022). In the past, outcomes from comparable SPH collision and giant-impact simulations have also been predicted using tree-based ML surrogate models (Cambioni et al., 2019; Timpe et al., 2020). They are still not widely used for asteroid tidal-disruption encounters, though.</w:t>
       </w:r>
     </w:p>
     <w:p>
@@ -884,15 +832,7 @@
         <w:t>bound​</w:t>
       </w:r>
       <w:r>
-        <w:t xml:space="preserve">, which is the fraction of the original asteroid mass that remains </w:t>
-      </w:r>
-      <w:proofErr w:type="spellStart"/>
-      <w:r>
-        <w:t>gravitationaly</w:t>
-      </w:r>
-      <w:proofErr w:type="spellEnd"/>
-      <w:r>
-        <w:t xml:space="preserve"> bound to Mars after the encounter, this will be referred to as BMF throughout this report. </w:t>
+        <w:t xml:space="preserve">, which is the fraction of the original asteroid mass that remains gravitationaly bound to Mars after the encounter, this will be referred to as BMF throughout this report. </w:t>
       </w:r>
     </w:p>
     <w:p>
@@ -2016,35 +1956,7 @@
         <w:rPr>
           <w:rFonts w:eastAsia="Gungsuh"/>
         </w:rPr>
-        <w:t xml:space="preserve"> baseline models were used. While this project primarily focuses on tree-based models, Logistic Regression is also used for the BMF ≥ 10% classification task because it offers a straightforward baseline for testing whether lower- and higher-retention cases can already be separated using a relatively simple combination of the inputs (Knauer et al., 2024). Because Random Forest can capture nonlinear correlations and interactions between the simulation parameters while averaging numerous trees to lessen susceptibility to specific cases, it is tried for continuous BMF prediction (</w:t>
-      </w:r>
-      <w:proofErr w:type="spellStart"/>
-      <w:r>
-        <w:rPr>
-          <w:rFonts w:eastAsia="Gungsuh"/>
-        </w:rPr>
-        <w:t>Breiman</w:t>
-      </w:r>
-      <w:proofErr w:type="spellEnd"/>
-      <w:r>
-        <w:rPr>
-          <w:rFonts w:eastAsia="Gungsuh"/>
-        </w:rPr>
-        <w:t xml:space="preserve">, 2001; </w:t>
-      </w:r>
-      <w:proofErr w:type="spellStart"/>
-      <w:r>
-        <w:rPr>
-          <w:rFonts w:eastAsia="Gungsuh"/>
-        </w:rPr>
-        <w:t>Cambioni</w:t>
-      </w:r>
-      <w:proofErr w:type="spellEnd"/>
-      <w:r>
-        <w:rPr>
-          <w:rFonts w:eastAsia="Gungsuh"/>
-        </w:rPr>
-        <w:t xml:space="preserve"> et al., 2019). Additionally, Gradient Boosting is evaluated since it constructs trees in a sequential manner, with each subsequent tree fixing mistakes produced by the ones before it. This could assist capture more precise changes between various encounter settings (Friedman, 2001; Valencia et al., 2019; Timpe et al., 2020).</w:t>
+        <w:t xml:space="preserve"> baseline models were used. While this project primarily focuses on tree-based models, Logistic Regression is also used for the BMF ≥ 10% classification task because it offers a straightforward baseline for testing whether lower- and higher-retention cases can already be separated using a relatively simple combination of the inputs (Knauer et al., 2024). Because Random Forest can capture nonlinear correlations and interactions between the simulation parameters while averaging numerous trees to lessen susceptibility to specific cases, it is tried for continuous BMF prediction (Breiman, 2001; Cambioni et al., 2019). Additionally, Gradient Boosting is evaluated since it constructs trees in a sequential manner, with each subsequent tree fixing mistakes produced by the ones before it. This could assist capture more precise changes between various encounter settings (Friedman, 2001; Valencia et al., 2019; Timpe et al., 2020).</w:t>
       </w:r>
     </w:p>
     <w:p>
@@ -2083,33 +1995,7 @@
           <w:lang w:val="en-GB"/>
           <w14:ligatures w14:val="none"/>
         </w:rPr>
-        <w:t xml:space="preserve"> determine whether these modifications enhanced prediction performance, the model was further developed after the baseline by adjusting the model's parameters and incorporating physics-derived attributes computed from the first simulation inputs. Other more sophisticated model variations, such as XGBoost and two-stage hurdle models, were also investigated; however, they remained exploratory and are not covered in more detail in this project because their primary purpose was to demonstrate the possibility of further model improvement in subsequent work rather than to serve as the project's primary outcome. Since this project uses a small tabular dataset of simulation inputs and numerical results, more sophisticated methods like physics-informed neural networks, which are primarily intended to learn continuous spatial or time-dependent fields while enforcing physical equations, were not investigated (</w:t>
-      </w:r>
-      <w:proofErr w:type="spellStart"/>
-      <w:r>
-        <w:rPr>
-          <w:rFonts w:ascii="Times New Roman" w:eastAsia="Times New Roman" w:hAnsi="Times New Roman" w:cs="Times New Roman"/>
-          <w:color w:val="auto"/>
-          <w:kern w:val="0"/>
-          <w:sz w:val="24"/>
-          <w:szCs w:val="24"/>
-          <w:lang w:val="en-GB"/>
-          <w14:ligatures w14:val="none"/>
-        </w:rPr>
-        <w:t>Raissi</w:t>
-      </w:r>
-      <w:proofErr w:type="spellEnd"/>
-      <w:r>
-        <w:rPr>
-          <w:rFonts w:ascii="Times New Roman" w:eastAsia="Times New Roman" w:hAnsi="Times New Roman" w:cs="Times New Roman"/>
-          <w:color w:val="auto"/>
-          <w:kern w:val="0"/>
-          <w:sz w:val="24"/>
-          <w:szCs w:val="24"/>
-          <w:lang w:val="en-GB"/>
-          <w14:ligatures w14:val="none"/>
-        </w:rPr>
-        <w:t xml:space="preserve"> et al., 2019).</w:t>
+        <w:t xml:space="preserve"> determine whether these modifications enhanced prediction performance, the model was further developed after the baseline by adjusting the model's parameters and incorporating physics-derived attributes computed from the first simulation inputs. Other more sophisticated model variations, such as XGBoost and two-stage hurdle models, were also investigated; however, they remained exploratory and are not covered in more detail in this project because their primary purpose was to demonstrate the possibility of further model improvement in subsequent work rather than to serve as the project's primary outcome. Since this project uses a small tabular dataset of simulation inputs and numerical results, more sophisticated methods like physics-informed neural networks, which are primarily intended to learn continuous spatial or time-dependent fields while enforcing physical equations, were not investigated (Raissi et al., 2019).</w:t>
       </w:r>
     </w:p>
     <w:p>
@@ -2889,6 +2775,7 @@
       <w:pPr>
         <w:spacing w:before="240" w:after="240"/>
       </w:pPr>
+      <w:commentRangeStart w:id="0"/>
       <w:r>
         <w:t>Tuning the Random Forest by adjusting its model settings</w:t>
       </w:r>
@@ -2897,6 +2784,15 @@
       </w:r>
       <w:r>
         <w:t>only changes from R² = 0.8971, MAE = 0.0184, and RMSE = 0.0298 to R² = 0.8983, MAE = 0.0186, and RMSE = 0.0297. On the other hand, performance is improved to R² = 0.9225, MAE = 0.0179, and RMSE = 0.0259 when the physics-derived features computed from the original simulation inputs are added (see Appendix A, Table A1). This version is utilized as the primary model. This is an overall average and does not imply that the error of each individual forecast is the same (see Appendix A for more information).</w:t>
+      </w:r>
+      <w:commentRangeEnd w:id="0"/>
+      <w:r>
+        <w:rPr>
+          <w:rStyle w:val="CommentReference"/>
+          <w:sz w:val="24"/>
+          <w:szCs w:val="24"/>
+        </w:rPr>
+        <w:commentReference w:id="0"/>
       </w:r>
     </w:p>
     <w:p>
@@ -2912,6 +2808,7 @@
           <w:lang w:val="en-GB"/>
         </w:rPr>
       </w:pPr>
+      <w:commentRangeStart w:id="1"/>
       <w:r>
         <w:rPr>
           <w:rFonts w:ascii="Times New Roman" w:eastAsia="Times New Roman" w:hAnsi="Times New Roman" w:cs="Times New Roman"/>
@@ -2936,62 +2833,10 @@
         </w:rPr>
         <w:t>Physical Parameter Importance</w:t>
       </w:r>
-    </w:p>
-    <w:p>
-      <w:pPr>
-        <w:spacing w:before="240" w:after="240"/>
-      </w:pPr>
-      <w:r>
-        <w:t xml:space="preserve">The input-removal test </w:t>
-      </w:r>
-      <w:r>
-        <w:t>yields the most understandable overall result. The amount of predictive information lost is indicated by the decrease in R</w:t>
-      </w:r>
-      <w:r>
-        <w:rPr>
-          <w:vertAlign w:val="superscript"/>
-        </w:rPr>
-        <w:t>2</w:t>
-      </w:r>
-      <w:r>
-        <w:t xml:space="preserve"> that results from removing each original </w:t>
-      </w:r>
-      <w:r>
-        <w:lastRenderedPageBreak/>
-        <w:t>parameter along with derived features that carry the same information. The strongest overall input is the removal of periapsis, which results in the biggest drop (ΔR² = -0.504). When velocity is eliminated, ΔR² = -0.279, and when spin is eliminated, ΔR² = -0.258. The overall effect of asteroid mass is smaller and less reliable. These numbers cannot be simply joined together because they represent overall averages. They display the degree to which the model is dependent on each input, not whether increasing that input directly produces the result or rises or lowers BMF. Periapsis is the strongest overall, followed by spin and velocity, however this order may vary locally.</w:t>
-      </w:r>
-    </w:p>
-    <w:p>
-      <w:pPr>
-        <w:pStyle w:val="Heading2"/>
-        <w:jc w:val="both"/>
-        <w:rPr>
-          <w:rFonts w:ascii="Times New Roman" w:eastAsia="Times New Roman" w:hAnsi="Times New Roman" w:cs="Times New Roman"/>
-          <w:color w:val="auto"/>
-          <w:kern w:val="0"/>
-          <w:sz w:val="24"/>
-          <w:szCs w:val="24"/>
-          <w:lang w:val="en-GB"/>
-          <w14:ligatures w14:val="none"/>
-        </w:rPr>
-      </w:pPr>
-      <w:r>
-        <w:rPr>
-          <w:rFonts w:ascii="Times New Roman" w:eastAsia="Times New Roman" w:hAnsi="Times New Roman" w:cs="Times New Roman"/>
-          <w:color w:val="auto"/>
-          <w:kern w:val="0"/>
-          <w:sz w:val="24"/>
-          <w:szCs w:val="24"/>
-          <w:lang w:val="en-GB"/>
-          <w14:ligatures w14:val="none"/>
-        </w:rPr>
-        <w:t>A different response is required for fragmentation. The most extreme fragmentation in the SPH data requires very small periapsis, yet a close encounter does not ensure significant breakdown. FoF connecting length has a direct impact on fragment count as well. This analysis does not provide a single, straightforward global ranking for fragmentation because of this. While the actual fragment pattern depends on the entire encounter and how fragments are gathered during post-processing, periapsis indicates where the largest disruption may occur.</w:t>
-      </w:r>
-    </w:p>
-    <w:p>
-      <w:pPr>
-        <w:pStyle w:val="Heading2"/>
-        <w:rPr>
+      <w:commentRangeEnd w:id="1"/>
+      <w:r>
+        <w:rPr>
+          <w:rStyle w:val="CommentReference"/>
           <w:rFonts w:ascii="Times New Roman" w:hAnsi="Times New Roman" w:cs="Times New Roman"/>
           <w:b/>
           <w:bCs/>
@@ -3000,6 +2845,114 @@
           <w:szCs w:val="24"/>
           <w:lang w:val="en-GB"/>
         </w:rPr>
+        <w:commentReference w:id="1"/>
+      </w:r>
+    </w:p>
+    <w:p>
+      <w:pPr>
+        <w:spacing w:before="240" w:after="240"/>
+      </w:pPr>
+      <w:r>
+        <w:t xml:space="preserve">The input-removal test </w:t>
+      </w:r>
+      <w:r>
+        <w:t>yields the most understandable overall result. The amount of predictive information lost is indicated by the decrease in R</w:t>
+      </w:r>
+      <w:r>
+        <w:rPr>
+          <w:vertAlign w:val="superscript"/>
+        </w:rPr>
+        <w:t>2</w:t>
+      </w:r>
+      <w:r>
+        <w:t xml:space="preserve"> that results from removing each original </w:t>
+      </w:r>
+      <w:r>
+        <w:lastRenderedPageBreak/>
+        <w:t xml:space="preserve">parameter along with derived features that carry the same information. The strongest overall input is the removal of periapsis, which results in the biggest drop (ΔR² = </w:t>
+      </w:r>
+      <w:r>
+        <w:t>-</w:t>
+      </w:r>
+      <w:r>
+        <w:t>0.574</w:t>
+      </w:r>
+      <w:r>
+        <w:t xml:space="preserve">). When </w:t>
+      </w:r>
+      <w:r>
+        <w:t>spin</w:t>
+      </w:r>
+      <w:r>
+        <w:t xml:space="preserve"> is eliminated, ΔR² = </w:t>
+      </w:r>
+      <w:r>
+        <w:t>-</w:t>
+      </w:r>
+      <w:r>
+        <w:t>0.316</w:t>
+      </w:r>
+      <w:r>
+        <w:t xml:space="preserve">, and when </w:t>
+      </w:r>
+      <w:r>
+        <w:t>velocity</w:t>
+      </w:r>
+      <w:r>
+        <w:t xml:space="preserve"> is eliminated, ΔR² = </w:t>
+      </w:r>
+      <w:r>
+        <w:t>-</w:t>
+      </w:r>
+      <w:r>
+        <w:t>0.296</w:t>
+      </w:r>
+      <w:r>
+        <w:t>. The overall effect of asteroid mass is smaller and less reliable. These numbers cannot be simply joined together because they represent overall averages. They display the degree to which the model is dependent on each input, not whether increasing that input directly produces the result or rises or lowers BMF. Periapsis is the strongest overall, followed by spin and velocity, however this order may vary locally.</w:t>
+      </w:r>
+      <w:r>
+        <w:t xml:space="preserve"> </w:t>
+      </w:r>
+    </w:p>
+    <w:p>
+      <w:pPr>
+        <w:pStyle w:val="Heading2"/>
+        <w:jc w:val="both"/>
+        <w:rPr>
+          <w:rFonts w:ascii="Times New Roman" w:eastAsia="Times New Roman" w:hAnsi="Times New Roman" w:cs="Times New Roman"/>
+          <w:color w:val="auto"/>
+          <w:kern w:val="0"/>
+          <w:sz w:val="24"/>
+          <w:szCs w:val="24"/>
+          <w:lang w:val="en-GB"/>
+          <w14:ligatures w14:val="none"/>
+        </w:rPr>
+      </w:pPr>
+      <w:r>
+        <w:rPr>
+          <w:rFonts w:ascii="Times New Roman" w:eastAsia="Times New Roman" w:hAnsi="Times New Roman" w:cs="Times New Roman"/>
+          <w:color w:val="auto"/>
+          <w:kern w:val="0"/>
+          <w:sz w:val="24"/>
+          <w:szCs w:val="24"/>
+          <w:lang w:val="en-GB"/>
+          <w14:ligatures w14:val="none"/>
+        </w:rPr>
+        <w:t>A different response is required for fragmentation. The most extreme fragmentation in the SPH data requires very small periapsis, yet a close encounter does not ensure significant breakdown. FoF connecting length has a direct impact on fragment count as well. This analysis does not provide a single, straightforward global ranking for fragmentation because of this. While the actual fragment pattern depends on the entire encounter and how fragments are gathered during post-processing, periapsis indicates where the largest disruption may occur.</w:t>
+      </w:r>
+    </w:p>
+    <w:p>
+      <w:pPr>
+        <w:pStyle w:val="Heading2"/>
+        <w:rPr>
+          <w:rFonts w:ascii="Times New Roman" w:hAnsi="Times New Roman" w:cs="Times New Roman"/>
+          <w:b/>
+          <w:bCs/>
+          <w:color w:val="000000" w:themeColor="text1"/>
+          <w:sz w:val="24"/>
+          <w:szCs w:val="24"/>
+          <w:lang w:val="en-GB"/>
+        </w:rPr>
       </w:pPr>
       <w:r>
         <w:rPr>
@@ -3039,25 +2992,25 @@
         <w:spacing w:before="240" w:after="240"/>
         <w:jc w:val="center"/>
       </w:pPr>
-      <w:r>
-        <w:rPr>
-          <w:noProof/>
-        </w:rPr>
+      <w:commentRangeStart w:id="2"/>
+      <w:r>
         <w:drawing>
-          <wp:inline distT="114300" distB="114300" distL="114300" distR="114300" wp14:anchorId="29C2306D" wp14:editId="19C87D46">
-            <wp:extent cx="4224338" cy="3670931"/>
-            <wp:effectExtent l="0" t="0" r="0" b="0"/>
-            <wp:docPr id="3" name="image7.png"/>
-            <wp:cNvGraphicFramePr/>
+          <wp:inline distT="0" distB="0" distL="0" distR="0" wp14:anchorId="09B4274B" wp14:editId="5A450A7D">
+            <wp:extent cx="4481242" cy="3043989"/>
+            <wp:effectExtent l="0" t="0" r="1905" b="4445"/>
+            <wp:docPr id="1662911872" name="Picture 1"/>
+            <wp:cNvGraphicFramePr>
+              <a:graphicFrameLocks xmlns:a="http://schemas.openxmlformats.org/drawingml/2006/main" noChangeAspect="1"/>
+            </wp:cNvGraphicFramePr>
             <a:graphic xmlns:a="http://schemas.openxmlformats.org/drawingml/2006/main">
               <a:graphicData uri="http://schemas.openxmlformats.org/drawingml/2006/picture">
                 <pic:pic xmlns:pic="http://schemas.openxmlformats.org/drawingml/2006/picture">
                   <pic:nvPicPr>
-                    <pic:cNvPr id="3" name="image7.png"/>
+                    <pic:cNvPr id="1662911872" name=""/>
                     <pic:cNvPicPr/>
                   </pic:nvPicPr>
                   <pic:blipFill>
-                    <a:blip r:embed="rId10"/>
+                    <a:blip r:embed="rId14"/>
                     <a:stretch>
                       <a:fillRect/>
                     </a:stretch>
@@ -3065,7 +3018,7 @@
                   <pic:spPr>
                     <a:xfrm>
                       <a:off x="0" y="0"/>
-                      <a:ext cx="4224338" cy="3670931"/>
+                      <a:ext cx="4587315" cy="3116041"/>
                     </a:xfrm>
                     <a:prstGeom prst="rect">
                       <a:avLst/>
@@ -3076,6 +3029,15 @@
             </a:graphic>
           </wp:inline>
         </w:drawing>
+      </w:r>
+      <w:commentRangeEnd w:id="2"/>
+      <w:r>
+        <w:rPr>
+          <w:rStyle w:val="CommentReference"/>
+          <w:sz w:val="24"/>
+          <w:szCs w:val="24"/>
+        </w:rPr>
+        <w:commentReference w:id="2"/>
       </w:r>
     </w:p>
     <w:p>
@@ -3151,7 +3113,7 @@
                     <pic:cNvPicPr/>
                   </pic:nvPicPr>
                   <pic:blipFill>
-                    <a:blip r:embed="rId11"/>
+                    <a:blip r:embed="rId15"/>
                     <a:srcRect t="16637"/>
                     <a:stretch>
                       <a:fillRect/>
@@ -3381,7 +3343,7 @@
                     <pic:cNvPicPr/>
                   </pic:nvPicPr>
                   <pic:blipFill>
-                    <a:blip r:embed="rId12"/>
+                    <a:blip r:embed="rId16"/>
                     <a:stretch>
                       <a:fillRect/>
                     </a:stretch>
@@ -4333,27 +4295,13 @@
         <w:rPr>
           <w:color w:val="000000"/>
         </w:rPr>
-        <w:t xml:space="preserve"> in multiple </w:t>
-      </w:r>
-      <w:proofErr w:type="gramStart"/>
-      <w:r>
-        <w:rPr>
-          <w:color w:val="000000"/>
-        </w:rPr>
-        <w:t>way</w:t>
-      </w:r>
-      <w:r>
-        <w:rPr>
-          <w:color w:val="000000"/>
-        </w:rPr>
-        <w:t>s,</w:t>
-      </w:r>
-      <w:proofErr w:type="gramEnd"/>
-      <w:r>
-        <w:rPr>
-          <w:color w:val="000000"/>
-        </w:rPr>
-        <w:t xml:space="preserve"> h</w:t>
+        <w:t xml:space="preserve"> in multiple way</w:t>
+      </w:r>
+      <w:r>
+        <w:rPr>
+          <w:color w:val="000000"/>
+        </w:rPr>
+        <w:t>s, h</w:t>
       </w:r>
       <w:r>
         <w:rPr>
@@ -4503,19 +4451,11 @@
       <w:pPr>
         <w:ind w:left="340" w:hanging="340"/>
       </w:pPr>
-      <w:proofErr w:type="spellStart"/>
-      <w:r>
-        <w:rPr>
-          <w:color w:val="000000"/>
-        </w:rPr>
-        <w:t>Breiman</w:t>
-      </w:r>
-      <w:proofErr w:type="spellEnd"/>
-      <w:r>
-        <w:rPr>
-          <w:color w:val="000000"/>
-        </w:rPr>
-        <w:t>, L. (2001). Random forests. Machine Learning, 45, 5</w:t>
+      <w:r>
+        <w:rPr>
+          <w:color w:val="000000"/>
+        </w:rPr>
+        <w:t>Breiman, L. (2001). Random forests. Machine Learning, 45, 5</w:t>
       </w:r>
       <w:r>
         <w:t>-</w:t>
@@ -4535,21 +4475,7 @@
         <w:rPr>
           <w:color w:val="000000"/>
         </w:rPr>
-        <w:t xml:space="preserve">Brunton, S. L., Noack, B. R. &amp; </w:t>
-      </w:r>
-      <w:proofErr w:type="spellStart"/>
-      <w:r>
-        <w:rPr>
-          <w:color w:val="000000"/>
-        </w:rPr>
-        <w:t>Koumoutsakos</w:t>
-      </w:r>
-      <w:proofErr w:type="spellEnd"/>
-      <w:r>
-        <w:rPr>
-          <w:color w:val="000000"/>
-        </w:rPr>
-        <w:t>, P. (2020). Machine learning for fluid mechanics. Annual Review of Fluid Mechanics, 52, 477</w:t>
+        <w:t>Brunton, S. L., Noack, B. R. &amp; Koumoutsakos, P. (2020). Machine learning for fluid mechanics. Annual Review of Fluid Mechanics, 52, 477</w:t>
       </w:r>
       <w:r>
         <w:t>-</w:t>
@@ -4569,21 +4495,7 @@
         <w:rPr>
           <w:color w:val="000000"/>
         </w:rPr>
-        <w:t>Canup, R. M. &amp; Salmon, J. (2018). Origin of Phobos and Deimos by the impact of a Vesta-to-Ceres sized body with Mars. Science Advances, 4(4), eaar6887. doi:10.1126/</w:t>
-      </w:r>
-      <w:proofErr w:type="gramStart"/>
-      <w:r>
-        <w:rPr>
-          <w:color w:val="000000"/>
-        </w:rPr>
-        <w:t>sciadv.aar</w:t>
-      </w:r>
-      <w:proofErr w:type="gramEnd"/>
-      <w:r>
-        <w:rPr>
-          <w:color w:val="000000"/>
-        </w:rPr>
-        <w:t>6887.</w:t>
+        <w:t>Canup, R. M. &amp; Salmon, J. (2018). Origin of Phobos and Deimos by the impact of a Vesta-to-Ceres sized body with Mars. Science Advances, 4(4), eaar6887. doi:10.1126/sciadv.aar6887.</w:t>
       </w:r>
     </w:p>
     <w:p>
@@ -4594,21 +4506,7 @@
         <w:rPr>
           <w:color w:val="000000"/>
         </w:rPr>
-        <w:t xml:space="preserve">Chen, T. &amp; </w:t>
-      </w:r>
-      <w:proofErr w:type="spellStart"/>
-      <w:r>
-        <w:rPr>
-          <w:color w:val="000000"/>
-        </w:rPr>
-        <w:t>Guestrin</w:t>
-      </w:r>
-      <w:proofErr w:type="spellEnd"/>
-      <w:r>
-        <w:rPr>
-          <w:color w:val="000000"/>
-        </w:rPr>
-        <w:t>, C. (2016). XGBoost: A scalable tree boosting system. Proceedings of the 22nd ACM SIGKDD International Conference on Knowledge Discovery and Data Mining, 785</w:t>
+        <w:t>Chen, T. &amp; Guestrin, C. (2016). XGBoost: A scalable tree boosting system. Proceedings of the 22nd ACM SIGKDD International Conference on Knowledge Discovery and Data Mining, 785</w:t>
       </w:r>
       <w:r>
         <w:t>-</w:t>
@@ -4637,21 +4535,7 @@
         <w:rPr>
           <w:color w:val="000000"/>
         </w:rPr>
-        <w:t xml:space="preserve">338. </w:t>
-      </w:r>
-      <w:proofErr w:type="gramStart"/>
-      <w:r>
-        <w:rPr>
-          <w:color w:val="000000"/>
-        </w:rPr>
-        <w:t>doi:10.1016/j.icarus</w:t>
-      </w:r>
-      <w:proofErr w:type="gramEnd"/>
-      <w:r>
-        <w:rPr>
-          <w:color w:val="000000"/>
-        </w:rPr>
-        <w:t>.2015.02.011.</w:t>
+        <w:t>338. doi:10.1016/j.icarus.2015.02.011.</w:t>
       </w:r>
     </w:p>
     <w:p>
@@ -4662,21 +4546,7 @@
         <w:rPr>
           <w:color w:val="000000"/>
         </w:rPr>
-        <w:t xml:space="preserve">Duan, T., Anand, A., Ding, D. Y., Thai, K. K., Basu, S., Ng, A. &amp; Schuler, A. (2020). </w:t>
-      </w:r>
-      <w:proofErr w:type="spellStart"/>
-      <w:r>
-        <w:rPr>
-          <w:color w:val="000000"/>
-        </w:rPr>
-        <w:t>NGBoost</w:t>
-      </w:r>
-      <w:proofErr w:type="spellEnd"/>
-      <w:r>
-        <w:rPr>
-          <w:color w:val="000000"/>
-        </w:rPr>
-        <w:t>: Natural Gradient Boosting for Probabilistic Prediction. Proceedings of the 37th International Conference on Machine Learning, PMLR 119, 2690</w:t>
+        <w:t>Duan, T., Anand, A., Ding, D. Y., Thai, K. K., Basu, S., Ng, A. &amp; Schuler, A. (2020). NGBoost: Natural Gradient Boosting for Probabilistic Prediction. Proceedings of the 37th International Conference on Machine Learning, PMLR 119, 2690</w:t>
       </w:r>
       <w:r>
         <w:t>-</w:t>
@@ -4705,68 +4575,18 @@
         <w:rPr>
           <w:color w:val="000000"/>
         </w:rPr>
-        <w:t>1232. doi:10.1214/</w:t>
-      </w:r>
-      <w:proofErr w:type="spellStart"/>
-      <w:r>
-        <w:rPr>
-          <w:color w:val="000000"/>
-        </w:rPr>
-        <w:t>aos</w:t>
-      </w:r>
-      <w:proofErr w:type="spellEnd"/>
-      <w:r>
-        <w:rPr>
-          <w:color w:val="000000"/>
-        </w:rPr>
-        <w:t>/1013203451.</w:t>
+        <w:t>1232. doi:10.1214/aos/1013203451.</w:t>
       </w:r>
     </w:p>
     <w:p>
       <w:pPr>
         <w:ind w:left="340" w:hanging="340"/>
       </w:pPr>
-      <w:proofErr w:type="spellStart"/>
-      <w:r>
-        <w:rPr>
-          <w:color w:val="000000"/>
-        </w:rPr>
-        <w:t>Grinsztajn</w:t>
-      </w:r>
-      <w:proofErr w:type="spellEnd"/>
-      <w:r>
-        <w:rPr>
-          <w:color w:val="000000"/>
-        </w:rPr>
-        <w:t xml:space="preserve">, L., </w:t>
-      </w:r>
-      <w:proofErr w:type="spellStart"/>
-      <w:r>
-        <w:rPr>
-          <w:color w:val="000000"/>
-        </w:rPr>
-        <w:t>Oyallon</w:t>
-      </w:r>
-      <w:proofErr w:type="spellEnd"/>
-      <w:r>
-        <w:rPr>
-          <w:color w:val="000000"/>
-        </w:rPr>
-        <w:t xml:space="preserve">, E. &amp; </w:t>
-      </w:r>
-      <w:proofErr w:type="spellStart"/>
-      <w:r>
-        <w:rPr>
-          <w:color w:val="000000"/>
-        </w:rPr>
-        <w:t>Varoquaux</w:t>
-      </w:r>
-      <w:proofErr w:type="spellEnd"/>
-      <w:r>
-        <w:rPr>
-          <w:color w:val="000000"/>
-        </w:rPr>
-        <w:t>, G. (2022). Why do tree-based models still outperform deep learning on tabular data? Advances in Neural Information Processing Systems, 35.</w:t>
+      <w:r>
+        <w:rPr>
+          <w:color w:val="000000"/>
+        </w:rPr>
+        <w:t>Grinsztajn, L., Oyallon, E. &amp; Varoquaux, G. (2022). Why do tree-based models still outperform deep learning on tabular data? Advances in Neural Information Processing Systems, 35.</w:t>
       </w:r>
     </w:p>
     <w:p>
@@ -4777,35 +4597,7 @@
         <w:rPr>
           <w:color w:val="000000"/>
         </w:rPr>
-        <w:t xml:space="preserve">Kegerreis, J. A., Lissauer, J. J., Eke, V. R., Sandnes, T. D. &amp; </w:t>
-      </w:r>
-      <w:proofErr w:type="spellStart"/>
-      <w:r>
-        <w:rPr>
-          <w:color w:val="000000"/>
-        </w:rPr>
-        <w:t>Elphic</w:t>
-      </w:r>
-      <w:proofErr w:type="spellEnd"/>
-      <w:r>
-        <w:rPr>
-          <w:color w:val="000000"/>
-        </w:rPr>
-        <w:t xml:space="preserve">, R. C. (2024). Origin of Mars’s moons by disruptive partial capture of an asteroid. Icarus, Article 116337. </w:t>
-      </w:r>
-      <w:proofErr w:type="gramStart"/>
-      <w:r>
-        <w:rPr>
-          <w:color w:val="000000"/>
-        </w:rPr>
-        <w:t>doi:10.1016/j.icarus</w:t>
-      </w:r>
-      <w:proofErr w:type="gramEnd"/>
-      <w:r>
-        <w:rPr>
-          <w:color w:val="000000"/>
-        </w:rPr>
-        <w:t>.2024.116337.</w:t>
+        <w:t>Kegerreis, J. A., Lissauer, J. J., Eke, V. R., Sandnes, T. D. &amp; Elphic, R. C. (2024). Origin of Mars’s moons by disruptive partial capture of an asteroid. Icarus, Article 116337. doi:10.1016/j.icarus.2024.116337.</w:t>
       </w:r>
     </w:p>
     <w:p>
@@ -4816,35 +4608,7 @@
         <w:rPr>
           <w:color w:val="000000"/>
         </w:rPr>
-        <w:t xml:space="preserve">More, S., Kravtsov, A. V., Dalal, N. &amp; </w:t>
-      </w:r>
-      <w:proofErr w:type="spellStart"/>
-      <w:r>
-        <w:rPr>
-          <w:color w:val="000000"/>
-        </w:rPr>
-        <w:t>Gottlöber</w:t>
-      </w:r>
-      <w:proofErr w:type="spellEnd"/>
-      <w:r>
-        <w:rPr>
-          <w:color w:val="000000"/>
-        </w:rPr>
-        <w:t xml:space="preserve">, S. (2011). The </w:t>
-      </w:r>
-      <w:proofErr w:type="spellStart"/>
-      <w:r>
-        <w:rPr>
-          <w:color w:val="000000"/>
-        </w:rPr>
-        <w:t>overdensity</w:t>
-      </w:r>
-      <w:proofErr w:type="spellEnd"/>
-      <w:r>
-        <w:rPr>
-          <w:color w:val="000000"/>
-        </w:rPr>
-        <w:t xml:space="preserve"> and masses of the friends-of-friends halos and universality of the halo mass function. The Astrophysical Journal Supplement Series, 195(1), 4. doi:10.1088/0067-0049/195/1/4.</w:t>
+        <w:t>More, S., Kravtsov, A. V., Dalal, N. &amp; Gottlöber, S. (2011). The overdensity and masses of the friends-of-friends halos and universality of the halo mass function. The Astrophysical Journal Supplement Series, 195(1), 4. doi:10.1088/0067-0049/195/1/4.</w:t>
       </w:r>
     </w:p>
     <w:p>
@@ -4864,116 +4628,30 @@
         <w:rPr>
           <w:color w:val="000000"/>
         </w:rPr>
-        <w:t xml:space="preserve">794. </w:t>
-      </w:r>
-      <w:proofErr w:type="gramStart"/>
-      <w:r>
-        <w:rPr>
-          <w:color w:val="000000"/>
-        </w:rPr>
-        <w:t>doi:10.1016/j.jcp</w:t>
-      </w:r>
-      <w:proofErr w:type="gramEnd"/>
-      <w:r>
-        <w:rPr>
-          <w:color w:val="000000"/>
-        </w:rPr>
-        <w:t>.2010.12.011.</w:t>
+        <w:t>794. doi:10.1016/j.jcp.2010.12.011.</w:t>
       </w:r>
     </w:p>
     <w:p>
       <w:pPr>
         <w:ind w:left="340" w:hanging="340"/>
       </w:pPr>
-      <w:proofErr w:type="spellStart"/>
-      <w:r>
-        <w:rPr>
-          <w:color w:val="000000"/>
-        </w:rPr>
-        <w:t>Prokhorenkova</w:t>
-      </w:r>
-      <w:proofErr w:type="spellEnd"/>
-      <w:r>
-        <w:rPr>
-          <w:color w:val="000000"/>
-        </w:rPr>
-        <w:t xml:space="preserve">, L., Gusev, G., Vorobev, A., </w:t>
-      </w:r>
-      <w:proofErr w:type="spellStart"/>
-      <w:r>
-        <w:rPr>
-          <w:color w:val="000000"/>
-        </w:rPr>
-        <w:t>Dorogush</w:t>
-      </w:r>
-      <w:proofErr w:type="spellEnd"/>
-      <w:r>
-        <w:rPr>
-          <w:color w:val="000000"/>
-        </w:rPr>
-        <w:t xml:space="preserve">, A. V. &amp; Gulin, A. (2018). </w:t>
-      </w:r>
-      <w:proofErr w:type="spellStart"/>
-      <w:r>
-        <w:rPr>
-          <w:color w:val="000000"/>
-        </w:rPr>
-        <w:t>CatBoost</w:t>
-      </w:r>
-      <w:proofErr w:type="spellEnd"/>
-      <w:r>
-        <w:rPr>
-          <w:color w:val="000000"/>
-        </w:rPr>
-        <w:t>: unbiased boosting with categorical features. Advances in Neural Information Processing Systems, 31.</w:t>
+      <w:r>
+        <w:rPr>
+          <w:color w:val="000000"/>
+        </w:rPr>
+        <w:t>Prokhorenkova, L., Gusev, G., Vorobev, A., Dorogush, A. V. &amp; Gulin, A. (2018). CatBoost: unbiased boosting with categorical features. Advances in Neural Information Processing Systems, 31.</w:t>
       </w:r>
     </w:p>
     <w:p>
       <w:pPr>
         <w:ind w:left="340" w:hanging="340"/>
       </w:pPr>
-      <w:proofErr w:type="spellStart"/>
       <w:r>
         <w:rPr>
           <w:color w:val="000000"/>
         </w:rPr>
         <w:lastRenderedPageBreak/>
-        <w:t>Raissi</w:t>
-      </w:r>
-      <w:proofErr w:type="spellEnd"/>
-      <w:r>
-        <w:rPr>
-          <w:color w:val="000000"/>
-        </w:rPr>
-        <w:t xml:space="preserve">, M., </w:t>
-      </w:r>
-      <w:proofErr w:type="spellStart"/>
-      <w:r>
-        <w:rPr>
-          <w:color w:val="000000"/>
-        </w:rPr>
-        <w:t>Perdikaris</w:t>
-      </w:r>
-      <w:proofErr w:type="spellEnd"/>
-      <w:r>
-        <w:rPr>
-          <w:color w:val="000000"/>
-        </w:rPr>
-        <w:t xml:space="preserve">, P. &amp; </w:t>
-      </w:r>
-      <w:proofErr w:type="spellStart"/>
-      <w:r>
-        <w:rPr>
-          <w:color w:val="000000"/>
-        </w:rPr>
-        <w:t>Karniadakis</w:t>
-      </w:r>
-      <w:proofErr w:type="spellEnd"/>
-      <w:r>
-        <w:rPr>
-          <w:color w:val="000000"/>
-        </w:rPr>
-        <w:t>, G. E. (2019). Physics-informed neural networks: A deep learning framework for solving forward and inverse problems involving nonlinear partial differential equations. Journal of Computational Physics, 378, 686</w:t>
+        <w:t>Raissi, M., Perdikaris, P. &amp; Karniadakis, G. E. (2019). Physics-informed neural networks: A deep learning framework for solving forward and inverse problems involving nonlinear partial differential equations. Journal of Computational Physics, 378, 686</w:t>
       </w:r>
       <w:r>
         <w:t>-</w:t>
@@ -4982,21 +4660,7 @@
         <w:rPr>
           <w:color w:val="000000"/>
         </w:rPr>
-        <w:t xml:space="preserve">707. </w:t>
-      </w:r>
-      <w:proofErr w:type="gramStart"/>
-      <w:r>
-        <w:rPr>
-          <w:color w:val="000000"/>
-        </w:rPr>
-        <w:t>doi:10.1016/j.jcp</w:t>
-      </w:r>
-      <w:proofErr w:type="gramEnd"/>
-      <w:r>
-        <w:rPr>
-          <w:color w:val="000000"/>
-        </w:rPr>
-        <w:t>.2018.10.045.</w:t>
+        <w:t>707. doi:10.1016/j.jcp.2018.10.045.</w:t>
       </w:r>
     </w:p>
     <w:p>
@@ -5027,21 +4691,7 @@
         <w:rPr>
           <w:color w:val="000000"/>
         </w:rPr>
-        <w:t xml:space="preserve">Rosenblatt, P., </w:t>
-      </w:r>
-      <w:proofErr w:type="spellStart"/>
-      <w:r>
-        <w:rPr>
-          <w:color w:val="000000"/>
-        </w:rPr>
-        <w:t>Charnoz</w:t>
-      </w:r>
-      <w:proofErr w:type="spellEnd"/>
-      <w:r>
-        <w:rPr>
-          <w:color w:val="000000"/>
-        </w:rPr>
-        <w:t>, S., Dunseath, K. M., Terao-Dunseath, M. &amp; Trinh, A. (2016). Accretion of Phobos and Deimos in an extended debris disc stirred by transient moons. Nature Geoscience, 9, 581</w:t>
+        <w:t>Rosenblatt, P., Charnoz, S., Dunseath, K. M., Terao-Dunseath, M. &amp; Trinh, A. (2016). Accretion of Phobos and Deimos in an extended debris disc stirred by transient moons. Nature Geoscience, 9, 581</w:t>
       </w:r>
       <w:r>
         <w:t>-</w:t>
@@ -5061,21 +4711,7 @@
         <w:rPr>
           <w:color w:val="000000"/>
         </w:rPr>
-        <w:t xml:space="preserve">Villaescusa-Navarro, F. et al. (2021). The CAMELS project: Cosmology and Astrophysics with </w:t>
-      </w:r>
-      <w:proofErr w:type="spellStart"/>
-      <w:r>
-        <w:rPr>
-          <w:color w:val="000000"/>
-        </w:rPr>
-        <w:t>MachinE</w:t>
-      </w:r>
-      <w:proofErr w:type="spellEnd"/>
-      <w:r>
-        <w:rPr>
-          <w:color w:val="000000"/>
-        </w:rPr>
-        <w:t xml:space="preserve"> Learning Simulations. arXiv:2010.00619.</w:t>
+        <w:t>Villaescusa-Navarro, F. et al. (2021). The CAMELS project: Cosmology and Astrophysics with MachinE Learning Simulations. arXiv:2010.00619.</w:t>
       </w:r>
     </w:p>
     <w:p>
@@ -5098,21 +4734,7 @@
         <w:rPr>
           <w:color w:val="000000"/>
         </w:rPr>
-        <w:t xml:space="preserve">216. </w:t>
-      </w:r>
-      <w:proofErr w:type="gramStart"/>
-      <w:r>
-        <w:rPr>
-          <w:color w:val="000000"/>
-        </w:rPr>
-        <w:t>doi:10.1016/j.icarus</w:t>
-      </w:r>
-      <w:proofErr w:type="gramEnd"/>
-      <w:r>
-        <w:rPr>
-          <w:color w:val="000000"/>
-        </w:rPr>
-        <w:t>.2005.08.015.</w:t>
+        <w:t>216. doi:10.1016/j.icarus.2005.08.015.</w:t>
       </w:r>
     </w:p>
     <w:p>
@@ -5185,7 +4807,18 @@
         <w:keepNext/>
       </w:pPr>
       <w:r>
-        <w:t>Table A1. Physics-derived features calculated from the original setup inputs. These features express useful combinations of encounter parameters.</w:t>
+        <w:t xml:space="preserve">Table A1. </w:t>
+      </w:r>
+      <w:r>
+        <w:t>Tuning Choice (?) &amp; Physics-derived features</w:t>
+      </w:r>
+    </w:p>
+    <w:p>
+      <w:pPr>
+        <w:keepNext/>
+      </w:pPr>
+      <w:r>
+        <w:t>Physics-derived features calculated from the original setup inputs. These features express useful combinations of encounter parameters.</w:t>
       </w:r>
     </w:p>
     <w:tbl>
@@ -5395,14 +5028,7 @@
               <w:rPr>
                 <w:color w:val="000000"/>
               </w:rPr>
-              <w:t>1/</w:t>
-            </w:r>
-            <w:proofErr w:type="spellStart"/>
-            <w:r>
-              <w:rPr>
-                <w:color w:val="000000"/>
-              </w:rPr>
-              <w:t>r</w:t>
+              <w:t>1/r</w:t>
             </w:r>
             <w:r>
               <w:rPr>
@@ -5411,7 +5037,6 @@
               </w:rPr>
               <w:t>p</w:t>
             </w:r>
-            <w:proofErr w:type="spellEnd"/>
           </w:p>
         </w:tc>
         <w:tc>
@@ -5478,7 +5103,6 @@
                 <w:vertAlign w:val="subscript"/>
               </w:rPr>
             </w:pPr>
-            <w:proofErr w:type="spellStart"/>
             <w:r>
               <w:rPr>
                 <w:color w:val="000000"/>
@@ -5492,7 +5116,6 @@
               </w:rPr>
               <w:t>p</w:t>
             </w:r>
-            <w:proofErr w:type="spellEnd"/>
             <w:r>
               <w:rPr>
                 <w:color w:val="000000"/>
@@ -5577,14 +5200,7 @@
               <w:rPr>
                 <w:color w:val="000000"/>
               </w:rPr>
-              <w:t>1/</w:t>
-            </w:r>
-            <w:proofErr w:type="spellStart"/>
-            <w:r>
-              <w:rPr>
-                <w:color w:val="000000"/>
-              </w:rPr>
-              <w:t>P</w:t>
+              <w:t>1/P</w:t>
             </w:r>
             <w:r>
               <w:rPr>
@@ -5593,7 +5209,6 @@
               </w:rPr>
               <w:t>spin</w:t>
             </w:r>
-            <w:proofErr w:type="spellEnd"/>
           </w:p>
         </w:tc>
         <w:tc>
@@ -5881,6 +5496,8 @@
               <w:spacing w:after="0" w:line="252" w:lineRule="auto"/>
               <w:jc w:val="left"/>
             </w:pPr>
+            <w:commentRangeStart w:id="3"/>
+            <w:commentRangeStart w:id="4"/>
             <w:r>
               <w:rPr>
                 <w:color w:val="000000"/>
@@ -5928,6 +5545,24 @@
             <w:r>
               <w:t>Estimates how long the asteroid stays in the region where Martian tides may be strong enough to disrupt it.</w:t>
             </w:r>
+            <w:commentRangeEnd w:id="3"/>
+            <w:r>
+              <w:rPr>
+                <w:rStyle w:val="CommentReference"/>
+                <w:sz w:val="24"/>
+                <w:szCs w:val="24"/>
+              </w:rPr>
+              <w:commentReference w:id="3"/>
+            </w:r>
+            <w:commentRangeEnd w:id="4"/>
+            <w:r>
+              <w:rPr>
+                <w:rStyle w:val="CommentReference"/>
+                <w:sz w:val="24"/>
+                <w:szCs w:val="24"/>
+              </w:rPr>
+              <w:commentReference w:id="4"/>
+            </w:r>
           </w:p>
         </w:tc>
       </w:tr>
@@ -5935,81 +5570,9 @@
     <w:p>
       <w:pPr>
         <w:keepNext/>
-        <w:spacing w:after="0"/>
-        <w:jc w:val="left"/>
-      </w:pPr>
-      <w:r>
-        <w:rPr>
-          <w:noProof/>
-        </w:rPr>
+      </w:pPr>
+      <w:r>
         <w:lastRenderedPageBreak/>
-        <w:drawing>
-          <wp:inline distT="114300" distB="114300" distL="114300" distR="114300" wp14:anchorId="6926A25A" wp14:editId="0A2F53C1">
-            <wp:extent cx="5900738" cy="1560291"/>
-            <wp:effectExtent l="0" t="0" r="0" b="0"/>
-            <wp:docPr id="1" name="image3.png"/>
-            <wp:cNvGraphicFramePr/>
-            <a:graphic xmlns:a="http://schemas.openxmlformats.org/drawingml/2006/main">
-              <a:graphicData uri="http://schemas.openxmlformats.org/drawingml/2006/picture">
-                <pic:pic xmlns:pic="http://schemas.openxmlformats.org/drawingml/2006/picture">
-                  <pic:nvPicPr>
-                    <pic:cNvPr id="1" name="image3.png"/>
-                    <pic:cNvPicPr/>
-                  </pic:nvPicPr>
-                  <pic:blipFill>
-                    <a:blip r:embed="rId13"/>
-                    <a:stretch>
-                      <a:fillRect/>
-                    </a:stretch>
-                  </pic:blipFill>
-                  <pic:spPr>
-                    <a:xfrm>
-                      <a:off x="0" y="0"/>
-                      <a:ext cx="5900738" cy="1560291"/>
-                    </a:xfrm>
-                    <a:prstGeom prst="rect">
-                      <a:avLst/>
-                    </a:prstGeom>
-                  </pic:spPr>
-                </pic:pic>
-              </a:graphicData>
-            </a:graphic>
-          </wp:inline>
-        </w:drawing>
-      </w:r>
-    </w:p>
-    <w:p>
-      <w:pPr>
-        <w:keepLines/>
-        <w:jc w:val="center"/>
-      </w:pPr>
-      <w:r>
-        <w:rPr>
-          <w:i/>
-          <w:iCs/>
-        </w:rPr>
-        <w:t xml:space="preserve">Figure A1. Change in held-out R² when different derived features are added. Using the setup-derived features together improves R² by about +0.023. Individual features can help, add little new information, or reduce performance. The experiment that uses an outcome-derived feature is not </w:t>
-      </w:r>
-      <w:r>
-        <w:rPr>
-          <w:i/>
-          <w:iCs/>
-        </w:rPr>
-        <w:t>the model</w:t>
-      </w:r>
-      <w:r>
-        <w:rPr>
-          <w:i/>
-          <w:iCs/>
-        </w:rPr>
-        <w:t>.</w:t>
-      </w:r>
-    </w:p>
-    <w:p>
-      <w:pPr>
-        <w:keepNext/>
-      </w:pPr>
-      <w:r>
         <w:t>Table A2. Comparison of BMF regression models using five-fold GroupKFold by physical SPH simulation, including exploratory advanced models to show the potential for further performance improvement in future work.</w:t>
       </w:r>
     </w:p>
@@ -6388,6 +5951,7 @@
                 <w:szCs w:val="22"/>
               </w:rPr>
             </w:pPr>
+            <w:commentRangeStart w:id="5"/>
             <w:r>
               <w:rPr>
                 <w:sz w:val="22"/>
@@ -6432,6 +5996,15 @@
               </w:rPr>
               <w:t>Alternative baseline model</w:t>
             </w:r>
+            <w:commentRangeEnd w:id="5"/>
+            <w:r>
+              <w:rPr>
+                <w:rStyle w:val="CommentReference"/>
+                <w:sz w:val="22"/>
+                <w:szCs w:val="22"/>
+              </w:rPr>
+              <w:commentReference w:id="5"/>
+            </w:r>
           </w:p>
         </w:tc>
       </w:tr>
@@ -7258,21 +6831,12 @@
                 <w:szCs w:val="20"/>
               </w:rPr>
             </w:pPr>
-            <w:proofErr w:type="spellStart"/>
             <w:r>
               <w:rPr>
                 <w:sz w:val="22"/>
                 <w:szCs w:val="22"/>
               </w:rPr>
-              <w:t>CatBoost</w:t>
-            </w:r>
-            <w:proofErr w:type="spellEnd"/>
-            <w:r>
-              <w:rPr>
-                <w:sz w:val="22"/>
-                <w:szCs w:val="22"/>
-              </w:rPr>
-              <w:t xml:space="preserve"> hurdle</w:t>
+              <w:t>CatBoost hurdle</w:t>
             </w:r>
           </w:p>
         </w:tc>
@@ -7464,21 +7028,12 @@
                 <w:szCs w:val="20"/>
               </w:rPr>
             </w:pPr>
-            <w:proofErr w:type="spellStart"/>
             <w:r>
               <w:rPr>
                 <w:sz w:val="22"/>
                 <w:szCs w:val="22"/>
               </w:rPr>
-              <w:t>NGBoost</w:t>
-            </w:r>
-            <w:proofErr w:type="spellEnd"/>
-            <w:r>
-              <w:rPr>
-                <w:sz w:val="22"/>
-                <w:szCs w:val="22"/>
-              </w:rPr>
-              <w:t xml:space="preserve"> hurdle</w:t>
+              <w:t>NGBoost hurdle</w:t>
             </w:r>
           </w:p>
         </w:tc>
@@ -7663,8 +7218,8 @@
           <w:lang w:val="en-GB"/>
         </w:rPr>
       </w:pPr>
-      <w:bookmarkStart w:id="0" w:name="_v7aw85qw1s9d" w:colFirst="0" w:colLast="0"/>
-      <w:bookmarkEnd w:id="0"/>
+      <w:bookmarkStart w:id="6" w:name="_v7aw85qw1s9d" w:colFirst="0" w:colLast="0"/>
+      <w:bookmarkEnd w:id="6"/>
       <w:r>
         <w:rPr>
           <w:rFonts w:ascii="Times New Roman" w:hAnsi="Times New Roman" w:cs="Times New Roman"/>
@@ -7702,7 +7257,7 @@
                     <pic:cNvPicPr/>
                   </pic:nvPicPr>
                   <pic:blipFill>
-                    <a:blip r:embed="rId14"/>
+                    <a:blip r:embed="rId17"/>
                     <a:stretch>
                       <a:fillRect/>
                     </a:stretch>
@@ -7816,8 +7371,8 @@
           <w:lang w:val="en-GB"/>
         </w:rPr>
       </w:pPr>
-      <w:bookmarkStart w:id="1" w:name="_brg4hhj14he5" w:colFirst="0" w:colLast="0"/>
-      <w:bookmarkEnd w:id="1"/>
+      <w:bookmarkStart w:id="7" w:name="_brg4hhj14he5" w:colFirst="0" w:colLast="0"/>
+      <w:bookmarkEnd w:id="7"/>
       <w:r>
         <w:rPr>
           <w:rFonts w:ascii="Times New Roman" w:hAnsi="Times New Roman" w:cs="Times New Roman"/>
@@ -7891,7 +7446,7 @@
       </w:r>
     </w:p>
     <w:sectPr>
-      <w:footerReference w:type="default" r:id="rId15"/>
+      <w:footerReference w:type="default" r:id="rId18"/>
       <w:pgSz w:w="12240" w:h="15840"/>
       <w:pgMar w:top="1440" w:right="1440" w:bottom="1440" w:left="1440" w:header="720" w:footer="720" w:gutter="0"/>
       <w:pgNumType w:start="1"/>
@@ -7899,6 +7454,229 @@
     </w:sectPr>
   </w:body>
 </w:document>
+</file>
+
+<file path=word/comments.xml><?xml version="1.0" encoding="utf-8"?>
+<w:comments xmlns:wpc="http://schemas.microsoft.com/office/word/2010/wordprocessingCanvas" xmlns:cx="http://schemas.microsoft.com/office/drawing/2014/chartex" xmlns:cx1="http://schemas.microsoft.com/office/drawing/2015/9/8/chartex" xmlns:cx2="http://schemas.microsoft.com/office/drawing/2015/10/21/chartex" xmlns:cx3="http://schemas.microsoft.com/office/drawing/2016/5/9/chartex" xmlns:cx4="http://schemas.microsoft.com/office/drawing/2016/5/10/chartex" xmlns:cx5="http://schemas.microsoft.com/office/drawing/2016/5/11/chartex" xmlns:cx6="http://schemas.microsoft.com/office/drawing/2016/5/12/chartex" xmlns:cx7="http://schemas.microsoft.com/office/drawing/2016/5/13/chartex" xmlns:cx8="http://schemas.microsoft.com/office/drawing/2016/5/14/chartex" xmlns:mc="http://schemas.openxmlformats.org/markup-compatibility/2006" xmlns:m="http://schemas.openxmlformats.org/officeDocument/2006/math" xmlns:aink="http://schemas.microsoft.com/office/drawing/2016/ink" xmlns:am3d="http://schemas.microsoft.com/office/drawing/2017/model3d" xmlns:oel="http://schemas.microsoft.com/office/2019/extlst" xmlns:r="http://schemas.openxmlformats.org/officeDocument/2006/relationships" xmlns:wp14="http://schemas.microsoft.com/office/word/2010/wordprocessingDrawing" xmlns:wp="http://schemas.openxmlformats.org/drawingml/2006/wordprocessingDrawing" xmlns:wpg="http://schemas.microsoft.com/office/word/2010/wordprocessingGroup" xmlns:wpi="http://schemas.microsoft.com/office/word/2010/wordprocessingInk" xmlns:wps="http://schemas.microsoft.com/office/word/2010/wordprocessingShape" xmlns:o="urn:schemas-microsoft-com:office:office" xmlns:v="urn:schemas-microsoft-com:vml" xmlns:w10="urn:schemas-microsoft-com:office:word" xmlns:w="http://schemas.openxmlformats.org/wordprocessingml/2006/main" xmlns:w14="http://schemas.microsoft.com/office/word/2010/wordml" xmlns:w15="http://schemas.microsoft.com/office/word/2012/wordml" xmlns:w16cex="http://schemas.microsoft.com/office/word/2018/wordml/cex" xmlns:w16cid="http://schemas.microsoft.com/office/word/2016/wordml/cid" xmlns:w16="http://schemas.microsoft.com/office/word/2018/wordml" xmlns:w16sdtdh="http://schemas.microsoft.com/office/word/2020/wordml/sdtdatahash" xmlns:w16sdtfl="http://schemas.microsoft.com/office/word/2024/wordml/sdtformatlock" xmlns:w16se="http://schemas.microsoft.com/office/word/2015/wordml/symex" xmlns:w16du="http://schemas.microsoft.com/office/word/2023/wordml/word16du" xmlns:wne="http://schemas.microsoft.com/office/word/2006/wordml" mc:Ignorable="w14 w15 w16se w16cid w16 w16cex w16sdtdh w16sdtfl w16du wp14">
+  <w:comment w:id="0" w:author="Kristy Natasha" w:date="2026-08-19T20:30:00Z" w:initials="KN">
+    <w:p>
+      <w:pPr>
+        <w:jc w:val="left"/>
+      </w:pPr>
+      <w:r>
+        <w:rPr>
+          <w:rStyle w:val="CommentReference"/>
+        </w:rPr>
+        <w:annotationRef/>
+      </w:r>
+      <w:r>
+        <w:rPr>
+          <w:sz w:val="20"/>
+          <w:szCs w:val="20"/>
+        </w:rPr>
+        <w:t>change, with new a2 table</w:t>
+      </w:r>
+    </w:p>
+  </w:comment>
+  <w:comment w:id="1" w:author="Kristy Natasha" w:date="2026-08-19T20:25:00Z" w:initials="KN">
+    <w:p>
+      <w:pPr>
+        <w:jc w:val="left"/>
+      </w:pPr>
+      <w:r>
+        <w:rPr>
+          <w:rStyle w:val="CommentReference"/>
+        </w:rPr>
+        <w:annotationRef/>
+      </w:r>
+      <w:r>
+        <w:rPr>
+          <w:sz w:val="20"/>
+          <w:szCs w:val="20"/>
+        </w:rPr>
+        <w:t>Overall Parameter Importance</w:t>
+      </w:r>
+    </w:p>
+    <w:p>
+      <w:pPr>
+        <w:jc w:val="left"/>
+      </w:pPr>
+      <w:r>
+        <w:rPr>
+          <w:sz w:val="20"/>
+          <w:szCs w:val="20"/>
+        </w:rPr>
+        <w:t>Removing periapsis: ΔR² = −0.574</w:t>
+      </w:r>
+    </w:p>
+    <w:p>
+      <w:pPr>
+        <w:jc w:val="left"/>
+      </w:pPr>
+      <w:r>
+        <w:rPr>
+          <w:sz w:val="20"/>
+          <w:szCs w:val="20"/>
+        </w:rPr>
+        <w:t>Removing velocity: ΔR² = −0.296</w:t>
+      </w:r>
+    </w:p>
+    <w:p>
+      <w:pPr>
+        <w:jc w:val="left"/>
+      </w:pPr>
+      <w:r>
+        <w:rPr>
+          <w:sz w:val="20"/>
+          <w:szCs w:val="20"/>
+        </w:rPr>
+        <w:t>Removing spin: ΔR² = −0.316</w:t>
+      </w:r>
+    </w:p>
+    <w:p>
+      <w:pPr>
+        <w:jc w:val="left"/>
+      </w:pPr>
+    </w:p>
+    <w:p>
+      <w:pPr>
+        <w:jc w:val="left"/>
+      </w:pPr>
+      <w:r>
+        <w:rPr>
+          <w:sz w:val="20"/>
+          <w:szCs w:val="20"/>
+        </w:rPr>
+        <w:t>Overall Rule</w:t>
+      </w:r>
+    </w:p>
+    <w:p>
+      <w:pPr>
+        <w:jc w:val="left"/>
+      </w:pPr>
+      <w:r>
+        <w:rPr>
+          <w:sz w:val="20"/>
+          <w:szCs w:val="20"/>
+        </w:rPr>
+        <w:t>periapsis &gt; spin &gt; velocity</w:t>
+      </w:r>
+    </w:p>
+  </w:comment>
+  <w:comment w:id="2" w:author="Kristy Natasha" w:date="2026-08-19T20:28:00Z" w:initials="KN">
+    <w:p>
+      <w:pPr>
+        <w:jc w:val="left"/>
+      </w:pPr>
+      <w:r>
+        <w:rPr>
+          <w:rStyle w:val="CommentReference"/>
+        </w:rPr>
+        <w:annotationRef/>
+      </w:r>
+      <w:r>
+        <w:rPr>
+          <w:sz w:val="20"/>
+          <w:szCs w:val="20"/>
+        </w:rPr>
+        <w:t>need to renew with tuned gb model</w:t>
+      </w:r>
+    </w:p>
+  </w:comment>
+  <w:comment w:id="3" w:author="Kristy Natasha" w:date="2026-08-19T20:25:00Z" w:initials="KN">
+    <w:p>
+      <w:pPr>
+        <w:jc w:val="left"/>
+      </w:pPr>
+      <w:r>
+        <w:rPr>
+          <w:rStyle w:val="CommentReference"/>
+        </w:rPr>
+        <w:annotationRef/>
+      </w:r>
+      <w:r>
+        <w:rPr>
+          <w:sz w:val="20"/>
+          <w:szCs w:val="20"/>
+        </w:rPr>
+        <w:t>unused ??</w:t>
+      </w:r>
+    </w:p>
+  </w:comment>
+  <w:comment w:id="4" w:author="Kristy Natasha" w:date="2026-08-19T20:28:00Z" w:initials="KN">
+    <w:p>
+      <w:pPr>
+        <w:jc w:val="left"/>
+      </w:pPr>
+      <w:r>
+        <w:rPr>
+          <w:rStyle w:val="CommentReference"/>
+        </w:rPr>
+        <w:annotationRef/>
+      </w:r>
+      <w:r>
+        <w:rPr>
+          <w:sz w:val="20"/>
+          <w:szCs w:val="20"/>
+        </w:rPr>
+        <w:t>remove table?</w:t>
+      </w:r>
+    </w:p>
+  </w:comment>
+  <w:comment w:id="5" w:author="Kristy Natasha" w:date="2026-08-19T20:23:00Z" w:initials="KN">
+    <w:p>
+      <w:pPr>
+        <w:jc w:val="left"/>
+      </w:pPr>
+      <w:r>
+        <w:rPr>
+          <w:rStyle w:val="CommentReference"/>
+        </w:rPr>
+        <w:annotationRef/>
+      </w:r>
+      <w:r>
+        <w:rPr>
+          <w:sz w:val="20"/>
+          <w:szCs w:val="20"/>
+        </w:rPr>
+        <w:t>change table, current best model now = tuned gradient boosting</w:t>
+      </w:r>
+    </w:p>
+  </w:comment>
+</w:comments>
+</file>
+
+<file path=word/commentsExtended.xml><?xml version="1.0" encoding="utf-8"?>
+<w15:commentsEx xmlns:wpc="http://schemas.microsoft.com/office/word/2010/wordprocessingCanvas" xmlns:cx="http://schemas.microsoft.com/office/drawing/2014/chartex" xmlns:cx1="http://schemas.microsoft.com/office/drawing/2015/9/8/chartex" xmlns:cx2="http://schemas.microsoft.com/office/drawing/2015/10/21/chartex" xmlns:cx3="http://schemas.microsoft.com/office/drawing/2016/5/9/chartex" xmlns:cx4="http://schemas.microsoft.com/office/drawing/2016/5/10/chartex" xmlns:cx5="http://schemas.microsoft.com/office/drawing/2016/5/11/chartex" xmlns:cx6="http://schemas.microsoft.com/office/drawing/2016/5/12/chartex" xmlns:cx7="http://schemas.microsoft.com/office/drawing/2016/5/13/chartex" xmlns:cx8="http://schemas.microsoft.com/office/drawing/2016/5/14/chartex" xmlns:mc="http://schemas.openxmlformats.org/markup-compatibility/2006" xmlns:m="http://schemas.openxmlformats.org/officeDocument/2006/math" xmlns:aink="http://schemas.microsoft.com/office/drawing/2016/ink" xmlns:am3d="http://schemas.microsoft.com/office/drawing/2017/model3d" xmlns:oel="http://schemas.microsoft.com/office/2019/extlst" xmlns:r="http://schemas.openxmlformats.org/officeDocument/2006/relationships" xmlns:wp14="http://schemas.microsoft.com/office/word/2010/wordprocessingDrawing" xmlns:wp="http://schemas.openxmlformats.org/drawingml/2006/wordprocessingDrawing" xmlns:wpg="http://schemas.microsoft.com/office/word/2010/wordprocessingGroup" xmlns:wpi="http://schemas.microsoft.com/office/word/2010/wordprocessingInk" xmlns:wps="http://schemas.microsoft.com/office/word/2010/wordprocessingShape" xmlns:o="urn:schemas-microsoft-com:office:office" xmlns:v="urn:schemas-microsoft-com:vml" xmlns:w10="urn:schemas-microsoft-com:office:word" xmlns:w="http://schemas.openxmlformats.org/wordprocessingml/2006/main" xmlns:w14="http://schemas.microsoft.com/office/word/2010/wordml" xmlns:w15="http://schemas.microsoft.com/office/word/2012/wordml" xmlns:w16cex="http://schemas.microsoft.com/office/word/2018/wordml/cex" xmlns:w16cid="http://schemas.microsoft.com/office/word/2016/wordml/cid" xmlns:w16="http://schemas.microsoft.com/office/word/2018/wordml" xmlns:w16sdtdh="http://schemas.microsoft.com/office/word/2020/wordml/sdtdatahash" xmlns:w16sdtfl="http://schemas.microsoft.com/office/word/2024/wordml/sdtformatlock" xmlns:w16se="http://schemas.microsoft.com/office/word/2015/wordml/symex" xmlns:w16du="http://schemas.microsoft.com/office/word/2023/wordml/word16du" xmlns:wne="http://schemas.microsoft.com/office/word/2006/wordml" mc:Ignorable="w14 w15 w16se w16cid w16 w16cex w16sdtdh w16sdtfl w16du wp14">
+  <w15:commentEx w15:paraId="395B5650" w15:done="0"/>
+  <w15:commentEx w15:paraId="4AA38294" w15:done="0"/>
+  <w15:commentEx w15:paraId="597E2FC7" w15:done="0"/>
+  <w15:commentEx w15:paraId="0B8491A2" w15:done="0"/>
+  <w15:commentEx w15:paraId="68EB1324" w15:paraIdParent="0B8491A2" w15:done="0"/>
+  <w15:commentEx w15:paraId="4055B514" w15:done="0"/>
+</w15:commentsEx>
+</file>
+
+<file path=word/commentsExtensible.xml><?xml version="1.0" encoding="utf-8"?>
+<w16cex:commentsExtensible xmlns:wpc="http://schemas.microsoft.com/office/word/2010/wordprocessingCanvas" xmlns:cx="http://schemas.microsoft.com/office/drawing/2014/chartex" xmlns:cx1="http://schemas.microsoft.com/office/drawing/2015/9/8/chartex" xmlns:cx2="http://schemas.microsoft.com/office/drawing/2015/10/21/chartex" xmlns:cx3="http://schemas.microsoft.com/office/drawing/2016/5/9/chartex" xmlns:cx4="http://schemas.microsoft.com/office/drawing/2016/5/10/chartex" xmlns:cx5="http://schemas.microsoft.com/office/drawing/2016/5/11/chartex" xmlns:cx6="http://schemas.microsoft.com/office/drawing/2016/5/12/chartex" xmlns:cx7="http://schemas.microsoft.com/office/drawing/2016/5/13/chartex" xmlns:cx8="http://schemas.microsoft.com/office/drawing/2016/5/14/chartex" xmlns:cr="http://schemas.microsoft.com/office/comments/2020/reactions" xmlns:mc="http://schemas.openxmlformats.org/markup-compatibility/2006" xmlns:m="http://schemas.openxmlformats.org/officeDocument/2006/math" xmlns:aink="http://schemas.microsoft.com/office/drawing/2016/ink" xmlns:am3d="http://schemas.microsoft.com/office/drawing/2017/model3d" xmlns:oel="http://schemas.microsoft.com/office/2019/extlst" xmlns:r="http://schemas.openxmlformats.org/officeDocument/2006/relationships" xmlns:wp14="http://schemas.microsoft.com/office/word/2010/wordprocessingDrawing" xmlns:wp="http://schemas.openxmlformats.org/drawingml/2006/wordprocessingDrawing" xmlns:wpg="http://schemas.microsoft.com/office/word/2010/wordprocessingGroup" xmlns:wpi="http://schemas.microsoft.com/office/word/2010/wordprocessingInk" xmlns:wps="http://schemas.microsoft.com/office/word/2010/wordprocessingShape" xmlns:o="urn:schemas-microsoft-com:office:office" xmlns:v="urn:schemas-microsoft-com:vml" xmlns:w10="urn:schemas-microsoft-com:office:word" xmlns:w="http://schemas.openxmlformats.org/wordprocessingml/2006/main" xmlns:w14="http://schemas.microsoft.com/office/word/2010/wordml" xmlns:w15="http://schemas.microsoft.com/office/word/2012/wordml" xmlns:w16cex="http://schemas.microsoft.com/office/word/2018/wordml/cex" xmlns:w16cid="http://schemas.microsoft.com/office/word/2016/wordml/cid" xmlns:w16="http://schemas.microsoft.com/office/word/2018/wordml" xmlns:w16sdtdh="http://schemas.microsoft.com/office/word/2020/wordml/sdtdatahash" xmlns:w16sdtfl="http://schemas.microsoft.com/office/word/2024/wordml/sdtformatlock" xmlns:w16se="http://schemas.microsoft.com/office/word/2015/wordml/symex" xmlns:w16du="http://schemas.microsoft.com/office/word/2023/wordml/word16du" xmlns:wne="http://schemas.microsoft.com/office/word/2006/wordml" mc:Ignorable="w14 w15 w16se w16cid w16 w16cex w16sdtdh w16sdtfl cr w16du wp14">
+  <w16cex:commentExtensible w16cex:durableId="6D627328" w16cex:dateUtc="2026-08-19T19:30:00Z"/>
+  <w16cex:commentExtensible w16cex:durableId="1E48CB65" w16cex:dateUtc="2026-08-19T19:25:00Z"/>
+  <w16cex:commentExtensible w16cex:durableId="05CD4FFB" w16cex:dateUtc="2026-08-19T19:28:00Z"/>
+  <w16cex:commentExtensible w16cex:durableId="7D0FCA70" w16cex:dateUtc="2026-08-19T19:25:00Z"/>
+  <w16cex:commentExtensible w16cex:durableId="40B5FB3E" w16cex:dateUtc="2026-08-19T19:28:00Z"/>
+  <w16cex:commentExtensible w16cex:durableId="2922EE9E" w16cex:dateUtc="2026-08-19T19:23:00Z"/>
+</w16cex:commentsExtensible>
+</file>
+
+<file path=word/commentsIds.xml><?xml version="1.0" encoding="utf-8"?>
+<w16cid:commentsIds xmlns:wpc="http://schemas.microsoft.com/office/word/2010/wordprocessingCanvas" xmlns:cx="http://schemas.microsoft.com/office/drawing/2014/chartex" xmlns:cx1="http://schemas.microsoft.com/office/drawing/2015/9/8/chartex" xmlns:cx2="http://schemas.microsoft.com/office/drawing/2015/10/21/chartex" xmlns:cx3="http://schemas.microsoft.com/office/drawing/2016/5/9/chartex" xmlns:cx4="http://schemas.microsoft.com/office/drawing/2016/5/10/chartex" xmlns:cx5="http://schemas.microsoft.com/office/drawing/2016/5/11/chartex" xmlns:cx6="http://schemas.microsoft.com/office/drawing/2016/5/12/chartex" xmlns:cx7="http://schemas.microsoft.com/office/drawing/2016/5/13/chartex" xmlns:cx8="http://schemas.microsoft.com/office/drawing/2016/5/14/chartex" xmlns:mc="http://schemas.openxmlformats.org/markup-compatibility/2006" xmlns:m="http://schemas.openxmlformats.org/officeDocument/2006/math" xmlns:aink="http://schemas.microsoft.com/office/drawing/2016/ink" xmlns:am3d="http://schemas.microsoft.com/office/drawing/2017/model3d" xmlns:oel="http://schemas.microsoft.com/office/2019/extlst" xmlns:r="http://schemas.openxmlformats.org/officeDocument/2006/relationships" xmlns:wp14="http://schemas.microsoft.com/office/word/2010/wordprocessingDrawing" xmlns:wp="http://schemas.openxmlformats.org/drawingml/2006/wordprocessingDrawing" xmlns:wpg="http://schemas.microsoft.com/office/word/2010/wordprocessingGroup" xmlns:wpi="http://schemas.microsoft.com/office/word/2010/wordprocessingInk" xmlns:wps="http://schemas.microsoft.com/office/word/2010/wordprocessingShape" xmlns:o="urn:schemas-microsoft-com:office:office" xmlns:v="urn:schemas-microsoft-com:vml" xmlns:w10="urn:schemas-microsoft-com:office:word" xmlns:w="http://schemas.openxmlformats.org/wordprocessingml/2006/main" xmlns:w14="http://schemas.microsoft.com/office/word/2010/wordml" xmlns:w15="http://schemas.microsoft.com/office/word/2012/wordml" xmlns:w16cex="http://schemas.microsoft.com/office/word/2018/wordml/cex" xmlns:w16cid="http://schemas.microsoft.com/office/word/2016/wordml/cid" xmlns:w16="http://schemas.microsoft.com/office/word/2018/wordml" xmlns:w16sdtdh="http://schemas.microsoft.com/office/word/2020/wordml/sdtdatahash" xmlns:w16sdtfl="http://schemas.microsoft.com/office/word/2024/wordml/sdtformatlock" xmlns:w16se="http://schemas.microsoft.com/office/word/2015/wordml/symex" xmlns:w16du="http://schemas.microsoft.com/office/word/2023/wordml/word16du" xmlns:wne="http://schemas.microsoft.com/office/word/2006/wordml" mc:Ignorable="w14 w15 w16se w16cid w16 w16cex w16sdtdh w16sdtfl w16du wp14">
+  <w16cid:commentId w16cid:paraId="395B5650" w16cid:durableId="6D627328"/>
+  <w16cid:commentId w16cid:paraId="4AA38294" w16cid:durableId="1E48CB65"/>
+  <w16cid:commentId w16cid:paraId="597E2FC7" w16cid:durableId="05CD4FFB"/>
+  <w16cid:commentId w16cid:paraId="0B8491A2" w16cid:durableId="7D0FCA70"/>
+  <w16cid:commentId w16cid:paraId="68EB1324" w16cid:durableId="40B5FB3E"/>
+  <w16cid:commentId w16cid:paraId="4055B514" w16cid:durableId="2922EE9E"/>
+</w16cid:commentsIds>
 </file>
 
 <file path=word/endnotes.xml><?xml version="1.0" encoding="utf-8"?>
@@ -7974,6 +7752,14 @@
     </w:p>
   </w:footnote>
 </w:footnotes>
+</file>
+
+<file path=word/people.xml><?xml version="1.0" encoding="utf-8"?>
+<w15:people xmlns:wpc="http://schemas.microsoft.com/office/word/2010/wordprocessingCanvas" xmlns:cx="http://schemas.microsoft.com/office/drawing/2014/chartex" xmlns:cx1="http://schemas.microsoft.com/office/drawing/2015/9/8/chartex" xmlns:cx2="http://schemas.microsoft.com/office/drawing/2015/10/21/chartex" xmlns:cx3="http://schemas.microsoft.com/office/drawing/2016/5/9/chartex" xmlns:cx4="http://schemas.microsoft.com/office/drawing/2016/5/10/chartex" xmlns:cx5="http://schemas.microsoft.com/office/drawing/2016/5/11/chartex" xmlns:cx6="http://schemas.microsoft.com/office/drawing/2016/5/12/chartex" xmlns:cx7="http://schemas.microsoft.com/office/drawing/2016/5/13/chartex" xmlns:cx8="http://schemas.microsoft.com/office/drawing/2016/5/14/chartex" xmlns:mc="http://schemas.openxmlformats.org/markup-compatibility/2006" xmlns:m="http://schemas.openxmlformats.org/officeDocument/2006/math" xmlns:aink="http://schemas.microsoft.com/office/drawing/2016/ink" xmlns:am3d="http://schemas.microsoft.com/office/drawing/2017/model3d" xmlns:oel="http://schemas.microsoft.com/office/2019/extlst" xmlns:r="http://schemas.openxmlformats.org/officeDocument/2006/relationships" xmlns:wp14="http://schemas.microsoft.com/office/word/2010/wordprocessingDrawing" xmlns:wp="http://schemas.openxmlformats.org/drawingml/2006/wordprocessingDrawing" xmlns:wpg="http://schemas.microsoft.com/office/word/2010/wordprocessingGroup" xmlns:wpi="http://schemas.microsoft.com/office/word/2010/wordprocessingInk" xmlns:wps="http://schemas.microsoft.com/office/word/2010/wordprocessingShape" xmlns:o="urn:schemas-microsoft-com:office:office" xmlns:v="urn:schemas-microsoft-com:vml" xmlns:w10="urn:schemas-microsoft-com:office:word" xmlns:w="http://schemas.openxmlformats.org/wordprocessingml/2006/main" xmlns:w14="http://schemas.microsoft.com/office/word/2010/wordml" xmlns:w15="http://schemas.microsoft.com/office/word/2012/wordml" xmlns:w16cex="http://schemas.microsoft.com/office/word/2018/wordml/cex" xmlns:w16cid="http://schemas.microsoft.com/office/word/2016/wordml/cid" xmlns:w16="http://schemas.microsoft.com/office/word/2018/wordml" xmlns:w16sdtdh="http://schemas.microsoft.com/office/word/2020/wordml/sdtdatahash" xmlns:w16sdtfl="http://schemas.microsoft.com/office/word/2024/wordml/sdtformatlock" xmlns:w16se="http://schemas.microsoft.com/office/word/2015/wordml/symex" xmlns:w16du="http://schemas.microsoft.com/office/word/2023/wordml/word16du" xmlns:wne="http://schemas.microsoft.com/office/word/2006/wordml" mc:Ignorable="w14 w15 w16se w16cid w16 w16cex w16sdtdh w16sdtfl w16du wp14">
+  <w15:person w15:author="Kristy Natasha">
+    <w15:presenceInfo w15:providerId="Windows Live" w15:userId="ad2cc11aa85b65bf"/>
+  </w15:person>
+</w15:people>
 </file>
 
 <file path=word/styles.xml><?xml version="1.0" encoding="utf-8"?>
@@ -9018,6 +8804,82 @@
       <w14:ligatures w14:val="none"/>
     </w:rPr>
   </w:style>
+  <w:style w:type="character" w:styleId="CommentReference">
+    <w:name w:val="annotation reference"/>
+    <w:basedOn w:val="DefaultParagraphFont"/>
+    <w:uiPriority w:val="99"/>
+    <w:semiHidden/>
+    <w:unhideWhenUsed/>
+    <w:rsid w:val="002D4DDB"/>
+    <w:rPr>
+      <w:sz w:val="16"/>
+      <w:szCs w:val="16"/>
+    </w:rPr>
+  </w:style>
+  <w:style w:type="paragraph" w:styleId="CommentText">
+    <w:name w:val="annotation text"/>
+    <w:basedOn w:val="Normal"/>
+    <w:link w:val="CommentTextChar"/>
+    <w:uiPriority w:val="99"/>
+    <w:semiHidden/>
+    <w:unhideWhenUsed/>
+    <w:rsid w:val="002D4DDB"/>
+    <w:pPr>
+      <w:spacing w:line="240" w:lineRule="auto"/>
+    </w:pPr>
+    <w:rPr>
+      <w:sz w:val="20"/>
+      <w:szCs w:val="20"/>
+    </w:rPr>
+  </w:style>
+  <w:style w:type="character" w:customStyle="1" w:styleId="CommentTextChar">
+    <w:name w:val="Comment Text Char"/>
+    <w:basedOn w:val="DefaultParagraphFont"/>
+    <w:link w:val="CommentText"/>
+    <w:uiPriority w:val="99"/>
+    <w:semiHidden/>
+    <w:rsid w:val="002D4DDB"/>
+    <w:rPr>
+      <w:rFonts w:ascii="Times New Roman" w:eastAsia="Times New Roman" w:hAnsi="Times New Roman" w:cs="Times New Roman"/>
+      <w:kern w:val="0"/>
+      <w:sz w:val="20"/>
+      <w:szCs w:val="20"/>
+      <w:lang w:val="en-GB"/>
+      <w14:ligatures w14:val="none"/>
+    </w:rPr>
+  </w:style>
+  <w:style w:type="paragraph" w:styleId="CommentSubject">
+    <w:name w:val="annotation subject"/>
+    <w:basedOn w:val="CommentText"/>
+    <w:next w:val="CommentText"/>
+    <w:link w:val="CommentSubjectChar"/>
+    <w:uiPriority w:val="99"/>
+    <w:semiHidden/>
+    <w:unhideWhenUsed/>
+    <w:rsid w:val="002D4DDB"/>
+    <w:rPr>
+      <w:b/>
+      <w:bCs/>
+    </w:rPr>
+  </w:style>
+  <w:style w:type="character" w:customStyle="1" w:styleId="CommentSubjectChar">
+    <w:name w:val="Comment Subject Char"/>
+    <w:basedOn w:val="CommentTextChar"/>
+    <w:link w:val="CommentSubject"/>
+    <w:uiPriority w:val="99"/>
+    <w:semiHidden/>
+    <w:rsid w:val="002D4DDB"/>
+    <w:rPr>
+      <w:rFonts w:ascii="Times New Roman" w:eastAsia="Times New Roman" w:hAnsi="Times New Roman" w:cs="Times New Roman"/>
+      <w:b/>
+      <w:bCs/>
+      <w:kern w:val="0"/>
+      <w:sz w:val="20"/>
+      <w:szCs w:val="20"/>
+      <w:lang w:val="en-GB"/>
+      <w14:ligatures w14:val="none"/>
+    </w:rPr>
+  </w:style>
 </w:styles>
 </file>
 
@@ -9341,7 +9203,7 @@
 </file>
 
 <file path=customXml/itemProps1.xml><?xml version="1.0" encoding="utf-8"?>
-<ds:datastoreItem xmlns:ds="http://schemas.openxmlformats.org/officeDocument/2006/customXml" ds:itemID="{EE65C99C-2AA9-4945-A74F-A8B37AB63811}">
+<ds:datastoreItem xmlns:ds="http://schemas.openxmlformats.org/officeDocument/2006/customXml" ds:itemID="{BEC5EEC8-5AAF-FC4A-A91A-803F4C26AD1F}">
   <ds:schemaRefs>
     <ds:schemaRef ds:uri="http://schemas.openxmlformats.org/officeDocument/2006/bibliography"/>
   </ds:schemaRefs>

</xml_diff>

<commit_message>
docs: fix numerical changes in abstract
</commit_message>
<xml_diff>
--- a/deliverables/nny124-final-report.docx
+++ b/deliverables/nny124-final-report.docx
@@ -333,11 +333,7 @@
         </w:rPr>
         <w:t>One theory for the formation of Mars's moons, Phobos and Deimos, is that close collisions between asteroids and Mars can tidally damage the asteroid and leave some debris bonded to the planet. This process is thoroughly modelled by smoothed-particle hydrodynamics (SPH), but testing every possible combination of inputs is computationally costly. In this study, bound mass fraction (BMF) is predicted from the simulation inputs using machine learning models after SPH outputs are converted into fragmentation measurements.</w:t>
       </w:r>
-    </w:p>
-    <w:p>
-      <w:pPr>
-        <w:pStyle w:val="Heading1"/>
-        <w:jc w:val="both"/>
+      <w:r>
         <w:rPr>
           <w:rFonts w:ascii="Times New Roman" w:eastAsia="Times New Roman" w:hAnsi="Times New Roman" w:cs="Times New Roman"/>
           <w:color w:val="auto"/>
@@ -347,7 +343,8 @@
           <w:lang w:val="en-GB"/>
           <w14:ligatures w14:val="none"/>
         </w:rPr>
-      </w:pPr>
+        <w:t xml:space="preserve"> </w:t>
+      </w:r>
       <w:r>
         <w:rPr>
           <w:rFonts w:ascii="Times New Roman" w:eastAsia="Times New Roman" w:hAnsi="Times New Roman" w:cs="Times New Roman"/>
@@ -432,11 +429,7 @@
         </w:rPr>
         <w:t xml:space="preserve">The models are assessed using grouped cross-validation. </w:t>
       </w:r>
-    </w:p>
-    <w:p>
-      <w:pPr>
-        <w:pStyle w:val="Heading1"/>
-        <w:jc w:val="both"/>
+      <w:r>
         <w:rPr>
           <w:rFonts w:ascii="Times New Roman" w:eastAsia="Times New Roman" w:hAnsi="Times New Roman" w:cs="Times New Roman"/>
           <w:color w:val="auto"/>
@@ -446,7 +439,8 @@
           <w:lang w:val="en-GB"/>
           <w14:ligatures w14:val="none"/>
         </w:rPr>
-      </w:pPr>
+        <w:t>In a controlled set, predicted BMF generally decreases from roughly 0.27 at 1.2 Mars radii to approximately zero by about 2.5 Mars radii as periapsis increases. A similarly clear decline occurs as encounter speed increases, from roughly 0.25 at low velocity to approximately zero by about 1.2 km/s. While the impacts of spin and velocity depend on the encounter conditions, periapsis is the strongest overall physical input. As a result, distinct physical inputs may become more significant in different regions of the measured parameter range.</w:t>
+      </w:r>
       <w:r>
         <w:rPr>
           <w:rFonts w:ascii="Times New Roman" w:eastAsia="Times New Roman" w:hAnsi="Times New Roman" w:cs="Times New Roman"/>
@@ -457,47 +451,8 @@
           <w:lang w:val="en-GB"/>
           <w14:ligatures w14:val="none"/>
         </w:rPr>
-        <w:t>In controlled experiments,</w:t>
-      </w:r>
-      <w:r>
-        <w:rPr>
-          <w:rFonts w:ascii="Times New Roman" w:eastAsia="Times New Roman" w:hAnsi="Times New Roman" w:cs="Times New Roman"/>
-          <w:color w:val="auto"/>
-          <w:kern w:val="0"/>
-          <w:sz w:val="20"/>
-          <w:szCs w:val="20"/>
-          <w:lang w:val="en-GB"/>
-          <w14:ligatures w14:val="none"/>
-        </w:rPr>
         <w:t xml:space="preserve"> </w:t>
       </w:r>
-      <w:r>
-        <w:rPr>
-          <w:rFonts w:ascii="Times New Roman" w:eastAsia="Times New Roman" w:hAnsi="Times New Roman" w:cs="Times New Roman"/>
-          <w:color w:val="auto"/>
-          <w:kern w:val="0"/>
-          <w:sz w:val="20"/>
-          <w:szCs w:val="20"/>
-          <w:lang w:val="en-GB"/>
-          <w14:ligatures w14:val="none"/>
-        </w:rPr>
-        <w:t xml:space="preserve">the available SPH cases drop to roughly zero beyond around 2.2 Mars radii, while the anticipated BMF drops from roughly 0.25 at 1.2 Mars radii as periapsis increases. A more noticeable decline occurs as encounter speed increases, from roughly 0.25 at 0 km/s to roughly zero above 1 km/s. While the impacts of spin and velocity depend on the encounter conditions, periapsis is the strongest overall physical input. As a result, distinct physical inputs may become more significant in different regions of the measured parameter range. </w:t>
-      </w:r>
-    </w:p>
-    <w:p>
-      <w:pPr>
-        <w:pStyle w:val="Heading1"/>
-        <w:jc w:val="both"/>
-        <w:rPr>
-          <w:rFonts w:ascii="Times New Roman" w:eastAsia="Times New Roman" w:hAnsi="Times New Roman" w:cs="Times New Roman"/>
-          <w:color w:val="auto"/>
-          <w:kern w:val="0"/>
-          <w:sz w:val="20"/>
-          <w:szCs w:val="20"/>
-          <w:lang w:val="en-GB"/>
-          <w14:ligatures w14:val="none"/>
-        </w:rPr>
-      </w:pPr>
       <w:r>
         <w:rPr>
           <w:rFonts w:ascii="Times New Roman" w:eastAsia="Times New Roman" w:hAnsi="Times New Roman" w:cs="Times New Roman"/>
@@ -620,7 +575,6 @@
         <w:rPr>
           <w:color w:val="000000"/>
         </w:rPr>
-        <w:lastRenderedPageBreak/>
         <w:t>Th</w:t>
       </w:r>
       <w:r>
@@ -686,6 +640,7 @@
           <w:szCs w:val="24"/>
           <w:lang w:val="en-GB"/>
         </w:rPr>
+        <w:lastRenderedPageBreak/>
         <w:t>1.2 Significance and Originality</w:t>
       </w:r>
     </w:p>
@@ -852,11 +807,7 @@
         <w:t>neighbouring</w:t>
       </w:r>
       <w:r>
-        <w:t xml:space="preserve"> particles; therefore, the reported number and mass of fragments depend in part on the encounter physics as </w:t>
-      </w:r>
-      <w:r>
-        <w:lastRenderedPageBreak/>
-        <w:t>well as that processing option (More et al., 2011). Bound mass is handled differently: a fragment's orbital energy in relation to Mars determines whether it is bound or unbound.</w:t>
+        <w:t xml:space="preserve"> particles; therefore, the reported number and mass of fragments depend in part on the encounter physics as well as that processing option (More et al., 2011). Bound mass is handled differently: a fragment's orbital energy in relation to Mars determines whether it is bound or unbound.</w:t>
       </w:r>
     </w:p>
     <w:p>
@@ -883,6 +834,7 @@
           <w:lang w:val="en-GB"/>
           <w14:ligatures w14:val="none"/>
         </w:rPr>
+        <w:lastRenderedPageBreak/>
         <w:t>The particle-level SPH outputs are transformed into scalar outcomes through post-processing, creating a compact tabular dataset appropriate for machine learning. Because tree-based models perform well with tiny, nonlinear tabular datasets, this makes the problem a good fit for machine learning (ML) (Grinsztajn et al., 2022). In the past, outcomes from comparable SPH collision and giant-impact simulations have also been predicted using tree-based ML surrogate models (Cambioni et al., 2019; Timpe et al., 2020). They are still not widely used for asteroid tidal-disruption encounters, though.</w:t>
       </w:r>
     </w:p>

</xml_diff>

<commit_message>
docs: add new findings
</commit_message>
<xml_diff>
--- a/deliverables/nny124-final-report.docx
+++ b/deliverables/nny124-final-report.docx
@@ -3123,7 +3123,34 @@
         <w:rPr>
           <w:color w:val="000000" w:themeColor="text1"/>
         </w:rPr>
-        <w:t>Figure 3 compares the tuned Gradient Boosting response with available SPH simulation results by changing one input at a time while holding the others constant. In the representative periapsis profile, predicted BMF generally decreases from roughly 0.27 at 1.2 Mars radii to approximately zero by about 2.5 Mars radii. A similarly clear decline occurs as encounter velocity increases, from roughly 0.25 at low velocity to approximately zero by about 1.2 km/s.</w:t>
+        <w:t>Figure 3 compares the tuned Gradient Boosting response with available SPH simulation results by changing one input at a time while holding the others constant. In the representative periapsis profile, predicted BMF generally decreases from roughly 0.27 at 1.2 Mars radii to approximately zero by about 2.5 Mars radii.</w:t>
+      </w:r>
+      <w:r>
+        <w:t xml:space="preserve"> </w:t>
+      </w:r>
+      <w:r>
+        <w:rPr>
+          <w:color w:val="000000" w:themeColor="text1"/>
+        </w:rPr>
+        <w:t>The model remains slightly above the SPH results around 2.2</w:t>
+      </w:r>
+      <w:r>
+        <w:rPr>
+          <w:color w:val="000000" w:themeColor="text1"/>
+        </w:rPr>
+        <w:t>-</w:t>
+      </w:r>
+      <w:r>
+        <w:rPr>
+          <w:color w:val="000000" w:themeColor="text1"/>
+        </w:rPr>
+        <w:t>2.4 Mars radii because its prediction is influenced by patterns learned from the wider training data, not periapsis alone. By about 2.5 Mars radii, the input crosses tree thresholds associated mainly with zero-BMF training cases, so the prediction also falls to approximately zero.</w:t>
+      </w:r>
+      <w:r>
+        <w:rPr>
+          <w:color w:val="000000" w:themeColor="text1"/>
+        </w:rPr>
+        <w:t xml:space="preserve"> A similarly clear decline occurs as encounter velocity increases, from roughly 0.25 at low velocity to approximately zero by about 1.2 km/s.</w:t>
       </w:r>
     </w:p>
     <w:p>
@@ -3150,14 +3177,14 @@
         <w:rPr>
           <w:color w:val="000000" w:themeColor="text1"/>
         </w:rPr>
-        <w:t xml:space="preserve"> curve should be considered model dependent. For the z-axis scenario that is shown, the spin-period panel is almost flat, indicating that altering the spin period has minimal impact in this specific configuration. This demonstrates that an input that is significant throughout the whole dataset can only have a minor </w:t>
+        <w:t xml:space="preserve"> curve should be </w:t>
       </w:r>
       <w:r>
         <w:rPr>
           <w:color w:val="000000" w:themeColor="text1"/>
         </w:rPr>
         <w:lastRenderedPageBreak/>
-        <w:t>impact given a particular set of encounter conditions, which does not contradict the overall significance of spin in Section 3.4.</w:t>
+        <w:t>considered model dependent. For the z-axis scenario that is shown, the spin-period panel is almost flat, indicating that altering the spin period has minimal impact in this specific configuration. This demonstrates that an input that is significant throughout the whole dataset can only have a minor impact given a particular set of encounter conditions, which does not contradict the overall significance of spin in Section 3.4.</w:t>
       </w:r>
     </w:p>
     <w:p>
@@ -3355,6 +3382,7 @@
         <w:rPr>
           <w:color w:val="000000" w:themeColor="text1"/>
         </w:rPr>
+        <w:lastRenderedPageBreak/>
         <w:t>The outcome makes it abundantly evident that each parameter's intensity varies. Changing spin results in a BMF range of around 0.06-0.09 below about 1.5 Mars-radii. This can grow much stronger at bigger periapsis: the spin-related range increases to around 0.24 at 1.8 Mars-radii for v</w:t>
       </w:r>
       <w:r>
@@ -3368,14 +3396,7 @@
         <w:rPr>
           <w:color w:val="000000" w:themeColor="text1"/>
         </w:rPr>
-        <w:t xml:space="preserve">=0, while various other velocity groups reach approximately 0.14-0.22 between 1.6 and 2.0 </w:t>
-      </w:r>
-      <w:r>
-        <w:rPr>
-          <w:color w:val="000000" w:themeColor="text1"/>
-        </w:rPr>
-        <w:lastRenderedPageBreak/>
-        <w:t>Mars-radii. The pattern of velocity is distinct. The velocity-related BMF range for the no-spin instances is approximately 0.18 at 1.2-1.4 Mars radii, decreases to approximately 0.14 at 1.6 Mars radii, and reaches zero by 1.8 Mars radii. On the other hand, velocity-related ranges of roughly 0.15-0.19 between 1.6 and 2.0 Mars-radii are still seen in the sampled prograde z-spin situations.</w:t>
+        <w:t>=0, while various other velocity groups reach approximately 0.14-0.22 between 1.6 and 2.0 Mars-radii. The pattern of velocity is distinct. The velocity-related BMF range for the no-spin instances is approximately 0.18 at 1.2-1.4 Mars radii, decreases to approximately 0.14 at 1.6 Mars radii, and reaches zero by 1.8 Mars radii. On the other hand, velocity-related ranges of roughly 0.15-0.19 between 1.6 and 2.0 Mars-radii are still seen in the sampled prograde z-spin situations.</w:t>
       </w:r>
     </w:p>
     <w:p>
@@ -3853,6 +3874,7 @@
               <w:rPr>
                 <w:color w:val="000000" w:themeColor="text1"/>
               </w:rPr>
+              <w:lastRenderedPageBreak/>
               <w:t>1.6</w:t>
             </w:r>
           </w:p>
@@ -8682,7 +8704,7 @@
                 <w:color w:val="000000" w:themeColor="text1"/>
                 <w:lang w:val="en-US"/>
               </w:rPr>
-              <w:t xml:space="preserve"> used for analysis</w:t>
+              <w:t xml:space="preserve"> </w:t>
             </w:r>
           </w:p>
         </w:tc>

</xml_diff>

<commit_message>
docs: add explanation of new finding in discussion with supported figures linking how it supports the finding
</commit_message>
<xml_diff>
--- a/deliverables/nny124-final-report.docx
+++ b/deliverables/nny124-final-report.docx
@@ -4278,6 +4278,61 @@
     </w:p>
     <w:p>
       <w:pPr>
+        <w:spacing w:before="360" w:after="80" w:line="276" w:lineRule="auto"/>
+        <w:jc w:val="both"/>
+      </w:pPr>
+      <w:r>
+        <w:t>The clearest periapsis and velocity trends are seen in the controlled experiments, while the matched comparisons show that the effects of spin and velocity vary with encounter conditions.</w:t>
+      </w:r>
+    </w:p>
+    <w:p>
+      <w:pPr>
+        <w:spacing w:before="360" w:after="80" w:line="276" w:lineRule="auto"/>
+        <w:jc w:val="both"/>
+        <w:rPr>
+          <w:color w:val="000000" w:themeColor="text1"/>
+        </w:rPr>
+      </w:pPr>
+      <w:r>
+        <w:t>The model learns these relationships from the SPH results rather than directly from physical equations. However, the behaviour i</w:t>
+      </w:r>
+      <w:r>
+        <w:t xml:space="preserve">n </w:t>
+      </w:r>
+      <w:r>
+        <w:t>Figure 3 is consistent with the other analyses. At larger periapsis, the controlled Gradient Boosting prediction remains slightly above the available SPH results before falling to approximately zero at about 2.5 Mars radii.</w:t>
+      </w:r>
+      <w:r>
+        <w:t xml:space="preserve"> </w:t>
+      </w:r>
+      <w:r>
+        <w:t>In Figure 1, most cases at larger periapsis are close to zero BMF, but one prograde-spin case still retains about 3-4% BMF at 2.6 Mars radii. Figure 4 also shows that the BMF differences associated with spin and velocity can become larger at higher periapsis, indicating that the outcome there depends on the full encounter conditions rather than periapsis alone. Figure 5 shows the same idea from the mass-periapsis coverage: at around 2.6 Mars radii, the 10</w:t>
+      </w:r>
+      <w:r>
+        <w:rPr>
+          <w:vertAlign w:val="superscript"/>
+        </w:rPr>
+        <w:t>19</w:t>
+      </w:r>
+      <w:r>
+        <w:t>kg bin has mean BMF = 0, while the 10</w:t>
+      </w:r>
+      <w:r>
+        <w:rPr>
+          <w:vertAlign w:val="superscript"/>
+        </w:rPr>
+        <w:t>20</w:t>
+      </w:r>
+      <w:r>
+        <w:t xml:space="preserve">kg bin still contains non-zero BMF cases. This does not prove that higher mass directly causes higher </w:t>
+      </w:r>
+      <w:r>
+        <w:lastRenderedPageBreak/>
+        <w:t>BMF, because the other encounter parameters also differ, but it shows that similar periapsis values can still produce different outcomes under different conditions.</w:t>
+      </w:r>
+    </w:p>
+    <w:p>
+      <w:pPr>
         <w:spacing w:before="240" w:after="80" w:line="276" w:lineRule="auto"/>
         <w:jc w:val="both"/>
         <w:rPr>
@@ -4318,14 +4373,7 @@
         <w:rPr>
           <w:color w:val="000000" w:themeColor="text1"/>
         </w:rPr>
-        <w:t xml:space="preserve">As a result, ML's usefulness is restricted. It can swiftly filter well-supported input combinations, identify transition zones, uncover situations that yield promising retained mass, and indicate areas where more simulation could yield valuable information. Long-term debris survivability, precise </w:t>
-      </w:r>
-      <w:r>
-        <w:rPr>
-          <w:color w:val="000000" w:themeColor="text1"/>
-        </w:rPr>
-        <w:lastRenderedPageBreak/>
-        <w:t>fragment shapes and distributions from BMF alone, and forecasts for inadequately sampled input combinations cannot all be determined by it. This is evident from the 1019.5 kg example: when only two independent simulations support the local combination, being numerically inside the training range is insufficient.</w:t>
+        <w:t>As a result, ML's usefulness is restricted. It can swiftly filter well-supported input combinations, identify transition zones, uncover situations that yield promising retained mass, and indicate areas where more simulation could yield valuable information. Long-term debris survivability, precise fragment shapes and distributions from BMF alone, and forecasts for inadequately sampled input combinations cannot all be determined by it. This is evident from the 1019.5 kg example: when only two independent simulations support the local combination, being numerically inside the training range is insufficient.</w:t>
       </w:r>
     </w:p>
     <w:p>
@@ -4383,6 +4431,7 @@
           <w:lang w:val="en-GB"/>
           <w14:ligatures w14:val="none"/>
         </w:rPr>
+        <w:lastRenderedPageBreak/>
         <w:t>All things considered, the ML model is a quick screening method for the current SPH archive. Poorly sampled cases, transition regions, and issues requiring certain fragment attributes still require SPH.</w:t>
       </w:r>
     </w:p>
@@ -4564,14 +4613,7 @@
         <w:rPr>
           <w:color w:val="000000" w:themeColor="text1"/>
         </w:rPr>
-        <w:t xml:space="preserve">0.296). However, matched cases show that their relative importance changes locally. Changing </w:t>
-      </w:r>
-      <w:r>
-        <w:rPr>
-          <w:color w:val="000000" w:themeColor="text1"/>
-        </w:rPr>
-        <w:lastRenderedPageBreak/>
-        <w:t>spin produces a BMF range of roughly 0.06</w:t>
+        <w:t>0.296). However, matched cases show that their relative importance changes locally. Changing spin produces a BMF range of roughly 0.06</w:t>
       </w:r>
       <w:r>
         <w:rPr>
@@ -4628,7 +4670,14 @@
         <w:rPr>
           <w:color w:val="000000" w:themeColor="text1"/>
         </w:rPr>
-        <w:t>Yes, in cases where the SPH archive supports comparable input combinations. The primary tuned Gradient Boosting model using the original simulation inputs obtains a grouped cross-validated R² of 0.9234, MAE of 0.0159, and RMSE of 0.0257. Adding physics-derived features produces only a small further change to R² = 0.9240 and MAE = 0.0155, with RMSE unchanged at 0.0257, so the simpler tuned model is retained. Performance is not equally dependable everywhere, however. Despite the input values falling within the numerical training ranges, held-out errors increase to roughly 0.08 BMF, or 8 percentage points, in the sparsely sampled 10</w:t>
+        <w:t xml:space="preserve">Yes, in cases where the SPH archive supports comparable input combinations. The primary tuned Gradient Boosting model using the original simulation inputs obtains a grouped cross-validated R² of 0.9234, MAE of 0.0159, and RMSE of 0.0257. Adding physics-derived features produces only a small further change to R² = 0.9240 and MAE = 0.0155, with RMSE unchanged at 0.0257, so the simpler tuned model is retained. Performance is not equally dependable everywhere, however. Despite the input values falling within the numerical training ranges, held-out errors increase to roughly 0.08 BMF, or 8 </w:t>
+      </w:r>
+      <w:r>
+        <w:rPr>
+          <w:color w:val="000000" w:themeColor="text1"/>
+        </w:rPr>
+        <w:lastRenderedPageBreak/>
+        <w:t>percentage points, in the sparsely sampled 10</w:t>
       </w:r>
       <w:r>
         <w:rPr>
@@ -4737,7 +4786,6 @@
           <w:lang w:val="en-GB"/>
           <w14:ligatures w14:val="none"/>
         </w:rPr>
-        <w:lastRenderedPageBreak/>
         <w:t xml:space="preserve">Higher grouped-validation scores are obtained by exploratory XGBoost and hurdle models, but more testing is necessary before they can take the place of the primary </w:t>
       </w:r>
       <w:r>
@@ -4847,6 +4895,7 @@
         <w:rPr>
           <w:color w:val="000000" w:themeColor="text1"/>
         </w:rPr>
+        <w:lastRenderedPageBreak/>
         <w:t>Future research should enhance automatic identification of input combinations with inadequate support and per-prediction reliability estimates. Before updating the current model, new SPH simulations should be used to test exploratory XGBoost and hurdle models. Stronger physical limitations, multi-output prediction, and uncertainty estimates are possible additional enhancements.</w:t>
       </w:r>
     </w:p>
@@ -4983,7 +5032,6 @@
         <w:rPr>
           <w:color w:val="000000" w:themeColor="text1"/>
         </w:rPr>
-        <w:lastRenderedPageBreak/>
         <w:t>Duan, T., Anand, A., Ding, D. Y., Thai, K. K., Basu, S., Ng, A. &amp; Schuler, A. (2020). NGBoost: Natural Gradient Boosting for Probabilistic Prediction. Proceedings of the 37th International Conference on Machine Learning, PMLR 119, 2690-2700.</w:t>
       </w:r>
     </w:p>
@@ -5048,6 +5096,7 @@
         <w:rPr>
           <w:color w:val="000000" w:themeColor="text1"/>
         </w:rPr>
+        <w:lastRenderedPageBreak/>
         <w:t>More, S., Kravtsov, A. V., Dalal, N. &amp; Gottlöber, S. (2011). The overdensity and masses of the friends-of-friends halos and universality of the halo mass function. The Astrophysical Journal Supplement Series, 195(1), 4. doi:10.1088/0067-0049/195/1/4.</w:t>
       </w:r>
     </w:p>

</xml_diff>

<commit_message>
docs: update figure 3, less linspace, show prediction dots
</commit_message>
<xml_diff>
--- a/deliverables/nny124-final-report.docx
+++ b/deliverables/nny124-final-report.docx
@@ -58,17 +58,6 @@
         </w:rPr>
         <w:t>MSc in Applied Computational Science and Engineering</w:t>
       </w:r>
-    </w:p>
-    <w:p>
-      <w:pPr>
-        <w:spacing w:after="160" w:line="276" w:lineRule="auto"/>
-        <w:jc w:val="center"/>
-        <w:rPr>
-          <w:color w:val="000000" w:themeColor="text1"/>
-          <w:sz w:val="32"/>
-          <w:szCs w:val="32"/>
-        </w:rPr>
-      </w:pPr>
     </w:p>
     <w:p>
       <w:pPr>
@@ -322,7 +311,6 @@
     <w:p>
       <w:pPr>
         <w:spacing w:after="160" w:line="276" w:lineRule="auto"/>
-        <w:jc w:val="center"/>
         <w:rPr>
           <w:color w:val="000000" w:themeColor="text1"/>
         </w:rPr>
@@ -344,7 +332,6 @@
           <w:sz w:val="30"/>
           <w:szCs w:val="30"/>
         </w:rPr>
-        <w:lastRenderedPageBreak/>
         <w:t>September 2026</w:t>
       </w:r>
     </w:p>
@@ -370,6 +357,7 @@
           <w:szCs w:val="24"/>
           <w:lang w:val="en-GB"/>
         </w:rPr>
+        <w:lastRenderedPageBreak/>
         <w:t>Abstract</w:t>
       </w:r>
     </w:p>
@@ -690,14 +678,7 @@
         <w:rPr>
           <w:color w:val="000000" w:themeColor="text1"/>
         </w:rPr>
-        <w:t xml:space="preserve">(1) how do orbital and physical parameters affect disruption and bound retention; (2) which inputs matter most for fragment formation and </w:t>
-      </w:r>
-      <w:r>
-        <w:rPr>
-          <w:color w:val="000000" w:themeColor="text1"/>
-        </w:rPr>
-        <w:lastRenderedPageBreak/>
-        <w:t>retained debris; and (3) can machine-learning models predict outcomes within the sampled data while showing when a prediction should or should not be trusted?</w:t>
+        <w:t>(1) how do orbital and physical parameters affect disruption and bound retention; (2) which inputs matter most for fragment formation and retained debris; and (3) can machine-learning models predict outcomes within the sampled data while showing when a prediction should or should not be trusted?</w:t>
       </w:r>
     </w:p>
     <w:p>
@@ -721,6 +702,7 @@
           <w:szCs w:val="24"/>
           <w:lang w:val="en-GB"/>
         </w:rPr>
+        <w:lastRenderedPageBreak/>
         <w:t>1.2 Significance and Originality</w:t>
       </w:r>
     </w:p>
@@ -905,14 +887,7 @@
         <w:rPr>
           <w:color w:val="000000" w:themeColor="text1"/>
         </w:rPr>
-        <w:t xml:space="preserve"> particles; </w:t>
-      </w:r>
-      <w:r>
-        <w:rPr>
-          <w:color w:val="000000" w:themeColor="text1"/>
-        </w:rPr>
-        <w:lastRenderedPageBreak/>
-        <w:t>therefore, the reported number and mass of fragments depend in part on the encounter physics as well as that processing option (More et al., 2011). Bound mass is handled differently: a fragment's orbital energy in relation to Mars determines whether it is bound or unbound.</w:t>
+        <w:t xml:space="preserve"> particles; therefore, the reported number and mass of fragments depend in part on the encounter physics as well as that processing option (More et al., 2011). Bound mass is handled differently: a fragment's orbital energy in relation to Mars determines whether it is bound or unbound.</w:t>
       </w:r>
     </w:p>
     <w:p>
@@ -940,6 +915,7 @@
           <w:lang w:val="en-GB"/>
           <w14:ligatures w14:val="none"/>
         </w:rPr>
+        <w:lastRenderedPageBreak/>
         <w:t>The particle-level SPH outputs are transformed into scalar outcomes through post-processing, creating a compact tabular dataset appropriate for machine learning. Because tree-based models perform well with tiny, nonlinear tabular datasets, this makes the problem a good fit for machine learning (ML) (Grinsztajn et al., 2022). In the past, outcomes from comparable SPH collision and giant-impact simulations have also been predicted using tree-based ML surrogate models (Cambioni et al., 2019; Timpe et al., 2020). They are still not widely used for asteroid tidal-disruption encounters, though.</w:t>
       </w:r>
     </w:p>
@@ -1476,7 +1452,6 @@
               <w:rPr>
                 <w:color w:val="000000" w:themeColor="text1"/>
               </w:rPr>
-              <w:lastRenderedPageBreak/>
               <w:t>Encounter speed</w:t>
             </w:r>
           </w:p>
@@ -1590,6 +1565,7 @@
               <w:rPr>
                 <w:color w:val="000000" w:themeColor="text1"/>
               </w:rPr>
+              <w:lastRenderedPageBreak/>
               <w:t>Spin</w:t>
             </w:r>
           </w:p>
@@ -2002,22 +1978,29 @@
           <w:rFonts w:eastAsia="Gungsuh"/>
           <w:color w:val="000000" w:themeColor="text1"/>
         </w:rPr>
+        <w:t xml:space="preserve">For the prediction tasks, </w:t>
+      </w:r>
+      <w:r>
+        <w:rPr>
+          <w:rFonts w:eastAsia="Gungsuh"/>
+          <w:color w:val="000000" w:themeColor="text1"/>
+        </w:rPr>
+        <w:t>several</w:t>
+      </w:r>
+      <w:r>
+        <w:rPr>
+          <w:rFonts w:eastAsia="Gungsuh"/>
+          <w:color w:val="000000" w:themeColor="text1"/>
+        </w:rPr>
+        <w:t xml:space="preserve"> baseline models were used. While this project primarily focuses on tree-based models, Logistic Regression is also used for the BMF ≥ 10% classification task because it offers a straightforward baseline for testing whether lower- and higher-retention cases </w:t>
+      </w:r>
+      <w:r>
+        <w:rPr>
+          <w:rFonts w:eastAsia="Gungsuh"/>
+          <w:color w:val="000000" w:themeColor="text1"/>
+        </w:rPr>
         <w:lastRenderedPageBreak/>
-        <w:t xml:space="preserve">For the prediction tasks, </w:t>
-      </w:r>
-      <w:r>
-        <w:rPr>
-          <w:rFonts w:eastAsia="Gungsuh"/>
-          <w:color w:val="000000" w:themeColor="text1"/>
-        </w:rPr>
-        <w:t>several</w:t>
-      </w:r>
-      <w:r>
-        <w:rPr>
-          <w:rFonts w:eastAsia="Gungsuh"/>
-          <w:color w:val="000000" w:themeColor="text1"/>
-        </w:rPr>
-        <w:t xml:space="preserve"> baseline models were used. While this project primarily focuses on tree-based models, Logistic Regression is also used for the BMF ≥ 10% classification task because it offers a straightforward baseline for testing whether lower- and higher-retention cases can already be separated using a relatively simple combination of the inputs (Knauer et al., 2024). Because Random Forest can capture nonlinear correlations and interactions between the simulation parameters while averaging numerous trees to lessen susceptibility to specific cases, it is tried for continuous BMF prediction (Breiman, 2001; Cambioni et al., 2019). Additionally, Gradient Boosting is evaluated since it constructs trees in a sequential manner, with each subsequent tree fixing mistakes produced by the ones before it. This could assist capture more precise changes between various encounter settings (Friedman, 2001; Valencia et al., 2019; Timpe et al., 2020).</w:t>
+        <w:t>can already be separated using a relatively simple combination of the inputs (Knauer et al., 2024). Because Random Forest can capture nonlinear correlations and interactions between the simulation parameters while averaging numerous trees to lessen susceptibility to specific cases, it is tried for continuous BMF prediction (Breiman, 2001; Cambioni et al., 2019). Additionally, Gradient Boosting is evaluated since it constructs trees in a sequential manner, with each subsequent tree fixing mistakes produced by the ones before it. This could assist capture more precise changes between various encounter settings (Friedman, 2001; Valencia et al., 2019; Timpe et al., 2020).</w:t>
       </w:r>
     </w:p>
     <w:p>
@@ -2034,21 +2017,21 @@
           <w:rFonts w:eastAsia="Gungsuh"/>
           <w:color w:val="000000" w:themeColor="text1"/>
         </w:rPr>
-        <w:t>To determine whether prediction performance could be improved beyond the baseline models, Gradient Boosting hyperparameters were tuned and physics-derived attributes calculated from the original simulation inputs were tested as a separate feature-engineering experiment. The tuned Gradient Boosting model using the original inputs was retained as the primary model because the derived features produced no meaningful additional gain (</w:t>
+        <w:t>To determine whether prediction performance could be improved beyond the baseline models, Gradient Boosting hyperparameters were tuned and physics-derived attributes calculated from the original simulation inputs were tested as a separate feature-engineering experiment. The tuned Gradient Boosting model using the original inputs was retained as the primary model because the derived features produced no meaningful additional gain (Appendix A</w:t>
       </w:r>
       <w:r>
         <w:rPr>
           <w:rFonts w:eastAsia="Gungsuh"/>
           <w:color w:val="000000" w:themeColor="text1"/>
         </w:rPr>
-        <w:t xml:space="preserve">see </w:t>
+        <w:t>, Tables A1-A2</w:t>
       </w:r>
       <w:r>
         <w:rPr>
           <w:rFonts w:eastAsia="Gungsuh"/>
           <w:color w:val="000000" w:themeColor="text1"/>
         </w:rPr>
-        <w:t xml:space="preserve">Appendix A). More sophisticated alternatives, including XGBoost and two-stage hurdle models, </w:t>
+        <w:t xml:space="preserve">). More sophisticated alternatives, including XGBoost and two-stage hurdle models, </w:t>
       </w:r>
       <w:r>
         <w:rPr>
@@ -2178,7 +2161,6 @@
         <w:rPr>
           <w:color w:val="000000" w:themeColor="text1"/>
         </w:rPr>
-        <w:lastRenderedPageBreak/>
         <w:t>Regression performance is measured using R</w:t>
       </w:r>
       <w:r>
@@ -2216,6 +2198,7 @@
           <w:szCs w:val="24"/>
           <w:lang w:val="en-GB"/>
         </w:rPr>
+        <w:lastRenderedPageBreak/>
         <w:t>2.4 How the Physical Effects Were Analysed</w:t>
       </w:r>
     </w:p>
@@ -2533,7 +2516,7 @@
           <w:right w:val="nil"/>
           <w:between w:val="nil"/>
         </w:pBdr>
-        <w:spacing w:before="360" w:after="80" w:line="276" w:lineRule="auto"/>
+        <w:spacing w:after="80" w:line="276" w:lineRule="auto"/>
         <w:jc w:val="center"/>
         <w:rPr>
           <w:i/>
@@ -2697,7 +2680,7 @@
           <w:right w:val="nil"/>
           <w:between w:val="nil"/>
         </w:pBdr>
-        <w:spacing w:before="360" w:after="80" w:line="276" w:lineRule="auto"/>
+        <w:spacing w:after="80" w:line="276" w:lineRule="auto"/>
         <w:jc w:val="center"/>
         <w:rPr>
           <w:i/>
@@ -3057,10 +3040,10 @@
         </w:rPr>
         <w:lastRenderedPageBreak/>
         <w:drawing>
-          <wp:inline distT="0" distB="0" distL="0" distR="0" wp14:anchorId="045BCD56" wp14:editId="42A5EB5A">
-            <wp:extent cx="5943600" cy="4037330"/>
-            <wp:effectExtent l="0" t="0" r="0" b="1270"/>
-            <wp:docPr id="1473537885" name="Picture 1"/>
+          <wp:inline distT="0" distB="0" distL="0" distR="0" wp14:anchorId="0F761EB7" wp14:editId="1A6B64FD">
+            <wp:extent cx="5943600" cy="4072255"/>
+            <wp:effectExtent l="0" t="0" r="0" b="4445"/>
+            <wp:docPr id="623214946" name="Picture 1"/>
             <wp:cNvGraphicFramePr>
               <a:graphicFrameLocks xmlns:a="http://schemas.openxmlformats.org/drawingml/2006/main" noChangeAspect="1"/>
             </wp:cNvGraphicFramePr>
@@ -3068,7 +3051,7 @@
               <a:graphicData uri="http://schemas.openxmlformats.org/drawingml/2006/picture">
                 <pic:pic xmlns:pic="http://schemas.openxmlformats.org/drawingml/2006/picture">
                   <pic:nvPicPr>
-                    <pic:cNvPr id="1473537885" name=""/>
+                    <pic:cNvPr id="623214946" name=""/>
                     <pic:cNvPicPr/>
                   </pic:nvPicPr>
                   <pic:blipFill>
@@ -3080,7 +3063,7 @@
                   <pic:spPr>
                     <a:xfrm>
                       <a:off x="0" y="0"/>
-                      <a:ext cx="5943600" cy="4037330"/>
+                      <a:ext cx="5943600" cy="4072255"/>
                     </a:xfrm>
                     <a:prstGeom prst="rect">
                       <a:avLst/>
@@ -3096,7 +3079,7 @@
     <w:p>
       <w:pPr>
         <w:keepLines/>
-        <w:spacing w:before="360" w:after="80" w:line="276" w:lineRule="auto"/>
+        <w:spacing w:after="80" w:line="276" w:lineRule="auto"/>
         <w:jc w:val="center"/>
         <w:rPr>
           <w:color w:val="000000" w:themeColor="text1"/>
@@ -3177,14 +3160,26 @@
         <w:rPr>
           <w:color w:val="000000" w:themeColor="text1"/>
         </w:rPr>
-        <w:t xml:space="preserve"> curve should be </w:t>
+        <w:t xml:space="preserve"> curve should be considered model dependent. For the z-axis scenario that is shown, the spin-period panel is almost </w:t>
       </w:r>
       <w:r>
         <w:rPr>
           <w:color w:val="000000" w:themeColor="text1"/>
         </w:rPr>
         <w:lastRenderedPageBreak/>
-        <w:t>considered model dependent. For the z-axis scenario that is shown, the spin-period panel is almost flat, indicating that altering the spin period has minimal impact in this specific configuration. This demonstrates that an input that is significant throughout the whole dataset can only have a minor impact given a particular set of encounter conditions, which does not contradict the overall significance of spin in Section 3.4.</w:t>
+        <w:t>flat, indicating that altering the spin period has minimal impact in this specific configuration. This demonstrates that an input that is significant throughout the whole dataset can only have a minor impact given a particular set of encounter conditions, which does not contradict the overall significance of spin in Section 3.4.</w:t>
+      </w:r>
+    </w:p>
+    <w:p>
+      <w:pPr>
+        <w:spacing w:before="360" w:after="80" w:line="276" w:lineRule="auto"/>
+        <w:jc w:val="both"/>
+        <w:rPr>
+          <w:color w:val="000000" w:themeColor="text1"/>
+        </w:rPr>
+      </w:pPr>
+      <w:r>
+        <w:t>Far outside the sampled parameter ranges, tree-based predictions become stepwise or constant and need not represent physical trends (Appendix Figure A1)</w:t>
       </w:r>
     </w:p>
     <w:p>
@@ -3483,511 +3478,6 @@
     </w:p>
     <w:p>
       <w:pPr>
-        <w:spacing w:before="360" w:after="80" w:line="276" w:lineRule="auto"/>
-        <w:jc w:val="both"/>
-        <w:rPr>
-          <w:color w:val="000000" w:themeColor="text1"/>
-        </w:rPr>
-      </w:pPr>
-      <w:r>
-        <w:rPr>
-          <w:color w:val="000000" w:themeColor="text1"/>
-        </w:rPr>
-        <w:t>A specific illustration of this issue for the sparsely sampled 1019.5 kg asteroid mass is provided in Table 2. At periapsis 1.2 and 1.6 Mars radii, when five post-processing rows are provided but only one independent physical SPH simulation supports each periapsis, it compares the true BMF, held-out prediction, and absolute error.</w:t>
-      </w:r>
-    </w:p>
-    <w:p>
-      <w:pPr>
-        <w:keepNext/>
-        <w:spacing w:line="276" w:lineRule="auto"/>
-        <w:jc w:val="center"/>
-        <w:rPr>
-          <w:color w:val="000000" w:themeColor="text1"/>
-        </w:rPr>
-      </w:pPr>
-    </w:p>
-    <w:p>
-      <w:pPr>
-        <w:keepNext/>
-        <w:spacing w:line="276" w:lineRule="auto"/>
-        <w:jc w:val="center"/>
-        <w:rPr>
-          <w:i/>
-          <w:iCs/>
-          <w:color w:val="000000" w:themeColor="text1"/>
-        </w:rPr>
-      </w:pPr>
-      <w:r>
-        <w:rPr>
-          <w:i/>
-          <w:iCs/>
-          <w:color w:val="000000" w:themeColor="text1"/>
-        </w:rPr>
-        <w:t>Table 2. Failure case at asteroid mass 10</w:t>
-      </w:r>
-      <w:r>
-        <w:rPr>
-          <w:i/>
-          <w:iCs/>
-          <w:color w:val="000000" w:themeColor="text1"/>
-          <w:vertAlign w:val="superscript"/>
-        </w:rPr>
-        <w:t>19.5</w:t>
-      </w:r>
-      <w:r>
-        <w:rPr>
-          <w:i/>
-          <w:iCs/>
-          <w:color w:val="000000" w:themeColor="text1"/>
-        </w:rPr>
-        <w:t xml:space="preserve"> kg: the mass is within the sampled range,</w:t>
-      </w:r>
-    </w:p>
-    <w:p>
-      <w:pPr>
-        <w:keepNext/>
-        <w:spacing w:line="276" w:lineRule="auto"/>
-        <w:jc w:val="center"/>
-        <w:rPr>
-          <w:i/>
-          <w:iCs/>
-          <w:color w:val="000000" w:themeColor="text1"/>
-        </w:rPr>
-      </w:pPr>
-      <w:r>
-        <w:rPr>
-          <w:i/>
-          <w:iCs/>
-          <w:color w:val="000000" w:themeColor="text1"/>
-        </w:rPr>
-        <w:t>but only two unique physical SPH simulations support these cases.</w:t>
-      </w:r>
-    </w:p>
-    <w:tbl>
-      <w:tblPr>
-        <w:tblW w:w="7290" w:type="dxa"/>
-        <w:jc w:val="center"/>
-        <w:tblBorders>
-          <w:top w:val="single" w:sz="6" w:space="0" w:color="000000"/>
-          <w:left w:val="single" w:sz="6" w:space="0" w:color="000000"/>
-          <w:bottom w:val="single" w:sz="6" w:space="0" w:color="000000"/>
-          <w:right w:val="single" w:sz="6" w:space="0" w:color="000000"/>
-          <w:insideH w:val="single" w:sz="6" w:space="0" w:color="000000"/>
-          <w:insideV w:val="single" w:sz="6" w:space="0" w:color="000000"/>
-        </w:tblBorders>
-        <w:tblLayout w:type="fixed"/>
-        <w:tblLook w:val="0400" w:firstRow="0" w:lastRow="0" w:firstColumn="0" w:lastColumn="0" w:noHBand="0" w:noVBand="1"/>
-      </w:tblPr>
-      <w:tblGrid>
-        <w:gridCol w:w="1245"/>
-        <w:gridCol w:w="1155"/>
-        <w:gridCol w:w="1365"/>
-        <w:gridCol w:w="1155"/>
-        <w:gridCol w:w="2370"/>
-      </w:tblGrid>
-      <w:tr>
-        <w:trPr>
-          <w:cantSplit/>
-          <w:trHeight w:val="617"/>
-          <w:tblHeader/>
-          <w:jc w:val="center"/>
-        </w:trPr>
-        <w:tc>
-          <w:tcPr>
-            <w:tcW w:w="1245" w:type="dxa"/>
-            <w:tcMar>
-              <w:top w:w="60" w:type="dxa"/>
-              <w:bottom w:w="60" w:type="dxa"/>
-            </w:tcMar>
-            <w:vAlign w:val="center"/>
-          </w:tcPr>
-          <w:p>
-            <w:pPr>
-              <w:spacing w:line="276" w:lineRule="auto"/>
-              <w:rPr>
-                <w:color w:val="000000" w:themeColor="text1"/>
-              </w:rPr>
-            </w:pPr>
-            <w:r>
-              <w:rPr>
-                <w:b/>
-                <w:bCs/>
-                <w:color w:val="000000" w:themeColor="text1"/>
-              </w:rPr>
-              <w:t>Periapsis</w:t>
-            </w:r>
-          </w:p>
-        </w:tc>
-        <w:tc>
-          <w:tcPr>
-            <w:tcW w:w="1155" w:type="dxa"/>
-            <w:tcMar>
-              <w:top w:w="60" w:type="dxa"/>
-              <w:bottom w:w="60" w:type="dxa"/>
-            </w:tcMar>
-            <w:vAlign w:val="center"/>
-          </w:tcPr>
-          <w:p>
-            <w:pPr>
-              <w:spacing w:line="276" w:lineRule="auto"/>
-              <w:rPr>
-                <w:color w:val="000000" w:themeColor="text1"/>
-              </w:rPr>
-            </w:pPr>
-            <w:r>
-              <w:rPr>
-                <w:b/>
-                <w:bCs/>
-                <w:color w:val="000000" w:themeColor="text1"/>
-              </w:rPr>
-              <w:t>Actual BMF</w:t>
-            </w:r>
-          </w:p>
-        </w:tc>
-        <w:tc>
-          <w:tcPr>
-            <w:tcW w:w="1365" w:type="dxa"/>
-            <w:tcMar>
-              <w:top w:w="60" w:type="dxa"/>
-              <w:bottom w:w="60" w:type="dxa"/>
-            </w:tcMar>
-            <w:vAlign w:val="center"/>
-          </w:tcPr>
-          <w:p>
-            <w:pPr>
-              <w:spacing w:line="276" w:lineRule="auto"/>
-              <w:rPr>
-                <w:color w:val="000000" w:themeColor="text1"/>
-              </w:rPr>
-            </w:pPr>
-            <w:r>
-              <w:rPr>
-                <w:b/>
-                <w:bCs/>
-                <w:color w:val="000000" w:themeColor="text1"/>
-              </w:rPr>
-              <w:t>OOF prediction</w:t>
-            </w:r>
-          </w:p>
-        </w:tc>
-        <w:tc>
-          <w:tcPr>
-            <w:tcW w:w="1155" w:type="dxa"/>
-            <w:tcMar>
-              <w:top w:w="60" w:type="dxa"/>
-              <w:bottom w:w="60" w:type="dxa"/>
-            </w:tcMar>
-            <w:vAlign w:val="center"/>
-          </w:tcPr>
-          <w:p>
-            <w:pPr>
-              <w:spacing w:line="276" w:lineRule="auto"/>
-              <w:rPr>
-                <w:color w:val="000000" w:themeColor="text1"/>
-              </w:rPr>
-            </w:pPr>
-            <w:r>
-              <w:rPr>
-                <w:b/>
-                <w:bCs/>
-                <w:color w:val="000000" w:themeColor="text1"/>
-              </w:rPr>
-              <w:t>Abs. error</w:t>
-            </w:r>
-          </w:p>
-        </w:tc>
-        <w:tc>
-          <w:tcPr>
-            <w:tcW w:w="2370" w:type="dxa"/>
-            <w:tcMar>
-              <w:top w:w="60" w:type="dxa"/>
-              <w:bottom w:w="60" w:type="dxa"/>
-            </w:tcMar>
-            <w:vAlign w:val="center"/>
-          </w:tcPr>
-          <w:p>
-            <w:pPr>
-              <w:spacing w:line="276" w:lineRule="auto"/>
-              <w:rPr>
-                <w:color w:val="000000" w:themeColor="text1"/>
-              </w:rPr>
-            </w:pPr>
-            <w:r>
-              <w:rPr>
-                <w:b/>
-                <w:bCs/>
-                <w:color w:val="000000" w:themeColor="text1"/>
-              </w:rPr>
-              <w:t>Failure</w:t>
-            </w:r>
-          </w:p>
-        </w:tc>
-      </w:tr>
-      <w:tr>
-        <w:trPr>
-          <w:cantSplit/>
-          <w:jc w:val="center"/>
-        </w:trPr>
-        <w:tc>
-          <w:tcPr>
-            <w:tcW w:w="1245" w:type="dxa"/>
-            <w:tcMar>
-              <w:top w:w="60" w:type="dxa"/>
-              <w:bottom w:w="60" w:type="dxa"/>
-            </w:tcMar>
-            <w:vAlign w:val="center"/>
-          </w:tcPr>
-          <w:p>
-            <w:pPr>
-              <w:spacing w:line="276" w:lineRule="auto"/>
-              <w:rPr>
-                <w:color w:val="000000" w:themeColor="text1"/>
-              </w:rPr>
-            </w:pPr>
-            <w:r>
-              <w:rPr>
-                <w:color w:val="000000" w:themeColor="text1"/>
-              </w:rPr>
-              <w:t>1.2</w:t>
-            </w:r>
-          </w:p>
-        </w:tc>
-        <w:tc>
-          <w:tcPr>
-            <w:tcW w:w="1155" w:type="dxa"/>
-            <w:tcMar>
-              <w:top w:w="60" w:type="dxa"/>
-              <w:bottom w:w="60" w:type="dxa"/>
-            </w:tcMar>
-            <w:vAlign w:val="center"/>
-          </w:tcPr>
-          <w:p>
-            <w:pPr>
-              <w:spacing w:line="276" w:lineRule="auto"/>
-              <w:rPr>
-                <w:color w:val="000000" w:themeColor="text1"/>
-              </w:rPr>
-            </w:pPr>
-            <w:r>
-              <w:rPr>
-                <w:color w:val="000000" w:themeColor="text1"/>
-              </w:rPr>
-              <w:t>0.0913</w:t>
-            </w:r>
-          </w:p>
-        </w:tc>
-        <w:tc>
-          <w:tcPr>
-            <w:tcW w:w="1365" w:type="dxa"/>
-            <w:tcMar>
-              <w:top w:w="60" w:type="dxa"/>
-              <w:bottom w:w="60" w:type="dxa"/>
-            </w:tcMar>
-            <w:vAlign w:val="center"/>
-          </w:tcPr>
-          <w:p>
-            <w:pPr>
-              <w:spacing w:line="276" w:lineRule="auto"/>
-              <w:rPr>
-                <w:color w:val="000000" w:themeColor="text1"/>
-              </w:rPr>
-            </w:pPr>
-            <w:r>
-              <w:rPr>
-                <w:color w:val="000000" w:themeColor="text1"/>
-              </w:rPr>
-              <w:t>0.0134</w:t>
-            </w:r>
-          </w:p>
-        </w:tc>
-        <w:tc>
-          <w:tcPr>
-            <w:tcW w:w="1155" w:type="dxa"/>
-            <w:tcMar>
-              <w:top w:w="60" w:type="dxa"/>
-              <w:bottom w:w="60" w:type="dxa"/>
-            </w:tcMar>
-            <w:vAlign w:val="center"/>
-          </w:tcPr>
-          <w:p>
-            <w:pPr>
-              <w:spacing w:line="276" w:lineRule="auto"/>
-              <w:rPr>
-                <w:color w:val="000000" w:themeColor="text1"/>
-              </w:rPr>
-            </w:pPr>
-            <w:r>
-              <w:rPr>
-                <w:color w:val="000000" w:themeColor="text1"/>
-              </w:rPr>
-              <w:t>0.0779</w:t>
-            </w:r>
-          </w:p>
-        </w:tc>
-        <w:tc>
-          <w:tcPr>
-            <w:tcW w:w="2370" w:type="dxa"/>
-            <w:tcMar>
-              <w:top w:w="60" w:type="dxa"/>
-              <w:bottom w:w="60" w:type="dxa"/>
-            </w:tcMar>
-            <w:vAlign w:val="center"/>
-          </w:tcPr>
-          <w:p>
-            <w:pPr>
-              <w:spacing w:line="276" w:lineRule="auto"/>
-              <w:rPr>
-                <w:color w:val="000000" w:themeColor="text1"/>
-              </w:rPr>
-            </w:pPr>
-            <w:r>
-              <w:rPr>
-                <w:color w:val="000000" w:themeColor="text1"/>
-              </w:rPr>
-              <w:t>Underpredicts</w:t>
-            </w:r>
-          </w:p>
-        </w:tc>
-      </w:tr>
-      <w:tr>
-        <w:trPr>
-          <w:cantSplit/>
-          <w:jc w:val="center"/>
-        </w:trPr>
-        <w:tc>
-          <w:tcPr>
-            <w:tcW w:w="1245" w:type="dxa"/>
-            <w:tcMar>
-              <w:top w:w="60" w:type="dxa"/>
-              <w:bottom w:w="60" w:type="dxa"/>
-            </w:tcMar>
-            <w:vAlign w:val="center"/>
-          </w:tcPr>
-          <w:p>
-            <w:pPr>
-              <w:spacing w:line="276" w:lineRule="auto"/>
-              <w:rPr>
-                <w:color w:val="000000" w:themeColor="text1"/>
-              </w:rPr>
-            </w:pPr>
-            <w:r>
-              <w:rPr>
-                <w:color w:val="000000" w:themeColor="text1"/>
-              </w:rPr>
-              <w:lastRenderedPageBreak/>
-              <w:t>1.6</w:t>
-            </w:r>
-          </w:p>
-        </w:tc>
-        <w:tc>
-          <w:tcPr>
-            <w:tcW w:w="1155" w:type="dxa"/>
-            <w:tcMar>
-              <w:top w:w="60" w:type="dxa"/>
-              <w:bottom w:w="60" w:type="dxa"/>
-            </w:tcMar>
-            <w:vAlign w:val="center"/>
-          </w:tcPr>
-          <w:p>
-            <w:pPr>
-              <w:spacing w:line="276" w:lineRule="auto"/>
-              <w:rPr>
-                <w:color w:val="000000" w:themeColor="text1"/>
-              </w:rPr>
-            </w:pPr>
-            <w:r>
-              <w:rPr>
-                <w:color w:val="000000" w:themeColor="text1"/>
-              </w:rPr>
-              <w:t>0.000204</w:t>
-            </w:r>
-          </w:p>
-        </w:tc>
-        <w:tc>
-          <w:tcPr>
-            <w:tcW w:w="1365" w:type="dxa"/>
-            <w:tcMar>
-              <w:top w:w="60" w:type="dxa"/>
-              <w:bottom w:w="60" w:type="dxa"/>
-            </w:tcMar>
-            <w:vAlign w:val="center"/>
-          </w:tcPr>
-          <w:p>
-            <w:pPr>
-              <w:spacing w:line="276" w:lineRule="auto"/>
-              <w:rPr>
-                <w:color w:val="000000" w:themeColor="text1"/>
-              </w:rPr>
-            </w:pPr>
-            <w:r>
-              <w:rPr>
-                <w:color w:val="000000" w:themeColor="text1"/>
-              </w:rPr>
-              <w:t>0.0827</w:t>
-            </w:r>
-          </w:p>
-        </w:tc>
-        <w:tc>
-          <w:tcPr>
-            <w:tcW w:w="1155" w:type="dxa"/>
-            <w:tcMar>
-              <w:top w:w="60" w:type="dxa"/>
-              <w:bottom w:w="60" w:type="dxa"/>
-            </w:tcMar>
-            <w:vAlign w:val="center"/>
-          </w:tcPr>
-          <w:p>
-            <w:pPr>
-              <w:spacing w:line="276" w:lineRule="auto"/>
-              <w:rPr>
-                <w:color w:val="000000" w:themeColor="text1"/>
-              </w:rPr>
-            </w:pPr>
-            <w:r>
-              <w:rPr>
-                <w:color w:val="000000" w:themeColor="text1"/>
-              </w:rPr>
-              <w:t>0.0825</w:t>
-            </w:r>
-          </w:p>
-        </w:tc>
-        <w:tc>
-          <w:tcPr>
-            <w:tcW w:w="2370" w:type="dxa"/>
-            <w:tcMar>
-              <w:top w:w="60" w:type="dxa"/>
-              <w:bottom w:w="60" w:type="dxa"/>
-            </w:tcMar>
-            <w:vAlign w:val="center"/>
-          </w:tcPr>
-          <w:p>
-            <w:pPr>
-              <w:spacing w:line="276" w:lineRule="auto"/>
-              <w:rPr>
-                <w:color w:val="000000" w:themeColor="text1"/>
-              </w:rPr>
-            </w:pPr>
-            <w:r>
-              <w:rPr>
-                <w:color w:val="000000" w:themeColor="text1"/>
-              </w:rPr>
-              <w:t>Overpredicts</w:t>
-            </w:r>
-          </w:p>
-        </w:tc>
-      </w:tr>
-    </w:tbl>
-    <w:p>
-      <w:pPr>
-        <w:spacing w:before="360" w:after="80" w:line="276" w:lineRule="auto"/>
-        <w:jc w:val="both"/>
-        <w:rPr>
-          <w:color w:val="000000" w:themeColor="text1"/>
-        </w:rPr>
-      </w:pPr>
-    </w:p>
-    <w:p>
-      <w:pPr>
         <w:keepNext/>
         <w:spacing w:line="276" w:lineRule="auto"/>
         <w:jc w:val="center"/>
@@ -4119,6 +3609,502 @@
     </w:p>
     <w:p>
       <w:pPr>
+        <w:spacing w:before="360" w:after="80" w:line="276" w:lineRule="auto"/>
+        <w:jc w:val="both"/>
+        <w:rPr>
+          <w:color w:val="000000" w:themeColor="text1"/>
+        </w:rPr>
+      </w:pPr>
+      <w:r>
+        <w:rPr>
+          <w:color w:val="000000" w:themeColor="text1"/>
+        </w:rPr>
+        <w:lastRenderedPageBreak/>
+        <w:t>A specific illustration of this issue for the sparsely sampled 1019.5 kg asteroid mass is provided in Table 2. At periapsis 1.2 and 1.6 Mars radii, when five post-processing rows are provided but only one independent physical SPH simulation supports each periapsis, it compares the true BMF, held-out prediction, and absolute error.</w:t>
+      </w:r>
+    </w:p>
+    <w:p>
+      <w:pPr>
+        <w:keepNext/>
+        <w:spacing w:line="276" w:lineRule="auto"/>
+        <w:jc w:val="center"/>
+        <w:rPr>
+          <w:color w:val="000000" w:themeColor="text1"/>
+        </w:rPr>
+      </w:pPr>
+    </w:p>
+    <w:p>
+      <w:pPr>
+        <w:keepNext/>
+        <w:spacing w:line="276" w:lineRule="auto"/>
+        <w:jc w:val="center"/>
+        <w:rPr>
+          <w:i/>
+          <w:iCs/>
+          <w:color w:val="000000" w:themeColor="text1"/>
+        </w:rPr>
+      </w:pPr>
+      <w:r>
+        <w:rPr>
+          <w:i/>
+          <w:iCs/>
+          <w:color w:val="000000" w:themeColor="text1"/>
+        </w:rPr>
+        <w:t>Table 2. Failure case at asteroid mass 10</w:t>
+      </w:r>
+      <w:r>
+        <w:rPr>
+          <w:i/>
+          <w:iCs/>
+          <w:color w:val="000000" w:themeColor="text1"/>
+          <w:vertAlign w:val="superscript"/>
+        </w:rPr>
+        <w:t>19.5</w:t>
+      </w:r>
+      <w:r>
+        <w:rPr>
+          <w:i/>
+          <w:iCs/>
+          <w:color w:val="000000" w:themeColor="text1"/>
+        </w:rPr>
+        <w:t xml:space="preserve"> kg: the mass is within the sampled range,</w:t>
+      </w:r>
+    </w:p>
+    <w:p>
+      <w:pPr>
+        <w:keepNext/>
+        <w:spacing w:line="276" w:lineRule="auto"/>
+        <w:jc w:val="center"/>
+        <w:rPr>
+          <w:i/>
+          <w:iCs/>
+          <w:color w:val="000000" w:themeColor="text1"/>
+        </w:rPr>
+      </w:pPr>
+      <w:r>
+        <w:rPr>
+          <w:i/>
+          <w:iCs/>
+          <w:color w:val="000000" w:themeColor="text1"/>
+        </w:rPr>
+        <w:t>but only two unique physical SPH simulations support these cases.</w:t>
+      </w:r>
+    </w:p>
+    <w:tbl>
+      <w:tblPr>
+        <w:tblW w:w="7290" w:type="dxa"/>
+        <w:jc w:val="center"/>
+        <w:tblBorders>
+          <w:top w:val="single" w:sz="6" w:space="0" w:color="000000"/>
+          <w:left w:val="single" w:sz="6" w:space="0" w:color="000000"/>
+          <w:bottom w:val="single" w:sz="6" w:space="0" w:color="000000"/>
+          <w:right w:val="single" w:sz="6" w:space="0" w:color="000000"/>
+          <w:insideH w:val="single" w:sz="6" w:space="0" w:color="000000"/>
+          <w:insideV w:val="single" w:sz="6" w:space="0" w:color="000000"/>
+        </w:tblBorders>
+        <w:tblLayout w:type="fixed"/>
+        <w:tblLook w:val="0400" w:firstRow="0" w:lastRow="0" w:firstColumn="0" w:lastColumn="0" w:noHBand="0" w:noVBand="1"/>
+      </w:tblPr>
+      <w:tblGrid>
+        <w:gridCol w:w="1245"/>
+        <w:gridCol w:w="1155"/>
+        <w:gridCol w:w="1365"/>
+        <w:gridCol w:w="1155"/>
+        <w:gridCol w:w="2370"/>
+      </w:tblGrid>
+      <w:tr>
+        <w:trPr>
+          <w:cantSplit/>
+          <w:trHeight w:val="617"/>
+          <w:tblHeader/>
+          <w:jc w:val="center"/>
+        </w:trPr>
+        <w:tc>
+          <w:tcPr>
+            <w:tcW w:w="1245" w:type="dxa"/>
+            <w:tcMar>
+              <w:top w:w="60" w:type="dxa"/>
+              <w:bottom w:w="60" w:type="dxa"/>
+            </w:tcMar>
+            <w:vAlign w:val="center"/>
+          </w:tcPr>
+          <w:p>
+            <w:pPr>
+              <w:spacing w:line="276" w:lineRule="auto"/>
+              <w:rPr>
+                <w:color w:val="000000" w:themeColor="text1"/>
+              </w:rPr>
+            </w:pPr>
+            <w:r>
+              <w:rPr>
+                <w:b/>
+                <w:bCs/>
+                <w:color w:val="000000" w:themeColor="text1"/>
+              </w:rPr>
+              <w:t>Periapsis</w:t>
+            </w:r>
+          </w:p>
+        </w:tc>
+        <w:tc>
+          <w:tcPr>
+            <w:tcW w:w="1155" w:type="dxa"/>
+            <w:tcMar>
+              <w:top w:w="60" w:type="dxa"/>
+              <w:bottom w:w="60" w:type="dxa"/>
+            </w:tcMar>
+            <w:vAlign w:val="center"/>
+          </w:tcPr>
+          <w:p>
+            <w:pPr>
+              <w:spacing w:line="276" w:lineRule="auto"/>
+              <w:rPr>
+                <w:color w:val="000000" w:themeColor="text1"/>
+              </w:rPr>
+            </w:pPr>
+            <w:r>
+              <w:rPr>
+                <w:b/>
+                <w:bCs/>
+                <w:color w:val="000000" w:themeColor="text1"/>
+              </w:rPr>
+              <w:t>Actual BMF</w:t>
+            </w:r>
+          </w:p>
+        </w:tc>
+        <w:tc>
+          <w:tcPr>
+            <w:tcW w:w="1365" w:type="dxa"/>
+            <w:tcMar>
+              <w:top w:w="60" w:type="dxa"/>
+              <w:bottom w:w="60" w:type="dxa"/>
+            </w:tcMar>
+            <w:vAlign w:val="center"/>
+          </w:tcPr>
+          <w:p>
+            <w:pPr>
+              <w:spacing w:line="276" w:lineRule="auto"/>
+              <w:rPr>
+                <w:color w:val="000000" w:themeColor="text1"/>
+              </w:rPr>
+            </w:pPr>
+            <w:r>
+              <w:rPr>
+                <w:b/>
+                <w:bCs/>
+                <w:color w:val="000000" w:themeColor="text1"/>
+              </w:rPr>
+              <w:t>OOF prediction</w:t>
+            </w:r>
+          </w:p>
+        </w:tc>
+        <w:tc>
+          <w:tcPr>
+            <w:tcW w:w="1155" w:type="dxa"/>
+            <w:tcMar>
+              <w:top w:w="60" w:type="dxa"/>
+              <w:bottom w:w="60" w:type="dxa"/>
+            </w:tcMar>
+            <w:vAlign w:val="center"/>
+          </w:tcPr>
+          <w:p>
+            <w:pPr>
+              <w:spacing w:line="276" w:lineRule="auto"/>
+              <w:rPr>
+                <w:color w:val="000000" w:themeColor="text1"/>
+              </w:rPr>
+            </w:pPr>
+            <w:r>
+              <w:rPr>
+                <w:b/>
+                <w:bCs/>
+                <w:color w:val="000000" w:themeColor="text1"/>
+              </w:rPr>
+              <w:t>Abs. error</w:t>
+            </w:r>
+          </w:p>
+        </w:tc>
+        <w:tc>
+          <w:tcPr>
+            <w:tcW w:w="2370" w:type="dxa"/>
+            <w:tcMar>
+              <w:top w:w="60" w:type="dxa"/>
+              <w:bottom w:w="60" w:type="dxa"/>
+            </w:tcMar>
+            <w:vAlign w:val="center"/>
+          </w:tcPr>
+          <w:p>
+            <w:pPr>
+              <w:spacing w:line="276" w:lineRule="auto"/>
+              <w:rPr>
+                <w:color w:val="000000" w:themeColor="text1"/>
+              </w:rPr>
+            </w:pPr>
+            <w:r>
+              <w:rPr>
+                <w:b/>
+                <w:bCs/>
+                <w:color w:val="000000" w:themeColor="text1"/>
+              </w:rPr>
+              <w:t>Failure</w:t>
+            </w:r>
+          </w:p>
+        </w:tc>
+      </w:tr>
+      <w:tr>
+        <w:trPr>
+          <w:cantSplit/>
+          <w:jc w:val="center"/>
+        </w:trPr>
+        <w:tc>
+          <w:tcPr>
+            <w:tcW w:w="1245" w:type="dxa"/>
+            <w:tcMar>
+              <w:top w:w="60" w:type="dxa"/>
+              <w:bottom w:w="60" w:type="dxa"/>
+            </w:tcMar>
+            <w:vAlign w:val="center"/>
+          </w:tcPr>
+          <w:p>
+            <w:pPr>
+              <w:spacing w:line="276" w:lineRule="auto"/>
+              <w:rPr>
+                <w:color w:val="000000" w:themeColor="text1"/>
+              </w:rPr>
+            </w:pPr>
+            <w:r>
+              <w:rPr>
+                <w:color w:val="000000" w:themeColor="text1"/>
+              </w:rPr>
+              <w:t>1.2</w:t>
+            </w:r>
+          </w:p>
+        </w:tc>
+        <w:tc>
+          <w:tcPr>
+            <w:tcW w:w="1155" w:type="dxa"/>
+            <w:tcMar>
+              <w:top w:w="60" w:type="dxa"/>
+              <w:bottom w:w="60" w:type="dxa"/>
+            </w:tcMar>
+            <w:vAlign w:val="center"/>
+          </w:tcPr>
+          <w:p>
+            <w:pPr>
+              <w:spacing w:line="276" w:lineRule="auto"/>
+              <w:rPr>
+                <w:color w:val="000000" w:themeColor="text1"/>
+              </w:rPr>
+            </w:pPr>
+            <w:r>
+              <w:rPr>
+                <w:color w:val="000000" w:themeColor="text1"/>
+              </w:rPr>
+              <w:t>0.0913</w:t>
+            </w:r>
+          </w:p>
+        </w:tc>
+        <w:tc>
+          <w:tcPr>
+            <w:tcW w:w="1365" w:type="dxa"/>
+            <w:tcMar>
+              <w:top w:w="60" w:type="dxa"/>
+              <w:bottom w:w="60" w:type="dxa"/>
+            </w:tcMar>
+            <w:vAlign w:val="center"/>
+          </w:tcPr>
+          <w:p>
+            <w:pPr>
+              <w:spacing w:line="276" w:lineRule="auto"/>
+              <w:rPr>
+                <w:color w:val="000000" w:themeColor="text1"/>
+              </w:rPr>
+            </w:pPr>
+            <w:r>
+              <w:rPr>
+                <w:color w:val="000000" w:themeColor="text1"/>
+              </w:rPr>
+              <w:t>0.0134</w:t>
+            </w:r>
+          </w:p>
+        </w:tc>
+        <w:tc>
+          <w:tcPr>
+            <w:tcW w:w="1155" w:type="dxa"/>
+            <w:tcMar>
+              <w:top w:w="60" w:type="dxa"/>
+              <w:bottom w:w="60" w:type="dxa"/>
+            </w:tcMar>
+            <w:vAlign w:val="center"/>
+          </w:tcPr>
+          <w:p>
+            <w:pPr>
+              <w:spacing w:line="276" w:lineRule="auto"/>
+              <w:rPr>
+                <w:color w:val="000000" w:themeColor="text1"/>
+              </w:rPr>
+            </w:pPr>
+            <w:r>
+              <w:rPr>
+                <w:color w:val="000000" w:themeColor="text1"/>
+              </w:rPr>
+              <w:t>0.0779</w:t>
+            </w:r>
+          </w:p>
+        </w:tc>
+        <w:tc>
+          <w:tcPr>
+            <w:tcW w:w="2370" w:type="dxa"/>
+            <w:tcMar>
+              <w:top w:w="60" w:type="dxa"/>
+              <w:bottom w:w="60" w:type="dxa"/>
+            </w:tcMar>
+            <w:vAlign w:val="center"/>
+          </w:tcPr>
+          <w:p>
+            <w:pPr>
+              <w:spacing w:line="276" w:lineRule="auto"/>
+              <w:rPr>
+                <w:color w:val="000000" w:themeColor="text1"/>
+              </w:rPr>
+            </w:pPr>
+            <w:r>
+              <w:rPr>
+                <w:color w:val="000000" w:themeColor="text1"/>
+              </w:rPr>
+              <w:t>Underpredicts</w:t>
+            </w:r>
+          </w:p>
+        </w:tc>
+      </w:tr>
+      <w:tr>
+        <w:trPr>
+          <w:cantSplit/>
+          <w:jc w:val="center"/>
+        </w:trPr>
+        <w:tc>
+          <w:tcPr>
+            <w:tcW w:w="1245" w:type="dxa"/>
+            <w:tcMar>
+              <w:top w:w="60" w:type="dxa"/>
+              <w:bottom w:w="60" w:type="dxa"/>
+            </w:tcMar>
+            <w:vAlign w:val="center"/>
+          </w:tcPr>
+          <w:p>
+            <w:pPr>
+              <w:spacing w:line="276" w:lineRule="auto"/>
+              <w:rPr>
+                <w:color w:val="000000" w:themeColor="text1"/>
+              </w:rPr>
+            </w:pPr>
+            <w:r>
+              <w:rPr>
+                <w:color w:val="000000" w:themeColor="text1"/>
+              </w:rPr>
+              <w:t>1.6</w:t>
+            </w:r>
+          </w:p>
+        </w:tc>
+        <w:tc>
+          <w:tcPr>
+            <w:tcW w:w="1155" w:type="dxa"/>
+            <w:tcMar>
+              <w:top w:w="60" w:type="dxa"/>
+              <w:bottom w:w="60" w:type="dxa"/>
+            </w:tcMar>
+            <w:vAlign w:val="center"/>
+          </w:tcPr>
+          <w:p>
+            <w:pPr>
+              <w:spacing w:line="276" w:lineRule="auto"/>
+              <w:rPr>
+                <w:color w:val="000000" w:themeColor="text1"/>
+              </w:rPr>
+            </w:pPr>
+            <w:r>
+              <w:rPr>
+                <w:color w:val="000000" w:themeColor="text1"/>
+              </w:rPr>
+              <w:t>0.000204</w:t>
+            </w:r>
+          </w:p>
+        </w:tc>
+        <w:tc>
+          <w:tcPr>
+            <w:tcW w:w="1365" w:type="dxa"/>
+            <w:tcMar>
+              <w:top w:w="60" w:type="dxa"/>
+              <w:bottom w:w="60" w:type="dxa"/>
+            </w:tcMar>
+            <w:vAlign w:val="center"/>
+          </w:tcPr>
+          <w:p>
+            <w:pPr>
+              <w:spacing w:line="276" w:lineRule="auto"/>
+              <w:rPr>
+                <w:color w:val="000000" w:themeColor="text1"/>
+              </w:rPr>
+            </w:pPr>
+            <w:r>
+              <w:rPr>
+                <w:color w:val="000000" w:themeColor="text1"/>
+              </w:rPr>
+              <w:t>0.0827</w:t>
+            </w:r>
+          </w:p>
+        </w:tc>
+        <w:tc>
+          <w:tcPr>
+            <w:tcW w:w="1155" w:type="dxa"/>
+            <w:tcMar>
+              <w:top w:w="60" w:type="dxa"/>
+              <w:bottom w:w="60" w:type="dxa"/>
+            </w:tcMar>
+            <w:vAlign w:val="center"/>
+          </w:tcPr>
+          <w:p>
+            <w:pPr>
+              <w:spacing w:line="276" w:lineRule="auto"/>
+              <w:rPr>
+                <w:color w:val="000000" w:themeColor="text1"/>
+              </w:rPr>
+            </w:pPr>
+            <w:r>
+              <w:rPr>
+                <w:color w:val="000000" w:themeColor="text1"/>
+              </w:rPr>
+              <w:t>0.0825</w:t>
+            </w:r>
+          </w:p>
+        </w:tc>
+        <w:tc>
+          <w:tcPr>
+            <w:tcW w:w="2370" w:type="dxa"/>
+            <w:tcMar>
+              <w:top w:w="60" w:type="dxa"/>
+              <w:bottom w:w="60" w:type="dxa"/>
+            </w:tcMar>
+            <w:vAlign w:val="center"/>
+          </w:tcPr>
+          <w:p>
+            <w:pPr>
+              <w:spacing w:line="276" w:lineRule="auto"/>
+              <w:rPr>
+                <w:color w:val="000000" w:themeColor="text1"/>
+              </w:rPr>
+            </w:pPr>
+            <w:r>
+              <w:rPr>
+                <w:color w:val="000000" w:themeColor="text1"/>
+              </w:rPr>
+              <w:t>Overpredicts</w:t>
+            </w:r>
+          </w:p>
+        </w:tc>
+      </w:tr>
+    </w:tbl>
+    <w:p>
+      <w:pPr>
         <w:pStyle w:val="Heading2"/>
         <w:spacing w:line="276" w:lineRule="auto"/>
         <w:jc w:val="both"/>
@@ -4132,7 +4118,12 @@
           <w14:ligatures w14:val="none"/>
         </w:rPr>
       </w:pPr>
-      <w:r>
+    </w:p>
+    <w:p>
+      <w:pPr>
+        <w:pStyle w:val="Heading2"/>
+        <w:spacing w:line="276" w:lineRule="auto"/>
+        <w:jc w:val="both"/>
         <w:rPr>
           <w:rFonts w:ascii="Times New Roman" w:eastAsia="Times New Roman" w:hAnsi="Times New Roman" w:cs="Times New Roman"/>
           <w:color w:val="000000" w:themeColor="text1"/>
@@ -4142,93 +4133,8 @@
           <w:lang w:val="en-GB"/>
           <w14:ligatures w14:val="none"/>
         </w:rPr>
-        <w:lastRenderedPageBreak/>
-        <w:t>This demonstrates that the held-out model overpredicts the 1.6 Mars-radii scenario by 0.0825 BMF and underpredicts the 1.2 Mars-radii case by 0.0779 BMF. The local relationship has not been successfully learned because the errors are both substantial and have opposite signs. Therefore, a new instance in this region should not be believed just because its mass falls between sampled masses; instead, it should be verified with more SPH.</w:t>
-      </w:r>
-    </w:p>
-    <w:p>
-      <w:pPr>
-        <w:pStyle w:val="Heading2"/>
-        <w:spacing w:line="276" w:lineRule="auto"/>
-        <w:jc w:val="both"/>
-        <w:rPr>
-          <w:rFonts w:ascii="Times New Roman" w:hAnsi="Times New Roman" w:cs="Times New Roman"/>
-          <w:color w:val="000000" w:themeColor="text1"/>
-          <w:lang w:val="en-GB"/>
-        </w:rPr>
-      </w:pPr>
-      <w:r>
-        <w:rPr>
-          <w:rFonts w:ascii="Times New Roman" w:eastAsia="Times New Roman" w:hAnsi="Times New Roman" w:cs="Times New Roman"/>
-          <w:b/>
-          <w:bCs/>
-          <w:color w:val="000000" w:themeColor="text1"/>
-          <w:sz w:val="24"/>
-          <w:szCs w:val="24"/>
-          <w:lang w:val="en-GB"/>
-        </w:rPr>
-        <w:t>3.7 How the Model Supports SPH Decisions</w:t>
-      </w:r>
-    </w:p>
-    <w:p>
-      <w:pPr>
-        <w:spacing w:before="240" w:after="240" w:line="276" w:lineRule="auto"/>
-        <w:jc w:val="both"/>
-        <w:rPr>
-          <w:color w:val="000000" w:themeColor="text1"/>
-        </w:rPr>
-      </w:pPr>
-      <w:r>
-        <w:rPr>
-          <w:color w:val="000000" w:themeColor="text1"/>
-        </w:rPr>
-        <w:t>So,</w:t>
-      </w:r>
-      <w:r>
-        <w:rPr>
-          <w:color w:val="000000" w:themeColor="text1"/>
-        </w:rPr>
-        <w:t xml:space="preserve"> what is the model </w:t>
-      </w:r>
-      <w:r>
-        <w:rPr>
-          <w:color w:val="000000" w:themeColor="text1"/>
-        </w:rPr>
-        <w:t>actually useful</w:t>
-      </w:r>
-      <w:r>
-        <w:rPr>
-          <w:color w:val="000000" w:themeColor="text1"/>
-        </w:rPr>
-        <w:t xml:space="preserve"> for? The screening process separates disruption from retention. </w:t>
-      </w:r>
-      <w:r>
-        <w:rPr>
-          <w:color w:val="000000" w:themeColor="text1"/>
-        </w:rPr>
-        <w:t>While BMF calculates the amount of material that is still attached to Mars, the largest-remnant fraction indicates whether the asteroid is largely intact, breaks apart somewhat, or is seriously disturbed. Strong disruption can nevertheless result in primarily fleeing debris, which is why both outcomes are distinct.</w:t>
-      </w:r>
-    </w:p>
-    <w:p>
-      <w:pPr>
-        <w:spacing w:before="240" w:after="240" w:line="276" w:lineRule="auto"/>
-        <w:jc w:val="both"/>
-        <w:rPr>
-          <w:color w:val="000000" w:themeColor="text1"/>
-        </w:rPr>
-      </w:pPr>
-      <w:r>
-        <w:rPr>
-          <w:color w:val="000000" w:themeColor="text1"/>
-        </w:rPr>
-        <w:t>Therefore, only promising situations are prioritized for additional SPH simulation using the 10% BMF threshold. It does not guaranty the formation of a moon. Additionally, comparing the current combined mass of Phobos and Deimos with the expected bound mass is merely a minimal way to ensure that there is sufficient material. This model does not account for later processes such debris survival, orbital circularization, disk creation, and accretion into moons, which call for more physical modelling.</w:t>
-      </w:r>
-    </w:p>
-    <w:p>
-      <w:pPr>
-        <w:pStyle w:val="Heading1"/>
-        <w:spacing w:line="276" w:lineRule="auto"/>
-        <w:jc w:val="both"/>
+      </w:pPr>
+      <w:r>
         <w:rPr>
           <w:rFonts w:ascii="Times New Roman" w:eastAsia="Times New Roman" w:hAnsi="Times New Roman" w:cs="Times New Roman"/>
           <w:color w:val="000000" w:themeColor="text1"/>
@@ -4238,8 +4144,92 @@
           <w:lang w:val="en-GB"/>
           <w14:ligatures w14:val="none"/>
         </w:rPr>
-      </w:pPr>
-      <w:r>
+        <w:t>This demonstrates that the held-out model overpredicts the 1.6 Mars-radii scenario by 0.0825 BMF and underpredicts the 1.2 Mars-radii case by 0.0779 BMF. The local relationship has not been successfully learned because the errors are both substantial and have opposite signs. Therefore, a new instance in this region should not be believed just because its mass falls between sampled masses; instead, it should be verified with more SPH.</w:t>
+      </w:r>
+    </w:p>
+    <w:p>
+      <w:pPr>
+        <w:pStyle w:val="Heading2"/>
+        <w:spacing w:line="276" w:lineRule="auto"/>
+        <w:jc w:val="both"/>
+        <w:rPr>
+          <w:rFonts w:ascii="Times New Roman" w:hAnsi="Times New Roman" w:cs="Times New Roman"/>
+          <w:color w:val="000000" w:themeColor="text1"/>
+          <w:lang w:val="en-GB"/>
+        </w:rPr>
+      </w:pPr>
+      <w:r>
+        <w:rPr>
+          <w:rFonts w:ascii="Times New Roman" w:eastAsia="Times New Roman" w:hAnsi="Times New Roman" w:cs="Times New Roman"/>
+          <w:b/>
+          <w:bCs/>
+          <w:color w:val="000000" w:themeColor="text1"/>
+          <w:sz w:val="24"/>
+          <w:szCs w:val="24"/>
+          <w:lang w:val="en-GB"/>
+        </w:rPr>
+        <w:t>3.7 How the Model Supports SPH Decisions</w:t>
+      </w:r>
+    </w:p>
+    <w:p>
+      <w:pPr>
+        <w:spacing w:before="240" w:after="240" w:line="276" w:lineRule="auto"/>
+        <w:jc w:val="both"/>
+        <w:rPr>
+          <w:color w:val="000000" w:themeColor="text1"/>
+        </w:rPr>
+      </w:pPr>
+      <w:r>
+        <w:rPr>
+          <w:color w:val="000000" w:themeColor="text1"/>
+        </w:rPr>
+        <w:t>So,</w:t>
+      </w:r>
+      <w:r>
+        <w:rPr>
+          <w:color w:val="000000" w:themeColor="text1"/>
+        </w:rPr>
+        <w:t xml:space="preserve"> what is the model </w:t>
+      </w:r>
+      <w:r>
+        <w:rPr>
+          <w:color w:val="000000" w:themeColor="text1"/>
+        </w:rPr>
+        <w:t>actually useful</w:t>
+      </w:r>
+      <w:r>
+        <w:rPr>
+          <w:color w:val="000000" w:themeColor="text1"/>
+        </w:rPr>
+        <w:t xml:space="preserve"> for? The screening process separates disruption from retention. </w:t>
+      </w:r>
+      <w:r>
+        <w:rPr>
+          <w:color w:val="000000" w:themeColor="text1"/>
+        </w:rPr>
+        <w:t>While BMF calculates the amount of material that is still attached to Mars, the largest-remnant fraction indicates whether the asteroid is largely intact, breaks apart somewhat, or is seriously disturbed. Strong disruption can nevertheless result in primarily fleeing debris, which is why both outcomes are distinct.</w:t>
+      </w:r>
+    </w:p>
+    <w:p>
+      <w:pPr>
+        <w:spacing w:before="240" w:after="240" w:line="276" w:lineRule="auto"/>
+        <w:jc w:val="both"/>
+        <w:rPr>
+          <w:color w:val="000000" w:themeColor="text1"/>
+        </w:rPr>
+      </w:pPr>
+      <w:r>
+        <w:rPr>
+          <w:color w:val="000000" w:themeColor="text1"/>
+        </w:rPr>
+        <w:t>Therefore, only promising situations are prioritized for additional SPH simulation using the 10% BMF threshold. It does not guaranty the formation of a moon. Additionally, comparing the current combined mass of Phobos and Deimos with the expected bound mass is merely a minimal way to ensure that there is sufficient material. This model does not account for later processes such debris survival, orbital circularization, disk creation, and accretion into moons, which call for more physical modelling.</w:t>
+      </w:r>
+    </w:p>
+    <w:p>
+      <w:pPr>
+        <w:pStyle w:val="Heading1"/>
+        <w:spacing w:line="276" w:lineRule="auto"/>
+        <w:jc w:val="both"/>
         <w:rPr>
           <w:rFonts w:ascii="Times New Roman" w:eastAsia="Times New Roman" w:hAnsi="Times New Roman" w:cs="Times New Roman"/>
           <w:color w:val="000000" w:themeColor="text1"/>
@@ -4249,168 +4239,8 @@
           <w:lang w:val="en-GB"/>
           <w14:ligatures w14:val="none"/>
         </w:rPr>
-        <w:t>As a result, the prototype provides the breakup class, estimated Mars-bound mass, expected BMF, data coverage, and a recommendation about the use of SPH. While sparse, edge, transition, or doubtful instances should be examined with SPH, well-supported cases can be swiftly evaluated with ML.</w:t>
-      </w:r>
-    </w:p>
-    <w:p>
-      <w:pPr>
-        <w:pStyle w:val="Heading1"/>
-        <w:spacing w:before="0" w:line="276" w:lineRule="auto"/>
-        <w:jc w:val="both"/>
-        <w:rPr>
-          <w:rFonts w:ascii="Times New Roman" w:hAnsi="Times New Roman" w:cs="Times New Roman"/>
-          <w:color w:val="000000" w:themeColor="text1"/>
-          <w:lang w:val="en-GB"/>
-        </w:rPr>
-      </w:pPr>
-      <w:r>
-        <w:rPr>
-          <w:rFonts w:ascii="Times New Roman" w:eastAsia="Times New Roman" w:hAnsi="Times New Roman" w:cs="Times New Roman"/>
-          <w:b/>
-          <w:bCs/>
-          <w:color w:val="000000" w:themeColor="text1"/>
-          <w:sz w:val="28"/>
-          <w:szCs w:val="28"/>
-          <w:lang w:val="en-GB"/>
-        </w:rPr>
-        <w:t>4. Discussion</w:t>
-      </w:r>
-    </w:p>
-    <w:p>
-      <w:pPr>
-        <w:spacing w:before="360" w:after="80" w:line="276" w:lineRule="auto"/>
-        <w:jc w:val="both"/>
-      </w:pPr>
-      <w:r>
-        <w:t>The clearest periapsis and velocity trends are seen in the controlled experiments, while the matched comparisons show that the effects of spin and velocity vary with encounter conditions.</w:t>
-      </w:r>
-    </w:p>
-    <w:p>
-      <w:pPr>
-        <w:spacing w:before="360" w:after="80" w:line="276" w:lineRule="auto"/>
-        <w:jc w:val="both"/>
-        <w:rPr>
-          <w:color w:val="000000" w:themeColor="text1"/>
-        </w:rPr>
-      </w:pPr>
-      <w:r>
-        <w:t>The model learns these relationships from the SPH results rather than directly from physical equations. However, the behaviour i</w:t>
-      </w:r>
-      <w:r>
-        <w:t xml:space="preserve">n </w:t>
-      </w:r>
-      <w:r>
-        <w:t>Figure 3 is consistent with the other analyses. At larger periapsis, the controlled Gradient Boosting prediction remains slightly above the available SPH results before falling to approximately zero at about 2.5 Mars radii.</w:t>
-      </w:r>
-      <w:r>
-        <w:t xml:space="preserve"> </w:t>
-      </w:r>
-      <w:r>
-        <w:t>In Figure 1, most cases at larger periapsis are close to zero BMF, but one prograde-spin case still retains about 3-4% BMF at 2.6 Mars radii. Figure 4 also shows that the BMF differences associated with spin and velocity can become larger at higher periapsis, indicating that the outcome there depends on the full encounter conditions rather than periapsis alone. Figure 5 shows the same idea from the mass-periapsis coverage: at around 2.6 Mars radii, the 10</w:t>
-      </w:r>
-      <w:r>
-        <w:rPr>
-          <w:vertAlign w:val="superscript"/>
-        </w:rPr>
-        <w:t>19</w:t>
-      </w:r>
-      <w:r>
-        <w:t>kg bin has mean BMF = 0, while the 10</w:t>
-      </w:r>
-      <w:r>
-        <w:rPr>
-          <w:vertAlign w:val="superscript"/>
-        </w:rPr>
-        <w:t>20</w:t>
-      </w:r>
-      <w:r>
-        <w:t xml:space="preserve">kg bin still contains non-zero BMF cases. This does not prove that higher mass directly causes higher </w:t>
-      </w:r>
-      <w:r>
-        <w:lastRenderedPageBreak/>
-        <w:t>BMF, because the other encounter parameters also differ, but it shows that similar periapsis values can still produce different outcomes under different conditions.</w:t>
-      </w:r>
-    </w:p>
-    <w:p>
-      <w:pPr>
-        <w:spacing w:before="240" w:after="80" w:line="276" w:lineRule="auto"/>
-        <w:jc w:val="both"/>
-        <w:rPr>
-          <w:color w:val="000000" w:themeColor="text1"/>
-        </w:rPr>
-      </w:pPr>
-      <w:r>
-        <w:rPr>
-          <w:color w:val="000000" w:themeColor="text1"/>
-        </w:rPr>
-        <w:t>The primary physical outcome is that each parameter's impact is contingent upon the other encounter conditions. Within those parameters, periapsis determines the overall strength of the tidal encounter, encounter speed influences the duration of the contact and the favourable capture, and mass and spin alter the outcome. The most obvious periapsis and speed directions are found in the controlled experiments. The paired simulations demonstrate how periapsis and spin state affect the magnitude of the spin and velocity impacts.</w:t>
-      </w:r>
-    </w:p>
-    <w:p>
-      <w:pPr>
-        <w:spacing w:before="240" w:after="80" w:line="276" w:lineRule="auto"/>
-        <w:jc w:val="both"/>
-        <w:rPr>
-          <w:color w:val="000000" w:themeColor="text1"/>
-        </w:rPr>
-      </w:pPr>
-      <w:r>
-        <w:rPr>
-          <w:color w:val="000000" w:themeColor="text1"/>
-        </w:rPr>
-        <w:t>Though these associations are acquired from SPH outputs rather than from physical laws, the ML model replicates general trends and reveals interactions throughout the archive. As a result, matched comparisons, controlled tests, and group validation support interpretation but do not prove causality.</w:t>
-      </w:r>
-    </w:p>
-    <w:p>
-      <w:pPr>
-        <w:spacing w:before="240" w:after="80" w:line="276" w:lineRule="auto"/>
-        <w:jc w:val="both"/>
-        <w:rPr>
-          <w:color w:val="000000" w:themeColor="text1"/>
-        </w:rPr>
-      </w:pPr>
-      <w:r>
-        <w:rPr>
-          <w:color w:val="000000" w:themeColor="text1"/>
-        </w:rPr>
-        <w:t>As a result, ML's usefulness is restricted. It can swiftly filter well-supported input combinations, identify transition zones, uncover situations that yield promising retained mass, and indicate areas where more simulation could yield valuable information. Long-term debris survivability, precise fragment shapes and distributions from BMF alone, and forecasts for inadequately sampled input combinations cannot all be determined by it. This is evident from the 1019.5 kg example: when only two independent simulations support the local combination, being numerically inside the training range is insufficient.</w:t>
-      </w:r>
-    </w:p>
-    <w:p>
-      <w:pPr>
-        <w:spacing w:before="240" w:after="80" w:line="276" w:lineRule="auto"/>
-        <w:jc w:val="both"/>
-        <w:rPr>
-          <w:color w:val="000000" w:themeColor="text1"/>
-        </w:rPr>
-      </w:pPr>
-      <w:r>
-        <w:rPr>
-          <w:color w:val="000000" w:themeColor="text1"/>
-        </w:rPr>
-        <w:t>Different questions are addressed by the matching and ablation analysis. Although matching cases demonstrate that spin or velocity can become more significant under specific encounter settings, periapsis is generally the strongest.</w:t>
-      </w:r>
-    </w:p>
-    <w:p>
-      <w:pPr>
-        <w:spacing w:before="240" w:after="80" w:line="276" w:lineRule="auto"/>
-        <w:jc w:val="both"/>
-        <w:rPr>
-          <w:color w:val="000000" w:themeColor="text1"/>
-        </w:rPr>
-      </w:pPr>
-      <w:r>
-        <w:rPr>
-          <w:color w:val="000000" w:themeColor="text1"/>
-        </w:rPr>
-        <w:t>Compared to BMF, fragmentation requires more prudence. Strong fragmentation is possible but not guaranteed by close periapsis, and the number of pieces is directly altered by the FoF connecting length. Therefore, rather than taking the place of BMF, fragment count and largest-remnant metrics offer additional information. Strong breakup does not always result in much bound debris, therefore the procedure separates breakup severity from Mars-bound retention.</w:t>
-      </w:r>
-    </w:p>
-    <w:p>
-      <w:pPr>
-        <w:pStyle w:val="Heading1"/>
-        <w:spacing w:before="240" w:line="276" w:lineRule="auto"/>
-        <w:jc w:val="both"/>
+      </w:pPr>
+      <w:r>
         <w:rPr>
           <w:rFonts w:ascii="Times New Roman" w:eastAsia="Times New Roman" w:hAnsi="Times New Roman" w:cs="Times New Roman"/>
           <w:color w:val="000000" w:themeColor="text1"/>
@@ -4420,8 +4250,182 @@
           <w:lang w:val="en-GB"/>
           <w14:ligatures w14:val="none"/>
         </w:rPr>
-      </w:pPr>
-      <w:r>
+        <w:lastRenderedPageBreak/>
+        <w:t>As a result, the prototype provides the breakup class, estimated Mars-bound mass, expected BMF, data coverage, and a recommendation about the use of SPH. While sparse, edge, transition, or doubtful instances should be examined with SPH, well-supported cases can be swiftly evaluated with ML.</w:t>
+      </w:r>
+    </w:p>
+    <w:p>
+      <w:pPr>
+        <w:pStyle w:val="Heading1"/>
+        <w:spacing w:before="0" w:line="276" w:lineRule="auto"/>
+        <w:jc w:val="both"/>
+        <w:rPr>
+          <w:rFonts w:ascii="Times New Roman" w:eastAsia="Times New Roman" w:hAnsi="Times New Roman" w:cs="Times New Roman"/>
+          <w:b/>
+          <w:bCs/>
+          <w:color w:val="000000" w:themeColor="text1"/>
+          <w:sz w:val="28"/>
+          <w:szCs w:val="28"/>
+          <w:lang w:val="en-GB"/>
+        </w:rPr>
+      </w:pPr>
+    </w:p>
+    <w:p>
+      <w:pPr>
+        <w:pStyle w:val="Heading1"/>
+        <w:spacing w:before="0" w:line="276" w:lineRule="auto"/>
+        <w:jc w:val="both"/>
+        <w:rPr>
+          <w:rFonts w:ascii="Times New Roman" w:hAnsi="Times New Roman" w:cs="Times New Roman"/>
+          <w:color w:val="000000" w:themeColor="text1"/>
+          <w:lang w:val="en-GB"/>
+        </w:rPr>
+      </w:pPr>
+      <w:r>
+        <w:rPr>
+          <w:rFonts w:ascii="Times New Roman" w:eastAsia="Times New Roman" w:hAnsi="Times New Roman" w:cs="Times New Roman"/>
+          <w:b/>
+          <w:bCs/>
+          <w:color w:val="000000" w:themeColor="text1"/>
+          <w:sz w:val="28"/>
+          <w:szCs w:val="28"/>
+          <w:lang w:val="en-GB"/>
+        </w:rPr>
+        <w:t>4. Discussion</w:t>
+      </w:r>
+    </w:p>
+    <w:p>
+      <w:pPr>
+        <w:spacing w:before="360" w:after="80" w:line="276" w:lineRule="auto"/>
+        <w:jc w:val="both"/>
+      </w:pPr>
+      <w:r>
+        <w:t>The clearest periapsis and velocity trends are seen in the controlled experiments, while the matched comparisons show that the effects of spin and velocity vary with encounter conditions.</w:t>
+      </w:r>
+      <w:r>
+        <w:t xml:space="preserve"> </w:t>
+      </w:r>
+      <w:r>
+        <w:t>The model learns these relationships from the SPH results rather than directly from physical equations. However, the behaviour i</w:t>
+      </w:r>
+      <w:r>
+        <w:t xml:space="preserve">n </w:t>
+      </w:r>
+      <w:r>
+        <w:t>Figure 3 is consistent with the other analyses. At larger periapsis, the controlled Gradient Boosting prediction remains slightly above the available SPH results before falling to approximately zero at about 2.5 Mars radii.</w:t>
+      </w:r>
+      <w:r>
+        <w:t xml:space="preserve"> </w:t>
+      </w:r>
+      <w:r>
+        <w:t>In Figure 1, most cases at larger periapsis are close to zero BMF, but one prograde-spin case still retains about 3-4% BMF at 2.6 Mars radii. Figure 4 also shows that the BMF differences associated with spin and velocity can become larger at higher periapsis, indicating that the outcome there depends on the full encounter conditions rather than periapsis alone. Figure 5 shows the same idea from the mass-periapsis coverage: at around 2.6 Mars radii, the 10</w:t>
+      </w:r>
+      <w:r>
+        <w:rPr>
+          <w:vertAlign w:val="superscript"/>
+        </w:rPr>
+        <w:t>19</w:t>
+      </w:r>
+      <w:r>
+        <w:t>kg bin has mean BMF = 0, while the 10</w:t>
+      </w:r>
+      <w:r>
+        <w:rPr>
+          <w:vertAlign w:val="superscript"/>
+        </w:rPr>
+        <w:t>20</w:t>
+      </w:r>
+      <w:r>
+        <w:t>kg bin still contains non-zero BMF cases. This does not prove that higher mass directly causes higher BMF, because the other encounter parameters also differ, but it shows that similar periapsis values can still produce different outcomes under different conditions.</w:t>
+      </w:r>
+    </w:p>
+    <w:p>
+      <w:pPr>
+        <w:spacing w:before="240" w:after="80" w:line="276" w:lineRule="auto"/>
+        <w:jc w:val="both"/>
+        <w:rPr>
+          <w:color w:val="000000" w:themeColor="text1"/>
+        </w:rPr>
+      </w:pPr>
+      <w:r>
+        <w:rPr>
+          <w:color w:val="000000" w:themeColor="text1"/>
+        </w:rPr>
+        <w:t>The primary physical outcome is that each parameter's impact is contingent upon the other encounter conditions. Within those parameters, periapsis determines the overall strength of the tidal encounter, encounter speed influences the duration of the contact and the favourable capture, and mass and spin alter the outcome. The most obvious periapsis and speed directions are found in the controlled experiments. The paired simulations demonstrate how periapsis and spin state affect the magnitude of the spin and velocity impacts.</w:t>
+      </w:r>
+    </w:p>
+    <w:p>
+      <w:pPr>
+        <w:spacing w:before="240" w:after="80" w:line="276" w:lineRule="auto"/>
+        <w:jc w:val="both"/>
+        <w:rPr>
+          <w:color w:val="000000" w:themeColor="text1"/>
+        </w:rPr>
+      </w:pPr>
+      <w:r>
+        <w:rPr>
+          <w:color w:val="000000" w:themeColor="text1"/>
+        </w:rPr>
+        <w:t>Though these associations are acquired from SPH outputs rather than from physical laws, the ML model replicates general trends and reveals interactions throughout the archive. As a result, matched comparisons, controlled tests, and group validation support interpretation but do not prove causality.</w:t>
+      </w:r>
+    </w:p>
+    <w:p>
+      <w:pPr>
+        <w:spacing w:before="240" w:after="80" w:line="276" w:lineRule="auto"/>
+        <w:jc w:val="both"/>
+        <w:rPr>
+          <w:color w:val="000000" w:themeColor="text1"/>
+        </w:rPr>
+      </w:pPr>
+      <w:r>
+        <w:rPr>
+          <w:color w:val="000000" w:themeColor="text1"/>
+        </w:rPr>
+        <w:t xml:space="preserve">As a result, ML's usefulness is restricted. It can swiftly filter well-supported input combinations, identify transition zones, uncover situations that yield promising retained mass, and indicate areas where more simulation could yield valuable information. Long-term debris survivability, precise fragment shapes and distributions from BMF alone, and forecasts for inadequately sampled input combinations cannot all be determined by it. This is evident from the 1019.5 kg example: when </w:t>
+      </w:r>
+      <w:r>
+        <w:rPr>
+          <w:color w:val="000000" w:themeColor="text1"/>
+        </w:rPr>
+        <w:lastRenderedPageBreak/>
+        <w:t>only two independent simulations support the local combination, being numerically inside the training range is insufficient.</w:t>
+      </w:r>
+    </w:p>
+    <w:p>
+      <w:pPr>
+        <w:spacing w:before="240" w:after="80" w:line="276" w:lineRule="auto"/>
+        <w:jc w:val="both"/>
+        <w:rPr>
+          <w:color w:val="000000" w:themeColor="text1"/>
+        </w:rPr>
+      </w:pPr>
+      <w:r>
+        <w:rPr>
+          <w:color w:val="000000" w:themeColor="text1"/>
+        </w:rPr>
+        <w:t>Different questions are addressed by the matching and ablation analysis. Although matching cases demonstrate that spin or velocity can become more significant under specific encounter settings, periapsis is generally the strongest.</w:t>
+      </w:r>
+    </w:p>
+    <w:p>
+      <w:pPr>
+        <w:spacing w:before="240" w:after="80" w:line="276" w:lineRule="auto"/>
+        <w:jc w:val="both"/>
+        <w:rPr>
+          <w:color w:val="000000" w:themeColor="text1"/>
+        </w:rPr>
+      </w:pPr>
+      <w:r>
+        <w:rPr>
+          <w:color w:val="000000" w:themeColor="text1"/>
+        </w:rPr>
+        <w:t>Compared to BMF, fragmentation requires more prudence. Strong fragmentation is possible but not guaranteed by close periapsis, and the number of pieces is directly altered by the FoF connecting length. Therefore, rather than taking the place of BMF, fragment count and largest-remnant metrics offer additional information. Strong breakup does not always result in much bound debris, therefore the procedure separates breakup severity from Mars-bound retention.</w:t>
+      </w:r>
+    </w:p>
+    <w:p>
+      <w:pPr>
+        <w:pStyle w:val="Heading1"/>
+        <w:spacing w:before="240" w:line="276" w:lineRule="auto"/>
+        <w:jc w:val="both"/>
         <w:rPr>
           <w:rFonts w:ascii="Times New Roman" w:eastAsia="Times New Roman" w:hAnsi="Times New Roman" w:cs="Times New Roman"/>
           <w:color w:val="000000" w:themeColor="text1"/>
@@ -4431,341 +4435,8 @@
           <w:lang w:val="en-GB"/>
           <w14:ligatures w14:val="none"/>
         </w:rPr>
-        <w:lastRenderedPageBreak/>
-        <w:t>All things considered, the ML model is a quick screening method for the current SPH archive. Poorly sampled cases, transition regions, and issues requiring certain fragment attributes still require SPH.</w:t>
-      </w:r>
-    </w:p>
-    <w:p>
-      <w:pPr>
-        <w:pStyle w:val="Heading1"/>
-        <w:spacing w:before="240" w:line="276" w:lineRule="auto"/>
-        <w:jc w:val="both"/>
-        <w:rPr>
-          <w:rFonts w:ascii="Times New Roman" w:hAnsi="Times New Roman" w:cs="Times New Roman"/>
-          <w:color w:val="000000" w:themeColor="text1"/>
-          <w:lang w:val="en-GB"/>
-        </w:rPr>
-      </w:pPr>
-      <w:r>
-        <w:rPr>
-          <w:rFonts w:ascii="Times New Roman" w:eastAsia="Times New Roman" w:hAnsi="Times New Roman" w:cs="Times New Roman"/>
-          <w:b/>
-          <w:bCs/>
-          <w:color w:val="000000" w:themeColor="text1"/>
-          <w:sz w:val="28"/>
-          <w:szCs w:val="28"/>
-          <w:lang w:val="en-GB"/>
-        </w:rPr>
-        <w:t>5. Conclusions, Limitations and Future Work</w:t>
-      </w:r>
-    </w:p>
-    <w:p>
-      <w:pPr>
-        <w:pStyle w:val="Heading2"/>
-        <w:spacing w:before="240" w:line="276" w:lineRule="auto"/>
-        <w:jc w:val="both"/>
-        <w:rPr>
-          <w:rFonts w:ascii="Times New Roman" w:hAnsi="Times New Roman" w:cs="Times New Roman"/>
-          <w:color w:val="000000" w:themeColor="text1"/>
-          <w:lang w:val="en-GB"/>
-        </w:rPr>
-      </w:pPr>
-      <w:r>
-        <w:rPr>
-          <w:rFonts w:ascii="Times New Roman" w:eastAsia="Times New Roman" w:hAnsi="Times New Roman" w:cs="Times New Roman"/>
-          <w:b/>
-          <w:bCs/>
-          <w:color w:val="000000" w:themeColor="text1"/>
-          <w:sz w:val="24"/>
-          <w:szCs w:val="24"/>
-          <w:lang w:val="en-GB"/>
-        </w:rPr>
-        <w:t>5.1 Conclusions and Answers to the Research Questions</w:t>
-      </w:r>
-    </w:p>
-    <w:p>
-      <w:pPr>
-        <w:spacing w:before="240" w:line="276" w:lineRule="auto"/>
-        <w:jc w:val="both"/>
-        <w:rPr>
-          <w:color w:val="000000" w:themeColor="text1"/>
-        </w:rPr>
-      </w:pPr>
-      <w:r>
-        <w:rPr>
-          <w:color w:val="000000" w:themeColor="text1"/>
-        </w:rPr>
-        <w:t>This study sought to determine which inputs are most important for fragment creation and retained debris, how orbital and physical characteristics affect disruption and bound retention, and whether machine learning (ML) can forecast outcomes while indicating when its predictions should be believed. Below is a summary of the responses.</w:t>
-      </w:r>
-    </w:p>
-    <w:p>
-      <w:pPr>
-        <w:spacing w:before="240" w:line="276" w:lineRule="auto"/>
-        <w:jc w:val="both"/>
-        <w:rPr>
-          <w:color w:val="000000" w:themeColor="text1"/>
-        </w:rPr>
-      </w:pPr>
-      <w:r>
-        <w:rPr>
-          <w:b/>
-          <w:bCs/>
-          <w:color w:val="000000" w:themeColor="text1"/>
-        </w:rPr>
-        <w:t xml:space="preserve">Q1. How do orbital and physical parameters </w:t>
-      </w:r>
-      <w:r>
-        <w:rPr>
-          <w:b/>
-          <w:bCs/>
-          <w:color w:val="000000" w:themeColor="text1"/>
-        </w:rPr>
-        <w:t>affect disruption and bound retention</w:t>
-      </w:r>
-      <w:r>
-        <w:rPr>
-          <w:b/>
-          <w:bCs/>
-          <w:color w:val="000000" w:themeColor="text1"/>
-        </w:rPr>
-        <w:t xml:space="preserve">? </w:t>
-      </w:r>
-      <w:r>
-        <w:rPr>
-          <w:color w:val="000000" w:themeColor="text1"/>
-        </w:rPr>
-        <w:t xml:space="preserve">Although the impact varies depending on the other inputs, closer and slower contacts typically retain more debris. In the representative controlled test, </w:t>
-      </w:r>
-      <w:r>
-        <w:rPr>
-          <w:color w:val="000000" w:themeColor="text1"/>
-        </w:rPr>
-        <w:t>predicted BMF generally decreases from roughly 27% at 1.2 Mars radii to approximately zero by about 2.5 Mars radii as periapsis increases. A similarly clear decline occurs as encounter speed increases, from roughly 25% at low velocity to approximately zero by about 1.2 km/s. Rather than being universal thresholds, these reactions are condition specific. Mass and spin alter the outcome, speed alters the encounter and capture conditions, and periapsis regulates tidal power.</w:t>
-      </w:r>
-    </w:p>
-    <w:p>
-      <w:pPr>
-        <w:spacing w:before="240" w:line="276" w:lineRule="auto"/>
-        <w:jc w:val="both"/>
-        <w:rPr>
-          <w:color w:val="000000" w:themeColor="text1"/>
-        </w:rPr>
-      </w:pPr>
-      <w:r>
-        <w:rPr>
-          <w:b/>
-          <w:bCs/>
-          <w:color w:val="000000" w:themeColor="text1"/>
-        </w:rPr>
-        <w:t>Q2. Which</w:t>
-      </w:r>
-      <w:r>
-        <w:rPr>
-          <w:color w:val="000000" w:themeColor="text1"/>
-        </w:rPr>
-        <w:t xml:space="preserve"> </w:t>
-      </w:r>
-      <w:r>
-        <w:rPr>
-          <w:b/>
-          <w:bCs/>
-          <w:color w:val="000000" w:themeColor="text1"/>
-        </w:rPr>
-        <w:t xml:space="preserve">inputs matter most for fragment formation and retained debris? </w:t>
-      </w:r>
-      <w:r>
-        <w:rPr>
-          <w:color w:val="000000" w:themeColor="text1"/>
-        </w:rPr>
-        <w:t xml:space="preserve">There is no single universal ranking under all encounter conditions. For BMF, the tuned Gradient Boosting input-removal analysis identifies periapsis as the strongest overall physical input, with its removal causing the largest decrease in performance (ΔR² = </w:t>
-      </w:r>
-      <w:r>
-        <w:rPr>
-          <w:color w:val="000000" w:themeColor="text1"/>
-        </w:rPr>
-        <w:t>-</w:t>
-      </w:r>
-      <w:r>
-        <w:rPr>
-          <w:color w:val="000000" w:themeColor="text1"/>
-        </w:rPr>
-        <w:t>0.574), followed by spin (</w:t>
-      </w:r>
-      <w:r>
-        <w:rPr>
-          <w:color w:val="000000" w:themeColor="text1"/>
-        </w:rPr>
-        <w:t>-</w:t>
-      </w:r>
-      <w:r>
-        <w:rPr>
-          <w:color w:val="000000" w:themeColor="text1"/>
-        </w:rPr>
-        <w:t>0.316) and velocity (</w:t>
-      </w:r>
-      <w:r>
-        <w:rPr>
-          <w:color w:val="000000" w:themeColor="text1"/>
-        </w:rPr>
-        <w:t>-</w:t>
-      </w:r>
-      <w:r>
-        <w:rPr>
-          <w:color w:val="000000" w:themeColor="text1"/>
-        </w:rPr>
-        <w:t>0.296). However, matched cases show that their relative importance changes locally. Changing spin produces a BMF range of roughly 0.06</w:t>
-      </w:r>
-      <w:r>
-        <w:rPr>
-          <w:color w:val="000000" w:themeColor="text1"/>
-        </w:rPr>
-        <w:t>-</w:t>
-      </w:r>
-      <w:r>
-        <w:rPr>
-          <w:color w:val="000000" w:themeColor="text1"/>
-        </w:rPr>
-        <w:t>0.09 below 1.5 Mars radii and up to roughly 0.24 at larger periapsis, while velocity can produce similarly large differences under other conditions. Fragmentation requires separate interpretation because fragment count depends partly on the FoF definition and BMF measures retained debris rather than breakup severity. Because BMF measures retained debris rather than breakup severity, fragmentation is considered separately using fragment count and the largest-remnant fraction.</w:t>
-      </w:r>
-    </w:p>
-    <w:p>
-      <w:pPr>
-        <w:spacing w:before="240" w:line="276" w:lineRule="auto"/>
-        <w:jc w:val="both"/>
-        <w:rPr>
-          <w:color w:val="000000" w:themeColor="text1"/>
-        </w:rPr>
-      </w:pPr>
-      <w:r>
-        <w:rPr>
-          <w:b/>
-          <w:bCs/>
-          <w:color w:val="000000" w:themeColor="text1"/>
-        </w:rPr>
-        <w:t xml:space="preserve">Q3. </w:t>
-      </w:r>
-      <w:r>
-        <w:rPr>
-          <w:b/>
-          <w:bCs/>
-          <w:color w:val="000000" w:themeColor="text1"/>
-        </w:rPr>
-        <w:t>Can machine-learning models predict outcomes within the sampled data while showing when a prediction should or should not be trusted</w:t>
-      </w:r>
-      <w:r>
-        <w:rPr>
-          <w:b/>
-          <w:bCs/>
-          <w:color w:val="000000" w:themeColor="text1"/>
-        </w:rPr>
-        <w:t>?</w:t>
-      </w:r>
-      <w:r>
-        <w:rPr>
-          <w:color w:val="000000" w:themeColor="text1"/>
-        </w:rPr>
-        <w:t xml:space="preserve"> </w:t>
-      </w:r>
-      <w:r>
-        <w:rPr>
-          <w:color w:val="000000" w:themeColor="text1"/>
-        </w:rPr>
-        <w:t xml:space="preserve">Yes, in cases where the SPH archive supports comparable input combinations. The primary tuned Gradient Boosting model using the original simulation inputs obtains a grouped cross-validated R² of 0.9234, MAE of 0.0159, and RMSE of 0.0257. Adding physics-derived features produces only a small further change to R² = 0.9240 and MAE = 0.0155, with RMSE unchanged at 0.0257, so the simpler tuned model is retained. Performance is not equally dependable everywhere, however. Despite the input values falling within the numerical training ranges, held-out errors increase to roughly 0.08 BMF, or 8 </w:t>
-      </w:r>
-      <w:r>
-        <w:rPr>
-          <w:color w:val="000000" w:themeColor="text1"/>
-        </w:rPr>
-        <w:lastRenderedPageBreak/>
-        <w:t>percentage points, in the sparsely sampled 10</w:t>
-      </w:r>
-      <w:r>
-        <w:rPr>
-          <w:color w:val="000000" w:themeColor="text1"/>
-          <w:vertAlign w:val="superscript"/>
-        </w:rPr>
-        <w:t>19.5</w:t>
-      </w:r>
-      <w:r>
-        <w:rPr>
-          <w:color w:val="000000" w:themeColor="text1"/>
-        </w:rPr>
-        <w:t xml:space="preserve"> kg example. This demonstrates that being within the overall input range is insufficient for a reliable prediction; comparable SPH cases must also exist nearby in the sampled parameter space. Thus, ML can support rapid screening and simulation prioritisation, while sparse, edge, transition, or poorly supported cases still require additional SPH investigation.</w:t>
-      </w:r>
-    </w:p>
-    <w:p>
-      <w:pPr>
-        <w:spacing w:before="240" w:line="276" w:lineRule="auto"/>
-        <w:jc w:val="both"/>
-        <w:rPr>
-          <w:color w:val="000000" w:themeColor="text1"/>
-        </w:rPr>
-      </w:pPr>
-      <w:r>
-        <w:rPr>
-          <w:color w:val="000000" w:themeColor="text1"/>
-        </w:rPr>
-        <w:t>Overall, the project shows that tidal-disruption outcomes depend on interacting physical conditions rather than one universal ranking of parameters. Machine learning makes the existing SPH archive faster to explore, shows where predictions are well supported, and highlights where new simulations would be most useful. It complements SPH rather than replacing the simulation physics.</w:t>
-      </w:r>
-    </w:p>
-    <w:p>
-      <w:pPr>
-        <w:pStyle w:val="Heading2"/>
-        <w:spacing w:before="240" w:line="276" w:lineRule="auto"/>
-        <w:rPr>
-          <w:rFonts w:ascii="Times New Roman" w:hAnsi="Times New Roman" w:cs="Times New Roman"/>
-          <w:color w:val="000000" w:themeColor="text1"/>
-          <w:lang w:val="en-GB"/>
-        </w:rPr>
-      </w:pPr>
-      <w:r>
-        <w:rPr>
-          <w:rFonts w:ascii="Times New Roman" w:eastAsia="Times New Roman" w:hAnsi="Times New Roman" w:cs="Times New Roman"/>
-          <w:b/>
-          <w:bCs/>
-          <w:color w:val="000000" w:themeColor="text1"/>
-          <w:sz w:val="24"/>
-          <w:szCs w:val="24"/>
-          <w:lang w:val="en-GB"/>
-        </w:rPr>
-        <w:t>5.2 Limitations</w:t>
-      </w:r>
-    </w:p>
-    <w:p>
-      <w:pPr>
-        <w:spacing w:before="240" w:line="276" w:lineRule="auto"/>
-        <w:jc w:val="both"/>
-        <w:rPr>
-          <w:color w:val="000000" w:themeColor="text1"/>
-        </w:rPr>
-      </w:pPr>
-      <w:r>
-        <w:rPr>
-          <w:color w:val="000000" w:themeColor="text1"/>
-        </w:rPr>
-        <w:t>The simulation archive's short size and uneven sampling are its primary drawbacks. A single SPH simulation can be analysed in multiple ways, hence many rows are not independent physical evidence. Although it is unable to produce missing simulations, group validation keeps the test score from becoming unduly optimistic. Even when each individual input value falls between its reported minimum and maximum, predictions are still unclear for combinations that are poorly sampled, close to the data's edges, or outside the combinations observed during training.</w:t>
-      </w:r>
-    </w:p>
-    <w:p>
-      <w:pPr>
-        <w:spacing w:before="240" w:line="276" w:lineRule="auto"/>
-        <w:jc w:val="both"/>
-        <w:rPr>
-          <w:color w:val="000000" w:themeColor="text1"/>
-        </w:rPr>
-      </w:pPr>
-      <w:r>
-        <w:rPr>
-          <w:color w:val="000000" w:themeColor="text1"/>
-        </w:rPr>
-        <w:t xml:space="preserve">Additionally, instead of solving the physical laws directly, the ML model learns patterns from SPH results. It does not follow the subsequent orbits of fragments and does not impose conservation of mass, momentum, energy, or angular momentum. Therefore, a reliable BMF prediction cannot determine whether debris accumulates into moons, forms a disk, or endures for a long time. Additionally, fragment measurements are more sensitive to the FoF connecting length employed in post-processing and are noisier than BMF. </w:t>
-      </w:r>
-    </w:p>
-    <w:p>
-      <w:pPr>
-        <w:pStyle w:val="Heading2"/>
-        <w:spacing w:before="240" w:line="276" w:lineRule="auto"/>
-        <w:jc w:val="both"/>
+      </w:pPr>
+      <w:r>
         <w:rPr>
           <w:rFonts w:ascii="Times New Roman" w:eastAsia="Times New Roman" w:hAnsi="Times New Roman" w:cs="Times New Roman"/>
           <w:color w:val="000000" w:themeColor="text1"/>
@@ -4775,8 +4446,340 @@
           <w:lang w:val="en-GB"/>
           <w14:ligatures w14:val="none"/>
         </w:rPr>
-      </w:pPr>
-      <w:r>
+        <w:t>All things considered, the ML model is a quick screening method for the current SPH archive. Poorly sampled cases, transition regions, and issues requiring certain fragment attributes still require SPH.</w:t>
+      </w:r>
+    </w:p>
+    <w:p>
+      <w:pPr>
+        <w:pStyle w:val="Heading1"/>
+        <w:spacing w:before="240" w:line="276" w:lineRule="auto"/>
+        <w:jc w:val="both"/>
+        <w:rPr>
+          <w:rFonts w:ascii="Times New Roman" w:hAnsi="Times New Roman" w:cs="Times New Roman"/>
+          <w:color w:val="000000" w:themeColor="text1"/>
+          <w:lang w:val="en-GB"/>
+        </w:rPr>
+      </w:pPr>
+      <w:r>
+        <w:rPr>
+          <w:rFonts w:ascii="Times New Roman" w:eastAsia="Times New Roman" w:hAnsi="Times New Roman" w:cs="Times New Roman"/>
+          <w:b/>
+          <w:bCs/>
+          <w:color w:val="000000" w:themeColor="text1"/>
+          <w:sz w:val="28"/>
+          <w:szCs w:val="28"/>
+          <w:lang w:val="en-GB"/>
+        </w:rPr>
+        <w:t>5. Conclusions, Limitations and Future Work</w:t>
+      </w:r>
+    </w:p>
+    <w:p>
+      <w:pPr>
+        <w:pStyle w:val="Heading2"/>
+        <w:spacing w:before="240" w:line="276" w:lineRule="auto"/>
+        <w:jc w:val="both"/>
+        <w:rPr>
+          <w:rFonts w:ascii="Times New Roman" w:hAnsi="Times New Roman" w:cs="Times New Roman"/>
+          <w:color w:val="000000" w:themeColor="text1"/>
+          <w:lang w:val="en-GB"/>
+        </w:rPr>
+      </w:pPr>
+      <w:r>
+        <w:rPr>
+          <w:rFonts w:ascii="Times New Roman" w:eastAsia="Times New Roman" w:hAnsi="Times New Roman" w:cs="Times New Roman"/>
+          <w:b/>
+          <w:bCs/>
+          <w:color w:val="000000" w:themeColor="text1"/>
+          <w:sz w:val="24"/>
+          <w:szCs w:val="24"/>
+          <w:lang w:val="en-GB"/>
+        </w:rPr>
+        <w:t>5.1 Conclusions and Answers to the Research Questions</w:t>
+      </w:r>
+    </w:p>
+    <w:p>
+      <w:pPr>
+        <w:spacing w:before="240" w:line="276" w:lineRule="auto"/>
+        <w:jc w:val="both"/>
+        <w:rPr>
+          <w:color w:val="000000" w:themeColor="text1"/>
+        </w:rPr>
+      </w:pPr>
+      <w:r>
+        <w:rPr>
+          <w:color w:val="000000" w:themeColor="text1"/>
+        </w:rPr>
+        <w:t>This study sought to determine which inputs are most important for fragment creation and retained debris, how orbital and physical characteristics affect disruption and bound retention, and whether machine learning (ML) can forecast outcomes while indicating when its predictions should be believed. Below is a summary of the responses.</w:t>
+      </w:r>
+    </w:p>
+    <w:p>
+      <w:pPr>
+        <w:spacing w:before="240" w:line="276" w:lineRule="auto"/>
+        <w:jc w:val="both"/>
+        <w:rPr>
+          <w:color w:val="000000" w:themeColor="text1"/>
+        </w:rPr>
+      </w:pPr>
+      <w:r>
+        <w:rPr>
+          <w:b/>
+          <w:bCs/>
+          <w:color w:val="000000" w:themeColor="text1"/>
+        </w:rPr>
+        <w:t xml:space="preserve">Q1. How do orbital and physical parameters </w:t>
+      </w:r>
+      <w:r>
+        <w:rPr>
+          <w:b/>
+          <w:bCs/>
+          <w:color w:val="000000" w:themeColor="text1"/>
+        </w:rPr>
+        <w:t>affect disruption and bound retention</w:t>
+      </w:r>
+      <w:r>
+        <w:rPr>
+          <w:b/>
+          <w:bCs/>
+          <w:color w:val="000000" w:themeColor="text1"/>
+        </w:rPr>
+        <w:t xml:space="preserve">? </w:t>
+      </w:r>
+      <w:r>
+        <w:rPr>
+          <w:color w:val="000000" w:themeColor="text1"/>
+        </w:rPr>
+        <w:t xml:space="preserve">Although the impact varies depending on the other inputs, closer and slower contacts typically retain more debris. In the representative controlled test, </w:t>
+      </w:r>
+      <w:r>
+        <w:rPr>
+          <w:color w:val="000000" w:themeColor="text1"/>
+        </w:rPr>
+        <w:t>predicted BMF generally decreases from roughly 27% at 1.2 Mars radii to approximately zero by about 2.5 Mars radii as periapsis increases. A similarly clear decline occurs as encounter speed increases, from roughly 25% at low velocity to approximately zero by about 1.2 km/s. Rather than being universal thresholds, these reactions are condition specific. Mass and spin alter the outcome, speed alters the encounter and capture conditions, and periapsis regulates tidal power.</w:t>
+      </w:r>
+    </w:p>
+    <w:p>
+      <w:pPr>
+        <w:spacing w:before="240" w:line="276" w:lineRule="auto"/>
+        <w:jc w:val="both"/>
+        <w:rPr>
+          <w:color w:val="000000" w:themeColor="text1"/>
+        </w:rPr>
+      </w:pPr>
+      <w:r>
+        <w:rPr>
+          <w:b/>
+          <w:bCs/>
+          <w:color w:val="000000" w:themeColor="text1"/>
+        </w:rPr>
+        <w:t>Q2. Which</w:t>
+      </w:r>
+      <w:r>
+        <w:rPr>
+          <w:color w:val="000000" w:themeColor="text1"/>
+        </w:rPr>
+        <w:t xml:space="preserve"> </w:t>
+      </w:r>
+      <w:r>
+        <w:rPr>
+          <w:b/>
+          <w:bCs/>
+          <w:color w:val="000000" w:themeColor="text1"/>
+        </w:rPr>
+        <w:t xml:space="preserve">inputs matter most for fragment formation and retained debris? </w:t>
+      </w:r>
+      <w:r>
+        <w:rPr>
+          <w:color w:val="000000" w:themeColor="text1"/>
+        </w:rPr>
+        <w:t xml:space="preserve">There is no single universal ranking under all encounter conditions. For BMF, the tuned Gradient Boosting input-removal analysis identifies periapsis as the strongest overall physical input, with its removal causing the largest decrease in performance (ΔR² = </w:t>
+      </w:r>
+      <w:r>
+        <w:rPr>
+          <w:color w:val="000000" w:themeColor="text1"/>
+        </w:rPr>
+        <w:t>-</w:t>
+      </w:r>
+      <w:r>
+        <w:rPr>
+          <w:color w:val="000000" w:themeColor="text1"/>
+        </w:rPr>
+        <w:t>0.574), followed by spin (</w:t>
+      </w:r>
+      <w:r>
+        <w:rPr>
+          <w:color w:val="000000" w:themeColor="text1"/>
+        </w:rPr>
+        <w:t>-</w:t>
+      </w:r>
+      <w:r>
+        <w:rPr>
+          <w:color w:val="000000" w:themeColor="text1"/>
+        </w:rPr>
+        <w:t>0.316) and velocity (</w:t>
+      </w:r>
+      <w:r>
+        <w:rPr>
+          <w:color w:val="000000" w:themeColor="text1"/>
+        </w:rPr>
+        <w:t>-</w:t>
+      </w:r>
+      <w:r>
+        <w:rPr>
+          <w:color w:val="000000" w:themeColor="text1"/>
+        </w:rPr>
+        <w:t>0.296). However, matched cases show that their relative importance changes locally. Changing spin produces a BMF range of roughly 0.06</w:t>
+      </w:r>
+      <w:r>
+        <w:rPr>
+          <w:color w:val="000000" w:themeColor="text1"/>
+        </w:rPr>
+        <w:t>-</w:t>
+      </w:r>
+      <w:r>
+        <w:rPr>
+          <w:color w:val="000000" w:themeColor="text1"/>
+        </w:rPr>
+        <w:t xml:space="preserve">0.09 below 1.5 Mars radii and up to roughly 0.24 at larger periapsis, while velocity can produce similarly large differences under other conditions. </w:t>
+      </w:r>
+      <w:r>
+        <w:rPr>
+          <w:color w:val="000000" w:themeColor="text1"/>
+        </w:rPr>
+        <w:lastRenderedPageBreak/>
+        <w:t>Fragmentation requires separate interpretation because fragment count depends partly on the FoF definition and BMF measures retained debris rather than breakup severity. Because BMF measures retained debris rather than breakup severity, fragmentation is considered separately using fragment count and the largest-remnant fraction.</w:t>
+      </w:r>
+    </w:p>
+    <w:p>
+      <w:pPr>
+        <w:spacing w:before="240" w:line="276" w:lineRule="auto"/>
+        <w:jc w:val="both"/>
+        <w:rPr>
+          <w:color w:val="000000" w:themeColor="text1"/>
+        </w:rPr>
+      </w:pPr>
+      <w:r>
+        <w:rPr>
+          <w:b/>
+          <w:bCs/>
+          <w:color w:val="000000" w:themeColor="text1"/>
+        </w:rPr>
+        <w:t xml:space="preserve">Q3. </w:t>
+      </w:r>
+      <w:r>
+        <w:rPr>
+          <w:b/>
+          <w:bCs/>
+          <w:color w:val="000000" w:themeColor="text1"/>
+        </w:rPr>
+        <w:t>Can machine-learning models predict outcomes within the sampled data while showing when a prediction should or should not be trusted</w:t>
+      </w:r>
+      <w:r>
+        <w:rPr>
+          <w:b/>
+          <w:bCs/>
+          <w:color w:val="000000" w:themeColor="text1"/>
+        </w:rPr>
+        <w:t>?</w:t>
+      </w:r>
+      <w:r>
+        <w:rPr>
+          <w:color w:val="000000" w:themeColor="text1"/>
+        </w:rPr>
+        <w:t xml:space="preserve"> </w:t>
+      </w:r>
+      <w:r>
+        <w:rPr>
+          <w:color w:val="000000" w:themeColor="text1"/>
+        </w:rPr>
+        <w:t>Yes, in cases where the SPH archive supports comparable input combinations. The primary tuned Gradient Boosting model using the original simulation inputs obtains a grouped cross-validated R² of 0.9234, MAE of 0.0159, and RMSE of 0.0257. Adding physics-derived features produces only a small further change to R² = 0.9240 and MAE = 0.0155, with RMSE unchanged at 0.0257, so the simpler tuned model is retained. Performance is not equally dependable everywhere, however. Despite the input values falling within the numerical training ranges, held-out errors increase to roughly 0.08 BMF, or 8 percentage points, in the sparsely sampled 10</w:t>
+      </w:r>
+      <w:r>
+        <w:rPr>
+          <w:color w:val="000000" w:themeColor="text1"/>
+          <w:vertAlign w:val="superscript"/>
+        </w:rPr>
+        <w:t>19.5</w:t>
+      </w:r>
+      <w:r>
+        <w:rPr>
+          <w:color w:val="000000" w:themeColor="text1"/>
+        </w:rPr>
+        <w:t xml:space="preserve"> kg example. This demonstrates that being within the overall input range is insufficient for a reliable prediction; comparable SPH cases must also exist nearby in the sampled parameter space. Thus, ML can support rapid screening and simulation prioritisation, while sparse, edge, transition, or poorly supported cases still require additional SPH investigation.</w:t>
+      </w:r>
+    </w:p>
+    <w:p>
+      <w:pPr>
+        <w:spacing w:before="240" w:line="276" w:lineRule="auto"/>
+        <w:jc w:val="both"/>
+        <w:rPr>
+          <w:color w:val="000000" w:themeColor="text1"/>
+        </w:rPr>
+      </w:pPr>
+      <w:r>
+        <w:rPr>
+          <w:color w:val="000000" w:themeColor="text1"/>
+        </w:rPr>
+        <w:t>Overall, the project shows that tidal-disruption outcomes depend on interacting physical conditions rather than one universal ranking of parameters. Machine learning makes the existing SPH archive faster to explore, shows where predictions are well supported, and highlights where new simulations would be most useful. It complements SPH rather than replacing the simulation physics.</w:t>
+      </w:r>
+    </w:p>
+    <w:p>
+      <w:pPr>
+        <w:pStyle w:val="Heading2"/>
+        <w:spacing w:before="240" w:line="276" w:lineRule="auto"/>
+        <w:rPr>
+          <w:rFonts w:ascii="Times New Roman" w:hAnsi="Times New Roman" w:cs="Times New Roman"/>
+          <w:color w:val="000000" w:themeColor="text1"/>
+          <w:lang w:val="en-GB"/>
+        </w:rPr>
+      </w:pPr>
+      <w:r>
+        <w:rPr>
+          <w:rFonts w:ascii="Times New Roman" w:eastAsia="Times New Roman" w:hAnsi="Times New Roman" w:cs="Times New Roman"/>
+          <w:b/>
+          <w:bCs/>
+          <w:color w:val="000000" w:themeColor="text1"/>
+          <w:sz w:val="24"/>
+          <w:szCs w:val="24"/>
+          <w:lang w:val="en-GB"/>
+        </w:rPr>
+        <w:t>5.2 Limitations</w:t>
+      </w:r>
+    </w:p>
+    <w:p>
+      <w:pPr>
+        <w:spacing w:before="240" w:line="276" w:lineRule="auto"/>
+        <w:jc w:val="both"/>
+        <w:rPr>
+          <w:color w:val="000000" w:themeColor="text1"/>
+        </w:rPr>
+      </w:pPr>
+      <w:r>
+        <w:rPr>
+          <w:color w:val="000000" w:themeColor="text1"/>
+        </w:rPr>
+        <w:t>The simulation archive's short size and uneven sampling are its primary drawbacks. A single SPH simulation can be analysed in multiple ways, hence many rows are not independent physical evidence. Although it is unable to produce missing simulations, group validation keeps the test score from becoming unduly optimistic. Even when each individual input value falls between its reported minimum and maximum, predictions are still unclear for combinations that are poorly sampled, close to the data's edges, or outside the combinations observed during training.</w:t>
+      </w:r>
+    </w:p>
+    <w:p>
+      <w:pPr>
+        <w:spacing w:before="240" w:line="276" w:lineRule="auto"/>
+        <w:jc w:val="both"/>
+        <w:rPr>
+          <w:color w:val="000000" w:themeColor="text1"/>
+        </w:rPr>
+      </w:pPr>
+      <w:r>
+        <w:rPr>
+          <w:color w:val="000000" w:themeColor="text1"/>
+        </w:rPr>
+        <w:t xml:space="preserve">Additionally, instead of solving the physical laws directly, the ML model learns patterns from SPH results. It does not follow the subsequent orbits of fragments and does not impose conservation of mass, momentum, energy, or angular momentum. Therefore, a reliable BMF prediction cannot determine whether debris accumulates into moons, forms a disk, or endures for a long time. Additionally, fragment measurements are more sensitive to the FoF connecting length employed in post-processing and are noisier than BMF. </w:t>
+      </w:r>
+    </w:p>
+    <w:p>
+      <w:pPr>
+        <w:pStyle w:val="Heading2"/>
+        <w:spacing w:before="240" w:line="276" w:lineRule="auto"/>
+        <w:jc w:val="both"/>
         <w:rPr>
           <w:rFonts w:ascii="Times New Roman" w:eastAsia="Times New Roman" w:hAnsi="Times New Roman" w:cs="Times New Roman"/>
           <w:color w:val="000000" w:themeColor="text1"/>
@@ -4786,8 +4789,7 @@
           <w:lang w:val="en-GB"/>
           <w14:ligatures w14:val="none"/>
         </w:rPr>
-        <w:t xml:space="preserve">Higher grouped-validation scores are obtained by exploratory XGBoost and hurdle models, but more testing is necessary before they can take the place of the primary </w:t>
-      </w:r>
+      </w:pPr>
       <w:r>
         <w:rPr>
           <w:rFonts w:ascii="Times New Roman" w:eastAsia="Times New Roman" w:hAnsi="Times New Roman" w:cs="Times New Roman"/>
@@ -4798,7 +4800,8 @@
           <w:lang w:val="en-GB"/>
           <w14:ligatures w14:val="none"/>
         </w:rPr>
-        <w:t>Gradient Boosting</w:t>
+        <w:lastRenderedPageBreak/>
+        <w:t xml:space="preserve">Higher grouped-validation scores are obtained by exploratory XGBoost and hurdle models, but more testing is necessary before they can take the place of the primary </w:t>
       </w:r>
       <w:r>
         <w:rPr>
@@ -4810,6 +4813,18 @@
           <w:lang w:val="en-GB"/>
           <w14:ligatures w14:val="none"/>
         </w:rPr>
+        <w:t>Gradient Boosting</w:t>
+      </w:r>
+      <w:r>
+        <w:rPr>
+          <w:rFonts w:ascii="Times New Roman" w:eastAsia="Times New Roman" w:hAnsi="Times New Roman" w:cs="Times New Roman"/>
+          <w:color w:val="000000" w:themeColor="text1"/>
+          <w:kern w:val="0"/>
+          <w:sz w:val="24"/>
+          <w:szCs w:val="24"/>
+          <w:lang w:val="en-GB"/>
+          <w14:ligatures w14:val="none"/>
+        </w:rPr>
         <w:t>. Because outcome-derived quantities are not known prior to simulation, models that employ them are not appropriate for pre-SPH screening.</w:t>
       </w:r>
     </w:p>
@@ -4895,7 +4910,6 @@
         <w:rPr>
           <w:color w:val="000000" w:themeColor="text1"/>
         </w:rPr>
-        <w:lastRenderedPageBreak/>
         <w:t>Future research should enhance automatic identification of input combinations with inadequate support and per-prediction reliability estimates. Before updating the current model, new SPH simulations should be used to test exploratory XGBoost and hurdle models. Stronger physical limitations, multi-output prediction, and uncertainty estimates are possible additional enhancements.</w:t>
       </w:r>
     </w:p>
@@ -5032,6 +5046,7 @@
         <w:rPr>
           <w:color w:val="000000" w:themeColor="text1"/>
         </w:rPr>
+        <w:lastRenderedPageBreak/>
         <w:t>Duan, T., Anand, A., Ding, D. Y., Thai, K. K., Basu, S., Ng, A. &amp; Schuler, A. (2020). NGBoost: Natural Gradient Boosting for Probabilistic Prediction. Proceedings of the 37th International Conference on Machine Learning, PMLR 119, 2690-2700.</w:t>
       </w:r>
     </w:p>
@@ -5096,7 +5111,6 @@
         <w:rPr>
           <w:color w:val="000000" w:themeColor="text1"/>
         </w:rPr>
-        <w:lastRenderedPageBreak/>
         <w:t>More, S., Kravtsov, A. V., Dalal, N. &amp; Gottlöber, S. (2011). The overdensity and masses of the friends-of-friends halos and universality of the halo mass function. The Astrophysical Journal Supplement Series, 195(1), 4. doi:10.1088/0067-0049/195/1/4.</w:t>
       </w:r>
     </w:p>
@@ -7995,8 +8009,18 @@
         <w:t>Table A2. Comparison of BMF regression models using five-fold GroupKFold by physical SPH simulation, including exploratory advanced models to show the potential for further performance improvement in future work.</w:t>
       </w:r>
     </w:p>
+    <w:p>
+      <w:pPr>
+        <w:keepNext/>
+        <w:spacing w:line="276" w:lineRule="auto"/>
+        <w:rPr>
+          <w:color w:val="000000" w:themeColor="text1"/>
+        </w:rPr>
+      </w:pPr>
+    </w:p>
     <w:tbl>
       <w:tblPr>
+        <w:tblpPr w:leftFromText="180" w:rightFromText="180" w:vertAnchor="text" w:tblpY="70"/>
         <w:tblW w:w="0" w:type="auto"/>
         <w:tblCellMar>
           <w:top w:w="15" w:type="dxa"/>
@@ -8014,6 +8038,9 @@
         <w:gridCol w:w="4031"/>
       </w:tblGrid>
       <w:tr>
+        <w:trPr>
+          <w:tblHeader/>
+        </w:trPr>
         <w:tc>
           <w:tcPr>
             <w:tcW w:w="0" w:type="auto"/>
@@ -8229,6 +8256,9 @@
         </w:tc>
       </w:tr>
       <w:tr>
+        <w:trPr>
+          <w:tblHeader/>
+        </w:trPr>
         <w:tc>
           <w:tcPr>
             <w:tcW w:w="0" w:type="auto"/>
@@ -8401,6 +8431,9 @@
         </w:tc>
       </w:tr>
       <w:tr>
+        <w:trPr>
+          <w:tblHeader/>
+        </w:trPr>
         <w:tc>
           <w:tcPr>
             <w:tcW w:w="0" w:type="auto"/>
@@ -8573,6 +8606,9 @@
         </w:tc>
       </w:tr>
       <w:tr>
+        <w:trPr>
+          <w:tblHeader/>
+        </w:trPr>
         <w:tc>
           <w:tcPr>
             <w:tcW w:w="0" w:type="auto"/>
@@ -8739,26 +8775,15 @@
                 <w:color w:val="000000" w:themeColor="text1"/>
                 <w:lang w:val="en-US"/>
               </w:rPr>
-              <w:t>Main</w:t>
-            </w:r>
-            <w:r>
-              <w:rPr>
-                <w:color w:val="000000" w:themeColor="text1"/>
-                <w:lang w:val="en-US"/>
-              </w:rPr>
-              <w:t xml:space="preserve"> model</w:t>
-            </w:r>
-            <w:r>
-              <w:rPr>
-                <w:color w:val="000000" w:themeColor="text1"/>
-                <w:lang w:val="en-US"/>
-              </w:rPr>
-              <w:t xml:space="preserve"> </w:t>
+              <w:t xml:space="preserve">Main model </w:t>
             </w:r>
           </w:p>
         </w:tc>
       </w:tr>
       <w:tr>
+        <w:trPr>
+          <w:tblHeader/>
+        </w:trPr>
         <w:tc>
           <w:tcPr>
             <w:tcW w:w="0" w:type="auto"/>
@@ -8931,6 +8956,9 @@
         </w:tc>
       </w:tr>
       <w:tr>
+        <w:trPr>
+          <w:tblHeader/>
+        </w:trPr>
         <w:tc>
           <w:tcPr>
             <w:tcW w:w="0" w:type="auto"/>
@@ -9103,6 +9131,9 @@
         </w:tc>
       </w:tr>
       <w:tr>
+        <w:trPr>
+          <w:tblHeader/>
+        </w:trPr>
         <w:tc>
           <w:tcPr>
             <w:tcW w:w="0" w:type="auto"/>
@@ -9275,6 +9306,9 @@
         </w:tc>
       </w:tr>
       <w:tr>
+        <w:trPr>
+          <w:tblHeader/>
+        </w:trPr>
         <w:tc>
           <w:tcPr>
             <w:tcW w:w="0" w:type="auto"/>
@@ -9449,6 +9483,130 @@
     </w:tbl>
     <w:p>
       <w:pPr>
+        <w:keepNext/>
+        <w:spacing w:line="276" w:lineRule="auto"/>
+        <w:jc w:val="center"/>
+        <w:rPr>
+          <w:color w:val="000000" w:themeColor="text1"/>
+        </w:rPr>
+      </w:pPr>
+      <w:r>
+        <w:rPr>
+          <w:color w:val="000000" w:themeColor="text1"/>
+        </w:rPr>
+        <w:lastRenderedPageBreak/>
+        <w:drawing>
+          <wp:inline distT="0" distB="0" distL="0" distR="0" wp14:anchorId="531B6B25" wp14:editId="603EE89F">
+            <wp:extent cx="5943600" cy="4029710"/>
+            <wp:effectExtent l="0" t="0" r="0" b="0"/>
+            <wp:docPr id="952965952" name="Picture 1"/>
+            <wp:cNvGraphicFramePr>
+              <a:graphicFrameLocks xmlns:a="http://schemas.openxmlformats.org/drawingml/2006/main" noChangeAspect="1"/>
+            </wp:cNvGraphicFramePr>
+            <a:graphic xmlns:a="http://schemas.openxmlformats.org/drawingml/2006/main">
+              <a:graphicData uri="http://schemas.openxmlformats.org/drawingml/2006/picture">
+                <pic:pic xmlns:pic="http://schemas.openxmlformats.org/drawingml/2006/picture">
+                  <pic:nvPicPr>
+                    <pic:cNvPr id="952965952" name=""/>
+                    <pic:cNvPicPr/>
+                  </pic:nvPicPr>
+                  <pic:blipFill>
+                    <a:blip r:embed="rId17"/>
+                    <a:stretch>
+                      <a:fillRect/>
+                    </a:stretch>
+                  </pic:blipFill>
+                  <pic:spPr>
+                    <a:xfrm>
+                      <a:off x="0" y="0"/>
+                      <a:ext cx="5943600" cy="4029710"/>
+                    </a:xfrm>
+                    <a:prstGeom prst="rect">
+                      <a:avLst/>
+                    </a:prstGeom>
+                  </pic:spPr>
+                </pic:pic>
+              </a:graphicData>
+            </a:graphic>
+          </wp:inline>
+        </w:drawing>
+      </w:r>
+    </w:p>
+    <w:p>
+      <w:pPr>
+        <w:keepNext/>
+        <w:spacing w:line="276" w:lineRule="auto"/>
+        <w:jc w:val="center"/>
+        <w:rPr>
+          <w:color w:val="000000" w:themeColor="text1"/>
+        </w:rPr>
+      </w:pPr>
+    </w:p>
+    <w:p>
+      <w:pPr>
+        <w:keepNext/>
+        <w:spacing w:line="276" w:lineRule="auto"/>
+        <w:jc w:val="center"/>
+        <w:rPr>
+          <w:color w:val="000000" w:themeColor="text1"/>
+        </w:rPr>
+      </w:pPr>
+      <w:r>
+        <w:rPr>
+          <w:color w:val="000000" w:themeColor="text1"/>
+        </w:rPr>
+        <w:t>Figure A</w:t>
+      </w:r>
+      <w:r>
+        <w:rPr>
+          <w:color w:val="000000" w:themeColor="text1"/>
+        </w:rPr>
+        <w:t>1</w:t>
+      </w:r>
+      <w:r>
+        <w:rPr>
+          <w:color w:val="000000" w:themeColor="text1"/>
+        </w:rPr>
+        <w:t xml:space="preserve">. </w:t>
+      </w:r>
+      <w:r>
+        <w:rPr>
+          <w:color w:val="000000" w:themeColor="text1"/>
+        </w:rPr>
+        <w:t>Gradient Boosting predictions beyond the observed SPH parameter ranges.</w:t>
+      </w:r>
+    </w:p>
+    <w:p>
+      <w:pPr>
+        <w:keepNext/>
+        <w:spacing w:line="276" w:lineRule="auto"/>
+        <w:jc w:val="both"/>
+        <w:rPr>
+          <w:color w:val="000000" w:themeColor="text1"/>
+        </w:rPr>
+      </w:pPr>
+    </w:p>
+    <w:p>
+      <w:pPr>
+        <w:spacing w:after="160" w:line="278" w:lineRule="auto"/>
+        <w:jc w:val="both"/>
+        <w:rPr>
+          <w:rFonts w:eastAsiaTheme="majorEastAsia"/>
+          <w:b/>
+          <w:bCs/>
+          <w:color w:val="000000" w:themeColor="text1"/>
+          <w:kern w:val="2"/>
+          <w:sz w:val="28"/>
+          <w:szCs w:val="28"/>
+          <w14:ligatures w14:val="standardContextual"/>
+        </w:rPr>
+      </w:pPr>
+      <w:r>
+        <w:t xml:space="preserve">The shaded central regions indicate the ranges represented by the corresponding SPH slice. Outside these ranges, the tree-based model does not extrapolate a physical trend. Instead, it continues to use partitions learned from the training data, producing stepwise or constant predictions, as seen most clearly for periapsis, velocity, and spin. For mass, the prediction initially increases slightly beyond the observed range as the changing mass and associated derived features continue to cross learned tree thresholds, before eventually remaining within the same terminal partitions and settling onto a near-constant plateau. This does not occur for the other parameter sweeps because their out-of-range values enter terminal partitions more immediately, after which further changes no longer alter the prediction. These out-of-range predictions should therefore not be interpreted as physical trends. </w:t>
+      </w:r>
+    </w:p>
+    <w:p>
+      <w:pPr>
         <w:pStyle w:val="Heading1"/>
         <w:spacing w:line="276" w:lineRule="auto"/>
         <w:rPr>
@@ -9502,7 +9660,7 @@
                     <pic:cNvPicPr/>
                   </pic:nvPicPr>
                   <pic:blipFill>
-                    <a:blip r:embed="rId17"/>
+                    <a:blip r:embed="rId18"/>
                     <a:stretch>
                       <a:fillRect/>
                     </a:stretch>
@@ -9674,7 +9832,7 @@
       </w:r>
     </w:p>
     <w:sectPr>
-      <w:footerReference w:type="default" r:id="rId18"/>
+      <w:footerReference w:type="default" r:id="rId19"/>
       <w:pgSz w:w="12240" w:h="15840"/>
       <w:pgMar w:top="1440" w:right="1440" w:bottom="1440" w:left="1440" w:header="720" w:footer="720" w:gutter="0"/>
       <w:pgNumType w:start="1"/>

</xml_diff>

<commit_message>
docs: renew figure 1
</commit_message>
<xml_diff>
--- a/deliverables/nny124-final-report.docx
+++ b/deliverables/nny124-final-report.docx
@@ -1250,42 +1250,73 @@
               <w:rPr>
                 <w:color w:val="000000" w:themeColor="text1"/>
               </w:rPr>
-              <w:t>Mass of the incoming asteroid. For example, A</w:t>
-            </w:r>
-            <w:r>
-              <w:rPr>
+              <w:t xml:space="preserve">Mass of the incoming asteroid. For example, </w:t>
+            </w:r>
+            <w:r>
+              <w:rPr>
+                <w:rFonts w:eastAsia="Gungsuh"/>
+                <w:color w:val="000000" w:themeColor="text1"/>
+              </w:rPr>
+              <w:t>A</w:t>
+            </w:r>
+            <w:r>
+              <w:rPr>
+                <w:rFonts w:eastAsia="Gungsuh"/>
                 <w:color w:val="000000" w:themeColor="text1"/>
                 <w:vertAlign w:val="subscript"/>
               </w:rPr>
-              <w:t>1800</w:t>
+              <w:t>2</w:t>
             </w:r>
             <w:r>
               <w:rPr>
                 <w:rFonts w:eastAsia="Gungsuh"/>
                 <w:color w:val="000000" w:themeColor="text1"/>
-              </w:rPr>
-              <w:t xml:space="preserve"> ≈ 10</w:t>
+                <w:vertAlign w:val="subscript"/>
+              </w:rPr>
+              <w:t>0</w:t>
+            </w:r>
+            <w:r>
+              <w:rPr>
+                <w:rFonts w:eastAsia="Gungsuh"/>
+                <w:color w:val="000000" w:themeColor="text1"/>
+                <w:vertAlign w:val="subscript"/>
+              </w:rPr>
+              <w:t>00</w:t>
+            </w:r>
+            <w:r>
+              <w:rPr>
+                <w:rFonts w:eastAsia="Gungsuh"/>
+                <w:color w:val="000000" w:themeColor="text1"/>
+              </w:rPr>
+              <w:t xml:space="preserve"> </w:t>
+            </w:r>
+            <w:r>
+              <w:rPr>
+                <w:rFonts w:eastAsia="Gungsuh"/>
+                <w:color w:val="000000" w:themeColor="text1"/>
+              </w:rPr>
+              <w:t>=</w:t>
+            </w:r>
+            <w:r>
+              <w:rPr>
+                <w:rFonts w:eastAsia="Gungsuh"/>
+                <w:color w:val="000000" w:themeColor="text1"/>
+              </w:rPr>
+              <w:t xml:space="preserve"> 10</w:t>
             </w:r>
             <w:r>
               <w:rPr>
                 <w:color w:val="000000" w:themeColor="text1"/>
                 <w:vertAlign w:val="superscript"/>
               </w:rPr>
-              <w:t>18</w:t>
-            </w:r>
-            <w:r>
-              <w:rPr>
-                <w:rFonts w:eastAsia="Gungsuh"/>
-                <w:color w:val="000000" w:themeColor="text1"/>
-              </w:rPr>
-              <w:t xml:space="preserve"> kg and A2100 ≈ 10</w:t>
+              <w:t>2</w:t>
             </w:r>
             <w:r>
               <w:rPr>
                 <w:color w:val="000000" w:themeColor="text1"/>
                 <w:vertAlign w:val="superscript"/>
               </w:rPr>
-              <w:t>21</w:t>
+              <w:t>0</w:t>
             </w:r>
             <w:r>
               <w:rPr>
@@ -1417,7 +1448,19 @@
               <w:rPr>
                 <w:color w:val="000000" w:themeColor="text1"/>
               </w:rPr>
-              <w:t xml:space="preserve"> = 1.2 R</w:t>
+              <w:t xml:space="preserve"> = 1.2</w:t>
+            </w:r>
+            <w:r>
+              <w:rPr>
+                <w:color w:val="000000" w:themeColor="text1"/>
+              </w:rPr>
+              <w:t xml:space="preserve"> </w:t>
+            </w:r>
+            <w:r>
+              <w:rPr>
+                <w:color w:val="000000" w:themeColor="text1"/>
+              </w:rPr>
+              <w:t>R</w:t>
             </w:r>
             <w:r>
               <w:rPr>
@@ -2469,19 +2512,24 @@
       </w:pPr>
       <w:r>
         <w:rPr>
-          <w:color w:val="000000" w:themeColor="text1"/>
+          <w:rFonts w:ascii="Helvetica" w:eastAsiaTheme="minorHAnsi" w:hAnsi="Helvetica" w:cs="Helvetica"/>
+          <w:noProof w:val="0"/>
+          <w:lang w:val="en-US"/>
+          <w14:ligatures w14:val="standardContextual"/>
         </w:rPr>
         <w:drawing>
-          <wp:inline distT="114300" distB="114300" distL="114300" distR="114300" wp14:anchorId="1598CD21" wp14:editId="22022BF4">
-            <wp:extent cx="5943600" cy="2362200"/>
-            <wp:effectExtent l="0" t="0" r="0" b="0"/>
-            <wp:docPr id="4" name="image4.png"/>
-            <wp:cNvGraphicFramePr/>
+          <wp:inline distT="0" distB="0" distL="0" distR="0" wp14:anchorId="3D017574" wp14:editId="719BC647">
+            <wp:extent cx="5113393" cy="3803904"/>
+            <wp:effectExtent l="0" t="0" r="5080" b="0"/>
+            <wp:docPr id="589236429" name="Picture 1"/>
+            <wp:cNvGraphicFramePr>
+              <a:graphicFrameLocks xmlns:a="http://schemas.openxmlformats.org/drawingml/2006/main" noChangeAspect="1"/>
+            </wp:cNvGraphicFramePr>
             <a:graphic xmlns:a="http://schemas.openxmlformats.org/drawingml/2006/main">
               <a:graphicData uri="http://schemas.openxmlformats.org/drawingml/2006/picture">
                 <pic:pic xmlns:pic="http://schemas.openxmlformats.org/drawingml/2006/picture">
                   <pic:nvPicPr>
-                    <pic:cNvPr id="4" name="image4.png"/>
+                    <pic:cNvPr id="589236429" name=""/>
                     <pic:cNvPicPr/>
                   </pic:nvPicPr>
                   <pic:blipFill>
@@ -2493,7 +2541,7 @@
                   <pic:spPr>
                     <a:xfrm>
                       <a:off x="0" y="0"/>
-                      <a:ext cx="5943600" cy="2362200"/>
+                      <a:ext cx="5199340" cy="3867841"/>
                     </a:xfrm>
                     <a:prstGeom prst="rect">
                       <a:avLst/>
@@ -2508,29 +2556,92 @@
     </w:p>
     <w:p>
       <w:pPr>
-        <w:keepLines/>
-        <w:pBdr>
-          <w:top w:val="nil"/>
-          <w:left w:val="nil"/>
-          <w:bottom w:val="nil"/>
-          <w:right w:val="nil"/>
-          <w:between w:val="nil"/>
-        </w:pBdr>
-        <w:spacing w:after="80" w:line="276" w:lineRule="auto"/>
+        <w:pStyle w:val="Heading2"/>
+        <w:spacing w:before="360" w:line="276" w:lineRule="auto"/>
         <w:jc w:val="center"/>
         <w:rPr>
+          <w:rFonts w:ascii="Times New Roman" w:eastAsia="Times New Roman" w:hAnsi="Times New Roman" w:cs="Times New Roman"/>
           <w:i/>
           <w:iCs/>
           <w:color w:val="000000" w:themeColor="text1"/>
-        </w:rPr>
-      </w:pPr>
-      <w:r>
-        <w:rPr>
+          <w:kern w:val="0"/>
+          <w:sz w:val="24"/>
+          <w:szCs w:val="24"/>
+          <w:lang w:val="en-GB"/>
+          <w14:ligatures w14:val="none"/>
+        </w:rPr>
+      </w:pPr>
+      <w:r>
+        <w:rPr>
+          <w:rFonts w:ascii="Times New Roman" w:eastAsia="Times New Roman" w:hAnsi="Times New Roman" w:cs="Times New Roman"/>
           <w:i/>
           <w:iCs/>
           <w:color w:val="000000" w:themeColor="text1"/>
-        </w:rPr>
-        <w:t>Figure 1. Exploratory SPH results. (a) The largest fragment counts occur only in close encounters, although a close periapsis does not guarantee strong fragmentation. (b) Bound retention is generally higher for closer and slower encounters. Colours show encounter speed, while marker and line styles distinguish spin settings. Lines connect sampled cases with the same settings and are not physical trajectories.</w:t>
+          <w:kern w:val="0"/>
+          <w:sz w:val="24"/>
+          <w:szCs w:val="24"/>
+          <w:lang w:val="en-GB"/>
+          <w14:ligatures w14:val="none"/>
+        </w:rPr>
+        <w:t>Figure 1. Exploratory SPH trends and mass-dependent bound-retention regimes. (a) Fragment count versus periapsis. (b) BMF across all sampled encounter conditions. (c-d) The same BMF results separated into 10</w:t>
+      </w:r>
+      <w:r>
+        <w:rPr>
+          <w:rFonts w:ascii="Times New Roman" w:eastAsia="Times New Roman" w:hAnsi="Times New Roman" w:cs="Times New Roman"/>
+          <w:i/>
+          <w:iCs/>
+          <w:color w:val="000000" w:themeColor="text1"/>
+          <w:kern w:val="0"/>
+          <w:sz w:val="24"/>
+          <w:szCs w:val="24"/>
+          <w:vertAlign w:val="superscript"/>
+          <w:lang w:val="en-GB"/>
+          <w14:ligatures w14:val="none"/>
+        </w:rPr>
+        <w:t>19</w:t>
+      </w:r>
+      <w:r>
+        <w:rPr>
+          <w:rFonts w:ascii="Times New Roman" w:eastAsia="Times New Roman" w:hAnsi="Times New Roman" w:cs="Times New Roman"/>
+          <w:i/>
+          <w:iCs/>
+          <w:color w:val="000000" w:themeColor="text1"/>
+          <w:kern w:val="0"/>
+          <w:sz w:val="24"/>
+          <w:szCs w:val="24"/>
+          <w:lang w:val="en-GB"/>
+          <w14:ligatures w14:val="none"/>
+        </w:rPr>
+        <w:t xml:space="preserve"> and 10</w:t>
+      </w:r>
+      <w:r>
+        <w:rPr>
+          <w:rFonts w:ascii="Times New Roman" w:eastAsia="Times New Roman" w:hAnsi="Times New Roman" w:cs="Times New Roman"/>
+          <w:i/>
+          <w:iCs/>
+          <w:color w:val="000000" w:themeColor="text1"/>
+          <w:kern w:val="0"/>
+          <w:sz w:val="24"/>
+          <w:szCs w:val="24"/>
+          <w:vertAlign w:val="superscript"/>
+          <w:lang w:val="en-GB"/>
+          <w14:ligatures w14:val="none"/>
+        </w:rPr>
+        <w:t>20</w:t>
+      </w:r>
+      <w:r>
+        <w:rPr>
+          <w:rFonts w:ascii="Times New Roman" w:eastAsia="Times New Roman" w:hAnsi="Times New Roman" w:cs="Times New Roman"/>
+          <w:i/>
+          <w:iCs/>
+          <w:color w:val="000000" w:themeColor="text1"/>
+          <w:kern w:val="0"/>
+          <w:sz w:val="24"/>
+          <w:szCs w:val="24"/>
+          <w:lang w:val="en-GB"/>
+          <w14:ligatures w14:val="none"/>
+        </w:rPr>
+        <w:t xml:space="preserve"> kg asteroid-mass groups, showing that the combined scatter includes distinct retention regimes.</w:t>
       </w:r>
     </w:p>
     <w:p>
@@ -2558,7 +2669,7 @@
           <w:lang w:val="en-GB"/>
           <w14:ligatures w14:val="none"/>
         </w:rPr>
-        <w:t>Although close interactions do not always result in strong fragmentation or high BMF, Figure 1 illustrates that both fragmentation and bound retention typically decrease as periapsis increases. The mean BMF rises with tiny periapsis and falls with increasing encounter speed. The relative impacts also vary throughout the sampling range: separation between spin states becomes more apparent around 1.7-2.0 Mars radii, whereas velocity differences are more noticeable at roughly 1.1-1.6 Mars radii. The region is too rarely sampled to draw firm conclusions, but one prograde-spin case maintains roughly 3-4% BMF at 2.6 Mars radii whereas the other sampled cases are close to zero. Along with the other encounter parameters, the impact of asteroid mass also varies in magnitude and direction. Overall, the results show regime-dependent behaviour, where distinct bound-mass outcomes result from varying relative effects of parameters across the parameter space.</w:t>
+        <w:t xml:space="preserve">Although close interactions do not always result in strong fragmentation or high BMF, Figure 1 illustrates that both fragmentation and bound retention typically decrease as periapsis increases. The mean BMF rises with tiny periapsis and falls with increasing encounter speed. The relative impacts also vary throughout the sampling range: separation between spin states becomes more apparent around 1.7-2.0 Mars radii, whereas velocity differences are more noticeable at roughly 1.1-1.6 Mars radii. The region is too rarely sampled to draw firm conclusions, but one prograde-spin case maintains roughly 3-4% BMF at 2.6 Mars radii whereas the other sampled cases are close to zero. </w:t>
       </w:r>
     </w:p>
     <w:p>
@@ -2567,6 +2678,304 @@
         <w:spacing w:before="360" w:line="276" w:lineRule="auto"/>
         <w:jc w:val="both"/>
         <w:rPr>
+          <w:rFonts w:ascii="Times New Roman" w:eastAsia="Times New Roman" w:hAnsi="Times New Roman" w:cs="Times New Roman"/>
+          <w:color w:val="000000" w:themeColor="text1"/>
+          <w:kern w:val="0"/>
+          <w:sz w:val="24"/>
+          <w:szCs w:val="24"/>
+          <w:lang w:val="en-GB"/>
+          <w14:ligatures w14:val="none"/>
+        </w:rPr>
+      </w:pPr>
+      <w:r>
+        <w:rPr>
+          <w:rFonts w:ascii="Times New Roman" w:eastAsia="Times New Roman" w:hAnsi="Times New Roman" w:cs="Times New Roman"/>
+          <w:color w:val="000000" w:themeColor="text1"/>
+          <w:kern w:val="0"/>
+          <w:sz w:val="24"/>
+          <w:szCs w:val="24"/>
+          <w:lang w:val="en-GB"/>
+          <w14:ligatures w14:val="none"/>
+        </w:rPr>
+        <w:lastRenderedPageBreak/>
+        <w:t xml:space="preserve">The combined BMF panel appears highly irregular because it overlays simulations from different asteroid-mass regimes and encounter conditions. Separating </w:t>
+      </w:r>
+      <w:r>
+        <w:rPr>
+          <w:rFonts w:ascii="Times New Roman" w:eastAsia="Times New Roman" w:hAnsi="Times New Roman" w:cs="Times New Roman"/>
+          <w:color w:val="000000" w:themeColor="text1"/>
+          <w:kern w:val="0"/>
+          <w:sz w:val="24"/>
+          <w:szCs w:val="24"/>
+          <w:lang w:val="en-GB"/>
+          <w14:ligatures w14:val="none"/>
+        </w:rPr>
+        <w:t>the mass</w:t>
+      </w:r>
+      <w:r>
+        <w:rPr>
+          <w:rFonts w:ascii="Times New Roman" w:eastAsia="Times New Roman" w:hAnsi="Times New Roman" w:cs="Times New Roman"/>
+          <w:color w:val="000000" w:themeColor="text1"/>
+          <w:kern w:val="0"/>
+          <w:sz w:val="24"/>
+          <w:szCs w:val="24"/>
+          <w:lang w:val="en-GB"/>
+          <w14:ligatures w14:val="none"/>
+        </w:rPr>
+        <w:t xml:space="preserve"> cases shows that much of this apparent scatter reflects differences between sampled regimes rather than a single periapsis trend.</w:t>
+      </w:r>
+      <w:r>
+        <w:rPr>
+          <w:rFonts w:ascii="Times New Roman" w:eastAsia="Times New Roman" w:hAnsi="Times New Roman" w:cs="Times New Roman"/>
+          <w:color w:val="000000" w:themeColor="text1"/>
+          <w:kern w:val="0"/>
+          <w:sz w:val="24"/>
+          <w:szCs w:val="24"/>
+          <w:lang w:val="en-GB"/>
+          <w14:ligatures w14:val="none"/>
+        </w:rPr>
+        <w:t xml:space="preserve"> </w:t>
+      </w:r>
+      <w:r>
+        <w:rPr>
+          <w:rFonts w:ascii="Times New Roman" w:eastAsia="Times New Roman" w:hAnsi="Times New Roman" w:cs="Times New Roman"/>
+          <w:color w:val="000000" w:themeColor="text1"/>
+          <w:kern w:val="0"/>
+          <w:sz w:val="24"/>
+          <w:szCs w:val="24"/>
+          <w:lang w:val="en-GB"/>
+          <w14:ligatures w14:val="none"/>
+        </w:rPr>
+        <w:t xml:space="preserve">The mass-separated panels also show a strong asymmetry in the sampled archive: the </w:t>
+      </w:r>
+      <w:r>
+        <w:rPr>
+          <w:rFonts w:ascii="Times New Roman" w:eastAsia="Times New Roman" w:hAnsi="Times New Roman" w:cs="Times New Roman"/>
+          <w:color w:val="000000" w:themeColor="text1"/>
+          <w:kern w:val="0"/>
+          <w:sz w:val="24"/>
+          <w:szCs w:val="24"/>
+          <w:lang w:val="en-GB"/>
+          <w14:ligatures w14:val="none"/>
+        </w:rPr>
+        <w:t>10</w:t>
+      </w:r>
+      <w:r>
+        <w:rPr>
+          <w:rFonts w:ascii="Times New Roman" w:eastAsia="Times New Roman" w:hAnsi="Times New Roman" w:cs="Times New Roman"/>
+          <w:color w:val="000000" w:themeColor="text1"/>
+          <w:kern w:val="0"/>
+          <w:sz w:val="24"/>
+          <w:szCs w:val="24"/>
+          <w:vertAlign w:val="superscript"/>
+          <w:lang w:val="en-GB"/>
+          <w14:ligatures w14:val="none"/>
+        </w:rPr>
+        <w:t>20</w:t>
+      </w:r>
+      <w:r>
+        <w:rPr>
+          <w:rFonts w:ascii="Times New Roman" w:eastAsia="Times New Roman" w:hAnsi="Times New Roman" w:cs="Times New Roman"/>
+          <w:color w:val="000000" w:themeColor="text1"/>
+          <w:kern w:val="0"/>
+          <w:sz w:val="24"/>
+          <w:szCs w:val="24"/>
+          <w:vertAlign w:val="superscript"/>
+          <w:lang w:val="en-GB"/>
+          <w14:ligatures w14:val="none"/>
+        </w:rPr>
+        <w:t xml:space="preserve"> </w:t>
+      </w:r>
+      <w:r>
+        <w:rPr>
+          <w:rFonts w:ascii="Times New Roman" w:eastAsia="Times New Roman" w:hAnsi="Times New Roman" w:cs="Times New Roman"/>
+          <w:color w:val="000000" w:themeColor="text1"/>
+          <w:kern w:val="0"/>
+          <w:sz w:val="24"/>
+          <w:szCs w:val="24"/>
+          <w:lang w:val="en-GB"/>
+          <w14:ligatures w14:val="none"/>
+        </w:rPr>
+        <w:t xml:space="preserve">kg cases are much more heavily represented (n=271) than the </w:t>
+      </w:r>
+      <w:r>
+        <w:rPr>
+          <w:rFonts w:ascii="Times New Roman" w:eastAsia="Times New Roman" w:hAnsi="Times New Roman" w:cs="Times New Roman"/>
+          <w:color w:val="000000" w:themeColor="text1"/>
+          <w:kern w:val="0"/>
+          <w:sz w:val="24"/>
+          <w:szCs w:val="24"/>
+          <w:lang w:val="en-GB"/>
+          <w14:ligatures w14:val="none"/>
+        </w:rPr>
+        <w:t>10</w:t>
+      </w:r>
+      <w:r>
+        <w:rPr>
+          <w:rFonts w:ascii="Times New Roman" w:eastAsia="Times New Roman" w:hAnsi="Times New Roman" w:cs="Times New Roman"/>
+          <w:color w:val="000000" w:themeColor="text1"/>
+          <w:kern w:val="0"/>
+          <w:sz w:val="24"/>
+          <w:szCs w:val="24"/>
+          <w:vertAlign w:val="superscript"/>
+          <w:lang w:val="en-GB"/>
+          <w14:ligatures w14:val="none"/>
+        </w:rPr>
+        <w:t xml:space="preserve">19 </w:t>
+      </w:r>
+      <w:r>
+        <w:rPr>
+          <w:rFonts w:ascii="Times New Roman" w:eastAsia="Times New Roman" w:hAnsi="Times New Roman" w:cs="Times New Roman"/>
+          <w:color w:val="000000" w:themeColor="text1"/>
+          <w:kern w:val="0"/>
+          <w:sz w:val="24"/>
+          <w:szCs w:val="24"/>
+          <w:lang w:val="en-GB"/>
+          <w14:ligatures w14:val="none"/>
+        </w:rPr>
+        <w:t>kg cases (n=81),</w:t>
+      </w:r>
+      <w:r>
+        <w:rPr>
+          <w:rFonts w:ascii="Times New Roman" w:eastAsia="Times New Roman" w:hAnsi="Times New Roman" w:cs="Times New Roman"/>
+          <w:color w:val="000000" w:themeColor="text1"/>
+          <w:kern w:val="0"/>
+          <w:sz w:val="24"/>
+          <w:szCs w:val="24"/>
+          <w:lang w:val="en-GB"/>
+          <w14:ligatures w14:val="none"/>
+        </w:rPr>
+        <w:t xml:space="preserve"> </w:t>
+      </w:r>
+      <w:r>
+        <w:rPr>
+          <w:rFonts w:ascii="Times New Roman" w:eastAsia="Times New Roman" w:hAnsi="Times New Roman" w:cs="Times New Roman"/>
+          <w:color w:val="000000" w:themeColor="text1"/>
+          <w:kern w:val="0"/>
+          <w:sz w:val="24"/>
+          <w:szCs w:val="24"/>
+          <w:lang w:val="en-GB"/>
+          <w14:ligatures w14:val="none"/>
+        </w:rPr>
+        <w:t>and they span substantially higher BMF and remain non-zero over a wider periapsis range.</w:t>
+      </w:r>
+      <w:r>
+        <w:rPr>
+          <w:rFonts w:ascii="Times New Roman" w:eastAsia="Times New Roman" w:hAnsi="Times New Roman" w:cs="Times New Roman"/>
+          <w:color w:val="000000" w:themeColor="text1"/>
+          <w:kern w:val="0"/>
+          <w:sz w:val="24"/>
+          <w:szCs w:val="24"/>
+          <w:lang w:val="en-GB"/>
+          <w14:ligatures w14:val="none"/>
+        </w:rPr>
+        <w:t xml:space="preserve"> Th</w:t>
+      </w:r>
+      <w:r>
+        <w:rPr>
+          <w:rFonts w:ascii="Times New Roman" w:eastAsia="Times New Roman" w:hAnsi="Times New Roman" w:cs="Times New Roman"/>
+          <w:color w:val="000000" w:themeColor="text1"/>
+          <w:kern w:val="0"/>
+          <w:sz w:val="24"/>
+          <w:szCs w:val="24"/>
+          <w:lang w:val="en-GB"/>
+          <w14:ligatures w14:val="none"/>
+        </w:rPr>
+        <w:t>e 10</w:t>
+      </w:r>
+      <w:r>
+        <w:rPr>
+          <w:rFonts w:ascii="Times New Roman" w:eastAsia="Times New Roman" w:hAnsi="Times New Roman" w:cs="Times New Roman"/>
+          <w:color w:val="000000" w:themeColor="text1"/>
+          <w:kern w:val="0"/>
+          <w:sz w:val="24"/>
+          <w:szCs w:val="24"/>
+          <w:vertAlign w:val="superscript"/>
+          <w:lang w:val="en-GB"/>
+          <w14:ligatures w14:val="none"/>
+        </w:rPr>
+        <w:t>19</w:t>
+      </w:r>
+      <w:r>
+        <w:rPr>
+          <w:rFonts w:ascii="Times New Roman" w:eastAsia="Times New Roman" w:hAnsi="Times New Roman" w:cs="Times New Roman"/>
+          <w:color w:val="000000" w:themeColor="text1"/>
+          <w:kern w:val="0"/>
+          <w:sz w:val="24"/>
+          <w:szCs w:val="24"/>
+          <w:vertAlign w:val="superscript"/>
+          <w:lang w:val="en-GB"/>
+          <w14:ligatures w14:val="none"/>
+        </w:rPr>
+        <w:t xml:space="preserve"> </w:t>
+      </w:r>
+      <w:r>
+        <w:rPr>
+          <w:rFonts w:ascii="Times New Roman" w:eastAsia="Times New Roman" w:hAnsi="Times New Roman" w:cs="Times New Roman"/>
+          <w:color w:val="000000" w:themeColor="text1"/>
+          <w:kern w:val="0"/>
+          <w:sz w:val="24"/>
+          <w:szCs w:val="24"/>
+          <w:lang w:val="en-GB"/>
+          <w14:ligatures w14:val="none"/>
+        </w:rPr>
+        <w:t>kg cases are mostly in a low-retention regime. However, because the two mass groups do not contain the same combinations of velocity, spin, and periapsis, this should not be interpreted as a direct causal mass effect.</w:t>
+      </w:r>
+      <w:r>
+        <w:rPr>
+          <w:rFonts w:ascii="Times New Roman" w:eastAsia="Times New Roman" w:hAnsi="Times New Roman" w:cs="Times New Roman"/>
+          <w:color w:val="000000" w:themeColor="text1"/>
+          <w:kern w:val="0"/>
+          <w:sz w:val="24"/>
+          <w:szCs w:val="24"/>
+          <w:lang w:val="en-GB"/>
+          <w14:ligatures w14:val="none"/>
+        </w:rPr>
+        <w:t xml:space="preserve"> </w:t>
+      </w:r>
+      <w:r>
+        <w:rPr>
+          <w:rFonts w:ascii="Times New Roman" w:eastAsia="Times New Roman" w:hAnsi="Times New Roman" w:cs="Times New Roman"/>
+          <w:color w:val="000000" w:themeColor="text1"/>
+          <w:kern w:val="0"/>
+          <w:sz w:val="24"/>
+          <w:szCs w:val="24"/>
+          <w:lang w:val="en-GB"/>
+          <w14:ligatures w14:val="none"/>
+        </w:rPr>
+        <w:t>Overall, the results show regime-dependent behaviour, where distinct bound-mass outcomes result from varying relative effects of parameters across the parameter space</w:t>
+      </w:r>
+      <w:r>
+        <w:rPr>
+          <w:rFonts w:ascii="Times New Roman" w:eastAsia="Times New Roman" w:hAnsi="Times New Roman" w:cs="Times New Roman"/>
+          <w:color w:val="000000" w:themeColor="text1"/>
+          <w:kern w:val="0"/>
+          <w:sz w:val="24"/>
+          <w:szCs w:val="24"/>
+          <w:lang w:val="en-GB"/>
+          <w14:ligatures w14:val="none"/>
+        </w:rPr>
+        <w:t xml:space="preserve"> </w:t>
+      </w:r>
+      <w:r>
+        <w:rPr>
+          <w:rFonts w:ascii="Times New Roman" w:eastAsia="Times New Roman" w:hAnsi="Times New Roman" w:cs="Times New Roman"/>
+          <w:color w:val="000000" w:themeColor="text1"/>
+          <w:kern w:val="0"/>
+          <w:sz w:val="24"/>
+          <w:szCs w:val="24"/>
+          <w:lang w:val="en-GB"/>
+          <w14:ligatures w14:val="none"/>
+        </w:rPr>
+        <w:t>rather than a single parameter acting independently.</w:t>
+      </w:r>
+    </w:p>
+    <w:p>
+      <w:pPr>
+        <w:pStyle w:val="Heading2"/>
+        <w:spacing w:before="360" w:line="276" w:lineRule="auto"/>
+        <w:jc w:val="both"/>
+        <w:rPr>
           <w:rFonts w:ascii="Times New Roman" w:hAnsi="Times New Roman" w:cs="Times New Roman"/>
           <w:color w:val="000000" w:themeColor="text1"/>
           <w:lang w:val="en-GB"/>
@@ -2597,14 +3006,7 @@
         <w:rPr>
           <w:color w:val="000000" w:themeColor="text1"/>
         </w:rPr>
-        <w:t xml:space="preserve">It was previously demonstrated that fragmentation and BMF do not follow a single, straightforward input trend, thus I want to see if relevant physical parameters can more accurately characterize this behaviour. To provide a single physically significant measure of the orbit shape </w:t>
-      </w:r>
-      <w:r>
-        <w:rPr>
-          <w:color w:val="000000" w:themeColor="text1"/>
-        </w:rPr>
-        <w:lastRenderedPageBreak/>
-        <w:t>and enable retention to be analysed using the entire encounter trajectory rather than as distinct factors, periapsis and encounter speed are combined to form an encounter eccentricity.</w:t>
+        <w:t>It was previously demonstrated that fragmentation and BMF do not follow a single, straightforward input trend, thus I want to see if relevant physical parameters can more accurately characterize this behaviour. To provide a single physically significant measure of the orbit shape and enable retention to be analysed using the entire encounter trajectory rather than as distinct factors, periapsis and encounter speed are combined to form an encounter eccentricity.</w:t>
       </w:r>
     </w:p>
     <w:p>
@@ -2636,9 +3038,9 @@
           <w:color w:val="000000" w:themeColor="text1"/>
         </w:rPr>
         <w:drawing>
-          <wp:inline distT="0" distB="0" distL="114300" distR="114300" wp14:anchorId="485CF5A0" wp14:editId="3147C7A1">
-            <wp:extent cx="3290888" cy="2285339"/>
-            <wp:effectExtent l="0" t="0" r="0" b="0"/>
+          <wp:inline distT="0" distB="0" distL="114300" distR="114300" wp14:anchorId="485CF5A0" wp14:editId="0CBA4922">
+            <wp:extent cx="2980944" cy="2048256"/>
+            <wp:effectExtent l="0" t="0" r="3810" b="0"/>
             <wp:docPr id="5" name="image1.png"/>
             <wp:cNvGraphicFramePr/>
             <a:graphic xmlns:a="http://schemas.openxmlformats.org/drawingml/2006/main">
@@ -2657,7 +3059,7 @@
                   <pic:spPr>
                     <a:xfrm>
                       <a:off x="0" y="0"/>
-                      <a:ext cx="3290888" cy="2285339"/>
+                      <a:ext cx="2996666" cy="2059059"/>
                     </a:xfrm>
                     <a:prstGeom prst="rect">
                       <a:avLst/>
@@ -2718,6 +3120,7 @@
           <w:szCs w:val="24"/>
           <w:lang w:val="en-GB"/>
         </w:rPr>
+        <w:lastRenderedPageBreak/>
         <w:t>3.3 Model Performance and Screening Use</w:t>
       </w:r>
     </w:p>
@@ -2786,26 +3189,6 @@
         </w:rPr>
         <w:t>10% screening task, Logistic Regression obtains aggregated balanced accuracy of 0.849 and ROC AUC of 0.925, indicating that the two retention groups are reasonably separable. Continuous BMF continues to be the main output; the threshold is simply utilized for prioritisation.</w:t>
       </w:r>
-    </w:p>
-    <w:p>
-      <w:pPr>
-        <w:spacing w:before="360" w:after="80" w:line="276" w:lineRule="auto"/>
-        <w:jc w:val="both"/>
-        <w:rPr>
-          <w:rFonts w:eastAsia="Gungsuh"/>
-          <w:color w:val="000000" w:themeColor="text1"/>
-        </w:rPr>
-      </w:pPr>
-    </w:p>
-    <w:p>
-      <w:pPr>
-        <w:spacing w:before="360" w:after="80" w:line="276" w:lineRule="auto"/>
-        <w:jc w:val="both"/>
-        <w:rPr>
-          <w:rFonts w:eastAsia="Gungsuh"/>
-          <w:color w:val="000000" w:themeColor="text1"/>
-        </w:rPr>
-      </w:pPr>
     </w:p>
     <w:p>
       <w:pPr>
@@ -2832,7 +3215,6 @@
           <w:lang w:val="en-GB"/>
           <w14:ligatures w14:val="none"/>
         </w:rPr>
-        <w:lastRenderedPageBreak/>
         <w:t>Tuning Gradient Boosting improves performance from R² = 0.9142, MAE = 0.0175, and RMSE = 0.0272 to R² = 0.9234, MAE = 0.0159, and RMSE = 0.0257 (Appendix A, Tables A1-A2). Adding the tested physics-derived features produces only a small further change to R² = 0.9240, MAE = 0.0155, and RMSE = 0.0257. This additional gain is not meaningful, so the tuned Gradient Boosting model using the original simulation inputs is selected as the primary model.</w:t>
       </w:r>
       <w:r>
@@ -3023,7 +3405,14 @@
         <w:rPr>
           <w:color w:val="000000" w:themeColor="text1"/>
         </w:rPr>
-        <w:t>The overall ranking of the inputs on which the model is most dependent does not demonstrate how BMF varies with each input or whether an input's significance stays constant under various encounter circumstances. Two follow-up issues are posed in this section: (1) how does BMF change when one input is changed while the others remain unchanged, and (2) do the impacts of significant inputs hold true under various encounter conditions?</w:t>
+        <w:t xml:space="preserve">The overall ranking of the inputs on which the model is most dependent does not demonstrate how BMF varies with each input or whether an input's significance stays constant under various </w:t>
+      </w:r>
+      <w:r>
+        <w:rPr>
+          <w:color w:val="000000" w:themeColor="text1"/>
+        </w:rPr>
+        <w:lastRenderedPageBreak/>
+        <w:t>encounter circumstances. Two follow-up issues are posed in this section: (1) how does BMF change when one input is changed while the others remain unchanged, and (2) do the impacts of significant inputs hold true under various encounter conditions?</w:t>
       </w:r>
     </w:p>
     <w:p>
@@ -3038,7 +3427,6 @@
         <w:rPr>
           <w:color w:val="000000" w:themeColor="text1"/>
         </w:rPr>
-        <w:lastRenderedPageBreak/>
         <w:drawing>
           <wp:inline distT="0" distB="0" distL="0" distR="0" wp14:anchorId="0F761EB7" wp14:editId="1A6B64FD">
             <wp:extent cx="5943600" cy="4072255"/>
@@ -3148,6 +3536,7 @@
         <w:rPr>
           <w:color w:val="000000" w:themeColor="text1"/>
         </w:rPr>
+        <w:lastRenderedPageBreak/>
         <w:t>Support for the mass plot is far weaker. There are only roughly two asteroid-mass values with exact SPH scenarios in which every other selected condition is the same. There is insufficient matched data to construct a trustworthy mass trend because the available higher-mass SPH examples are likewise concentrated at low periapsis and low velocity. Therefore, rather of being viewed as a physical threshold, the sharp increase in the</w:t>
       </w:r>
       <w:r>
@@ -3160,14 +3549,7 @@
         <w:rPr>
           <w:color w:val="000000" w:themeColor="text1"/>
         </w:rPr>
-        <w:t xml:space="preserve"> curve should be considered model dependent. For the z-axis scenario that is shown, the spin-period panel is almost </w:t>
-      </w:r>
-      <w:r>
-        <w:rPr>
-          <w:color w:val="000000" w:themeColor="text1"/>
-        </w:rPr>
-        <w:lastRenderedPageBreak/>
-        <w:t>flat, indicating that altering the spin period has minimal impact in this specific configuration. This demonstrates that an input that is significant throughout the whole dataset can only have a minor impact given a particular set of encounter conditions, which does not contradict the overall significance of spin in Section 3.4.</w:t>
+        <w:t xml:space="preserve"> curve should be considered model dependent. For the z-axis scenario that is shown, the spin-period panel is almost flat, indicating that altering the spin period has minimal impact in this specific configuration. This demonstrates that an input that is significant throughout the whole dataset can only have a minor impact given a particular set of encounter conditions, which does not contradict the overall significance of spin in Section 3.4.</w:t>
       </w:r>
     </w:p>
     <w:p>
@@ -3180,6 +3562,9 @@
       </w:pPr>
       <w:r>
         <w:t>Far outside the sampled parameter ranges, tree-based predictions become stepwise or constant and need not represent physical trends (Appendix Figure A1)</w:t>
+      </w:r>
+      <w:r>
+        <w:t>.</w:t>
       </w:r>
     </w:p>
     <w:p>
@@ -3336,6 +3721,7 @@
         <w:rPr>
           <w:color w:val="000000" w:themeColor="text1"/>
         </w:rPr>
+        <w:lastRenderedPageBreak/>
         <w:t>In Figure 4, spin and velocity are used because the archive contains matched cases where these parameters can be varied while mass and key numerical and post-processing settings are kept fixed. Periapsis is then varied across the comparison. In the left panel, ΔBMF</w:t>
       </w:r>
       <w:r>
@@ -3377,7 +3763,6 @@
         <w:rPr>
           <w:color w:val="000000" w:themeColor="text1"/>
         </w:rPr>
-        <w:lastRenderedPageBreak/>
         <w:t>The outcome makes it abundantly evident that each parameter's intensity varies. Changing spin results in a BMF range of around 0.06-0.09 below about 1.5 Mars-radii. This can grow much stronger at bigger periapsis: the spin-related range increases to around 0.24 at 1.8 Mars-radii for v</w:t>
       </w:r>
       <w:r>

</xml_diff>

<commit_message>
docs: save as pdf
</commit_message>
<xml_diff>
--- a/deliverables/nny124-final-report.docx
+++ b/deliverables/nny124-final-report.docx
@@ -1631,7 +1631,7 @@
           <w:rPr>
             <w:webHidden/>
           </w:rPr>
-          <w:t>17</w:t>
+          <w:t>16</w:t>
         </w:r>
         <w:r>
           <w:rPr>
@@ -1694,7 +1694,7 @@
           <w:rPr>
             <w:webHidden/>
           </w:rPr>
-          <w:t>18</w:t>
+          <w:t>17</w:t>
         </w:r>
         <w:r>
           <w:rPr>
@@ -1757,7 +1757,7 @@
           <w:rPr>
             <w:webHidden/>
           </w:rPr>
-          <w:t>18</w:t>
+          <w:t>17</w:t>
         </w:r>
         <w:r>
           <w:rPr>
@@ -1883,7 +1883,7 @@
           <w:rPr>
             <w:webHidden/>
           </w:rPr>
-          <w:t>20</w:t>
+          <w:t>19</w:t>
         </w:r>
         <w:r>
           <w:rPr>
@@ -2329,7 +2329,7 @@
           <w:rPr>
             <w:webHidden/>
           </w:rPr>
-          <w:t>16</w:t>
+          <w:t>14</w:t>
         </w:r>
         <w:r>
           <w:rPr>

</xml_diff>

<commit_message>
docs: reduce word count
</commit_message>
<xml_diff>
--- a/deliverables/nny124-final-report.docx
+++ b/deliverables/nny124-final-report.docx
@@ -840,7 +840,19 @@
           <w:rPr>
             <w:rStyle w:val="Hyperlink"/>
           </w:rPr>
-          <w:t>2.2 Prediction Model Choices and Rationale</w:t>
+          <w:t>2.2 Prediction Model Choices and R</w:t>
+        </w:r>
+        <w:r>
+          <w:rPr>
+            <w:rStyle w:val="Hyperlink"/>
+          </w:rPr>
+          <w:t>a</w:t>
+        </w:r>
+        <w:r>
+          <w:rPr>
+            <w:rStyle w:val="Hyperlink"/>
+          </w:rPr>
+          <w:t>tionale</w:t>
         </w:r>
         <w:r>
           <w:rPr>
@@ -3037,7 +3049,13 @@
         <w:t xml:space="preserve">: </w:t>
       </w:r>
       <w:r>
-        <w:t>(1) how do orbital and physical parameters affect disruption and bound retention; (2) which inputs matter most for fragment formation and retained debris; and (3) can machine-learning models predict outcomes within the sampled data while showing when a prediction should or should not be trusted?</w:t>
+        <w:t xml:space="preserve">(1) how do orbital and physical parameters affect disruption and bound retention; (2) which inputs matter most </w:t>
+      </w:r>
+      <w:r>
+        <w:t xml:space="preserve">for </w:t>
+      </w:r>
+      <w:r>
+        <w:t>retained debris; and (3) can machine-learning models predict outcomes within the sampled data while showing when a prediction should or should not be trusted?</w:t>
       </w:r>
     </w:p>
     <w:p>
@@ -3982,32 +4000,20 @@
         <w:t>, Tables A1-A2</w:t>
       </w:r>
       <w:r>
-        <w:t xml:space="preserve">). More sophisticated alternatives, including XGBoost and two-stage hurdle models, </w:t>
-      </w:r>
-      <w:r>
-        <w:t>were also investigated bu</w:t>
-      </w:r>
-      <w:r>
-        <w:t>t were retained as exploratory models</w:t>
-      </w:r>
-      <w:r>
-        <w:t>,</w:t>
-      </w:r>
-      <w:r>
-        <w:t xml:space="preserve"> however they remained exploratory and are not covered in more detail in this project</w:t>
-      </w:r>
-      <w:r>
-        <w:t xml:space="preserve"> as t</w:t>
-      </w:r>
-      <w:r>
-        <w:t>hey introduce additional model complexity, particularly the two-stage approaches, and would require further testing and interpretation before replacing the primary model</w:t>
-      </w:r>
-      <w:r>
-        <w:t xml:space="preserve">. This was beyond the scope of the present project since the primary purpose was </w:t>
-      </w:r>
-      <w:r>
-        <w:t>to demonstrate the possibility of further model improvement in subsequent work rather than to serve as the project's primary outcome.</w:t>
-      </w:r>
+        <w:t>).</w:t>
+      </w:r>
+    </w:p>
+    <w:p>
+      <w:pPr>
+        <w:pStyle w:val="Heading2"/>
+      </w:pPr>
+      <w:bookmarkStart w:id="18" w:name="_Toc238149737"/>
+      <w:bookmarkStart w:id="19" w:name="_Toc238151077"/>
+      <w:r>
+        <w:t>2.3 Model Testing and Performance Metrics</w:t>
+      </w:r>
+      <w:bookmarkEnd w:id="18"/>
+      <w:bookmarkEnd w:id="19"/>
     </w:p>
     <w:p>
       <w:pPr>
@@ -4015,20 +4021,8 @@
         <w:jc w:val="both"/>
       </w:pPr>
       <w:r>
-        <w:t>Since this project uses a small tabular dataset of simulation inputs and numerical results, more sophisticated methods like physics-informed neural networks, which are primarily intended to learn continuous spatial or time-dependent fields while enforcing physical equations, were not investigated (Raissi et al., 2019).</w:t>
-      </w:r>
-    </w:p>
-    <w:p>
-      <w:pPr>
-        <w:pStyle w:val="Heading2"/>
-      </w:pPr>
-      <w:bookmarkStart w:id="18" w:name="_Toc238149737"/>
-      <w:bookmarkStart w:id="19" w:name="_Toc238151077"/>
-      <w:r>
-        <w:t>2.3 Model Testing and Performance Metrics</w:t>
-      </w:r>
-      <w:bookmarkEnd w:id="18"/>
-      <w:bookmarkEnd w:id="19"/>
+        <w:t xml:space="preserve">One of the main issues with the archive is that it contains repeated rows from the same physical SPH simulation, for example when the same simulation is post-processed using different FoF linking lengths. Therefore, the model might be trained on one processed version of a simulation and tested on another version of the same simulation using a random row split. 5-fold GroupKFold cross-validation was employed to prevent this. Every out-of-fold (OOF) prediction is made by a model that has not been trained on that physical simulation since all rows from the same physical simulation file are stored in the same fold. </w:t>
+      </w:r>
     </w:p>
     <w:p>
       <w:pPr>
@@ -4036,8 +4030,26 @@
         <w:jc w:val="both"/>
       </w:pPr>
       <w:r>
-        <w:t xml:space="preserve">One of the main issues with the archive is that it contains repeated rows from the same physical SPH simulation, for example when the same simulation is post-processed using different FoF linking lengths. Therefore, the model might be trained on one processed version of a simulation and tested on another version of the same simulation using a random row split. 5-fold GroupKFold cross-validation was employed to prevent this. Every out-of-fold (OOF) prediction is made by a model that has not been trained on that physical simulation since all rows from the same physical simulation file are stored in the same fold. </w:t>
-      </w:r>
+        <w:t xml:space="preserve">Regression performance is measured using </w:t>
+      </w:r>
+      <w:r>
+        <w:t>R²</w:t>
+      </w:r>
+      <w:r>
+        <w:t xml:space="preserve">, mean absolute error (MAE), and root mean squared error (RMSE). Classification performance is measured using balanced accuracy, F1, and ROC AUC. </w:t>
+      </w:r>
+    </w:p>
+    <w:p>
+      <w:pPr>
+        <w:pStyle w:val="Heading2"/>
+      </w:pPr>
+      <w:bookmarkStart w:id="20" w:name="_Toc238149738"/>
+      <w:bookmarkStart w:id="21" w:name="_Toc238151078"/>
+      <w:r>
+        <w:t>2.4 How the Physical Effects Were Analysed</w:t>
+      </w:r>
+      <w:bookmarkEnd w:id="20"/>
+      <w:bookmarkEnd w:id="21"/>
     </w:p>
     <w:p>
       <w:pPr>
@@ -4045,33 +4057,45 @@
         <w:jc w:val="both"/>
       </w:pPr>
       <w:r>
-        <w:t xml:space="preserve">Regression performance is measured using </w:t>
-      </w:r>
-      <w:r>
-        <w:t>R²</w:t>
-      </w:r>
-      <w:r>
-        <w:t xml:space="preserve">, mean absolute error (MAE), and root mean squared error (RMSE). Classification performance is measured using balanced accuracy, F1, and ROC AUC. </w:t>
-      </w:r>
+        <w:t xml:space="preserve">Although overall scores are helpful, they do not demonstrate whether the model exhibits reasonable physical behaviour in various scenarios. Three complimentary analyses are employed to verify this. </w:t>
+      </w:r>
+      <w:r>
+        <w:t>To determine how heavily the model depends on each physical input across the dataset, an input-removal test, also known as ablation, first eliminates one original input from the</w:t>
+      </w:r>
+      <w:r>
+        <w:t xml:space="preserve"> </w:t>
+      </w:r>
+      <w:r>
+        <w:t>model and analyses how much model performance declines</w:t>
+      </w:r>
+      <w:r>
+        <w:t xml:space="preserve"> </w:t>
+      </w:r>
+      <w:r>
+        <w:t>(Section 3.4). Second, to illustrate the direction and form of the model response, controlled tests alter one input while maintaining the others constant (Section 3.5, Figure 3). Third, matched SPH comparisons examine whether an input's significance varies depending on encounter circumstances (Section 3.5, Figure 4).</w:t>
+      </w:r>
+    </w:p>
+    <w:p>
+      <w:pPr>
+        <w:pStyle w:val="Heading2"/>
+      </w:pPr>
+      <w:bookmarkStart w:id="22" w:name="_Toc238149739"/>
+      <w:bookmarkStart w:id="23" w:name="_Toc238151079"/>
+      <w:r>
+        <w:t>2.5 When to Trust the Model</w:t>
+      </w:r>
+      <w:bookmarkEnd w:id="22"/>
+      <w:bookmarkEnd w:id="23"/>
     </w:p>
     <w:p>
       <w:pPr>
         <w:spacing w:before="240" w:after="240" w:line="276" w:lineRule="auto"/>
         <w:jc w:val="both"/>
       </w:pPr>
-    </w:p>
-    <w:p>
-      <w:pPr>
-        <w:pStyle w:val="Heading2"/>
-      </w:pPr>
-      <w:bookmarkStart w:id="20" w:name="_Toc238149738"/>
-      <w:bookmarkStart w:id="21" w:name="_Toc238151078"/>
       <w:r>
         <w:lastRenderedPageBreak/>
-        <w:t>2.4 How the Physical Effects Were Analysed</w:t>
-      </w:r>
-      <w:bookmarkEnd w:id="20"/>
-      <w:bookmarkEnd w:id="21"/>
+        <w:t>The method also determines whether a new setup is comparable to SPH simulations that are already in the archive because model accuracy alone cannot demonstrate the reliability of each individual forecast because an overall score can conceal areas where the model has insufficient data or produces larger errors. When there are multiple independent SPH simulations and a low held-out prediction error in the surrounding area, predictions are more reliable. When the input combination is outside the sampled region, close to the edge of the available data, or poorly sampled, predictions are deemed less accurate. Figure 5 and section 3.6 provide an analysis of these inspections.</w:t>
+      </w:r>
     </w:p>
     <w:p>
       <w:pPr>
@@ -4079,51 +4103,6 @@
         <w:jc w:val="both"/>
       </w:pPr>
       <w:r>
-        <w:t xml:space="preserve">Although overall scores are helpful, they do not demonstrate whether the model exhibits reasonable physical behaviour in various scenarios. Three complimentary analyses are employed to verify this. </w:t>
-      </w:r>
-      <w:r>
-        <w:t>To determine how heavily the model depends on each physical input across the dataset, an input-removal test, also known as ablation, first eliminates one original input from the</w:t>
-      </w:r>
-      <w:r>
-        <w:t xml:space="preserve"> </w:t>
-      </w:r>
-      <w:r>
-        <w:t>model and analyses how much model performance declines</w:t>
-      </w:r>
-      <w:r>
-        <w:t xml:space="preserve"> </w:t>
-      </w:r>
-      <w:r>
-        <w:t>(Section 3.4). Second, to illustrate the direction and form of the model response, controlled tests alter one input while maintaining the others constant (Section 3.5, Figure 3). Third, matched SPH comparisons examine whether an input's significance varies depending on encounter circumstances (Section 3.5, Figure 4).</w:t>
-      </w:r>
-    </w:p>
-    <w:p>
-      <w:pPr>
-        <w:pStyle w:val="Heading2"/>
-      </w:pPr>
-      <w:bookmarkStart w:id="22" w:name="_Toc238149739"/>
-      <w:bookmarkStart w:id="23" w:name="_Toc238151079"/>
-      <w:r>
-        <w:t>2.5 When to Trust the Model</w:t>
-      </w:r>
-      <w:bookmarkEnd w:id="22"/>
-      <w:bookmarkEnd w:id="23"/>
-    </w:p>
-    <w:p>
-      <w:pPr>
-        <w:spacing w:before="240" w:after="240" w:line="276" w:lineRule="auto"/>
-        <w:jc w:val="both"/>
-      </w:pPr>
-      <w:r>
-        <w:t>The method also determines whether a new setup is comparable to SPH simulations that are already in the archive because model accuracy alone cannot demonstrate the reliability of each individual forecast because an overall score can conceal areas where the model has insufficient data or produces larger errors. When there are multiple independent SPH simulations and a low held-out prediction error in the surrounding area, predictions are more reliable. When the input combination is outside the sampled region, close to the edge of the available data, or poorly sampled, predictions are deemed less accurate. Figure 5 and section 3.6 provide an analysis of these inspections.</w:t>
-      </w:r>
-    </w:p>
-    <w:p>
-      <w:pPr>
-        <w:spacing w:before="240" w:after="240" w:line="276" w:lineRule="auto"/>
-        <w:jc w:val="both"/>
-      </w:pPr>
-      <w:r>
         <w:t>The final decision then separates two questions: (1) how strongly the asteroid breaks up, and (2) how much material remains bound to Mars. Breakup is described by the largest-remnant fraction f</w:t>
       </w:r>
       <w:r>
@@ -4214,7 +4193,6 @@
       </w:pPr>
       <w:bookmarkStart w:id="25" w:name="_Toc238151080"/>
       <w:r>
-        <w:lastRenderedPageBreak/>
         <w:t>3. Results</w:t>
       </w:r>
       <w:bookmarkEnd w:id="24"/>
@@ -4242,6 +4220,7 @@
         <w:rPr>
           <w:lang w:val="en-US"/>
         </w:rPr>
+        <w:lastRenderedPageBreak/>
         <w:drawing>
           <wp:inline distT="0" distB="0" distL="0" distR="0" wp14:anchorId="3D017574" wp14:editId="27FC7490">
             <wp:extent cx="5332223" cy="3966693"/>
@@ -4416,35 +4395,35 @@
         <w:t xml:space="preserve"> </w:t>
       </w:r>
       <w:r>
-        <w:t xml:space="preserve">and they span substantially higher BMF and </w:t>
+        <w:t>and they span substantially higher BMF and remain non-zero over a wider periapsis range.</w:t>
+      </w:r>
+      <w:r>
+        <w:t xml:space="preserve"> Th</w:t>
+      </w:r>
+      <w:r>
+        <w:t>e 10</w:t>
+      </w:r>
+      <w:r>
+        <w:rPr>
+          <w:vertAlign w:val="superscript"/>
+        </w:rPr>
+        <w:t>19</w:t>
+      </w:r>
+      <w:r>
+        <w:t xml:space="preserve"> </w:t>
+      </w:r>
+      <w:r>
+        <w:t>kg cases are mostly in a low-retention regime. However, because the two mass groups do not contain the same combinations of velocity, spin, and periapsis, this should not be interpreted as a direct causal mass effect.</w:t>
+      </w:r>
+      <w:r>
+        <w:t xml:space="preserve"> </w:t>
+      </w:r>
+      <w:r>
+        <w:t xml:space="preserve">Overall, the results </w:t>
       </w:r>
       <w:r>
         <w:lastRenderedPageBreak/>
-        <w:t>remain non-zero over a wider periapsis range.</w:t>
-      </w:r>
-      <w:r>
-        <w:t xml:space="preserve"> Th</w:t>
-      </w:r>
-      <w:r>
-        <w:t>e 10</w:t>
-      </w:r>
-      <w:r>
-        <w:rPr>
-          <w:vertAlign w:val="superscript"/>
-        </w:rPr>
-        <w:t>19</w:t>
-      </w:r>
-      <w:r>
-        <w:t xml:space="preserve"> </w:t>
-      </w:r>
-      <w:r>
-        <w:t>kg cases are mostly in a low-retention regime. However, because the two mass groups do not contain the same combinations of velocity, spin, and periapsis, this should not be interpreted as a direct causal mass effect.</w:t>
-      </w:r>
-      <w:r>
-        <w:t xml:space="preserve"> </w:t>
-      </w:r>
-      <w:r>
-        <w:t>Overall, the results show regime-dependent behaviour, where distinct bound-mass outcomes result from varying relative effects of parameters across the parameter space</w:t>
+        <w:t>show regime-dependent behaviour, where distinct bound-mass outcomes result from varying relative effects of parameters across the parameter space</w:t>
       </w:r>
       <w:r>
         <w:t xml:space="preserve"> </w:t>
@@ -5038,25 +5017,16 @@
         <w:jc w:val="both"/>
       </w:pPr>
       <w:r>
-        <w:t>In Figure 4, spin and velocity are used because the archive contains matched cases where these parameters can be varied while mass and key numerical and post-processing settings are kept fixed. Periapsis is then varied across the comparison. In the left panel, ΔBMF</w:t>
+        <w:t>The outcome makes it abundantly evident that each parameter's intensity varies. Changing spin results in a BMF range of around 0.06-0.09 below about 1.5 Mars-radii. This can grow much stronger at bigger periapsis: the spin-related range increases to around 0.24 at 1.8 Mars-radii for v</w:t>
       </w:r>
       <w:r>
         <w:rPr>
           <w:vertAlign w:val="subscript"/>
         </w:rPr>
-        <w:t>spin</w:t>
-      </w:r>
-      <w:r>
-        <w:t>​ is the difference between the largest and smallest BMF across available spin states while velocity is fixed. In the right panel, ΔBMF</w:t>
-      </w:r>
-      <w:r>
-        <w:rPr>
-          <w:vertAlign w:val="subscript"/>
-        </w:rPr>
-        <w:t>velocity</w:t>
-      </w:r>
-      <w:r>
-        <w:t>​ is the same range across available velocities while spin is fixed. A larger ΔBMF means that changing that parameter makes a larger difference to the retained mass under those conditions.</w:t>
+        <w:t>∞</w:t>
+      </w:r>
+      <w:r>
+        <w:t>=0, while various other velocity groups reach approximately 0.14-0.22 between 1.6 and 2.0 Mars-radii. The pattern of velocity is distinct. The velocity-related BMF range for the no-spin instances is approximately 0.18 at 1.2-1.4 Mars radii, decreases to approximately 0.14 at 1.6 Mars radii, and reaches zero by 1.8 Mars radii. On the other hand, velocity-related ranges of roughly 0.15-0.19 between 1.6 and 2.0 Mars-radii are still seen in the sampled prograde z-spin situations.</w:t>
       </w:r>
     </w:p>
     <w:p>
@@ -5065,21 +5035,20 @@
         <w:jc w:val="both"/>
       </w:pPr>
       <w:r>
-        <w:t>The outcome makes it abundantly evident that each parameter's intensity varies. Changing spin results in a BMF range of around 0.06-0.09 below about 1.5 Mars-radii. This can grow much stronger at bigger periapsis: the spin-related range increases to around 0.24 at 1.8 Mars-radii for v</w:t>
-      </w:r>
-      <w:r>
-        <w:rPr>
-          <w:vertAlign w:val="subscript"/>
-        </w:rPr>
-        <w:t>∞</w:t>
-      </w:r>
-      <w:r>
-        <w:t xml:space="preserve">=0, while various other velocity groups reach approximately 0.14-0.22 between 1.6 and 2.0 Mars-radii. The pattern of velocity is distinct. The velocity-related BMF range for the no-spin </w:t>
-      </w:r>
-      <w:r>
-        <w:lastRenderedPageBreak/>
-        <w:t>instances is approximately 0.18 at 1.2-1.4 Mars radii, decreases to approximately 0.14 at 1.6 Mars radii, and reaches zero by 1.8 Mars radii. On the other hand, velocity-related ranges of roughly 0.15-0.19 between 1.6 and 2.0 Mars-radii are still seen in the sampled prograde z-spin situations.</w:t>
-      </w:r>
+        <w:t>These findings support the importance of regime-dependent parameters: the overall ablation ranking is not universal because spin predominates under some situations while velocity predominates under others.</w:t>
+      </w:r>
+    </w:p>
+    <w:p>
+      <w:pPr>
+        <w:pStyle w:val="Heading2"/>
+      </w:pPr>
+      <w:bookmarkStart w:id="41" w:name="_Toc238149746"/>
+      <w:bookmarkStart w:id="42" w:name="_Toc238151086"/>
+      <w:r>
+        <w:t>3.6 Where the Model Can and Cannot Be Trusted</w:t>
+      </w:r>
+      <w:bookmarkEnd w:id="41"/>
+      <w:bookmarkEnd w:id="42"/>
     </w:p>
     <w:p>
       <w:pPr>
@@ -5087,27 +5056,7 @@
         <w:jc w:val="both"/>
       </w:pPr>
       <w:r>
-        <w:t>These findings support the importance of regime-dependent parameters: the overall ablation ranking is not universal because spin predominates under some situations while velocity predominates under others.</w:t>
-      </w:r>
-    </w:p>
-    <w:p>
-      <w:pPr>
-        <w:pStyle w:val="Heading2"/>
-      </w:pPr>
-      <w:bookmarkStart w:id="41" w:name="_Toc238149746"/>
-      <w:bookmarkStart w:id="42" w:name="_Toc238151086"/>
-      <w:r>
-        <w:t>3.6 Where the Model Can and Cannot Be Trusted</w:t>
-      </w:r>
-      <w:bookmarkEnd w:id="41"/>
-      <w:bookmarkEnd w:id="42"/>
-    </w:p>
-    <w:p>
-      <w:pPr>
-        <w:spacing w:before="240" w:after="240" w:line="276" w:lineRule="auto"/>
-        <w:jc w:val="both"/>
-      </w:pPr>
-      <w:r>
+        <w:lastRenderedPageBreak/>
         <w:t>The quantity of local SPH data and prediction error both influence trust. Instead of counting repeated FoF rows, the coverage-error maps count distinct physical simulations and compare that number to the average held-out absolute error in the same area. While sparse or fringe regions can have significantly worse error, regions with many simulations typically have lower error. Low error is insufficient on its own; certain poorly sampled locations appear simple simply because the true BMF is typically zero.</w:t>
       </w:r>
     </w:p>
@@ -5750,6 +5699,9 @@
       <w:r>
         <w:t>While BMF calculates the amount of material that is still attached to Mars, the largest-remnant fraction indicates whether the asteroid is largely intact, breaks apart somewhat, or is seriously disturbed. Strong disruption can nevertheless result in primarily fleeing debris, which is why both outcomes are distinct.</w:t>
       </w:r>
+      <w:r>
+        <w:t xml:space="preserve"> </w:t>
+      </w:r>
     </w:p>
     <w:p>
       <w:pPr>
@@ -5757,8 +5709,20 @@
         <w:jc w:val="both"/>
       </w:pPr>
       <w:r>
-        <w:t>Therefore, only promising situations are prioritized for additional SPH simulation using the 10% BMF threshold. It does not guaranty the formation of a moon. Additionally, comparing the current combined mass of Phobos and Deimos with the expected bound mass is merely a minimal way to ensure that there is sufficient material. This model does not account for later processes such debris survival, orbital circularization, disk creation, and accretion into moons, which call for more physical modelling.</w:t>
-      </w:r>
+        <w:t>As a result, the prototype provides the breakup class, estimated Mars-bound mass, expected BMF, data coverage, and a recommendation about the use of SPH. While sparse, edge, transition, or doubtful instances should be examined with SPH, well-supported cases can be swiftly evaluated with ML.</w:t>
+      </w:r>
+    </w:p>
+    <w:p>
+      <w:pPr>
+        <w:pStyle w:val="Heading1"/>
+      </w:pPr>
+      <w:bookmarkStart w:id="47" w:name="_Toc238149748"/>
+      <w:bookmarkStart w:id="48" w:name="_Toc238151088"/>
+      <w:r>
+        <w:t>4. Discussion</w:t>
+      </w:r>
+      <w:bookmarkEnd w:id="47"/>
+      <w:bookmarkEnd w:id="48"/>
     </w:p>
     <w:p>
       <w:pPr>
@@ -5766,20 +5730,8 @@
         <w:jc w:val="both"/>
       </w:pPr>
       <w:r>
-        <w:t>As a result, the prototype provides the breakup class, estimated Mars-bound mass, expected BMF, data coverage, and a recommendation about the use of SPH. While sparse, edge, transition, or doubtful instances should be examined with SPH, well-supported cases can be swiftly evaluated with ML.</w:t>
-      </w:r>
-    </w:p>
-    <w:p>
-      <w:pPr>
-        <w:pStyle w:val="Heading1"/>
-      </w:pPr>
-      <w:bookmarkStart w:id="47" w:name="_Toc238149748"/>
-      <w:bookmarkStart w:id="48" w:name="_Toc238151088"/>
-      <w:r>
-        <w:t>4. Discussion</w:t>
-      </w:r>
-      <w:bookmarkEnd w:id="47"/>
-      <w:bookmarkEnd w:id="48"/>
+        <w:t>The clearest periapsis and velocity trends are seen in the controlled experiments, while the matched comparisons show that the effects of spin and velocity vary with encounter conditions. The behaviour in Figure 3 is consistent with the other analyses: although most larger-periapsis cases have near-zero BMF, Figures 1, 4, and 5 show that non-zero retention can still occur under particular combinations of spin, velocity, and mass. This indicates that similar periapsis values can produce different outcomes depending on the full encounter conditions. These relationships are learned from SPH outputs and support interpretation rather than proving physical causality.</w:t>
+      </w:r>
     </w:p>
     <w:p>
       <w:pPr>
@@ -5787,40 +5739,7 @@
         <w:jc w:val="both"/>
       </w:pPr>
       <w:r>
-        <w:t>The clearest periapsis and velocity trends are seen in the controlled experiments, while the matched comparisons show that the effects of spin and velocity vary with encounter conditions.</w:t>
-      </w:r>
-      <w:r>
-        <w:t xml:space="preserve"> </w:t>
-      </w:r>
-      <w:r>
-        <w:t>The model learns these relationships from the SPH results rather than directly from physical equations. However, the behaviour i</w:t>
-      </w:r>
-      <w:r>
-        <w:t xml:space="preserve">n </w:t>
-      </w:r>
-      <w:r>
-        <w:t>Figure 3 is consistent with the other analyses. At larger periapsis, the controlled Gradient Boosting prediction remains slightly above the available SPH results before falling to approximately zero at about 2.5 Mars radii.</w:t>
-      </w:r>
-      <w:r>
-        <w:t xml:space="preserve"> </w:t>
-      </w:r>
-      <w:r>
-        <w:t>In Figure 1, most cases at larger periapsis are close to zero BMF, but one prograde-spin case still retains about 3-4% BMF at 2.6 Mars radii. Figure 4 also shows that the BMF differences associated with spin and velocity can become larger at higher periapsis, indicating that the outcome there depends on the full encounter conditions rather than periapsis alone. Figure 5 shows the same idea from the mass-periapsis coverage: at around 2.6 Mars radii, the 1019kg bin has mean BMF = 0, while the 10</w:t>
-      </w:r>
-      <w:r>
-        <w:rPr>
-          <w:vertAlign w:val="superscript"/>
-        </w:rPr>
-        <w:t>20</w:t>
-      </w:r>
-      <w:r>
-        <w:rPr>
-          <w:vertAlign w:val="superscript"/>
-        </w:rPr>
-        <w:t xml:space="preserve"> </w:t>
-      </w:r>
-      <w:r>
-        <w:t>kg bin still contains non-zero BMF cases. This does not prove that higher mass directly causes higher BMF, because the other encounter parameters also differ, but it shows that similar periapsis values can still produce different outcomes under different conditions.</w:t>
+        <w:t>The primary physical outcome is that each parameter's impact is contingent upon the other encounter conditions. Within those parameters, periapsis determines the overall strength of the tidal encounter, encounter speed influences the duration of the contact and the favourable capture, and mass and spin alter the outcome. The most obvious periapsis and speed directions are found in the controlled experiments. The paired simulations demonstrate how periapsis and spin state affect the magnitude of the spin and velocity impacts.</w:t>
       </w:r>
     </w:p>
     <w:p>
@@ -5829,8 +5748,7 @@
         <w:jc w:val="both"/>
       </w:pPr>
       <w:r>
-        <w:lastRenderedPageBreak/>
-        <w:t>The primary physical outcome is that each parameter's impact is contingent upon the other encounter conditions. Within those parameters, periapsis determines the overall strength of the tidal encounter, encounter speed influences the duration of the contact and the favourable capture, and mass and spin alter the outcome. The most obvious periapsis and speed directions are found in the controlled experiments. The paired simulations demonstrate how periapsis and spin state affect the magnitude of the spin and velocity impacts.</w:t>
+        <w:t>Though these associations are acquired from SPH outputs rather than from physical laws, the ML model replicates general trends and reveals interactions throughout the archive. As a result, matched comparisons, controlled tests, and group validation support interpretation but do not prove causality.</w:t>
       </w:r>
     </w:p>
     <w:p>
@@ -5839,7 +5757,17 @@
         <w:jc w:val="both"/>
       </w:pPr>
       <w:r>
-        <w:t>Though these associations are acquired from SPH outputs rather than from physical laws, the ML model replicates general trends and reveals interactions throughout the archive. As a result, matched comparisons, controlled tests, and group validation support interpretation but do not prove causality.</w:t>
+        <w:lastRenderedPageBreak/>
+        <w:t>As a result, ML's usefulness is restricted. It can swiftly filter well-supported input combinations, identify transition zones, uncover situations that yield promising retained mass, and indicate areas where more simulation could yield valuable information. Long-term debris survivability, precise fragment shapes and distributions from BMF alone, and forecasts for inadequately sampled input combinations cannot all be determined by it. This is evident from the 10</w:t>
+      </w:r>
+      <w:r>
+        <w:rPr>
+          <w:vertAlign w:val="superscript"/>
+        </w:rPr>
+        <w:t>19.5</w:t>
+      </w:r>
+      <w:r>
+        <w:t xml:space="preserve"> kg example: when only two independent simulations support the local combination, being numerically inside the training range is insufficient.</w:t>
       </w:r>
     </w:p>
     <w:p>
@@ -5848,16 +5776,7 @@
         <w:jc w:val="both"/>
       </w:pPr>
       <w:r>
-        <w:t>As a result, ML's usefulness is restricted. It can swiftly filter well-supported input combinations, identify transition zones, uncover situations that yield promising retained mass, and indicate areas where more simulation could yield valuable information. Long-term debris survivability, precise fragment shapes and distributions from BMF alone, and forecasts for inadequately sampled input combinations cannot all be determined by it. This is evident from the 10</w:t>
-      </w:r>
-      <w:r>
-        <w:rPr>
-          <w:vertAlign w:val="superscript"/>
-        </w:rPr>
-        <w:t>19.5</w:t>
-      </w:r>
-      <w:r>
-        <w:t xml:space="preserve"> kg example: when only two independent simulations support the local combination, being numerically inside the training range is insufficient.</w:t>
+        <w:t>Different questions are addressed by the matching and ablation analysis. Although matching cases demonstrate that spin or velocity can become more significant under specific encounter settings, periapsis is generally the strongest.</w:t>
       </w:r>
     </w:p>
     <w:p>
@@ -5866,7 +5785,7 @@
         <w:jc w:val="both"/>
       </w:pPr>
       <w:r>
-        <w:t>Different questions are addressed by the matching and ablation analysis. Although matching cases demonstrate that spin or velocity can become more significant under specific encounter settings, periapsis is generally the strongest.</w:t>
+        <w:t>Compared to BMF, fragmentation requires more prudence. Strong fragmentation is possible but not guaranteed by close periapsis, and the number of pieces is directly altered by the FoF connecting length. Therefore, rather than taking the place of BMF, fragment count and largest-remnant metrics offer additional information. Strong breakup does not always result in much bound debris, therefore the procedure separates breakup severity from Mars-bound retention.</w:t>
       </w:r>
     </w:p>
     <w:p>
@@ -5875,8 +5794,32 @@
         <w:jc w:val="both"/>
       </w:pPr>
       <w:r>
-        <w:t>Compared to BMF, fragmentation requires more prudence. Strong fragmentation is possible but not guaranteed by close periapsis, and the number of pieces is directly altered by the FoF connecting length. Therefore, rather than taking the place of BMF, fragment count and largest-remnant metrics offer additional information. Strong breakup does not always result in much bound debris, therefore the procedure separates breakup severity from Mars-bound retention.</w:t>
-      </w:r>
+        <w:t>All things considered, the ML model is a quick screening method for the current SPH archive. Poorly sampled cases, transition regions, and issues requiring certain fragment attributes still require SPH.</w:t>
+      </w:r>
+    </w:p>
+    <w:p>
+      <w:pPr>
+        <w:pStyle w:val="Heading1"/>
+      </w:pPr>
+      <w:bookmarkStart w:id="49" w:name="_Toc238149749"/>
+      <w:bookmarkStart w:id="50" w:name="_Toc238151089"/>
+      <w:r>
+        <w:t>5. Conclusions, Limitations and Future Work</w:t>
+      </w:r>
+      <w:bookmarkEnd w:id="49"/>
+      <w:bookmarkEnd w:id="50"/>
+    </w:p>
+    <w:p>
+      <w:pPr>
+        <w:pStyle w:val="Heading2"/>
+      </w:pPr>
+      <w:bookmarkStart w:id="51" w:name="_Toc238149750"/>
+      <w:bookmarkStart w:id="52" w:name="_Toc238151090"/>
+      <w:r>
+        <w:t>5.1 Conclusions and Answers to the Research Questions</w:t>
+      </w:r>
+      <w:bookmarkEnd w:id="51"/>
+      <w:bookmarkEnd w:id="52"/>
     </w:p>
     <w:p>
       <w:pPr>
@@ -5884,32 +5827,8 @@
         <w:jc w:val="both"/>
       </w:pPr>
       <w:r>
-        <w:t>All things considered, the ML model is a quick screening method for the current SPH archive. Poorly sampled cases, transition regions, and issues requiring certain fragment attributes still require SPH.</w:t>
-      </w:r>
-    </w:p>
-    <w:p>
-      <w:pPr>
-        <w:pStyle w:val="Heading1"/>
-      </w:pPr>
-      <w:bookmarkStart w:id="49" w:name="_Toc238149749"/>
-      <w:bookmarkStart w:id="50" w:name="_Toc238151089"/>
-      <w:r>
-        <w:t>5. Conclusions, Limitations and Future Work</w:t>
-      </w:r>
-      <w:bookmarkEnd w:id="49"/>
-      <w:bookmarkEnd w:id="50"/>
-    </w:p>
-    <w:p>
-      <w:pPr>
-        <w:pStyle w:val="Heading2"/>
-      </w:pPr>
-      <w:bookmarkStart w:id="51" w:name="_Toc238149750"/>
-      <w:bookmarkStart w:id="52" w:name="_Toc238151090"/>
-      <w:r>
-        <w:t>5.1 Conclusions and Answers to the Research Questions</w:t>
-      </w:r>
-      <w:bookmarkEnd w:id="51"/>
-      <w:bookmarkEnd w:id="52"/>
+        <w:t>This study sought to determine which inputs are most important for fragment creation and retained debris, how orbital and physical characteristics affect disruption and bound retention, and whether machine learning (ML) can forecast outcomes while indicating when its predictions should be believed. Below is a summary of the responses.</w:t>
+      </w:r>
     </w:p>
     <w:p>
       <w:pPr>
@@ -5917,7 +5836,25 @@
         <w:jc w:val="both"/>
       </w:pPr>
       <w:r>
-        <w:t>This study sought to determine which inputs are most important for fragment creation and retained debris, how orbital and physical characteristics affect disruption and bound retention, and whether machine learning (ML) can forecast outcomes while indicating when its predictions should be believed. Below is a summary of the responses.</w:t>
+        <w:t>Q</w:t>
+      </w:r>
+      <w:r>
+        <w:t>uestion 1:</w:t>
+      </w:r>
+      <w:r>
+        <w:t xml:space="preserve"> How do orbital and physical parameters </w:t>
+      </w:r>
+      <w:r>
+        <w:t>affect disruption and bound retention</w:t>
+      </w:r>
+      <w:r>
+        <w:t xml:space="preserve">? </w:t>
+      </w:r>
+      <w:r>
+        <w:t xml:space="preserve">Although the impact varies depending on the other inputs, closer and slower contacts typically retain more debris. In the representative controlled test, </w:t>
+      </w:r>
+      <w:r>
+        <w:t>predicted BMF generally decreases from roughly 27% at 1.2 Mars radii to approximately zero by about 2.5 Mars radii as periapsis increases. A similarly clear decline occurs as encounter speed increases, from roughly 25% at low velocity to approximately zero by about 1.2 km/s. Rather than being universal thresholds, these reactions are condition specific. Mass and spin alter the outcome, speed alters the encounter and capture conditions, and periapsis regulates tidal power.</w:t>
       </w:r>
     </w:p>
     <w:p>
@@ -5926,26 +5863,53 @@
         <w:jc w:val="both"/>
       </w:pPr>
       <w:r>
+        <w:t>Q</w:t>
+      </w:r>
+      <w:r>
+        <w:t xml:space="preserve">uestion </w:t>
+      </w:r>
+      <w:r>
+        <w:t>2</w:t>
+      </w:r>
+      <w:r>
+        <w:t>:</w:t>
+      </w:r>
+      <w:r>
+        <w:t xml:space="preserve"> </w:t>
+      </w:r>
+      <w:r>
+        <w:t>Which</w:t>
+      </w:r>
+      <w:r>
+        <w:t xml:space="preserve"> inputs matter most for retained debris? </w:t>
+      </w:r>
+      <w:r>
+        <w:t xml:space="preserve">There is no single universal ranking under all encounter conditions. </w:t>
+      </w:r>
+      <w:r>
+        <w:t xml:space="preserve">For BMF, the tuned Gradient Boosting input-removal analysis </w:t>
+      </w:r>
+      <w:r>
         <w:lastRenderedPageBreak/>
-        <w:t>Q</w:t>
-      </w:r>
-      <w:r>
-        <w:t>uestion 1:</w:t>
-      </w:r>
-      <w:r>
-        <w:t xml:space="preserve"> How do orbital and physical parameters </w:t>
-      </w:r>
-      <w:r>
-        <w:t>affect disruption and bound retention</w:t>
-      </w:r>
-      <w:r>
-        <w:t xml:space="preserve">? </w:t>
-      </w:r>
-      <w:r>
-        <w:t xml:space="preserve">Although the impact varies depending on the other inputs, closer and slower contacts typically retain more debris. In the representative controlled test, </w:t>
-      </w:r>
-      <w:r>
-        <w:t>predicted BMF generally decreases from roughly 27% at 1.2 Mars radii to approximately zero by about 2.5 Mars radii as periapsis increases. A similarly clear decline occurs as encounter speed increases, from roughly 25% at low velocity to approximately zero by about 1.2 km/s. Rather than being universal thresholds, these reactions are condition specific. Mass and spin alter the outcome, speed alters the encounter and capture conditions, and periapsis regulates tidal power.</w:t>
+        <w:t xml:space="preserve">identifies periapsis as the strongest overall physical input, with its removal causing the largest decrease in performance (ΔR² = </w:t>
+      </w:r>
+      <w:r>
+        <w:t>-</w:t>
+      </w:r>
+      <w:r>
+        <w:t>0.574), followed by spin (</w:t>
+      </w:r>
+      <w:r>
+        <w:t>-</w:t>
+      </w:r>
+      <w:r>
+        <w:t>0.316) and velocity (</w:t>
+      </w:r>
+      <w:r>
+        <w:t>-</w:t>
+      </w:r>
+      <w:r>
+        <w:t>0.296). However, matched cases show that their relative importance changes locally.</w:t>
       </w:r>
     </w:p>
     <w:p>
@@ -5960,7 +5924,7 @@
         <w:t xml:space="preserve">uestion </w:t>
       </w:r>
       <w:r>
-        <w:t>2</w:t>
+        <w:t>3</w:t>
       </w:r>
       <w:r>
         <w:t>:</w:t>
@@ -5969,37 +5933,22 @@
         <w:t xml:space="preserve"> </w:t>
       </w:r>
       <w:r>
-        <w:t>Which</w:t>
-      </w:r>
-      <w:r>
-        <w:t xml:space="preserve"> inputs matter most for fragment formation and retained debris? </w:t>
-      </w:r>
-      <w:r>
-        <w:t xml:space="preserve">There is no single universal ranking under all encounter conditions. For BMF, the tuned Gradient Boosting input-removal analysis identifies periapsis as the strongest overall physical input, with its removal causing the largest decrease in performance (ΔR² = </w:t>
-      </w:r>
-      <w:r>
-        <w:t>-</w:t>
-      </w:r>
-      <w:r>
-        <w:t>0.574), followed by spin (</w:t>
-      </w:r>
-      <w:r>
-        <w:t>-</w:t>
-      </w:r>
-      <w:r>
-        <w:t>0.316) and velocity (</w:t>
-      </w:r>
-      <w:r>
-        <w:t>-</w:t>
-      </w:r>
-      <w:r>
-        <w:t>0.296). However, matched cases show that their relative importance changes locally. Changing spin produces a BMF range of roughly 0.06</w:t>
-      </w:r>
-      <w:r>
-        <w:t>-</w:t>
-      </w:r>
-      <w:r>
-        <w:t>0.09 below 1.5 Mars radii and up to roughly 0.24 at larger periapsis, while velocity can produce similarly large differences under other conditions. Fragmentation requires separate interpretation because fragment count depends partly on the FoF definition and BMF measures retained debris rather than breakup severity. Because BMF measures retained debris rather than breakup severity, fragmentation is considered separately using fragment count and the largest-remnant fraction.</w:t>
+        <w:t>Can machine-learning models predict outcomes within the sampled data while showing when a prediction should or should not be trusted</w:t>
+      </w:r>
+      <w:r>
+        <w:t xml:space="preserve">? </w:t>
+      </w:r>
+      <w:r>
+        <w:t>Yes, in cases where the SPH archive supports comparable input combinations. The primary tuned Gradient Boosting model using the original simulation inputs obtains a grouped cross-validated R² of 0.9234, MAE of 0.0159, and RMSE of 0.0257. Adding physics-derived features produces only a small further change to R² = 0.9240 and MAE = 0.0155, with RMSE unchanged at 0.0257, so the simpler tuned model is retained. Performance is not equally dependable everywhere, however. Despite the input values falling within the numerical training ranges, held-out errors increase to roughly 0.08 BMF, or 8 percentage points, in the sparsely sampled 10</w:t>
+      </w:r>
+      <w:r>
+        <w:rPr>
+          <w:vertAlign w:val="superscript"/>
+        </w:rPr>
+        <w:t>19.5</w:t>
+      </w:r>
+      <w:r>
+        <w:t xml:space="preserve"> kg example. This demonstrates that being within the overall input range is insufficient for a reliable prediction; comparable SPH cases must also exist nearby in the sampled parameter space. Thus, ML can support rapid screening and simulation prioritisation, while sparse, edge, transition, or poorly supported cases still require additional SPH investigation.</w:t>
       </w:r>
     </w:p>
     <w:p>
@@ -6008,38 +5957,20 @@
         <w:jc w:val="both"/>
       </w:pPr>
       <w:r>
-        <w:t>Q</w:t>
-      </w:r>
-      <w:r>
-        <w:t xml:space="preserve">uestion </w:t>
-      </w:r>
-      <w:r>
-        <w:t>3</w:t>
-      </w:r>
-      <w:r>
-        <w:t>:</w:t>
-      </w:r>
-      <w:r>
-        <w:t xml:space="preserve"> </w:t>
-      </w:r>
-      <w:r>
-        <w:t>Can machine-learning models predict outcomes within the sampled data while showing when a prediction should or should not be trusted</w:t>
-      </w:r>
-      <w:r>
-        <w:t xml:space="preserve">? </w:t>
-      </w:r>
-      <w:r>
-        <w:t>Yes, in cases where the SPH archive supports comparable input combinations. The primary tuned Gradient Boosting model using the original simulation inputs obtains a grouped cross-validated R² of 0.9234, MAE of 0.0159, and RMSE of 0.0257. Adding physics-derived features produces only a small further change to R² = 0.9240 and MAE = 0.0155, with RMSE unchanged at 0.0257, so the simpler tuned model is retained. Performance is not equally dependable everywhere, however. Despite the input values falling within the numerical training ranges, held-out errors increase to roughly 0.08 BMF, or 8 percentage points, in the sparsely sampled 10</w:t>
-      </w:r>
-      <w:r>
-        <w:rPr>
-          <w:vertAlign w:val="superscript"/>
-        </w:rPr>
-        <w:t>19.5</w:t>
-      </w:r>
-      <w:r>
-        <w:t xml:space="preserve"> kg example. This demonstrates that being within the overall input range is insufficient for a reliable prediction; comparable SPH cases must also exist nearby in the sampled parameter space. Thus, ML can support rapid screening and simulation prioritisation, while sparse, edge, transition, or poorly supported cases still require additional SPH investigation.</w:t>
-      </w:r>
+        <w:t>Overall, the project shows that tidal-disruption outcomes depend on interacting physical conditions rather than one universal ranking of parameters. Machine learning makes the existing SPH archive faster to explore, shows where predictions are well supported, and highlights where new simulations would be most useful. It complements SPH rather than replacing the simulation physics.</w:t>
+      </w:r>
+    </w:p>
+    <w:p>
+      <w:pPr>
+        <w:pStyle w:val="Heading2"/>
+      </w:pPr>
+      <w:bookmarkStart w:id="53" w:name="_Toc238149751"/>
+      <w:bookmarkStart w:id="54" w:name="_Toc238151091"/>
+      <w:r>
+        <w:t>5.2 Limitations</w:t>
+      </w:r>
+      <w:bookmarkEnd w:id="53"/>
+      <w:bookmarkEnd w:id="54"/>
     </w:p>
     <w:p>
       <w:pPr>
@@ -6047,21 +5978,8 @@
         <w:jc w:val="both"/>
       </w:pPr>
       <w:r>
-        <w:t>Overall, the project shows that tidal-disruption outcomes depend on interacting physical conditions rather than one universal ranking of parameters. Machine learning makes the existing SPH archive faster to explore, shows where predictions are well supported, and highlights where new simulations would be most useful. It complements SPH rather than replacing the simulation physics.</w:t>
-      </w:r>
-    </w:p>
-    <w:p>
-      <w:pPr>
-        <w:pStyle w:val="Heading2"/>
-      </w:pPr>
-      <w:bookmarkStart w:id="53" w:name="_Toc238149751"/>
-      <w:bookmarkStart w:id="54" w:name="_Toc238151091"/>
-      <w:r>
-        <w:lastRenderedPageBreak/>
-        <w:t>5.2 Limitations</w:t>
-      </w:r>
-      <w:bookmarkEnd w:id="53"/>
-      <w:bookmarkEnd w:id="54"/>
+        <w:t>The simulation archive's short size and uneven sampling are its primary drawbacks. A single SPH simulation can be analysed in multiple ways, hence many rows are not independent physical evidence. Although it is unable to produce missing simulations, group validation keeps the test score from becoming unduly optimistic. Even when each individual input value falls between its reported minimum and maximum, predictions are still unclear for combinations that are poorly sampled, close to the data's edges, or outside the combinations observed during training.</w:t>
+      </w:r>
     </w:p>
     <w:p>
       <w:pPr>
@@ -6069,7 +5987,7 @@
         <w:jc w:val="both"/>
       </w:pPr>
       <w:r>
-        <w:t>The simulation archive's short size and uneven sampling are its primary drawbacks. A single SPH simulation can be analysed in multiple ways, hence many rows are not independent physical evidence. Although it is unable to produce missing simulations, group validation keeps the test score from becoming unduly optimistic. Even when each individual input value falls between its reported minimum and maximum, predictions are still unclear for combinations that are poorly sampled, close to the data's edges, or outside the combinations observed during training.</w:t>
+        <w:t xml:space="preserve">Additionally, instead of solving the physical laws directly, the ML model learns patterns from SPH results. It does not follow the subsequent orbits of fragments and does not impose conservation of mass, momentum, energy, or angular momentum. Therefore, a reliable BMF prediction cannot determine whether debris accumulates into moons, forms a disk, or endures for a long time. Additionally, fragment measurements are more sensitive to the FoF connecting length employed in post-processing and are noisier than BMF. </w:t>
       </w:r>
     </w:p>
     <w:p>
@@ -6078,8 +5996,30 @@
         <w:jc w:val="both"/>
       </w:pPr>
       <w:r>
-        <w:t xml:space="preserve">Additionally, instead of solving the physical laws directly, the ML model learns patterns from SPH results. It does not follow the subsequent orbits of fragments and does not impose conservation of mass, momentum, energy, or angular momentum. Therefore, a reliable BMF prediction cannot determine whether debris accumulates into moons, forms a disk, or endures for a long time. Additionally, fragment measurements are more sensitive to the FoF connecting length employed in post-processing and are noisier than BMF. </w:t>
-      </w:r>
+        <w:t xml:space="preserve">Higher grouped-validation scores are obtained by exploratory XGBoost and hurdle models, but more testing is necessary before they can take the place of the primary </w:t>
+      </w:r>
+      <w:r>
+        <w:t>Gradient Boosting</w:t>
+      </w:r>
+      <w:r>
+        <w:t xml:space="preserve">. Because </w:t>
+      </w:r>
+      <w:r>
+        <w:lastRenderedPageBreak/>
+        <w:t>outcome-derived quantities are not known prior to simulation, models that employ them are not appropriate for pre-SPH screening.</w:t>
+      </w:r>
+    </w:p>
+    <w:p>
+      <w:pPr>
+        <w:pStyle w:val="Heading2"/>
+      </w:pPr>
+      <w:bookmarkStart w:id="55" w:name="_Toc238149752"/>
+      <w:bookmarkStart w:id="56" w:name="_Toc238151092"/>
+      <w:r>
+        <w:t>5.3 Future Work</w:t>
+      </w:r>
+      <w:bookmarkEnd w:id="55"/>
+      <w:bookmarkEnd w:id="56"/>
     </w:p>
     <w:p>
       <w:pPr>
@@ -6087,26 +6027,29 @@
         <w:jc w:val="both"/>
       </w:pPr>
       <w:r>
-        <w:t xml:space="preserve">Higher grouped-validation scores are obtained by exploratory XGBoost and hurdle models, but more testing is necessary before they can take the place of the primary </w:t>
-      </w:r>
-      <w:r>
-        <w:t>Gradient Boosting</w:t>
-      </w:r>
-      <w:r>
-        <w:t>. Because outcome-derived quantities are not known prior to simulation, models that employ them are not appropriate for pre-SPH screening.</w:t>
-      </w:r>
-    </w:p>
-    <w:p>
-      <w:pPr>
-        <w:pStyle w:val="Heading2"/>
-      </w:pPr>
-      <w:bookmarkStart w:id="55" w:name="_Toc238149752"/>
-      <w:bookmarkStart w:id="56" w:name="_Toc238151092"/>
-      <w:r>
-        <w:t>5.3 Future Work</w:t>
-      </w:r>
-      <w:bookmarkEnd w:id="55"/>
-      <w:bookmarkEnd w:id="56"/>
+        <w:t>The highest priority for future work is to run new SPH simulations in poorly covered mass-periapsis-velocity-spin combinations, especially near the change between retained and zero BMF. More matched groups should repeat the A</w:t>
+      </w:r>
+      <w:r>
+        <w:rPr>
+          <w:vertAlign w:val="subscript"/>
+        </w:rPr>
+        <w:t>2000</w:t>
+      </w:r>
+      <w:r>
+        <w:t>, n</w:t>
+      </w:r>
+      <w:r>
+        <w:rPr>
+          <w:vertAlign w:val="subscript"/>
+        </w:rPr>
+        <w:t>65</w:t>
+      </w:r>
+      <w:r>
+        <w:t xml:space="preserve"> comparison at other masses and resolutions while keeping processing choices fixed. </w:t>
+      </w:r>
+      <w:r>
+        <w:t>It would be possible to determine whether the stronger spin disparities also occur in other groups by reporting the BMF range together with the actual BMF values and the number of independent simulations. It would be more robust to test the model on whole new SPH runs created after training rather than repeatedly dividing the current library.</w:t>
+      </w:r>
     </w:p>
     <w:p>
       <w:pPr>
@@ -6114,36 +6057,6 @@
         <w:jc w:val="both"/>
       </w:pPr>
       <w:r>
-        <w:t>The highest priority for future work is to run new SPH simulations in poorly covered mass-periapsis-velocity-spin combinations, especially near the change between retained and zero BMF. More matched groups should repeat the A</w:t>
-      </w:r>
-      <w:r>
-        <w:rPr>
-          <w:vertAlign w:val="subscript"/>
-        </w:rPr>
-        <w:t>2000</w:t>
-      </w:r>
-      <w:r>
-        <w:t>, n</w:t>
-      </w:r>
-      <w:r>
-        <w:rPr>
-          <w:vertAlign w:val="subscript"/>
-        </w:rPr>
-        <w:t>65</w:t>
-      </w:r>
-      <w:r>
-        <w:t xml:space="preserve"> comparison at other masses and resolutions while keeping processing choices fixed. </w:t>
-      </w:r>
-      <w:r>
-        <w:t>It would be possible to determine whether the stronger spin disparities also occur in other groups by reporting the BMF range together with the actual BMF values and the number of independent simulations. It would be more robust to test the model on whole new SPH runs created after training rather than repeatedly dividing the current library.</w:t>
-      </w:r>
-    </w:p>
-    <w:p>
-      <w:pPr>
-        <w:spacing w:before="240" w:after="240" w:line="276" w:lineRule="auto"/>
-        <w:jc w:val="both"/>
-      </w:pPr>
-      <w:r>
         <w:t>Future research should enhance automatic identification of input combinations with inadequate support and per-prediction reliability estimates. Before updating the current model, new SPH simulations should be used to test exploratory XGBoost and hurdle models. Stronger physical limitations, multi-output prediction, and uncertainty estimates are possible additional enhancements.</w:t>
       </w:r>
     </w:p>
@@ -6169,7 +6082,6 @@
         <w:pStyle w:val="Heading1"/>
       </w:pPr>
       <w:r>
-        <w:lastRenderedPageBreak/>
         <w:t>References</w:t>
       </w:r>
       <w:bookmarkEnd w:id="57"/>
@@ -6268,6 +6180,7 @@
         <w:rPr>
           <w:color w:val="000000" w:themeColor="text1"/>
         </w:rPr>
+        <w:lastRenderedPageBreak/>
         <w:t>Citron, R. I., Genda, H. &amp; Ida, S. (2015). Formation of Phobos and Deimos via a giant impact. Icarus, 252, 334-338. doi:10.1016/j.icarus.2015.02.011.</w:t>
       </w:r>
     </w:p>
@@ -6380,7 +6293,6 @@
         <w:rPr>
           <w:color w:val="000000" w:themeColor="text1"/>
         </w:rPr>
-        <w:lastRenderedPageBreak/>
         <w:t>Prokhorenkova, L., Gusev, G., Vorobev, A., Dorogush, A. V. &amp; Gulin, A. (2018). CatBoost: unbiased boosting with categorical features. Advances in Neural Information Processing Systems, 31.</w:t>
       </w:r>
     </w:p>
@@ -6461,6 +6373,7 @@
         <w:rPr>
           <w:color w:val="000000" w:themeColor="text1"/>
         </w:rPr>
+        <w:lastRenderedPageBreak/>
         <w:t>Walsh, K. J. &amp; Richardson, D. C. (2006). Binary near-Earth asteroid formation: Rubble pile model of tidal disruptions. Icarus, 180(1), 201-216. doi:10.1016/j.icarus.2005.08.015.</w:t>
       </w:r>
     </w:p>
@@ -6548,16 +6461,16 @@
         <w:tblLook w:val="04A0" w:firstRow="1" w:lastRow="0" w:firstColumn="1" w:lastColumn="0" w:noHBand="0" w:noVBand="1"/>
       </w:tblPr>
       <w:tblGrid>
-        <w:gridCol w:w="1709"/>
-        <w:gridCol w:w="2538"/>
-        <w:gridCol w:w="1500"/>
-        <w:gridCol w:w="2073"/>
+        <w:gridCol w:w="1200"/>
+        <w:gridCol w:w="2840"/>
+        <w:gridCol w:w="1836"/>
+        <w:gridCol w:w="1944"/>
         <w:gridCol w:w="1520"/>
       </w:tblGrid>
       <w:tr>
         <w:tc>
           <w:tcPr>
-            <w:tcW w:w="0" w:type="auto"/>
+            <w:tcW w:w="1200" w:type="dxa"/>
             <w:tcBorders>
               <w:top w:val="single" w:sz="8" w:space="0" w:color="000000"/>
               <w:left w:val="single" w:sz="8" w:space="0" w:color="000000"/>
@@ -6592,7 +6505,7 @@
         </w:tc>
         <w:tc>
           <w:tcPr>
-            <w:tcW w:w="0" w:type="auto"/>
+            <w:tcW w:w="2840" w:type="dxa"/>
             <w:tcBorders>
               <w:top w:val="single" w:sz="8" w:space="0" w:color="000000"/>
               <w:left w:val="single" w:sz="8" w:space="0" w:color="000000"/>
@@ -6627,7 +6540,7 @@
         </w:tc>
         <w:tc>
           <w:tcPr>
-            <w:tcW w:w="0" w:type="auto"/>
+            <w:tcW w:w="1836" w:type="dxa"/>
             <w:tcBorders>
               <w:top w:val="single" w:sz="8" w:space="0" w:color="000000"/>
               <w:left w:val="single" w:sz="8" w:space="0" w:color="000000"/>
@@ -6662,7 +6575,7 @@
         </w:tc>
         <w:tc>
           <w:tcPr>
-            <w:tcW w:w="2073" w:type="dxa"/>
+            <w:tcW w:w="1944" w:type="dxa"/>
             <w:tcBorders>
               <w:top w:val="single" w:sz="8" w:space="0" w:color="000000"/>
               <w:left w:val="single" w:sz="8" w:space="0" w:color="000000"/>
@@ -6737,7 +6650,7 @@
         </w:trPr>
         <w:tc>
           <w:tcPr>
-            <w:tcW w:w="0" w:type="auto"/>
+            <w:tcW w:w="1200" w:type="dxa"/>
             <w:vMerge w:val="restart"/>
             <w:tcBorders>
               <w:top w:val="single" w:sz="8" w:space="0" w:color="000000"/>
@@ -6771,7 +6684,7 @@
         </w:tc>
         <w:tc>
           <w:tcPr>
-            <w:tcW w:w="0" w:type="auto"/>
+            <w:tcW w:w="2840" w:type="dxa"/>
             <w:tcBorders>
               <w:top w:val="single" w:sz="8" w:space="0" w:color="000000"/>
               <w:left w:val="single" w:sz="8" w:space="0" w:color="000000"/>
@@ -6804,7 +6717,7 @@
         </w:tc>
         <w:tc>
           <w:tcPr>
-            <w:tcW w:w="0" w:type="auto"/>
+            <w:tcW w:w="1836" w:type="dxa"/>
             <w:tcBorders>
               <w:top w:val="single" w:sz="8" w:space="0" w:color="000000"/>
               <w:left w:val="single" w:sz="8" w:space="0" w:color="000000"/>
@@ -6837,7 +6750,7 @@
         </w:tc>
         <w:tc>
           <w:tcPr>
-            <w:tcW w:w="2073" w:type="dxa"/>
+            <w:tcW w:w="1944" w:type="dxa"/>
             <w:tcBorders>
               <w:top w:val="single" w:sz="8" w:space="0" w:color="000000"/>
               <w:left w:val="single" w:sz="8" w:space="0" w:color="000000"/>
@@ -6909,7 +6822,7 @@
         </w:trPr>
         <w:tc>
           <w:tcPr>
-            <w:tcW w:w="0" w:type="auto"/>
+            <w:tcW w:w="1200" w:type="dxa"/>
             <w:vMerge/>
             <w:tcBorders>
               <w:top w:val="single" w:sz="8" w:space="0" w:color="000000"/>
@@ -6931,7 +6844,7 @@
         </w:tc>
         <w:tc>
           <w:tcPr>
-            <w:tcW w:w="0" w:type="auto"/>
+            <w:tcW w:w="2840" w:type="dxa"/>
             <w:tcBorders>
               <w:top w:val="single" w:sz="8" w:space="0" w:color="000000"/>
               <w:left w:val="single" w:sz="8" w:space="0" w:color="000000"/>
@@ -6964,7 +6877,7 @@
         </w:tc>
         <w:tc>
           <w:tcPr>
-            <w:tcW w:w="0" w:type="auto"/>
+            <w:tcW w:w="1836" w:type="dxa"/>
             <w:tcBorders>
               <w:top w:val="single" w:sz="8" w:space="0" w:color="000000"/>
               <w:left w:val="single" w:sz="8" w:space="0" w:color="000000"/>
@@ -6997,7 +6910,7 @@
         </w:tc>
         <w:tc>
           <w:tcPr>
-            <w:tcW w:w="2073" w:type="dxa"/>
+            <w:tcW w:w="1944" w:type="dxa"/>
             <w:tcBorders>
               <w:top w:val="single" w:sz="8" w:space="0" w:color="000000"/>
               <w:left w:val="single" w:sz="8" w:space="0" w:color="000000"/>
@@ -7057,7 +6970,7 @@
         </w:trPr>
         <w:tc>
           <w:tcPr>
-            <w:tcW w:w="0" w:type="auto"/>
+            <w:tcW w:w="1200" w:type="dxa"/>
             <w:vMerge/>
             <w:tcBorders>
               <w:top w:val="single" w:sz="8" w:space="0" w:color="000000"/>
@@ -7079,7 +6992,7 @@
         </w:tc>
         <w:tc>
           <w:tcPr>
-            <w:tcW w:w="0" w:type="auto"/>
+            <w:tcW w:w="2840" w:type="dxa"/>
             <w:tcBorders>
               <w:top w:val="single" w:sz="8" w:space="0" w:color="000000"/>
               <w:left w:val="single" w:sz="8" w:space="0" w:color="000000"/>
@@ -7112,7 +7025,7 @@
         </w:tc>
         <w:tc>
           <w:tcPr>
-            <w:tcW w:w="0" w:type="auto"/>
+            <w:tcW w:w="1836" w:type="dxa"/>
             <w:tcBorders>
               <w:top w:val="single" w:sz="8" w:space="0" w:color="000000"/>
               <w:left w:val="single" w:sz="8" w:space="0" w:color="000000"/>
@@ -7145,7 +7058,7 @@
         </w:tc>
         <w:tc>
           <w:tcPr>
-            <w:tcW w:w="2073" w:type="dxa"/>
+            <w:tcW w:w="1944" w:type="dxa"/>
             <w:tcBorders>
               <w:top w:val="single" w:sz="8" w:space="0" w:color="000000"/>
               <w:left w:val="single" w:sz="8" w:space="0" w:color="000000"/>
@@ -7205,7 +7118,7 @@
         </w:trPr>
         <w:tc>
           <w:tcPr>
-            <w:tcW w:w="0" w:type="auto"/>
+            <w:tcW w:w="1200" w:type="dxa"/>
             <w:vMerge/>
             <w:tcBorders>
               <w:top w:val="single" w:sz="8" w:space="0" w:color="000000"/>
@@ -7227,7 +7140,7 @@
         </w:tc>
         <w:tc>
           <w:tcPr>
-            <w:tcW w:w="0" w:type="auto"/>
+            <w:tcW w:w="2840" w:type="dxa"/>
             <w:tcBorders>
               <w:top w:val="single" w:sz="8" w:space="0" w:color="000000"/>
               <w:left w:val="single" w:sz="8" w:space="0" w:color="000000"/>
@@ -7275,7 +7188,7 @@
         </w:tc>
         <w:tc>
           <w:tcPr>
-            <w:tcW w:w="0" w:type="auto"/>
+            <w:tcW w:w="1836" w:type="dxa"/>
             <w:tcBorders>
               <w:top w:val="single" w:sz="8" w:space="0" w:color="000000"/>
               <w:left w:val="single" w:sz="8" w:space="0" w:color="000000"/>
@@ -7308,7 +7221,7 @@
         </w:tc>
         <w:tc>
           <w:tcPr>
-            <w:tcW w:w="2073" w:type="dxa"/>
+            <w:tcW w:w="1944" w:type="dxa"/>
             <w:tcBorders>
               <w:top w:val="single" w:sz="8" w:space="0" w:color="000000"/>
               <w:left w:val="single" w:sz="8" w:space="0" w:color="000000"/>
@@ -7368,7 +7281,7 @@
         </w:trPr>
         <w:tc>
           <w:tcPr>
-            <w:tcW w:w="0" w:type="auto"/>
+            <w:tcW w:w="1200" w:type="dxa"/>
             <w:vMerge w:val="restart"/>
             <w:tcBorders>
               <w:top w:val="single" w:sz="8" w:space="0" w:color="000000"/>
@@ -7402,7 +7315,7 @@
         </w:tc>
         <w:tc>
           <w:tcPr>
-            <w:tcW w:w="0" w:type="auto"/>
+            <w:tcW w:w="2840" w:type="dxa"/>
             <w:tcBorders>
               <w:top w:val="single" w:sz="8" w:space="0" w:color="000000"/>
               <w:left w:val="single" w:sz="8" w:space="0" w:color="000000"/>
@@ -7435,7 +7348,7 @@
         </w:tc>
         <w:tc>
           <w:tcPr>
-            <w:tcW w:w="0" w:type="auto"/>
+            <w:tcW w:w="1836" w:type="dxa"/>
             <w:tcBorders>
               <w:top w:val="single" w:sz="8" w:space="0" w:color="000000"/>
               <w:left w:val="single" w:sz="8" w:space="0" w:color="000000"/>
@@ -7475,7 +7388,7 @@
         </w:tc>
         <w:tc>
           <w:tcPr>
-            <w:tcW w:w="2073" w:type="dxa"/>
+            <w:tcW w:w="1944" w:type="dxa"/>
             <w:tcBorders>
               <w:top w:val="single" w:sz="8" w:space="0" w:color="000000"/>
               <w:left w:val="single" w:sz="8" w:space="0" w:color="000000"/>
@@ -7560,7 +7473,7 @@
         </w:trPr>
         <w:tc>
           <w:tcPr>
-            <w:tcW w:w="0" w:type="auto"/>
+            <w:tcW w:w="1200" w:type="dxa"/>
             <w:vMerge/>
             <w:tcBorders>
               <w:top w:val="single" w:sz="8" w:space="0" w:color="000000"/>
@@ -7582,7 +7495,7 @@
         </w:tc>
         <w:tc>
           <w:tcPr>
-            <w:tcW w:w="0" w:type="auto"/>
+            <w:tcW w:w="2840" w:type="dxa"/>
             <w:tcBorders>
               <w:top w:val="single" w:sz="8" w:space="0" w:color="000000"/>
               <w:left w:val="single" w:sz="8" w:space="0" w:color="000000"/>
@@ -7615,7 +7528,7 @@
         </w:tc>
         <w:tc>
           <w:tcPr>
-            <w:tcW w:w="0" w:type="auto"/>
+            <w:tcW w:w="1836" w:type="dxa"/>
             <w:tcBorders>
               <w:top w:val="single" w:sz="8" w:space="0" w:color="000000"/>
               <w:left w:val="single" w:sz="8" w:space="0" w:color="000000"/>
@@ -7655,7 +7568,7 @@
         </w:tc>
         <w:tc>
           <w:tcPr>
-            <w:tcW w:w="2073" w:type="dxa"/>
+            <w:tcW w:w="1944" w:type="dxa"/>
             <w:tcBorders>
               <w:top w:val="single" w:sz="8" w:space="0" w:color="000000"/>
               <w:left w:val="single" w:sz="8" w:space="0" w:color="000000"/>
@@ -7728,7 +7641,7 @@
         </w:trPr>
         <w:tc>
           <w:tcPr>
-            <w:tcW w:w="0" w:type="auto"/>
+            <w:tcW w:w="1200" w:type="dxa"/>
             <w:vMerge/>
             <w:tcBorders>
               <w:top w:val="single" w:sz="8" w:space="0" w:color="000000"/>
@@ -7750,7 +7663,7 @@
         </w:tc>
         <w:tc>
           <w:tcPr>
-            <w:tcW w:w="0" w:type="auto"/>
+            <w:tcW w:w="2840" w:type="dxa"/>
             <w:tcBorders>
               <w:top w:val="single" w:sz="8" w:space="0" w:color="000000"/>
               <w:left w:val="single" w:sz="8" w:space="0" w:color="000000"/>
@@ -7783,7 +7696,7 @@
         </w:tc>
         <w:tc>
           <w:tcPr>
-            <w:tcW w:w="0" w:type="auto"/>
+            <w:tcW w:w="1836" w:type="dxa"/>
             <w:tcBorders>
               <w:top w:val="single" w:sz="8" w:space="0" w:color="000000"/>
               <w:left w:val="single" w:sz="8" w:space="0" w:color="000000"/>
@@ -7829,7 +7742,7 @@
         </w:tc>
         <w:tc>
           <w:tcPr>
-            <w:tcW w:w="2073" w:type="dxa"/>
+            <w:tcW w:w="1944" w:type="dxa"/>
             <w:tcBorders>
               <w:top w:val="single" w:sz="8" w:space="0" w:color="000000"/>
               <w:left w:val="single" w:sz="8" w:space="0" w:color="000000"/>
@@ -7902,7 +7815,7 @@
         </w:trPr>
         <w:tc>
           <w:tcPr>
-            <w:tcW w:w="0" w:type="auto"/>
+            <w:tcW w:w="1200" w:type="dxa"/>
             <w:vMerge/>
             <w:tcBorders>
               <w:top w:val="single" w:sz="8" w:space="0" w:color="000000"/>
@@ -7924,7 +7837,7 @@
         </w:tc>
         <w:tc>
           <w:tcPr>
-            <w:tcW w:w="0" w:type="auto"/>
+            <w:tcW w:w="2840" w:type="dxa"/>
             <w:tcBorders>
               <w:top w:val="single" w:sz="8" w:space="0" w:color="000000"/>
               <w:left w:val="single" w:sz="8" w:space="0" w:color="000000"/>
@@ -7957,7 +7870,7 @@
         </w:tc>
         <w:tc>
           <w:tcPr>
-            <w:tcW w:w="0" w:type="auto"/>
+            <w:tcW w:w="1836" w:type="dxa"/>
             <w:tcBorders>
               <w:top w:val="single" w:sz="8" w:space="0" w:color="000000"/>
               <w:left w:val="single" w:sz="8" w:space="0" w:color="000000"/>
@@ -7997,7 +7910,7 @@
         </w:tc>
         <w:tc>
           <w:tcPr>
-            <w:tcW w:w="2073" w:type="dxa"/>
+            <w:tcW w:w="1944" w:type="dxa"/>
             <w:tcBorders>
               <w:top w:val="single" w:sz="8" w:space="0" w:color="000000"/>
               <w:left w:val="single" w:sz="8" w:space="0" w:color="000000"/>
@@ -8219,7 +8132,7 @@
         </w:trPr>
         <w:tc>
           <w:tcPr>
-            <w:tcW w:w="0" w:type="auto"/>
+            <w:tcW w:w="1200" w:type="dxa"/>
             <w:vMerge w:val="restart"/>
             <w:tcBorders>
               <w:top w:val="single" w:sz="8" w:space="0" w:color="000000"/>
@@ -8253,7 +8166,7 @@
         </w:tc>
         <w:tc>
           <w:tcPr>
-            <w:tcW w:w="0" w:type="auto"/>
+            <w:tcW w:w="2840" w:type="dxa"/>
             <w:tcBorders>
               <w:top w:val="single" w:sz="8" w:space="0" w:color="000000"/>
               <w:left w:val="single" w:sz="8" w:space="0" w:color="000000"/>
@@ -8286,7 +8199,7 @@
         </w:tc>
         <w:tc>
           <w:tcPr>
-            <w:tcW w:w="0" w:type="auto"/>
+            <w:tcW w:w="1836" w:type="dxa"/>
             <w:tcBorders>
               <w:top w:val="single" w:sz="8" w:space="0" w:color="000000"/>
               <w:left w:val="single" w:sz="8" w:space="0" w:color="000000"/>
@@ -8345,7 +8258,7 @@
         </w:tc>
         <w:tc>
           <w:tcPr>
-            <w:tcW w:w="2073" w:type="dxa"/>
+            <w:tcW w:w="1944" w:type="dxa"/>
             <w:tcBorders>
               <w:top w:val="single" w:sz="8" w:space="0" w:color="000000"/>
               <w:left w:val="single" w:sz="8" w:space="0" w:color="000000"/>
@@ -8449,7 +8362,7 @@
         </w:trPr>
         <w:tc>
           <w:tcPr>
-            <w:tcW w:w="0" w:type="auto"/>
+            <w:tcW w:w="1200" w:type="dxa"/>
             <w:vMerge/>
             <w:tcBorders>
               <w:top w:val="single" w:sz="8" w:space="0" w:color="000000"/>
@@ -8471,7 +8384,7 @@
         </w:tc>
         <w:tc>
           <w:tcPr>
-            <w:tcW w:w="0" w:type="auto"/>
+            <w:tcW w:w="2840" w:type="dxa"/>
             <w:tcBorders>
               <w:top w:val="single" w:sz="8" w:space="0" w:color="000000"/>
               <w:left w:val="single" w:sz="8" w:space="0" w:color="000000"/>
@@ -8504,7 +8417,7 @@
         </w:tc>
         <w:tc>
           <w:tcPr>
-            <w:tcW w:w="0" w:type="auto"/>
+            <w:tcW w:w="1836" w:type="dxa"/>
             <w:tcBorders>
               <w:top w:val="single" w:sz="8" w:space="0" w:color="000000"/>
               <w:left w:val="single" w:sz="8" w:space="0" w:color="000000"/>
@@ -8563,7 +8476,7 @@
         </w:tc>
         <w:tc>
           <w:tcPr>
-            <w:tcW w:w="2073" w:type="dxa"/>
+            <w:tcW w:w="1944" w:type="dxa"/>
             <w:tcBorders>
               <w:top w:val="single" w:sz="8" w:space="0" w:color="000000"/>
               <w:left w:val="single" w:sz="8" w:space="0" w:color="000000"/>
@@ -8746,7 +8659,7 @@
         </w:trPr>
         <w:tc>
           <w:tcPr>
-            <w:tcW w:w="0" w:type="auto"/>
+            <w:tcW w:w="1200" w:type="dxa"/>
             <w:vMerge/>
             <w:tcBorders>
               <w:top w:val="single" w:sz="8" w:space="0" w:color="000000"/>
@@ -8768,7 +8681,7 @@
         </w:tc>
         <w:tc>
           <w:tcPr>
-            <w:tcW w:w="0" w:type="auto"/>
+            <w:tcW w:w="2840" w:type="dxa"/>
             <w:tcBorders>
               <w:top w:val="single" w:sz="8" w:space="0" w:color="000000"/>
               <w:left w:val="single" w:sz="8" w:space="0" w:color="000000"/>
@@ -8820,7 +8733,7 @@
         </w:tc>
         <w:tc>
           <w:tcPr>
-            <w:tcW w:w="0" w:type="auto"/>
+            <w:tcW w:w="1836" w:type="dxa"/>
             <w:tcBorders>
               <w:top w:val="single" w:sz="8" w:space="0" w:color="000000"/>
               <w:left w:val="single" w:sz="8" w:space="0" w:color="000000"/>
@@ -8879,7 +8792,7 @@
         </w:tc>
         <w:tc>
           <w:tcPr>
-            <w:tcW w:w="2073" w:type="dxa"/>
+            <w:tcW w:w="1944" w:type="dxa"/>
             <w:tcBorders>
               <w:top w:val="single" w:sz="8" w:space="0" w:color="000000"/>
               <w:left w:val="single" w:sz="8" w:space="0" w:color="000000"/>
@@ -8991,7 +8904,7 @@
         </w:trPr>
         <w:tc>
           <w:tcPr>
-            <w:tcW w:w="0" w:type="auto"/>
+            <w:tcW w:w="1200" w:type="dxa"/>
             <w:vMerge/>
             <w:tcBorders>
               <w:top w:val="single" w:sz="8" w:space="0" w:color="000000"/>
@@ -9013,7 +8926,7 @@
         </w:tc>
         <w:tc>
           <w:tcPr>
-            <w:tcW w:w="0" w:type="auto"/>
+            <w:tcW w:w="2840" w:type="dxa"/>
             <w:tcBorders>
               <w:top w:val="single" w:sz="8" w:space="0" w:color="000000"/>
               <w:left w:val="single" w:sz="8" w:space="0" w:color="000000"/>
@@ -9046,7 +8959,7 @@
         </w:tc>
         <w:tc>
           <w:tcPr>
-            <w:tcW w:w="0" w:type="auto"/>
+            <w:tcW w:w="1836" w:type="dxa"/>
             <w:tcBorders>
               <w:top w:val="single" w:sz="8" w:space="0" w:color="000000"/>
               <w:left w:val="single" w:sz="8" w:space="0" w:color="000000"/>
@@ -9105,7 +9018,7 @@
         </w:tc>
         <w:tc>
           <w:tcPr>
-            <w:tcW w:w="2073" w:type="dxa"/>
+            <w:tcW w:w="1944" w:type="dxa"/>
             <w:tcBorders>
               <w:top w:val="single" w:sz="8" w:space="0" w:color="000000"/>
               <w:left w:val="single" w:sz="8" w:space="0" w:color="000000"/>
@@ -9296,18 +9209,16 @@
           </w:tcPr>
           <w:p>
             <w:pPr>
-              <w:spacing w:line="276" w:lineRule="auto"/>
-              <w:jc w:val="center"/>
-              <w:rPr>
-                <w:color w:val="000000" w:themeColor="text1"/>
-                <w:lang w:val="en-US"/>
-              </w:rPr>
-            </w:pPr>
-            <w:r>
               <w:rPr>
                 <w:b/>
                 <w:bCs/>
-                <w:color w:val="000000" w:themeColor="text1"/>
+                <w:lang w:val="en-US"/>
+              </w:rPr>
+            </w:pPr>
+            <w:r>
+              <w:rPr>
+                <w:b/>
+                <w:bCs/>
                 <w:lang w:val="en-US"/>
               </w:rPr>
               <w:t>Model</w:t>
@@ -9333,12 +9244,9 @@
           </w:tcPr>
           <w:p>
             <w:pPr>
-              <w:spacing w:line="276" w:lineRule="auto"/>
-              <w:jc w:val="center"/>
               <w:rPr>
                 <w:b/>
                 <w:bCs/>
-                <w:color w:val="000000" w:themeColor="text1"/>
                 <w:lang w:val="en-US"/>
               </w:rPr>
             </w:pPr>
@@ -9370,39 +9278,19 @@
           </w:tcPr>
           <w:p>
             <w:pPr>
-              <w:spacing w:line="276" w:lineRule="auto"/>
-              <w:jc w:val="center"/>
-              <w:rPr>
-                <w:color w:val="000000" w:themeColor="text1"/>
-                <w:lang w:val="en-US"/>
-              </w:rPr>
-            </w:pPr>
-            <w:r>
               <w:rPr>
                 <w:b/>
                 <w:bCs/>
-                <w:color w:val="000000" w:themeColor="text1"/>
                 <w:lang w:val="en-US"/>
               </w:rPr>
-              <w:t>M</w:t>
-            </w:r>
+            </w:pPr>
             <w:r>
               <w:rPr>
                 <w:b/>
                 <w:bCs/>
-                <w:color w:val="000000" w:themeColor="text1"/>
                 <w:lang w:val="en-US"/>
               </w:rPr>
-              <w:t>A</w:t>
-            </w:r>
-            <w:r>
-              <w:rPr>
-                <w:b/>
-                <w:bCs/>
-                <w:color w:val="000000" w:themeColor="text1"/>
-                <w:lang w:val="en-US"/>
-              </w:rPr>
-              <w:t>E</w:t>
+              <w:t>MAE</w:t>
             </w:r>
           </w:p>
         </w:tc>
@@ -9425,18 +9313,16 @@
           </w:tcPr>
           <w:p>
             <w:pPr>
-              <w:spacing w:line="276" w:lineRule="auto"/>
-              <w:jc w:val="center"/>
-              <w:rPr>
-                <w:color w:val="000000" w:themeColor="text1"/>
-                <w:lang w:val="en-US"/>
-              </w:rPr>
-            </w:pPr>
-            <w:r>
               <w:rPr>
                 <w:b/>
                 <w:bCs/>
-                <w:color w:val="000000" w:themeColor="text1"/>
+                <w:lang w:val="en-US"/>
+              </w:rPr>
+            </w:pPr>
+            <w:r>
+              <w:rPr>
+                <w:b/>
+                <w:bCs/>
                 <w:lang w:val="en-US"/>
               </w:rPr>
               <w:t>RMSE</w:t>
@@ -9462,18 +9348,16 @@
           </w:tcPr>
           <w:p>
             <w:pPr>
-              <w:spacing w:line="276" w:lineRule="auto"/>
-              <w:jc w:val="center"/>
-              <w:rPr>
-                <w:color w:val="000000" w:themeColor="text1"/>
-                <w:lang w:val="en-US"/>
-              </w:rPr>
-            </w:pPr>
-            <w:r>
               <w:rPr>
                 <w:b/>
                 <w:bCs/>
-                <w:color w:val="000000" w:themeColor="text1"/>
+                <w:lang w:val="en-US"/>
+              </w:rPr>
+            </w:pPr>
+            <w:r>
+              <w:rPr>
+                <w:b/>
+                <w:bCs/>
                 <w:lang w:val="en-US"/>
               </w:rPr>
               <w:t>Status</w:t>
@@ -9504,15 +9388,12 @@
           </w:tcPr>
           <w:p>
             <w:pPr>
-              <w:spacing w:line="276" w:lineRule="auto"/>
-              <w:rPr>
-                <w:color w:val="000000" w:themeColor="text1"/>
+              <w:rPr>
                 <w:lang w:val="en-US"/>
               </w:rPr>
             </w:pPr>
             <w:r>
               <w:rPr>
-                <w:color w:val="000000" w:themeColor="text1"/>
                 <w:lang w:val="en-US"/>
               </w:rPr>
               <w:t>Baseline Random Forest (RF)</w:t>
@@ -9538,15 +9419,12 @@
           </w:tcPr>
           <w:p>
             <w:pPr>
-              <w:spacing w:line="276" w:lineRule="auto"/>
-              <w:rPr>
-                <w:color w:val="000000" w:themeColor="text1"/>
+              <w:rPr>
                 <w:lang w:val="en-US"/>
               </w:rPr>
             </w:pPr>
             <w:r>
               <w:rPr>
-                <w:color w:val="000000" w:themeColor="text1"/>
                 <w:lang w:val="en-US"/>
               </w:rPr>
               <w:t>0.8977</w:t>
@@ -9572,15 +9450,12 @@
           </w:tcPr>
           <w:p>
             <w:pPr>
-              <w:spacing w:line="276" w:lineRule="auto"/>
-              <w:rPr>
-                <w:color w:val="000000" w:themeColor="text1"/>
+              <w:rPr>
                 <w:lang w:val="en-US"/>
               </w:rPr>
             </w:pPr>
             <w:r>
               <w:rPr>
-                <w:color w:val="000000" w:themeColor="text1"/>
                 <w:lang w:val="en-US"/>
               </w:rPr>
               <w:t>0.0187</w:t>
@@ -9606,15 +9481,12 @@
           </w:tcPr>
           <w:p>
             <w:pPr>
-              <w:spacing w:line="276" w:lineRule="auto"/>
-              <w:rPr>
-                <w:color w:val="000000" w:themeColor="text1"/>
+              <w:rPr>
                 <w:lang w:val="en-US"/>
               </w:rPr>
             </w:pPr>
             <w:r>
               <w:rPr>
-                <w:color w:val="000000" w:themeColor="text1"/>
                 <w:lang w:val="en-US"/>
               </w:rPr>
               <w:t>0.0298</w:t>
@@ -9640,15 +9512,12 @@
           </w:tcPr>
           <w:p>
             <w:pPr>
-              <w:spacing w:line="276" w:lineRule="auto"/>
-              <w:rPr>
-                <w:color w:val="000000" w:themeColor="text1"/>
+              <w:rPr>
                 <w:lang w:val="en-US"/>
               </w:rPr>
             </w:pPr>
             <w:r>
               <w:rPr>
-                <w:color w:val="000000" w:themeColor="text1"/>
                 <w:lang w:val="en-US"/>
               </w:rPr>
               <w:t>Baseline model</w:t>
@@ -9679,15 +9548,12 @@
           </w:tcPr>
           <w:p>
             <w:pPr>
-              <w:spacing w:line="276" w:lineRule="auto"/>
-              <w:rPr>
-                <w:color w:val="000000" w:themeColor="text1"/>
+              <w:rPr>
                 <w:lang w:val="en-US"/>
               </w:rPr>
             </w:pPr>
             <w:r>
               <w:rPr>
-                <w:color w:val="000000" w:themeColor="text1"/>
                 <w:lang w:val="en-US"/>
               </w:rPr>
               <w:t>Baseline Gradient Boosting (GB)</w:t>
@@ -9713,15 +9579,12 @@
           </w:tcPr>
           <w:p>
             <w:pPr>
-              <w:spacing w:line="276" w:lineRule="auto"/>
-              <w:rPr>
-                <w:color w:val="000000" w:themeColor="text1"/>
+              <w:rPr>
                 <w:lang w:val="en-US"/>
               </w:rPr>
             </w:pPr>
             <w:r>
               <w:rPr>
-                <w:color w:val="000000" w:themeColor="text1"/>
                 <w:lang w:val="en-US"/>
               </w:rPr>
               <w:t>0.9142</w:t>
@@ -9747,15 +9610,12 @@
           </w:tcPr>
           <w:p>
             <w:pPr>
-              <w:spacing w:line="276" w:lineRule="auto"/>
-              <w:rPr>
-                <w:color w:val="000000" w:themeColor="text1"/>
+              <w:rPr>
                 <w:lang w:val="en-US"/>
               </w:rPr>
             </w:pPr>
             <w:r>
               <w:rPr>
-                <w:color w:val="000000" w:themeColor="text1"/>
                 <w:lang w:val="en-US"/>
               </w:rPr>
               <w:t>0.0175</w:t>
@@ -9781,15 +9641,12 @@
           </w:tcPr>
           <w:p>
             <w:pPr>
-              <w:spacing w:line="276" w:lineRule="auto"/>
-              <w:rPr>
-                <w:color w:val="000000" w:themeColor="text1"/>
+              <w:rPr>
                 <w:lang w:val="en-US"/>
               </w:rPr>
             </w:pPr>
             <w:r>
               <w:rPr>
-                <w:color w:val="000000" w:themeColor="text1"/>
                 <w:lang w:val="en-US"/>
               </w:rPr>
               <w:t>0.0272</w:t>
@@ -9815,15 +9672,12 @@
           </w:tcPr>
           <w:p>
             <w:pPr>
-              <w:spacing w:line="276" w:lineRule="auto"/>
-              <w:rPr>
-                <w:color w:val="000000" w:themeColor="text1"/>
+              <w:rPr>
                 <w:lang w:val="en-US"/>
               </w:rPr>
             </w:pPr>
             <w:r>
               <w:rPr>
-                <w:color w:val="000000" w:themeColor="text1"/>
                 <w:lang w:val="en-US"/>
               </w:rPr>
               <w:t>Best baseline model</w:t>
@@ -9854,15 +9708,12 @@
           </w:tcPr>
           <w:p>
             <w:pPr>
-              <w:spacing w:line="276" w:lineRule="auto"/>
-              <w:rPr>
-                <w:color w:val="000000" w:themeColor="text1"/>
+              <w:rPr>
                 <w:lang w:val="en-US"/>
               </w:rPr>
             </w:pPr>
             <w:r>
               <w:rPr>
-                <w:color w:val="000000" w:themeColor="text1"/>
                 <w:lang w:val="en-US"/>
               </w:rPr>
               <w:t>Tuned GB</w:t>
@@ -9888,15 +9739,12 @@
           </w:tcPr>
           <w:p>
             <w:pPr>
-              <w:spacing w:line="276" w:lineRule="auto"/>
-              <w:rPr>
-                <w:color w:val="000000" w:themeColor="text1"/>
+              <w:rPr>
                 <w:lang w:val="en-US"/>
               </w:rPr>
             </w:pPr>
             <w:r>
               <w:rPr>
-                <w:color w:val="000000" w:themeColor="text1"/>
                 <w:lang w:val="en-US"/>
               </w:rPr>
               <w:t>0.9234</w:t>
@@ -9922,15 +9770,12 @@
           </w:tcPr>
           <w:p>
             <w:pPr>
-              <w:spacing w:line="276" w:lineRule="auto"/>
-              <w:rPr>
-                <w:color w:val="000000" w:themeColor="text1"/>
+              <w:rPr>
                 <w:lang w:val="en-US"/>
               </w:rPr>
             </w:pPr>
             <w:r>
               <w:rPr>
-                <w:color w:val="000000" w:themeColor="text1"/>
                 <w:lang w:val="en-US"/>
               </w:rPr>
               <w:t>0.0159</w:t>
@@ -9956,15 +9801,12 @@
           </w:tcPr>
           <w:p>
             <w:pPr>
-              <w:spacing w:line="276" w:lineRule="auto"/>
-              <w:rPr>
-                <w:color w:val="000000" w:themeColor="text1"/>
+              <w:rPr>
                 <w:lang w:val="en-US"/>
               </w:rPr>
             </w:pPr>
             <w:r>
               <w:rPr>
-                <w:color w:val="000000" w:themeColor="text1"/>
                 <w:lang w:val="en-US"/>
               </w:rPr>
               <w:t>0.0257</w:t>
@@ -9990,15 +9832,12 @@
           </w:tcPr>
           <w:p>
             <w:pPr>
-              <w:spacing w:line="276" w:lineRule="auto"/>
-              <w:rPr>
-                <w:color w:val="000000" w:themeColor="text1"/>
+              <w:rPr>
                 <w:lang w:val="en-US"/>
               </w:rPr>
             </w:pPr>
             <w:r>
               <w:rPr>
-                <w:color w:val="000000" w:themeColor="text1"/>
                 <w:lang w:val="en-US"/>
               </w:rPr>
               <w:t xml:space="preserve">Main model </w:t>
@@ -10029,15 +9868,12 @@
           </w:tcPr>
           <w:p>
             <w:pPr>
-              <w:spacing w:line="276" w:lineRule="auto"/>
-              <w:rPr>
-                <w:color w:val="000000" w:themeColor="text1"/>
+              <w:rPr>
                 <w:lang w:val="en-US"/>
               </w:rPr>
             </w:pPr>
             <w:r>
               <w:rPr>
-                <w:color w:val="000000" w:themeColor="text1"/>
                 <w:lang w:val="en-US"/>
               </w:rPr>
               <w:t>Tuned GB + derived features</w:t>
@@ -10063,15 +9899,12 @@
           </w:tcPr>
           <w:p>
             <w:pPr>
-              <w:spacing w:line="276" w:lineRule="auto"/>
-              <w:rPr>
-                <w:color w:val="000000" w:themeColor="text1"/>
+              <w:rPr>
                 <w:lang w:val="en-US"/>
               </w:rPr>
             </w:pPr>
             <w:r>
               <w:rPr>
-                <w:color w:val="000000" w:themeColor="text1"/>
                 <w:lang w:val="en-US"/>
               </w:rPr>
               <w:t>0.9240</w:t>
@@ -10097,15 +9930,12 @@
           </w:tcPr>
           <w:p>
             <w:pPr>
-              <w:spacing w:line="276" w:lineRule="auto"/>
-              <w:rPr>
-                <w:color w:val="000000" w:themeColor="text1"/>
+              <w:rPr>
                 <w:lang w:val="en-US"/>
               </w:rPr>
             </w:pPr>
             <w:r>
               <w:rPr>
-                <w:color w:val="000000" w:themeColor="text1"/>
                 <w:lang w:val="en-US"/>
               </w:rPr>
               <w:t>0.0155</w:t>
@@ -10131,15 +9961,12 @@
           </w:tcPr>
           <w:p>
             <w:pPr>
-              <w:spacing w:line="276" w:lineRule="auto"/>
-              <w:rPr>
-                <w:color w:val="000000" w:themeColor="text1"/>
+              <w:rPr>
                 <w:lang w:val="en-US"/>
               </w:rPr>
             </w:pPr>
             <w:r>
               <w:rPr>
-                <w:color w:val="000000" w:themeColor="text1"/>
                 <w:lang w:val="en-US"/>
               </w:rPr>
               <w:t>0.0257</w:t>
@@ -10165,15 +9992,12 @@
           </w:tcPr>
           <w:p>
             <w:pPr>
-              <w:spacing w:line="276" w:lineRule="auto"/>
-              <w:rPr>
-                <w:color w:val="000000" w:themeColor="text1"/>
+              <w:rPr>
                 <w:lang w:val="en-US"/>
               </w:rPr>
             </w:pPr>
             <w:r>
               <w:rPr>
-                <w:color w:val="000000" w:themeColor="text1"/>
                 <w:lang w:val="en-US"/>
               </w:rPr>
               <w:t>No meaningful gain</w:t>
@@ -10204,15 +10028,12 @@
           </w:tcPr>
           <w:p>
             <w:pPr>
-              <w:spacing w:line="276" w:lineRule="auto"/>
-              <w:rPr>
-                <w:color w:val="000000" w:themeColor="text1"/>
+              <w:rPr>
                 <w:lang w:val="en-US"/>
               </w:rPr>
             </w:pPr>
             <w:r>
               <w:rPr>
-                <w:color w:val="000000" w:themeColor="text1"/>
                 <w:lang w:val="en-US"/>
               </w:rPr>
               <w:t>XGBoost</w:t>
@@ -10238,15 +10059,12 @@
           </w:tcPr>
           <w:p>
             <w:pPr>
-              <w:spacing w:line="276" w:lineRule="auto"/>
-              <w:rPr>
-                <w:color w:val="000000" w:themeColor="text1"/>
+              <w:rPr>
                 <w:lang w:val="en-US"/>
               </w:rPr>
             </w:pPr>
             <w:r>
               <w:rPr>
-                <w:color w:val="000000" w:themeColor="text1"/>
                 <w:lang w:val="en-US"/>
               </w:rPr>
               <w:t>0.9377</w:t>
@@ -10272,15 +10090,12 @@
           </w:tcPr>
           <w:p>
             <w:pPr>
-              <w:spacing w:line="276" w:lineRule="auto"/>
-              <w:rPr>
-                <w:color w:val="000000" w:themeColor="text1"/>
+              <w:rPr>
                 <w:lang w:val="en-US"/>
               </w:rPr>
             </w:pPr>
             <w:r>
               <w:rPr>
-                <w:color w:val="000000" w:themeColor="text1"/>
                 <w:lang w:val="en-US"/>
               </w:rPr>
               <w:t>0.0132</w:t>
@@ -10306,15 +10121,12 @@
           </w:tcPr>
           <w:p>
             <w:pPr>
-              <w:spacing w:line="276" w:lineRule="auto"/>
-              <w:rPr>
-                <w:color w:val="000000" w:themeColor="text1"/>
+              <w:rPr>
                 <w:lang w:val="en-US"/>
               </w:rPr>
             </w:pPr>
             <w:r>
               <w:rPr>
-                <w:color w:val="000000" w:themeColor="text1"/>
                 <w:lang w:val="en-US"/>
               </w:rPr>
               <w:t>0.0232</w:t>
@@ -10340,15 +10152,12 @@
           </w:tcPr>
           <w:p>
             <w:pPr>
-              <w:spacing w:line="276" w:lineRule="auto"/>
-              <w:rPr>
-                <w:color w:val="000000" w:themeColor="text1"/>
+              <w:rPr>
                 <w:lang w:val="en-US"/>
               </w:rPr>
             </w:pPr>
             <w:r>
               <w:rPr>
-                <w:color w:val="000000" w:themeColor="text1"/>
                 <w:lang w:val="en-US"/>
               </w:rPr>
               <w:t>(Exploratory only) strongest single-stage alternative</w:t>
@@ -10379,15 +10188,12 @@
           </w:tcPr>
           <w:p>
             <w:pPr>
-              <w:spacing w:line="276" w:lineRule="auto"/>
-              <w:rPr>
-                <w:color w:val="000000" w:themeColor="text1"/>
+              <w:rPr>
                 <w:lang w:val="en-US"/>
               </w:rPr>
             </w:pPr>
             <w:r>
               <w:rPr>
-                <w:color w:val="000000" w:themeColor="text1"/>
                 <w:lang w:val="en-US"/>
               </w:rPr>
               <w:t>Two-stage CatBoost hurdle</w:t>
@@ -10413,15 +10219,12 @@
           </w:tcPr>
           <w:p>
             <w:pPr>
-              <w:spacing w:line="276" w:lineRule="auto"/>
-              <w:rPr>
-                <w:color w:val="000000" w:themeColor="text1"/>
+              <w:rPr>
                 <w:lang w:val="en-US"/>
               </w:rPr>
             </w:pPr>
             <w:r>
               <w:rPr>
-                <w:color w:val="000000" w:themeColor="text1"/>
                 <w:lang w:val="en-US"/>
               </w:rPr>
               <w:t>0.9483</w:t>
@@ -10447,15 +10250,12 @@
           </w:tcPr>
           <w:p>
             <w:pPr>
-              <w:spacing w:line="276" w:lineRule="auto"/>
-              <w:rPr>
-                <w:color w:val="000000" w:themeColor="text1"/>
+              <w:rPr>
                 <w:lang w:val="en-US"/>
               </w:rPr>
             </w:pPr>
             <w:r>
               <w:rPr>
-                <w:color w:val="000000" w:themeColor="text1"/>
                 <w:lang w:val="en-US"/>
               </w:rPr>
               <w:t>0.0122</w:t>
@@ -10481,15 +10281,12 @@
           </w:tcPr>
           <w:p>
             <w:pPr>
-              <w:spacing w:line="276" w:lineRule="auto"/>
-              <w:rPr>
-                <w:color w:val="000000" w:themeColor="text1"/>
+              <w:rPr>
                 <w:lang w:val="en-US"/>
               </w:rPr>
             </w:pPr>
             <w:r>
               <w:rPr>
-                <w:color w:val="000000" w:themeColor="text1"/>
                 <w:lang w:val="en-US"/>
               </w:rPr>
               <w:t>0.0212</w:t>
@@ -10515,15 +10312,12 @@
           </w:tcPr>
           <w:p>
             <w:pPr>
-              <w:spacing w:line="276" w:lineRule="auto"/>
-              <w:rPr>
-                <w:color w:val="000000" w:themeColor="text1"/>
+              <w:rPr>
                 <w:lang w:val="en-US"/>
               </w:rPr>
             </w:pPr>
             <w:r>
               <w:rPr>
-                <w:color w:val="000000" w:themeColor="text1"/>
                 <w:lang w:val="en-US"/>
               </w:rPr>
               <w:t>(Exploratory only) lowest MAE among hurdle tests</w:t>
@@ -10554,15 +10348,12 @@
           </w:tcPr>
           <w:p>
             <w:pPr>
-              <w:spacing w:line="276" w:lineRule="auto"/>
-              <w:rPr>
-                <w:color w:val="000000" w:themeColor="text1"/>
+              <w:rPr>
                 <w:lang w:val="en-US"/>
               </w:rPr>
             </w:pPr>
             <w:r>
               <w:rPr>
-                <w:color w:val="000000" w:themeColor="text1"/>
                 <w:lang w:val="en-US"/>
               </w:rPr>
               <w:t>Two-stage NGBoost hurdle</w:t>
@@ -10588,15 +10379,12 @@
           </w:tcPr>
           <w:p>
             <w:pPr>
-              <w:spacing w:line="276" w:lineRule="auto"/>
-              <w:rPr>
-                <w:color w:val="000000" w:themeColor="text1"/>
+              <w:rPr>
                 <w:lang w:val="en-US"/>
               </w:rPr>
             </w:pPr>
             <w:r>
               <w:rPr>
-                <w:color w:val="000000" w:themeColor="text1"/>
                 <w:lang w:val="en-US"/>
               </w:rPr>
               <w:t>0.9485</w:t>
@@ -10622,15 +10410,12 @@
           </w:tcPr>
           <w:p>
             <w:pPr>
-              <w:spacing w:line="276" w:lineRule="auto"/>
-              <w:rPr>
-                <w:color w:val="000000" w:themeColor="text1"/>
+              <w:rPr>
                 <w:lang w:val="en-US"/>
               </w:rPr>
             </w:pPr>
             <w:r>
               <w:rPr>
-                <w:color w:val="000000" w:themeColor="text1"/>
                 <w:lang w:val="en-US"/>
               </w:rPr>
               <w:t>0.0127</w:t>
@@ -10656,15 +10441,12 @@
           </w:tcPr>
           <w:p>
             <w:pPr>
-              <w:spacing w:line="276" w:lineRule="auto"/>
-              <w:rPr>
-                <w:color w:val="000000" w:themeColor="text1"/>
+              <w:rPr>
                 <w:lang w:val="en-US"/>
               </w:rPr>
             </w:pPr>
             <w:r>
               <w:rPr>
-                <w:color w:val="000000" w:themeColor="text1"/>
                 <w:lang w:val="en-US"/>
               </w:rPr>
               <w:t>0.0211</w:t>
@@ -10690,15 +10472,12 @@
           </w:tcPr>
           <w:p>
             <w:pPr>
-              <w:spacing w:line="276" w:lineRule="auto"/>
-              <w:rPr>
-                <w:color w:val="000000" w:themeColor="text1"/>
+              <w:rPr>
                 <w:lang w:val="en-US"/>
               </w:rPr>
             </w:pPr>
             <w:r>
               <w:rPr>
-                <w:color w:val="000000" w:themeColor="text1"/>
                 <w:lang w:val="en-US"/>
               </w:rPr>
               <w:t>(Exploratory only) highest R² / lowest RMSE</w:t>
@@ -10707,6 +10486,57 @@
         </w:tc>
       </w:tr>
     </w:tbl>
+    <w:p>
+      <w:pPr>
+        <w:spacing w:before="100" w:beforeAutospacing="1" w:after="100" w:afterAutospacing="1"/>
+        <w:jc w:val="both"/>
+      </w:pPr>
+    </w:p>
+    <w:p>
+      <w:pPr>
+        <w:spacing w:before="100" w:beforeAutospacing="1" w:after="100" w:afterAutospacing="1"/>
+        <w:jc w:val="both"/>
+        <w:rPr>
+          <w:noProof w:val="0"/>
+          <w:lang w:val="en-US"/>
+        </w:rPr>
+      </w:pPr>
+      <w:r>
+        <w:rPr>
+          <w:noProof w:val="0"/>
+          <w:lang w:val="en-US"/>
+        </w:rPr>
+        <w:t xml:space="preserve">The 10% BMF threshold (using logistic regression) is used for screening rather than as a criterion for moon formation, </w:t>
+      </w:r>
+      <w:r>
+        <w:rPr>
+          <w:noProof w:val="0"/>
+          <w:lang w:val="en-US"/>
+        </w:rPr>
+        <w:t>therefore</w:t>
+      </w:r>
+      <w:r>
+        <w:rPr>
+          <w:noProof w:val="0"/>
+          <w:lang w:val="en-US"/>
+        </w:rPr>
+        <w:t xml:space="preserve"> excluded from the table.</w:t>
+      </w:r>
+      <w:r>
+        <w:rPr>
+          <w:noProof w:val="0"/>
+          <w:lang w:val="en-US"/>
+        </w:rPr>
+        <w:t xml:space="preserve"> </w:t>
+      </w:r>
+      <w:r>
+        <w:rPr>
+          <w:noProof w:val="0"/>
+          <w:lang w:val="en-US"/>
+        </w:rPr>
+        <w:t xml:space="preserve">More sophisticated alternatives, including XGBoost and two-stage hurdle models, were also investigated but were retained as exploratory models, however they remained exploratory and are not covered in more detail in this project as they introduce additional model complexity, particularly the two-stage approaches, and would require further testing and interpretation before replacing the primary model. This was beyond the scope of the present project since the primary purpose was to demonstrate the possibility of further model improvement in subsequent work rather than to serve as the project's primary outcome. </w:t>
+      </w:r>
+    </w:p>
     <w:p>
       <w:pPr>
         <w:keepNext/>
@@ -10716,11 +10546,20 @@
           <w:color w:val="000000" w:themeColor="text1"/>
         </w:rPr>
       </w:pPr>
-      <w:r>
+    </w:p>
+    <w:p>
+      <w:pPr>
+        <w:keepNext/>
+        <w:spacing w:line="276" w:lineRule="auto"/>
+        <w:jc w:val="center"/>
         <w:rPr>
           <w:color w:val="000000" w:themeColor="text1"/>
         </w:rPr>
-        <w:lastRenderedPageBreak/>
+      </w:pPr>
+      <w:r>
+        <w:rPr>
+          <w:color w:val="000000" w:themeColor="text1"/>
+        </w:rPr>
         <w:drawing>
           <wp:inline distT="0" distB="0" distL="0" distR="0" wp14:anchorId="531B6B25" wp14:editId="603EE89F">
             <wp:extent cx="5943600" cy="4029710"/>

</xml_diff>

<commit_message>
docs: update final report
</commit_message>
<xml_diff>
--- a/deliverables/nny124-final-report.docx
+++ b/deliverables/nny124-final-report.docx
@@ -348,11 +348,13 @@
         <w:pStyle w:val="Heading1"/>
       </w:pPr>
       <w:bookmarkStart w:id="0" w:name="_Toc238151068"/>
+      <w:bookmarkStart w:id="1" w:name="_Toc238392126"/>
       <w:r>
         <w:lastRenderedPageBreak/>
         <w:t>Table of Contents</w:t>
       </w:r>
       <w:bookmarkEnd w:id="0"/>
+      <w:bookmarkEnd w:id="1"/>
       <w:r>
         <w:rPr>
           <w:b w:val="0"/>
@@ -394,12 +396,12 @@
           <w14:ligatures w14:val="standardContextual"/>
         </w:rPr>
       </w:pPr>
-      <w:hyperlink w:anchor="_Toc238151069" w:history="1">
+      <w:hyperlink w:anchor="_Toc238392126" w:history="1">
         <w:r>
           <w:rPr>
             <w:rStyle w:val="Hyperlink"/>
           </w:rPr>
-          <w:t>Abstract</w:t>
+          <w:t>Table of Contents</w:t>
         </w:r>
         <w:r>
           <w:rPr>
@@ -417,7 +419,7 @@
           <w:rPr>
             <w:webHidden/>
           </w:rPr>
-          <w:instrText xml:space="preserve"> PAGEREF _Toc238151069 \h </w:instrText>
+          <w:instrText xml:space="preserve"> PAGEREF _Toc238392126 \h </w:instrText>
         </w:r>
         <w:r>
           <w:rPr>
@@ -434,7 +436,7 @@
           <w:rPr>
             <w:webHidden/>
           </w:rPr>
-          <w:t>3</w:t>
+          <w:t>1</w:t>
         </w:r>
         <w:r>
           <w:rPr>
@@ -457,11 +459,137 @@
           <w14:ligatures w14:val="standardContextual"/>
         </w:rPr>
       </w:pPr>
-      <w:hyperlink w:anchor="_Toc238151070" w:history="1">
+      <w:hyperlink w:anchor="_Toc238392127" w:history="1">
         <w:r>
           <w:rPr>
             <w:rStyle w:val="Hyperlink"/>
           </w:rPr>
+          <w:t>List of Tables</w:t>
+        </w:r>
+        <w:r>
+          <w:rPr>
+            <w:webHidden/>
+          </w:rPr>
+          <w:tab/>
+        </w:r>
+        <w:r>
+          <w:rPr>
+            <w:webHidden/>
+          </w:rPr>
+          <w:fldChar w:fldCharType="begin"/>
+        </w:r>
+        <w:r>
+          <w:rPr>
+            <w:webHidden/>
+          </w:rPr>
+          <w:instrText xml:space="preserve"> PAGEREF _Toc238392127 \h </w:instrText>
+        </w:r>
+        <w:r>
+          <w:rPr>
+            <w:webHidden/>
+          </w:rPr>
+        </w:r>
+        <w:r>
+          <w:rPr>
+            <w:webHidden/>
+          </w:rPr>
+          <w:fldChar w:fldCharType="separate"/>
+        </w:r>
+        <w:r>
+          <w:rPr>
+            <w:webHidden/>
+          </w:rPr>
+          <w:t>2</w:t>
+        </w:r>
+        <w:r>
+          <w:rPr>
+            <w:webHidden/>
+          </w:rPr>
+          <w:fldChar w:fldCharType="end"/>
+        </w:r>
+      </w:hyperlink>
+    </w:p>
+    <w:p>
+      <w:pPr>
+        <w:pStyle w:val="TOC1"/>
+        <w:tabs>
+          <w:tab w:val="right" w:leader="dot" w:pos="9350"/>
+        </w:tabs>
+        <w:rPr>
+          <w:rFonts w:asciiTheme="minorHAnsi" w:eastAsiaTheme="minorEastAsia" w:hAnsiTheme="minorHAnsi" w:cstheme="minorBidi"/>
+          <w:kern w:val="2"/>
+          <w:lang w:val="en-US"/>
+          <w14:ligatures w14:val="standardContextual"/>
+        </w:rPr>
+      </w:pPr>
+      <w:hyperlink w:anchor="_Toc238392128" w:history="1">
+        <w:r>
+          <w:rPr>
+            <w:rStyle w:val="Hyperlink"/>
+          </w:rPr>
+          <w:t>List of Figures</w:t>
+        </w:r>
+        <w:r>
+          <w:rPr>
+            <w:webHidden/>
+          </w:rPr>
+          <w:tab/>
+        </w:r>
+        <w:r>
+          <w:rPr>
+            <w:webHidden/>
+          </w:rPr>
+          <w:fldChar w:fldCharType="begin"/>
+        </w:r>
+        <w:r>
+          <w:rPr>
+            <w:webHidden/>
+          </w:rPr>
+          <w:instrText xml:space="preserve"> PAGEREF _Toc238392128 \h </w:instrText>
+        </w:r>
+        <w:r>
+          <w:rPr>
+            <w:webHidden/>
+          </w:rPr>
+        </w:r>
+        <w:r>
+          <w:rPr>
+            <w:webHidden/>
+          </w:rPr>
+          <w:fldChar w:fldCharType="separate"/>
+        </w:r>
+        <w:r>
+          <w:rPr>
+            <w:webHidden/>
+          </w:rPr>
+          <w:t>2</w:t>
+        </w:r>
+        <w:r>
+          <w:rPr>
+            <w:webHidden/>
+          </w:rPr>
+          <w:fldChar w:fldCharType="end"/>
+        </w:r>
+      </w:hyperlink>
+    </w:p>
+    <w:p>
+      <w:pPr>
+        <w:pStyle w:val="TOC1"/>
+        <w:tabs>
+          <w:tab w:val="right" w:leader="dot" w:pos="9350"/>
+        </w:tabs>
+        <w:rPr>
+          <w:rFonts w:asciiTheme="minorHAnsi" w:eastAsiaTheme="minorEastAsia" w:hAnsiTheme="minorHAnsi" w:cstheme="minorBidi"/>
+          <w:kern w:val="2"/>
+          <w:lang w:val="en-US"/>
+          <w14:ligatures w14:val="standardContextual"/>
+        </w:rPr>
+      </w:pPr>
+      <w:hyperlink w:anchor="_Toc238392129" w:history="1">
+        <w:r>
+          <w:rPr>
+            <w:rStyle w:val="Hyperlink"/>
+          </w:rPr>
           <w:t>1. Introduction</w:t>
         </w:r>
         <w:r>
@@ -480,7 +608,7 @@
           <w:rPr>
             <w:webHidden/>
           </w:rPr>
-          <w:instrText xml:space="preserve"> PAGEREF _Toc238151070 \h </w:instrText>
+          <w:instrText xml:space="preserve"> PAGEREF _Toc238392129 \h </w:instrText>
         </w:r>
         <w:r>
           <w:rPr>
@@ -520,7 +648,7 @@
           <w14:ligatures w14:val="standardContextual"/>
         </w:rPr>
       </w:pPr>
-      <w:hyperlink w:anchor="_Toc238151071" w:history="1">
+      <w:hyperlink w:anchor="_Toc238392130" w:history="1">
         <w:r>
           <w:rPr>
             <w:rStyle w:val="Hyperlink"/>
@@ -543,7 +671,7 @@
           <w:rPr>
             <w:webHidden/>
           </w:rPr>
-          <w:instrText xml:space="preserve"> PAGEREF _Toc238151071 \h </w:instrText>
+          <w:instrText xml:space="preserve"> PAGEREF _Toc238392130 \h </w:instrText>
         </w:r>
         <w:r>
           <w:rPr>
@@ -583,7 +711,7 @@
           <w14:ligatures w14:val="standardContextual"/>
         </w:rPr>
       </w:pPr>
-      <w:hyperlink w:anchor="_Toc238151072" w:history="1">
+      <w:hyperlink w:anchor="_Toc238392131" w:history="1">
         <w:r>
           <w:rPr>
             <w:rStyle w:val="Hyperlink"/>
@@ -606,7 +734,7 @@
           <w:rPr>
             <w:webHidden/>
           </w:rPr>
-          <w:instrText xml:space="preserve"> PAGEREF _Toc238151072 \h </w:instrText>
+          <w:instrText xml:space="preserve"> PAGEREF _Toc238392131 \h </w:instrText>
         </w:r>
         <w:r>
           <w:rPr>
@@ -646,7 +774,7 @@
           <w14:ligatures w14:val="standardContextual"/>
         </w:rPr>
       </w:pPr>
-      <w:hyperlink w:anchor="_Toc238151073" w:history="1">
+      <w:hyperlink w:anchor="_Toc238392132" w:history="1">
         <w:r>
           <w:rPr>
             <w:rStyle w:val="Hyperlink"/>
@@ -669,7 +797,7 @@
           <w:rPr>
             <w:webHidden/>
           </w:rPr>
-          <w:instrText xml:space="preserve"> PAGEREF _Toc238151073 \h </w:instrText>
+          <w:instrText xml:space="preserve"> PAGEREF _Toc238392132 \h </w:instrText>
         </w:r>
         <w:r>
           <w:rPr>
@@ -709,7 +837,7 @@
           <w14:ligatures w14:val="standardContextual"/>
         </w:rPr>
       </w:pPr>
-      <w:hyperlink w:anchor="_Toc238151074" w:history="1">
+      <w:hyperlink w:anchor="_Toc238392133" w:history="1">
         <w:r>
           <w:rPr>
             <w:rStyle w:val="Hyperlink"/>
@@ -732,7 +860,7 @@
           <w:rPr>
             <w:webHidden/>
           </w:rPr>
-          <w:instrText xml:space="preserve"> PAGEREF _Toc238151074 \h </w:instrText>
+          <w:instrText xml:space="preserve"> PAGEREF _Toc238392133 \h </w:instrText>
         </w:r>
         <w:r>
           <w:rPr>
@@ -772,7 +900,7 @@
           <w14:ligatures w14:val="standardContextual"/>
         </w:rPr>
       </w:pPr>
-      <w:hyperlink w:anchor="_Toc238151075" w:history="1">
+      <w:hyperlink w:anchor="_Toc238392134" w:history="1">
         <w:r>
           <w:rPr>
             <w:rStyle w:val="Hyperlink"/>
@@ -795,7 +923,7 @@
           <w:rPr>
             <w:webHidden/>
           </w:rPr>
-          <w:instrText xml:space="preserve"> PAGEREF _Toc238151075 \h </w:instrText>
+          <w:instrText xml:space="preserve"> PAGEREF _Toc238392134 \h </w:instrText>
         </w:r>
         <w:r>
           <w:rPr>
@@ -835,24 +963,12 @@
           <w14:ligatures w14:val="standardContextual"/>
         </w:rPr>
       </w:pPr>
-      <w:hyperlink w:anchor="_Toc238151076" w:history="1">
+      <w:hyperlink w:anchor="_Toc238392135" w:history="1">
         <w:r>
           <w:rPr>
             <w:rStyle w:val="Hyperlink"/>
           </w:rPr>
-          <w:t>2.2 Prediction Model Choices and R</w:t>
-        </w:r>
-        <w:r>
-          <w:rPr>
-            <w:rStyle w:val="Hyperlink"/>
-          </w:rPr>
-          <w:t>a</w:t>
-        </w:r>
-        <w:r>
-          <w:rPr>
-            <w:rStyle w:val="Hyperlink"/>
-          </w:rPr>
-          <w:t>tionale</w:t>
+          <w:t>2.2 Prediction Model Choices and Rationale</w:t>
         </w:r>
         <w:r>
           <w:rPr>
@@ -870,7 +986,7 @@
           <w:rPr>
             <w:webHidden/>
           </w:rPr>
-          <w:instrText xml:space="preserve"> PAGEREF _Toc238151076 \h </w:instrText>
+          <w:instrText xml:space="preserve"> PAGEREF _Toc238392135 \h </w:instrText>
         </w:r>
         <w:r>
           <w:rPr>
@@ -910,7 +1026,7 @@
           <w14:ligatures w14:val="standardContextual"/>
         </w:rPr>
       </w:pPr>
-      <w:hyperlink w:anchor="_Toc238151077" w:history="1">
+      <w:hyperlink w:anchor="_Toc238392136" w:history="1">
         <w:r>
           <w:rPr>
             <w:rStyle w:val="Hyperlink"/>
@@ -933,7 +1049,7 @@
           <w:rPr>
             <w:webHidden/>
           </w:rPr>
-          <w:instrText xml:space="preserve"> PAGEREF _Toc238151077 \h </w:instrText>
+          <w:instrText xml:space="preserve"> PAGEREF _Toc238392136 \h </w:instrText>
         </w:r>
         <w:r>
           <w:rPr>
@@ -973,7 +1089,7 @@
           <w14:ligatures w14:val="standardContextual"/>
         </w:rPr>
       </w:pPr>
-      <w:hyperlink w:anchor="_Toc238151078" w:history="1">
+      <w:hyperlink w:anchor="_Toc238392137" w:history="1">
         <w:r>
           <w:rPr>
             <w:rStyle w:val="Hyperlink"/>
@@ -996,7 +1112,7 @@
           <w:rPr>
             <w:webHidden/>
           </w:rPr>
-          <w:instrText xml:space="preserve"> PAGEREF _Toc238151078 \h </w:instrText>
+          <w:instrText xml:space="preserve"> PAGEREF _Toc238392137 \h </w:instrText>
         </w:r>
         <w:r>
           <w:rPr>
@@ -1013,7 +1129,7 @@
           <w:rPr>
             <w:webHidden/>
           </w:rPr>
-          <w:t>8</w:t>
+          <w:t>7</w:t>
         </w:r>
         <w:r>
           <w:rPr>
@@ -1036,7 +1152,7 @@
           <w14:ligatures w14:val="standardContextual"/>
         </w:rPr>
       </w:pPr>
-      <w:hyperlink w:anchor="_Toc238151079" w:history="1">
+      <w:hyperlink w:anchor="_Toc238392138" w:history="1">
         <w:r>
           <w:rPr>
             <w:rStyle w:val="Hyperlink"/>
@@ -1059,7 +1175,7 @@
           <w:rPr>
             <w:webHidden/>
           </w:rPr>
-          <w:instrText xml:space="preserve"> PAGEREF _Toc238151079 \h </w:instrText>
+          <w:instrText xml:space="preserve"> PAGEREF _Toc238392138 \h </w:instrText>
         </w:r>
         <w:r>
           <w:rPr>
@@ -1076,7 +1192,7 @@
           <w:rPr>
             <w:webHidden/>
           </w:rPr>
-          <w:t>8</w:t>
+          <w:t>7</w:t>
         </w:r>
         <w:r>
           <w:rPr>
@@ -1099,7 +1215,7 @@
           <w14:ligatures w14:val="standardContextual"/>
         </w:rPr>
       </w:pPr>
-      <w:hyperlink w:anchor="_Toc238151080" w:history="1">
+      <w:hyperlink w:anchor="_Toc238392139" w:history="1">
         <w:r>
           <w:rPr>
             <w:rStyle w:val="Hyperlink"/>
@@ -1122,7 +1238,7 @@
           <w:rPr>
             <w:webHidden/>
           </w:rPr>
-          <w:instrText xml:space="preserve"> PAGEREF _Toc238151080 \h </w:instrText>
+          <w:instrText xml:space="preserve"> PAGEREF _Toc238392139 \h </w:instrText>
         </w:r>
         <w:r>
           <w:rPr>
@@ -1139,7 +1255,7 @@
           <w:rPr>
             <w:webHidden/>
           </w:rPr>
-          <w:t>9</w:t>
+          <w:t>8</w:t>
         </w:r>
         <w:r>
           <w:rPr>
@@ -1162,7 +1278,7 @@
           <w14:ligatures w14:val="standardContextual"/>
         </w:rPr>
       </w:pPr>
-      <w:hyperlink w:anchor="_Toc238151081" w:history="1">
+      <w:hyperlink w:anchor="_Toc238392140" w:history="1">
         <w:r>
           <w:rPr>
             <w:rStyle w:val="Hyperlink"/>
@@ -1185,7 +1301,7 @@
           <w:rPr>
             <w:webHidden/>
           </w:rPr>
-          <w:instrText xml:space="preserve"> PAGEREF _Toc238151081 \h </w:instrText>
+          <w:instrText xml:space="preserve"> PAGEREF _Toc238392140 \h </w:instrText>
         </w:r>
         <w:r>
           <w:rPr>
@@ -1202,7 +1318,7 @@
           <w:rPr>
             <w:webHidden/>
           </w:rPr>
-          <w:t>9</w:t>
+          <w:t>8</w:t>
         </w:r>
         <w:r>
           <w:rPr>
@@ -1225,7 +1341,7 @@
           <w14:ligatures w14:val="standardContextual"/>
         </w:rPr>
       </w:pPr>
-      <w:hyperlink w:anchor="_Toc238151082" w:history="1">
+      <w:hyperlink w:anchor="_Toc238392141" w:history="1">
         <w:r>
           <w:rPr>
             <w:rStyle w:val="Hyperlink"/>
@@ -1248,7 +1364,7 @@
           <w:rPr>
             <w:webHidden/>
           </w:rPr>
-          <w:instrText xml:space="preserve"> PAGEREF _Toc238151082 \h </w:instrText>
+          <w:instrText xml:space="preserve"> PAGEREF _Toc238392141 \h </w:instrText>
         </w:r>
         <w:r>
           <w:rPr>
@@ -1288,7 +1404,7 @@
           <w14:ligatures w14:val="standardContextual"/>
         </w:rPr>
       </w:pPr>
-      <w:hyperlink w:anchor="_Toc238151083" w:history="1">
+      <w:hyperlink w:anchor="_Toc238392142" w:history="1">
         <w:r>
           <w:rPr>
             <w:rStyle w:val="Hyperlink"/>
@@ -1311,7 +1427,7 @@
           <w:rPr>
             <w:webHidden/>
           </w:rPr>
-          <w:instrText xml:space="preserve"> PAGEREF _Toc238151083 \h </w:instrText>
+          <w:instrText xml:space="preserve"> PAGEREF _Toc238392142 \h </w:instrText>
         </w:r>
         <w:r>
           <w:rPr>
@@ -1351,7 +1467,7 @@
           <w14:ligatures w14:val="standardContextual"/>
         </w:rPr>
       </w:pPr>
-      <w:hyperlink w:anchor="_Toc238151084" w:history="1">
+      <w:hyperlink w:anchor="_Toc238392143" w:history="1">
         <w:r>
           <w:rPr>
             <w:rStyle w:val="Hyperlink"/>
@@ -1374,7 +1490,7 @@
           <w:rPr>
             <w:webHidden/>
           </w:rPr>
-          <w:instrText xml:space="preserve"> PAGEREF _Toc238151084 \h </w:instrText>
+          <w:instrText xml:space="preserve"> PAGEREF _Toc238392143 \h </w:instrText>
         </w:r>
         <w:r>
           <w:rPr>
@@ -1414,7 +1530,7 @@
           <w14:ligatures w14:val="standardContextual"/>
         </w:rPr>
       </w:pPr>
-      <w:hyperlink w:anchor="_Toc238151085" w:history="1">
+      <w:hyperlink w:anchor="_Toc238392144" w:history="1">
         <w:r>
           <w:rPr>
             <w:rStyle w:val="Hyperlink"/>
@@ -1437,7 +1553,7 @@
           <w:rPr>
             <w:webHidden/>
           </w:rPr>
-          <w:instrText xml:space="preserve"> PAGEREF _Toc238151085 \h </w:instrText>
+          <w:instrText xml:space="preserve"> PAGEREF _Toc238392144 \h </w:instrText>
         </w:r>
         <w:r>
           <w:rPr>
@@ -1477,7 +1593,7 @@
           <w14:ligatures w14:val="standardContextual"/>
         </w:rPr>
       </w:pPr>
-      <w:hyperlink w:anchor="_Toc238151086" w:history="1">
+      <w:hyperlink w:anchor="_Toc238392145" w:history="1">
         <w:r>
           <w:rPr>
             <w:rStyle w:val="Hyperlink"/>
@@ -1500,7 +1616,7 @@
           <w:rPr>
             <w:webHidden/>
           </w:rPr>
-          <w:instrText xml:space="preserve"> PAGEREF _Toc238151086 \h </w:instrText>
+          <w:instrText xml:space="preserve"> PAGEREF _Toc238392145 \h </w:instrText>
         </w:r>
         <w:r>
           <w:rPr>
@@ -1517,7 +1633,7 @@
           <w:rPr>
             <w:webHidden/>
           </w:rPr>
-          <w:t>14</w:t>
+          <w:t>13</w:t>
         </w:r>
         <w:r>
           <w:rPr>
@@ -1540,7 +1656,7 @@
           <w14:ligatures w14:val="standardContextual"/>
         </w:rPr>
       </w:pPr>
-      <w:hyperlink w:anchor="_Toc238151087" w:history="1">
+      <w:hyperlink w:anchor="_Toc238392146" w:history="1">
         <w:r>
           <w:rPr>
             <w:rStyle w:val="Hyperlink"/>
@@ -1563,7 +1679,7 @@
           <w:rPr>
             <w:webHidden/>
           </w:rPr>
-          <w:instrText xml:space="preserve"> PAGEREF _Toc238151087 \h </w:instrText>
+          <w:instrText xml:space="preserve"> PAGEREF _Toc238392146 \h </w:instrText>
         </w:r>
         <w:r>
           <w:rPr>
@@ -1603,7 +1719,7 @@
           <w14:ligatures w14:val="standardContextual"/>
         </w:rPr>
       </w:pPr>
-      <w:hyperlink w:anchor="_Toc238151088" w:history="1">
+      <w:hyperlink w:anchor="_Toc238392147" w:history="1">
         <w:r>
           <w:rPr>
             <w:rStyle w:val="Hyperlink"/>
@@ -1626,7 +1742,7 @@
           <w:rPr>
             <w:webHidden/>
           </w:rPr>
-          <w:instrText xml:space="preserve"> PAGEREF _Toc238151088 \h </w:instrText>
+          <w:instrText xml:space="preserve"> PAGEREF _Toc238392147 \h </w:instrText>
         </w:r>
         <w:r>
           <w:rPr>
@@ -1666,7 +1782,7 @@
           <w14:ligatures w14:val="standardContextual"/>
         </w:rPr>
       </w:pPr>
-      <w:hyperlink w:anchor="_Toc238151089" w:history="1">
+      <w:hyperlink w:anchor="_Toc238392148" w:history="1">
         <w:r>
           <w:rPr>
             <w:rStyle w:val="Hyperlink"/>
@@ -1689,7 +1805,7 @@
           <w:rPr>
             <w:webHidden/>
           </w:rPr>
-          <w:instrText xml:space="preserve"> PAGEREF _Toc238151089 \h </w:instrText>
+          <w:instrText xml:space="preserve"> PAGEREF _Toc238392148 \h </w:instrText>
         </w:r>
         <w:r>
           <w:rPr>
@@ -1729,7 +1845,7 @@
           <w14:ligatures w14:val="standardContextual"/>
         </w:rPr>
       </w:pPr>
-      <w:hyperlink w:anchor="_Toc238151090" w:history="1">
+      <w:hyperlink w:anchor="_Toc238392149" w:history="1">
         <w:r>
           <w:rPr>
             <w:rStyle w:val="Hyperlink"/>
@@ -1752,7 +1868,7 @@
           <w:rPr>
             <w:webHidden/>
           </w:rPr>
-          <w:instrText xml:space="preserve"> PAGEREF _Toc238151090 \h </w:instrText>
+          <w:instrText xml:space="preserve"> PAGEREF _Toc238392149 \h </w:instrText>
         </w:r>
         <w:r>
           <w:rPr>
@@ -1792,7 +1908,7 @@
           <w14:ligatures w14:val="standardContextual"/>
         </w:rPr>
       </w:pPr>
-      <w:hyperlink w:anchor="_Toc238151091" w:history="1">
+      <w:hyperlink w:anchor="_Toc238392150" w:history="1">
         <w:r>
           <w:rPr>
             <w:rStyle w:val="Hyperlink"/>
@@ -1815,7 +1931,7 @@
           <w:rPr>
             <w:webHidden/>
           </w:rPr>
-          <w:instrText xml:space="preserve"> PAGEREF _Toc238151091 \h </w:instrText>
+          <w:instrText xml:space="preserve"> PAGEREF _Toc238392150 \h </w:instrText>
         </w:r>
         <w:r>
           <w:rPr>
@@ -1832,7 +1948,7 @@
           <w:rPr>
             <w:webHidden/>
           </w:rPr>
-          <w:t>19</w:t>
+          <w:t>18</w:t>
         </w:r>
         <w:r>
           <w:rPr>
@@ -1855,7 +1971,7 @@
           <w14:ligatures w14:val="standardContextual"/>
         </w:rPr>
       </w:pPr>
-      <w:hyperlink w:anchor="_Toc238151092" w:history="1">
+      <w:hyperlink w:anchor="_Toc238392151" w:history="1">
         <w:r>
           <w:rPr>
             <w:rStyle w:val="Hyperlink"/>
@@ -1878,7 +1994,7 @@
           <w:rPr>
             <w:webHidden/>
           </w:rPr>
-          <w:instrText xml:space="preserve"> PAGEREF _Toc238151092 \h </w:instrText>
+          <w:instrText xml:space="preserve"> PAGEREF _Toc238392151 \h </w:instrText>
         </w:r>
         <w:r>
           <w:rPr>
@@ -1918,7 +2034,7 @@
           <w14:ligatures w14:val="standardContextual"/>
         </w:rPr>
       </w:pPr>
-      <w:hyperlink w:anchor="_Toc238151093" w:history="1">
+      <w:hyperlink w:anchor="_Toc238392152" w:history="1">
         <w:r>
           <w:rPr>
             <w:rStyle w:val="Hyperlink"/>
@@ -1941,7 +2057,7 @@
           <w:rPr>
             <w:webHidden/>
           </w:rPr>
-          <w:instrText xml:space="preserve"> PAGEREF _Toc238151093 \h </w:instrText>
+          <w:instrText xml:space="preserve"> PAGEREF _Toc238392152 \h </w:instrText>
         </w:r>
         <w:r>
           <w:rPr>
@@ -1958,7 +2074,7 @@
           <w:rPr>
             <w:webHidden/>
           </w:rPr>
-          <w:t>20</w:t>
+          <w:t>19</w:t>
         </w:r>
         <w:r>
           <w:rPr>
@@ -1981,7 +2097,7 @@
           <w14:ligatures w14:val="standardContextual"/>
         </w:rPr>
       </w:pPr>
-      <w:hyperlink w:anchor="_Toc238151094" w:history="1">
+      <w:hyperlink w:anchor="_Toc238392153" w:history="1">
         <w:r>
           <w:rPr>
             <w:rStyle w:val="Hyperlink"/>
@@ -2004,7 +2120,7 @@
           <w:rPr>
             <w:webHidden/>
           </w:rPr>
-          <w:instrText xml:space="preserve"> PAGEREF _Toc238151094 \h </w:instrText>
+          <w:instrText xml:space="preserve"> PAGEREF _Toc238392153 \h </w:instrText>
         </w:r>
         <w:r>
           <w:rPr>
@@ -2044,12 +2160,12 @@
           <w14:ligatures w14:val="standardContextual"/>
         </w:rPr>
       </w:pPr>
-      <w:hyperlink w:anchor="_Toc238151095" w:history="1">
+      <w:hyperlink w:anchor="_Toc238392154" w:history="1">
         <w:r>
           <w:rPr>
             <w:rStyle w:val="Hyperlink"/>
           </w:rPr>
-          <w:t>Appendix B. Decision-Support Prototype</w:t>
+          <w:t>Appendix B. AI acknowledgement Statement</w:t>
         </w:r>
         <w:r>
           <w:rPr>
@@ -2067,7 +2183,7 @@
           <w:rPr>
             <w:webHidden/>
           </w:rPr>
-          <w:instrText xml:space="preserve"> PAGEREF _Toc238151095 \h </w:instrText>
+          <w:instrText xml:space="preserve"> PAGEREF _Toc238392154 \h </w:instrText>
         </w:r>
         <w:r>
           <w:rPr>
@@ -2085,69 +2201,6 @@
             <w:webHidden/>
           </w:rPr>
           <w:t>25</w:t>
-        </w:r>
-        <w:r>
-          <w:rPr>
-            <w:webHidden/>
-          </w:rPr>
-          <w:fldChar w:fldCharType="end"/>
-        </w:r>
-      </w:hyperlink>
-    </w:p>
-    <w:p>
-      <w:pPr>
-        <w:pStyle w:val="TOC1"/>
-        <w:tabs>
-          <w:tab w:val="right" w:leader="dot" w:pos="9350"/>
-        </w:tabs>
-        <w:rPr>
-          <w:rFonts w:asciiTheme="minorHAnsi" w:eastAsiaTheme="minorEastAsia" w:hAnsiTheme="minorHAnsi" w:cstheme="minorBidi"/>
-          <w:kern w:val="2"/>
-          <w:lang w:val="en-US"/>
-          <w14:ligatures w14:val="standardContextual"/>
-        </w:rPr>
-      </w:pPr>
-      <w:hyperlink w:anchor="_Toc238151096" w:history="1">
-        <w:r>
-          <w:rPr>
-            <w:rStyle w:val="Hyperlink"/>
-          </w:rPr>
-          <w:t>Appendix C. AI acknowledgement Statement</w:t>
-        </w:r>
-        <w:r>
-          <w:rPr>
-            <w:webHidden/>
-          </w:rPr>
-          <w:tab/>
-        </w:r>
-        <w:r>
-          <w:rPr>
-            <w:webHidden/>
-          </w:rPr>
-          <w:fldChar w:fldCharType="begin"/>
-        </w:r>
-        <w:r>
-          <w:rPr>
-            <w:webHidden/>
-          </w:rPr>
-          <w:instrText xml:space="preserve"> PAGEREF _Toc238151096 \h </w:instrText>
-        </w:r>
-        <w:r>
-          <w:rPr>
-            <w:webHidden/>
-          </w:rPr>
-        </w:r>
-        <w:r>
-          <w:rPr>
-            <w:webHidden/>
-          </w:rPr>
-          <w:fldChar w:fldCharType="separate"/>
-        </w:r>
-        <w:r>
-          <w:rPr>
-            <w:webHidden/>
-          </w:rPr>
-          <w:t>26</w:t>
         </w:r>
         <w:r>
           <w:rPr>
@@ -2171,22 +2224,19 @@
         <w:fldChar w:fldCharType="end"/>
       </w:r>
     </w:p>
+    <w:p/>
     <w:p>
       <w:pPr>
         <w:pStyle w:val="Heading1"/>
       </w:pPr>
-    </w:p>
-    <w:p/>
-    <w:p>
-      <w:pPr>
-        <w:pStyle w:val="Heading1"/>
-      </w:pPr>
+      <w:bookmarkStart w:id="2" w:name="_Toc238392127"/>
       <w:r>
         <w:lastRenderedPageBreak/>
         <w:t>List of Tables</w:t>
       </w:r>
-    </w:p>
-    <w:bookmarkStart w:id="1" w:name="_Toc238149729"/>
+      <w:bookmarkEnd w:id="2"/>
+    </w:p>
+    <w:bookmarkStart w:id="3" w:name="_Toc238149729"/>
     <w:p>
       <w:pPr>
         <w:pStyle w:val="TableofFigures"/>
@@ -2364,9 +2414,11 @@
         </w:rPr>
         <w:fldChar w:fldCharType="end"/>
       </w:r>
+      <w:bookmarkStart w:id="4" w:name="_Toc238392128"/>
       <w:r>
         <w:t>List of Figures</w:t>
       </w:r>
+      <w:bookmarkEnd w:id="4"/>
     </w:p>
     <w:p>
       <w:pPr>
@@ -2506,19 +2558,19 @@
           <w:rPr>
             <w:rStyle w:val="Hyperlink"/>
           </w:rPr>
-          <w:t>Figure 2. Bound mass fraction versus encounter eccentricity proxy. Strong and non-zero retention quickly disappears as the enc</w:t>
+          <w:t>Figure 2. Bound mass fraction versus encounter e</w:t>
         </w:r>
         <w:r>
           <w:rPr>
             <w:rStyle w:val="Hyperlink"/>
           </w:rPr>
-          <w:t>o</w:t>
+          <w:t>c</w:t>
         </w:r>
         <w:r>
           <w:rPr>
             <w:rStyle w:val="Hyperlink"/>
           </w:rPr>
-          <w:t>unter becomes more hyperbolic.</w:t>
+          <w:t>centricity proxy. Strong and non-zero retention quickly disappears as the encounter becomes more hyperbolic.</w:t>
         </w:r>
         <w:r>
           <w:rPr>
@@ -2583,19 +2635,7 @@
           <w:rPr>
             <w:rStyle w:val="Hyperlink"/>
           </w:rPr>
-          <w:t>Figure 3. BMF checks where one input changes at a time. Dots are available SPH simulation results and curves show tuned Gradient Boosting predictions with the other inputs fixed. Blue background shows the interpolation range, while red background shows the extrapolati</w:t>
-        </w:r>
-        <w:r>
-          <w:rPr>
-            <w:rStyle w:val="Hyperlink"/>
-          </w:rPr>
-          <w:t>o</w:t>
-        </w:r>
-        <w:r>
-          <w:rPr>
-            <w:rStyle w:val="Hyperlink"/>
-          </w:rPr>
-          <w:t>n range.</w:t>
+          <w:t>Figure 3. BMF checks where one input changes at a time. Dots are available SPH simulation results and curves show tuned Gradient Boosting predictions with the other inputs fixed. Blue background shows the interpolation range, while red background shows the extrapolation range.</w:t>
         </w:r>
         <w:r>
           <w:rPr>
@@ -2816,7 +2856,6 @@
         </w:rPr>
         <w:fldChar w:fldCharType="end"/>
       </w:r>
-      <w:bookmarkStart w:id="2" w:name="_Toc238151069"/>
     </w:p>
     <w:p>
       <w:pPr>
@@ -2857,8 +2896,7 @@
         <w:lastRenderedPageBreak/>
         <w:t>Abstract</w:t>
       </w:r>
-      <w:bookmarkEnd w:id="1"/>
-      <w:bookmarkEnd w:id="2"/>
+      <w:bookmarkEnd w:id="3"/>
     </w:p>
     <w:p>
       <w:pPr>
@@ -2896,7 +2934,7 @@
           <w:sz w:val="20"/>
           <w:szCs w:val="20"/>
         </w:rPr>
-        <w:t>The primary model, a tuned Gradient Boosting regressor using the original simulation inputs, achieves a grouped cross-validated R² of 0.9234, MAE of 0.0159, and RMSE of 0.0257.</w:t>
+        <w:t xml:space="preserve">The primary model, a tuned Gradient Boosting regressor using the original simulation inputs, achieves a grouped cross-validated R² of 0.9234, MAE of 0.0159, and RMSE of 0.0257. </w:t>
       </w:r>
       <w:r>
         <w:rPr>
@@ -2905,7 +2943,7 @@
           <w:sz w:val="20"/>
           <w:szCs w:val="20"/>
         </w:rPr>
-        <w:t xml:space="preserve"> </w:t>
+        <w:t xml:space="preserve">Adding physics-derived features gives no meaningful extra improvement, so the simpler tuned raw-input model is retained. </w:t>
       </w:r>
       <w:r>
         <w:rPr>
@@ -2914,7 +2952,7 @@
           <w:sz w:val="20"/>
           <w:szCs w:val="20"/>
         </w:rPr>
-        <w:t xml:space="preserve">Adding physics-derived features </w:t>
+        <w:t xml:space="preserve">The models are assessed using grouped cross-validation. </w:t>
       </w:r>
       <w:r>
         <w:rPr>
@@ -2923,7 +2961,7 @@
           <w:sz w:val="20"/>
           <w:szCs w:val="20"/>
         </w:rPr>
-        <w:t>gives no meaningful extra improvement</w:t>
+        <w:t xml:space="preserve">In a controlled set, predicted BMF generally decreases from roughly 0.27 at 1.2 Mars radii to approximately zero by about 2.5 Mars radii as periapsis increases. A similarly clear decline occurs as encounter speed increases, from roughly 0.25 at low velocity to approximately zero by about 1.2 km/s. While the impacts of spin and velocity depend on the encounter conditions, periapsis is the strongest overall physical input. As a result, distinct physical inputs may become more significant in different regions of the measured parameter range. </w:t>
       </w:r>
       <w:r>
         <w:rPr>
@@ -2932,51 +2970,6 @@
           <w:sz w:val="20"/>
           <w:szCs w:val="20"/>
         </w:rPr>
-        <w:t>, so the simpler tuned raw-input model is retained.</w:t>
-      </w:r>
-      <w:r>
-        <w:rPr>
-          <w:i/>
-          <w:iCs/>
-          <w:sz w:val="20"/>
-          <w:szCs w:val="20"/>
-        </w:rPr>
-        <w:t xml:space="preserve"> </w:t>
-      </w:r>
-      <w:r>
-        <w:rPr>
-          <w:i/>
-          <w:iCs/>
-          <w:sz w:val="20"/>
-          <w:szCs w:val="20"/>
-        </w:rPr>
-        <w:t xml:space="preserve">The models are assessed using grouped cross-validation. </w:t>
-      </w:r>
-      <w:r>
-        <w:rPr>
-          <w:i/>
-          <w:iCs/>
-          <w:sz w:val="20"/>
-          <w:szCs w:val="20"/>
-        </w:rPr>
-        <w:t>In a controlled set, predicted BMF generally decreases from roughly 0.27 at 1.2 Mars radii to approximately zero by about 2.5 Mars radii as periapsis increases. A similarly clear decline occurs as encounter speed increases, from roughly 0.25 at low velocity to approximately zero by about 1.2 km/s. While the impacts of spin and velocity depend on the encounter conditions, periapsis is the strongest overall physical input. As a result, distinct physical inputs may become more significant in different regions of the measured parameter range.</w:t>
-      </w:r>
-      <w:r>
-        <w:rPr>
-          <w:i/>
-          <w:iCs/>
-          <w:sz w:val="20"/>
-          <w:szCs w:val="20"/>
-        </w:rPr>
-        <w:t xml:space="preserve"> </w:t>
-      </w:r>
-      <w:r>
-        <w:rPr>
-          <w:i/>
-          <w:iCs/>
-          <w:sz w:val="20"/>
-          <w:szCs w:val="20"/>
-        </w:rPr>
         <w:t>Changes in spin in matched cases result in BMF discrepancies of up to 0.24 at bigger periapsis and between 0.06 and 0.09 below 1.5 Mars radii. Despite falling within the numerical training ranges, a sparsely sampled 1019.5 kg instance yields held-out errors close to 0.08 BMF, demonstrating that being within the input range does not ensure a trustworthy prediction. Therefore, the model does not replace SPH or prove physical causality, but it is helpful for quickly screening well-supported encounter circumstances and highlighting parameter correlations that call for additional SPH research.</w:t>
       </w:r>
     </w:p>
@@ -2984,28 +2977,28 @@
       <w:pPr>
         <w:pStyle w:val="Heading1"/>
       </w:pPr>
-      <w:bookmarkStart w:id="3" w:name="_Toc238149730"/>
-      <w:bookmarkStart w:id="4" w:name="_Toc238151070"/>
+      <w:bookmarkStart w:id="5" w:name="_Toc238149730"/>
+      <w:bookmarkStart w:id="6" w:name="_Toc238392129"/>
       <w:r>
         <w:t>1. Introduction</w:t>
-      </w:r>
-      <w:bookmarkEnd w:id="3"/>
-      <w:bookmarkEnd w:id="4"/>
-    </w:p>
-    <w:p>
-      <w:pPr>
-        <w:pStyle w:val="Heading2"/>
-      </w:pPr>
-      <w:bookmarkStart w:id="5" w:name="_Toc238149731"/>
-      <w:bookmarkStart w:id="6" w:name="_Toc238151071"/>
-      <w:r>
-        <w:t>1.1 Research Problem and Questions</w:t>
       </w:r>
       <w:bookmarkEnd w:id="5"/>
       <w:bookmarkEnd w:id="6"/>
     </w:p>
     <w:p>
       <w:pPr>
+        <w:pStyle w:val="Heading2"/>
+      </w:pPr>
+      <w:bookmarkStart w:id="7" w:name="_Toc238149731"/>
+      <w:bookmarkStart w:id="8" w:name="_Toc238392130"/>
+      <w:r>
+        <w:t>1.1 Research Problem and Questions</w:t>
+      </w:r>
+      <w:bookmarkEnd w:id="7"/>
+      <w:bookmarkEnd w:id="8"/>
+    </w:p>
+    <w:p>
+      <w:pPr>
         <w:spacing w:before="240" w:after="240" w:line="276" w:lineRule="auto"/>
         <w:jc w:val="both"/>
       </w:pPr>
@@ -3062,19 +3055,19 @@
       <w:pPr>
         <w:pStyle w:val="Heading2"/>
       </w:pPr>
-      <w:bookmarkStart w:id="7" w:name="_Toc238149732"/>
+      <w:bookmarkStart w:id="9" w:name="_Toc238149732"/>
     </w:p>
     <w:p>
       <w:pPr>
         <w:pStyle w:val="Heading2"/>
       </w:pPr>
-      <w:bookmarkStart w:id="8" w:name="_Toc238151072"/>
+      <w:bookmarkStart w:id="10" w:name="_Toc238392131"/>
       <w:r>
         <w:lastRenderedPageBreak/>
         <w:t>1.2 Significance and Originality</w:t>
       </w:r>
-      <w:bookmarkEnd w:id="7"/>
-      <w:bookmarkEnd w:id="8"/>
+      <w:bookmarkEnd w:id="9"/>
+      <w:bookmarkEnd w:id="10"/>
     </w:p>
     <w:p>
       <w:pPr>
@@ -3113,13 +3106,13 @@
       <w:pPr>
         <w:pStyle w:val="Heading2"/>
       </w:pPr>
-      <w:bookmarkStart w:id="9" w:name="_Toc238149733"/>
-      <w:bookmarkStart w:id="10" w:name="_Toc238151073"/>
+      <w:bookmarkStart w:id="11" w:name="_Toc238149733"/>
+      <w:bookmarkStart w:id="12" w:name="_Toc238392132"/>
       <w:r>
         <w:t>1.3 Literature Review and Research Gaps</w:t>
       </w:r>
-      <w:bookmarkEnd w:id="9"/>
-      <w:bookmarkEnd w:id="10"/>
+      <w:bookmarkEnd w:id="11"/>
+      <w:bookmarkEnd w:id="12"/>
     </w:p>
     <w:p>
       <w:pPr>
@@ -3180,25 +3173,25 @@
       <w:pPr>
         <w:pStyle w:val="Heading1"/>
       </w:pPr>
-      <w:bookmarkStart w:id="11" w:name="_Toc238149734"/>
-      <w:bookmarkStart w:id="12" w:name="_Toc238151074"/>
+      <w:bookmarkStart w:id="13" w:name="_Toc238149734"/>
+      <w:bookmarkStart w:id="14" w:name="_Toc238392133"/>
       <w:r>
         <w:t>2. Methodology</w:t>
-      </w:r>
-      <w:bookmarkEnd w:id="11"/>
-      <w:bookmarkEnd w:id="12"/>
-    </w:p>
-    <w:p>
-      <w:pPr>
-        <w:pStyle w:val="Heading2"/>
-      </w:pPr>
-      <w:bookmarkStart w:id="13" w:name="_Toc238149735"/>
-      <w:bookmarkStart w:id="14" w:name="_Toc238151075"/>
-      <w:r>
-        <w:t>2.1 Data Archive, Inputs, and Post-Processing</w:t>
       </w:r>
       <w:bookmarkEnd w:id="13"/>
       <w:bookmarkEnd w:id="14"/>
+    </w:p>
+    <w:p>
+      <w:pPr>
+        <w:pStyle w:val="Heading2"/>
+      </w:pPr>
+      <w:bookmarkStart w:id="15" w:name="_Toc238149735"/>
+      <w:bookmarkStart w:id="16" w:name="_Toc238392134"/>
+      <w:r>
+        <w:t>2.1 Data Archive, Inputs, and Post-Processing</w:t>
+      </w:r>
+      <w:bookmarkEnd w:id="15"/>
+      <w:bookmarkEnd w:id="16"/>
     </w:p>
     <w:p>
       <w:pPr>
@@ -3238,7 +3231,7 @@
           <w:szCs w:val="20"/>
         </w:rPr>
       </w:pPr>
-      <w:bookmarkStart w:id="15" w:name="_Toc238151450"/>
+      <w:bookmarkStart w:id="17" w:name="_Toc238151450"/>
       <w:r>
         <w:rPr>
           <w:color w:val="000000" w:themeColor="text1"/>
@@ -3302,23 +3295,16 @@
           <w:szCs w:val="20"/>
         </w:rPr>
         <w:br/>
-      </w:r>
-      <w:r>
-        <w:rPr>
-          <w:color w:val="000000" w:themeColor="text1"/>
+        <w:t>Some parameter values appear much more often than others in the archive</w:t>
+      </w:r>
+      <w:r>
+        <w:rPr>
           <w:sz w:val="20"/>
           <w:szCs w:val="20"/>
         </w:rPr>
-        <w:t>Some parameter values appear much more often than others in the archive</w:t>
-      </w:r>
-      <w:r>
-        <w:rPr>
-          <w:sz w:val="20"/>
-          <w:szCs w:val="20"/>
-        </w:rPr>
         <w:t>.</w:t>
       </w:r>
-      <w:bookmarkEnd w:id="15"/>
+      <w:bookmarkEnd w:id="17"/>
     </w:p>
     <w:tbl>
       <w:tblPr>
@@ -3936,20 +3922,32 @@
         <w:t xml:space="preserve"> ≥ 0.</w:t>
       </w:r>
       <w:r>
-        <w:t xml:space="preserve"> The number of bound fragments, the greatest and average bound-fragment mass, the total fragment count, and the largest-remnant measurements are among the exploratory outputs; BMF is the primary recorded output. It's also crucial to remember that BMF does not yet determine later disk or moon development, it merely measures gravitational retention.</w:t>
+        <w:t xml:space="preserve"> </w:t>
+      </w:r>
+      <w:r>
+        <w:t xml:space="preserve">The bound percentage compared to all fragments is the Bound Mass Fraction (BMF). </w:t>
+      </w:r>
+      <w:r>
+        <w:t xml:space="preserve">It's also crucial to remember that </w:t>
+      </w:r>
+      <w:r>
+        <w:t>this</w:t>
+      </w:r>
+      <w:r>
+        <w:t xml:space="preserve"> does not yet determine later disk or moon development, it merely measures gravitational retention.</w:t>
       </w:r>
     </w:p>
     <w:p>
       <w:pPr>
         <w:pStyle w:val="Heading2"/>
       </w:pPr>
-      <w:bookmarkStart w:id="16" w:name="_Toc238149736"/>
-      <w:bookmarkStart w:id="17" w:name="_Toc238151076"/>
+      <w:bookmarkStart w:id="18" w:name="_Toc238149736"/>
+      <w:bookmarkStart w:id="19" w:name="_Toc238392135"/>
       <w:r>
         <w:t>2.2 Prediction Model Choices and Rationale</w:t>
       </w:r>
-      <w:bookmarkEnd w:id="16"/>
-      <w:bookmarkEnd w:id="17"/>
+      <w:bookmarkEnd w:id="18"/>
+      <w:bookmarkEnd w:id="19"/>
     </w:p>
     <w:p>
       <w:pPr>
@@ -3981,11 +3979,11 @@
         <w:t>several</w:t>
       </w:r>
       <w:r>
-        <w:t xml:space="preserve"> baseline models were used. While this project primarily focuses on tree-based models, Logistic Regression is also used for the BMF ≥ 10% classification task because it offers a straightforward baseline for testing whether lower- and higher-retention cases </w:t>
+        <w:t xml:space="preserve"> baseline models were used. While this project primarily focuses on tree-based models, Logistic Regression is also used for the BMF ≥ 10% classification task because it offers a straightforward baseline for testing whether lower- and higher-retention cases can already be separated using a relatively simple combination of the inputs (Knauer et al., 2024). Because Random Forest can capture nonlinear correlations and interactions between the simulation </w:t>
       </w:r>
       <w:r>
         <w:lastRenderedPageBreak/>
-        <w:t>can already be separated using a relatively simple combination of the inputs (Knauer et al., 2024). Because Random Forest can capture nonlinear correlations and interactions between the simulation parameters while averaging numerous trees to lessen susceptibility to specific cases, it is tried for continuous BMF prediction (Breiman, 2001; Cambioni et al., 2019). Additionally, Gradient Boosting is evaluated since it constructs trees in a sequential manner, with each subsequent tree fixing mistakes produced by the ones before it. This could assist capture more precise changes between various encounter settings (Friedman, 2001; Valencia et al., 2019; Timpe et al., 2020).</w:t>
+        <w:t>parameters while averaging numerous trees to lessen susceptibility to specific cases, it is tried for continuous BMF prediction (Breiman, 2001; Cambioni et al., 2019). Additionally, Gradient Boosting is evaluated since it constructs trees in a sequential manner, with each subsequent tree fixing mistakes produced by the ones before it. This could assist capture more precise changes between various encounter settings (Friedman, 2001; Valencia et al., 2019; Timpe et al., 2020).</w:t>
       </w:r>
     </w:p>
     <w:p>
@@ -4007,13 +4005,13 @@
       <w:pPr>
         <w:pStyle w:val="Heading2"/>
       </w:pPr>
-      <w:bookmarkStart w:id="18" w:name="_Toc238149737"/>
-      <w:bookmarkStart w:id="19" w:name="_Toc238151077"/>
+      <w:bookmarkStart w:id="20" w:name="_Toc238149737"/>
+      <w:bookmarkStart w:id="21" w:name="_Toc238392136"/>
       <w:r>
         <w:t>2.3 Model Testing and Performance Metrics</w:t>
       </w:r>
-      <w:bookmarkEnd w:id="18"/>
-      <w:bookmarkEnd w:id="19"/>
+      <w:bookmarkEnd w:id="20"/>
+      <w:bookmarkEnd w:id="21"/>
     </w:p>
     <w:p>
       <w:pPr>
@@ -4043,13 +4041,13 @@
       <w:pPr>
         <w:pStyle w:val="Heading2"/>
       </w:pPr>
-      <w:bookmarkStart w:id="20" w:name="_Toc238149738"/>
-      <w:bookmarkStart w:id="21" w:name="_Toc238151078"/>
+      <w:bookmarkStart w:id="22" w:name="_Toc238149738"/>
+      <w:bookmarkStart w:id="23" w:name="_Toc238392137"/>
       <w:r>
         <w:t>2.4 How the Physical Effects Were Analysed</w:t>
       </w:r>
-      <w:bookmarkEnd w:id="20"/>
-      <w:bookmarkEnd w:id="21"/>
+      <w:bookmarkEnd w:id="22"/>
+      <w:bookmarkEnd w:id="23"/>
     </w:p>
     <w:p>
       <w:pPr>
@@ -4060,16 +4058,7 @@
         <w:t xml:space="preserve">Although overall scores are helpful, they do not demonstrate whether the model exhibits reasonable physical behaviour in various scenarios. Three complimentary analyses are employed to verify this. </w:t>
       </w:r>
       <w:r>
-        <w:t>To determine how heavily the model depends on each physical input across the dataset, an input-removal test, also known as ablation, first eliminates one original input from the</w:t>
-      </w:r>
-      <w:r>
-        <w:t xml:space="preserve"> </w:t>
-      </w:r>
-      <w:r>
-        <w:t>model and analyses how much model performance declines</w:t>
-      </w:r>
-      <w:r>
-        <w:t xml:space="preserve"> </w:t>
+        <w:t xml:space="preserve">To determine how heavily the model depends on each physical input across the dataset, an input-removal test, also known as ablation, first eliminates one original input from the model and analyses how much model performance declines </w:t>
       </w:r>
       <w:r>
         <w:t>(Section 3.4). Second, to illustrate the direction and form of the model response, controlled tests alter one input while maintaining the others constant (Section 3.5, Figure 3). Third, matched SPH comparisons examine whether an input's significance varies depending on encounter circumstances (Section 3.5, Figure 4).</w:t>
@@ -4079,13 +4068,13 @@
       <w:pPr>
         <w:pStyle w:val="Heading2"/>
       </w:pPr>
-      <w:bookmarkStart w:id="22" w:name="_Toc238149739"/>
-      <w:bookmarkStart w:id="23" w:name="_Toc238151079"/>
+      <w:bookmarkStart w:id="24" w:name="_Toc238149739"/>
+      <w:bookmarkStart w:id="25" w:name="_Toc238392138"/>
       <w:r>
         <w:t>2.5 When to Trust the Model</w:t>
       </w:r>
-      <w:bookmarkEnd w:id="22"/>
-      <w:bookmarkEnd w:id="23"/>
+      <w:bookmarkEnd w:id="24"/>
+      <w:bookmarkEnd w:id="25"/>
     </w:p>
     <w:p>
       <w:pPr>
@@ -4093,8 +4082,11 @@
         <w:jc w:val="both"/>
       </w:pPr>
       <w:r>
+        <w:t xml:space="preserve">The method also determines whether a new setup is comparable to SPH simulations that are already in the archive because model accuracy alone cannot demonstrate the reliability of each individual forecast because an overall score can conceal areas where the model has insufficient </w:t>
+      </w:r>
+      <w:r>
         <w:lastRenderedPageBreak/>
-        <w:t>The method also determines whether a new setup is comparable to SPH simulations that are already in the archive because model accuracy alone cannot demonstrate the reliability of each individual forecast because an overall score can conceal areas where the model has insufficient data or produces larger errors. When there are multiple independent SPH simulations and a low held-out prediction error in the surrounding area, predictions are more reliable. When the input combination is outside the sampled region, close to the edge of the available data, or poorly sampled, predictions are deemed less accurate. Figure 5 and section 3.6 provide an analysis of these inspections.</w:t>
+        <w:t>data or produces larger errors. When there are multiple independent SPH simulations and a low held-out prediction error in the surrounding area, predictions are more reliable. When the input combination is outside the sampled region, close to the edge of the available data, or poorly sampled, predictions are deemed less accurate. Figure 5 and section 3.6 provide an analysis of these inspections.</w:t>
       </w:r>
     </w:p>
     <w:p>
@@ -4150,65 +4142,30 @@
       <w:r>
         <w:t xml:space="preserve">, this is important because severe breakup can still leave almost no material bound to Mars (Richardson et al., 1998; Walsh &amp; Richardson, 2006). </w:t>
       </w:r>
+      <w:bookmarkStart w:id="26" w:name="_Toc238149740"/>
     </w:p>
     <w:p>
       <w:pPr>
         <w:pStyle w:val="Heading1"/>
       </w:pPr>
-      <w:bookmarkStart w:id="24" w:name="_Toc238149740"/>
-    </w:p>
-    <w:p>
-      <w:pPr>
-        <w:pStyle w:val="Heading1"/>
-      </w:pPr>
-    </w:p>
-    <w:p>
-      <w:pPr>
-        <w:pStyle w:val="Heading1"/>
-      </w:pPr>
-    </w:p>
-    <w:p>
-      <w:pPr>
-        <w:pStyle w:val="Heading1"/>
-      </w:pPr>
-    </w:p>
-    <w:p>
-      <w:pPr>
-        <w:pStyle w:val="Heading1"/>
-      </w:pPr>
-    </w:p>
-    <w:p>
-      <w:pPr>
-        <w:pStyle w:val="Heading1"/>
-      </w:pPr>
-    </w:p>
-    <w:p>
-      <w:pPr>
-        <w:pStyle w:val="Heading1"/>
-      </w:pPr>
-    </w:p>
-    <w:p>
-      <w:pPr>
-        <w:pStyle w:val="Heading1"/>
-      </w:pPr>
-      <w:bookmarkStart w:id="25" w:name="_Toc238151080"/>
+      <w:bookmarkStart w:id="27" w:name="_Toc238392139"/>
       <w:r>
         <w:t>3. Results</w:t>
-      </w:r>
-      <w:bookmarkEnd w:id="24"/>
-      <w:bookmarkEnd w:id="25"/>
-    </w:p>
-    <w:p>
-      <w:pPr>
-        <w:pStyle w:val="Heading2"/>
-      </w:pPr>
-      <w:bookmarkStart w:id="26" w:name="_Toc238149741"/>
-      <w:bookmarkStart w:id="27" w:name="_Toc238151081"/>
-      <w:r>
-        <w:t>3.1 Exploratory Physical Trends</w:t>
       </w:r>
       <w:bookmarkEnd w:id="26"/>
       <w:bookmarkEnd w:id="27"/>
+    </w:p>
+    <w:p>
+      <w:pPr>
+        <w:pStyle w:val="Heading2"/>
+      </w:pPr>
+      <w:bookmarkStart w:id="28" w:name="_Toc238149741"/>
+      <w:bookmarkStart w:id="29" w:name="_Toc238392140"/>
+      <w:r>
+        <w:t>3.1 Exploratory Physical Trends</w:t>
+      </w:r>
+      <w:bookmarkEnd w:id="28"/>
+      <w:bookmarkEnd w:id="29"/>
     </w:p>
     <w:p>
       <w:pPr>
@@ -4220,7 +4177,6 @@
         <w:rPr>
           <w:lang w:val="en-US"/>
         </w:rPr>
-        <w:lastRenderedPageBreak/>
         <w:drawing>
           <wp:inline distT="0" distB="0" distL="0" distR="0" wp14:anchorId="3D017574" wp14:editId="27FC7490">
             <wp:extent cx="5332223" cy="3966693"/>
@@ -4267,7 +4223,7 @@
           <w:szCs w:val="20"/>
         </w:rPr>
       </w:pPr>
-      <w:bookmarkStart w:id="28" w:name="_Toc238151303"/>
+      <w:bookmarkStart w:id="30" w:name="_Toc238151303"/>
       <w:r>
         <w:rPr>
           <w:sz w:val="20"/>
@@ -4315,14 +4271,7 @@
           <w:sz w:val="20"/>
           <w:szCs w:val="20"/>
         </w:rPr>
-        <w:t xml:space="preserve">. </w:t>
-      </w:r>
-      <w:r>
-        <w:rPr>
-          <w:sz w:val="20"/>
-          <w:szCs w:val="20"/>
-        </w:rPr>
-        <w:t>Exploratory SPH trends and mass-dependent bound-retention regimes. (a) Fragment count versus periapsis. (b) BMF across all sampled encounter conditions. (c-d) The same BMF results separated into 10</w:t>
+        <w:t>. Exploratory SPH trends and mass-dependent bound-retention regimes. (a) Fragment count versus periapsis. (b) BMF across all sampled encounter conditions. (c-d) The same BMF results separated into 10</w:t>
       </w:r>
       <w:r>
         <w:rPr>
@@ -4354,7 +4303,7 @@
         </w:rPr>
         <w:t xml:space="preserve"> kg asteroid-mass groups, showing that the combined scatter includes distinct retention regimes.</w:t>
       </w:r>
-      <w:bookmarkEnd w:id="28"/>
+      <w:bookmarkEnd w:id="30"/>
     </w:p>
     <w:p>
       <w:pPr>
@@ -4362,6 +4311,7 @@
         <w:jc w:val="both"/>
       </w:pPr>
       <w:r>
+        <w:lastRenderedPageBreak/>
         <w:t xml:space="preserve">Although close interactions do not always result in strong fragmentation or high BMF, Figure 1 illustrates that both fragmentation and bound retention typically decrease as periapsis increases. The mean BMF rises with tiny periapsis and falls with increasing encounter speed. The relative impacts also vary throughout the sampling range: separation between spin states becomes more apparent around 1.7-2.0 Mars radii, whereas velocity differences are more noticeable at roughly 1.1-1.6 Mars radii. The region is too rarely sampled to draw firm conclusions, but one prograde-spin case maintains roughly 3-4% BMF at 2.6 Mars radii whereas the other sampled cases are close to zero. </w:t>
       </w:r>
     </w:p>
@@ -4371,78 +4321,38 @@
         <w:jc w:val="both"/>
       </w:pPr>
       <w:r>
-        <w:t>The combined BMF graph is highly irregular because it has simulations from different asteroid-mass</w:t>
+        <w:t xml:space="preserve">The combined BMF graph is highly irregular because it has simulations from different asteroid-mass regimes, and separating the mass cases shows that this apparent scatter shows that the bound mass is regime-dependant rather than following a single periapsis trend. </w:t>
+      </w:r>
+      <w:r>
+        <w:t>The mass-separated panels also show a strong asymmetry in the sampled archive: the 1020 kg cases are much more heavily represented (n=271) than the 1019 kg cases (n=81), and they span substantially higher BMF and remain non-zero over a wider periapsis range. Th</w:t>
+      </w:r>
+      <w:r>
+        <w:t>e 10</w:t>
+      </w:r>
+      <w:r>
+        <w:rPr>
+          <w:vertAlign w:val="superscript"/>
+        </w:rPr>
+        <w:t>19</w:t>
       </w:r>
       <w:r>
         <w:t xml:space="preserve"> </w:t>
       </w:r>
       <w:r>
-        <w:t>regimes, and separating the mass cases shows that this apparent scatter shows that the bound mass is regime-dependant rather than following a single periapsis trend.</w:t>
-      </w:r>
-      <w:r>
-        <w:t xml:space="preserve"> </w:t>
-      </w:r>
-      <w:r>
-        <w:t>The mass-separated panels also show a strong asymmetry in the sampled archive: the 1020</w:t>
-      </w:r>
-      <w:r>
-        <w:t xml:space="preserve"> </w:t>
-      </w:r>
-      <w:r>
-        <w:t>kg cases are much more heavily represented (n=271) than the 1019 kg cases (n=81),</w:t>
-      </w:r>
-      <w:r>
-        <w:t xml:space="preserve"> </w:t>
-      </w:r>
-      <w:r>
-        <w:t>and they span substantially higher BMF and remain non-zero over a wider periapsis range.</w:t>
-      </w:r>
-      <w:r>
-        <w:t xml:space="preserve"> Th</w:t>
-      </w:r>
-      <w:r>
-        <w:t>e 10</w:t>
-      </w:r>
-      <w:r>
-        <w:rPr>
-          <w:vertAlign w:val="superscript"/>
-        </w:rPr>
-        <w:t>19</w:t>
-      </w:r>
-      <w:r>
-        <w:t xml:space="preserve"> </w:t>
-      </w:r>
-      <w:r>
-        <w:t>kg cases are mostly in a low-retention regime. However, because the two mass groups do not contain the same combinations of velocity, spin, and periapsis, this should not be interpreted as a direct causal mass effect.</w:t>
-      </w:r>
-      <w:r>
-        <w:t xml:space="preserve"> </w:t>
-      </w:r>
-      <w:r>
-        <w:t xml:space="preserve">Overall, the results </w:t>
-      </w:r>
-      <w:r>
-        <w:lastRenderedPageBreak/>
-        <w:t>show regime-dependent behaviour, where distinct bound-mass outcomes result from varying relative effects of parameters across the parameter space</w:t>
-      </w:r>
-      <w:r>
-        <w:t xml:space="preserve"> </w:t>
-      </w:r>
-      <w:r>
-        <w:t>rather than a single parameter acting independently.</w:t>
+        <w:t>kg cases are mostly in a low-retention regime. However, because the two mass groups do not contain the same combinations of velocity, spin, and periapsis, this should not be interpreted as a direct causal mass effect. Overall, the results show regime-dependent behaviour, where distinct bound-mass outcomes result from varying relative effects of parameters across the parameter space rather than a single parameter acting independently.</w:t>
       </w:r>
     </w:p>
     <w:p>
       <w:pPr>
         <w:pStyle w:val="Heading2"/>
       </w:pPr>
-      <w:bookmarkStart w:id="29" w:name="_Toc238149742"/>
-      <w:bookmarkStart w:id="30" w:name="_Toc238151082"/>
+      <w:bookmarkStart w:id="31" w:name="_Toc238149742"/>
+      <w:bookmarkStart w:id="32" w:name="_Toc238392141"/>
       <w:r>
         <w:t>3.2 Eccentricity and Bound Retention</w:t>
       </w:r>
-      <w:bookmarkEnd w:id="29"/>
-      <w:bookmarkEnd w:id="30"/>
+      <w:bookmarkEnd w:id="31"/>
+      <w:bookmarkEnd w:id="32"/>
     </w:p>
     <w:p>
       <w:pPr>
@@ -4469,6 +4379,7 @@
         <w:jc w:val="center"/>
       </w:pPr>
       <w:r>
+        <w:lastRenderedPageBreak/>
         <w:drawing>
           <wp:inline distT="0" distB="0" distL="114300" distR="114300" wp14:anchorId="485CF5A0" wp14:editId="2C25327C">
             <wp:extent cx="3529965" cy="2222500"/>
@@ -4513,7 +4424,7 @@
           <w:szCs w:val="24"/>
         </w:rPr>
       </w:pPr>
-      <w:bookmarkStart w:id="31" w:name="_Toc238151304"/>
+      <w:bookmarkStart w:id="33" w:name="_Toc238151304"/>
       <w:r>
         <w:t xml:space="preserve">Figure </w:t>
       </w:r>
@@ -4544,19 +4455,19 @@
       <w:r>
         <w:t>Strong and non-zero retention quickly disappears as the encounter becomes more hyperbolic.</w:t>
       </w:r>
-      <w:bookmarkEnd w:id="31"/>
+      <w:bookmarkEnd w:id="33"/>
     </w:p>
     <w:p>
       <w:pPr>
         <w:pStyle w:val="Heading2"/>
       </w:pPr>
-      <w:bookmarkStart w:id="32" w:name="_Toc238149743"/>
-      <w:bookmarkStart w:id="33" w:name="_Toc238151083"/>
+      <w:bookmarkStart w:id="34" w:name="_Toc238149743"/>
+      <w:bookmarkStart w:id="35" w:name="_Toc238392142"/>
       <w:r>
         <w:t>3.3 Model Performance and Screening Use</w:t>
       </w:r>
-      <w:bookmarkEnd w:id="32"/>
-      <w:bookmarkEnd w:id="33"/>
+      <w:bookmarkEnd w:id="34"/>
+      <w:bookmarkEnd w:id="35"/>
     </w:p>
     <w:p>
       <w:pPr>
@@ -4564,10 +4475,7 @@
         <w:jc w:val="both"/>
       </w:pPr>
       <w:r>
-        <w:t>The baseline model comparisons support Gradient Boosting for continuous BMF prediction. Random Forest produces R² = 0.8977, MAE = 0.0187, and RMSE = 0.0298, while Gradient Boosting achieves R² = 0.9142, MAE = 0.0175, and RMSE = 0.0272. Gradient Boosting is therefore the stronger baseline model for this dataset.</w:t>
-      </w:r>
-      <w:r>
-        <w:t xml:space="preserve"> </w:t>
+        <w:t xml:space="preserve">The baseline model comparisons support Gradient Boosting for continuous BMF prediction. Random Forest produces R² = 0.8977, MAE = 0.0187, and RMSE = 0.0298, while Gradient Boosting achieves R² = 0.9142, MAE = 0.0175, and RMSE = 0.0272. Gradient Boosting is therefore the stronger baseline model for this dataset. </w:t>
       </w:r>
     </w:p>
     <w:p>
@@ -4576,7 +4484,6 @@
         <w:jc w:val="both"/>
       </w:pPr>
       <w:r>
-        <w:lastRenderedPageBreak/>
         <w:t>For the BMF</w:t>
       </w:r>
       <w:r>
@@ -4598,32 +4505,29 @@
         <w:jc w:val="both"/>
       </w:pPr>
       <w:r>
-        <w:t>Tuning Gradient Boosting improves performance from R² = 0.9142, MAE = 0.0175, and RMSE = 0.0272 to R² = 0.9234, MAE = 0.0159, and RMSE = 0.0257 (Appendix A, Tables A1-A2). Adding the tested physics-derived features produces only a small further change to R² = 0.9240, MAE = 0.0155, and RMSE = 0.0257. This additional gain is not meaningful, so the tuned Gradient Boosting model using the original simulation inputs is selected as the primary model.</w:t>
-      </w:r>
-      <w:r>
-        <w:t xml:space="preserve"> </w:t>
+        <w:t xml:space="preserve">Tuning Gradient Boosting improves performance from R² = 0.9142, MAE = 0.0175, and RMSE = 0.0272 to R² = 0.9234, MAE = 0.0159, and RMSE = 0.0257 (Appendix A, Tables A1-A2). Adding the tested physics-derived features produces only a small further change to R² = 0.9240, MAE = 0.0155, and RMSE = 0.0257. This additional gain is not meaningful, so the tuned Gradient Boosting model using the original simulation inputs is selected as the primary model. </w:t>
       </w:r>
     </w:p>
     <w:p>
       <w:pPr>
         <w:pStyle w:val="Heading2"/>
       </w:pPr>
-      <w:bookmarkStart w:id="34" w:name="_Toc238149744"/>
-      <w:bookmarkStart w:id="35" w:name="_Toc238151084"/>
-      <w:commentRangeStart w:id="36"/>
+      <w:bookmarkStart w:id="36" w:name="_Toc238149744"/>
+      <w:bookmarkStart w:id="37" w:name="_Toc238392143"/>
+      <w:commentRangeStart w:id="38"/>
       <w:r>
         <w:t>3.4 Overall Physical Parameter Importance</w:t>
       </w:r>
-      <w:bookmarkEnd w:id="34"/>
-      <w:bookmarkEnd w:id="35"/>
-      <w:commentRangeEnd w:id="36"/>
+      <w:bookmarkEnd w:id="36"/>
+      <w:bookmarkEnd w:id="37"/>
+      <w:commentRangeEnd w:id="38"/>
       <w:r>
         <w:rPr>
           <w:rStyle w:val="CommentReference"/>
           <w:sz w:val="24"/>
           <w:szCs w:val="24"/>
         </w:rPr>
-        <w:commentReference w:id="36"/>
+        <w:commentReference w:id="38"/>
       </w:r>
     </w:p>
     <w:p>
@@ -4632,10 +4536,7 @@
         <w:jc w:val="both"/>
       </w:pPr>
       <w:r>
-        <w:t>The input-removal test yields the most understandable overall result. The amount of predictive information lost is indicated by the decrease in R² when each original physical input is removed from the tuned Gradient Boosting model. Removing periapsis causes the biggest drop (ΔR² = -0.574). Removing spin gives ΔR² = -0.316, and removing velocity gives ΔR² = -0.296. The overall effect of asteroid mass is smaller and less reliable. These values are separate ablation experiments and should not be added together. They display the degree to which the model depends on each input, not whether increasing that input directly raises or lowers BMF. Periapsis is the strongest overall, followed by spin and velocity, although this order may vary locally.</w:t>
-      </w:r>
-      <w:r>
-        <w:t xml:space="preserve"> </w:t>
+        <w:t xml:space="preserve">The input-removal test yields the most understandable overall result. The amount of predictive information lost is indicated by the decrease in R² when each original physical input is removed from the tuned Gradient Boosting model. Removing periapsis causes the biggest drop (ΔR² = -0.574). Removing spin gives ΔR² = -0.316, and removing velocity gives ΔR² = -0.296. The overall effect of asteroid mass is smaller and less reliable. These values are separate ablation experiments and should not be added together. They display the degree to which the model depends on each input, not whether increasing that input directly raises or lowers BMF. Periapsis is the strongest overall, followed by spin and velocity, although this order may vary locally. </w:t>
       </w:r>
     </w:p>
     <w:p>
@@ -4644,6 +4545,7 @@
         <w:jc w:val="both"/>
       </w:pPr>
       <w:r>
+        <w:lastRenderedPageBreak/>
         <w:t>A different response is required for fragmentation. The most extreme fragmentation in the SPH data requires very small periapsis, yet a close encounter does not ensure significant breakdown. FoF connecting length has a direct impact on fragment count as well. This analysis does not provide a single, straightforward global ranking for fragmentation because of this. While the actual fragment pattern depends on the entire encounter and how fragments are gathered during post-processing, periapsis indicates where the largest disruption may occur.</w:t>
       </w:r>
     </w:p>
@@ -4651,13 +4553,13 @@
       <w:pPr>
         <w:pStyle w:val="Heading2"/>
       </w:pPr>
-      <w:bookmarkStart w:id="37" w:name="_Toc238149745"/>
-      <w:bookmarkStart w:id="38" w:name="_Toc238151085"/>
+      <w:bookmarkStart w:id="39" w:name="_Toc238149745"/>
+      <w:bookmarkStart w:id="40" w:name="_Toc238392144"/>
       <w:r>
         <w:t>3.5 Checking Physical Trends and Condition-Dependent Effects</w:t>
       </w:r>
-      <w:bookmarkEnd w:id="37"/>
-      <w:bookmarkEnd w:id="38"/>
+      <w:bookmarkEnd w:id="39"/>
+      <w:bookmarkEnd w:id="40"/>
     </w:p>
     <w:p>
       <w:pPr>
@@ -4675,7 +4577,6 @@
         <w:jc w:val="center"/>
       </w:pPr>
       <w:r>
-        <w:lastRenderedPageBreak/>
         <w:drawing>
           <wp:inline distT="0" distB="0" distL="0" distR="0" wp14:anchorId="0F761EB7" wp14:editId="4955386A">
             <wp:extent cx="5243332" cy="3592467"/>
@@ -4722,7 +4623,7 @@
           <w:szCs w:val="28"/>
         </w:rPr>
       </w:pPr>
-      <w:bookmarkStart w:id="39" w:name="_Toc238151305"/>
+      <w:bookmarkStart w:id="41" w:name="_Toc238151305"/>
       <w:r>
         <w:rPr>
           <w:sz w:val="20"/>
@@ -4770,23 +4671,9 @@
           <w:sz w:val="20"/>
           <w:szCs w:val="20"/>
         </w:rPr>
-        <w:t xml:space="preserve">. BMF checks where one input changes at a time. Dots are available SPH simulation results and curves show tuned Gradient Boosting predictions with the other inputs fixed. Blue background shows the interpolation range, while red background shows the </w:t>
-      </w:r>
-      <w:r>
-        <w:rPr>
-          <w:sz w:val="20"/>
-          <w:szCs w:val="20"/>
-        </w:rPr>
-        <w:t>extrapolation range</w:t>
-      </w:r>
-      <w:r>
-        <w:rPr>
-          <w:sz w:val="20"/>
-          <w:szCs w:val="20"/>
-        </w:rPr>
-        <w:t>.</w:t>
-      </w:r>
-      <w:bookmarkEnd w:id="39"/>
+        <w:t>. BMF checks where one input changes at a time. Dots are available SPH simulation results and curves show tuned Gradient Boosting predictions with the other inputs fixed. Blue background shows the interpolation range, while red background shows the extrapolation range.</w:t>
+      </w:r>
+      <w:bookmarkEnd w:id="41"/>
     </w:p>
     <w:p>
       <w:pPr>
@@ -4797,16 +4684,11 @@
         <w:t>Figure 3 compares the tuned Gradient Boosting response with available SPH simulation results by changing one input at a time while holding the others constant. In the representative periapsis profile, predicted BMF generally decreases from roughly 0.27 at 1.2 Mars radii to approximately zero by about 2.5 Mars radii.</w:t>
       </w:r>
       <w:r>
-        <w:t xml:space="preserve"> </w:t>
-      </w:r>
-      <w:r>
-        <w:t>The model remains slightly above the SPH results around 2.2</w:t>
-      </w:r>
-      <w:r>
-        <w:t>-</w:t>
-      </w:r>
-      <w:r>
-        <w:t>2.4 Mars radii because its prediction is influenced by patterns learned from the wider training data, not periapsis alone. By about 2.5 Mars radii, the input crosses tree thresholds associated mainly with zero-BMF training cases, so the prediction also falls to approximately zero.</w:t>
+        <w:t xml:space="preserve"> The model remains slightly above the SPH results around 2.2-2.4 Mars radii because its prediction is influenced by patterns learned from the wider training data, </w:t>
+      </w:r>
+      <w:r>
+        <w:lastRenderedPageBreak/>
+        <w:t>not periapsis alone. By about 2.5 Mars radii, the input crosses tree thresholds associated mainly with zero-BMF training cases, so the prediction also falls to approximately zero.</w:t>
       </w:r>
       <w:r>
         <w:t xml:space="preserve"> A similarly clear decline occurs as encounter velocity increases, from roughly 0.25 at low velocity to approximately zero by about 1.2 km/s.</w:t>
@@ -4824,11 +4706,7 @@
         <w:t xml:space="preserve"> Gradient Boosting</w:t>
       </w:r>
       <w:r>
-        <w:t xml:space="preserve"> curve should be considered model dependent. For the z-axis scenario that is shown, the spin-period panel is almost flat, indicating that altering the spin period has minimal impact in this specific configuration. This demonstrates that an input that is significant throughout the whole dataset can only have a minor </w:t>
-      </w:r>
-      <w:r>
-        <w:lastRenderedPageBreak/>
-        <w:t>impact given a particular set of encounter conditions, which does not contradict the overall significance of spin in Section 3.4.</w:t>
+        <w:t xml:space="preserve"> curve should be considered model dependent. For the z-axis scenario that is shown, the spin-period panel is almost flat, indicating that altering the spin period has minimal impact in this specific configuration. This demonstrates that an input that is significant throughout the whole dataset can only have a minor impact given a particular set of encounter conditions, which does not contradict the overall significance of spin in Section 3.4.</w:t>
       </w:r>
     </w:p>
     <w:p>
@@ -4895,7 +4773,7 @@
           <w:szCs w:val="28"/>
         </w:rPr>
       </w:pPr>
-      <w:bookmarkStart w:id="40" w:name="_Toc238151306"/>
+      <w:bookmarkStart w:id="42" w:name="_Toc238151306"/>
       <w:r>
         <w:rPr>
           <w:sz w:val="20"/>
@@ -4973,16 +4851,9 @@
           <w:sz w:val="20"/>
           <w:szCs w:val="20"/>
         </w:rPr>
-        <w:t xml:space="preserve"> subset at timestep 90000 and FoF linking length 0.004. Left: BMF range across spin states with velocity fixed. Right: BMF range across velocities with spin fixed. These ranges show how strongly outcomes </w:t>
-      </w:r>
-      <w:r>
-        <w:rPr>
-          <w:sz w:val="20"/>
-          <w:szCs w:val="20"/>
-        </w:rPr>
-        <w:t>differ within this subset; they do not show direction or prove causation.</w:t>
-      </w:r>
-      <w:bookmarkEnd w:id="40"/>
+        <w:t xml:space="preserve"> subset at timestep 90000 and FoF linking length 0.004. Left: BMF range across spin states with velocity fixed. Right: BMF range across velocities with spin fixed. These ranges show how strongly outcomes differ within this subset; they do not show direction or prove causation.</w:t>
+      </w:r>
+      <w:bookmarkEnd w:id="42"/>
     </w:p>
     <w:p>
       <w:pPr>
@@ -5017,6 +4888,7 @@
         <w:jc w:val="both"/>
       </w:pPr>
       <w:r>
+        <w:lastRenderedPageBreak/>
         <w:t>The outcome makes it abundantly evident that each parameter's intensity varies. Changing spin results in a BMF range of around 0.06-0.09 below about 1.5 Mars-radii. This can grow much stronger at bigger periapsis: the spin-related range increases to around 0.24 at 1.8 Mars-radii for v</w:t>
       </w:r>
       <w:r>
@@ -5042,13 +4914,13 @@
       <w:pPr>
         <w:pStyle w:val="Heading2"/>
       </w:pPr>
-      <w:bookmarkStart w:id="41" w:name="_Toc238149746"/>
-      <w:bookmarkStart w:id="42" w:name="_Toc238151086"/>
+      <w:bookmarkStart w:id="43" w:name="_Toc238149746"/>
+      <w:bookmarkStart w:id="44" w:name="_Toc238392145"/>
       <w:r>
         <w:t>3.6 Where the Model Can and Cannot Be Trusted</w:t>
       </w:r>
-      <w:bookmarkEnd w:id="41"/>
-      <w:bookmarkEnd w:id="42"/>
+      <w:bookmarkEnd w:id="43"/>
+      <w:bookmarkEnd w:id="44"/>
     </w:p>
     <w:p>
       <w:pPr>
@@ -5056,7 +4928,6 @@
         <w:jc w:val="both"/>
       </w:pPr>
       <w:r>
-        <w:lastRenderedPageBreak/>
         <w:t>The quantity of local SPH data and prediction error both influence trust. Instead of counting repeated FoF rows, the coverage-error maps count distinct physical simulations and compare that number to the average held-out absolute error in the same area. While sparse or fringe regions can have significantly worse error, regions with many simulations typically have lower error. Low error is insufficient on its own; certain poorly sampled locations appear simple simply because the true BMF is typically zero.</w:t>
       </w:r>
     </w:p>
@@ -5097,7 +4968,7 @@
           <w:szCs w:val="20"/>
         </w:rPr>
       </w:pPr>
-      <w:bookmarkStart w:id="43" w:name="_Toc238151451"/>
+      <w:bookmarkStart w:id="45" w:name="_Toc238151451"/>
       <w:r>
         <w:rPr>
           <w:sz w:val="20"/>
@@ -5176,7 +5047,7 @@
         </w:rPr>
         <w:t>but only two unique physical SPH simulations support these cases.</w:t>
       </w:r>
-      <w:bookmarkEnd w:id="43"/>
+      <w:bookmarkEnd w:id="45"/>
     </w:p>
     <w:tbl>
       <w:tblPr>
@@ -5546,7 +5417,6 @@
         <w:jc w:val="center"/>
       </w:pPr>
       <w:r>
-        <w:lastRenderedPageBreak/>
         <w:drawing>
           <wp:inline distT="0" distB="0" distL="114300" distR="114300" wp14:anchorId="5D08FC53" wp14:editId="3CC4E8E0">
             <wp:extent cx="4268788" cy="6836818"/>
@@ -5591,7 +5461,7 @@
           <w:szCs w:val="20"/>
         </w:rPr>
       </w:pPr>
-      <w:bookmarkStart w:id="44" w:name="_Toc238151307"/>
+      <w:bookmarkStart w:id="46" w:name="_Toc238151307"/>
       <w:r>
         <w:rPr>
           <w:sz w:val="20"/>
@@ -5655,7 +5525,7 @@
         </w:rPr>
         <w:t>(Top: the number of unique SPH simulations and the mean held-out absolute error provide different information. Bottom: pairwise coverage shows input combinations that are missing even when each individual value is within its sampled range.) Grey means no SPH data in that bin, light blue means SPH data exists, but the mean observed BMF is 0, while other coloured cells mean that SPH data exists and mean observed BMF is &gt; 0.</w:t>
       </w:r>
-      <w:bookmarkEnd w:id="44"/>
+      <w:bookmarkEnd w:id="46"/>
     </w:p>
     <w:p>
       <w:pPr>
@@ -5671,13 +5541,13 @@
       <w:pPr>
         <w:pStyle w:val="Heading2"/>
       </w:pPr>
-      <w:bookmarkStart w:id="45" w:name="_Toc238149747"/>
-      <w:bookmarkStart w:id="46" w:name="_Toc238151087"/>
+      <w:bookmarkStart w:id="47" w:name="_Toc238149747"/>
+      <w:bookmarkStart w:id="48" w:name="_Toc238392146"/>
       <w:r>
         <w:t>3.7 How the Model Supports SPH Decisions</w:t>
       </w:r>
-      <w:bookmarkEnd w:id="45"/>
-      <w:bookmarkEnd w:id="46"/>
+      <w:bookmarkEnd w:id="47"/>
+      <w:bookmarkEnd w:id="48"/>
     </w:p>
     <w:p>
       <w:pPr>
@@ -5716,13 +5586,13 @@
       <w:pPr>
         <w:pStyle w:val="Heading1"/>
       </w:pPr>
-      <w:bookmarkStart w:id="47" w:name="_Toc238149748"/>
-      <w:bookmarkStart w:id="48" w:name="_Toc238151088"/>
+      <w:bookmarkStart w:id="49" w:name="_Toc238149748"/>
+      <w:bookmarkStart w:id="50" w:name="_Toc238392147"/>
       <w:r>
         <w:t>4. Discussion</w:t>
       </w:r>
-      <w:bookmarkEnd w:id="47"/>
-      <w:bookmarkEnd w:id="48"/>
+      <w:bookmarkEnd w:id="49"/>
+      <w:bookmarkEnd w:id="50"/>
     </w:p>
     <w:p>
       <w:pPr>
@@ -5801,28 +5671,28 @@
       <w:pPr>
         <w:pStyle w:val="Heading1"/>
       </w:pPr>
-      <w:bookmarkStart w:id="49" w:name="_Toc238149749"/>
-      <w:bookmarkStart w:id="50" w:name="_Toc238151089"/>
+      <w:bookmarkStart w:id="51" w:name="_Toc238149749"/>
+      <w:bookmarkStart w:id="52" w:name="_Toc238392148"/>
       <w:r>
         <w:t>5. Conclusions, Limitations and Future Work</w:t>
-      </w:r>
-      <w:bookmarkEnd w:id="49"/>
-      <w:bookmarkEnd w:id="50"/>
-    </w:p>
-    <w:p>
-      <w:pPr>
-        <w:pStyle w:val="Heading2"/>
-      </w:pPr>
-      <w:bookmarkStart w:id="51" w:name="_Toc238149750"/>
-      <w:bookmarkStart w:id="52" w:name="_Toc238151090"/>
-      <w:r>
-        <w:t>5.1 Conclusions and Answers to the Research Questions</w:t>
       </w:r>
       <w:bookmarkEnd w:id="51"/>
       <w:bookmarkEnd w:id="52"/>
     </w:p>
     <w:p>
       <w:pPr>
+        <w:pStyle w:val="Heading2"/>
+      </w:pPr>
+      <w:bookmarkStart w:id="53" w:name="_Toc238149750"/>
+      <w:bookmarkStart w:id="54" w:name="_Toc238392149"/>
+      <w:r>
+        <w:t>5.1 Conclusions and Answers to the Research Questions</w:t>
+      </w:r>
+      <w:bookmarkEnd w:id="53"/>
+      <w:bookmarkEnd w:id="54"/>
+    </w:p>
+    <w:p>
+      <w:pPr>
         <w:spacing w:before="240" w:after="240" w:line="276" w:lineRule="auto"/>
         <w:jc w:val="both"/>
       </w:pPr>
@@ -5866,13 +5736,7 @@
         <w:t>Q</w:t>
       </w:r>
       <w:r>
-        <w:t xml:space="preserve">uestion </w:t>
-      </w:r>
-      <w:r>
-        <w:t>2</w:t>
-      </w:r>
-      <w:r>
-        <w:t>:</w:t>
+        <w:t>uestion 2:</w:t>
       </w:r>
       <w:r>
         <w:t xml:space="preserve"> </w:t>
@@ -5921,13 +5785,7 @@
         <w:t>Q</w:t>
       </w:r>
       <w:r>
-        <w:t xml:space="preserve">uestion </w:t>
-      </w:r>
-      <w:r>
-        <w:t>3</w:t>
-      </w:r>
-      <w:r>
-        <w:t>:</w:t>
+        <w:t>uestion 3:</w:t>
       </w:r>
       <w:r>
         <w:t xml:space="preserve"> </w:t>
@@ -5964,13 +5822,13 @@
       <w:pPr>
         <w:pStyle w:val="Heading2"/>
       </w:pPr>
-      <w:bookmarkStart w:id="53" w:name="_Toc238149751"/>
-      <w:bookmarkStart w:id="54" w:name="_Toc238151091"/>
+      <w:bookmarkStart w:id="55" w:name="_Toc238149751"/>
+      <w:bookmarkStart w:id="56" w:name="_Toc238392150"/>
       <w:r>
         <w:t>5.2 Limitations</w:t>
       </w:r>
-      <w:bookmarkEnd w:id="53"/>
-      <w:bookmarkEnd w:id="54"/>
+      <w:bookmarkEnd w:id="55"/>
+      <w:bookmarkEnd w:id="56"/>
     </w:p>
     <w:p>
       <w:pPr>
@@ -6013,13 +5871,13 @@
       <w:pPr>
         <w:pStyle w:val="Heading2"/>
       </w:pPr>
-      <w:bookmarkStart w:id="55" w:name="_Toc238149752"/>
-      <w:bookmarkStart w:id="56" w:name="_Toc238151092"/>
+      <w:bookmarkStart w:id="57" w:name="_Toc238149752"/>
+      <w:bookmarkStart w:id="58" w:name="_Toc238392151"/>
       <w:r>
         <w:t>5.3 Future Work</w:t>
       </w:r>
-      <w:bookmarkEnd w:id="55"/>
-      <w:bookmarkEnd w:id="56"/>
+      <w:bookmarkEnd w:id="57"/>
+      <w:bookmarkEnd w:id="58"/>
     </w:p>
     <w:p>
       <w:pPr>
@@ -6064,8 +5922,7 @@
       <w:pPr>
         <w:pStyle w:val="Heading1"/>
       </w:pPr>
-      <w:bookmarkStart w:id="57" w:name="_Toc238149753"/>
-      <w:bookmarkStart w:id="58" w:name="_Toc238151093"/>
+      <w:bookmarkStart w:id="59" w:name="_Toc238149753"/>
     </w:p>
     <w:p>
       <w:pPr>
@@ -6081,11 +5938,12 @@
       <w:pPr>
         <w:pStyle w:val="Heading1"/>
       </w:pPr>
+      <w:bookmarkStart w:id="60" w:name="_Toc238392152"/>
       <w:r>
         <w:t>References</w:t>
       </w:r>
-      <w:bookmarkEnd w:id="57"/>
-      <w:bookmarkEnd w:id="58"/>
+      <w:bookmarkEnd w:id="59"/>
+      <w:bookmarkEnd w:id="60"/>
     </w:p>
     <w:p>
       <w:pPr>
@@ -6406,14 +6264,14 @@
       <w:pPr>
         <w:pStyle w:val="Heading1"/>
       </w:pPr>
-      <w:bookmarkStart w:id="59" w:name="_Toc238149754"/>
-      <w:bookmarkStart w:id="60" w:name="_Toc238151094"/>
+      <w:bookmarkStart w:id="61" w:name="_Toc238149754"/>
+      <w:bookmarkStart w:id="62" w:name="_Toc238392153"/>
       <w:r>
         <w:lastRenderedPageBreak/>
         <w:t>Appendix A. Supporting Model Results</w:t>
       </w:r>
-      <w:bookmarkEnd w:id="59"/>
-      <w:bookmarkEnd w:id="60"/>
+      <w:bookmarkEnd w:id="61"/>
+      <w:bookmarkEnd w:id="62"/>
     </w:p>
     <w:p>
       <w:pPr>
@@ -10506,21 +10364,7 @@
           <w:noProof w:val="0"/>
           <w:lang w:val="en-US"/>
         </w:rPr>
-        <w:t xml:space="preserve">The 10% BMF threshold (using logistic regression) is used for screening rather than as a criterion for moon formation, </w:t>
-      </w:r>
-      <w:r>
-        <w:rPr>
-          <w:noProof w:val="0"/>
-          <w:lang w:val="en-US"/>
-        </w:rPr>
-        <w:t>therefore</w:t>
-      </w:r>
-      <w:r>
-        <w:rPr>
-          <w:noProof w:val="0"/>
-          <w:lang w:val="en-US"/>
-        </w:rPr>
-        <w:t xml:space="preserve"> excluded from the table.</w:t>
+        <w:t>The 10% BMF threshold (using logistic regression) is used for screening rather than as a criterion for moon formation, therefore excluded from the table.</w:t>
       </w:r>
       <w:r>
         <w:rPr>
@@ -10638,17 +10482,7 @@
           <w:sz w:val="20"/>
           <w:szCs w:val="20"/>
         </w:rPr>
-        <w:t xml:space="preserve">. </w:t>
-      </w:r>
-      <w:r>
-        <w:rPr>
-          <w:i/>
-          <w:iCs/>
-          <w:color w:val="000000" w:themeColor="text1"/>
-          <w:sz w:val="20"/>
-          <w:szCs w:val="20"/>
-        </w:rPr>
-        <w:t>Gradient Boosting predictions beyond the observed SPH parameter ranges.</w:t>
+        <w:t>. Gradient Boosting predictions beyond the observed SPH parameter ranges.</w:t>
       </w:r>
     </w:p>
     <w:p>
@@ -10684,7 +10518,7 @@
       <w:pPr>
         <w:pStyle w:val="Heading1"/>
       </w:pPr>
-      <w:bookmarkStart w:id="61" w:name="_Toc238149755"/>
+      <w:bookmarkStart w:id="63" w:name="_Toc238149755"/>
     </w:p>
     <w:p>
       <w:pPr>
@@ -10705,93 +10539,21 @@
       <w:pPr>
         <w:pStyle w:val="Heading1"/>
       </w:pPr>
-      <w:bookmarkStart w:id="62" w:name="_Toc238151095"/>
+      <w:bookmarkStart w:id="64" w:name="_Toc238149756"/>
+      <w:bookmarkStart w:id="65" w:name="_Toc238392154"/>
+      <w:bookmarkEnd w:id="63"/>
       <w:r>
         <w:lastRenderedPageBreak/>
-        <w:t>Appendix B. Decision-Support Prototype</w:t>
-      </w:r>
-      <w:bookmarkEnd w:id="61"/>
-      <w:bookmarkEnd w:id="62"/>
-    </w:p>
-    <w:p>
-      <w:pPr>
-        <w:keepNext/>
-        <w:spacing w:line="276" w:lineRule="auto"/>
-        <w:jc w:val="center"/>
-        <w:rPr>
-          <w:color w:val="000000" w:themeColor="text1"/>
-        </w:rPr>
-      </w:pPr>
-      <w:r>
-        <w:rPr>
-          <w:color w:val="000000" w:themeColor="text1"/>
-        </w:rPr>
-        <w:drawing>
-          <wp:inline distT="0" distB="0" distL="114300" distR="114300" wp14:anchorId="54ACCCA8" wp14:editId="0434360E">
-            <wp:extent cx="4892040" cy="5192574"/>
-            <wp:effectExtent l="0" t="0" r="0" b="0"/>
-            <wp:docPr id="2" name="image2.png"/>
-            <wp:cNvGraphicFramePr/>
-            <a:graphic xmlns:a="http://schemas.openxmlformats.org/drawingml/2006/main">
-              <a:graphicData uri="http://schemas.openxmlformats.org/drawingml/2006/picture">
-                <pic:pic xmlns:pic="http://schemas.openxmlformats.org/drawingml/2006/picture">
-                  <pic:nvPicPr>
-                    <pic:cNvPr id="2" name="image2.png"/>
-                    <pic:cNvPicPr/>
-                  </pic:nvPicPr>
-                  <pic:blipFill>
-                    <a:blip r:embed="rId18"/>
-                    <a:stretch>
-                      <a:fillRect/>
-                    </a:stretch>
-                  </pic:blipFill>
-                  <pic:spPr>
-                    <a:xfrm>
-                      <a:off x="0" y="0"/>
-                      <a:ext cx="4892040" cy="5192574"/>
-                    </a:xfrm>
-                    <a:prstGeom prst="rect">
-                      <a:avLst/>
-                    </a:prstGeom>
-                  </pic:spPr>
-                </pic:pic>
-              </a:graphicData>
-            </a:graphic>
-          </wp:inline>
-        </w:drawing>
-      </w:r>
-    </w:p>
-    <w:p>
-      <w:pPr>
-        <w:keepLines/>
-        <w:spacing w:line="276" w:lineRule="auto"/>
-        <w:jc w:val="center"/>
-        <w:rPr>
-          <w:i/>
-          <w:iCs/>
-          <w:color w:val="000000" w:themeColor="text1"/>
-          <w:sz w:val="20"/>
-          <w:szCs w:val="20"/>
-        </w:rPr>
-      </w:pPr>
-      <w:r>
-        <w:rPr>
-          <w:i/>
-          <w:iCs/>
-          <w:color w:val="000000" w:themeColor="text1"/>
-          <w:sz w:val="20"/>
-          <w:szCs w:val="20"/>
-        </w:rPr>
-        <w:t>Figure B1. Mars Tidal Disruption Screening Explorer. The demonstration interface uses the main Random Forest model to report predicted BMF, estimated Mars-bound mass, data-coverage checks and a recommendation on whether another SPH simulation is needed.</w:t>
-      </w:r>
-    </w:p>
-    <w:p>
-      <w:pPr>
-        <w:spacing w:line="276" w:lineRule="auto"/>
-        <w:rPr>
-          <w:color w:val="000000" w:themeColor="text1"/>
-        </w:rPr>
-      </w:pPr>
+        <w:t xml:space="preserve">Appendix </w:t>
+      </w:r>
+      <w:r>
+        <w:t>B</w:t>
+      </w:r>
+      <w:r>
+        <w:t>. AI acknowledgement Statement</w:t>
+      </w:r>
+      <w:bookmarkEnd w:id="64"/>
+      <w:bookmarkEnd w:id="65"/>
     </w:p>
     <w:p>
       <w:pPr>
@@ -10805,85 +10567,12 @@
         <w:rPr>
           <w:color w:val="000000" w:themeColor="text1"/>
         </w:rPr>
-        <w:t>A demonstration implementation of the screening workflow was developed as a dashboard and API package. It packages the model, input processing, coverage checks and screening rules into a runnable interface. The application can be downloaded and run locally by cloning the project repository.</w:t>
-      </w:r>
-    </w:p>
-    <w:p>
-      <w:pPr>
-        <w:widowControl w:val="0"/>
-        <w:pBdr>
-          <w:top w:val="nil"/>
-          <w:left w:val="nil"/>
-          <w:bottom w:val="nil"/>
-          <w:right w:val="nil"/>
-          <w:between w:val="nil"/>
-        </w:pBdr>
-        <w:spacing w:line="276" w:lineRule="auto"/>
-        <w:jc w:val="both"/>
-        <w:rPr>
-          <w:color w:val="000000" w:themeColor="text1"/>
-        </w:rPr>
-      </w:pPr>
-    </w:p>
-    <w:p>
-      <w:pPr>
-        <w:spacing w:after="160" w:line="276" w:lineRule="auto"/>
-        <w:jc w:val="both"/>
-        <w:rPr>
-          <w:rFonts w:eastAsiaTheme="majorEastAsia"/>
-          <w:b/>
-          <w:bCs/>
-          <w:color w:val="000000" w:themeColor="text1"/>
-          <w:kern w:val="2"/>
-          <w:sz w:val="28"/>
-          <w:szCs w:val="28"/>
-          <w14:ligatures w14:val="standardContextual"/>
-        </w:rPr>
-      </w:pPr>
-      <w:bookmarkStart w:id="63" w:name="_brg4hhj14he5" w:colFirst="0" w:colLast="0"/>
-      <w:bookmarkEnd w:id="63"/>
-      <w:r>
-        <w:rPr>
-          <w:b/>
-          <w:bCs/>
-          <w:color w:val="000000" w:themeColor="text1"/>
-          <w:sz w:val="28"/>
-          <w:szCs w:val="28"/>
-        </w:rPr>
-        <w:br w:type="page"/>
-      </w:r>
-    </w:p>
-    <w:p>
-      <w:pPr>
-        <w:pStyle w:val="Heading1"/>
-      </w:pPr>
-      <w:bookmarkStart w:id="64" w:name="_Toc238149756"/>
-      <w:bookmarkStart w:id="65" w:name="_Toc238151096"/>
-      <w:r>
-        <w:lastRenderedPageBreak/>
-        <w:t>Appendix C. AI acknowledgement Statement</w:t>
-      </w:r>
-      <w:bookmarkEnd w:id="64"/>
-      <w:bookmarkEnd w:id="65"/>
-    </w:p>
-    <w:p>
-      <w:pPr>
-        <w:spacing w:line="276" w:lineRule="auto"/>
-        <w:jc w:val="both"/>
-        <w:rPr>
-          <w:color w:val="000000" w:themeColor="text1"/>
-        </w:rPr>
-      </w:pPr>
-      <w:r>
-        <w:rPr>
-          <w:color w:val="000000" w:themeColor="text1"/>
-        </w:rPr>
         <w:t>I used OpenAI Codex (https://chatgpt.com/codex) throughout the project for targeted code-development support. This included producing initial implementation drafts for data extraction and processing, exploratory data analysis, feature engineering, diagnostic and visualisation scripts, refactoring, debugging, repository documentation, and some commit messages. All AI-assisted code and documentation were reviewed, modified, tested, and verified by me before inclusion. I specified the scientific questions, modelling targets, physics-derived features, thresholds, evaluation strategy, plot selection, interpretation, and final project decisions, and I can explain, modify, and reproduce the submitted implementation. AI was not used to write the Project Plan or Final Report. The scientific conclusions, design decisions, and submitted report are made by me and reflect my own work and understanding. Further details of AI usage are documented in docs/ai_usage.md.</w:t>
       </w:r>
     </w:p>
     <w:sectPr>
-      <w:footerReference w:type="even" r:id="rId19"/>
-      <w:footerReference w:type="default" r:id="rId20"/>
+      <w:footerReference w:type="even" r:id="rId18"/>
+      <w:footerReference w:type="default" r:id="rId19"/>
       <w:pgSz w:w="12240" w:h="15840"/>
       <w:pgMar w:top="1440" w:right="1440" w:bottom="1440" w:left="1440" w:header="720" w:footer="720" w:gutter="0"/>
       <w:pgNumType w:start="0"/>
@@ -10897,7 +10586,7 @@
 
 <file path=word/comments.xml><?xml version="1.0" encoding="utf-8"?>
 <w:comments xmlns:wpc="http://schemas.microsoft.com/office/word/2010/wordprocessingCanvas" xmlns:cx="http://schemas.microsoft.com/office/drawing/2014/chartex" xmlns:cx1="http://schemas.microsoft.com/office/drawing/2015/9/8/chartex" xmlns:cx2="http://schemas.microsoft.com/office/drawing/2015/10/21/chartex" xmlns:cx3="http://schemas.microsoft.com/office/drawing/2016/5/9/chartex" xmlns:cx4="http://schemas.microsoft.com/office/drawing/2016/5/10/chartex" xmlns:cx5="http://schemas.microsoft.com/office/drawing/2016/5/11/chartex" xmlns:cx6="http://schemas.microsoft.com/office/drawing/2016/5/12/chartex" xmlns:cx7="http://schemas.microsoft.com/office/drawing/2016/5/13/chartex" xmlns:cx8="http://schemas.microsoft.com/office/drawing/2016/5/14/chartex" xmlns:mc="http://schemas.openxmlformats.org/markup-compatibility/2006" xmlns:m="http://schemas.openxmlformats.org/officeDocument/2006/math" xmlns:aink="http://schemas.microsoft.com/office/drawing/2016/ink" xmlns:am3d="http://schemas.microsoft.com/office/drawing/2017/model3d" xmlns:oel="http://schemas.microsoft.com/office/2019/extlst" xmlns:r="http://schemas.openxmlformats.org/officeDocument/2006/relationships" xmlns:wp14="http://schemas.microsoft.com/office/word/2010/wordprocessingDrawing" xmlns:wp="http://schemas.openxmlformats.org/drawingml/2006/wordprocessingDrawing" xmlns:wpg="http://schemas.microsoft.com/office/word/2010/wordprocessingGroup" xmlns:wpi="http://schemas.microsoft.com/office/word/2010/wordprocessingInk" xmlns:wps="http://schemas.microsoft.com/office/word/2010/wordprocessingShape" xmlns:o="urn:schemas-microsoft-com:office:office" xmlns:v="urn:schemas-microsoft-com:vml" xmlns:w10="urn:schemas-microsoft-com:office:word" xmlns:w="http://schemas.openxmlformats.org/wordprocessingml/2006/main" xmlns:w14="http://schemas.microsoft.com/office/word/2010/wordml" xmlns:w15="http://schemas.microsoft.com/office/word/2012/wordml" xmlns:w16cex="http://schemas.microsoft.com/office/word/2018/wordml/cex" xmlns:w16cid="http://schemas.microsoft.com/office/word/2016/wordml/cid" xmlns:w16="http://schemas.microsoft.com/office/word/2018/wordml" xmlns:w16sdtdh="http://schemas.microsoft.com/office/word/2020/wordml/sdtdatahash" xmlns:w16sdtfl="http://schemas.microsoft.com/office/word/2024/wordml/sdtformatlock" xmlns:w16se="http://schemas.microsoft.com/office/word/2015/wordml/symex" xmlns:w16du="http://schemas.microsoft.com/office/word/2023/wordml/word16du" xmlns:wne="http://schemas.microsoft.com/office/word/2006/wordml" mc:Ignorable="w14 w15 w16se w16cid w16 w16cex w16sdtdh w16sdtfl w16du wp14">
-  <w:comment w:id="36" w:author="Kristy Natasha" w:date="2026-08-19T20:25:00Z" w:initials="KN">
+  <w:comment w:id="38" w:author="Kristy Natasha" w:date="2026-08-19T20:25:00Z" w:initials="KN">
     <w:p>
       <w:r>
         <w:rPr>

</xml_diff>

<commit_message>
docs: formatting issue, superscript, table 1 coverage replace filename code
</commit_message>
<xml_diff>
--- a/deliverables/nny124-final-report.docx
+++ b/deliverables/nny124-final-report.docx
@@ -1381,7 +1381,7 @@
           <w:rPr>
             <w:webHidden/>
           </w:rPr>
-          <w:t>10</w:t>
+          <w:t>9</w:t>
         </w:r>
         <w:r>
           <w:rPr>
@@ -1507,7 +1507,7 @@
           <w:rPr>
             <w:webHidden/>
           </w:rPr>
-          <w:t>11</w:t>
+          <w:t>10</w:t>
         </w:r>
         <w:r>
           <w:rPr>
@@ -1696,7 +1696,7 @@
           <w:rPr>
             <w:webHidden/>
           </w:rPr>
-          <w:t>16</w:t>
+          <w:t>15</w:t>
         </w:r>
         <w:r>
           <w:rPr>
@@ -1759,7 +1759,7 @@
           <w:rPr>
             <w:webHidden/>
           </w:rPr>
-          <w:t>16</w:t>
+          <w:t>15</w:t>
         </w:r>
         <w:r>
           <w:rPr>
@@ -1822,7 +1822,7 @@
           <w:rPr>
             <w:webHidden/>
           </w:rPr>
-          <w:t>17</w:t>
+          <w:t>16</w:t>
         </w:r>
         <w:r>
           <w:rPr>
@@ -1885,7 +1885,7 @@
           <w:rPr>
             <w:webHidden/>
           </w:rPr>
-          <w:t>17</w:t>
+          <w:t>16</w:t>
         </w:r>
         <w:r>
           <w:rPr>
@@ -1948,7 +1948,7 @@
           <w:rPr>
             <w:webHidden/>
           </w:rPr>
-          <w:t>18</w:t>
+          <w:t>17</w:t>
         </w:r>
         <w:r>
           <w:rPr>
@@ -2011,7 +2011,7 @@
           <w:rPr>
             <w:webHidden/>
           </w:rPr>
-          <w:t>19</w:t>
+          <w:t>18</w:t>
         </w:r>
         <w:r>
           <w:rPr>
@@ -2074,7 +2074,7 @@
           <w:rPr>
             <w:webHidden/>
           </w:rPr>
-          <w:t>19</w:t>
+          <w:t>18</w:t>
         </w:r>
         <w:r>
           <w:rPr>
@@ -2137,7 +2137,7 @@
           <w:rPr>
             <w:webHidden/>
           </w:rPr>
-          <w:t>22</w:t>
+          <w:t>20</w:t>
         </w:r>
         <w:r>
           <w:rPr>
@@ -2200,7 +2200,7 @@
           <w:rPr>
             <w:webHidden/>
           </w:rPr>
-          <w:t>25</w:t>
+          <w:t>23</w:t>
         </w:r>
         <w:r>
           <w:rPr>
@@ -2391,7 +2391,7 @@
           <w:rPr>
             <w:webHidden/>
           </w:rPr>
-          <w:t>14</w:t>
+          <w:t>13</w:t>
         </w:r>
         <w:r>
           <w:rPr>
@@ -2528,7 +2528,7 @@
           <w:rPr>
             <w:webHidden/>
           </w:rPr>
-          <w:t>9</w:t>
+          <w:t>8</w:t>
         </w:r>
         <w:r>
           <w:rPr>
@@ -2670,7 +2670,7 @@
           <w:rPr>
             <w:webHidden/>
           </w:rPr>
-          <w:t>12</w:t>
+          <w:t>11</w:t>
         </w:r>
         <w:r>
           <w:rPr>
@@ -2761,7 +2761,7 @@
           <w:rPr>
             <w:webHidden/>
           </w:rPr>
-          <w:t>13</w:t>
+          <w:t>12</w:t>
         </w:r>
         <w:r>
           <w:rPr>
@@ -2826,7 +2826,7 @@
           <w:rPr>
             <w:webHidden/>
           </w:rPr>
-          <w:t>15</w:t>
+          <w:t>14</w:t>
         </w:r>
         <w:r>
           <w:rPr>
@@ -2970,7 +2970,26 @@
           <w:sz w:val="20"/>
           <w:szCs w:val="20"/>
         </w:rPr>
-        <w:t>Changes in spin in matched cases result in BMF discrepancies of up to 0.24 at bigger periapsis and between 0.06 and 0.09 below 1.5 Mars radii. Despite falling within the numerical training ranges, a sparsely sampled 1019.5 kg instance yields held-out errors close to 0.08 BMF, demonstrating that being within the input range does not ensure a trustworthy prediction. Therefore, the model does not replace SPH or prove physical causality, but it is helpful for quickly screening well-supported encounter circumstances and highlighting parameter correlations that call for additional SPH research.</w:t>
+        <w:t>Changes in spin in matched cases result in BMF discrepancies of up to 0.24 at bigger periapsis and between 0.06 and 0.09 below 1.5 Mars radii. Despite falling within the numerical training ranges, a sparsely sampled 10</w:t>
+      </w:r>
+      <w:r>
+        <w:rPr>
+          <w:i/>
+          <w:iCs/>
+          <w:sz w:val="20"/>
+          <w:szCs w:val="20"/>
+          <w:vertAlign w:val="superscript"/>
+        </w:rPr>
+        <w:t>19.5</w:t>
+      </w:r>
+      <w:r>
+        <w:rPr>
+          <w:i/>
+          <w:iCs/>
+          <w:sz w:val="20"/>
+          <w:szCs w:val="20"/>
+        </w:rPr>
+        <w:t xml:space="preserve"> kg instance yields held-out errors close to 0.08 BMF, demonstrating that being within the input range does not ensure a trustworthy prediction. Therefore, the model does not replace SPH or prove physical causality, but it is helpful for quickly screening well-supported encounter circumstances and highlighting parameter correlations that call for additional SPH research.</w:t>
       </w:r>
     </w:p>
     <w:p>
@@ -3412,34 +3431,55 @@
               <w:spacing w:before="240" w:after="240" w:line="276" w:lineRule="auto"/>
             </w:pPr>
             <w:r>
-              <w:t>A</w:t>
-            </w:r>
-            <w:r>
-              <w:rPr>
-                <w:vertAlign w:val="subscript"/>
-              </w:rPr>
-              <w:t>1800</w:t>
-            </w:r>
-            <w:r>
-              <w:t>-A</w:t>
-            </w:r>
-            <w:r>
-              <w:rPr>
-                <w:vertAlign w:val="subscript"/>
-              </w:rPr>
-              <w:t>2100</w:t>
-            </w:r>
-            <w:r>
-              <w:t>; A</w:t>
-            </w:r>
-            <w:r>
-              <w:rPr>
-                <w:vertAlign w:val="subscript"/>
-              </w:rPr>
-              <w:t>2000</w:t>
-            </w:r>
-            <w:r>
-              <w:t xml:space="preserve"> dominates</w:t>
+              <w:t>10</w:t>
+            </w:r>
+            <w:r>
+              <w:rPr>
+                <w:vertAlign w:val="superscript"/>
+              </w:rPr>
+              <w:t>18</w:t>
+            </w:r>
+            <w:r>
+              <w:rPr>
+                <w:vertAlign w:val="superscript"/>
+              </w:rPr>
+              <w:t xml:space="preserve"> </w:t>
+            </w:r>
+            <w:r>
+              <w:t>to 1</w:t>
+            </w:r>
+            <w:r>
+              <w:t>0</w:t>
+            </w:r>
+            <w:r>
+              <w:rPr>
+                <w:vertAlign w:val="superscript"/>
+              </w:rPr>
+              <w:t>20</w:t>
+            </w:r>
+            <w:r>
+              <w:t xml:space="preserve"> </w:t>
+            </w:r>
+            <w:r>
+              <w:t xml:space="preserve"> kg</w:t>
+            </w:r>
+            <w:r>
+              <w:t xml:space="preserve">; </w:t>
+            </w:r>
+            <w:r>
+              <w:t>10</w:t>
+            </w:r>
+            <w:r>
+              <w:rPr>
+                <w:vertAlign w:val="superscript"/>
+              </w:rPr>
+              <w:t>20</w:t>
+            </w:r>
+            <w:r>
+              <w:t xml:space="preserve"> </w:t>
+            </w:r>
+            <w:r>
+              <w:t>dominates</w:t>
             </w:r>
           </w:p>
         </w:tc>
@@ -3453,49 +3493,7 @@
               <w:jc w:val="both"/>
             </w:pPr>
             <w:r>
-              <w:t>Mass of the incoming asteroid. For example, A</w:t>
-            </w:r>
-            <w:r>
-              <w:rPr>
-                <w:vertAlign w:val="subscript"/>
-              </w:rPr>
-              <w:t>2</w:t>
-            </w:r>
-            <w:r>
-              <w:rPr>
-                <w:vertAlign w:val="subscript"/>
-              </w:rPr>
-              <w:t>0</w:t>
-            </w:r>
-            <w:r>
-              <w:rPr>
-                <w:vertAlign w:val="subscript"/>
-              </w:rPr>
-              <w:t>00</w:t>
-            </w:r>
-            <w:r>
-              <w:t xml:space="preserve"> </w:t>
-            </w:r>
-            <w:r>
-              <w:t>=</w:t>
-            </w:r>
-            <w:r>
-              <w:t xml:space="preserve"> 10</w:t>
-            </w:r>
-            <w:r>
-              <w:rPr>
-                <w:vertAlign w:val="superscript"/>
-              </w:rPr>
-              <w:t>2</w:t>
-            </w:r>
-            <w:r>
-              <w:rPr>
-                <w:vertAlign w:val="superscript"/>
-              </w:rPr>
-              <w:t>0</w:t>
-            </w:r>
-            <w:r>
-              <w:t xml:space="preserve"> kg. Its effect on BMF also depends on the other encounter conditions.</w:t>
+              <w:t>Mass of the incoming asteroid. Its effect on BMF also depends on the other encounter conditions.</w:t>
             </w:r>
           </w:p>
         </w:tc>
@@ -3524,40 +3522,19 @@
               <w:spacing w:before="240" w:after="240" w:line="276" w:lineRule="auto"/>
             </w:pPr>
             <w:r>
-              <w:t>r</w:t>
-            </w:r>
-            <w:r>
-              <w:rPr>
-                <w:vertAlign w:val="subscript"/>
-              </w:rPr>
-              <w:t>11</w:t>
-            </w:r>
-            <w:r>
-              <w:t>-r</w:t>
-            </w:r>
-            <w:r>
-              <w:rPr>
-                <w:vertAlign w:val="subscript"/>
-              </w:rPr>
-              <w:t>30</w:t>
-            </w:r>
-            <w:r>
-              <w:t>; r</w:t>
-            </w:r>
-            <w:r>
-              <w:rPr>
-                <w:vertAlign w:val="subscript"/>
-              </w:rPr>
-              <w:t>12</w:t>
-            </w:r>
-            <w:r>
-              <w:t xml:space="preserve"> and r</w:t>
-            </w:r>
-            <w:r>
-              <w:rPr>
-                <w:vertAlign w:val="subscript"/>
-              </w:rPr>
-              <w:t>16</w:t>
+              <w:t>1.1 to 3.0 Mars radii</w:t>
+            </w:r>
+            <w:r>
+              <w:t xml:space="preserve">; </w:t>
+            </w:r>
+            <w:r>
+              <w:t>1.2</w:t>
+            </w:r>
+            <w:r>
+              <w:t xml:space="preserve"> and </w:t>
+            </w:r>
+            <w:r>
+              <w:t>1.6 Mars radii</w:t>
             </w:r>
             <w:r>
               <w:t xml:space="preserve"> common</w:t>
@@ -3574,31 +3551,13 @@
               <w:jc w:val="both"/>
             </w:pPr>
             <w:r>
-              <w:t>Closest distance between the asteroid and Mars. For example, r</w:t>
-            </w:r>
-            <w:r>
-              <w:rPr>
-                <w:vertAlign w:val="subscript"/>
-              </w:rPr>
-              <w:t>12</w:t>
-            </w:r>
-            <w:r>
-              <w:t xml:space="preserve"> = 1.2</w:t>
+              <w:t>Closest distance between the asteroid and Mars.</w:t>
             </w:r>
             <w:r>
               <w:t xml:space="preserve"> </w:t>
             </w:r>
             <w:r>
-              <w:t>R</w:t>
-            </w:r>
-            <w:r>
-              <w:rPr>
-                <w:vertAlign w:val="subscript"/>
-              </w:rPr>
-              <w:t>Mars</w:t>
-            </w:r>
-            <w:r>
-              <w:t xml:space="preserve"> (Mars-radii). Smaller values mean a closer encounter and stronger tidal forces.</w:t>
+              <w:t>Smaller values mean a closer encounter and stronger tidal forces.</w:t>
             </w:r>
           </w:p>
         </w:tc>
@@ -3627,34 +3586,29 @@
               <w:spacing w:before="240" w:after="240" w:line="276" w:lineRule="auto"/>
             </w:pPr>
             <w:r>
+              <w:t>0 to 3.0 km/s</w:t>
+            </w:r>
+            <w:r>
+              <w:t xml:space="preserve">; </w:t>
+            </w:r>
+            <w:r>
+              <w:rPr>
+                <w:color w:val="000000" w:themeColor="text1"/>
+              </w:rPr>
               <w:t>v</w:t>
             </w:r>
             <w:r>
               <w:rPr>
+                <w:color w:val="000000" w:themeColor="text1"/>
                 <w:vertAlign w:val="subscript"/>
               </w:rPr>
-              <w:t>00</w:t>
-            </w:r>
-            <w:r>
-              <w:t>-v</w:t>
-            </w:r>
-            <w:r>
-              <w:rPr>
-                <w:vertAlign w:val="subscript"/>
-              </w:rPr>
-              <w:t>30</w:t>
-            </w:r>
-            <w:r>
-              <w:t>; v</w:t>
-            </w:r>
-            <w:r>
-              <w:rPr>
-                <w:vertAlign w:val="subscript"/>
-              </w:rPr>
-              <w:t>00</w:t>
-            </w:r>
-            <w:r>
-              <w:t xml:space="preserve"> dominates</w:t>
+              <w:t>∞</w:t>
+            </w:r>
+            <w:r>
+              <w:t xml:space="preserve">=0 km/s </w:t>
+            </w:r>
+            <w:r>
+              <w:t>dominates</w:t>
             </w:r>
           </w:p>
         </w:tc>
@@ -3668,16 +3622,7 @@
               <w:jc w:val="both"/>
             </w:pPr>
             <w:r>
-              <w:t>Speed of the asteroid during the encounter. v</w:t>
-            </w:r>
-            <w:r>
-              <w:rPr>
-                <w:vertAlign w:val="subscript"/>
-              </w:rPr>
-              <w:t>00</w:t>
-            </w:r>
-            <w:r>
-              <w:t xml:space="preserve"> is the lowest-speed case, while higher v codes represent faster encounters. Higher speeds cause less capture.</w:t>
+              <w:t>Asteroid speed far from Mars before the encounter. Higher encounter speeds generally reduce the time available for tidal interaction and capture.</w:t>
             </w:r>
           </w:p>
         </w:tc>
@@ -3707,7 +3652,7 @@
               <w:spacing w:before="240" w:after="240" w:line="276" w:lineRule="auto"/>
             </w:pPr>
             <w:r>
-              <w:t>none, x, y, z, mz; unevenly sampled</w:t>
+              <w:t>No spin; equatorial x- or y-axis spin; prograde z-axis spin; retrograde z-axis spin; unevenly sampled</w:t>
             </w:r>
           </w:p>
         </w:tc>
@@ -3721,7 +3666,7 @@
               <w:jc w:val="both"/>
             </w:pPr>
             <w:r>
-              <w:t>Rotation of the asteroid and the direction of its spin axis: none means no spin, x or y means equatorial spin, z means prograde z-spin, and mz means retrograde z-spin. Spin can change how the asteroid breaks up, but the different spin settings are unevenly sampled.</w:t>
+              <w:t>Rotation state of the asteroid. Spin can alter the disruption and bound-retention outcome, and the available spin states are unevenly sampled.</w:t>
             </w:r>
           </w:p>
         </w:tc>
@@ -3750,34 +3695,52 @@
               <w:spacing w:before="240" w:after="240" w:line="276" w:lineRule="auto"/>
             </w:pPr>
             <w:r>
-              <w:t>n</w:t>
-            </w:r>
-            <w:r>
-              <w:rPr>
-                <w:vertAlign w:val="subscript"/>
-              </w:rPr>
-              <w:t>50</w:t>
-            </w:r>
-            <w:r>
-              <w:t>-n</w:t>
-            </w:r>
-            <w:r>
-              <w:rPr>
-                <w:vertAlign w:val="subscript"/>
-              </w:rPr>
-              <w:t>70</w:t>
-            </w:r>
-            <w:r>
-              <w:t>; n</w:t>
-            </w:r>
-            <w:r>
-              <w:rPr>
-                <w:vertAlign w:val="subscript"/>
-              </w:rPr>
-              <w:t>65</w:t>
-            </w:r>
-            <w:r>
-              <w:t xml:space="preserve"> dominates</w:t>
+              <w:t>Approximately</w:t>
+            </w:r>
+            <w:r>
+              <w:t xml:space="preserve"> </w:t>
+            </w:r>
+            <w:r>
+              <w:t>10</w:t>
+            </w:r>
+            <w:r>
+              <w:rPr>
+                <w:vertAlign w:val="superscript"/>
+              </w:rPr>
+              <w:t>5</w:t>
+            </w:r>
+            <w:r>
+              <w:t xml:space="preserve"> to </w:t>
+            </w:r>
+            <w:r>
+              <w:t>10</w:t>
+            </w:r>
+            <w:r>
+              <w:rPr>
+                <w:vertAlign w:val="superscript"/>
+              </w:rPr>
+              <w:t xml:space="preserve">7 </w:t>
+            </w:r>
+            <w:r>
+              <w:t xml:space="preserve">particles; </w:t>
+            </w:r>
+            <w:r>
+              <w:t>10</w:t>
+            </w:r>
+            <w:r>
+              <w:rPr>
+                <w:vertAlign w:val="superscript"/>
+              </w:rPr>
+              <w:t>6.5</w:t>
+            </w:r>
+            <w:r>
+              <w:rPr>
+                <w:vertAlign w:val="superscript"/>
+              </w:rPr>
+              <w:t xml:space="preserve"> </w:t>
+            </w:r>
+            <w:r>
+              <w:t>particles dominates</w:t>
             </w:r>
           </w:p>
         </w:tc>
@@ -3791,25 +3754,7 @@
               <w:jc w:val="both"/>
             </w:pPr>
             <w:r>
-              <w:t>Number of SPH particles used in the simulation. For example, n</w:t>
-            </w:r>
-            <w:r>
-              <w:rPr>
-                <w:vertAlign w:val="subscript"/>
-              </w:rPr>
-              <w:t>65</w:t>
-            </w:r>
-            <w:r>
-              <w:t xml:space="preserve"> is roughly 10</w:t>
-            </w:r>
-            <w:r>
-              <w:rPr>
-                <w:vertAlign w:val="superscript"/>
-              </w:rPr>
-              <w:t>6.5</w:t>
-            </w:r>
-            <w:r>
-              <w:t xml:space="preserve"> particles. This is a numerical setting rather than a physical property of the encounter.</w:t>
+              <w:t>Number of SPH particles used in the simulation. This is a numerical simulation setting rather than a physical property of the encounter.</w:t>
             </w:r>
           </w:p>
         </w:tc>
@@ -3859,7 +3804,7 @@
               <w:jc w:val="both"/>
             </w:pPr>
             <w:r>
-              <w:t>The maximum distance used to decide if nearby particles belong to the same fragment or not. Can change the measured fragments, does not change the physical encounter.</w:t>
+              <w:t>Maximum separation used by the friends-of-friends algorithm to assign nearby particles to the same fragment. It can change the measured fragment properties but does not change the physical encounter.</w:t>
             </w:r>
           </w:p>
         </w:tc>
@@ -3973,17 +3918,14 @@
         <w:jc w:val="both"/>
       </w:pPr>
       <w:r>
+        <w:lastRenderedPageBreak/>
         <w:t xml:space="preserve">For the prediction tasks, </w:t>
       </w:r>
       <w:r>
         <w:t>several</w:t>
       </w:r>
       <w:r>
-        <w:t xml:space="preserve"> baseline models were used. While this project primarily focuses on tree-based models, Logistic Regression is also used for the BMF ≥ 10% classification task because it offers a straightforward baseline for testing whether lower- and higher-retention cases can already be separated using a relatively simple combination of the inputs (Knauer et al., 2024). Because Random Forest can capture nonlinear correlations and interactions between the simulation </w:t>
-      </w:r>
-      <w:r>
-        <w:lastRenderedPageBreak/>
-        <w:t>parameters while averaging numerous trees to lessen susceptibility to specific cases, it is tried for continuous BMF prediction (Breiman, 2001; Cambioni et al., 2019). Additionally, Gradient Boosting is evaluated since it constructs trees in a sequential manner, with each subsequent tree fixing mistakes produced by the ones before it. This could assist capture more precise changes between various encounter settings (Friedman, 2001; Valencia et al., 2019; Timpe et al., 2020).</w:t>
+        <w:t xml:space="preserve"> baseline models were used. While this project primarily focuses on tree-based models, Logistic Regression is also used for the BMF ≥ 10% classification task because it offers a straightforward baseline for testing whether lower- and higher-retention cases can already be separated using a relatively simple combination of the inputs (Knauer et al., 2024). Because Random Forest can capture nonlinear correlations and interactions between the simulation parameters while averaging numerous trees to lessen susceptibility to specific cases, it is tried for continuous BMF prediction (Breiman, 2001; Cambioni et al., 2019). Additionally, Gradient Boosting is evaluated since it constructs trees in a sequential manner, with each subsequent tree fixing mistakes produced by the ones before it. This could assist capture more precise changes between various encounter settings (Friedman, 2001; Valencia et al., 2019; Timpe et al., 2020).</w:t>
       </w:r>
     </w:p>
     <w:p>
@@ -4071,6 +4013,7 @@
       <w:bookmarkStart w:id="24" w:name="_Toc238149739"/>
       <w:bookmarkStart w:id="25" w:name="_Toc238392138"/>
       <w:r>
+        <w:lastRenderedPageBreak/>
         <w:t>2.5 When to Trust the Model</w:t>
       </w:r>
       <w:bookmarkEnd w:id="24"/>
@@ -4082,11 +4025,7 @@
         <w:jc w:val="both"/>
       </w:pPr>
       <w:r>
-        <w:t xml:space="preserve">The method also determines whether a new setup is comparable to SPH simulations that are already in the archive because model accuracy alone cannot demonstrate the reliability of each individual forecast because an overall score can conceal areas where the model has insufficient </w:t>
-      </w:r>
-      <w:r>
-        <w:lastRenderedPageBreak/>
-        <w:t>data or produces larger errors. When there are multiple independent SPH simulations and a low held-out prediction error in the surrounding area, predictions are more reliable. When the input combination is outside the sampled region, close to the edge of the available data, or poorly sampled, predictions are deemed less accurate. Figure 5 and section 3.6 provide an analysis of these inspections.</w:t>
+        <w:t>The method also determines whether a new setup is comparable to SPH simulations that are already in the archive because model accuracy alone cannot demonstrate the reliability of each individual forecast because an overall score can conceal areas where the model has insufficient data or produces larger errors. When there are multiple independent SPH simulations and a low held-out prediction error in the surrounding area, predictions are more reliable. When the input combination is outside the sampled region, close to the edge of the available data, or poorly sampled, predictions are deemed less accurate. Figure 5 and section 3.6 provide an analysis of these inspections.</w:t>
       </w:r>
     </w:p>
     <w:p>
@@ -4177,6 +4116,7 @@
         <w:rPr>
           <w:lang w:val="en-US"/>
         </w:rPr>
+        <w:lastRenderedPageBreak/>
         <w:drawing>
           <wp:inline distT="0" distB="0" distL="0" distR="0" wp14:anchorId="3D017574" wp14:editId="27FC7490">
             <wp:extent cx="5332223" cy="3966693"/>
@@ -4286,15 +4226,14 @@
           <w:sz w:val="20"/>
           <w:szCs w:val="20"/>
         </w:rPr>
-        <w:t xml:space="preserve"> and 10</w:t>
+        <w:t xml:space="preserve"> and </w:t>
       </w:r>
       <w:r>
         <w:rPr>
           <w:sz w:val="20"/>
           <w:szCs w:val="20"/>
-          <w:vertAlign w:val="superscript"/>
-        </w:rPr>
-        <w:t>20</w:t>
+        </w:rPr>
+        <w:t xml:space="preserve"> </w:t>
       </w:r>
       <w:r>
         <w:rPr>
@@ -4311,7 +4250,6 @@
         <w:jc w:val="both"/>
       </w:pPr>
       <w:r>
-        <w:lastRenderedPageBreak/>
         <w:t xml:space="preserve">Although close interactions do not always result in strong fragmentation or high BMF, Figure 1 illustrates that both fragmentation and bound retention typically decrease as periapsis increases. The mean BMF rises with tiny periapsis and falls with increasing encounter speed. The relative impacts also vary throughout the sampling range: separation between spin states becomes more apparent around 1.7-2.0 Mars radii, whereas velocity differences are more noticeable at roughly 1.1-1.6 Mars radii. The region is too rarely sampled to draw firm conclusions, but one prograde-spin case maintains roughly 3-4% BMF at 2.6 Mars radii whereas the other sampled cases are close to zero. </w:t>
       </w:r>
     </w:p>
@@ -4324,7 +4262,16 @@
         <w:t xml:space="preserve">The combined BMF graph is highly irregular because it has simulations from different asteroid-mass regimes, and separating the mass cases shows that this apparent scatter shows that the bound mass is regime-dependant rather than following a single periapsis trend. </w:t>
       </w:r>
       <w:r>
-        <w:t>The mass-separated panels also show a strong asymmetry in the sampled archive: the 1020 kg cases are much more heavily represented (n=271) than the 1019 kg cases (n=81), and they span substantially higher BMF and remain non-zero over a wider periapsis range. Th</w:t>
+        <w:t>The mass-separated panels also show a strong asymmetry in the sampled archive: the 10</w:t>
+      </w:r>
+      <w:r>
+        <w:rPr>
+          <w:vertAlign w:val="superscript"/>
+        </w:rPr>
+        <w:t>20</w:t>
+      </w:r>
+      <w:r>
+        <w:t xml:space="preserve"> kg cases are much more heavily represented (n=271) than the 1019 kg cases (n=81), and they span substantially higher BMF and remain non-zero over a wider periapsis range. Th</w:t>
       </w:r>
       <w:r>
         <w:t>e 10</w:t>
@@ -4339,7 +4286,11 @@
         <w:t xml:space="preserve"> </w:t>
       </w:r>
       <w:r>
-        <w:t>kg cases are mostly in a low-retention regime. However, because the two mass groups do not contain the same combinations of velocity, spin, and periapsis, this should not be interpreted as a direct causal mass effect. Overall, the results show regime-dependent behaviour, where distinct bound-mass outcomes result from varying relative effects of parameters across the parameter space rather than a single parameter acting independently.</w:t>
+        <w:t xml:space="preserve">kg cases are mostly in a low-retention regime. However, because the two mass groups do not contain the same combinations of velocity, spin, and periapsis, this should not be interpreted as a direct causal mass effect. Overall, the results </w:t>
+      </w:r>
+      <w:r>
+        <w:lastRenderedPageBreak/>
+        <w:t>show regime-dependent behaviour, where distinct bound-mass outcomes result from varying relative effects of parameters across the parameter space rather than a single parameter acting independently.</w:t>
       </w:r>
     </w:p>
     <w:p>
@@ -4379,7 +4330,6 @@
         <w:jc w:val="center"/>
       </w:pPr>
       <w:r>
-        <w:lastRenderedPageBreak/>
         <w:drawing>
           <wp:inline distT="0" distB="0" distL="114300" distR="114300" wp14:anchorId="485CF5A0" wp14:editId="2C25327C">
             <wp:extent cx="3529965" cy="2222500"/>
@@ -4484,6 +4434,7 @@
         <w:jc w:val="both"/>
       </w:pPr>
       <w:r>
+        <w:lastRenderedPageBreak/>
         <w:t>For the BMF</w:t>
       </w:r>
       <w:r>
@@ -4545,7 +4496,6 @@
         <w:jc w:val="both"/>
       </w:pPr>
       <w:r>
-        <w:lastRenderedPageBreak/>
         <w:t>A different response is required for fragmentation. The most extreme fragmentation in the SPH data requires very small periapsis, yet a close encounter does not ensure significant breakdown. FoF connecting length has a direct impact on fragment count as well. This analysis does not provide a single, straightforward global ranking for fragmentation because of this. While the actual fragment pattern depends on the entire encounter and how fragments are gathered during post-processing, periapsis indicates where the largest disruption may occur.</w:t>
       </w:r>
     </w:p>
@@ -4577,6 +4527,7 @@
         <w:jc w:val="center"/>
       </w:pPr>
       <w:r>
+        <w:lastRenderedPageBreak/>
         <w:drawing>
           <wp:inline distT="0" distB="0" distL="0" distR="0" wp14:anchorId="0F761EB7" wp14:editId="4955386A">
             <wp:extent cx="5243332" cy="3592467"/>
@@ -4684,11 +4635,7 @@
         <w:t>Figure 3 compares the tuned Gradient Boosting response with available SPH simulation results by changing one input at a time while holding the others constant. In the representative periapsis profile, predicted BMF generally decreases from roughly 0.27 at 1.2 Mars radii to approximately zero by about 2.5 Mars radii.</w:t>
       </w:r>
       <w:r>
-        <w:t xml:space="preserve"> The model remains slightly above the SPH results around 2.2-2.4 Mars radii because its prediction is influenced by patterns learned from the wider training data, </w:t>
-      </w:r>
-      <w:r>
-        <w:lastRenderedPageBreak/>
-        <w:t>not periapsis alone. By about 2.5 Mars radii, the input crosses tree thresholds associated mainly with zero-BMF training cases, so the prediction also falls to approximately zero.</w:t>
+        <w:t xml:space="preserve"> The model remains slightly above the SPH results around 2.2-2.4 Mars radii because its prediction is influenced by patterns learned from the wider training data, not periapsis alone. By about 2.5 Mars radii, the input crosses tree thresholds associated mainly with zero-BMF training cases, so the prediction also falls to approximately zero.</w:t>
       </w:r>
       <w:r>
         <w:t xml:space="preserve"> A similarly clear decline occurs as encounter velocity increases, from roughly 0.25 at low velocity to approximately zero by about 1.2 km/s.</w:t>
@@ -4706,7 +4653,11 @@
         <w:t xml:space="preserve"> Gradient Boosting</w:t>
       </w:r>
       <w:r>
-        <w:t xml:space="preserve"> curve should be considered model dependent. For the z-axis scenario that is shown, the spin-period panel is almost flat, indicating that altering the spin period has minimal impact in this specific configuration. This demonstrates that an input that is significant throughout the whole dataset can only have a minor impact given a particular set of encounter conditions, which does not contradict the overall significance of spin in Section 3.4.</w:t>
+        <w:t xml:space="preserve"> curve should be considered model dependent. For the z-axis scenario that is shown, the spin-period panel is almost flat, indicating that altering the spin period has minimal impact in this specific configuration. This demonstrates that an input that is significant throughout the whole dataset can only have a minor </w:t>
+      </w:r>
+      <w:r>
+        <w:lastRenderedPageBreak/>
+        <w:t>impact given a particular set of encounter conditions, which does not contradict the overall significance of spin in Section 3.4.</w:t>
       </w:r>
     </w:p>
     <w:p>
@@ -4888,7 +4839,6 @@
         <w:jc w:val="both"/>
       </w:pPr>
       <w:r>
-        <w:lastRenderedPageBreak/>
         <w:t>The outcome makes it abundantly evident that each parameter's intensity varies. Changing spin results in a BMF range of around 0.06-0.09 below about 1.5 Mars-radii. This can grow much stronger at bigger periapsis: the spin-related range increases to around 0.24 at 1.8 Mars-radii for v</w:t>
       </w:r>
       <w:r>
@@ -4928,6 +4878,7 @@
         <w:jc w:val="both"/>
       </w:pPr>
       <w:r>
+        <w:lastRenderedPageBreak/>
         <w:t>The quantity of local SPH data and prediction error both influence trust. Instead of counting repeated FoF rows, the coverage-error maps count distinct physical simulations and compare that number to the average held-out absolute error in the same area. While sparse or fringe regions can have significantly worse error, regions with many simulations typically have lower error. Low error is insufficient on its own; certain poorly sampled locations appear simple simply because the true BMF is typically zero.</w:t>
       </w:r>
     </w:p>
@@ -5417,6 +5368,7 @@
         <w:jc w:val="center"/>
       </w:pPr>
       <w:r>
+        <w:lastRenderedPageBreak/>
         <w:drawing>
           <wp:inline distT="0" distB="0" distL="114300" distR="114300" wp14:anchorId="5D08FC53" wp14:editId="3CC4E8E0">
             <wp:extent cx="4268788" cy="6836818"/>
@@ -5917,22 +5869,7 @@
       <w:r>
         <w:t>Future research should enhance automatic identification of input combinations with inadequate support and per-prediction reliability estimates. Before updating the current model, new SPH simulations should be used to test exploratory XGBoost and hurdle models. Stronger physical limitations, multi-output prediction, and uncertainty estimates are possible additional enhancements.</w:t>
       </w:r>
-    </w:p>
-    <w:p>
-      <w:pPr>
-        <w:pStyle w:val="Heading1"/>
-      </w:pPr>
       <w:bookmarkStart w:id="59" w:name="_Toc238149753"/>
-    </w:p>
-    <w:p>
-      <w:pPr>
-        <w:pStyle w:val="Heading1"/>
-      </w:pPr>
-    </w:p>
-    <w:p>
-      <w:pPr>
-        <w:pStyle w:val="Heading1"/>
-      </w:pPr>
     </w:p>
     <w:p>
       <w:pPr>
@@ -6038,7 +5975,6 @@
         <w:rPr>
           <w:color w:val="000000" w:themeColor="text1"/>
         </w:rPr>
-        <w:lastRenderedPageBreak/>
         <w:t>Citron, R. I., Genda, H. &amp; Ida, S. (2015). Formation of Phobos and Deimos via a giant impact. Icarus, 252, 334-338. doi:10.1016/j.icarus.2015.02.011.</w:t>
       </w:r>
     </w:p>
@@ -6055,6 +5991,7 @@
         <w:rPr>
           <w:color w:val="000000" w:themeColor="text1"/>
         </w:rPr>
+        <w:lastRenderedPageBreak/>
         <w:t>Duan, T., Anand, A., Ding, D. Y., Thai, K. K., Basu, S., Ng, A. &amp; Schuler, A. (2020). NGBoost: Natural Gradient Boosting for Probabilistic Prediction. Proceedings of the 37th International Conference on Machine Learning, PMLR 119, 2690-2700.</w:t>
       </w:r>
     </w:p>
@@ -6231,7 +6168,6 @@
         <w:rPr>
           <w:color w:val="000000" w:themeColor="text1"/>
         </w:rPr>
-        <w:lastRenderedPageBreak/>
         <w:t>Walsh, K. J. &amp; Richardson, D. C. (2006). Binary near-Earth asteroid formation: Rubble pile model of tidal disruptions. Icarus, 180(1), 201-216. doi:10.1016/j.icarus.2005.08.015.</w:t>
       </w:r>
     </w:p>
@@ -12130,6 +12066,23 @@
     <w:unhideWhenUsed/>
     <w:rsid w:val="00A81E8F"/>
   </w:style>
+  <w:style w:type="paragraph" w:styleId="Revision">
+    <w:name w:val="Revision"/>
+    <w:hidden/>
+    <w:uiPriority w:val="99"/>
+    <w:semiHidden/>
+    <w:rsid w:val="00673E6B"/>
+    <w:pPr>
+      <w:spacing w:after="0" w:line="240" w:lineRule="auto"/>
+    </w:pPr>
+    <w:rPr>
+      <w:rFonts w:ascii="Times New Roman" w:eastAsia="Times New Roman" w:hAnsi="Times New Roman" w:cs="Times New Roman"/>
+      <w:noProof/>
+      <w:kern w:val="0"/>
+      <w:lang w:val="en-GB"/>
+      <w14:ligatures w14:val="none"/>
+    </w:rPr>
+  </w:style>
 </w:styles>
 </file>
 

</xml_diff>

<commit_message>
docs: change figure 3, add a b c d label and add sph cases for mass
</commit_message>
<xml_diff>
--- a/deliverables/nny124-final-report.docx
+++ b/deliverables/nny124-final-report.docx
@@ -4529,10 +4529,10 @@
       <w:r>
         <w:lastRenderedPageBreak/>
         <w:drawing>
-          <wp:inline distT="0" distB="0" distL="0" distR="0" wp14:anchorId="0F761EB7" wp14:editId="4955386A">
-            <wp:extent cx="5243332" cy="3592467"/>
-            <wp:effectExtent l="0" t="0" r="1905" b="1905"/>
-            <wp:docPr id="623214946" name="Picture 1"/>
+          <wp:inline distT="0" distB="0" distL="0" distR="0" wp14:anchorId="7EA8534E" wp14:editId="518664B9">
+            <wp:extent cx="5728938" cy="3891516"/>
+            <wp:effectExtent l="0" t="0" r="0" b="0"/>
+            <wp:docPr id="453900512" name="Picture 1"/>
             <wp:cNvGraphicFramePr>
               <a:graphicFrameLocks xmlns:a="http://schemas.openxmlformats.org/drawingml/2006/main" noChangeAspect="1"/>
             </wp:cNvGraphicFramePr>
@@ -4540,7 +4540,7 @@
               <a:graphicData uri="http://schemas.openxmlformats.org/drawingml/2006/picture">
                 <pic:pic xmlns:pic="http://schemas.openxmlformats.org/drawingml/2006/picture">
                   <pic:nvPicPr>
-                    <pic:cNvPr id="623214946" name=""/>
+                    <pic:cNvPr id="453900512" name=""/>
                     <pic:cNvPicPr/>
                   </pic:nvPicPr>
                   <pic:blipFill>
@@ -4552,7 +4552,7 @@
                   <pic:spPr>
                     <a:xfrm>
                       <a:off x="0" y="0"/>
-                      <a:ext cx="5254557" cy="3600158"/>
+                      <a:ext cx="5735514" cy="3895983"/>
                     </a:xfrm>
                     <a:prstGeom prst="rect">
                       <a:avLst/>
@@ -4628,36 +4628,95 @@
     </w:p>
     <w:p>
       <w:pPr>
-        <w:spacing w:before="240" w:after="240" w:line="276" w:lineRule="auto"/>
+        <w:spacing w:before="100" w:beforeAutospacing="1" w:after="100" w:afterAutospacing="1"/>
         <w:jc w:val="both"/>
-      </w:pPr>
-      <w:r>
-        <w:t>Figure 3 compares the tuned Gradient Boosting response with available SPH simulation results by changing one input at a time while holding the others constant. In the representative periapsis profile, predicted BMF generally decreases from roughly 0.27 at 1.2 Mars radii to approximately zero by about 2.5 Mars radii.</w:t>
-      </w:r>
-      <w:r>
-        <w:t xml:space="preserve"> The model remains slightly above the SPH results around 2.2-2.4 Mars radii because its prediction is influenced by patterns learned from the wider training data, not periapsis alone. By about 2.5 Mars radii, the input crosses tree thresholds associated mainly with zero-BMF training cases, so the prediction also falls to approximately zero.</w:t>
-      </w:r>
-      <w:r>
-        <w:t xml:space="preserve"> A similarly clear decline occurs as encounter velocity increases, from roughly 0.25 at low velocity to approximately zero by about 1.2 km/s.</w:t>
-      </w:r>
-    </w:p>
-    <w:p>
-      <w:pPr>
-        <w:spacing w:before="240" w:after="240" w:line="276" w:lineRule="auto"/>
+        <w:rPr>
+          <w:noProof w:val="0"/>
+          <w:lang w:val="en-US"/>
+        </w:rPr>
+      </w:pPr>
+      <w:r>
+        <w:rPr>
+          <w:noProof w:val="0"/>
+          <w:lang w:val="en-US"/>
+        </w:rPr>
+        <w:t>Figure 3 compares controlled profiles in which one scenario input is varied while the others are fixed to a representative, well-supported combination. The fixed conditions may differ between panels, so the profiles show conditional responses rather than directly comparable effect sizes.</w:t>
+      </w:r>
+    </w:p>
+    <w:p>
+      <w:pPr>
+        <w:spacing w:before="100" w:beforeAutospacing="1" w:after="100" w:afterAutospacing="1"/>
         <w:jc w:val="both"/>
-      </w:pPr>
-      <w:r>
-        <w:t>Support for the mass plot is far weaker. There are only roughly two asteroid-mass values with exact SPH scenarios in which every other selected condition is the same. There is insufficient matched data to construct a trustworthy mass trend because the available higher-mass SPH examples are likewise concentrated at low periapsis and low velocity. Therefore, rather of being viewed as a physical threshold, the sharp increase in the</w:t>
-      </w:r>
-      <w:r>
-        <w:t xml:space="preserve"> Gradient Boosting</w:t>
-      </w:r>
-      <w:r>
-        <w:t xml:space="preserve"> curve should be considered model dependent. For the z-axis scenario that is shown, the spin-period panel is almost flat, indicating that altering the spin period has minimal impact in this specific configuration. This demonstrates that an input that is significant throughout the whole dataset can only have a minor </w:t>
-      </w:r>
-      <w:r>
-        <w:lastRenderedPageBreak/>
-        <w:t>impact given a particular set of encounter conditions, which does not contradict the overall significance of spin in Section 3.4.</w:t>
+        <w:rPr>
+          <w:noProof w:val="0"/>
+          <w:lang w:val="en-US"/>
+        </w:rPr>
+      </w:pPr>
+      <w:r>
+        <w:rPr>
+          <w:noProof w:val="0"/>
+          <w:lang w:val="en-US"/>
+        </w:rPr>
+        <w:t>Predicted BMF decreases with increasing periapsis, reaching approximately zero by 2.5</w:t>
+      </w:r>
+      <w:r>
+        <w:rPr>
+          <w:noProof w:val="0"/>
+          <w:lang w:val="en-US"/>
+        </w:rPr>
+        <w:t>-</w:t>
+      </w:r>
+      <w:r>
+        <w:rPr>
+          <w:noProof w:val="0"/>
+          <w:lang w:val="en-US"/>
+        </w:rPr>
+        <w:t>2.6 Mars radii. Around 2.2</w:t>
+      </w:r>
+      <w:r>
+        <w:rPr>
+          <w:noProof w:val="0"/>
+          <w:lang w:val="en-US"/>
+        </w:rPr>
+        <w:t>-</w:t>
+      </w:r>
+      <w:r>
+        <w:rPr>
+          <w:noProof w:val="0"/>
+          <w:lang w:val="en-US"/>
+        </w:rPr>
+        <w:t>2.4 Mars radii, the model remains slightly above the available SPH results because it reflects patterns learned from the wider training data. BMF also decreases with encounter velocity, from about 0.18 at low velocity to near zero by 1.0</w:t>
+      </w:r>
+      <w:r>
+        <w:rPr>
+          <w:noProof w:val="0"/>
+          <w:lang w:val="en-US"/>
+        </w:rPr>
+        <w:t>-</w:t>
+      </w:r>
+      <w:r>
+        <w:rPr>
+          <w:noProof w:val="0"/>
+          <w:lang w:val="en-US"/>
+        </w:rPr>
+        <w:t>1.2 km/s.</w:t>
+      </w:r>
+    </w:p>
+    <w:p>
+      <w:pPr>
+        <w:spacing w:before="100" w:beforeAutospacing="1" w:after="100" w:afterAutospacing="1"/>
+        <w:jc w:val="both"/>
+        <w:rPr>
+          <w:noProof w:val="0"/>
+          <w:lang w:val="en-US"/>
+        </w:rPr>
+      </w:pPr>
+      <w:r>
+        <w:rPr>
+          <w:noProof w:val="0"/>
+          <w:lang w:val="en-US"/>
+        </w:rPr>
+        <w:t>For asteroid mass, seven matched physical scenarios show an overall increase in BMF with mass, although the Gradient Boosting response is stepwise and should not be interpreted as a physical threshold. Spin period has a smaller effect in the selected z-axis-spin scenario, showing that an input's influence depends on the other encounter conditions.</w:t>
       </w:r>
     </w:p>
     <w:p>
@@ -4679,6 +4738,7 @@
         <w:jc w:val="center"/>
       </w:pPr>
       <w:r>
+        <w:lastRenderedPageBreak/>
         <w:drawing>
           <wp:inline distT="0" distB="0" distL="114300" distR="114300" wp14:anchorId="3B7A9855" wp14:editId="62D9BA92">
             <wp:extent cx="5473700" cy="2044700"/>
@@ -4878,8 +4938,11 @@
         <w:jc w:val="both"/>
       </w:pPr>
       <w:r>
+        <w:t xml:space="preserve">The quantity of local SPH data and prediction error both influence trust. Instead of counting repeated FoF rows, the coverage-error maps count distinct physical simulations and compare that number to the average held-out absolute error in the same area. While sparse or fringe regions can have significantly worse error, regions with many simulations typically have lower error. Low </w:t>
+      </w:r>
+      <w:r>
         <w:lastRenderedPageBreak/>
-        <w:t>The quantity of local SPH data and prediction error both influence trust. Instead of counting repeated FoF rows, the coverage-error maps count distinct physical simulations and compare that number to the average held-out absolute error in the same area. While sparse or fringe regions can have significantly worse error, regions with many simulations typically have lower error. Low error is insufficient on its own; certain poorly sampled locations appear simple simply because the true BMF is typically zero.</w:t>
+        <w:t>error is insufficient on its own; certain poorly sampled locations appear simple simply because the true BMF is typically zero.</w:t>
       </w:r>
     </w:p>
     <w:p>
@@ -10341,10 +10404,10 @@
           <w:color w:val="000000" w:themeColor="text1"/>
         </w:rPr>
         <w:drawing>
-          <wp:inline distT="0" distB="0" distL="0" distR="0" wp14:anchorId="531B6B25" wp14:editId="603EE89F">
-            <wp:extent cx="5943600" cy="4029710"/>
-            <wp:effectExtent l="0" t="0" r="0" b="0"/>
-            <wp:docPr id="952965952" name="Picture 1"/>
+          <wp:inline distT="0" distB="0" distL="0" distR="0" wp14:anchorId="686F9AE1" wp14:editId="78FDA83C">
+            <wp:extent cx="5943600" cy="4037330"/>
+            <wp:effectExtent l="0" t="0" r="0" b="1270"/>
+            <wp:docPr id="440836601" name="Picture 1"/>
             <wp:cNvGraphicFramePr>
               <a:graphicFrameLocks xmlns:a="http://schemas.openxmlformats.org/drawingml/2006/main" noChangeAspect="1"/>
             </wp:cNvGraphicFramePr>
@@ -10352,7 +10415,7 @@
               <a:graphicData uri="http://schemas.openxmlformats.org/drawingml/2006/picture">
                 <pic:pic xmlns:pic="http://schemas.openxmlformats.org/drawingml/2006/picture">
                   <pic:nvPicPr>
-                    <pic:cNvPr id="952965952" name=""/>
+                    <pic:cNvPr id="440836601" name=""/>
                     <pic:cNvPicPr/>
                   </pic:nvPicPr>
                   <pic:blipFill>
@@ -10364,7 +10427,7 @@
                   <pic:spPr>
                     <a:xfrm>
                       <a:off x="0" y="0"/>
-                      <a:ext cx="5943600" cy="4029710"/>
+                      <a:ext cx="5943600" cy="4037330"/>
                     </a:xfrm>
                     <a:prstGeom prst="rect">
                       <a:avLst/>
@@ -12083,6 +12146,18 @@
       <w14:ligatures w14:val="none"/>
     </w:rPr>
   </w:style>
+  <w:style w:type="paragraph" w:customStyle="1" w:styleId="pdq2pgselectionanchorcontainer">
+    <w:name w:val="pdq2pg_selectionanchorcontainer"/>
+    <w:basedOn w:val="Normal"/>
+    <w:rsid w:val="002E418D"/>
+    <w:pPr>
+      <w:spacing w:before="100" w:beforeAutospacing="1" w:after="100" w:afterAutospacing="1"/>
+    </w:pPr>
+    <w:rPr>
+      <w:noProof w:val="0"/>
+      <w:lang w:val="en-US"/>
+    </w:rPr>
+  </w:style>
 </w:styles>
 </file>
 

</xml_diff>

<commit_message>
docs: simplify wording appendix
</commit_message>
<xml_diff>
--- a/deliverables/nny124-final-report.docx
+++ b/deliverables/nny124-final-report.docx
@@ -10510,7 +10510,22 @@
         </w:rPr>
       </w:pPr>
       <w:r>
-        <w:t xml:space="preserve">The shaded central regions indicate the ranges represented by the corresponding SPH slice. Outside these ranges, the tree-based model does not extrapolate a physical trend. Instead, it continues to use partitions learned from the training data, producing stepwise or constant predictions, as seen most clearly for periapsis, velocity, and spin. For mass, the prediction initially increases slightly beyond the observed range as the changing mass and associated derived features continue to cross learned tree thresholds, before eventually remaining within the same terminal partitions and settling onto a near-constant plateau. This does not occur for the other parameter sweeps because their out-of-range values enter terminal partitions more immediately, after which further changes no longer alter the prediction. These out-of-range predictions should therefore not be interpreted as physical trends. </w:t>
+        <w:t xml:space="preserve">The shaded central regions indicate the ranges represented by the corresponding SPH </w:t>
+      </w:r>
+      <w:r>
+        <w:t>results</w:t>
+      </w:r>
+      <w:r>
+        <w:t xml:space="preserve">. Outside these ranges, the tree-based model does not extrapolate a physical trend. Instead, it continues to use partitions learned from the training data, producing stepwise or constant predictions, as seen most clearly for periapsis, velocity, and spin. </w:t>
+      </w:r>
+      <w:r>
+        <w:t>For mass, the prediction keeps increasing slightly beyond the observed range because the higher mass values still cross different learned tree thresholds. Farther outside the range, the values fall into the same tree regions, so the prediction becomes nearly constant.</w:t>
+      </w:r>
+      <w:r>
+        <w:t xml:space="preserve"> </w:t>
+      </w:r>
+      <w:r>
+        <w:t xml:space="preserve">This does not occur for the other parameter sweeps because their out-of-range values enter terminal partitions more immediately, after which further changes no longer alter the prediction. These out-of-range predictions should therefore not be interpreted as physical trends. </w:t>
       </w:r>
     </w:p>
     <w:p>

</xml_diff>

<commit_message>
docs: update revised wording simulation to scenario inputs
</commit_message>
<xml_diff>
--- a/deliverables/nny124-final-report.docx
+++ b/deliverables/nny124-final-report.docx
@@ -2916,7 +2916,7 @@
           <w:sz w:val="20"/>
           <w:szCs w:val="20"/>
         </w:rPr>
-        <w:t>One theory for the formation of Mars's moons, Phobos and Deimos, is that close collisions between asteroids and Mars can tidally damage the asteroid and leave some debris bonded to the planet. This process is thoroughly modelled by smoothed-particle hydrodynamics (SPH), but testing every possible combination of inputs is computationally costly. In this study, bound mass fraction (BMF) is predicted from the simulation inputs using machine learning models after SPH outputs are converted into fragmentation measurements.</w:t>
+        <w:t>One theory for the formation of Mars's moons, Phobos and Deimos, is that close collisions between asteroids and Mars can tidally damage the asteroid and leave some debris bonded to the planet. This process is thoroughly modelled by smoothed-particle hydrodynamics (SPH), but testing every possible combination of inputs is computationally costly. In this study, bound mass fraction (BMF) is predicted from the</w:t>
       </w:r>
       <w:r>
         <w:rPr>
@@ -2925,7 +2925,7 @@
           <w:sz w:val="20"/>
           <w:szCs w:val="20"/>
         </w:rPr>
-        <w:t xml:space="preserve"> </w:t>
+        <w:t xml:space="preserve"> scneario</w:t>
       </w:r>
       <w:r>
         <w:rPr>
@@ -2934,7 +2934,43 @@
           <w:sz w:val="20"/>
           <w:szCs w:val="20"/>
         </w:rPr>
-        <w:t xml:space="preserve">The primary model, a tuned Gradient Boosting regressor using the original simulation inputs, achieves a grouped cross-validated R² of 0.9234, MAE of 0.0159, and RMSE of 0.0257. </w:t>
+        <w:t xml:space="preserve"> inputs using machine learning models after SPH outputs are converted into fragmentation measurements.</w:t>
+      </w:r>
+      <w:r>
+        <w:rPr>
+          <w:i/>
+          <w:iCs/>
+          <w:sz w:val="20"/>
+          <w:szCs w:val="20"/>
+        </w:rPr>
+        <w:t xml:space="preserve"> </w:t>
+      </w:r>
+      <w:r>
+        <w:rPr>
+          <w:i/>
+          <w:iCs/>
+          <w:sz w:val="20"/>
+          <w:szCs w:val="20"/>
+        </w:rPr>
+        <w:t xml:space="preserve">The primary model, a tuned Gradient Boosting regressor using the original </w:t>
+      </w:r>
+      <w:r>
+        <w:rPr>
+          <w:i/>
+          <w:iCs/>
+          <w:sz w:val="20"/>
+          <w:szCs w:val="20"/>
+        </w:rPr>
+        <w:t>scenario</w:t>
+      </w:r>
+      <w:r>
+        <w:rPr>
+          <w:i/>
+          <w:iCs/>
+          <w:sz w:val="20"/>
+          <w:szCs w:val="20"/>
+        </w:rPr>
+        <w:t xml:space="preserve"> inputs, achieves a grouped cross-validated R² of 0.9234, MAE of 0.0159, and RMSE of 0.0257. </w:t>
       </w:r>
       <w:r>
         <w:rPr>
@@ -3031,7 +3067,13 @@
         <w:jc w:val="both"/>
       </w:pPr>
       <w:r>
-        <w:t>Smoothed-particle hydrodynamics (SPH) works well in this case because its particles move with the material as it deforms, fragments, and interacts gravitationally. However, simulating each new arrangement is computationally expensive. It is simply not practical to test every possible combination of asteroid mass, closest approach, encounter speed, spin, and numerical parameters. Using the present simulation archive, this study creates a machine learning (ML) surrogate to filter probable scenarios and identify whether new SPH simulations are necessary.</w:t>
+        <w:t xml:space="preserve">Smoothed-particle hydrodynamics (SPH) works well in this case because its particles move with the material as it deforms, fragments, and interacts gravitationally. However, simulating each new arrangement is computationally expensive. It is simply not practical to test every possible combination of asteroid mass, closest approach, encounter speed, spin, and numerical </w:t>
+      </w:r>
+      <w:r>
+        <w:t>simulation  settings</w:t>
+      </w:r>
+      <w:r>
+        <w:t>. Using the present simulation archive, this study creates a machine learning (ML) surrogate to filter probable scenarios and identify whether new SPH simulations are necessary.</w:t>
       </w:r>
     </w:p>
     <w:p>
@@ -3228,7 +3270,13 @@
         <w:t>totalling</w:t>
       </w:r>
       <w:r>
-        <w:t xml:space="preserve"> over 218 GB of HDF5 particle data are included in the collection. These particle outputs are transformed into fragment and bound-mass measurements through post-processing. The asteroid and input parameter values are provided by the simulation setup and bound-mass findings are computed after post-processing breaks up the particle data. </w:t>
+        <w:t xml:space="preserve"> over 218 GB of HDF5 particle data are included in the collection. These particle outputs are transformed into fragment and bound-mass measurements through post-processing. </w:t>
+      </w:r>
+      <w:r>
+        <w:t>The physical scenario inputs and numerical simulation settings are provided by the SPH setup, while bound-mass measurements are calculated during post-processing</w:t>
+      </w:r>
+      <w:r>
+        <w:t xml:space="preserve">. </w:t>
       </w:r>
       <w:r>
         <w:t>The main outcome</w:t>
@@ -3925,7 +3973,13 @@
         <w:t>several</w:t>
       </w:r>
       <w:r>
-        <w:t xml:space="preserve"> baseline models were used. While this project primarily focuses on tree-based models, Logistic Regression is also used for the BMF ≥ 10% classification task because it offers a straightforward baseline for testing whether lower- and higher-retention cases can already be separated using a relatively simple combination of the inputs (Knauer et al., 2024). Because Random Forest can capture nonlinear correlations and interactions between the simulation parameters while averaging numerous trees to lessen susceptibility to specific cases, it is tried for continuous BMF prediction (Breiman, 2001; Cambioni et al., 2019). Additionally, Gradient Boosting is evaluated since it constructs trees in a sequential manner, with each subsequent tree fixing mistakes produced by the ones before it. This could assist capture more precise changes between various encounter settings (Friedman, 2001; Valencia et al., 2019; Timpe et al., 2020).</w:t>
+        <w:t xml:space="preserve"> baseline models were used. While this project primarily focuses on tree-based models, Logistic Regression is also used for the BMF ≥ 10% classification task because it offers a straightforward baseline for testing whether lower- and higher-retention cases can already be separated using a relatively simple combination of the inputs (Knauer et al., 2024). Because Random Forest can capture nonlinear correlations and interactions between </w:t>
+      </w:r>
+      <w:r>
+        <w:t xml:space="preserve">scenario inputs </w:t>
+      </w:r>
+      <w:r>
+        <w:t>while averaging numerous trees to lessen susceptibility to specific cases, it is tried for continuous BMF prediction (Breiman, 2001; Cambioni et al., 2019). Additionally, Gradient Boosting is evaluated since it constructs trees in a sequential manner, with each subsequent tree fixing mistakes produced by the ones before it. This could assist capture more precise changes between various encounter settings (Friedman, 2001; Valencia et al., 2019; Timpe et al., 2020).</w:t>
       </w:r>
     </w:p>
     <w:p>
@@ -3934,7 +3988,13 @@
         <w:jc w:val="both"/>
       </w:pPr>
       <w:r>
-        <w:t>To determine whether prediction performance could be improved beyond the baseline models, Gradient Boosting hyperparameters were tuned and physics-derived attributes calculated from the original simulation inputs were tested as a separate feature-engineering experiment. The tuned Gradient Boosting model using the original inputs was retained as the primary model because the derived features produced no meaningful additional gain (Appendix A</w:t>
+        <w:t>To determine whether prediction performance could be improved beyond the baseline models, Gradient Boosting hyperparameters were tuned and physics-derived attributes calculated from the original s</w:t>
+      </w:r>
+      <w:r>
+        <w:t xml:space="preserve">cenario </w:t>
+      </w:r>
+      <w:r>
+        <w:t>inputs were tested as a separate feature-engineering experiment. The tuned Gradient Boosting model using the original inputs was retained as the primary model because the derived features produced no meaningful additional gain (Appendix A</w:t>
       </w:r>
       <w:r>
         <w:t>, Tables A1-A2</w:t>
@@ -4116,11 +4176,10 @@
         <w:rPr>
           <w:lang w:val="en-US"/>
         </w:rPr>
-        <w:lastRenderedPageBreak/>
         <w:drawing>
-          <wp:inline distT="0" distB="0" distL="0" distR="0" wp14:anchorId="3D017574" wp14:editId="27FC7490">
-            <wp:extent cx="5332223" cy="3966693"/>
-            <wp:effectExtent l="0" t="0" r="1905" b="0"/>
+          <wp:inline distT="0" distB="0" distL="0" distR="0" wp14:anchorId="3D017574" wp14:editId="47E936BA">
+            <wp:extent cx="4373599" cy="3253562"/>
+            <wp:effectExtent l="0" t="0" r="0" b="0"/>
             <wp:docPr id="589236429" name="Picture 1"/>
             <wp:cNvGraphicFramePr>
               <a:graphicFrameLocks xmlns:a="http://schemas.openxmlformats.org/drawingml/2006/main" noChangeAspect="1"/>
@@ -4141,7 +4200,7 @@
                   <pic:spPr>
                     <a:xfrm>
                       <a:off x="0" y="0"/>
-                      <a:ext cx="5517283" cy="4104361"/>
+                      <a:ext cx="4555725" cy="3389047"/>
                     </a:xfrm>
                     <a:prstGeom prst="rect">
                       <a:avLst/>
@@ -4250,6 +4309,7 @@
         <w:jc w:val="both"/>
       </w:pPr>
       <w:r>
+        <w:lastRenderedPageBreak/>
         <w:t xml:space="preserve">Although close interactions do not always result in strong fragmentation or high BMF, Figure 1 illustrates that both fragmentation and bound retention typically decrease as periapsis increases. The mean BMF rises with tiny periapsis and falls with increasing encounter speed. The relative impacts also vary throughout the sampling range: separation between spin states becomes more apparent around 1.7-2.0 Mars radii, whereas velocity differences are more noticeable at roughly 1.1-1.6 Mars radii. The region is too rarely sampled to draw firm conclusions, but one prograde-spin case maintains roughly 3-4% BMF at 2.6 Mars radii whereas the other sampled cases are close to zero. </w:t>
       </w:r>
     </w:p>
@@ -4286,11 +4346,7 @@
         <w:t xml:space="preserve"> </w:t>
       </w:r>
       <w:r>
-        <w:t xml:space="preserve">kg cases are mostly in a low-retention regime. However, because the two mass groups do not contain the same combinations of velocity, spin, and periapsis, this should not be interpreted as a direct causal mass effect. Overall, the results </w:t>
-      </w:r>
-      <w:r>
-        <w:lastRenderedPageBreak/>
-        <w:t>show regime-dependent behaviour, where distinct bound-mass outcomes result from varying relative effects of parameters across the parameter space rather than a single parameter acting independently.</w:t>
+        <w:t>kg cases are mostly in a low-retention regime. However, because the two mass groups do not contain the same combinations of velocity, spin, and periapsis, this should not be interpreted as a direct causal mass effect. Overall, the results show regime-dependent behaviour, where distinct bound-mass outcomes result from varying relative effects of parameters across the parameter space rather than a single parameter acting independently.</w:t>
       </w:r>
     </w:p>
     <w:p>
@@ -4320,7 +4376,13 @@
         <w:jc w:val="both"/>
       </w:pPr>
       <w:r>
-        <w:t>The outcome demonstrates that retention is concentrated close to the parabolic limit, where the eccentricity proxy is almost equal to 1. Any non-zero BMF extends to around 1.127, although strong retention (BMF &gt; 0.10) only manifests up to a proxy of roughly 1.057. As the encounter gets more hyperbolic, the points compress toward BMF = 0, as Figure 2 clearly illustrates. Faster, more hyperbolic fly-bys leave less material bound to Mars because they spend less time in capture-friendly conditions.</w:t>
+        <w:t>The outcome demonstrates that retention is concentrated close to the parabolic limit, where the eccentricity</w:t>
+      </w:r>
+      <w:r>
+        <w:t xml:space="preserve"> </w:t>
+      </w:r>
+      <w:r>
+        <w:t>is almost equal to 1. Any non-zero BMF extends to around 1.127, although strong retention (BMF &gt; 0.10) only manifests up to a proxy of roughly 1.057. As the encounter gets more hyperbolic, the points compress toward BMF = 0, as Figure 2 clearly illustrates. Faster, more hyperbolic fly-bys leave less material bound to Mars because they spend less time in capture-friendly conditions.</w:t>
       </w:r>
     </w:p>
     <w:p>
@@ -4330,6 +4392,7 @@
         <w:jc w:val="center"/>
       </w:pPr>
       <w:r>
+        <w:lastRenderedPageBreak/>
         <w:drawing>
           <wp:inline distT="0" distB="0" distL="114300" distR="114300" wp14:anchorId="485CF5A0" wp14:editId="2C25327C">
             <wp:extent cx="3529965" cy="2222500"/>
@@ -4397,7 +4460,7 @@
         <w:t xml:space="preserve">. </w:t>
       </w:r>
       <w:r>
-        <w:t>Bound mass fraction versus encounter eccentricity proxy.</w:t>
+        <w:t>Bound mass fraction versus encounter eccentricity.</w:t>
       </w:r>
       <w:r>
         <w:br/>
@@ -4434,7 +4497,6 @@
         <w:jc w:val="both"/>
       </w:pPr>
       <w:r>
-        <w:lastRenderedPageBreak/>
         <w:t>For the BMF</w:t>
       </w:r>
       <w:r>
@@ -4456,7 +4518,13 @@
         <w:jc w:val="both"/>
       </w:pPr>
       <w:r>
-        <w:t xml:space="preserve">Tuning Gradient Boosting improves performance from R² = 0.9142, MAE = 0.0175, and RMSE = 0.0272 to R² = 0.9234, MAE = 0.0159, and RMSE = 0.0257 (Appendix A, Tables A1-A2). Adding the tested physics-derived features produces only a small further change to R² = 0.9240, MAE = 0.0155, and RMSE = 0.0257. This additional gain is not meaningful, so the tuned Gradient Boosting model using the original simulation inputs is selected as the primary model. </w:t>
+        <w:t xml:space="preserve">Tuning Gradient Boosting improves performance from R² = 0.9142, MAE = 0.0175, and RMSE = 0.0272 to R² = 0.9234, MAE = 0.0159, and RMSE = 0.0257 (Appendix A, Tables A1-A2). Adding the tested physics-derived features produces only a small further change to R² = 0.9240, MAE = 0.0155, and RMSE = 0.0257. This additional gain is not meaningful, so the tuned Gradient Boosting model using the original </w:t>
+      </w:r>
+      <w:r>
+        <w:t>scenario</w:t>
+      </w:r>
+      <w:r>
+        <w:t xml:space="preserve"> inputs is selected as the primary model. </w:t>
       </w:r>
     </w:p>
     <w:p>
@@ -4496,6 +4564,7 @@
         <w:jc w:val="both"/>
       </w:pPr>
       <w:r>
+        <w:lastRenderedPageBreak/>
         <w:t>A different response is required for fragmentation. The most extreme fragmentation in the SPH data requires very small periapsis, yet a close encounter does not ensure significant breakdown. FoF connecting length has a direct impact on fragment count as well. This analysis does not provide a single, straightforward global ranking for fragmentation because of this. While the actual fragment pattern depends on the entire encounter and how fragments are gathered during post-processing, periapsis indicates where the largest disruption may occur.</w:t>
       </w:r>
     </w:p>
@@ -4527,7 +4596,6 @@
         <w:jc w:val="center"/>
       </w:pPr>
       <w:r>
-        <w:lastRenderedPageBreak/>
         <w:drawing>
           <wp:inline distT="0" distB="0" distL="0" distR="0" wp14:anchorId="7EA8534E" wp14:editId="518664B9">
             <wp:extent cx="5728938" cy="3891516"/>
@@ -4657,6 +4725,7 @@
           <w:noProof w:val="0"/>
           <w:lang w:val="en-US"/>
         </w:rPr>
+        <w:lastRenderedPageBreak/>
         <w:t>Predicted BMF decreases with increasing periapsis, reaching approximately zero by 2.5</w:t>
       </w:r>
       <w:r>
@@ -4738,7 +4807,6 @@
         <w:jc w:val="center"/>
       </w:pPr>
       <w:r>
-        <w:lastRenderedPageBreak/>
         <w:drawing>
           <wp:inline distT="0" distB="0" distL="114300" distR="114300" wp14:anchorId="3B7A9855" wp14:editId="62D9BA92">
             <wp:extent cx="5473700" cy="2044700"/>
@@ -4908,7 +4976,11 @@
         <w:t>∞</w:t>
       </w:r>
       <w:r>
-        <w:t>=0, while various other velocity groups reach approximately 0.14-0.22 between 1.6 and 2.0 Mars-radii. The pattern of velocity is distinct. The velocity-related BMF range for the no-spin instances is approximately 0.18 at 1.2-1.4 Mars radii, decreases to approximately 0.14 at 1.6 Mars radii, and reaches zero by 1.8 Mars radii. On the other hand, velocity-related ranges of roughly 0.15-0.19 between 1.6 and 2.0 Mars-radii are still seen in the sampled prograde z-spin situations.</w:t>
+        <w:t xml:space="preserve">=0, while various other velocity groups reach approximately 0.14-0.22 between 1.6 and 2.0 Mars-radii. The pattern of velocity is distinct. The velocity-related BMF range for the no-spin instances is approximately 0.18 at 1.2-1.4 Mars radii, decreases to approximately 0.14 at 1.6 Mars </w:t>
+      </w:r>
+      <w:r>
+        <w:lastRenderedPageBreak/>
+        <w:t>radii, and reaches zero by 1.8 Mars radii. On the other hand, velocity-related ranges of roughly 0.15-0.19 between 1.6 and 2.0 Mars-radii are still seen in the sampled prograde z-spin situations.</w:t>
       </w:r>
     </w:p>
     <w:p>
@@ -4938,11 +5010,7 @@
         <w:jc w:val="both"/>
       </w:pPr>
       <w:r>
-        <w:t xml:space="preserve">The quantity of local SPH data and prediction error both influence trust. Instead of counting repeated FoF rows, the coverage-error maps count distinct physical simulations and compare that number to the average held-out absolute error in the same area. While sparse or fringe regions can have significantly worse error, regions with many simulations typically have lower error. Low </w:t>
-      </w:r>
-      <w:r>
-        <w:lastRenderedPageBreak/>
-        <w:t>error is insufficient on its own; certain poorly sampled locations appear simple simply because the true BMF is typically zero.</w:t>
+        <w:t>The quantity of local SPH data and prediction error both influence trust. Instead of counting repeated FoF rows, the coverage-error maps count distinct physical simulations and compare that number to the average held-out absolute error in the same area. While sparse or fringe regions can have significantly worse error, regions with many simulations typically have lower error. Low error is insufficient on its own; certain poorly sampled locations appear simple simply because the true BMF is typically zero.</w:t>
       </w:r>
     </w:p>
     <w:p>
@@ -5812,7 +5880,13 @@
         <w:t xml:space="preserve">? </w:t>
       </w:r>
       <w:r>
-        <w:t>Yes, in cases where the SPH archive supports comparable input combinations. The primary tuned Gradient Boosting model using the original simulation inputs obtains a grouped cross-validated R² of 0.9234, MAE of 0.0159, and RMSE of 0.0257. Adding physics-derived features produces only a small further change to R² = 0.9240 and MAE = 0.0155, with RMSE unchanged at 0.0257, so the simpler tuned model is retained. Performance is not equally dependable everywhere, however. Despite the input values falling within the numerical training ranges, held-out errors increase to roughly 0.08 BMF, or 8 percentage points, in the sparsely sampled 10</w:t>
+        <w:t xml:space="preserve">Yes, in cases where the SPH archive supports comparable input combinations. The primary tuned Gradient Boosting model using the original </w:t>
+      </w:r>
+      <w:r>
+        <w:t>scenario</w:t>
+      </w:r>
+      <w:r>
+        <w:t xml:space="preserve"> inputs obtains a grouped cross-validated R² of 0.9234, MAE of 0.0159, and RMSE of 0.0257. Adding physics-derived features produces only a small further change to R² = 0.9240 and MAE = 0.0155, with RMSE unchanged at 0.0257, so the simpler tuned model is retained. Performance is not equally dependable everywhere, however. Despite the input values falling within the numerical training ranges, held-out errors increase to roughly 0.08 BMF, or 8 percentage points, in the sparsely sampled 10</w:t>
       </w:r>
       <w:r>
         <w:rPr>
@@ -10498,16 +10572,6 @@
       <w:pPr>
         <w:spacing w:after="160" w:line="278" w:lineRule="auto"/>
         <w:jc w:val="both"/>
-        <w:rPr>
-          <w:rFonts w:eastAsiaTheme="majorEastAsia"/>
-          <w:b/>
-          <w:bCs/>
-          <w:color w:val="000000" w:themeColor="text1"/>
-          <w:kern w:val="2"/>
-          <w:sz w:val="28"/>
-          <w:szCs w:val="28"/>
-          <w14:ligatures w14:val="standardContextual"/>
-        </w:rPr>
       </w:pPr>
       <w:r>
         <w:t xml:space="preserve">The shaded central regions indicate the ranges represented by the corresponding SPH </w:t>
@@ -10524,15 +10588,16 @@
       <w:r>
         <w:t xml:space="preserve"> </w:t>
       </w:r>
-      <w:r>
-        <w:t xml:space="preserve">This does not occur for the other parameter sweeps because their out-of-range values enter terminal partitions more immediately, after which further changes no longer alter the prediction. These out-of-range predictions should therefore not be interpreted as physical trends. </w:t>
-      </w:r>
-    </w:p>
-    <w:p>
-      <w:pPr>
-        <w:pStyle w:val="Heading1"/>
-      </w:pPr>
       <w:bookmarkStart w:id="63" w:name="_Toc238149755"/>
+      <w:r>
+        <w:t>This happens sooner for the other parameter sweeps, where out-of-range values quickly enter the same terminal tree regions and further changes no longer affect the prediction. These out-of-range predictions should therefore not be interpreted as physical trends.</w:t>
+      </w:r>
+    </w:p>
+    <w:p>
+      <w:pPr>
+        <w:spacing w:after="160" w:line="278" w:lineRule="auto"/>
+        <w:jc w:val="both"/>
+      </w:pPr>
     </w:p>
     <w:p>
       <w:pPr>

</xml_diff>

<commit_message>
docs: update akward phrases as suggested by supervisor
</commit_message>
<xml_diff>
--- a/deliverables/nny124-final-report.docx
+++ b/deliverables/nny124-final-report.docx
@@ -4331,7 +4331,16 @@
         <w:t>20</w:t>
       </w:r>
       <w:r>
-        <w:t xml:space="preserve"> kg cases are much more heavily represented (n=271) than the 1019 kg cases (n=81), and they span substantially higher BMF and remain non-zero over a wider periapsis range. Th</w:t>
+        <w:t xml:space="preserve"> kg cases are much more heavily represented (n=271) than the 10</w:t>
+      </w:r>
+      <w:r>
+        <w:rPr>
+          <w:vertAlign w:val="superscript"/>
+        </w:rPr>
+        <w:t xml:space="preserve">19 </w:t>
+      </w:r>
+      <w:r>
+        <w:t>kg cases (n=81), and they span substantially higher BMF and remain non-zero over a wider periapsis range. Th</w:t>
       </w:r>
       <w:r>
         <w:t>e 10</w:t>
@@ -4900,15 +4909,19 @@
           <w:sz w:val="20"/>
           <w:szCs w:val="20"/>
         </w:rPr>
-        <w:t>. BMF differences within the matched A</w:t>
-      </w:r>
-      <w:r>
-        <w:rPr>
-          <w:sz w:val="20"/>
-          <w:szCs w:val="20"/>
-          <w:vertAlign w:val="subscript"/>
-        </w:rPr>
-        <w:t>2000</w:t>
+        <w:t xml:space="preserve">. BMF differences within the matched </w:t>
+      </w:r>
+      <w:r>
+        <w:t>1</w:t>
+      </w:r>
+      <w:r>
+        <w:t>0</w:t>
+      </w:r>
+      <w:r>
+        <w:rPr>
+          <w:vertAlign w:val="superscript"/>
+        </w:rPr>
+        <w:t>20</w:t>
       </w:r>
       <w:r>
         <w:rPr>
@@ -5662,7 +5675,13 @@
         <w:jc w:val="both"/>
       </w:pPr>
       <w:r>
-        <w:t>As a result, the prototype provides the breakup class, estimated Mars-bound mass, expected BMF, data coverage, and a recommendation about the use of SPH. While sparse, edge, transition, or doubtful instances should be examined with SPH, well-supported cases can be swiftly evaluated with ML.</w:t>
+        <w:t>The resulting screening workflow provides the breakup class, estimated Mars-bound mass, expected BMF, data coverage, and a recommendation about whether another SPH simulation is required.</w:t>
+      </w:r>
+      <w:r>
+        <w:t xml:space="preserve"> </w:t>
+      </w:r>
+      <w:r>
+        <w:t>While sparse, edge, transition, or doubtful instances should be examined with SPH, well-supported cases can be swiftly evaluated with ML.</w:t>
       </w:r>
     </w:p>
     <w:p>
@@ -5974,25 +5993,13 @@
         <w:jc w:val="both"/>
       </w:pPr>
       <w:r>
-        <w:t>The highest priority for future work is to run new SPH simulations in poorly covered mass-periapsis-velocity-spin combinations, especially near the change between retained and zero BMF. More matched groups should repeat the A</w:t>
-      </w:r>
-      <w:r>
-        <w:rPr>
-          <w:vertAlign w:val="subscript"/>
-        </w:rPr>
-        <w:t>2000</w:t>
-      </w:r>
-      <w:r>
-        <w:t>, n</w:t>
-      </w:r>
-      <w:r>
-        <w:rPr>
-          <w:vertAlign w:val="subscript"/>
-        </w:rPr>
-        <w:t>65</w:t>
-      </w:r>
-      <w:r>
-        <w:t xml:space="preserve"> comparison at other masses and resolutions while keeping processing choices fixed. </w:t>
+        <w:t xml:space="preserve">The highest priority for future work is to run new SPH simulations in poorly covered mass-periapsis-velocity-spin combinations, especially near the change between retained and zero BMF. More matched groups should </w:t>
+      </w:r>
+      <w:r>
+        <w:t xml:space="preserve">repeat </w:t>
+      </w:r>
+      <w:r>
+        <w:t xml:space="preserve">comparison at other masses and resolutions while keeping processing choices fixed. </w:t>
       </w:r>
       <w:r>
         <w:t>It would be possible to determine whether the stronger spin disparities also occur in other groups by reporting the BMF range together with the actual BMF values and the number of independent simulations. It would be more robust to test the model on whole new SPH runs created after training rather than repeatedly dividing the current library.</w:t>
@@ -6004,7 +6011,13 @@
         <w:jc w:val="both"/>
       </w:pPr>
       <w:r>
-        <w:t>Future research should enhance automatic identification of input combinations with inadequate support and per-prediction reliability estimates. Before updating the current model, new SPH simulations should be used to test exploratory XGBoost and hurdle models. Stronger physical limitations, multi-output prediction, and uncertainty estimates are possible additional enhancements.</w:t>
+        <w:t xml:space="preserve">Future research should enhance automatic identification of input combinations with inadequate support and per-prediction reliability estimates. Before updating the current model, new SPH simulations should be used to test exploratory </w:t>
+      </w:r>
+      <w:r>
+        <w:t>models</w:t>
+      </w:r>
+      <w:r>
+        <w:t>. Stronger physical limitations, multi-output prediction, and uncertainty estimates are possible additional enhancements.</w:t>
       </w:r>
       <w:bookmarkStart w:id="59" w:name="_Toc238149753"/>
     </w:p>
@@ -6128,7 +6141,6 @@
         <w:rPr>
           <w:color w:val="000000" w:themeColor="text1"/>
         </w:rPr>
-        <w:lastRenderedPageBreak/>
         <w:t>Duan, T., Anand, A., Ding, D. Y., Thai, K. K., Basu, S., Ng, A. &amp; Schuler, A. (2020). NGBoost: Natural Gradient Boosting for Probabilistic Prediction. Proceedings of the 37th International Conference on Machine Learning, PMLR 119, 2690-2700.</w:t>
       </w:r>
     </w:p>
@@ -6145,6 +6157,7 @@
         <w:rPr>
           <w:color w:val="000000" w:themeColor="text1"/>
         </w:rPr>
+        <w:lastRenderedPageBreak/>
         <w:t>Friedman, J. H. (2001). Greedy function approximation: A gradient boosting machine. Annals of Statistics, 29(5), 1189-1232. doi:10.1214/aos/1013203451.</w:t>
       </w:r>
     </w:p>
@@ -11602,7 +11615,6 @@
   <w:style w:type="character" w:default="1" w:styleId="DefaultParagraphFont">
     <w:name w:val="Default Paragraph Font"/>
     <w:uiPriority w:val="1"/>
-    <w:semiHidden/>
     <w:unhideWhenUsed/>
   </w:style>
   <w:style w:type="table" w:default="1" w:styleId="TableNormal">

</xml_diff>

<commit_message>
docs: more revision on wording, acronym, grammar
</commit_message>
<xml_diff>
--- a/deliverables/nny124-final-report.docx
+++ b/deliverables/nny124-final-report.docx
@@ -2925,7 +2925,25 @@
           <w:sz w:val="20"/>
           <w:szCs w:val="20"/>
         </w:rPr>
-        <w:t xml:space="preserve"> scneario</w:t>
+        <w:t xml:space="preserve"> sce</w:t>
+      </w:r>
+      <w:r>
+        <w:rPr>
+          <w:i/>
+          <w:iCs/>
+          <w:sz w:val="20"/>
+          <w:szCs w:val="20"/>
+        </w:rPr>
+        <w:t>n</w:t>
+      </w:r>
+      <w:r>
+        <w:rPr>
+          <w:i/>
+          <w:iCs/>
+          <w:sz w:val="20"/>
+          <w:szCs w:val="20"/>
+        </w:rPr>
+        <w:t>ario</w:t>
       </w:r>
       <w:r>
         <w:rPr>
@@ -3058,7 +3076,13 @@
         <w:jc w:val="both"/>
       </w:pPr>
       <w:r>
-        <w:t>The origin of Phobos and Deimos, the moons of Mars, is still a mystery. A close asteroid contact with Mars is one suggested route. The asteroid may be stretched or broken apart by variations in Martian gravity. While some debris might escape, others might stay gravitationally attached to Mars. Later orbital evolution and accretion into moons may benefit from this retained material (Kegerreis et al., 2024).</w:t>
+        <w:t xml:space="preserve">The origin of Phobos and Deimos, the moons of Mars, is still a mystery. A close asteroid contact with Mars is one suggested route. </w:t>
+      </w:r>
+      <w:r>
+        <w:t>During a sufficiently close encounter, differences in Mars's gravitational pull across the asteroid can produce strong tidal forces that deform or disrupt it</w:t>
+      </w:r>
+      <w:r>
+        <w:t>. While some debris might escape, others might stay gravitationally attached to Mars. Later orbital evolution and accretion into moons may benefit from this retained material (Kegerreis et al., 2024).</w:t>
       </w:r>
     </w:p>
     <w:p>
@@ -3067,13 +3091,31 @@
         <w:jc w:val="both"/>
       </w:pPr>
       <w:r>
-        <w:t xml:space="preserve">Smoothed-particle hydrodynamics (SPH) works well in this case because its particles move with the material as it deforms, fragments, and interacts gravitationally. However, simulating each new arrangement is computationally expensive. It is simply not practical to test every possible combination of asteroid mass, closest approach, encounter speed, spin, and numerical </w:t>
+        <w:t xml:space="preserve">Smoothed-particle hydrodynamics (SPH) works well in this case because its particles move with the material as </w:t>
+      </w:r>
+      <w:r>
+        <w:t>the material</w:t>
+      </w:r>
+      <w:r>
+        <w:t xml:space="preserve"> deforms, fragments, and interacts gra</w:t>
+      </w:r>
+      <w:r>
+        <w:t>t</w:t>
+      </w:r>
+      <w:r>
+        <w:t xml:space="preserve">vitationally. However, simulating each new arrangement is computationally expensive. It is simply not practical to test every possible combination of asteroid mass, closest approach, encounter speed, spin, and numerical </w:t>
       </w:r>
       <w:r>
         <w:t>simulation  settings</w:t>
       </w:r>
       <w:r>
-        <w:t>. Using the present simulation archive, this study creates a machine learning (ML) surrogate to filter probable scenarios and identify whether new SPH simulations are necessary.</w:t>
+        <w:t xml:space="preserve">. Using the present simulation archive, this study creates </w:t>
+      </w:r>
+      <w:r>
+        <w:t>ML</w:t>
+      </w:r>
+      <w:r>
+        <w:t xml:space="preserve"> surrogate to filter probable scenarios and identify whether new SPH simulations are necessary.</w:t>
       </w:r>
     </w:p>
     <w:p>
@@ -3160,7 +3202,13 @@
         <w:jc w:val="both"/>
       </w:pPr>
       <w:r>
-        <w:t>The primary contribution is the integration of physical interpretation with unambiguous testing for the reliability of an ML prediction. Each simulation's particle-level SPH outputs are combined into a single set of results by the workflow, which also tests the model on physical simulations that weren't used for training, compares matched and controlled cases, calculates the amount of similar SPH data that is present nearby, and uses these checks to suggest whether a new SPH run is necessary.</w:t>
+        <w:t>The primary contribution of this project is a workflow that combines physical interpretation with explicit tests of ML prediction reliability.</w:t>
+      </w:r>
+      <w:r>
+        <w:t xml:space="preserve"> </w:t>
+      </w:r>
+      <w:r>
+        <w:t>Each simulation's particle-level SPH outputs are combined into a single set of results by the workflow, which also tests the model on physical simulations that weren't used for training, compares matched and controlled cases, calculates the amount of similar SPH data that is present nearby, and uses these checks to suggest whether a new SPH run is necessary.</w:t>
       </w:r>
     </w:p>
     <w:p>
@@ -3190,7 +3238,13 @@
         <w:t>,</w:t>
       </w:r>
       <w:r>
-        <w:t xml:space="preserve"> have been explained in </w:t>
+        <w:t xml:space="preserve"> ha</w:t>
+      </w:r>
+      <w:r>
+        <w:t>s</w:t>
+      </w:r>
+      <w:r>
+        <w:t xml:space="preserve"> been explained in </w:t>
       </w:r>
       <w:r>
         <w:t>several</w:t>
@@ -3227,7 +3281,13 @@
       </w:pPr>
       <w:r>
         <w:lastRenderedPageBreak/>
-        <w:t>The particle-level SPH outputs are transformed into scalar outcomes through post-processing, creating a compact tabular dataset appropriate for machine learning. Because tree-based models perform well with tiny, nonlinear tabular datasets, this makes the problem a good fit for machine learning (ML) (Grinsztajn et al., 2022). In the past, outcomes from comparable SPH collision and giant-impact simulations have also been predicted using tree-based ML surrogate models (Cambioni et al., 2019; Timpe et al., 2020). They are still not widely used for asteroid tidal-disruption encounters, though.</w:t>
+        <w:t>The particle-level SPH outputs are transformed into scalar outcomes through post-processing, creating a compact tabular dataset appropriate for machine learning</w:t>
+      </w:r>
+      <w:r>
+        <w:t xml:space="preserve"> (ML)</w:t>
+      </w:r>
+      <w:r>
+        <w:t>. Because tree-based models perform well with tiny, nonlinear tabular datasets, this makes the problem a good fit for machine learning (Grinsztajn et al., 2022). In the past, outcomes from comparable SPH collision and giant-impact simulations have also been predicted using tree-based ML surrogate models (Cambioni et al., 2019; Timpe et al., 2020). They are still not widely used for asteroid tidal-disruption encounters, though.</w:t>
       </w:r>
     </w:p>
     <w:p>
@@ -3270,7 +3330,22 @@
         <w:t>totalling</w:t>
       </w:r>
       <w:r>
-        <w:t xml:space="preserve"> over 218 GB of HDF5 particle data are included in the collection. These particle outputs are transformed into fragment and bound-mass measurements through post-processing. </w:t>
+        <w:t xml:space="preserve"> over 218 GB of </w:t>
+      </w:r>
+      <w:r>
+        <w:t xml:space="preserve">Hierarchical Data Format version 5 </w:t>
+      </w:r>
+      <w:r>
+        <w:t>(</w:t>
+      </w:r>
+      <w:r>
+        <w:t>HDF5</w:t>
+      </w:r>
+      <w:r>
+        <w:t>)</w:t>
+      </w:r>
+      <w:r>
+        <w:t xml:space="preserve"> particle data are included in the collection. These particle outputs are transformed into fragment and bound-mass measurements through post-processing. </w:t>
       </w:r>
       <w:r>
         <w:t>The physical scenario inputs and numerical simulation settings are provided by the SPH setup, while bound-mass measurements are calculated during post-processing</w:t>
@@ -3285,7 +3360,13 @@
         <w:t xml:space="preserve">/model target </w:t>
       </w:r>
       <w:r>
-        <w:t xml:space="preserve">in this project is the bound mass fraction, represented by fbound​, which is the fraction of the original asteroid mass that remains gravitationaly bound to Mars after the encounter, this will be referred to as BMF throughout this report. </w:t>
+        <w:t xml:space="preserve">in this project is the bound mass fraction, represented by fbound​, which is the fraction of the original asteroid mass that remains </w:t>
+      </w:r>
+      <w:r>
+        <w:t>gravitationally</w:t>
+      </w:r>
+      <w:r>
+        <w:t xml:space="preserve"> bound to Mars after the encounter, this will be referred to as BMF throughout this report. </w:t>
       </w:r>
     </w:p>
     <w:p>
@@ -3948,16 +4029,7 @@
         <w:jc w:val="both"/>
       </w:pPr>
       <w:r>
-        <w:t xml:space="preserve">The main ML task is to predict the BMF value, </w:t>
-      </w:r>
-      <w:r>
-        <w:t>or the proportion of the initial asteroid mass that is expected to stay bound to Mars, is the primary machine learning job. This maintains the distinction between retained fractions that are tiny, medium, and big. Furthermore, because Kegerreis et al. (2024) discovered that "tens of percent of an unbound asteroid's mass can be captured and survive beyond collisional timescales"</w:t>
-      </w:r>
-      <w:r>
-        <w:t>,</w:t>
-      </w:r>
-      <w:r>
-        <w:t xml:space="preserve"> a 10% BMF threshold is used as a straightforward screening criterion for higher-retention instances. Therefore, the 10% barrier is not a real physical limitation for moon formation, rather it is only utilized to classify and prioritize occurrences. </w:t>
+        <w:t>The primary ML task is to predict BMF, the proportion of the initial asteroid mass expected to remain bound to Mars. This preserves the distinction between low, medium, and high retained fractions. Furthermore, because Kegerreis et al. (2024) found that “tens of percent of an unbound asteroid's mass can be captured and survive beyond collisional timescales”, a 10% BMF threshold is used as a simple screening criterion for higher-retention cases. This threshold is not a physical limit for moon formation, but is used only for classification and prioritisation.</w:t>
       </w:r>
     </w:p>
     <w:p>
@@ -3966,20 +4038,11 @@
         <w:jc w:val="both"/>
       </w:pPr>
       <w:r>
+        <w:t xml:space="preserve">For the prediction tasks, several baseline models were used. Logistic Regression models the probability of a case belonging to one of two classes from the input features, so it is used as a simple baseline for the BMF ≥ 10% classification task (Knauer et al., 2024). Random Forest </w:t>
+      </w:r>
+      <w:r>
         <w:lastRenderedPageBreak/>
-        <w:t xml:space="preserve">For the prediction tasks, </w:t>
-      </w:r>
-      <w:r>
-        <w:t>several</w:t>
-      </w:r>
-      <w:r>
-        <w:t xml:space="preserve"> baseline models were used. While this project primarily focuses on tree-based models, Logistic Regression is also used for the BMF ≥ 10% classification task because it offers a straightforward baseline for testing whether lower- and higher-retention cases can already be separated using a relatively simple combination of the inputs (Knauer et al., 2024). Because Random Forest can capture nonlinear correlations and interactions between </w:t>
-      </w:r>
-      <w:r>
-        <w:t xml:space="preserve">scenario inputs </w:t>
-      </w:r>
-      <w:r>
-        <w:t>while averaging numerous trees to lessen susceptibility to specific cases, it is tried for continuous BMF prediction (Breiman, 2001; Cambioni et al., 2019). Additionally, Gradient Boosting is evaluated since it constructs trees in a sequential manner, with each subsequent tree fixing mistakes produced by the ones before it. This could assist capture more precise changes between various encounter settings (Friedman, 2001; Valencia et al., 2019; Timpe et al., 2020).</w:t>
+        <w:t>combines many decision trees fitted to different samples of the data and averages their predictions, allowing it to capture nonlinear relationships while reducing sensitivity to individual cases (Breiman, 2001; Cambioni et al., 2019). Gradient Boosting also combines decision trees, but builds them sequentially so that each new tree reduces errors left by the previous trees. This can capture more detailed changes between encounter settings (Friedman, 2001; Valencia et al., 2019; Timpe et al., 2020).</w:t>
       </w:r>
     </w:p>
     <w:p>
@@ -4021,7 +4084,7 @@
         <w:jc w:val="both"/>
       </w:pPr>
       <w:r>
-        <w:t xml:space="preserve">One of the main issues with the archive is that it contains repeated rows from the same physical SPH simulation, for example when the same simulation is post-processed using different FoF linking lengths. Therefore, the model might be trained on one processed version of a simulation and tested on another version of the same simulation using a random row split. 5-fold GroupKFold cross-validation was employed to prevent this. Every out-of-fold (OOF) prediction is made by a model that has not been trained on that physical simulation since all rows from the same physical simulation file are stored in the same fold. </w:t>
+        <w:t>One of the main issues with the archive is that it contains repeated rows from the same physical SPH simulation, for example when the same simulation is post-processed using different FoF linking lengths. With a random row split, the model could therefore be trained on one processed version of a simulation and tested on another version of the same simulation. To prevent this, 5-fold GroupKFold cross-validation was used. GroupKFold divides the data into five folds while keeping all rows from the same physical simulation in the same fold. Each out-of-fold (OOF) prediction is therefore produced by a model that was not trained on any row from that physical simulation.</w:t>
       </w:r>
     </w:p>
     <w:p>
@@ -4036,7 +4099,10 @@
         <w:t>R²</w:t>
       </w:r>
       <w:r>
-        <w:t xml:space="preserve">, mean absolute error (MAE), and root mean squared error (RMSE). Classification performance is measured using balanced accuracy, F1, and ROC AUC. </w:t>
+        <w:t xml:space="preserve">, mean absolute error (MAE), and root mean squared error (RMSE). </w:t>
+      </w:r>
+      <w:r>
+        <w:t>Classification performance is measured using balanced accuracy, F1 score, and receiver operating characteristic area under the curve (ROC AUC).</w:t>
       </w:r>
     </w:p>
     <w:p>
@@ -4057,7 +4123,13 @@
         <w:jc w:val="both"/>
       </w:pPr>
       <w:r>
-        <w:t xml:space="preserve">Although overall scores are helpful, they do not demonstrate whether the model exhibits reasonable physical behaviour in various scenarios. Three complimentary analyses are employed to verify this. </w:t>
+        <w:t>Although overall scores are helpful, they do not demonstrate whether the model exhibits reasonable physical behaviour in various scenarios. Three compl</w:t>
+      </w:r>
+      <w:r>
+        <w:t>e</w:t>
+      </w:r>
+      <w:r>
+        <w:t xml:space="preserve">mentary analyses are employed to verify this. </w:t>
       </w:r>
       <w:r>
         <w:t xml:space="preserve">To determine how heavily the model depends on each physical input across the dataset, an input-removal test, also known as ablation, first eliminates one original input from the model and analyses how much model performance declines </w:t>
@@ -4073,7 +4145,6 @@
       <w:bookmarkStart w:id="24" w:name="_Toc238149739"/>
       <w:bookmarkStart w:id="25" w:name="_Toc238392138"/>
       <w:r>
-        <w:lastRenderedPageBreak/>
         <w:t>2.5 When to Trust the Model</w:t>
       </w:r>
       <w:bookmarkEnd w:id="24"/>
@@ -4085,6 +4156,7 @@
         <w:jc w:val="both"/>
       </w:pPr>
       <w:r>
+        <w:lastRenderedPageBreak/>
         <w:t>The method also determines whether a new setup is comparable to SPH simulations that are already in the archive because model accuracy alone cannot demonstrate the reliability of each individual forecast because an overall score can conceal areas where the model has insufficient data or produces larger errors. When there are multiple independent SPH simulations and a low held-out prediction error in the surrounding area, predictions are more reliable. When the input combination is outside the sampled region, close to the edge of the available data, or poorly sampled, predictions are deemed less accurate. Figure 5 and section 3.6 provide an analysis of these inspections.</w:t>
       </w:r>
     </w:p>
@@ -4319,7 +4391,13 @@
         <w:jc w:val="both"/>
       </w:pPr>
       <w:r>
-        <w:t xml:space="preserve">The combined BMF graph is highly irregular because it has simulations from different asteroid-mass regimes, and separating the mass cases shows that this apparent scatter shows that the bound mass is regime-dependant rather than following a single periapsis trend. </w:t>
+        <w:t>The combined BMF graph is highly irregular because it has simulations from different asteroid-mass regimes, and separating the mass cases shows that this apparent scatter shows that the bound mass is regime-depend</w:t>
+      </w:r>
+      <w:r>
+        <w:t>e</w:t>
+      </w:r>
+      <w:r>
+        <w:t xml:space="preserve">nt rather than following a single periapsis trend. </w:t>
       </w:r>
       <w:r>
         <w:t>The mass-separated panels also show a strong asymmetry in the sampled archive: the 10</w:t>
@@ -4928,22 +5006,14 @@
           <w:sz w:val="20"/>
           <w:szCs w:val="20"/>
         </w:rPr>
-        <w:t>, n</w:t>
+        <w:t xml:space="preserve"> kg</w:t>
       </w:r>
       <w:r>
         <w:rPr>
           <w:sz w:val="20"/>
           <w:szCs w:val="20"/>
-          <w:vertAlign w:val="subscript"/>
-        </w:rPr>
-        <w:t>65</w:t>
-      </w:r>
-      <w:r>
-        <w:rPr>
-          <w:sz w:val="20"/>
-          <w:szCs w:val="20"/>
-        </w:rPr>
-        <w:t xml:space="preserve"> subset at timestep 90000 and FoF linking length 0.004. Left: BMF range across spin states with velocity fixed. Right: BMF range across velocities with spin fixed. These ranges show how strongly outcomes differ within this subset; they do not show direction or prove causation.</w:t>
+        </w:rPr>
+        <w:t>. Left: BMF range across spin states with velocity fixed. Right: BMF range across velocities with spin fixed. These ranges show how strongly outcomes differ within this subset; they do not show direction or prove causation.</w:t>
       </w:r>
       <w:bookmarkEnd w:id="42"/>
     </w:p>
@@ -5799,7 +5869,13 @@
         <w:jc w:val="both"/>
       </w:pPr>
       <w:r>
-        <w:t>This study sought to determine which inputs are most important for fragment creation and retained debris, how orbital and physical characteristics affect disruption and bound retention, and whether machine learning (ML) can forecast outcomes while indicating when its predictions should be believed. Below is a summary of the responses.</w:t>
+        <w:t xml:space="preserve">This study sought to determine which inputs are most important for fragment creation and retained debris, how orbital and physical characteristics affect disruption and bound retention, and whether </w:t>
+      </w:r>
+      <w:r>
+        <w:t>ML</w:t>
+      </w:r>
+      <w:r>
+        <w:t xml:space="preserve"> can forecast outcomes while indicating when its predictions should be believed. Below is a summary of the responses.</w:t>
       </w:r>
     </w:p>
     <w:p>

</xml_diff>

<commit_message>
docs: update table 3 (minimise, remove 2 unimportant plot)
</commit_message>
<xml_diff>
--- a/deliverables/nny124-final-report.docx
+++ b/deliverables/nny124-final-report.docx
@@ -4249,9 +4249,9 @@
           <w:lang w:val="en-US"/>
         </w:rPr>
         <w:drawing>
-          <wp:inline distT="0" distB="0" distL="0" distR="0" wp14:anchorId="3D017574" wp14:editId="47E936BA">
-            <wp:extent cx="4373599" cy="3253562"/>
-            <wp:effectExtent l="0" t="0" r="0" b="0"/>
+          <wp:inline distT="0" distB="0" distL="0" distR="0" wp14:anchorId="3D017574" wp14:editId="21BA2965">
+            <wp:extent cx="4944985" cy="3678621"/>
+            <wp:effectExtent l="0" t="0" r="0" b="4445"/>
             <wp:docPr id="589236429" name="Picture 1"/>
             <wp:cNvGraphicFramePr>
               <a:graphicFrameLocks xmlns:a="http://schemas.openxmlformats.org/drawingml/2006/main" noChangeAspect="1"/>
@@ -4272,7 +4272,7 @@
                   <pic:spPr>
                     <a:xfrm>
                       <a:off x="0" y="0"/>
-                      <a:ext cx="4555725" cy="3389047"/>
+                      <a:ext cx="5189847" cy="3860776"/>
                     </a:xfrm>
                     <a:prstGeom prst="rect">
                       <a:avLst/>
@@ -4364,12 +4364,20 @@
           <w:sz w:val="20"/>
           <w:szCs w:val="20"/>
         </w:rPr>
-        <w:t xml:space="preserve"> </w:t>
+        <w:t>10</w:t>
       </w:r>
       <w:r>
         <w:rPr>
           <w:sz w:val="20"/>
           <w:szCs w:val="20"/>
+          <w:vertAlign w:val="superscript"/>
+        </w:rPr>
+        <w:t>20</w:t>
+      </w:r>
+      <w:r>
+        <w:rPr>
+          <w:sz w:val="20"/>
+          <w:szCs w:val="20"/>
         </w:rPr>
         <w:t xml:space="preserve"> kg asteroid-mass groups, showing that the combined scatter includes distinct retention regimes.</w:t>
       </w:r>
@@ -4409,7 +4417,19 @@
         <w:t>20</w:t>
       </w:r>
       <w:r>
-        <w:t xml:space="preserve"> kg cases are much more heavily represented (n=271) than the 10</w:t>
+        <w:t xml:space="preserve"> kg cases are much more heavily represented </w:t>
+      </w:r>
+      <w:r>
+        <w:t>(</w:t>
+      </w:r>
+      <w:r>
+        <w:t>271</w:t>
+      </w:r>
+      <w:r>
+        <w:t xml:space="preserve"> cases</w:t>
+      </w:r>
+      <w:r>
+        <w:t>) than the 10</w:t>
       </w:r>
       <w:r>
         <w:rPr>
@@ -4418,7 +4438,13 @@
         <w:t xml:space="preserve">19 </w:t>
       </w:r>
       <w:r>
-        <w:t>kg cases (n=81), and they span substantially higher BMF and remain non-zero over a wider periapsis range. Th</w:t>
+        <w:t>kg cases (81</w:t>
+      </w:r>
+      <w:r>
+        <w:t xml:space="preserve"> cases</w:t>
+      </w:r>
+      <w:r>
+        <w:t>), and they span substantially higher BMF and remain non-zero over a wider periapsis range. Th</w:t>
       </w:r>
       <w:r>
         <w:t>e 10</w:t>
@@ -4481,9 +4507,9 @@
       <w:r>
         <w:lastRenderedPageBreak/>
         <w:drawing>
-          <wp:inline distT="0" distB="0" distL="114300" distR="114300" wp14:anchorId="485CF5A0" wp14:editId="2C25327C">
-            <wp:extent cx="3529965" cy="2222500"/>
-            <wp:effectExtent l="0" t="0" r="635" b="0"/>
+          <wp:inline distT="0" distB="0" distL="114300" distR="114300" wp14:anchorId="485CF5A0" wp14:editId="5089B1D2">
+            <wp:extent cx="3363310" cy="2123090"/>
+            <wp:effectExtent l="0" t="0" r="2540" b="0"/>
             <wp:docPr id="5" name="image1.png"/>
             <wp:cNvGraphicFramePr/>
             <a:graphic xmlns:a="http://schemas.openxmlformats.org/drawingml/2006/main">
@@ -4502,7 +4528,7 @@
                   <pic:spPr>
                     <a:xfrm>
                       <a:off x="0" y="0"/>
-                      <a:ext cx="3626439" cy="2283241"/>
+                      <a:ext cx="3457135" cy="2182317"/>
                     </a:xfrm>
                     <a:prstGeom prst="rect">
                       <a:avLst/>
@@ -4684,8 +4710,8 @@
       </w:pPr>
       <w:r>
         <w:drawing>
-          <wp:inline distT="0" distB="0" distL="0" distR="0" wp14:anchorId="7EA8534E" wp14:editId="518664B9">
-            <wp:extent cx="5728938" cy="3891516"/>
+          <wp:inline distT="0" distB="0" distL="0" distR="0" wp14:anchorId="7EA8534E" wp14:editId="20666A63">
+            <wp:extent cx="5276193" cy="3583978"/>
             <wp:effectExtent l="0" t="0" r="0" b="0"/>
             <wp:docPr id="453900512" name="Picture 1"/>
             <wp:cNvGraphicFramePr>
@@ -4707,7 +4733,7 @@
                   <pic:spPr>
                     <a:xfrm>
                       <a:off x="0" y="0"/>
-                      <a:ext cx="5735514" cy="3895983"/>
+                      <a:ext cx="5301708" cy="3601310"/>
                     </a:xfrm>
                     <a:prstGeom prst="rect">
                       <a:avLst/>
@@ -4895,9 +4921,9 @@
       </w:pPr>
       <w:r>
         <w:drawing>
-          <wp:inline distT="0" distB="0" distL="114300" distR="114300" wp14:anchorId="3B7A9855" wp14:editId="62D9BA92">
-            <wp:extent cx="5473700" cy="2044700"/>
-            <wp:effectExtent l="0" t="0" r="0" b="0"/>
+          <wp:inline distT="0" distB="0" distL="114300" distR="114300" wp14:anchorId="3B7A9855" wp14:editId="6E44C856">
+            <wp:extent cx="5255172" cy="1849821"/>
+            <wp:effectExtent l="0" t="0" r="3175" b="4445"/>
             <wp:docPr id="7" name="image5.png"/>
             <wp:cNvGraphicFramePr/>
             <a:graphic xmlns:a="http://schemas.openxmlformats.org/drawingml/2006/main">
@@ -4917,7 +4943,7 @@
                   <pic:spPr>
                     <a:xfrm>
                       <a:off x="0" y="0"/>
-                      <a:ext cx="5474225" cy="2044896"/>
+                      <a:ext cx="5265375" cy="1853412"/>
                     </a:xfrm>
                     <a:prstGeom prst="rect">
                       <a:avLst/>
@@ -5059,11 +5085,7 @@
         <w:t>∞</w:t>
       </w:r>
       <w:r>
-        <w:t xml:space="preserve">=0, while various other velocity groups reach approximately 0.14-0.22 between 1.6 and 2.0 Mars-radii. The pattern of velocity is distinct. The velocity-related BMF range for the no-spin instances is approximately 0.18 at 1.2-1.4 Mars radii, decreases to approximately 0.14 at 1.6 Mars </w:t>
-      </w:r>
-      <w:r>
-        <w:lastRenderedPageBreak/>
-        <w:t>radii, and reaches zero by 1.8 Mars radii. On the other hand, velocity-related ranges of roughly 0.15-0.19 between 1.6 and 2.0 Mars-radii are still seen in the sampled prograde z-spin situations.</w:t>
+        <w:t>=0, while various other velocity groups reach approximately 0.14-0.22 between 1.6 and 2.0 Mars-radii. The pattern of velocity is distinct. The velocity-related BMF range for the no-spin instances is approximately 0.18 at 1.2-1.4 Mars radii, decreases to approximately 0.14 at 1.6 Mars radii, and reaches zero by 1.8 Mars radii. On the other hand, velocity-related ranges of roughly 0.15-0.19 between 1.6 and 2.0 Mars-radii are still seen in the sampled prograde z-spin situations.</w:t>
       </w:r>
     </w:p>
     <w:p>
@@ -5072,6 +5094,7 @@
         <w:jc w:val="both"/>
       </w:pPr>
       <w:r>
+        <w:lastRenderedPageBreak/>
         <w:t>These findings support the importance of regime-dependent parameters: the overall ablation ranking is not universal because spin predominates under some situations while velocity predominates under others.</w:t>
       </w:r>
     </w:p>
@@ -5107,10 +5130,152 @@
     </w:p>
     <w:p>
       <w:pPr>
+        <w:keepNext/>
+        <w:spacing w:before="240" w:after="240" w:line="276" w:lineRule="auto"/>
+        <w:jc w:val="center"/>
+      </w:pPr>
+      <w:r>
+        <w:drawing>
+          <wp:inline distT="0" distB="0" distL="0" distR="0" wp14:anchorId="1B9250F9" wp14:editId="325B11B7">
+            <wp:extent cx="5943600" cy="3060862"/>
+            <wp:effectExtent l="0" t="0" r="0" b="0"/>
+            <wp:docPr id="88218725" name="Picture 1"/>
+            <wp:cNvGraphicFramePr>
+              <a:graphicFrameLocks xmlns:a="http://schemas.openxmlformats.org/drawingml/2006/main" noChangeAspect="1"/>
+            </wp:cNvGraphicFramePr>
+            <a:graphic xmlns:a="http://schemas.openxmlformats.org/drawingml/2006/main">
+              <a:graphicData uri="http://schemas.openxmlformats.org/drawingml/2006/picture">
+                <pic:pic xmlns:pic="http://schemas.openxmlformats.org/drawingml/2006/picture">
+                  <pic:nvPicPr>
+                    <pic:cNvPr id="88218725" name=""/>
+                    <pic:cNvPicPr/>
+                  </pic:nvPicPr>
+                  <pic:blipFill rotWithShape="1">
+                    <a:blip r:embed="rId16"/>
+                    <a:srcRect t="5411"/>
+                    <a:stretch>
+                      <a:fillRect/>
+                    </a:stretch>
+                  </pic:blipFill>
+                  <pic:spPr bwMode="auto">
+                    <a:xfrm>
+                      <a:off x="0" y="0"/>
+                      <a:ext cx="5943600" cy="3060862"/>
+                    </a:xfrm>
+                    <a:prstGeom prst="rect">
+                      <a:avLst/>
+                    </a:prstGeom>
+                    <a:ln>
+                      <a:noFill/>
+                    </a:ln>
+                    <a:extLst>
+                      <a:ext uri="{53640926-AAD7-44D8-BBD7-CCE9431645EC}">
+                        <a14:shadowObscured xmlns:a14="http://schemas.microsoft.com/office/drawing/2010/main"/>
+                      </a:ext>
+                    </a:extLst>
+                  </pic:spPr>
+                </pic:pic>
+              </a:graphicData>
+            </a:graphic>
+          </wp:inline>
+        </w:drawing>
+      </w:r>
+    </w:p>
+    <w:p>
+      <w:pPr>
+        <w:pStyle w:val="Caption"/>
+        <w:jc w:val="center"/>
+        <w:rPr>
+          <w:sz w:val="20"/>
+          <w:szCs w:val="20"/>
+        </w:rPr>
+      </w:pPr>
+      <w:bookmarkStart w:id="45" w:name="_Toc238151307"/>
+      <w:r>
+        <w:rPr>
+          <w:sz w:val="20"/>
+          <w:szCs w:val="20"/>
+        </w:rPr>
+        <w:t xml:space="preserve">Figure </w:t>
+      </w:r>
+      <w:r>
+        <w:rPr>
+          <w:sz w:val="20"/>
+          <w:szCs w:val="20"/>
+        </w:rPr>
+        <w:fldChar w:fldCharType="begin"/>
+      </w:r>
+      <w:r>
+        <w:rPr>
+          <w:sz w:val="20"/>
+          <w:szCs w:val="20"/>
+        </w:rPr>
+        <w:instrText xml:space="preserve"> SEQ Figure \* ARABIC </w:instrText>
+      </w:r>
+      <w:r>
+        <w:rPr>
+          <w:sz w:val="20"/>
+          <w:szCs w:val="20"/>
+        </w:rPr>
+        <w:fldChar w:fldCharType="separate"/>
+      </w:r>
+      <w:r>
+        <w:rPr>
+          <w:sz w:val="20"/>
+          <w:szCs w:val="20"/>
+        </w:rPr>
+        <w:t>5</w:t>
+      </w:r>
+      <w:r>
+        <w:rPr>
+          <w:sz w:val="20"/>
+          <w:szCs w:val="20"/>
+        </w:rPr>
+        <w:fldChar w:fldCharType="end"/>
+      </w:r>
+      <w:r>
+        <w:rPr>
+          <w:sz w:val="20"/>
+          <w:szCs w:val="20"/>
+        </w:rPr>
+        <w:t xml:space="preserve">. </w:t>
+      </w:r>
+      <w:bookmarkEnd w:id="45"/>
+      <w:r>
+        <w:rPr>
+          <w:sz w:val="20"/>
+          <w:szCs w:val="20"/>
+        </w:rPr>
+        <w:t>Coverage, held-out error, and observed BMF across the sampled parameter space.</w:t>
+      </w:r>
+      <w:r>
+        <w:rPr>
+          <w:sz w:val="20"/>
+          <w:szCs w:val="20"/>
+        </w:rPr>
+        <w:t xml:space="preserve"> </w:t>
+      </w:r>
+      <w:r>
+        <w:rPr>
+          <w:sz w:val="20"/>
+          <w:szCs w:val="20"/>
+        </w:rPr>
+        <w:t>Panels (a,d) show unique physical SPH simulation counts, panels (b,e) show mean held-out absolute error, and panels (c,f) show mean observed BMF with unique simulation counts overlaid. Grey indicates no SPH data. In the observed-BMF panels, light blue indicates mean observed BMF = 0, while other colours indicate mean observed BMF &gt; 0.</w:t>
+      </w:r>
+    </w:p>
+    <w:p>
+      <w:pPr>
         <w:spacing w:before="240" w:after="240" w:line="276" w:lineRule="auto"/>
         <w:jc w:val="both"/>
       </w:pPr>
-      <w:r>
+    </w:p>
+    <w:p>
+      <w:pPr>
+        <w:spacing w:before="240" w:after="240" w:line="276" w:lineRule="auto"/>
+        <w:jc w:val="both"/>
+      </w:pPr>
+      <w:r>
+        <w:lastRenderedPageBreak/>
         <w:t>A specific illustration of this issue for the sparsely sampled 10</w:t>
       </w:r>
       <w:r>
@@ -5133,7 +5298,7 @@
           <w:szCs w:val="20"/>
         </w:rPr>
       </w:pPr>
-      <w:bookmarkStart w:id="45" w:name="_Toc238151451"/>
+      <w:bookmarkStart w:id="46" w:name="_Toc238151451"/>
       <w:r>
         <w:rPr>
           <w:sz w:val="20"/>
@@ -5212,7 +5377,7 @@
         </w:rPr>
         <w:t>but only two unique physical SPH simulations support these cases.</w:t>
       </w:r>
-      <w:bookmarkEnd w:id="45"/>
+      <w:bookmarkEnd w:id="46"/>
     </w:p>
     <w:tbl>
       <w:tblPr>
@@ -5574,124 +5739,21 @@
         <w:spacing w:before="240" w:after="240" w:line="276" w:lineRule="auto"/>
         <w:jc w:val="both"/>
       </w:pPr>
-    </w:p>
-    <w:p>
-      <w:pPr>
-        <w:keepNext/>
-        <w:spacing w:before="240" w:after="240" w:line="276" w:lineRule="auto"/>
-        <w:jc w:val="center"/>
-      </w:pPr>
-      <w:r>
-        <w:lastRenderedPageBreak/>
-        <w:drawing>
-          <wp:inline distT="0" distB="0" distL="114300" distR="114300" wp14:anchorId="5D08FC53" wp14:editId="3CC4E8E0">
-            <wp:extent cx="4268788" cy="6836818"/>
-            <wp:effectExtent l="0" t="0" r="0" b="0"/>
-            <wp:docPr id="6" name="image6.png"/>
-            <wp:cNvGraphicFramePr/>
-            <a:graphic xmlns:a="http://schemas.openxmlformats.org/drawingml/2006/main">
-              <a:graphicData uri="http://schemas.openxmlformats.org/drawingml/2006/picture">
-                <pic:pic xmlns:pic="http://schemas.openxmlformats.org/drawingml/2006/picture">
-                  <pic:nvPicPr>
-                    <pic:cNvPr id="6" name="image6.png"/>
-                    <pic:cNvPicPr/>
-                  </pic:nvPicPr>
-                  <pic:blipFill>
-                    <a:blip r:embed="rId16"/>
-                    <a:stretch>
-                      <a:fillRect/>
-                    </a:stretch>
-                  </pic:blipFill>
-                  <pic:spPr>
-                    <a:xfrm>
-                      <a:off x="0" y="0"/>
-                      <a:ext cx="4268788" cy="6836818"/>
-                    </a:xfrm>
-                    <a:prstGeom prst="rect">
-                      <a:avLst/>
-                    </a:prstGeom>
-                  </pic:spPr>
-                </pic:pic>
-              </a:graphicData>
-            </a:graphic>
-          </wp:inline>
-        </w:drawing>
-      </w:r>
-    </w:p>
-    <w:p>
-      <w:pPr>
-        <w:pStyle w:val="Caption"/>
-        <w:jc w:val="center"/>
-        <w:rPr>
-          <w:sz w:val="20"/>
-          <w:szCs w:val="20"/>
-        </w:rPr>
-      </w:pPr>
-      <w:bookmarkStart w:id="46" w:name="_Toc238151307"/>
-      <w:r>
-        <w:rPr>
-          <w:sz w:val="20"/>
-          <w:szCs w:val="20"/>
-        </w:rPr>
-        <w:t xml:space="preserve">Figure </w:t>
-      </w:r>
-      <w:r>
-        <w:rPr>
-          <w:sz w:val="20"/>
-          <w:szCs w:val="20"/>
-        </w:rPr>
-        <w:fldChar w:fldCharType="begin"/>
-      </w:r>
-      <w:r>
-        <w:rPr>
-          <w:sz w:val="20"/>
-          <w:szCs w:val="20"/>
-        </w:rPr>
-        <w:instrText xml:space="preserve"> SEQ Figure \* ARABIC </w:instrText>
-      </w:r>
-      <w:r>
-        <w:rPr>
-          <w:sz w:val="20"/>
-          <w:szCs w:val="20"/>
-        </w:rPr>
-        <w:fldChar w:fldCharType="separate"/>
-      </w:r>
-      <w:r>
-        <w:rPr>
-          <w:sz w:val="20"/>
-          <w:szCs w:val="20"/>
-        </w:rPr>
-        <w:t>5</w:t>
-      </w:r>
-      <w:r>
-        <w:rPr>
-          <w:sz w:val="20"/>
-          <w:szCs w:val="20"/>
-        </w:rPr>
-        <w:fldChar w:fldCharType="end"/>
-      </w:r>
-      <w:r>
-        <w:rPr>
-          <w:sz w:val="20"/>
-          <w:szCs w:val="20"/>
-        </w:rPr>
-        <w:t>. Checks used to judge prediction trust.</w:t>
-      </w:r>
-      <w:r>
-        <w:rPr>
-          <w:sz w:val="20"/>
-          <w:szCs w:val="20"/>
-        </w:rPr>
-        <w:br/>
-      </w:r>
-      <w:r>
-        <w:rPr>
-          <w:sz w:val="20"/>
-          <w:szCs w:val="20"/>
-        </w:rPr>
-        <w:t>(Top: the number of unique SPH simulations and the mean held-out absolute error provide different information. Bottom: pairwise coverage shows input combinations that are missing even when each individual value is within its sampled range.) Grey means no SPH data in that bin, light blue means SPH data exists, but the mean observed BMF is 0, while other coloured cells mean that SPH data exists and mean observed BMF is &gt; 0.</w:t>
-      </w:r>
-      <w:bookmarkEnd w:id="46"/>
+      <w:r>
+        <w:t>This demonstrates that the held-out model overpredicts the 1.6 Mars-radii scenario by 0.0825 BMF and underpredicts the 1.2 Mars-radii case by 0.0779 BMF. The local relationship has not been successfully learned because the errors are both substantial and have opposite signs. Therefore, a new instance in this region should not be believed just because its mass falls between sampled masses; instead, it should be verified with more SPH.</w:t>
+      </w:r>
+    </w:p>
+    <w:p>
+      <w:pPr>
+        <w:pStyle w:val="Heading2"/>
+      </w:pPr>
+      <w:bookmarkStart w:id="47" w:name="_Toc238149747"/>
+      <w:bookmarkStart w:id="48" w:name="_Toc238392146"/>
+      <w:r>
+        <w:t>3.7 How the Model Supports SPH Decisions</w:t>
+      </w:r>
+      <w:bookmarkEnd w:id="47"/>
+      <w:bookmarkEnd w:id="48"/>
     </w:p>
     <w:p>
       <w:pPr>
@@ -5699,21 +5761,23 @@
         <w:jc w:val="both"/>
       </w:pPr>
       <w:r>
-        <w:lastRenderedPageBreak/>
-        <w:t>This demonstrates that the held-out model overpredicts the 1.6 Mars-radii scenario by 0.0825 BMF and underpredicts the 1.2 Mars-radii case by 0.0779 BMF. The local relationship has not been successfully learned because the errors are both substantial and have opposite signs. Therefore, a new instance in this region should not be believed just because its mass falls between sampled masses; instead, it should be verified with more SPH.</w:t>
-      </w:r>
-    </w:p>
-    <w:p>
-      <w:pPr>
-        <w:pStyle w:val="Heading2"/>
-      </w:pPr>
-      <w:bookmarkStart w:id="47" w:name="_Toc238149747"/>
-      <w:bookmarkStart w:id="48" w:name="_Toc238392146"/>
-      <w:r>
-        <w:t>3.7 How the Model Supports SPH Decisions</w:t>
-      </w:r>
-      <w:bookmarkEnd w:id="47"/>
-      <w:bookmarkEnd w:id="48"/>
+        <w:t>So,</w:t>
+      </w:r>
+      <w:r>
+        <w:t xml:space="preserve"> what is the model </w:t>
+      </w:r>
+      <w:r>
+        <w:t>actually useful</w:t>
+      </w:r>
+      <w:r>
+        <w:t xml:space="preserve"> for? The screening process separates disruption from retention. </w:t>
+      </w:r>
+      <w:r>
+        <w:t>While BMF calculates the amount of material that is still attached to Mars, the largest-remnant fraction indicates whether the asteroid is largely intact, breaks apart somewhat, or is seriously disturbed. Strong disruption can nevertheless result in primarily fleeing debris, which is why both outcomes are distinct.</w:t>
+      </w:r>
+      <w:r>
+        <w:t xml:space="preserve"> </w:t>
+      </w:r>
     </w:p>
     <w:p>
       <w:pPr>
@@ -5721,23 +5785,26 @@
         <w:jc w:val="both"/>
       </w:pPr>
       <w:r>
-        <w:t>So,</w:t>
-      </w:r>
-      <w:r>
-        <w:t xml:space="preserve"> what is the model </w:t>
-      </w:r>
-      <w:r>
-        <w:t>actually useful</w:t>
-      </w:r>
-      <w:r>
-        <w:t xml:space="preserve"> for? The screening process separates disruption from retention. </w:t>
-      </w:r>
-      <w:r>
-        <w:t>While BMF calculates the amount of material that is still attached to Mars, the largest-remnant fraction indicates whether the asteroid is largely intact, breaks apart somewhat, or is seriously disturbed. Strong disruption can nevertheless result in primarily fleeing debris, which is why both outcomes are distinct.</w:t>
+        <w:t>The resulting screening workflow provides the breakup class, estimated Mars-bound mass, expected BMF, data coverage, and a recommendation about whether another SPH simulation is required.</w:t>
       </w:r>
       <w:r>
         <w:t xml:space="preserve"> </w:t>
       </w:r>
+      <w:r>
+        <w:t>While sparse, edge, transition, or doubtful instances should be examined with SPH, well-supported cases can be swiftly evaluated with ML.</w:t>
+      </w:r>
+    </w:p>
+    <w:p>
+      <w:pPr>
+        <w:pStyle w:val="Heading1"/>
+      </w:pPr>
+      <w:bookmarkStart w:id="49" w:name="_Toc238149748"/>
+      <w:bookmarkStart w:id="50" w:name="_Toc238392147"/>
+      <w:r>
+        <w:t>4. Discussion</w:t>
+      </w:r>
+      <w:bookmarkEnd w:id="49"/>
+      <w:bookmarkEnd w:id="50"/>
     </w:p>
     <w:p>
       <w:pPr>
@@ -5745,26 +5812,8 @@
         <w:jc w:val="both"/>
       </w:pPr>
       <w:r>
-        <w:t>The resulting screening workflow provides the breakup class, estimated Mars-bound mass, expected BMF, data coverage, and a recommendation about whether another SPH simulation is required.</w:t>
-      </w:r>
-      <w:r>
-        <w:t xml:space="preserve"> </w:t>
-      </w:r>
-      <w:r>
-        <w:t>While sparse, edge, transition, or doubtful instances should be examined with SPH, well-supported cases can be swiftly evaluated with ML.</w:t>
-      </w:r>
-    </w:p>
-    <w:p>
-      <w:pPr>
-        <w:pStyle w:val="Heading1"/>
-      </w:pPr>
-      <w:bookmarkStart w:id="49" w:name="_Toc238149748"/>
-      <w:bookmarkStart w:id="50" w:name="_Toc238392147"/>
-      <w:r>
-        <w:t>4. Discussion</w:t>
-      </w:r>
-      <w:bookmarkEnd w:id="49"/>
-      <w:bookmarkEnd w:id="50"/>
+        <w:t>The clearest periapsis and velocity trends are seen in the controlled experiments, while the matched comparisons show that the effects of spin and velocity vary with encounter conditions. The behaviour in Figure 3 is consistent with the other analyses: although most larger-periapsis cases have near-zero BMF, Figures 1, 4, and 5 show that non-zero retention can still occur under particular combinations of spin, velocity, and mass. This indicates that similar periapsis values can produce different outcomes depending on the full encounter conditions. These relationships are learned from SPH outputs and support interpretation rather than proving physical causality.</w:t>
+      </w:r>
     </w:p>
     <w:p>
       <w:pPr>
@@ -5772,7 +5821,8 @@
         <w:jc w:val="both"/>
       </w:pPr>
       <w:r>
-        <w:t>The clearest periapsis and velocity trends are seen in the controlled experiments, while the matched comparisons show that the effects of spin and velocity vary with encounter conditions. The behaviour in Figure 3 is consistent with the other analyses: although most larger-periapsis cases have near-zero BMF, Figures 1, 4, and 5 show that non-zero retention can still occur under particular combinations of spin, velocity, and mass. This indicates that similar periapsis values can produce different outcomes depending on the full encounter conditions. These relationships are learned from SPH outputs and support interpretation rather than proving physical causality.</w:t>
+        <w:lastRenderedPageBreak/>
+        <w:t>The primary physical outcome is that each parameter's impact is contingent upon the other encounter conditions. Within those parameters, periapsis determines the overall strength of the tidal encounter, encounter speed influences the duration of the contact and the favourable capture, and mass and spin alter the outcome. The most obvious periapsis and speed directions are found in the controlled experiments. The paired simulations demonstrate how periapsis and spin state affect the magnitude of the spin and velocity impacts.</w:t>
       </w:r>
     </w:p>
     <w:p>
@@ -5781,7 +5831,7 @@
         <w:jc w:val="both"/>
       </w:pPr>
       <w:r>
-        <w:t>The primary physical outcome is that each parameter's impact is contingent upon the other encounter conditions. Within those parameters, periapsis determines the overall strength of the tidal encounter, encounter speed influences the duration of the contact and the favourable capture, and mass and spin alter the outcome. The most obvious periapsis and speed directions are found in the controlled experiments. The paired simulations demonstrate how periapsis and spin state affect the magnitude of the spin and velocity impacts.</w:t>
+        <w:t>Though these associations are acquired from SPH outputs rather than from physical laws, the ML model replicates general trends and reveals interactions throughout the archive. As a result, matched comparisons, controlled tests, and group validation support interpretation but do not prove causality.</w:t>
       </w:r>
     </w:p>
     <w:p>
@@ -5790,7 +5840,16 @@
         <w:jc w:val="both"/>
       </w:pPr>
       <w:r>
-        <w:t>Though these associations are acquired from SPH outputs rather than from physical laws, the ML model replicates general trends and reveals interactions throughout the archive. As a result, matched comparisons, controlled tests, and group validation support interpretation but do not prove causality.</w:t>
+        <w:t>As a result, ML's usefulness is restricted. It can swiftly filter well-supported input combinations, identify transition zones, uncover situations that yield promising retained mass, and indicate areas where more simulation could yield valuable information. Long-term debris survivability, precise fragment shapes and distributions from BMF alone, and forecasts for inadequately sampled input combinations cannot all be determined by it. This is evident from the 10</w:t>
+      </w:r>
+      <w:r>
+        <w:rPr>
+          <w:vertAlign w:val="superscript"/>
+        </w:rPr>
+        <w:t>19.5</w:t>
+      </w:r>
+      <w:r>
+        <w:t xml:space="preserve"> kg example: when only two independent simulations support the local combination, being numerically inside the training range is insufficient.</w:t>
       </w:r>
     </w:p>
     <w:p>
@@ -5799,17 +5858,7 @@
         <w:jc w:val="both"/>
       </w:pPr>
       <w:r>
-        <w:lastRenderedPageBreak/>
-        <w:t>As a result, ML's usefulness is restricted. It can swiftly filter well-supported input combinations, identify transition zones, uncover situations that yield promising retained mass, and indicate areas where more simulation could yield valuable information. Long-term debris survivability, precise fragment shapes and distributions from BMF alone, and forecasts for inadequately sampled input combinations cannot all be determined by it. This is evident from the 10</w:t>
-      </w:r>
-      <w:r>
-        <w:rPr>
-          <w:vertAlign w:val="superscript"/>
-        </w:rPr>
-        <w:t>19.5</w:t>
-      </w:r>
-      <w:r>
-        <w:t xml:space="preserve"> kg example: when only two independent simulations support the local combination, being numerically inside the training range is insufficient.</w:t>
+        <w:t>Different questions are addressed by the matching and ablation analysis. Although matching cases demonstrate that spin or velocity can become more significant under specific encounter settings, periapsis is generally the strongest.</w:t>
       </w:r>
     </w:p>
     <w:p>
@@ -5818,7 +5867,7 @@
         <w:jc w:val="both"/>
       </w:pPr>
       <w:r>
-        <w:t>Different questions are addressed by the matching and ablation analysis. Although matching cases demonstrate that spin or velocity can become more significant under specific encounter settings, periapsis is generally the strongest.</w:t>
+        <w:t>Compared to BMF, fragmentation requires more prudence. Strong fragmentation is possible but not guaranteed by close periapsis, and the number of pieces is directly altered by the FoF connecting length. Therefore, rather than taking the place of BMF, fragment count and largest-remnant metrics offer additional information. Strong breakup does not always result in much bound debris, therefore the procedure separates breakup severity from Mars-bound retention.</w:t>
       </w:r>
     </w:p>
     <w:p>
@@ -5827,8 +5876,32 @@
         <w:jc w:val="both"/>
       </w:pPr>
       <w:r>
-        <w:t>Compared to BMF, fragmentation requires more prudence. Strong fragmentation is possible but not guaranteed by close periapsis, and the number of pieces is directly altered by the FoF connecting length. Therefore, rather than taking the place of BMF, fragment count and largest-remnant metrics offer additional information. Strong breakup does not always result in much bound debris, therefore the procedure separates breakup severity from Mars-bound retention.</w:t>
-      </w:r>
+        <w:t>All things considered, the ML model is a quick screening method for the current SPH archive. Poorly sampled cases, transition regions, and issues requiring certain fragment attributes still require SPH.</w:t>
+      </w:r>
+    </w:p>
+    <w:p>
+      <w:pPr>
+        <w:pStyle w:val="Heading1"/>
+      </w:pPr>
+      <w:bookmarkStart w:id="51" w:name="_Toc238149749"/>
+      <w:bookmarkStart w:id="52" w:name="_Toc238392148"/>
+      <w:r>
+        <w:t>5. Conclusions, Limitations and Future Work</w:t>
+      </w:r>
+      <w:bookmarkEnd w:id="51"/>
+      <w:bookmarkEnd w:id="52"/>
+    </w:p>
+    <w:p>
+      <w:pPr>
+        <w:pStyle w:val="Heading2"/>
+      </w:pPr>
+      <w:bookmarkStart w:id="53" w:name="_Toc238149750"/>
+      <w:bookmarkStart w:id="54" w:name="_Toc238392149"/>
+      <w:r>
+        <w:t>5.1 Conclusions and Answers to the Research Questions</w:t>
+      </w:r>
+      <w:bookmarkEnd w:id="53"/>
+      <w:bookmarkEnd w:id="54"/>
     </w:p>
     <w:p>
       <w:pPr>
@@ -5836,32 +5909,14 @@
         <w:jc w:val="both"/>
       </w:pPr>
       <w:r>
-        <w:t>All things considered, the ML model is a quick screening method for the current SPH archive. Poorly sampled cases, transition regions, and issues requiring certain fragment attributes still require SPH.</w:t>
-      </w:r>
-    </w:p>
-    <w:p>
-      <w:pPr>
-        <w:pStyle w:val="Heading1"/>
-      </w:pPr>
-      <w:bookmarkStart w:id="51" w:name="_Toc238149749"/>
-      <w:bookmarkStart w:id="52" w:name="_Toc238392148"/>
-      <w:r>
-        <w:t>5. Conclusions, Limitations and Future Work</w:t>
-      </w:r>
-      <w:bookmarkEnd w:id="51"/>
-      <w:bookmarkEnd w:id="52"/>
-    </w:p>
-    <w:p>
-      <w:pPr>
-        <w:pStyle w:val="Heading2"/>
-      </w:pPr>
-      <w:bookmarkStart w:id="53" w:name="_Toc238149750"/>
-      <w:bookmarkStart w:id="54" w:name="_Toc238392149"/>
-      <w:r>
-        <w:t>5.1 Conclusions and Answers to the Research Questions</w:t>
-      </w:r>
-      <w:bookmarkEnd w:id="53"/>
-      <w:bookmarkEnd w:id="54"/>
+        <w:t xml:space="preserve">This study sought to determine which inputs are most important for fragment creation and retained debris, how orbital and physical characteristics affect disruption and bound retention, and whether </w:t>
+      </w:r>
+      <w:r>
+        <w:t>ML</w:t>
+      </w:r>
+      <w:r>
+        <w:t xml:space="preserve"> can forecast outcomes while indicating when its predictions should be believed. Below is a summary of the responses.</w:t>
+      </w:r>
     </w:p>
     <w:p>
       <w:pPr>
@@ -5869,13 +5924,26 @@
         <w:jc w:val="both"/>
       </w:pPr>
       <w:r>
-        <w:t xml:space="preserve">This study sought to determine which inputs are most important for fragment creation and retained debris, how orbital and physical characteristics affect disruption and bound retention, and whether </w:t>
-      </w:r>
-      <w:r>
-        <w:t>ML</w:t>
-      </w:r>
-      <w:r>
-        <w:t xml:space="preserve"> can forecast outcomes while indicating when its predictions should be believed. Below is a summary of the responses.</w:t>
+        <w:lastRenderedPageBreak/>
+        <w:t>Q</w:t>
+      </w:r>
+      <w:r>
+        <w:t>uestion 1:</w:t>
+      </w:r>
+      <w:r>
+        <w:t xml:space="preserve"> How do orbital and physical parameters </w:t>
+      </w:r>
+      <w:r>
+        <w:t>affect disruption and bound retention</w:t>
+      </w:r>
+      <w:r>
+        <w:t xml:space="preserve">? </w:t>
+      </w:r>
+      <w:r>
+        <w:t xml:space="preserve">Although the impact varies depending on the other inputs, closer and slower contacts typically retain more debris. In the representative controlled test, </w:t>
+      </w:r>
+      <w:r>
+        <w:t>predicted BMF generally decreases from roughly 27% at 1.2 Mars radii to approximately zero by about 2.5 Mars radii as periapsis increases. A similarly clear decline occurs as encounter speed increases, from roughly 25% at low velocity to approximately zero by about 1.2 km/s. Rather than being universal thresholds, these reactions are condition specific. Mass and spin alter the outcome, speed alters the encounter and capture conditions, and periapsis regulates tidal power.</w:t>
       </w:r>
     </w:p>
     <w:p>
@@ -5887,22 +5955,40 @@
         <w:t>Q</w:t>
       </w:r>
       <w:r>
-        <w:t>uestion 1:</w:t>
-      </w:r>
-      <w:r>
-        <w:t xml:space="preserve"> How do orbital and physical parameters </w:t>
-      </w:r>
-      <w:r>
-        <w:t>affect disruption and bound retention</w:t>
-      </w:r>
-      <w:r>
-        <w:t xml:space="preserve">? </w:t>
-      </w:r>
-      <w:r>
-        <w:t xml:space="preserve">Although the impact varies depending on the other inputs, closer and slower contacts typically retain more debris. In the representative controlled test, </w:t>
-      </w:r>
-      <w:r>
-        <w:t>predicted BMF generally decreases from roughly 27% at 1.2 Mars radii to approximately zero by about 2.5 Mars radii as periapsis increases. A similarly clear decline occurs as encounter speed increases, from roughly 25% at low velocity to approximately zero by about 1.2 km/s. Rather than being universal thresholds, these reactions are condition specific. Mass and spin alter the outcome, speed alters the encounter and capture conditions, and periapsis regulates tidal power.</w:t>
+        <w:t>uestion 2:</w:t>
+      </w:r>
+      <w:r>
+        <w:t xml:space="preserve"> </w:t>
+      </w:r>
+      <w:r>
+        <w:t>Which</w:t>
+      </w:r>
+      <w:r>
+        <w:t xml:space="preserve"> inputs matter most for retained debris? </w:t>
+      </w:r>
+      <w:r>
+        <w:t xml:space="preserve">There is no single universal ranking under all encounter conditions. </w:t>
+      </w:r>
+      <w:r>
+        <w:t xml:space="preserve">For BMF, the tuned Gradient Boosting input-removal analysis identifies periapsis as the strongest overall physical input, with its removal causing the largest decrease in performance (ΔR² = </w:t>
+      </w:r>
+      <w:r>
+        <w:t>-</w:t>
+      </w:r>
+      <w:r>
+        <w:t>0.574), followed by spin (</w:t>
+      </w:r>
+      <w:r>
+        <w:t>-</w:t>
+      </w:r>
+      <w:r>
+        <w:t>0.316) and velocity (</w:t>
+      </w:r>
+      <w:r>
+        <w:t>-</w:t>
+      </w:r>
+      <w:r>
+        <w:t>0.296). However, matched cases show that their relative importance changes locally.</w:t>
       </w:r>
     </w:p>
     <w:p>
@@ -5914,44 +6000,34 @@
         <w:t>Q</w:t>
       </w:r>
       <w:r>
-        <w:t>uestion 2:</w:t>
+        <w:t>uestion 3:</w:t>
       </w:r>
       <w:r>
         <w:t xml:space="preserve"> </w:t>
       </w:r>
       <w:r>
-        <w:t>Which</w:t>
-      </w:r>
-      <w:r>
-        <w:t xml:space="preserve"> inputs matter most for retained debris? </w:t>
-      </w:r>
-      <w:r>
-        <w:t xml:space="preserve">There is no single universal ranking under all encounter conditions. </w:t>
-      </w:r>
-      <w:r>
-        <w:t xml:space="preserve">For BMF, the tuned Gradient Boosting input-removal analysis </w:t>
-      </w:r>
-      <w:r>
-        <w:lastRenderedPageBreak/>
-        <w:t xml:space="preserve">identifies periapsis as the strongest overall physical input, with its removal causing the largest decrease in performance (ΔR² = </w:t>
-      </w:r>
-      <w:r>
-        <w:t>-</w:t>
-      </w:r>
-      <w:r>
-        <w:t>0.574), followed by spin (</w:t>
-      </w:r>
-      <w:r>
-        <w:t>-</w:t>
-      </w:r>
-      <w:r>
-        <w:t>0.316) and velocity (</w:t>
-      </w:r>
-      <w:r>
-        <w:t>-</w:t>
-      </w:r>
-      <w:r>
-        <w:t>0.296). However, matched cases show that their relative importance changes locally.</w:t>
+        <w:t>Can machine-learning models predict outcomes within the sampled data while showing when a prediction should or should not be trusted</w:t>
+      </w:r>
+      <w:r>
+        <w:t xml:space="preserve">? </w:t>
+      </w:r>
+      <w:r>
+        <w:t xml:space="preserve">Yes, in cases where the SPH archive supports comparable input combinations. The primary tuned Gradient Boosting model using the original </w:t>
+      </w:r>
+      <w:r>
+        <w:t>scenario</w:t>
+      </w:r>
+      <w:r>
+        <w:t xml:space="preserve"> inputs obtains a grouped cross-validated R² of 0.9234, MAE of 0.0159, and RMSE of 0.0257. Adding physics-derived features produces only a small further change to R² = 0.9240 and MAE = 0.0155, with RMSE unchanged at 0.0257, so the simpler tuned model is retained. Performance is not equally dependable everywhere, however. Despite the input values falling within the numerical training ranges, held-out errors increase to roughly 0.08 BMF, or 8 percentage points, in the sparsely sampled 10</w:t>
+      </w:r>
+      <w:r>
+        <w:rPr>
+          <w:vertAlign w:val="superscript"/>
+        </w:rPr>
+        <w:t>19.5</w:t>
+      </w:r>
+      <w:r>
+        <w:t xml:space="preserve"> kg example. This demonstrates that being within the overall input range is insufficient for a reliable prediction; comparable SPH cases must also exist nearby in the sampled parameter space. Thus, ML can support rapid screening and simulation prioritisation, while sparse, edge, transition, or poorly supported cases still require additional SPH investigation.</w:t>
       </w:r>
     </w:p>
     <w:p>
@@ -5960,38 +6036,20 @@
         <w:jc w:val="both"/>
       </w:pPr>
       <w:r>
-        <w:t>Q</w:t>
-      </w:r>
-      <w:r>
-        <w:t>uestion 3:</w:t>
-      </w:r>
-      <w:r>
-        <w:t xml:space="preserve"> </w:t>
-      </w:r>
-      <w:r>
-        <w:t>Can machine-learning models predict outcomes within the sampled data while showing when a prediction should or should not be trusted</w:t>
-      </w:r>
-      <w:r>
-        <w:t xml:space="preserve">? </w:t>
-      </w:r>
-      <w:r>
-        <w:t xml:space="preserve">Yes, in cases where the SPH archive supports comparable input combinations. The primary tuned Gradient Boosting model using the original </w:t>
-      </w:r>
-      <w:r>
-        <w:t>scenario</w:t>
-      </w:r>
-      <w:r>
-        <w:t xml:space="preserve"> inputs obtains a grouped cross-validated R² of 0.9234, MAE of 0.0159, and RMSE of 0.0257. Adding physics-derived features produces only a small further change to R² = 0.9240 and MAE = 0.0155, with RMSE unchanged at 0.0257, so the simpler tuned model is retained. Performance is not equally dependable everywhere, however. Despite the input values falling within the numerical training ranges, held-out errors increase to roughly 0.08 BMF, or 8 percentage points, in the sparsely sampled 10</w:t>
-      </w:r>
-      <w:r>
-        <w:rPr>
-          <w:vertAlign w:val="superscript"/>
-        </w:rPr>
-        <w:t>19.5</w:t>
-      </w:r>
-      <w:r>
-        <w:t xml:space="preserve"> kg example. This demonstrates that being within the overall input range is insufficient for a reliable prediction; comparable SPH cases must also exist nearby in the sampled parameter space. Thus, ML can support rapid screening and simulation prioritisation, while sparse, edge, transition, or poorly supported cases still require additional SPH investigation.</w:t>
-      </w:r>
+        <w:t>Overall, the project shows that tidal-disruption outcomes depend on interacting physical conditions rather than one universal ranking of parameters. Machine learning makes the existing SPH archive faster to explore, shows where predictions are well supported, and highlights where new simulations would be most useful. It complements SPH rather than replacing the simulation physics.</w:t>
+      </w:r>
+    </w:p>
+    <w:p>
+      <w:pPr>
+        <w:pStyle w:val="Heading2"/>
+      </w:pPr>
+      <w:bookmarkStart w:id="55" w:name="_Toc238149751"/>
+      <w:bookmarkStart w:id="56" w:name="_Toc238392150"/>
+      <w:r>
+        <w:t>5.2 Limitations</w:t>
+      </w:r>
+      <w:bookmarkEnd w:id="55"/>
+      <w:bookmarkEnd w:id="56"/>
     </w:p>
     <w:p>
       <w:pPr>
@@ -5999,20 +6057,12 @@
         <w:jc w:val="both"/>
       </w:pPr>
       <w:r>
-        <w:t>Overall, the project shows that tidal-disruption outcomes depend on interacting physical conditions rather than one universal ranking of parameters. Machine learning makes the existing SPH archive faster to explore, shows where predictions are well supported, and highlights where new simulations would be most useful. It complements SPH rather than replacing the simulation physics.</w:t>
-      </w:r>
-    </w:p>
-    <w:p>
-      <w:pPr>
-        <w:pStyle w:val="Heading2"/>
-      </w:pPr>
-      <w:bookmarkStart w:id="55" w:name="_Toc238149751"/>
-      <w:bookmarkStart w:id="56" w:name="_Toc238392150"/>
-      <w:r>
-        <w:t>5.2 Limitations</w:t>
-      </w:r>
-      <w:bookmarkEnd w:id="55"/>
-      <w:bookmarkEnd w:id="56"/>
+        <w:t xml:space="preserve">The simulation archive's short size and uneven sampling are its primary drawbacks. A single SPH simulation can be analysed in multiple ways, hence many rows are not independent physical evidence. Although it is unable to produce missing simulations, group validation keeps the test score from becoming unduly optimistic. Even when each individual input value falls between its </w:t>
+      </w:r>
+      <w:r>
+        <w:lastRenderedPageBreak/>
+        <w:t>reported minimum and maximum, predictions are still unclear for combinations that are poorly sampled, close to the data's edges, or outside the combinations observed during training.</w:t>
+      </w:r>
     </w:p>
     <w:p>
       <w:pPr>
@@ -6020,7 +6070,7 @@
         <w:jc w:val="both"/>
       </w:pPr>
       <w:r>
-        <w:t>The simulation archive's short size and uneven sampling are its primary drawbacks. A single SPH simulation can be analysed in multiple ways, hence many rows are not independent physical evidence. Although it is unable to produce missing simulations, group validation keeps the test score from becoming unduly optimistic. Even when each individual input value falls between its reported minimum and maximum, predictions are still unclear for combinations that are poorly sampled, close to the data's edges, or outside the combinations observed during training.</w:t>
+        <w:t xml:space="preserve">Additionally, instead of solving the physical laws directly, the ML model learns patterns from SPH results. It does not follow the subsequent orbits of fragments and does not impose conservation of mass, momentum, energy, or angular momentum. Therefore, a reliable BMF prediction cannot determine whether debris accumulates into moons, forms a disk, or endures for a long time. Additionally, fragment measurements are more sensitive to the FoF connecting length employed in post-processing and are noisier than BMF. </w:t>
       </w:r>
     </w:p>
     <w:p>
@@ -6029,26 +6079,13 @@
         <w:jc w:val="both"/>
       </w:pPr>
       <w:r>
-        <w:t xml:space="preserve">Additionally, instead of solving the physical laws directly, the ML model learns patterns from SPH results. It does not follow the subsequent orbits of fragments and does not impose conservation of mass, momentum, energy, or angular momentum. Therefore, a reliable BMF prediction cannot determine whether debris accumulates into moons, forms a disk, or endures for a long time. Additionally, fragment measurements are more sensitive to the FoF connecting length employed in post-processing and are noisier than BMF. </w:t>
-      </w:r>
-    </w:p>
-    <w:p>
-      <w:pPr>
-        <w:spacing w:before="240" w:after="240" w:line="276" w:lineRule="auto"/>
-        <w:jc w:val="both"/>
-      </w:pPr>
-      <w:r>
         <w:t xml:space="preserve">Higher grouped-validation scores are obtained by exploratory XGBoost and hurdle models, but more testing is necessary before they can take the place of the primary </w:t>
       </w:r>
       <w:r>
         <w:t>Gradient Boosting</w:t>
       </w:r>
       <w:r>
-        <w:t xml:space="preserve">. Because </w:t>
-      </w:r>
-      <w:r>
-        <w:lastRenderedPageBreak/>
-        <w:t>outcome-derived quantities are not known prior to simulation, models that employ them are not appropriate for pre-SPH screening.</w:t>
+        <w:t>. Because outcome-derived quantities are not known prior to simulation, models that employ them are not appropriate for pre-SPH screening.</w:t>
       </w:r>
     </w:p>
     <w:p>
@@ -6169,6 +6206,7 @@
         <w:rPr>
           <w:color w:val="000000" w:themeColor="text1"/>
         </w:rPr>
+        <w:lastRenderedPageBreak/>
         <w:t>Canup, R. M. &amp; Salmon, J. (2018). Origin of Phobos and Deimos by the impact of a Vesta-to-Ceres sized body with Mars. Science Advances, 4(4), eaar6887. doi:10.1126/sciadv.aar6887.</w:t>
       </w:r>
     </w:p>
@@ -6233,7 +6271,6 @@
         <w:rPr>
           <w:color w:val="000000" w:themeColor="text1"/>
         </w:rPr>
-        <w:lastRenderedPageBreak/>
         <w:t>Friedman, J. H. (2001). Greedy function approximation: A gradient boosting machine. Annals of Statistics, 29(5), 1189-1232. doi:10.1214/aos/1013203451.</w:t>
       </w:r>
     </w:p>
@@ -6362,6 +6399,7 @@
         <w:rPr>
           <w:color w:val="000000" w:themeColor="text1"/>
         </w:rPr>
+        <w:lastRenderedPageBreak/>
         <w:t>Rosenblatt, P., Charnoz, S., Dunseath, K. M., Terao-Dunseath, M. &amp; Trinh, A. (2016). Accretion of Phobos and Deimos in an extended debris disc stirred by transient moons. Nature Geoscience, 9, 581-583. doi:10.1038/ngeo2742.</w:t>
       </w:r>
     </w:p>

</xml_diff>

<commit_message>
docs: revision on awkward wording & fixed values
</commit_message>
<xml_diff>
--- a/deliverables/nny124-final-report.docx
+++ b/deliverables/nny124-final-report.docx
@@ -348,7 +348,7 @@
         <w:pStyle w:val="Heading1"/>
       </w:pPr>
       <w:bookmarkStart w:id="0" w:name="_Toc238151068"/>
-      <w:bookmarkStart w:id="1" w:name="_Toc238392126"/>
+      <w:bookmarkStart w:id="1" w:name="_Toc238575667"/>
       <w:r>
         <w:lastRenderedPageBreak/>
         <w:t>Table of Contents</w:t>
@@ -396,7 +396,7 @@
           <w14:ligatures w14:val="standardContextual"/>
         </w:rPr>
       </w:pPr>
-      <w:hyperlink w:anchor="_Toc238392126" w:history="1">
+      <w:hyperlink w:anchor="_Toc238575667" w:history="1">
         <w:r>
           <w:rPr>
             <w:rStyle w:val="Hyperlink"/>
@@ -419,7 +419,7 @@
           <w:rPr>
             <w:webHidden/>
           </w:rPr>
-          <w:instrText xml:space="preserve"> PAGEREF _Toc238392126 \h </w:instrText>
+          <w:instrText xml:space="preserve"> PAGEREF _Toc238575667 \h </w:instrText>
         </w:r>
         <w:r>
           <w:rPr>
@@ -459,7 +459,7 @@
           <w14:ligatures w14:val="standardContextual"/>
         </w:rPr>
       </w:pPr>
-      <w:hyperlink w:anchor="_Toc238392127" w:history="1">
+      <w:hyperlink w:anchor="_Toc238575668" w:history="1">
         <w:r>
           <w:rPr>
             <w:rStyle w:val="Hyperlink"/>
@@ -482,7 +482,7 @@
           <w:rPr>
             <w:webHidden/>
           </w:rPr>
-          <w:instrText xml:space="preserve"> PAGEREF _Toc238392127 \h </w:instrText>
+          <w:instrText xml:space="preserve"> PAGEREF _Toc238575668 \h </w:instrText>
         </w:r>
         <w:r>
           <w:rPr>
@@ -522,7 +522,7 @@
           <w14:ligatures w14:val="standardContextual"/>
         </w:rPr>
       </w:pPr>
-      <w:hyperlink w:anchor="_Toc238392128" w:history="1">
+      <w:hyperlink w:anchor="_Toc238575669" w:history="1">
         <w:r>
           <w:rPr>
             <w:rStyle w:val="Hyperlink"/>
@@ -545,7 +545,7 @@
           <w:rPr>
             <w:webHidden/>
           </w:rPr>
-          <w:instrText xml:space="preserve"> PAGEREF _Toc238392128 \h </w:instrText>
+          <w:instrText xml:space="preserve"> PAGEREF _Toc238575669 \h </w:instrText>
         </w:r>
         <w:r>
           <w:rPr>
@@ -585,7 +585,7 @@
           <w14:ligatures w14:val="standardContextual"/>
         </w:rPr>
       </w:pPr>
-      <w:hyperlink w:anchor="_Toc238392129" w:history="1">
+      <w:hyperlink w:anchor="_Toc238575670" w:history="1">
         <w:r>
           <w:rPr>
             <w:rStyle w:val="Hyperlink"/>
@@ -608,7 +608,7 @@
           <w:rPr>
             <w:webHidden/>
           </w:rPr>
-          <w:instrText xml:space="preserve"> PAGEREF _Toc238392129 \h </w:instrText>
+          <w:instrText xml:space="preserve"> PAGEREF _Toc238575670 \h </w:instrText>
         </w:r>
         <w:r>
           <w:rPr>
@@ -648,7 +648,7 @@
           <w14:ligatures w14:val="standardContextual"/>
         </w:rPr>
       </w:pPr>
-      <w:hyperlink w:anchor="_Toc238392130" w:history="1">
+      <w:hyperlink w:anchor="_Toc238575671" w:history="1">
         <w:r>
           <w:rPr>
             <w:rStyle w:val="Hyperlink"/>
@@ -671,7 +671,7 @@
           <w:rPr>
             <w:webHidden/>
           </w:rPr>
-          <w:instrText xml:space="preserve"> PAGEREF _Toc238392130 \h </w:instrText>
+          <w:instrText xml:space="preserve"> PAGEREF _Toc238575671 \h </w:instrText>
         </w:r>
         <w:r>
           <w:rPr>
@@ -711,7 +711,7 @@
           <w14:ligatures w14:val="standardContextual"/>
         </w:rPr>
       </w:pPr>
-      <w:hyperlink w:anchor="_Toc238392131" w:history="1">
+      <w:hyperlink w:anchor="_Toc238575672" w:history="1">
         <w:r>
           <w:rPr>
             <w:rStyle w:val="Hyperlink"/>
@@ -734,7 +734,7 @@
           <w:rPr>
             <w:webHidden/>
           </w:rPr>
-          <w:instrText xml:space="preserve"> PAGEREF _Toc238392131 \h </w:instrText>
+          <w:instrText xml:space="preserve"> PAGEREF _Toc238575672 \h </w:instrText>
         </w:r>
         <w:r>
           <w:rPr>
@@ -774,7 +774,7 @@
           <w14:ligatures w14:val="standardContextual"/>
         </w:rPr>
       </w:pPr>
-      <w:hyperlink w:anchor="_Toc238392132" w:history="1">
+      <w:hyperlink w:anchor="_Toc238575673" w:history="1">
         <w:r>
           <w:rPr>
             <w:rStyle w:val="Hyperlink"/>
@@ -797,7 +797,7 @@
           <w:rPr>
             <w:webHidden/>
           </w:rPr>
-          <w:instrText xml:space="preserve"> PAGEREF _Toc238392132 \h </w:instrText>
+          <w:instrText xml:space="preserve"> PAGEREF _Toc238575673 \h </w:instrText>
         </w:r>
         <w:r>
           <w:rPr>
@@ -837,7 +837,7 @@
           <w14:ligatures w14:val="standardContextual"/>
         </w:rPr>
       </w:pPr>
-      <w:hyperlink w:anchor="_Toc238392133" w:history="1">
+      <w:hyperlink w:anchor="_Toc238575674" w:history="1">
         <w:r>
           <w:rPr>
             <w:rStyle w:val="Hyperlink"/>
@@ -860,7 +860,7 @@
           <w:rPr>
             <w:webHidden/>
           </w:rPr>
-          <w:instrText xml:space="preserve"> PAGEREF _Toc238392133 \h </w:instrText>
+          <w:instrText xml:space="preserve"> PAGEREF _Toc238575674 \h </w:instrText>
         </w:r>
         <w:r>
           <w:rPr>
@@ -900,7 +900,7 @@
           <w14:ligatures w14:val="standardContextual"/>
         </w:rPr>
       </w:pPr>
-      <w:hyperlink w:anchor="_Toc238392134" w:history="1">
+      <w:hyperlink w:anchor="_Toc238575675" w:history="1">
         <w:r>
           <w:rPr>
             <w:rStyle w:val="Hyperlink"/>
@@ -923,7 +923,7 @@
           <w:rPr>
             <w:webHidden/>
           </w:rPr>
-          <w:instrText xml:space="preserve"> PAGEREF _Toc238392134 \h </w:instrText>
+          <w:instrText xml:space="preserve"> PAGEREF _Toc238575675 \h </w:instrText>
         </w:r>
         <w:r>
           <w:rPr>
@@ -963,7 +963,7 @@
           <w14:ligatures w14:val="standardContextual"/>
         </w:rPr>
       </w:pPr>
-      <w:hyperlink w:anchor="_Toc238392135" w:history="1">
+      <w:hyperlink w:anchor="_Toc238575676" w:history="1">
         <w:r>
           <w:rPr>
             <w:rStyle w:val="Hyperlink"/>
@@ -986,7 +986,7 @@
           <w:rPr>
             <w:webHidden/>
           </w:rPr>
-          <w:instrText xml:space="preserve"> PAGEREF _Toc238392135 \h </w:instrText>
+          <w:instrText xml:space="preserve"> PAGEREF _Toc238575676 \h </w:instrText>
         </w:r>
         <w:r>
           <w:rPr>
@@ -1026,7 +1026,7 @@
           <w14:ligatures w14:val="standardContextual"/>
         </w:rPr>
       </w:pPr>
-      <w:hyperlink w:anchor="_Toc238392136" w:history="1">
+      <w:hyperlink w:anchor="_Toc238575677" w:history="1">
         <w:r>
           <w:rPr>
             <w:rStyle w:val="Hyperlink"/>
@@ -1049,7 +1049,7 @@
           <w:rPr>
             <w:webHidden/>
           </w:rPr>
-          <w:instrText xml:space="preserve"> PAGEREF _Toc238392136 \h </w:instrText>
+          <w:instrText xml:space="preserve"> PAGEREF _Toc238575677 \h </w:instrText>
         </w:r>
         <w:r>
           <w:rPr>
@@ -1089,7 +1089,7 @@
           <w14:ligatures w14:val="standardContextual"/>
         </w:rPr>
       </w:pPr>
-      <w:hyperlink w:anchor="_Toc238392137" w:history="1">
+      <w:hyperlink w:anchor="_Toc238575678" w:history="1">
         <w:r>
           <w:rPr>
             <w:rStyle w:val="Hyperlink"/>
@@ -1112,7 +1112,7 @@
           <w:rPr>
             <w:webHidden/>
           </w:rPr>
-          <w:instrText xml:space="preserve"> PAGEREF _Toc238392137 \h </w:instrText>
+          <w:instrText xml:space="preserve"> PAGEREF _Toc238575678 \h </w:instrText>
         </w:r>
         <w:r>
           <w:rPr>
@@ -1152,7 +1152,7 @@
           <w14:ligatures w14:val="standardContextual"/>
         </w:rPr>
       </w:pPr>
-      <w:hyperlink w:anchor="_Toc238392138" w:history="1">
+      <w:hyperlink w:anchor="_Toc238575679" w:history="1">
         <w:r>
           <w:rPr>
             <w:rStyle w:val="Hyperlink"/>
@@ -1175,7 +1175,7 @@
           <w:rPr>
             <w:webHidden/>
           </w:rPr>
-          <w:instrText xml:space="preserve"> PAGEREF _Toc238392138 \h </w:instrText>
+          <w:instrText xml:space="preserve"> PAGEREF _Toc238575679 \h </w:instrText>
         </w:r>
         <w:r>
           <w:rPr>
@@ -1215,7 +1215,7 @@
           <w14:ligatures w14:val="standardContextual"/>
         </w:rPr>
       </w:pPr>
-      <w:hyperlink w:anchor="_Toc238392139" w:history="1">
+      <w:hyperlink w:anchor="_Toc238575680" w:history="1">
         <w:r>
           <w:rPr>
             <w:rStyle w:val="Hyperlink"/>
@@ -1238,7 +1238,7 @@
           <w:rPr>
             <w:webHidden/>
           </w:rPr>
-          <w:instrText xml:space="preserve"> PAGEREF _Toc238392139 \h </w:instrText>
+          <w:instrText xml:space="preserve"> PAGEREF _Toc238575680 \h </w:instrText>
         </w:r>
         <w:r>
           <w:rPr>
@@ -1278,7 +1278,7 @@
           <w14:ligatures w14:val="standardContextual"/>
         </w:rPr>
       </w:pPr>
-      <w:hyperlink w:anchor="_Toc238392140" w:history="1">
+      <w:hyperlink w:anchor="_Toc238575681" w:history="1">
         <w:r>
           <w:rPr>
             <w:rStyle w:val="Hyperlink"/>
@@ -1301,7 +1301,7 @@
           <w:rPr>
             <w:webHidden/>
           </w:rPr>
-          <w:instrText xml:space="preserve"> PAGEREF _Toc238392140 \h </w:instrText>
+          <w:instrText xml:space="preserve"> PAGEREF _Toc238575681 \h </w:instrText>
         </w:r>
         <w:r>
           <w:rPr>
@@ -1341,7 +1341,7 @@
           <w14:ligatures w14:val="standardContextual"/>
         </w:rPr>
       </w:pPr>
-      <w:hyperlink w:anchor="_Toc238392141" w:history="1">
+      <w:hyperlink w:anchor="_Toc238575682" w:history="1">
         <w:r>
           <w:rPr>
             <w:rStyle w:val="Hyperlink"/>
@@ -1364,7 +1364,7 @@
           <w:rPr>
             <w:webHidden/>
           </w:rPr>
-          <w:instrText xml:space="preserve"> PAGEREF _Toc238392141 \h </w:instrText>
+          <w:instrText xml:space="preserve"> PAGEREF _Toc238575682 \h </w:instrText>
         </w:r>
         <w:r>
           <w:rPr>
@@ -1404,7 +1404,7 @@
           <w14:ligatures w14:val="standardContextual"/>
         </w:rPr>
       </w:pPr>
-      <w:hyperlink w:anchor="_Toc238392142" w:history="1">
+      <w:hyperlink w:anchor="_Toc238575683" w:history="1">
         <w:r>
           <w:rPr>
             <w:rStyle w:val="Hyperlink"/>
@@ -1427,7 +1427,7 @@
           <w:rPr>
             <w:webHidden/>
           </w:rPr>
-          <w:instrText xml:space="preserve"> PAGEREF _Toc238392142 \h </w:instrText>
+          <w:instrText xml:space="preserve"> PAGEREF _Toc238575683 \h </w:instrText>
         </w:r>
         <w:r>
           <w:rPr>
@@ -1467,7 +1467,7 @@
           <w14:ligatures w14:val="standardContextual"/>
         </w:rPr>
       </w:pPr>
-      <w:hyperlink w:anchor="_Toc238392143" w:history="1">
+      <w:hyperlink w:anchor="_Toc238575684" w:history="1">
         <w:r>
           <w:rPr>
             <w:rStyle w:val="Hyperlink"/>
@@ -1490,7 +1490,7 @@
           <w:rPr>
             <w:webHidden/>
           </w:rPr>
-          <w:instrText xml:space="preserve"> PAGEREF _Toc238392143 \h </w:instrText>
+          <w:instrText xml:space="preserve"> PAGEREF _Toc238575684 \h </w:instrText>
         </w:r>
         <w:r>
           <w:rPr>
@@ -1530,7 +1530,7 @@
           <w14:ligatures w14:val="standardContextual"/>
         </w:rPr>
       </w:pPr>
-      <w:hyperlink w:anchor="_Toc238392144" w:history="1">
+      <w:hyperlink w:anchor="_Toc238575685" w:history="1">
         <w:r>
           <w:rPr>
             <w:rStyle w:val="Hyperlink"/>
@@ -1553,7 +1553,7 @@
           <w:rPr>
             <w:webHidden/>
           </w:rPr>
-          <w:instrText xml:space="preserve"> PAGEREF _Toc238392144 \h </w:instrText>
+          <w:instrText xml:space="preserve"> PAGEREF _Toc238575685 \h </w:instrText>
         </w:r>
         <w:r>
           <w:rPr>
@@ -1593,7 +1593,7 @@
           <w14:ligatures w14:val="standardContextual"/>
         </w:rPr>
       </w:pPr>
-      <w:hyperlink w:anchor="_Toc238392145" w:history="1">
+      <w:hyperlink w:anchor="_Toc238575686" w:history="1">
         <w:r>
           <w:rPr>
             <w:rStyle w:val="Hyperlink"/>
@@ -1616,7 +1616,7 @@
           <w:rPr>
             <w:webHidden/>
           </w:rPr>
-          <w:instrText xml:space="preserve"> PAGEREF _Toc238392145 \h </w:instrText>
+          <w:instrText xml:space="preserve"> PAGEREF _Toc238575686 \h </w:instrText>
         </w:r>
         <w:r>
           <w:rPr>
@@ -1656,7 +1656,7 @@
           <w14:ligatures w14:val="standardContextual"/>
         </w:rPr>
       </w:pPr>
-      <w:hyperlink w:anchor="_Toc238392146" w:history="1">
+      <w:hyperlink w:anchor="_Toc238575687" w:history="1">
         <w:r>
           <w:rPr>
             <w:rStyle w:val="Hyperlink"/>
@@ -1679,7 +1679,7 @@
           <w:rPr>
             <w:webHidden/>
           </w:rPr>
-          <w:instrText xml:space="preserve"> PAGEREF _Toc238392146 \h </w:instrText>
+          <w:instrText xml:space="preserve"> PAGEREF _Toc238575687 \h </w:instrText>
         </w:r>
         <w:r>
           <w:rPr>
@@ -1696,7 +1696,7 @@
           <w:rPr>
             <w:webHidden/>
           </w:rPr>
-          <w:t>15</w:t>
+          <w:t>14</w:t>
         </w:r>
         <w:r>
           <w:rPr>
@@ -1719,7 +1719,7 @@
           <w14:ligatures w14:val="standardContextual"/>
         </w:rPr>
       </w:pPr>
-      <w:hyperlink w:anchor="_Toc238392147" w:history="1">
+      <w:hyperlink w:anchor="_Toc238575688" w:history="1">
         <w:r>
           <w:rPr>
             <w:rStyle w:val="Hyperlink"/>
@@ -1742,7 +1742,7 @@
           <w:rPr>
             <w:webHidden/>
           </w:rPr>
-          <w:instrText xml:space="preserve"> PAGEREF _Toc238392147 \h </w:instrText>
+          <w:instrText xml:space="preserve"> PAGEREF _Toc238575688 \h </w:instrText>
         </w:r>
         <w:r>
           <w:rPr>
@@ -1759,7 +1759,7 @@
           <w:rPr>
             <w:webHidden/>
           </w:rPr>
-          <w:t>15</w:t>
+          <w:t>14</w:t>
         </w:r>
         <w:r>
           <w:rPr>
@@ -1782,7 +1782,7 @@
           <w14:ligatures w14:val="standardContextual"/>
         </w:rPr>
       </w:pPr>
-      <w:hyperlink w:anchor="_Toc238392148" w:history="1">
+      <w:hyperlink w:anchor="_Toc238575689" w:history="1">
         <w:r>
           <w:rPr>
             <w:rStyle w:val="Hyperlink"/>
@@ -1805,7 +1805,7 @@
           <w:rPr>
             <w:webHidden/>
           </w:rPr>
-          <w:instrText xml:space="preserve"> PAGEREF _Toc238392148 \h </w:instrText>
+          <w:instrText xml:space="preserve"> PAGEREF _Toc238575689 \h </w:instrText>
         </w:r>
         <w:r>
           <w:rPr>
@@ -1822,7 +1822,7 @@
           <w:rPr>
             <w:webHidden/>
           </w:rPr>
-          <w:t>16</w:t>
+          <w:t>15</w:t>
         </w:r>
         <w:r>
           <w:rPr>
@@ -1845,7 +1845,7 @@
           <w14:ligatures w14:val="standardContextual"/>
         </w:rPr>
       </w:pPr>
-      <w:hyperlink w:anchor="_Toc238392149" w:history="1">
+      <w:hyperlink w:anchor="_Toc238575690" w:history="1">
         <w:r>
           <w:rPr>
             <w:rStyle w:val="Hyperlink"/>
@@ -1868,7 +1868,7 @@
           <w:rPr>
             <w:webHidden/>
           </w:rPr>
-          <w:instrText xml:space="preserve"> PAGEREF _Toc238392149 \h </w:instrText>
+          <w:instrText xml:space="preserve"> PAGEREF _Toc238575690 \h </w:instrText>
         </w:r>
         <w:r>
           <w:rPr>
@@ -1885,7 +1885,7 @@
           <w:rPr>
             <w:webHidden/>
           </w:rPr>
-          <w:t>16</w:t>
+          <w:t>15</w:t>
         </w:r>
         <w:r>
           <w:rPr>
@@ -1908,7 +1908,7 @@
           <w14:ligatures w14:val="standardContextual"/>
         </w:rPr>
       </w:pPr>
-      <w:hyperlink w:anchor="_Toc238392150" w:history="1">
+      <w:hyperlink w:anchor="_Toc238575691" w:history="1">
         <w:r>
           <w:rPr>
             <w:rStyle w:val="Hyperlink"/>
@@ -1931,7 +1931,7 @@
           <w:rPr>
             <w:webHidden/>
           </w:rPr>
-          <w:instrText xml:space="preserve"> PAGEREF _Toc238392150 \h </w:instrText>
+          <w:instrText xml:space="preserve"> PAGEREF _Toc238575691 \h </w:instrText>
         </w:r>
         <w:r>
           <w:rPr>
@@ -1948,7 +1948,7 @@
           <w:rPr>
             <w:webHidden/>
           </w:rPr>
-          <w:t>17</w:t>
+          <w:t>16</w:t>
         </w:r>
         <w:r>
           <w:rPr>
@@ -1971,7 +1971,7 @@
           <w14:ligatures w14:val="standardContextual"/>
         </w:rPr>
       </w:pPr>
-      <w:hyperlink w:anchor="_Toc238392151" w:history="1">
+      <w:hyperlink w:anchor="_Toc238575692" w:history="1">
         <w:r>
           <w:rPr>
             <w:rStyle w:val="Hyperlink"/>
@@ -1994,7 +1994,7 @@
           <w:rPr>
             <w:webHidden/>
           </w:rPr>
-          <w:instrText xml:space="preserve"> PAGEREF _Toc238392151 \h </w:instrText>
+          <w:instrText xml:space="preserve"> PAGEREF _Toc238575692 \h </w:instrText>
         </w:r>
         <w:r>
           <w:rPr>
@@ -2011,7 +2011,7 @@
           <w:rPr>
             <w:webHidden/>
           </w:rPr>
-          <w:t>18</w:t>
+          <w:t>17</w:t>
         </w:r>
         <w:r>
           <w:rPr>
@@ -2034,7 +2034,7 @@
           <w14:ligatures w14:val="standardContextual"/>
         </w:rPr>
       </w:pPr>
-      <w:hyperlink w:anchor="_Toc238392152" w:history="1">
+      <w:hyperlink w:anchor="_Toc238575693" w:history="1">
         <w:r>
           <w:rPr>
             <w:rStyle w:val="Hyperlink"/>
@@ -2057,7 +2057,7 @@
           <w:rPr>
             <w:webHidden/>
           </w:rPr>
-          <w:instrText xml:space="preserve"> PAGEREF _Toc238392152 \h </w:instrText>
+          <w:instrText xml:space="preserve"> PAGEREF _Toc238575693 \h </w:instrText>
         </w:r>
         <w:r>
           <w:rPr>
@@ -2074,7 +2074,7 @@
           <w:rPr>
             <w:webHidden/>
           </w:rPr>
-          <w:t>18</w:t>
+          <w:t>17</w:t>
         </w:r>
         <w:r>
           <w:rPr>
@@ -2097,7 +2097,7 @@
           <w14:ligatures w14:val="standardContextual"/>
         </w:rPr>
       </w:pPr>
-      <w:hyperlink w:anchor="_Toc238392153" w:history="1">
+      <w:hyperlink w:anchor="_Toc238575694" w:history="1">
         <w:r>
           <w:rPr>
             <w:rStyle w:val="Hyperlink"/>
@@ -2120,7 +2120,7 @@
           <w:rPr>
             <w:webHidden/>
           </w:rPr>
-          <w:instrText xml:space="preserve"> PAGEREF _Toc238392153 \h </w:instrText>
+          <w:instrText xml:space="preserve"> PAGEREF _Toc238575694 \h </w:instrText>
         </w:r>
         <w:r>
           <w:rPr>
@@ -2160,7 +2160,7 @@
           <w14:ligatures w14:val="standardContextual"/>
         </w:rPr>
       </w:pPr>
-      <w:hyperlink w:anchor="_Toc238392154" w:history="1">
+      <w:hyperlink w:anchor="_Toc238575695" w:history="1">
         <w:r>
           <w:rPr>
             <w:rStyle w:val="Hyperlink"/>
@@ -2183,7 +2183,7 @@
           <w:rPr>
             <w:webHidden/>
           </w:rPr>
-          <w:instrText xml:space="preserve"> PAGEREF _Toc238392154 \h </w:instrText>
+          <w:instrText xml:space="preserve"> PAGEREF _Toc238575695 \h </w:instrText>
         </w:r>
         <w:r>
           <w:rPr>
@@ -2229,7 +2229,7 @@
       <w:pPr>
         <w:pStyle w:val="Heading1"/>
       </w:pPr>
-      <w:bookmarkStart w:id="2" w:name="_Toc238392127"/>
+      <w:bookmarkStart w:id="2" w:name="_Toc238575668"/>
       <w:r>
         <w:lastRenderedPageBreak/>
         <w:t>List of Tables</w:t>
@@ -2243,7 +2243,7 @@
         <w:tabs>
           <w:tab w:val="right" w:leader="dot" w:pos="9350"/>
         </w:tabs>
-        <w:spacing w:after="240"/>
+        <w:spacing w:after="240" w:line="276" w:lineRule="auto"/>
         <w:jc w:val="both"/>
         <w:rPr>
           <w:rFonts w:asciiTheme="minorHAnsi" w:eastAsiaTheme="minorEastAsia" w:hAnsiTheme="minorHAnsi" w:cstheme="minorBidi"/>
@@ -2329,7 +2329,7 @@
         <w:tabs>
           <w:tab w:val="right" w:leader="dot" w:pos="9350"/>
         </w:tabs>
-        <w:spacing w:after="240"/>
+        <w:spacing w:after="240" w:line="276" w:lineRule="auto"/>
         <w:jc w:val="both"/>
         <w:rPr>
           <w:rFonts w:asciiTheme="minorHAnsi" w:eastAsiaTheme="minorEastAsia" w:hAnsiTheme="minorHAnsi" w:cstheme="minorBidi"/>
@@ -2414,7 +2414,7 @@
         </w:rPr>
         <w:fldChar w:fldCharType="end"/>
       </w:r>
-      <w:bookmarkStart w:id="4" w:name="_Toc238392128"/>
+      <w:bookmarkStart w:id="4" w:name="_Toc238575669"/>
       <w:r>
         <w:t>List of Figures</w:t>
       </w:r>
@@ -2426,7 +2426,7 @@
         <w:tabs>
           <w:tab w:val="right" w:leader="dot" w:pos="9350"/>
         </w:tabs>
-        <w:spacing w:after="240"/>
+        <w:spacing w:before="240" w:after="240" w:line="276" w:lineRule="auto"/>
         <w:jc w:val="both"/>
         <w:rPr>
           <w:rFonts w:asciiTheme="minorHAnsi" w:eastAsiaTheme="minorEastAsia" w:hAnsiTheme="minorHAnsi" w:cstheme="minorBidi"/>
@@ -2462,7 +2462,7 @@
         </w:rPr>
         <w:fldChar w:fldCharType="separate"/>
       </w:r>
-      <w:hyperlink w:anchor="_Toc238151303" w:history="1">
+      <w:hyperlink w:anchor="_Toc238575696" w:history="1">
         <w:r>
           <w:rPr>
             <w:rStyle w:val="Hyperlink"/>
@@ -2511,7 +2511,7 @@
           <w:rPr>
             <w:webHidden/>
           </w:rPr>
-          <w:instrText xml:space="preserve"> PAGEREF _Toc238151303 \h </w:instrText>
+          <w:instrText xml:space="preserve"> PAGEREF _Toc238575696 \h </w:instrText>
         </w:r>
         <w:r>
           <w:rPr>
@@ -2544,7 +2544,7 @@
         <w:tabs>
           <w:tab w:val="right" w:leader="dot" w:pos="9350"/>
         </w:tabs>
-        <w:spacing w:after="240"/>
+        <w:spacing w:before="240" w:after="240" w:line="276" w:lineRule="auto"/>
         <w:jc w:val="both"/>
         <w:rPr>
           <w:rFonts w:asciiTheme="minorHAnsi" w:eastAsiaTheme="minorEastAsia" w:hAnsiTheme="minorHAnsi" w:cstheme="minorBidi"/>
@@ -2553,24 +2553,12 @@
           <w14:ligatures w14:val="standardContextual"/>
         </w:rPr>
       </w:pPr>
-      <w:hyperlink w:anchor="_Toc238151304" w:history="1">
+      <w:hyperlink w:anchor="_Toc238575697" w:history="1">
         <w:r>
           <w:rPr>
             <w:rStyle w:val="Hyperlink"/>
           </w:rPr>
-          <w:t>Figure 2. Bound mass fraction versus encounter e</w:t>
-        </w:r>
-        <w:r>
-          <w:rPr>
-            <w:rStyle w:val="Hyperlink"/>
-          </w:rPr>
-          <w:t>c</w:t>
-        </w:r>
-        <w:r>
-          <w:rPr>
-            <w:rStyle w:val="Hyperlink"/>
-          </w:rPr>
-          <w:t>centricity proxy. Strong and non-zero retention quickly disappears as the encounter becomes more hyperbolic.</w:t>
+          <w:t>Figure 2. Bound mass fraction versus encounter eccentricity. Strong and non-zero retention quickly disappears as the encounter becomes more hyperbolic.</w:t>
         </w:r>
         <w:r>
           <w:rPr>
@@ -2588,7 +2576,7 @@
           <w:rPr>
             <w:webHidden/>
           </w:rPr>
-          <w:instrText xml:space="preserve"> PAGEREF _Toc238151304 \h </w:instrText>
+          <w:instrText xml:space="preserve"> PAGEREF _Toc238575697 \h </w:instrText>
         </w:r>
         <w:r>
           <w:rPr>
@@ -2621,7 +2609,7 @@
         <w:tabs>
           <w:tab w:val="right" w:leader="dot" w:pos="9350"/>
         </w:tabs>
-        <w:spacing w:after="240"/>
+        <w:spacing w:before="240" w:after="240" w:line="276" w:lineRule="auto"/>
         <w:jc w:val="both"/>
         <w:rPr>
           <w:rFonts w:asciiTheme="minorHAnsi" w:eastAsiaTheme="minorEastAsia" w:hAnsiTheme="minorHAnsi" w:cstheme="minorBidi"/>
@@ -2630,7 +2618,7 @@
           <w14:ligatures w14:val="standardContextual"/>
         </w:rPr>
       </w:pPr>
-      <w:hyperlink w:anchor="_Toc238151305" w:history="1">
+      <w:hyperlink w:anchor="_Toc238575698" w:history="1">
         <w:r>
           <w:rPr>
             <w:rStyle w:val="Hyperlink"/>
@@ -2653,7 +2641,7 @@
           <w:rPr>
             <w:webHidden/>
           </w:rPr>
-          <w:instrText xml:space="preserve"> PAGEREF _Toc238151305 \h </w:instrText>
+          <w:instrText xml:space="preserve"> PAGEREF _Toc238575698 \h </w:instrText>
         </w:r>
         <w:r>
           <w:rPr>
@@ -2686,7 +2674,7 @@
         <w:tabs>
           <w:tab w:val="right" w:leader="dot" w:pos="9350"/>
         </w:tabs>
-        <w:spacing w:after="240"/>
+        <w:spacing w:before="240" w:after="240" w:line="276" w:lineRule="auto"/>
         <w:jc w:val="both"/>
         <w:rPr>
           <w:rFonts w:asciiTheme="minorHAnsi" w:eastAsiaTheme="minorEastAsia" w:hAnsiTheme="minorHAnsi" w:cstheme="minorBidi"/>
@@ -2695,38 +2683,25 @@
           <w14:ligatures w14:val="standardContextual"/>
         </w:rPr>
       </w:pPr>
-      <w:hyperlink w:anchor="_Toc238151306" w:history="1">
+      <w:hyperlink w:anchor="_Toc238575699" w:history="1">
         <w:r>
           <w:rPr>
             <w:rStyle w:val="Hyperlink"/>
           </w:rPr>
-          <w:t>Figure 4. BMF differences within the matched A</w:t>
+          <w:t>Figure 4. BMF differences within the matched 10</w:t>
         </w:r>
         <w:r>
           <w:rPr>
             <w:rStyle w:val="Hyperlink"/>
-            <w:vertAlign w:val="subscript"/>
-          </w:rPr>
-          <w:t>2000</w:t>
+            <w:vertAlign w:val="superscript"/>
+          </w:rPr>
+          <w:t>20</w:t>
         </w:r>
         <w:r>
           <w:rPr>
             <w:rStyle w:val="Hyperlink"/>
           </w:rPr>
-          <w:t>, n</w:t>
-        </w:r>
-        <w:r>
-          <w:rPr>
-            <w:rStyle w:val="Hyperlink"/>
-            <w:vertAlign w:val="subscript"/>
-          </w:rPr>
-          <w:t>65</w:t>
-        </w:r>
-        <w:r>
-          <w:rPr>
-            <w:rStyle w:val="Hyperlink"/>
-          </w:rPr>
-          <w:t xml:space="preserve"> subset at timestep 90000 and FoF linking length 0.004. Left: BMF range across spin states with velocity fixed. Right: BMF range across velocities with spin fixed. These ranges show how strongly outcomes differ within this subset; they do not show direction or prove causation.</w:t>
+          <w:t xml:space="preserve"> kg. Left: BMF range across spin states with velocity fixed. Right: BMF range across velocities with spin fixed. These ranges show how strongly outcomes differ within this subset; they do not show direction or prove causation.</w:t>
         </w:r>
         <w:r>
           <w:rPr>
@@ -2744,7 +2719,7 @@
           <w:rPr>
             <w:webHidden/>
           </w:rPr>
-          <w:instrText xml:space="preserve"> PAGEREF _Toc238151306 \h </w:instrText>
+          <w:instrText xml:space="preserve"> PAGEREF _Toc238575699 \h </w:instrText>
         </w:r>
         <w:r>
           <w:rPr>
@@ -2777,7 +2752,7 @@
         <w:tabs>
           <w:tab w:val="right" w:leader="dot" w:pos="9350"/>
         </w:tabs>
-        <w:spacing w:after="240"/>
+        <w:spacing w:before="240" w:after="240" w:line="276" w:lineRule="auto"/>
         <w:jc w:val="both"/>
         <w:rPr>
           <w:rFonts w:asciiTheme="minorHAnsi" w:eastAsiaTheme="minorEastAsia" w:hAnsiTheme="minorHAnsi" w:cstheme="minorBidi"/>
@@ -2786,12 +2761,12 @@
           <w14:ligatures w14:val="standardContextual"/>
         </w:rPr>
       </w:pPr>
-      <w:hyperlink w:anchor="_Toc238151307" w:history="1">
+      <w:hyperlink w:anchor="_Toc238575700" w:history="1">
         <w:r>
           <w:rPr>
             <w:rStyle w:val="Hyperlink"/>
           </w:rPr>
-          <w:t>Figure 5. Checks used to judge prediction trust. (Top: the number of unique SPH simulations and the mean held-out absolute error provide different information. Bottom: pairwise coverage shows input combinations that are missing even when each individual value is within its sampled range.) Grey means no SPH data in that bin, light blue means SPH data exists, but the mean observed BMF is 0, while other coloured cells mean that SPH data exists and mean observed BMF is &gt; 0.</w:t>
+          <w:t>Figure 5. Coverage, held-out error, and observed BMF across the sampled parameter space. Panels (a,d) show unique physical SPH simulation counts, panels (b,e) show mean held-out absolute error, and panels (c,f) show mean observed BMF with unique simulation counts overlaid. Grey indicates no SPH data. In the observed-BMF panels, light blue indicates mean observed BMF = 0, while other colours indicate mean observed BMF &gt; 0.</w:t>
         </w:r>
         <w:r>
           <w:rPr>
@@ -2809,7 +2784,7 @@
           <w:rPr>
             <w:webHidden/>
           </w:rPr>
-          <w:instrText xml:space="preserve"> PAGEREF _Toc238151307 \h </w:instrText>
+          <w:instrText xml:space="preserve"> PAGEREF _Toc238575700 \h </w:instrText>
         </w:r>
         <w:r>
           <w:rPr>
@@ -2826,7 +2801,7 @@
           <w:rPr>
             <w:webHidden/>
           </w:rPr>
-          <w:t>14</w:t>
+          <w:t>13</w:t>
         </w:r>
         <w:r>
           <w:rPr>
@@ -2838,7 +2813,7 @@
     </w:p>
     <w:p>
       <w:pPr>
-        <w:spacing w:after="160" w:line="278" w:lineRule="auto"/>
+        <w:spacing w:before="240" w:after="240" w:line="276" w:lineRule="auto"/>
         <w:jc w:val="both"/>
         <w:rPr>
           <w:b/>
@@ -2900,134 +2875,33 @@
     </w:p>
     <w:p>
       <w:pPr>
-        <w:spacing w:line="276" w:lineRule="auto"/>
-        <w:jc w:val="both"/>
-        <w:rPr>
+        <w:pStyle w:val="Heading1"/>
+        <w:rPr>
+          <w:b w:val="0"/>
+          <w:bCs w:val="0"/>
           <w:i/>
           <w:iCs/>
           <w:sz w:val="20"/>
           <w:szCs w:val="20"/>
         </w:rPr>
       </w:pPr>
-      <w:r>
-        <w:rPr>
+      <w:bookmarkStart w:id="5" w:name="_Toc238149730"/>
+      <w:bookmarkStart w:id="6" w:name="_Toc238575670"/>
+      <w:r>
+        <w:rPr>
+          <w:b w:val="0"/>
+          <w:bCs w:val="0"/>
           <w:i/>
           <w:iCs/>
           <w:sz w:val="20"/>
           <w:szCs w:val="20"/>
         </w:rPr>
-        <w:t>One theory for the formation of Mars's moons, Phobos and Deimos, is that close collisions between asteroids and Mars can tidally damage the asteroid and leave some debris bonded to the planet. This process is thoroughly modelled by smoothed-particle hydrodynamics (SPH), but testing every possible combination of inputs is computationally costly. In this study, bound mass fraction (BMF) is predicted from the</w:t>
-      </w:r>
-      <w:r>
-        <w:rPr>
-          <w:i/>
-          <w:iCs/>
-          <w:sz w:val="20"/>
-          <w:szCs w:val="20"/>
-        </w:rPr>
-        <w:t xml:space="preserve"> sce</w:t>
-      </w:r>
-      <w:r>
-        <w:rPr>
-          <w:i/>
-          <w:iCs/>
-          <w:sz w:val="20"/>
-          <w:szCs w:val="20"/>
-        </w:rPr>
-        <w:t>n</w:t>
-      </w:r>
-      <w:r>
-        <w:rPr>
-          <w:i/>
-          <w:iCs/>
-          <w:sz w:val="20"/>
-          <w:szCs w:val="20"/>
-        </w:rPr>
-        <w:t>ario</w:t>
-      </w:r>
-      <w:r>
-        <w:rPr>
-          <w:i/>
-          <w:iCs/>
-          <w:sz w:val="20"/>
-          <w:szCs w:val="20"/>
-        </w:rPr>
-        <w:t xml:space="preserve"> inputs using machine learning models after SPH outputs are converted into fragmentation measurements.</w:t>
-      </w:r>
-      <w:r>
-        <w:rPr>
-          <w:i/>
-          <w:iCs/>
-          <w:sz w:val="20"/>
-          <w:szCs w:val="20"/>
-        </w:rPr>
-        <w:t xml:space="preserve"> </w:t>
-      </w:r>
-      <w:r>
-        <w:rPr>
-          <w:i/>
-          <w:iCs/>
-          <w:sz w:val="20"/>
-          <w:szCs w:val="20"/>
-        </w:rPr>
-        <w:t xml:space="preserve">The primary model, a tuned Gradient Boosting regressor using the original </w:t>
-      </w:r>
-      <w:r>
-        <w:rPr>
-          <w:i/>
-          <w:iCs/>
-          <w:sz w:val="20"/>
-          <w:szCs w:val="20"/>
-        </w:rPr>
-        <w:t>scenario</w:t>
-      </w:r>
-      <w:r>
-        <w:rPr>
-          <w:i/>
-          <w:iCs/>
-          <w:sz w:val="20"/>
-          <w:szCs w:val="20"/>
-        </w:rPr>
-        <w:t xml:space="preserve"> inputs, achieves a grouped cross-validated R² of 0.9234, MAE of 0.0159, and RMSE of 0.0257. </w:t>
-      </w:r>
-      <w:r>
-        <w:rPr>
-          <w:i/>
-          <w:iCs/>
-          <w:sz w:val="20"/>
-          <w:szCs w:val="20"/>
-        </w:rPr>
-        <w:t xml:space="preserve">Adding physics-derived features gives no meaningful extra improvement, so the simpler tuned raw-input model is retained. </w:t>
-      </w:r>
-      <w:r>
-        <w:rPr>
-          <w:i/>
-          <w:iCs/>
-          <w:sz w:val="20"/>
-          <w:szCs w:val="20"/>
-        </w:rPr>
-        <w:t xml:space="preserve">The models are assessed using grouped cross-validation. </w:t>
-      </w:r>
-      <w:r>
-        <w:rPr>
-          <w:i/>
-          <w:iCs/>
-          <w:sz w:val="20"/>
-          <w:szCs w:val="20"/>
-        </w:rPr>
-        <w:t xml:space="preserve">In a controlled set, predicted BMF generally decreases from roughly 0.27 at 1.2 Mars radii to approximately zero by about 2.5 Mars radii as periapsis increases. A similarly clear decline occurs as encounter speed increases, from roughly 0.25 at low velocity to approximately zero by about 1.2 km/s. While the impacts of spin and velocity depend on the encounter conditions, periapsis is the strongest overall physical input. As a result, distinct physical inputs may become more significant in different regions of the measured parameter range. </w:t>
-      </w:r>
-      <w:r>
-        <w:rPr>
-          <w:i/>
-          <w:iCs/>
-          <w:sz w:val="20"/>
-          <w:szCs w:val="20"/>
-        </w:rPr>
-        <w:t>Changes in spin in matched cases result in BMF discrepancies of up to 0.24 at bigger periapsis and between 0.06 and 0.09 below 1.5 Mars radii. Despite falling within the numerical training ranges, a sparsely sampled 10</w:t>
-      </w:r>
-      <w:r>
-        <w:rPr>
+        <w:t>One theory for the formation of Mars's moons, Phobos and Deimos, is that close encounters between asteroids and Mars can tidally disrupt the asteroid and leave some debris gravitationally bound to the planet. This process is thoroughly modelled by smoothed-particle hydrodynamics (SPH), but testing every possible combination of inputs is computationally costly. In this study, bound mass fraction (BMF) is predicted from the scenario inputs using machine learning models after SPH outputs are converted into post-processed outcome measurements. The primary model, a tuned Gradient Boosting regressor using the original scenario inputs, achieves a grouped cross-validated R² of 0.9328, MAE of 0.0277, and RMSE of 0.0400. Adding the tested physics-derived features does not improve the tuned Gradient Boosting model, so the simpler tuned raw-input model is retained. The models are assessed using grouped cross-validation. In a controlled set, predicted BMF generally decreases from roughly 0.48 at 1.2 Mars radii to roughly 0.12 at 3.0 Mars radii. A similarly clear decline occurs as encounter speed increases, from roughly 0.45 at low velocity to near zero by about 1.2-1.4 km/s. Overall, velocity has the strongest model dependence, followed by periapsis and spin, although their relative importance varies with encounter conditions. Matched comparisons further show that the effects of spin and velocity vary with the encounter conditions. Despite falling within the numerical training ranges, sparsely sampled 10</w:t>
+      </w:r>
+      <w:r>
+        <w:rPr>
+          <w:b w:val="0"/>
+          <w:bCs w:val="0"/>
           <w:i/>
           <w:iCs/>
           <w:sz w:val="20"/>
@@ -3038,20 +2912,42 @@
       </w:r>
       <w:r>
         <w:rPr>
+          <w:b w:val="0"/>
+          <w:bCs w:val="0"/>
           <w:i/>
           <w:iCs/>
           <w:sz w:val="20"/>
           <w:szCs w:val="20"/>
         </w:rPr>
-        <w:t xml:space="preserve"> kg instance yields held-out errors close to 0.08 BMF, demonstrating that being within the input range does not ensure a trustworthy prediction. Therefore, the model does not replace SPH or prove physical causality, but it is helpful for quickly screening well-supported encounter circumstances and highlighting parameter correlations that call for additional SPH research.</w:t>
+        <w:t xml:space="preserve"> kg cases yield held-out errors of up to </w:t>
+      </w:r>
+      <w:r>
+        <w:rPr>
+          <w:b w:val="0"/>
+          <w:bCs w:val="0"/>
+          <w:i/>
+          <w:iCs/>
+          <w:sz w:val="20"/>
+          <w:szCs w:val="20"/>
+        </w:rPr>
+        <w:t>3.9 percentage points</w:t>
+      </w:r>
+      <w:r>
+        <w:rPr>
+          <w:b w:val="0"/>
+          <w:bCs w:val="0"/>
+          <w:i/>
+          <w:iCs/>
+          <w:sz w:val="20"/>
+          <w:szCs w:val="20"/>
+        </w:rPr>
+        <w:t>, demonstrating that being within the input range does not ensure a trustworthy prediction. Therefore, the model does not replace SPH or prove physical causality, but it is helpful for quickly screening well-supported encounter scenarios and highlighting parameter relationships that call for additional SPH research.</w:t>
       </w:r>
     </w:p>
     <w:p>
       <w:pPr>
         <w:pStyle w:val="Heading1"/>
       </w:pPr>
-      <w:bookmarkStart w:id="5" w:name="_Toc238149730"/>
-      <w:bookmarkStart w:id="6" w:name="_Toc238392129"/>
       <w:r>
         <w:t>1. Introduction</w:t>
       </w:r>
@@ -3063,7 +2959,7 @@
         <w:pStyle w:val="Heading2"/>
       </w:pPr>
       <w:bookmarkStart w:id="7" w:name="_Toc238149731"/>
-      <w:bookmarkStart w:id="8" w:name="_Toc238392130"/>
+      <w:bookmarkStart w:id="8" w:name="_Toc238575671"/>
       <w:r>
         <w:t>1.1 Research Problem and Questions</w:t>
       </w:r>
@@ -3164,9 +3060,8 @@
       <w:pPr>
         <w:pStyle w:val="Heading2"/>
       </w:pPr>
-      <w:bookmarkStart w:id="10" w:name="_Toc238392131"/>
-      <w:r>
-        <w:lastRenderedPageBreak/>
+      <w:bookmarkStart w:id="10" w:name="_Toc238575672"/>
+      <w:r>
         <w:t>1.2 Significance and Originality</w:t>
       </w:r>
       <w:bookmarkEnd w:id="9"/>
@@ -3178,6 +3073,7 @@
         <w:jc w:val="both"/>
       </w:pPr>
       <w:r>
+        <w:lastRenderedPageBreak/>
         <w:t xml:space="preserve">The work </w:t>
       </w:r>
       <w:r>
@@ -3216,7 +3112,7 @@
         <w:pStyle w:val="Heading2"/>
       </w:pPr>
       <w:bookmarkStart w:id="11" w:name="_Toc238149733"/>
-      <w:bookmarkStart w:id="12" w:name="_Toc238392132"/>
+      <w:bookmarkStart w:id="12" w:name="_Toc238575673"/>
       <w:r>
         <w:t>1.3 Literature Review and Research Gaps</w:t>
       </w:r>
@@ -3280,14 +3176,17 @@
         <w:jc w:val="both"/>
       </w:pPr>
       <w:r>
+        <w:t>The particle-level SPH outputs are transformed into scalar outcomes through post-processing, creating a compact tabular dataset appropriate for machine learning</w:t>
+      </w:r>
+      <w:r>
+        <w:t xml:space="preserve"> (ML)</w:t>
+      </w:r>
+      <w:r>
+        <w:t xml:space="preserve">. Because tree-based models perform well with tiny, nonlinear tabular datasets, this makes the problem a good fit for </w:t>
+      </w:r>
+      <w:r>
         <w:lastRenderedPageBreak/>
-        <w:t>The particle-level SPH outputs are transformed into scalar outcomes through post-processing, creating a compact tabular dataset appropriate for machine learning</w:t>
-      </w:r>
-      <w:r>
-        <w:t xml:space="preserve"> (ML)</w:t>
-      </w:r>
-      <w:r>
-        <w:t>. Because tree-based models perform well with tiny, nonlinear tabular datasets, this makes the problem a good fit for machine learning (Grinsztajn et al., 2022). In the past, outcomes from comparable SPH collision and giant-impact simulations have also been predicted using tree-based ML surrogate models (Cambioni et al., 2019; Timpe et al., 2020). They are still not widely used for asteroid tidal-disruption encounters, though.</w:t>
+        <w:t>machine learning (Grinsztajn et al., 2022). In the past, outcomes from comparable SPH collision and giant-impact simulations have also been predicted using tree-based ML surrogate models (Cambioni et al., 2019; Timpe et al., 2020). They are still not widely used for asteroid tidal-disruption encounters, though.</w:t>
       </w:r>
     </w:p>
     <w:p>
@@ -3295,7 +3194,7 @@
         <w:pStyle w:val="Heading1"/>
       </w:pPr>
       <w:bookmarkStart w:id="13" w:name="_Toc238149734"/>
-      <w:bookmarkStart w:id="14" w:name="_Toc238392133"/>
+      <w:bookmarkStart w:id="14" w:name="_Toc238575674"/>
       <w:r>
         <w:t>2. Methodology</w:t>
       </w:r>
@@ -3307,7 +3206,7 @@
         <w:pStyle w:val="Heading2"/>
       </w:pPr>
       <w:bookmarkStart w:id="15" w:name="_Toc238149735"/>
-      <w:bookmarkStart w:id="16" w:name="_Toc238392134"/>
+      <w:bookmarkStart w:id="16" w:name="_Toc238575675"/>
       <w:r>
         <w:t>2.1 Data Archive, Inputs, and Post-Processing</w:t>
       </w:r>
@@ -3333,10 +3232,7 @@
         <w:t xml:space="preserve"> over 218 GB of </w:t>
       </w:r>
       <w:r>
-        <w:t xml:space="preserve">Hierarchical Data Format version 5 </w:t>
-      </w:r>
-      <w:r>
-        <w:t>(</w:t>
+        <w:t>Hierarchical Data Format version 5 (</w:t>
       </w:r>
       <w:r>
         <w:t>HDF5</w:t>
@@ -3360,13 +3256,31 @@
         <w:t xml:space="preserve">/model target </w:t>
       </w:r>
       <w:r>
-        <w:t xml:space="preserve">in this project is the bound mass fraction, represented by fbound​, which is the fraction of the original asteroid mass that remains </w:t>
+        <w:t>in this project is the</w:t>
+      </w:r>
+      <w:r>
+        <w:t xml:space="preserve"> Bound Mass Fraction (BMF), also commonly represented as </w:t>
+      </w:r>
+      <w:r>
+        <w:t>f</w:t>
+      </w:r>
+      <w:r>
+        <w:rPr>
+          <w:vertAlign w:val="subscript"/>
+        </w:rPr>
+        <w:t>bound</w:t>
+      </w:r>
+      <w:r>
+        <w:t xml:space="preserve">​, which is the fraction of the original asteroid mass that remains </w:t>
       </w:r>
       <w:r>
         <w:t>gravitationally</w:t>
       </w:r>
       <w:r>
-        <w:t xml:space="preserve"> bound to Mars after the encounter, this will be referred to as BMF throughout this report. </w:t>
+        <w:t xml:space="preserve"> bound to Mars after the encounter</w:t>
+      </w:r>
+      <w:r>
+        <w:t>.</w:t>
       </w:r>
     </w:p>
     <w:p>
@@ -3566,13 +3480,7 @@
               <w:rPr>
                 <w:vertAlign w:val="superscript"/>
               </w:rPr>
-              <w:t>18</w:t>
-            </w:r>
-            <w:r>
-              <w:rPr>
-                <w:vertAlign w:val="superscript"/>
-              </w:rPr>
-              <w:t xml:space="preserve"> </w:t>
+              <w:t xml:space="preserve">18 </w:t>
             </w:r>
             <w:r>
               <w:t>to 1</w:t>
@@ -3767,21 +3675,24 @@
               <w:jc w:val="both"/>
             </w:pPr>
             <w:r>
+              <w:t>Spin</w:t>
+            </w:r>
+          </w:p>
+        </w:tc>
+        <w:tc>
+          <w:tcPr>
+            <w:tcW w:w="1890" w:type="dxa"/>
+          </w:tcPr>
+          <w:p>
+            <w:pPr>
+              <w:spacing w:before="240" w:after="240" w:line="276" w:lineRule="auto"/>
+            </w:pPr>
+            <w:r>
+              <w:t xml:space="preserve">No spin; equatorial x- or y-axis spin; prograde z-axis spin; retrograde </w:t>
+            </w:r>
+            <w:r>
               <w:lastRenderedPageBreak/>
-              <w:t>Spin</w:t>
-            </w:r>
-          </w:p>
-        </w:tc>
-        <w:tc>
-          <w:tcPr>
-            <w:tcW w:w="1890" w:type="dxa"/>
-          </w:tcPr>
-          <w:p>
-            <w:pPr>
-              <w:spacing w:before="240" w:after="240" w:line="276" w:lineRule="auto"/>
-            </w:pPr>
-            <w:r>
-              <w:t>No spin; equatorial x- or y-axis spin; prograde z-axis spin; retrograde z-axis spin; unevenly sampled</w:t>
+              <w:t>z-axis spin; unevenly sampled</w:t>
             </w:r>
           </w:p>
         </w:tc>
@@ -3795,6 +3706,7 @@
               <w:jc w:val="both"/>
             </w:pPr>
             <w:r>
+              <w:lastRenderedPageBreak/>
               <w:t>Rotation state of the asteroid. Spin can alter the disruption and bound-retention outcome, and the available spin states are unevenly sampled.</w:t>
             </w:r>
           </w:p>
@@ -3824,10 +3736,7 @@
               <w:spacing w:before="240" w:after="240" w:line="276" w:lineRule="auto"/>
             </w:pPr>
             <w:r>
-              <w:t>Approximately</w:t>
-            </w:r>
-            <w:r>
-              <w:t xml:space="preserve"> </w:t>
+              <w:t xml:space="preserve">Approximately </w:t>
             </w:r>
             <w:r>
               <w:t>10</w:t>
@@ -3945,70 +3854,10 @@
         <w:jc w:val="both"/>
       </w:pPr>
       <w:r>
-        <w:t xml:space="preserve">How the post-processing works is that FoF first groups nearby debris particles into fragments. </w:t>
-      </w:r>
-      <w:r>
-        <w:t xml:space="preserve">The mass of each group g is equal to the sum of the particle masses, </w:t>
-      </w:r>
-      <w:r>
-        <w:t>Mg = Σ</w:t>
-      </w:r>
-      <w:r>
-        <w:rPr>
-          <w:vertAlign w:val="subscript"/>
-        </w:rPr>
-        <w:t>i</w:t>
-      </w:r>
-      <w:r>
-        <w:t>m</w:t>
-      </w:r>
-      <w:r>
-        <w:rPr>
-          <w:vertAlign w:val="subscript"/>
-        </w:rPr>
-        <w:t>i</w:t>
-      </w:r>
-      <w:r>
-        <w:t xml:space="preserve">. </w:t>
-      </w:r>
-      <w:r>
-        <w:t xml:space="preserve">The group's particular orbital energy with respect to Mars is then determined using its centre-of-mass position and velocity. </w:t>
-      </w:r>
-      <w:r>
-        <w:t>A group is bound when ε</w:t>
-      </w:r>
-      <w:r>
-        <w:rPr>
-          <w:vertAlign w:val="subscript"/>
-        </w:rPr>
-        <w:t>g</w:t>
-      </w:r>
-      <w:r>
-        <w:t xml:space="preserve"> &lt; 0 and unbound when ε</w:t>
-      </w:r>
-      <w:r>
-        <w:rPr>
-          <w:vertAlign w:val="subscript"/>
-        </w:rPr>
-        <w:t>g</w:t>
-      </w:r>
-      <w:r>
-        <w:t xml:space="preserve"> ≥ 0.</w:t>
-      </w:r>
-      <w:r>
-        <w:t xml:space="preserve"> </w:t>
-      </w:r>
-      <w:r>
-        <w:t xml:space="preserve">The bound percentage compared to all fragments is the Bound Mass Fraction (BMF). </w:t>
-      </w:r>
-      <w:r>
-        <w:t xml:space="preserve">It's also crucial to remember that </w:t>
-      </w:r>
-      <w:r>
-        <w:t>this</w:t>
-      </w:r>
-      <w:r>
-        <w:t xml:space="preserve"> does not yet determine later disk or moon development, it merely measures gravitational retention.</w:t>
+        <w:t xml:space="preserve">How the post-processing works is that </w:t>
+      </w:r>
+      <w:r>
+        <w:t>FoF first groups nearby debris particles into resolved fragments, whose orbital properties can be analysed using their centre-of-mass positions and velocities. The bound-mass calculation additionally includes debris that is not assigned to a resolved FoF fragment, and BMF is measured relative to the original asteroid mass.</w:t>
       </w:r>
     </w:p>
     <w:p>
@@ -4016,7 +3865,7 @@
         <w:pStyle w:val="Heading2"/>
       </w:pPr>
       <w:bookmarkStart w:id="18" w:name="_Toc238149736"/>
-      <w:bookmarkStart w:id="19" w:name="_Toc238392135"/>
+      <w:bookmarkStart w:id="19" w:name="_Toc238575676"/>
       <w:r>
         <w:t>2.2 Prediction Model Choices and Rationale</w:t>
       </w:r>
@@ -4038,11 +3887,7 @@
         <w:jc w:val="both"/>
       </w:pPr>
       <w:r>
-        <w:t xml:space="preserve">For the prediction tasks, several baseline models were used. Logistic Regression models the probability of a case belonging to one of two classes from the input features, so it is used as a simple baseline for the BMF ≥ 10% classification task (Knauer et al., 2024). Random Forest </w:t>
-      </w:r>
-      <w:r>
-        <w:lastRenderedPageBreak/>
-        <w:t>combines many decision trees fitted to different samples of the data and averages their predictions, allowing it to capture nonlinear relationships while reducing sensitivity to individual cases (Breiman, 2001; Cambioni et al., 2019). Gradient Boosting also combines decision trees, but builds them sequentially so that each new tree reduces errors left by the previous trees. This can capture more detailed changes between encounter settings (Friedman, 2001; Valencia et al., 2019; Timpe et al., 2020).</w:t>
+        <w:t>For the prediction tasks, several baseline models were used. Logistic Regression models the probability of a case belonging to one of two classes from the input features, so it is used as a simple baseline for the BMF ≥ 10% classification task (Knauer et al., 2024). Random Forest combines many decision trees fitted to different samples of the data and averages their predictions, allowing it to capture nonlinear relationships while reducing sensitivity to individual cases (Breiman, 2001; Cambioni et al., 2019). Gradient Boosting also combines decision trees, but builds them sequentially so that each new tree reduces errors left by the previous trees. This can capture more detailed changes between encounter settings (Friedman, 2001; Valencia et al., 2019; Timpe et al., 2020).</w:t>
       </w:r>
     </w:p>
     <w:p>
@@ -4051,6 +3896,7 @@
         <w:jc w:val="both"/>
       </w:pPr>
       <w:r>
+        <w:lastRenderedPageBreak/>
         <w:t>To determine whether prediction performance could be improved beyond the baseline models, Gradient Boosting hyperparameters were tuned and physics-derived attributes calculated from the original s</w:t>
       </w:r>
       <w:r>
@@ -4071,7 +3917,7 @@
         <w:pStyle w:val="Heading2"/>
       </w:pPr>
       <w:bookmarkStart w:id="20" w:name="_Toc238149737"/>
-      <w:bookmarkStart w:id="21" w:name="_Toc238392136"/>
+      <w:bookmarkStart w:id="21" w:name="_Toc238575677"/>
       <w:r>
         <w:t>2.3 Model Testing and Performance Metrics</w:t>
       </w:r>
@@ -4110,7 +3956,7 @@
         <w:pStyle w:val="Heading2"/>
       </w:pPr>
       <w:bookmarkStart w:id="22" w:name="_Toc238149738"/>
-      <w:bookmarkStart w:id="23" w:name="_Toc238392137"/>
+      <w:bookmarkStart w:id="23" w:name="_Toc238575678"/>
       <w:r>
         <w:t>2.4 How the Physical Effects Were Analysed</w:t>
       </w:r>
@@ -4143,7 +3989,7 @@
         <w:pStyle w:val="Heading2"/>
       </w:pPr>
       <w:bookmarkStart w:id="24" w:name="_Toc238149739"/>
-      <w:bookmarkStart w:id="25" w:name="_Toc238392138"/>
+      <w:bookmarkStart w:id="25" w:name="_Toc238575679"/>
       <w:r>
         <w:t>2.5 When to Trust the Model</w:t>
       </w:r>
@@ -4156,7 +4002,6 @@
         <w:jc w:val="both"/>
       </w:pPr>
       <w:r>
-        <w:lastRenderedPageBreak/>
         <w:t>The method also determines whether a new setup is comparable to SPH simulations that are already in the archive because model accuracy alone cannot demonstrate the reliability of each individual forecast because an overall score can conceal areas where the model has insufficient data or produces larger errors. When there are multiple independent SPH simulations and a low held-out prediction error in the surrounding area, predictions are more reliable. When the input combination is outside the sampled region, close to the edge of the available data, or poorly sampled, predictions are deemed less accurate. Figure 5 and section 3.6 provide an analysis of these inspections.</w:t>
       </w:r>
     </w:p>
@@ -4166,6 +4011,7 @@
         <w:jc w:val="both"/>
       </w:pPr>
       <w:r>
+        <w:lastRenderedPageBreak/>
         <w:t>The final decision then separates two questions: (1) how strongly the asteroid breaks up, and (2) how much material remains bound to Mars. Breakup is described by the largest-remnant fraction f</w:t>
       </w:r>
       <w:r>
@@ -4219,7 +4065,7 @@
       <w:pPr>
         <w:pStyle w:val="Heading1"/>
       </w:pPr>
-      <w:bookmarkStart w:id="27" w:name="_Toc238392139"/>
+      <w:bookmarkStart w:id="27" w:name="_Toc238575680"/>
       <w:r>
         <w:t>3. Results</w:t>
       </w:r>
@@ -4231,7 +4077,7 @@
         <w:pStyle w:val="Heading2"/>
       </w:pPr>
       <w:bookmarkStart w:id="28" w:name="_Toc238149741"/>
-      <w:bookmarkStart w:id="29" w:name="_Toc238392140"/>
+      <w:bookmarkStart w:id="29" w:name="_Toc238575681"/>
       <w:r>
         <w:t>3.1 Exploratory Physical Trends</w:t>
       </w:r>
@@ -4245,14 +4091,11 @@
         <w:jc w:val="center"/>
       </w:pPr>
       <w:r>
-        <w:rPr>
-          <w:lang w:val="en-US"/>
-        </w:rPr>
         <w:drawing>
-          <wp:inline distT="0" distB="0" distL="0" distR="0" wp14:anchorId="3D017574" wp14:editId="21BA2965">
-            <wp:extent cx="4944985" cy="3678621"/>
-            <wp:effectExtent l="0" t="0" r="0" b="4445"/>
-            <wp:docPr id="589236429" name="Picture 1"/>
+          <wp:inline distT="0" distB="0" distL="0" distR="0" wp14:anchorId="464F9462" wp14:editId="7CAF254D">
+            <wp:extent cx="5012750" cy="3729037"/>
+            <wp:effectExtent l="0" t="0" r="3810" b="5080"/>
+            <wp:docPr id="64437880" name="Picture 1"/>
             <wp:cNvGraphicFramePr>
               <a:graphicFrameLocks xmlns:a="http://schemas.openxmlformats.org/drawingml/2006/main" noChangeAspect="1"/>
             </wp:cNvGraphicFramePr>
@@ -4260,7 +4103,7 @@
               <a:graphicData uri="http://schemas.openxmlformats.org/drawingml/2006/picture">
                 <pic:pic xmlns:pic="http://schemas.openxmlformats.org/drawingml/2006/picture">
                   <pic:nvPicPr>
-                    <pic:cNvPr id="589236429" name=""/>
+                    <pic:cNvPr id="64437880" name=""/>
                     <pic:cNvPicPr/>
                   </pic:nvPicPr>
                   <pic:blipFill>
@@ -4272,7 +4115,7 @@
                   <pic:spPr>
                     <a:xfrm>
                       <a:off x="0" y="0"/>
-                      <a:ext cx="5189847" cy="3860776"/>
+                      <a:ext cx="5074066" cy="3774651"/>
                     </a:xfrm>
                     <a:prstGeom prst="rect">
                       <a:avLst/>
@@ -4294,7 +4137,7 @@
           <w:szCs w:val="20"/>
         </w:rPr>
       </w:pPr>
-      <w:bookmarkStart w:id="30" w:name="_Toc238151303"/>
+      <w:bookmarkStart w:id="30" w:name="_Toc238575696"/>
       <w:r>
         <w:rPr>
           <w:sz w:val="20"/>
@@ -4342,7 +4185,21 @@
           <w:sz w:val="20"/>
           <w:szCs w:val="20"/>
         </w:rPr>
-        <w:t>. Exploratory SPH trends and mass-dependent bound-retention regimes. (a) Fragment count versus periapsis. (b) BMF across all sampled encounter conditions. (c-d) The same BMF results separated into 10</w:t>
+        <w:t xml:space="preserve">. Exploratory SPH trends and mass-dependent bound-retention regimes. (a) Fragment count versus periapsis. (b) BMF across all sampled encounter conditions. (c-d) </w:t>
+      </w:r>
+      <w:r>
+        <w:rPr>
+          <w:sz w:val="20"/>
+          <w:szCs w:val="20"/>
+        </w:rPr>
+        <w:t xml:space="preserve">BMF results for the </w:t>
+      </w:r>
+      <w:r>
+        <w:rPr>
+          <w:sz w:val="20"/>
+          <w:szCs w:val="20"/>
+        </w:rPr>
+        <w:t>10</w:t>
       </w:r>
       <w:r>
         <w:rPr>
@@ -4379,7 +4236,21 @@
           <w:sz w:val="20"/>
           <w:szCs w:val="20"/>
         </w:rPr>
-        <w:t xml:space="preserve"> kg asteroid-mass groups, showing that the combined scatter includes distinct retention regimes.</w:t>
+        <w:t xml:space="preserve"> k</w:t>
+      </w:r>
+      <w:r>
+        <w:rPr>
+          <w:sz w:val="20"/>
+          <w:szCs w:val="20"/>
+        </w:rPr>
+        <w:t>g asteroid-mass groups</w:t>
+      </w:r>
+      <w:r>
+        <w:rPr>
+          <w:sz w:val="20"/>
+          <w:szCs w:val="20"/>
+        </w:rPr>
+        <w:t>, showing that the combined scatter includes distinct retention regimes.</w:t>
       </w:r>
       <w:bookmarkEnd w:id="30"/>
     </w:p>
@@ -4389,8 +4260,10 @@
         <w:jc w:val="both"/>
       </w:pPr>
       <w:r>
-        <w:lastRenderedPageBreak/>
-        <w:t xml:space="preserve">Although close interactions do not always result in strong fragmentation or high BMF, Figure 1 illustrates that both fragmentation and bound retention typically decrease as periapsis increases. The mean BMF rises with tiny periapsis and falls with increasing encounter speed. The relative impacts also vary throughout the sampling range: separation between spin states becomes more apparent around 1.7-2.0 Mars radii, whereas velocity differences are more noticeable at roughly 1.1-1.6 Mars radii. The region is too rarely sampled to draw firm conclusions, but one prograde-spin case maintains roughly 3-4% BMF at 2.6 Mars radii whereas the other sampled cases are close to zero. </w:t>
+        <w:t xml:space="preserve">Although close interactions do not always result in strong fragmentation or high BMF, Figure 1 illustrates that both fragmentation and bound retention typically decrease as periapsis increases. The mean BMF rises with tiny periapsis and falls with increasing encounter speed. The relative impacts also vary throughout the sampling range: separation between spin states becomes more apparent around 1.7-2.0 Mars radii, whereas velocity differences are more noticeable at roughly 1.1-1.6 Mars radii. </w:t>
+      </w:r>
+      <w:r>
+        <w:t>Some prograde-spin cases retain non-zero BMF to larger periapsis, although these regions are more sparsely sampled.</w:t>
       </w:r>
     </w:p>
     <w:p>
@@ -4399,6 +4272,7 @@
         <w:jc w:val="both"/>
       </w:pPr>
       <w:r>
+        <w:lastRenderedPageBreak/>
         <w:t>The combined BMF graph is highly irregular because it has simulations from different asteroid-mass regimes, and separating the mass cases shows that this apparent scatter shows that the bound mass is regime-depend</w:t>
       </w:r>
       <w:r>
@@ -4467,7 +4341,7 @@
         <w:pStyle w:val="Heading2"/>
       </w:pPr>
       <w:bookmarkStart w:id="31" w:name="_Toc238149742"/>
-      <w:bookmarkStart w:id="32" w:name="_Toc238392141"/>
+      <w:bookmarkStart w:id="32" w:name="_Toc238575682"/>
       <w:r>
         <w:t>3.2 Eccentricity and Bound Retention</w:t>
       </w:r>
@@ -4507,16 +4381,18 @@
       <w:r>
         <w:lastRenderedPageBreak/>
         <w:drawing>
-          <wp:inline distT="0" distB="0" distL="114300" distR="114300" wp14:anchorId="485CF5A0" wp14:editId="5089B1D2">
-            <wp:extent cx="3363310" cy="2123090"/>
-            <wp:effectExtent l="0" t="0" r="2540" b="0"/>
-            <wp:docPr id="5" name="image1.png"/>
-            <wp:cNvGraphicFramePr/>
+          <wp:inline distT="0" distB="0" distL="0" distR="0" wp14:anchorId="3675A28B" wp14:editId="4E9415DE">
+            <wp:extent cx="3915084" cy="2714625"/>
+            <wp:effectExtent l="0" t="0" r="0" b="3175"/>
+            <wp:docPr id="126477854" name="Picture 1"/>
+            <wp:cNvGraphicFramePr>
+              <a:graphicFrameLocks xmlns:a="http://schemas.openxmlformats.org/drawingml/2006/main" noChangeAspect="1"/>
+            </wp:cNvGraphicFramePr>
             <a:graphic xmlns:a="http://schemas.openxmlformats.org/drawingml/2006/main">
               <a:graphicData uri="http://schemas.openxmlformats.org/drawingml/2006/picture">
                 <pic:pic xmlns:pic="http://schemas.openxmlformats.org/drawingml/2006/picture">
                   <pic:nvPicPr>
-                    <pic:cNvPr id="5" name="image1.png"/>
+                    <pic:cNvPr id="126477854" name=""/>
                     <pic:cNvPicPr/>
                   </pic:nvPicPr>
                   <pic:blipFill>
@@ -4528,7 +4404,7 @@
                   <pic:spPr>
                     <a:xfrm>
                       <a:off x="0" y="0"/>
-                      <a:ext cx="3457135" cy="2182317"/>
+                      <a:ext cx="3941702" cy="2733081"/>
                     </a:xfrm>
                     <a:prstGeom prst="rect">
                       <a:avLst/>
@@ -4550,7 +4426,7 @@
           <w:szCs w:val="24"/>
         </w:rPr>
       </w:pPr>
-      <w:bookmarkStart w:id="33" w:name="_Toc238151304"/>
+      <w:bookmarkStart w:id="33" w:name="_Toc238575697"/>
       <w:r>
         <w:t xml:space="preserve">Figure </w:t>
       </w:r>
@@ -4588,7 +4464,7 @@
         <w:pStyle w:val="Heading2"/>
       </w:pPr>
       <w:bookmarkStart w:id="34" w:name="_Toc238149743"/>
-      <w:bookmarkStart w:id="35" w:name="_Toc238392142"/>
+      <w:bookmarkStart w:id="35" w:name="_Toc238575683"/>
       <w:r>
         <w:t>3.3 Model Performance and Screening Use</w:t>
       </w:r>
@@ -4645,7 +4521,7 @@
         <w:pStyle w:val="Heading2"/>
       </w:pPr>
       <w:bookmarkStart w:id="36" w:name="_Toc238149744"/>
-      <w:bookmarkStart w:id="37" w:name="_Toc238392143"/>
+      <w:bookmarkStart w:id="37" w:name="_Toc238575684"/>
       <w:commentRangeStart w:id="38"/>
       <w:r>
         <w:t>3.4 Overall Physical Parameter Importance</w:t>
@@ -4668,7 +4544,47 @@
         <w:jc w:val="both"/>
       </w:pPr>
       <w:r>
-        <w:t xml:space="preserve">The input-removal test yields the most understandable overall result. The amount of predictive information lost is indicated by the decrease in R² when each original physical input is removed from the tuned Gradient Boosting model. Removing periapsis causes the biggest drop (ΔR² = -0.574). Removing spin gives ΔR² = -0.316, and removing velocity gives ΔR² = -0.296. The overall effect of asteroid mass is smaller and less reliable. These values are separate ablation experiments and should not be added together. They display the degree to which the model depends on each input, not whether increasing that input directly raises or lowers BMF. Periapsis is the strongest overall, followed by spin and velocity, although this order may vary locally. </w:t>
+        <w:t xml:space="preserve">The input-removal test yields the most understandable overall result. The amount of predictive information lost is indicated by the decrease in R² when each original physical input is removed from the tuned Gradient Boosting model. Removing </w:t>
+      </w:r>
+      <w:r>
+        <w:t>velocity</w:t>
+      </w:r>
+      <w:r>
+        <w:t xml:space="preserve"> causes the biggest drop (ΔR² = -0.5</w:t>
+      </w:r>
+      <w:r>
+        <w:t>08</w:t>
+      </w:r>
+      <w:r>
+        <w:t xml:space="preserve">). Removing </w:t>
+      </w:r>
+      <w:r>
+        <w:t>periapsis</w:t>
+      </w:r>
+      <w:r>
+        <w:t xml:space="preserve"> gives ΔR² = -0.</w:t>
+      </w:r>
+      <w:r>
+        <w:t>466</w:t>
+      </w:r>
+      <w:r>
+        <w:t xml:space="preserve">, and removing </w:t>
+      </w:r>
+      <w:r>
+        <w:t>spin</w:t>
+      </w:r>
+      <w:r>
+        <w:t xml:space="preserve"> gives ΔR² = -0.</w:t>
+      </w:r>
+      <w:r>
+        <w:t>246</w:t>
+      </w:r>
+      <w:r>
+        <w:t xml:space="preserve"> The overall effect of asteroid mass is smaller and less reliable. These values are separate ablation experiments and should not be added together. They display the degree to which the model depends on each </w:t>
+      </w:r>
+      <w:r>
+        <w:lastRenderedPageBreak/>
+        <w:t xml:space="preserve">input, not whether increasing that input directly raises or lowers BMF. Periapsis is the strongest overall, followed by spin and velocity, although this order may vary locally. </w:t>
       </w:r>
     </w:p>
     <w:p>
@@ -4677,7 +4593,6 @@
         <w:jc w:val="both"/>
       </w:pPr>
       <w:r>
-        <w:lastRenderedPageBreak/>
         <w:t>A different response is required for fragmentation. The most extreme fragmentation in the SPH data requires very small periapsis, yet a close encounter does not ensure significant breakdown. FoF connecting length has a direct impact on fragment count as well. This analysis does not provide a single, straightforward global ranking for fragmentation because of this. While the actual fragment pattern depends on the entire encounter and how fragments are gathered during post-processing, periapsis indicates where the largest disruption may occur.</w:t>
       </w:r>
     </w:p>
@@ -4686,7 +4601,7 @@
         <w:pStyle w:val="Heading2"/>
       </w:pPr>
       <w:bookmarkStart w:id="39" w:name="_Toc238149745"/>
-      <w:bookmarkStart w:id="40" w:name="_Toc238392144"/>
+      <w:bookmarkStart w:id="40" w:name="_Toc238575685"/>
       <w:r>
         <w:t>3.5 Checking Physical Trends and Condition-Dependent Effects</w:t>
       </w:r>
@@ -4710,10 +4625,10 @@
       </w:pPr>
       <w:r>
         <w:drawing>
-          <wp:inline distT="0" distB="0" distL="0" distR="0" wp14:anchorId="7EA8534E" wp14:editId="20666A63">
-            <wp:extent cx="5276193" cy="3583978"/>
-            <wp:effectExtent l="0" t="0" r="0" b="0"/>
-            <wp:docPr id="453900512" name="Picture 1"/>
+          <wp:inline distT="0" distB="0" distL="0" distR="0" wp14:anchorId="4F709962" wp14:editId="6A63C568">
+            <wp:extent cx="5943600" cy="4037330"/>
+            <wp:effectExtent l="0" t="0" r="0" b="1270"/>
+            <wp:docPr id="47297538" name="Picture 1"/>
             <wp:cNvGraphicFramePr>
               <a:graphicFrameLocks xmlns:a="http://schemas.openxmlformats.org/drawingml/2006/main" noChangeAspect="1"/>
             </wp:cNvGraphicFramePr>
@@ -4721,7 +4636,7 @@
               <a:graphicData uri="http://schemas.openxmlformats.org/drawingml/2006/picture">
                 <pic:pic xmlns:pic="http://schemas.openxmlformats.org/drawingml/2006/picture">
                   <pic:nvPicPr>
-                    <pic:cNvPr id="453900512" name=""/>
+                    <pic:cNvPr id="47297538" name=""/>
                     <pic:cNvPicPr/>
                   </pic:nvPicPr>
                   <pic:blipFill>
@@ -4733,7 +4648,7 @@
                   <pic:spPr>
                     <a:xfrm>
                       <a:off x="0" y="0"/>
-                      <a:ext cx="5301708" cy="3601310"/>
+                      <a:ext cx="5943600" cy="4037330"/>
                     </a:xfrm>
                     <a:prstGeom prst="rect">
                       <a:avLst/>
@@ -4755,7 +4670,7 @@
           <w:szCs w:val="28"/>
         </w:rPr>
       </w:pPr>
-      <w:bookmarkStart w:id="41" w:name="_Toc238151305"/>
+      <w:bookmarkStart w:id="41" w:name="_Toc238575698"/>
       <w:r>
         <w:rPr>
           <w:sz w:val="20"/>
@@ -4821,6 +4736,7 @@
           <w:noProof w:val="0"/>
           <w:lang w:val="en-US"/>
         </w:rPr>
+        <w:lastRenderedPageBreak/>
         <w:t>Figure 3 compares controlled profiles in which one scenario input is varied while the others are fixed to a representative, well-supported combination. The fixed conditions may differ between panels, so the profiles show conditional responses rather than directly comparable effect sizes.</w:t>
       </w:r>
     </w:p>
@@ -4838,7 +4754,6 @@
           <w:noProof w:val="0"/>
           <w:lang w:val="en-US"/>
         </w:rPr>
-        <w:lastRenderedPageBreak/>
         <w:t>Predicted BMF decreases with increasing periapsis, reaching approximately zero by 2.5</w:t>
       </w:r>
       <w:r>
@@ -4921,225 +4836,10 @@
       </w:pPr>
       <w:r>
         <w:drawing>
-          <wp:inline distT="0" distB="0" distL="114300" distR="114300" wp14:anchorId="3B7A9855" wp14:editId="6E44C856">
-            <wp:extent cx="5255172" cy="1849821"/>
-            <wp:effectExtent l="0" t="0" r="3175" b="4445"/>
-            <wp:docPr id="7" name="image5.png"/>
-            <wp:cNvGraphicFramePr/>
-            <a:graphic xmlns:a="http://schemas.openxmlformats.org/drawingml/2006/main">
-              <a:graphicData uri="http://schemas.openxmlformats.org/drawingml/2006/picture">
-                <pic:pic xmlns:pic="http://schemas.openxmlformats.org/drawingml/2006/picture">
-                  <pic:nvPicPr>
-                    <pic:cNvPr id="7" name="image5.png"/>
-                    <pic:cNvPicPr/>
-                  </pic:nvPicPr>
-                  <pic:blipFill>
-                    <a:blip r:embed="rId15"/>
-                    <a:srcRect t="16637"/>
-                    <a:stretch>
-                      <a:fillRect/>
-                    </a:stretch>
-                  </pic:blipFill>
-                  <pic:spPr>
-                    <a:xfrm>
-                      <a:off x="0" y="0"/>
-                      <a:ext cx="5265375" cy="1853412"/>
-                    </a:xfrm>
-                    <a:prstGeom prst="rect">
-                      <a:avLst/>
-                    </a:prstGeom>
-                  </pic:spPr>
-                </pic:pic>
-              </a:graphicData>
-            </a:graphic>
-          </wp:inline>
-        </w:drawing>
-      </w:r>
-    </w:p>
-    <w:p>
-      <w:pPr>
-        <w:pStyle w:val="Caption"/>
-        <w:jc w:val="center"/>
-        <w:rPr>
-          <w:sz w:val="28"/>
-          <w:szCs w:val="28"/>
-        </w:rPr>
-      </w:pPr>
-      <w:bookmarkStart w:id="42" w:name="_Toc238151306"/>
-      <w:r>
-        <w:rPr>
-          <w:sz w:val="20"/>
-          <w:szCs w:val="20"/>
-        </w:rPr>
-        <w:t xml:space="preserve">Figure </w:t>
-      </w:r>
-      <w:r>
-        <w:rPr>
-          <w:sz w:val="20"/>
-          <w:szCs w:val="20"/>
-        </w:rPr>
-        <w:fldChar w:fldCharType="begin"/>
-      </w:r>
-      <w:r>
-        <w:rPr>
-          <w:sz w:val="20"/>
-          <w:szCs w:val="20"/>
-        </w:rPr>
-        <w:instrText xml:space="preserve"> SEQ Figure \* ARABIC </w:instrText>
-      </w:r>
-      <w:r>
-        <w:rPr>
-          <w:sz w:val="20"/>
-          <w:szCs w:val="20"/>
-        </w:rPr>
-        <w:fldChar w:fldCharType="separate"/>
-      </w:r>
-      <w:r>
-        <w:rPr>
-          <w:sz w:val="20"/>
-          <w:szCs w:val="20"/>
-        </w:rPr>
-        <w:t>4</w:t>
-      </w:r>
-      <w:r>
-        <w:rPr>
-          <w:sz w:val="20"/>
-          <w:szCs w:val="20"/>
-        </w:rPr>
-        <w:fldChar w:fldCharType="end"/>
-      </w:r>
-      <w:r>
-        <w:rPr>
-          <w:sz w:val="20"/>
-          <w:szCs w:val="20"/>
-        </w:rPr>
-        <w:t xml:space="preserve">. BMF differences within the matched </w:t>
-      </w:r>
-      <w:r>
-        <w:t>1</w:t>
-      </w:r>
-      <w:r>
-        <w:t>0</w:t>
-      </w:r>
-      <w:r>
-        <w:rPr>
-          <w:vertAlign w:val="superscript"/>
-        </w:rPr>
-        <w:t>20</w:t>
-      </w:r>
-      <w:r>
-        <w:rPr>
-          <w:sz w:val="20"/>
-          <w:szCs w:val="20"/>
-        </w:rPr>
-        <w:t xml:space="preserve"> kg</w:t>
-      </w:r>
-      <w:r>
-        <w:rPr>
-          <w:sz w:val="20"/>
-          <w:szCs w:val="20"/>
-        </w:rPr>
-        <w:t>. Left: BMF range across spin states with velocity fixed. Right: BMF range across velocities with spin fixed. These ranges show how strongly outcomes differ within this subset; they do not show direction or prove causation.</w:t>
-      </w:r>
-      <w:bookmarkEnd w:id="42"/>
-    </w:p>
-    <w:p>
-      <w:pPr>
-        <w:spacing w:before="240" w:after="240" w:line="276" w:lineRule="auto"/>
-        <w:jc w:val="both"/>
-      </w:pPr>
-      <w:r>
-        <w:t>Because the archive contains matching situations where these parameters can be changed while mass and other numerical and post-processing settings remain unchanged, spin and velocity are used in Figure 4. Next, periapsis is changed throughout the comparison. When velocity is fixed, the difference between the largest and smallest BMF over all possible spin states is represented by ΔBMF</w:t>
-      </w:r>
-      <w:r>
-        <w:rPr>
-          <w:vertAlign w:val="subscript"/>
-        </w:rPr>
-        <w:t>spin</w:t>
-      </w:r>
-      <w:r>
-        <w:t xml:space="preserve"> in the left panel. In the right panel, spin is fixed and ΔBMF</w:t>
-      </w:r>
-      <w:r>
-        <w:rPr>
-          <w:vertAlign w:val="subscript"/>
-        </w:rPr>
-        <w:t>velocity</w:t>
-      </w:r>
-      <w:r>
-        <w:t xml:space="preserve"> falls within the same range across all possible velocities. A higher ΔBMF indicates that, in certain circumstances, altering that parameter has a greater impact on the retained mass. </w:t>
-      </w:r>
-    </w:p>
-    <w:p>
-      <w:pPr>
-        <w:spacing w:before="240" w:after="240" w:line="276" w:lineRule="auto"/>
-        <w:jc w:val="both"/>
-      </w:pPr>
-      <w:r>
-        <w:t>The outcome makes it abundantly evident that each parameter's intensity varies. Changing spin results in a BMF range of around 0.06-0.09 below about 1.5 Mars-radii. This can grow much stronger at bigger periapsis: the spin-related range increases to around 0.24 at 1.8 Mars-radii for v</w:t>
-      </w:r>
-      <w:r>
-        <w:rPr>
-          <w:vertAlign w:val="subscript"/>
-        </w:rPr>
-        <w:t>∞</w:t>
-      </w:r>
-      <w:r>
-        <w:t>=0, while various other velocity groups reach approximately 0.14-0.22 between 1.6 and 2.0 Mars-radii. The pattern of velocity is distinct. The velocity-related BMF range for the no-spin instances is approximately 0.18 at 1.2-1.4 Mars radii, decreases to approximately 0.14 at 1.6 Mars radii, and reaches zero by 1.8 Mars radii. On the other hand, velocity-related ranges of roughly 0.15-0.19 between 1.6 and 2.0 Mars-radii are still seen in the sampled prograde z-spin situations.</w:t>
-      </w:r>
-    </w:p>
-    <w:p>
-      <w:pPr>
-        <w:spacing w:before="240" w:after="240" w:line="276" w:lineRule="auto"/>
-        <w:jc w:val="both"/>
-      </w:pPr>
-      <w:r>
-        <w:lastRenderedPageBreak/>
-        <w:t>These findings support the importance of regime-dependent parameters: the overall ablation ranking is not universal because spin predominates under some situations while velocity predominates under others.</w:t>
-      </w:r>
-    </w:p>
-    <w:p>
-      <w:pPr>
-        <w:pStyle w:val="Heading2"/>
-      </w:pPr>
-      <w:bookmarkStart w:id="43" w:name="_Toc238149746"/>
-      <w:bookmarkStart w:id="44" w:name="_Toc238392145"/>
-      <w:r>
-        <w:t>3.6 Where the Model Can and Cannot Be Trusted</w:t>
-      </w:r>
-      <w:bookmarkEnd w:id="43"/>
-      <w:bookmarkEnd w:id="44"/>
-    </w:p>
-    <w:p>
-      <w:pPr>
-        <w:spacing w:before="240" w:after="240" w:line="276" w:lineRule="auto"/>
-        <w:jc w:val="both"/>
-      </w:pPr>
-      <w:r>
-        <w:t>The quantity of local SPH data and prediction error both influence trust. Instead of counting repeated FoF rows, the coverage-error maps count distinct physical simulations and compare that number to the average held-out absolute error in the same area. While sparse or fringe regions can have significantly worse error, regions with many simulations typically have lower error. Low error is insufficient on its own; certain poorly sampled locations appear simple simply because the true BMF is typically zero.</w:t>
-      </w:r>
-    </w:p>
-    <w:p>
-      <w:pPr>
-        <w:spacing w:before="240" w:after="240" w:line="276" w:lineRule="auto"/>
-        <w:jc w:val="both"/>
-      </w:pPr>
-      <w:r>
-        <w:t>Because the model depends on input combinations, a case may fall inside the range of each individual input and yet have inadequate support. Thus, held-out error and pairwise parameter coverage are compared with local simulation coverage in Figure 5. Individual input ranges conceal unsampled combinations, which are revealed by pairwise mapping. Only when comparable SPH cases are close by in the input space is a prediction regarded as interpolation.</w:t>
-      </w:r>
-    </w:p>
-    <w:p>
-      <w:pPr>
-        <w:keepNext/>
-        <w:spacing w:before="240" w:after="240" w:line="276" w:lineRule="auto"/>
-        <w:jc w:val="center"/>
-      </w:pPr>
-      <w:r>
-        <w:drawing>
-          <wp:inline distT="0" distB="0" distL="0" distR="0" wp14:anchorId="1B9250F9" wp14:editId="325B11B7">
-            <wp:extent cx="5943600" cy="3060862"/>
-            <wp:effectExtent l="0" t="0" r="0" b="0"/>
-            <wp:docPr id="88218725" name="Picture 1"/>
+          <wp:inline distT="0" distB="0" distL="0" distR="0" wp14:anchorId="13192738" wp14:editId="4176F7E7">
+            <wp:extent cx="5942960" cy="2514600"/>
+            <wp:effectExtent l="0" t="0" r="1270" b="0"/>
+            <wp:docPr id="681598251" name="Picture 1"/>
             <wp:cNvGraphicFramePr>
               <a:graphicFrameLocks xmlns:a="http://schemas.openxmlformats.org/drawingml/2006/main" noChangeAspect="1"/>
             </wp:cNvGraphicFramePr>
@@ -5147,12 +4847,12 @@
               <a:graphicData uri="http://schemas.openxmlformats.org/drawingml/2006/picture">
                 <pic:pic xmlns:pic="http://schemas.openxmlformats.org/drawingml/2006/picture">
                   <pic:nvPicPr>
-                    <pic:cNvPr id="88218725" name=""/>
+                    <pic:cNvPr id="681598251" name=""/>
                     <pic:cNvPicPr/>
                   </pic:nvPicPr>
                   <pic:blipFill rotWithShape="1">
-                    <a:blip r:embed="rId16"/>
-                    <a:srcRect t="5411"/>
+                    <a:blip r:embed="rId15"/>
+                    <a:srcRect t="13040" b="12919"/>
                     <a:stretch>
                       <a:fillRect/>
                     </a:stretch>
@@ -5160,7 +4860,7 @@
                   <pic:spPr bwMode="auto">
                     <a:xfrm>
                       <a:off x="0" y="0"/>
-                      <a:ext cx="5943600" cy="3060862"/>
+                      <a:ext cx="5943600" cy="2514871"/>
                     </a:xfrm>
                     <a:prstGeom prst="rect">
                       <a:avLst/>
@@ -5186,96 +4886,306 @@
         <w:pStyle w:val="Caption"/>
         <w:jc w:val="center"/>
         <w:rPr>
+          <w:sz w:val="28"/>
+          <w:szCs w:val="28"/>
+        </w:rPr>
+      </w:pPr>
+      <w:bookmarkStart w:id="42" w:name="_Toc238575699"/>
+      <w:r>
+        <w:rPr>
           <w:sz w:val="20"/>
           <w:szCs w:val="20"/>
         </w:rPr>
-      </w:pPr>
-      <w:bookmarkStart w:id="45" w:name="_Toc238151307"/>
+        <w:t xml:space="preserve">Figure </w:t>
+      </w:r>
       <w:r>
         <w:rPr>
           <w:sz w:val="20"/>
           <w:szCs w:val="20"/>
         </w:rPr>
-        <w:t xml:space="preserve">Figure </w:t>
+        <w:fldChar w:fldCharType="begin"/>
       </w:r>
       <w:r>
         <w:rPr>
           <w:sz w:val="20"/>
           <w:szCs w:val="20"/>
         </w:rPr>
-        <w:fldChar w:fldCharType="begin"/>
+        <w:instrText xml:space="preserve"> SEQ Figure \* ARABIC </w:instrText>
       </w:r>
       <w:r>
         <w:rPr>
           <w:sz w:val="20"/>
           <w:szCs w:val="20"/>
         </w:rPr>
-        <w:instrText xml:space="preserve"> SEQ Figure \* ARABIC </w:instrText>
+        <w:fldChar w:fldCharType="separate"/>
       </w:r>
       <w:r>
         <w:rPr>
           <w:sz w:val="20"/>
           <w:szCs w:val="20"/>
         </w:rPr>
-        <w:fldChar w:fldCharType="separate"/>
+        <w:t>4</w:t>
       </w:r>
       <w:r>
         <w:rPr>
           <w:sz w:val="20"/>
           <w:szCs w:val="20"/>
         </w:rPr>
-        <w:t>5</w:t>
+        <w:fldChar w:fldCharType="end"/>
       </w:r>
       <w:r>
         <w:rPr>
           <w:sz w:val="20"/>
           <w:szCs w:val="20"/>
         </w:rPr>
-        <w:fldChar w:fldCharType="end"/>
+        <w:t xml:space="preserve">. BMF differences within the matched </w:t>
+      </w:r>
+      <w:r>
+        <w:t>1</w:t>
+      </w:r>
+      <w:r>
+        <w:t>0</w:t>
+      </w:r>
+      <w:r>
+        <w:rPr>
+          <w:vertAlign w:val="superscript"/>
+        </w:rPr>
+        <w:t>20</w:t>
       </w:r>
       <w:r>
         <w:rPr>
           <w:sz w:val="20"/>
           <w:szCs w:val="20"/>
         </w:rPr>
-        <w:t xml:space="preserve">. </w:t>
-      </w:r>
-      <w:bookmarkEnd w:id="45"/>
+        <w:t xml:space="preserve"> kg</w:t>
+      </w:r>
       <w:r>
         <w:rPr>
           <w:sz w:val="20"/>
           <w:szCs w:val="20"/>
         </w:rPr>
-        <w:t>Coverage, held-out error, and observed BMF across the sampled parameter space.</w:t>
-      </w:r>
-      <w:r>
+        <w:t>. Left: BMF range across spin states with velocity fixed. Right: BMF range across velocities with spin fixed. These ranges show how strongly outcomes differ within this subset; they do not show direction or prove causation.</w:t>
+      </w:r>
+      <w:bookmarkEnd w:id="42"/>
+    </w:p>
+    <w:p>
+      <w:pPr>
+        <w:spacing w:before="240" w:after="240" w:line="276" w:lineRule="auto"/>
+        <w:jc w:val="both"/>
+      </w:pPr>
+      <w:r>
+        <w:t>Because the archive contains matching situations where these parameters can be changed while mass and other numerical and post-processing settings remain unchanged, spin and velocity are used in Figure 4. Next, periapsis is changed throughout the comparison. When velocity is fixed, the difference between the largest and smallest BMF over all possible spin states is represented by ΔBMF</w:t>
+      </w:r>
+      <w:r>
+        <w:rPr>
+          <w:vertAlign w:val="subscript"/>
+        </w:rPr>
+        <w:t>spin</w:t>
+      </w:r>
+      <w:r>
+        <w:t xml:space="preserve"> in the left panel. In the right panel, spin is fixed and ΔBMF</w:t>
+      </w:r>
+      <w:r>
+        <w:rPr>
+          <w:vertAlign w:val="subscript"/>
+        </w:rPr>
+        <w:t>velocity</w:t>
+      </w:r>
+      <w:r>
+        <w:t xml:space="preserve"> falls within the same range across all possible velocities. A higher ΔBMF indicates that, in certain circumstances, altering that parameter has a greater impact on the retained mass. </w:t>
+      </w:r>
+    </w:p>
+    <w:p>
+      <w:pPr>
+        <w:spacing w:before="240" w:after="240" w:line="276" w:lineRule="auto"/>
+        <w:jc w:val="both"/>
+      </w:pPr>
+      <w:r>
+        <w:lastRenderedPageBreak/>
+        <w:t>The outcome makes it abundantly evident that each parameter's intensity varies. Changing spin results in a BMF range of around 0.06-0.09 below about 1.5 Mars-radii. This can grow much stronger at bigger periapsis: the spin-related range increases to around 0.24 at 1.8 Mars-radii for v</w:t>
+      </w:r>
+      <w:r>
+        <w:rPr>
+          <w:vertAlign w:val="subscript"/>
+        </w:rPr>
+        <w:t>∞</w:t>
+      </w:r>
+      <w:r>
+        <w:t>=0, while various other velocity groups reach approximately 0.14-0.22 between 1.6 and 2.0 Mars-radii. The pattern of velocity is distinct. The velocity-related BMF range for the no-spin instances is approximately 0.18 at 1.2-1.4 Mars radii, decreases to approximately 0.14 at 1.6 Mars radii, and reaches zero by 1.8 Mars radii. On the other hand, velocity-related ranges of roughly 0.15-0.19 between 1.6 and 2.0 Mars-radii are still seen in the sampled prograde z-spin situations.</w:t>
+      </w:r>
+    </w:p>
+    <w:p>
+      <w:pPr>
+        <w:spacing w:before="240" w:after="240" w:line="276" w:lineRule="auto"/>
+        <w:jc w:val="both"/>
+      </w:pPr>
+      <w:r>
+        <w:t>These findings support the importance of regime-dependent parameters: the overall ablation ranking is not universal because spin predominates under some situations while velocity predominates under others.</w:t>
+      </w:r>
+    </w:p>
+    <w:p>
+      <w:pPr>
+        <w:pStyle w:val="Heading2"/>
+      </w:pPr>
+      <w:bookmarkStart w:id="43" w:name="_Toc238149746"/>
+      <w:bookmarkStart w:id="44" w:name="_Toc238575686"/>
+      <w:r>
+        <w:t>3.6 Where the Model Can and Cannot Be Trusted</w:t>
+      </w:r>
+      <w:bookmarkEnd w:id="43"/>
+      <w:bookmarkEnd w:id="44"/>
+    </w:p>
+    <w:p>
+      <w:pPr>
+        <w:spacing w:before="240" w:after="240" w:line="276" w:lineRule="auto"/>
+        <w:jc w:val="both"/>
+      </w:pPr>
+      <w:r>
+        <w:t>The quantity of local SPH data and prediction error both influence trust. Instead of counting repeated FoF rows, the coverage-error maps count distinct physical simulations and compare that number to the average held-out absolute error in the same area. While sparse or fringe regions can have significantly worse error, regions with many simulations typically have lower error. Low error is insufficient on its own; certain poorly sampled locations appear simple simply because the true BMF is typically zero.</w:t>
+      </w:r>
+    </w:p>
+    <w:p>
+      <w:pPr>
+        <w:spacing w:before="240" w:after="240" w:line="276" w:lineRule="auto"/>
+        <w:jc w:val="both"/>
+      </w:pPr>
+      <w:r>
+        <w:t>Because the model depends on input combinations, a case may fall inside the range of each individual input and yet have inadequate support. Thus, held-out error and pairwise parameter coverage are compared with local simulation coverage in Figure 5. Individual input ranges conceal unsampled combinations, which are revealed by pairwise mapping. Only when comparable SPH cases are close by in the input space is a prediction regarded as interpolation.</w:t>
+      </w:r>
+    </w:p>
+    <w:p>
+      <w:pPr>
+        <w:keepNext/>
+        <w:spacing w:before="240" w:after="240" w:line="276" w:lineRule="auto"/>
+        <w:jc w:val="center"/>
+      </w:pPr>
+      <w:r>
+        <w:lastRenderedPageBreak/>
+        <w:drawing>
+          <wp:inline distT="0" distB="0" distL="0" distR="0" wp14:anchorId="0D989D59" wp14:editId="171DDAC3">
+            <wp:extent cx="5943600" cy="3248025"/>
+            <wp:effectExtent l="0" t="0" r="0" b="3175"/>
+            <wp:docPr id="451719201" name="Picture 1"/>
+            <wp:cNvGraphicFramePr>
+              <a:graphicFrameLocks xmlns:a="http://schemas.openxmlformats.org/drawingml/2006/main" noChangeAspect="1"/>
+            </wp:cNvGraphicFramePr>
+            <a:graphic xmlns:a="http://schemas.openxmlformats.org/drawingml/2006/main">
+              <a:graphicData uri="http://schemas.openxmlformats.org/drawingml/2006/picture">
+                <pic:pic xmlns:pic="http://schemas.openxmlformats.org/drawingml/2006/picture">
+                  <pic:nvPicPr>
+                    <pic:cNvPr id="451719201" name=""/>
+                    <pic:cNvPicPr/>
+                  </pic:nvPicPr>
+                  <pic:blipFill>
+                    <a:blip r:embed="rId16"/>
+                    <a:stretch>
+                      <a:fillRect/>
+                    </a:stretch>
+                  </pic:blipFill>
+                  <pic:spPr>
+                    <a:xfrm>
+                      <a:off x="0" y="0"/>
+                      <a:ext cx="5943600" cy="3248025"/>
+                    </a:xfrm>
+                    <a:prstGeom prst="rect">
+                      <a:avLst/>
+                    </a:prstGeom>
+                  </pic:spPr>
+                </pic:pic>
+              </a:graphicData>
+            </a:graphic>
+          </wp:inline>
+        </w:drawing>
+      </w:r>
+    </w:p>
+    <w:p>
+      <w:pPr>
+        <w:pStyle w:val="Caption"/>
+        <w:jc w:val="center"/>
         <w:rPr>
           <w:sz w:val="20"/>
           <w:szCs w:val="20"/>
         </w:rPr>
-        <w:t xml:space="preserve"> </w:t>
-      </w:r>
+      </w:pPr>
+      <w:bookmarkStart w:id="45" w:name="_Toc238575700"/>
       <w:r>
         <w:rPr>
           <w:sz w:val="20"/>
           <w:szCs w:val="20"/>
         </w:rPr>
+        <w:t xml:space="preserve">Figure </w:t>
+      </w:r>
+      <w:r>
+        <w:rPr>
+          <w:sz w:val="20"/>
+          <w:szCs w:val="20"/>
+        </w:rPr>
+        <w:fldChar w:fldCharType="begin"/>
+      </w:r>
+      <w:r>
+        <w:rPr>
+          <w:sz w:val="20"/>
+          <w:szCs w:val="20"/>
+        </w:rPr>
+        <w:instrText xml:space="preserve"> SEQ Figure \* ARABIC </w:instrText>
+      </w:r>
+      <w:r>
+        <w:rPr>
+          <w:sz w:val="20"/>
+          <w:szCs w:val="20"/>
+        </w:rPr>
+        <w:fldChar w:fldCharType="separate"/>
+      </w:r>
+      <w:r>
+        <w:rPr>
+          <w:sz w:val="20"/>
+          <w:szCs w:val="20"/>
+        </w:rPr>
+        <w:t>5</w:t>
+      </w:r>
+      <w:r>
+        <w:rPr>
+          <w:sz w:val="20"/>
+          <w:szCs w:val="20"/>
+        </w:rPr>
+        <w:fldChar w:fldCharType="end"/>
+      </w:r>
+      <w:r>
+        <w:rPr>
+          <w:sz w:val="20"/>
+          <w:szCs w:val="20"/>
+        </w:rPr>
+        <w:t xml:space="preserve">. </w:t>
+      </w:r>
+      <w:r>
+        <w:rPr>
+          <w:sz w:val="20"/>
+          <w:szCs w:val="20"/>
+        </w:rPr>
+        <w:t>Coverage, held-out error, and observed BMF across the sampled parameter space.</w:t>
+      </w:r>
+      <w:r>
+        <w:rPr>
+          <w:sz w:val="20"/>
+          <w:szCs w:val="20"/>
+        </w:rPr>
+        <w:t xml:space="preserve"> </w:t>
+      </w:r>
+      <w:r>
+        <w:rPr>
+          <w:sz w:val="20"/>
+          <w:szCs w:val="20"/>
+        </w:rPr>
         <w:t>Panels (a,d) show unique physical SPH simulation counts, panels (b,e) show mean held-out absolute error, and panels (c,f) show mean observed BMF with unique simulation counts overlaid. Grey indicates no SPH data. In the observed-BMF panels, light blue indicates mean observed BMF = 0, while other colours indicate mean observed BMF &gt; 0.</w:t>
       </w:r>
+      <w:bookmarkEnd w:id="45"/>
     </w:p>
     <w:p>
       <w:pPr>
         <w:spacing w:before="240" w:after="240" w:line="276" w:lineRule="auto"/>
         <w:jc w:val="both"/>
       </w:pPr>
-    </w:p>
-    <w:p>
-      <w:pPr>
-        <w:spacing w:before="240" w:after="240" w:line="276" w:lineRule="auto"/>
-        <w:jc w:val="both"/>
-      </w:pPr>
-      <w:r>
-        <w:lastRenderedPageBreak/>
+      <w:r>
         <w:t>A specific illustration of this issue for the sparsely sampled 10</w:t>
       </w:r>
       <w:r>
@@ -5577,7 +5487,7 @@
               <w:jc w:val="both"/>
             </w:pPr>
             <w:r>
-              <w:t>0.0913</w:t>
+              <w:t>0.496411</w:t>
             </w:r>
           </w:p>
         </w:tc>
@@ -5595,7 +5505,7 @@
               <w:jc w:val="both"/>
             </w:pPr>
             <w:r>
-              <w:t>0.0134</w:t>
+              <w:t>0.5042</w:t>
             </w:r>
           </w:p>
         </w:tc>
@@ -5613,7 +5523,7 @@
               <w:jc w:val="both"/>
             </w:pPr>
             <w:r>
-              <w:t>0.0779</w:t>
+              <w:t>0.0077</w:t>
             </w:r>
           </w:p>
         </w:tc>
@@ -5631,7 +5541,7 @@
               <w:jc w:val="both"/>
             </w:pPr>
             <w:r>
-              <w:t>Underpredicts</w:t>
+              <w:t>Overpredicts</w:t>
             </w:r>
           </w:p>
         </w:tc>
@@ -5674,7 +5584,7 @@
               <w:jc w:val="both"/>
             </w:pPr>
             <w:r>
-              <w:t>0.000204</w:t>
+              <w:t>0.426741</w:t>
             </w:r>
           </w:p>
         </w:tc>
@@ -5692,7 +5602,7 @@
               <w:jc w:val="both"/>
             </w:pPr>
             <w:r>
-              <w:t>0.0827</w:t>
+              <w:t>0.4658</w:t>
             </w:r>
           </w:p>
         </w:tc>
@@ -5710,7 +5620,7 @@
               <w:jc w:val="both"/>
             </w:pPr>
             <w:r>
-              <w:t>0.0825</w:t>
+              <w:t>0.039</w:t>
             </w:r>
           </w:p>
         </w:tc>
@@ -5745,11 +5655,18 @@
     </w:p>
     <w:p>
       <w:pPr>
+        <w:spacing w:before="240" w:after="240" w:line="276" w:lineRule="auto"/>
+        <w:jc w:val="both"/>
+      </w:pPr>
+    </w:p>
+    <w:p>
+      <w:pPr>
         <w:pStyle w:val="Heading2"/>
       </w:pPr>
       <w:bookmarkStart w:id="47" w:name="_Toc238149747"/>
-      <w:bookmarkStart w:id="48" w:name="_Toc238392146"/>
-      <w:r>
+      <w:bookmarkStart w:id="48" w:name="_Toc238575687"/>
+      <w:r>
+        <w:lastRenderedPageBreak/>
         <w:t>3.7 How the Model Supports SPH Decisions</w:t>
       </w:r>
       <w:bookmarkEnd w:id="47"/>
@@ -5799,7 +5716,7 @@
         <w:pStyle w:val="Heading1"/>
       </w:pPr>
       <w:bookmarkStart w:id="49" w:name="_Toc238149748"/>
-      <w:bookmarkStart w:id="50" w:name="_Toc238392147"/>
+      <w:bookmarkStart w:id="50" w:name="_Toc238575688"/>
       <w:r>
         <w:t>4. Discussion</w:t>
       </w:r>
@@ -5821,7 +5738,6 @@
         <w:jc w:val="both"/>
       </w:pPr>
       <w:r>
-        <w:lastRenderedPageBreak/>
         <w:t>The primary physical outcome is that each parameter's impact is contingent upon the other encounter conditions. Within those parameters, periapsis determines the overall strength of the tidal encounter, encounter speed influences the duration of the contact and the favourable capture, and mass and spin alter the outcome. The most obvious periapsis and speed directions are found in the controlled experiments. The paired simulations demonstrate how periapsis and spin state affect the magnitude of the spin and velocity impacts.</w:t>
       </w:r>
     </w:p>
@@ -5858,6 +5774,7 @@
         <w:jc w:val="both"/>
       </w:pPr>
       <w:r>
+        <w:lastRenderedPageBreak/>
         <w:t>Different questions are addressed by the matching and ablation analysis. Although matching cases demonstrate that spin or velocity can become more significant under specific encounter settings, periapsis is generally the strongest.</w:t>
       </w:r>
     </w:p>
@@ -5884,7 +5801,7 @@
         <w:pStyle w:val="Heading1"/>
       </w:pPr>
       <w:bookmarkStart w:id="51" w:name="_Toc238149749"/>
-      <w:bookmarkStart w:id="52" w:name="_Toc238392148"/>
+      <w:bookmarkStart w:id="52" w:name="_Toc238575689"/>
       <w:r>
         <w:t>5. Conclusions, Limitations and Future Work</w:t>
       </w:r>
@@ -5896,7 +5813,7 @@
         <w:pStyle w:val="Heading2"/>
       </w:pPr>
       <w:bookmarkStart w:id="53" w:name="_Toc238149750"/>
-      <w:bookmarkStart w:id="54" w:name="_Toc238392149"/>
+      <w:bookmarkStart w:id="54" w:name="_Toc238575690"/>
       <w:r>
         <w:t>5.1 Conclusions and Answers to the Research Questions</w:t>
       </w:r>
@@ -5924,7 +5841,6 @@
         <w:jc w:val="both"/>
       </w:pPr>
       <w:r>
-        <w:lastRenderedPageBreak/>
         <w:t>Q</w:t>
       </w:r>
       <w:r>
@@ -6018,7 +5934,11 @@
         <w:t>scenario</w:t>
       </w:r>
       <w:r>
-        <w:t xml:space="preserve"> inputs obtains a grouped cross-validated R² of 0.9234, MAE of 0.0159, and RMSE of 0.0257. Adding physics-derived features produces only a small further change to R² = 0.9240 and MAE = 0.0155, with RMSE unchanged at 0.0257, so the simpler tuned model is retained. Performance is not equally dependable everywhere, however. Despite the input values falling within the numerical training ranges, held-out errors increase to roughly 0.08 BMF, or 8 percentage points, in the sparsely sampled 10</w:t>
+        <w:t xml:space="preserve"> inputs obtains a grouped cross-validated R² of 0.9234, MAE of 0.0159, and </w:t>
+      </w:r>
+      <w:r>
+        <w:lastRenderedPageBreak/>
+        <w:t>RMSE of 0.0257. Adding physics-derived features produces only a small further change to R² = 0.9240 and MAE = 0.0155, with RMSE unchanged at 0.0257, so the simpler tuned model is retained. Performance is not equally dependable everywhere, however. Despite the input values falling within the numerical training ranges, held-out errors increase to roughly 0.08 BMF, or 8 percentage points, in the sparsely sampled 10</w:t>
       </w:r>
       <w:r>
         <w:rPr>
@@ -6044,7 +5964,7 @@
         <w:pStyle w:val="Heading2"/>
       </w:pPr>
       <w:bookmarkStart w:id="55" w:name="_Toc238149751"/>
-      <w:bookmarkStart w:id="56" w:name="_Toc238392150"/>
+      <w:bookmarkStart w:id="56" w:name="_Toc238575691"/>
       <w:r>
         <w:t>5.2 Limitations</w:t>
       </w:r>
@@ -6057,11 +5977,7 @@
         <w:jc w:val="both"/>
       </w:pPr>
       <w:r>
-        <w:t xml:space="preserve">The simulation archive's short size and uneven sampling are its primary drawbacks. A single SPH simulation can be analysed in multiple ways, hence many rows are not independent physical evidence. Although it is unable to produce missing simulations, group validation keeps the test score from becoming unduly optimistic. Even when each individual input value falls between its </w:t>
-      </w:r>
-      <w:r>
-        <w:lastRenderedPageBreak/>
-        <w:t>reported minimum and maximum, predictions are still unclear for combinations that are poorly sampled, close to the data's edges, or outside the combinations observed during training.</w:t>
+        <w:t>The simulation archive's short size and uneven sampling are its primary drawbacks. A single SPH simulation can be analysed in multiple ways, hence many rows are not independent physical evidence. Although it is unable to produce missing simulations, group validation keeps the test score from becoming unduly optimistic. Even when each individual input value falls between its reported minimum and maximum, predictions are still unclear for combinations that are poorly sampled, close to the data's edges, or outside the combinations observed during training.</w:t>
       </w:r>
     </w:p>
     <w:p>
@@ -6093,7 +6009,7 @@
         <w:pStyle w:val="Heading2"/>
       </w:pPr>
       <w:bookmarkStart w:id="57" w:name="_Toc238149752"/>
-      <w:bookmarkStart w:id="58" w:name="_Toc238392151"/>
+      <w:bookmarkStart w:id="58" w:name="_Toc238575692"/>
       <w:r>
         <w:t>5.3 Future Work</w:t>
       </w:r>
@@ -6112,7 +6028,11 @@
         <w:t xml:space="preserve">repeat </w:t>
       </w:r>
       <w:r>
-        <w:t xml:space="preserve">comparison at other masses and resolutions while keeping processing choices fixed. </w:t>
+        <w:t xml:space="preserve">comparison at other masses and resolutions while keeping </w:t>
+      </w:r>
+      <w:r>
+        <w:lastRenderedPageBreak/>
+        <w:t xml:space="preserve">processing choices fixed. </w:t>
       </w:r>
       <w:r>
         <w:t>It would be possible to determine whether the stronger spin disparities also occur in other groups by reporting the BMF range together with the actual BMF values and the number of independent simulations. It would be more robust to test the model on whole new SPH runs created after training rather than repeatedly dividing the current library.</w:t>
@@ -6138,7 +6058,7 @@
       <w:pPr>
         <w:pStyle w:val="Heading1"/>
       </w:pPr>
-      <w:bookmarkStart w:id="60" w:name="_Toc238392152"/>
+      <w:bookmarkStart w:id="60" w:name="_Toc238575693"/>
       <w:r>
         <w:t>References</w:t>
       </w:r>
@@ -6206,7 +6126,6 @@
         <w:rPr>
           <w:color w:val="000000" w:themeColor="text1"/>
         </w:rPr>
-        <w:lastRenderedPageBreak/>
         <w:t>Canup, R. M. &amp; Salmon, J. (2018). Origin of Phobos and Deimos by the impact of a Vesta-to-Ceres sized body with Mars. Science Advances, 4(4), eaar6887. doi:10.1126/sciadv.aar6887.</w:t>
       </w:r>
     </w:p>
@@ -6303,6 +6222,7 @@
         <w:rPr>
           <w:color w:val="000000" w:themeColor="text1"/>
         </w:rPr>
+        <w:lastRenderedPageBreak/>
         <w:t>Kegerreis, J. A., Lissauer, J. J., Eke, V. R., Sandnes, T. D. &amp; Elphic, R. C. (2024). Origin of Mars’s moons by disruptive partial capture of an asteroid. Icarus, Article 116337. doi:10.1016/j.icarus.2024.116337.</w:t>
       </w:r>
     </w:p>
@@ -6399,7 +6319,6 @@
         <w:rPr>
           <w:color w:val="000000" w:themeColor="text1"/>
         </w:rPr>
-        <w:lastRenderedPageBreak/>
         <w:t>Rosenblatt, P., Charnoz, S., Dunseath, K. M., Terao-Dunseath, M. &amp; Trinh, A. (2016). Accretion of Phobos and Deimos in an extended debris disc stirred by transient moons. Nature Geoscience, 9, 581-583. doi:10.1038/ngeo2742.</w:t>
       </w:r>
     </w:p>
@@ -6465,7 +6384,7 @@
         <w:pStyle w:val="Heading1"/>
       </w:pPr>
       <w:bookmarkStart w:id="61" w:name="_Toc238149754"/>
-      <w:bookmarkStart w:id="62" w:name="_Toc238392153"/>
+      <w:bookmarkStart w:id="62" w:name="_Toc238575694"/>
       <w:r>
         <w:lastRenderedPageBreak/>
         <w:t>Appendix A. Supporting Model Results</w:t>
@@ -10590,25 +10509,16 @@
           <w:color w:val="000000" w:themeColor="text1"/>
         </w:rPr>
       </w:pPr>
-    </w:p>
-    <w:p>
-      <w:pPr>
-        <w:keepNext/>
-        <w:spacing w:line="276" w:lineRule="auto"/>
-        <w:jc w:val="center"/>
+      <w:r>
         <w:rPr>
           <w:color w:val="000000" w:themeColor="text1"/>
         </w:rPr>
-      </w:pPr>
-      <w:r>
-        <w:rPr>
-          <w:color w:val="000000" w:themeColor="text1"/>
-        </w:rPr>
+        <w:lastRenderedPageBreak/>
         <w:drawing>
-          <wp:inline distT="0" distB="0" distL="0" distR="0" wp14:anchorId="686F9AE1" wp14:editId="78FDA83C">
+          <wp:inline distT="0" distB="0" distL="0" distR="0" wp14:anchorId="710CCD18" wp14:editId="7476EF07">
             <wp:extent cx="5943600" cy="4037330"/>
             <wp:effectExtent l="0" t="0" r="0" b="1270"/>
-            <wp:docPr id="440836601" name="Picture 1"/>
+            <wp:docPr id="239110468" name="Picture 1"/>
             <wp:cNvGraphicFramePr>
               <a:graphicFrameLocks xmlns:a="http://schemas.openxmlformats.org/drawingml/2006/main" noChangeAspect="1"/>
             </wp:cNvGraphicFramePr>
@@ -10616,7 +10526,7 @@
               <a:graphicData uri="http://schemas.openxmlformats.org/drawingml/2006/picture">
                 <pic:pic xmlns:pic="http://schemas.openxmlformats.org/drawingml/2006/picture">
                   <pic:nvPicPr>
-                    <pic:cNvPr id="440836601" name=""/>
+                    <pic:cNvPr id="239110468" name=""/>
                     <pic:cNvPicPr/>
                   </pic:nvPicPr>
                   <pic:blipFill>
@@ -10710,10 +10620,7 @@
         <w:t xml:space="preserve">. Outside these ranges, the tree-based model does not extrapolate a physical trend. Instead, it continues to use partitions learned from the training data, producing stepwise or constant predictions, as seen most clearly for periapsis, velocity, and spin. </w:t>
       </w:r>
       <w:r>
-        <w:t>For mass, the prediction keeps increasing slightly beyond the observed range because the higher mass values still cross different learned tree thresholds. Farther outside the range, the values fall into the same tree regions, so the prediction becomes nearly constant.</w:t>
-      </w:r>
-      <w:r>
-        <w:t xml:space="preserve"> </w:t>
+        <w:t xml:space="preserve">For mass, the prediction keeps increasing slightly beyond the observed range because the higher mass values still cross different learned tree thresholds. Farther outside the range, the values fall into the same tree regions, so the prediction becomes nearly constant. </w:t>
       </w:r>
       <w:bookmarkStart w:id="63" w:name="_Toc238149755"/>
       <w:r>
@@ -10746,7 +10653,7 @@
         <w:pStyle w:val="Heading1"/>
       </w:pPr>
       <w:bookmarkStart w:id="64" w:name="_Toc238149756"/>
-      <w:bookmarkStart w:id="65" w:name="_Toc238392154"/>
+      <w:bookmarkStart w:id="65" w:name="_Toc238575695"/>
       <w:bookmarkEnd w:id="63"/>
       <w:r>
         <w:lastRenderedPageBreak/>
@@ -11729,6 +11636,7 @@
   <w:style w:type="character" w:default="1" w:styleId="DefaultParagraphFont">
     <w:name w:val="Default Paragraph Font"/>
     <w:uiPriority w:val="1"/>
+    <w:semiHidden/>
     <w:unhideWhenUsed/>
   </w:style>
   <w:style w:type="table" w:default="1" w:styleId="TableNormal">

</xml_diff>

<commit_message>
docs: update changed analysis
</commit_message>
<xml_diff>
--- a/deliverables/nny124-final-report.docx
+++ b/deliverables/nny124-final-report.docx
@@ -4333,7 +4333,25 @@
         <w:t xml:space="preserve"> </w:t>
       </w:r>
       <w:r>
-        <w:t>kg cases are mostly in a low-retention regime. However, because the two mass groups do not contain the same combinations of velocity, spin, and periapsis, this should not be interpreted as a direct causal mass effect. Overall, the results show regime-dependent behaviour, where distinct bound-mass outcomes result from varying relative effects of parameters across the parameter space rather than a single parameter acting independently.</w:t>
+        <w:t xml:space="preserve">kg cases </w:t>
+      </w:r>
+      <w:r>
+        <w:t xml:space="preserve">generally reach lower BMF than </w:t>
+      </w:r>
+      <w:r>
+        <w:t>10</w:t>
+      </w:r>
+      <w:r>
+        <w:rPr>
+          <w:vertAlign w:val="superscript"/>
+        </w:rPr>
+        <w:t>20</w:t>
+      </w:r>
+      <w:r>
+        <w:t xml:space="preserve"> kg cases across the sampled combinations.</w:t>
+      </w:r>
+      <w:r>
+        <w:t xml:space="preserve"> However, because the two mass groups do not contain the same combinations of velocity, spin, and periapsis, this should not be interpreted as a direct causal mass effect. Overall, the results show regime-dependent behaviour, where distinct bound-mass outcomes result from varying relative effects of parameters across the parameter space rather than a single parameter acting independently.</w:t>
       </w:r>
     </w:p>
     <w:p>
@@ -4369,7 +4387,13 @@
         <w:t xml:space="preserve"> </w:t>
       </w:r>
       <w:r>
-        <w:t>is almost equal to 1. Any non-zero BMF extends to around 1.127, although strong retention (BMF &gt; 0.10) only manifests up to a proxy of roughly 1.057. As the encounter gets more hyperbolic, the points compress toward BMF = 0, as Figure 2 clearly illustrates. Faster, more hyperbolic fly-bys leave less material bound to Mars because they spend less time in capture-friendly conditions.</w:t>
+        <w:t xml:space="preserve">is almost equal to 1. </w:t>
+      </w:r>
+      <w:r>
+        <w:t>Retention is concentrated close to the parabolic regime and generally decreases as the encounter becomes more hyperbolic</w:t>
+      </w:r>
+      <w:r>
+        <w:t>, as Figure 2 clearly illustrates. Faster, more hyperbolic fly-bys leave less material bound to Mars because they spend less time in capture-friendly conditions.</w:t>
       </w:r>
     </w:p>
     <w:p>
@@ -4379,7 +4403,6 @@
         <w:jc w:val="center"/>
       </w:pPr>
       <w:r>
-        <w:lastRenderedPageBreak/>
         <w:drawing>
           <wp:inline distT="0" distB="0" distL="0" distR="0" wp14:anchorId="3675A28B" wp14:editId="4E9415DE">
             <wp:extent cx="3915084" cy="2714625"/>
@@ -4466,6 +4489,7 @@
       <w:bookmarkStart w:id="34" w:name="_Toc238149743"/>
       <w:bookmarkStart w:id="35" w:name="_Toc238575683"/>
       <w:r>
+        <w:lastRenderedPageBreak/>
         <w:t>3.3 Model Performance and Screening Use</w:t>
       </w:r>
       <w:bookmarkEnd w:id="34"/>
@@ -4477,7 +4501,43 @@
         <w:jc w:val="both"/>
       </w:pPr>
       <w:r>
-        <w:t xml:space="preserve">The baseline model comparisons support Gradient Boosting for continuous BMF prediction. Random Forest produces R² = 0.8977, MAE = 0.0187, and RMSE = 0.0298, while Gradient Boosting achieves R² = 0.9142, MAE = 0.0175, and RMSE = 0.0272. Gradient Boosting is therefore the stronger baseline model for this dataset. </w:t>
+        <w:t xml:space="preserve">The baseline model comparisons support Gradient Boosting for continuous BMF prediction. Random Forest produces R² = </w:t>
+      </w:r>
+      <w:r>
+        <w:t>0.9191</w:t>
+      </w:r>
+      <w:r>
+        <w:t xml:space="preserve">, MAE = </w:t>
+      </w:r>
+      <w:r>
+        <w:t>0.0293</w:t>
+      </w:r>
+      <w:r>
+        <w:t xml:space="preserve">, and RMSE = </w:t>
+      </w:r>
+      <w:r>
+        <w:t>0.0439</w:t>
+      </w:r>
+      <w:r>
+        <w:t xml:space="preserve">, while Gradient Boosting achieves R² = </w:t>
+      </w:r>
+      <w:r>
+        <w:t>0.9262</w:t>
+      </w:r>
+      <w:r>
+        <w:t xml:space="preserve">, MAE = </w:t>
+      </w:r>
+      <w:r>
+        <w:t>0.0296</w:t>
+      </w:r>
+      <w:r>
+        <w:t xml:space="preserve">, and RMSE = </w:t>
+      </w:r>
+      <w:r>
+        <w:t>0.0419</w:t>
+      </w:r>
+      <w:r>
+        <w:t xml:space="preserve">. Gradient Boosting is therefore the stronger baseline model for this dataset. </w:t>
       </w:r>
     </w:p>
     <w:p>
@@ -4507,13 +4567,25 @@
         <w:jc w:val="both"/>
       </w:pPr>
       <w:r>
-        <w:t xml:space="preserve">Tuning Gradient Boosting improves performance from R² = 0.9142, MAE = 0.0175, and RMSE = 0.0272 to R² = 0.9234, MAE = 0.0159, and RMSE = 0.0257 (Appendix A, Tables A1-A2). Adding the tested physics-derived features produces only a small further change to R² = 0.9240, MAE = 0.0155, and RMSE = 0.0257. This additional gain is not meaningful, so the tuned Gradient Boosting model using the original </w:t>
-      </w:r>
-      <w:r>
-        <w:t>scenario</w:t>
-      </w:r>
-      <w:r>
-        <w:t xml:space="preserve"> inputs is selected as the primary model. </w:t>
+        <w:t xml:space="preserve">Tuning Gradient Boosting improves performance </w:t>
+      </w:r>
+      <w:r>
+        <w:t xml:space="preserve">to </w:t>
+      </w:r>
+      <w:r>
+        <w:t>R² = 0.9328, MAE = 0.0277, RMSE = 0.0400</w:t>
+      </w:r>
+      <w:r>
+        <w:t xml:space="preserve"> </w:t>
+      </w:r>
+      <w:r>
+        <w:t xml:space="preserve">(Appendix A, Tables A1-A2). </w:t>
+      </w:r>
+      <w:r>
+        <w:t>Adding the tested physics-derived features does not improve the tuned Gradient Boosting model, so the model using the original scenario inputs is retained.</w:t>
+      </w:r>
+      <w:r>
+        <w:t xml:space="preserve"> </w:t>
       </w:r>
     </w:p>
     <w:p>
@@ -4580,11 +4652,13 @@
         <w:t>246</w:t>
       </w:r>
       <w:r>
-        <w:t xml:space="preserve"> The overall effect of asteroid mass is smaller and less reliable. These values are separate ablation experiments and should not be added together. They display the degree to which the model depends on each </w:t>
-      </w:r>
-      <w:r>
-        <w:lastRenderedPageBreak/>
-        <w:t xml:space="preserve">input, not whether increasing that input directly raises or lowers BMF. Periapsis is the strongest overall, followed by spin and velocity, although this order may vary locally. </w:t>
+        <w:t xml:space="preserve">. These values are separate ablation experiments and should not be added together. They display the degree to which the model depends on each input, not whether increasing that input directly raises or lowers BMF. </w:t>
+      </w:r>
+      <w:r>
+        <w:t>Velocity has the strongest overall model dependence, followed by periapsis and spin, although this order may vary locally.</w:t>
+      </w:r>
+      <w:r>
+        <w:t xml:space="preserve"> </w:t>
       </w:r>
     </w:p>
     <w:p>
@@ -4624,6 +4698,7 @@
         <w:jc w:val="center"/>
       </w:pPr>
       <w:r>
+        <w:lastRenderedPageBreak/>
         <w:drawing>
           <wp:inline distT="0" distB="0" distL="0" distR="0" wp14:anchorId="4F709962" wp14:editId="6A63C568">
             <wp:extent cx="5943600" cy="4037330"/>
@@ -4736,7 +4811,6 @@
           <w:noProof w:val="0"/>
           <w:lang w:val="en-US"/>
         </w:rPr>
-        <w:lastRenderedPageBreak/>
         <w:t>Figure 3 compares controlled profiles in which one scenario input is varied while the others are fixed to a representative, well-supported combination. The fixed conditions may differ between panels, so the profiles show conditional responses rather than directly comparable effect sizes.</w:t>
       </w:r>
     </w:p>
@@ -4754,49 +4828,21 @@
           <w:noProof w:val="0"/>
           <w:lang w:val="en-US"/>
         </w:rPr>
-        <w:t>Predicted BMF decreases with increasing periapsis, reaching approximately zero by 2.5</w:t>
+        <w:t>Predicted BMF decreases substantially with increasing periapsis, from roughly 0.48 at low periapsis to about 0.12 at 3 Mars radii in this controlled scenario.</w:t>
       </w:r>
       <w:r>
         <w:rPr>
           <w:noProof w:val="0"/>
           <w:lang w:val="en-US"/>
         </w:rPr>
-        <w:t>-</w:t>
+        <w:t xml:space="preserve"> </w:t>
       </w:r>
       <w:r>
         <w:rPr>
           <w:noProof w:val="0"/>
           <w:lang w:val="en-US"/>
         </w:rPr>
-        <w:t>2.6 Mars radii. Around 2.2</w:t>
-      </w:r>
-      <w:r>
-        <w:rPr>
-          <w:noProof w:val="0"/>
-          <w:lang w:val="en-US"/>
-        </w:rPr>
-        <w:t>-</w:t>
-      </w:r>
-      <w:r>
-        <w:rPr>
-          <w:noProof w:val="0"/>
-          <w:lang w:val="en-US"/>
-        </w:rPr>
-        <w:t>2.4 Mars radii, the model remains slightly above the available SPH results because it reflects patterns learned from the wider training data. BMF also decreases with encounter velocity, from about 0.18 at low velocity to near zero by 1.0</w:t>
-      </w:r>
-      <w:r>
-        <w:rPr>
-          <w:noProof w:val="0"/>
-          <w:lang w:val="en-US"/>
-        </w:rPr>
-        <w:t>-</w:t>
-      </w:r>
-      <w:r>
-        <w:rPr>
-          <w:noProof w:val="0"/>
-          <w:lang w:val="en-US"/>
-        </w:rPr>
-        <w:t>1.2 km/s.</w:t>
+        <w:t>BMF also decreases with encounter velocity, from about 0.45 at low velocity to near zero by about 1.2-1.4 km/s.</w:t>
       </w:r>
     </w:p>
     <w:p>
@@ -4835,6 +4881,7 @@
         <w:jc w:val="center"/>
       </w:pPr>
       <w:r>
+        <w:lastRenderedPageBreak/>
         <w:drawing>
           <wp:inline distT="0" distB="0" distL="0" distR="0" wp14:anchorId="13192738" wp14:editId="4176F7E7">
             <wp:extent cx="5942960" cy="2514600"/>
@@ -5001,18 +5048,29 @@
         <w:jc w:val="both"/>
       </w:pPr>
       <w:r>
-        <w:lastRenderedPageBreak/>
-        <w:t>The outcome makes it abundantly evident that each parameter's intensity varies. Changing spin results in a BMF range of around 0.06-0.09 below about 1.5 Mars-radii. This can grow much stronger at bigger periapsis: the spin-related range increases to around 0.24 at 1.8 Mars-radii for v</w:t>
-      </w:r>
-      <w:r>
-        <w:rPr>
-          <w:vertAlign w:val="subscript"/>
-        </w:rPr>
-        <w:t>∞</w:t>
-      </w:r>
-      <w:r>
-        <w:t>=0, while various other velocity groups reach approximately 0.14-0.22 between 1.6 and 2.0 Mars-radii. The pattern of velocity is distinct. The velocity-related BMF range for the no-spin instances is approximately 0.18 at 1.2-1.4 Mars radii, decreases to approximately 0.14 at 1.6 Mars radii, and reaches zero by 1.8 Mars radii. On the other hand, velocity-related ranges of roughly 0.15-0.19 between 1.6 and 2.0 Mars-radii are still seen in the sampled prograde z-spin situations.</w:t>
-      </w:r>
+        <w:t>Figure 4 shows that the magnitude of both spin and velocity effects changes with periapsis and the surrounding encounter conditions. Neither parameter has a constant effect across the sampled range: spin produces larger BMF differences in some regimes</w:t>
+      </w:r>
+      <w:r>
+        <w:t>/predominates under some situations</w:t>
+      </w:r>
+      <w:r>
+        <w:t>, while velocity produces larger differences in others. These findings support the importance of regime-dependent parameters, so the overall ablation ranking should not be interpreted as universal.</w:t>
+      </w:r>
+      <w:r>
+        <w:t xml:space="preserve"> </w:t>
+      </w:r>
+    </w:p>
+    <w:p>
+      <w:pPr>
+        <w:pStyle w:val="Heading2"/>
+      </w:pPr>
+      <w:bookmarkStart w:id="43" w:name="_Toc238149746"/>
+      <w:bookmarkStart w:id="44" w:name="_Toc238575686"/>
+      <w:r>
+        <w:t>3.6 Where the Model Can and Cannot Be Trusted</w:t>
+      </w:r>
+      <w:bookmarkEnd w:id="43"/>
+      <w:bookmarkEnd w:id="44"/>
     </w:p>
     <w:p>
       <w:pPr>
@@ -5020,20 +5078,8 @@
         <w:jc w:val="both"/>
       </w:pPr>
       <w:r>
-        <w:t>These findings support the importance of regime-dependent parameters: the overall ablation ranking is not universal because spin predominates under some situations while velocity predominates under others.</w:t>
-      </w:r>
-    </w:p>
-    <w:p>
-      <w:pPr>
-        <w:pStyle w:val="Heading2"/>
-      </w:pPr>
-      <w:bookmarkStart w:id="43" w:name="_Toc238149746"/>
-      <w:bookmarkStart w:id="44" w:name="_Toc238575686"/>
-      <w:r>
-        <w:t>3.6 Where the Model Can and Cannot Be Trusted</w:t>
-      </w:r>
-      <w:bookmarkEnd w:id="43"/>
-      <w:bookmarkEnd w:id="44"/>
+        <w:t>The quantity of local SPH data and prediction error both influence trust. Instead of counting repeated FoF rows, the coverage-error maps count distinct physical simulations and compare that number to the average held-out absolute error in the same area. While sparse or fringe regions can have significantly worse error, regions with many simulations typically have lower error. Low error is insufficient on its own; certain poorly sampled locations appear simple simply because the true BMF is typically zero.</w:t>
+      </w:r>
     </w:p>
     <w:p>
       <w:pPr>
@@ -5041,15 +5087,7 @@
         <w:jc w:val="both"/>
       </w:pPr>
       <w:r>
-        <w:t>The quantity of local SPH data and prediction error both influence trust. Instead of counting repeated FoF rows, the coverage-error maps count distinct physical simulations and compare that number to the average held-out absolute error in the same area. While sparse or fringe regions can have significantly worse error, regions with many simulations typically have lower error. Low error is insufficient on its own; certain poorly sampled locations appear simple simply because the true BMF is typically zero.</w:t>
-      </w:r>
-    </w:p>
-    <w:p>
-      <w:pPr>
-        <w:spacing w:before="240" w:after="240" w:line="276" w:lineRule="auto"/>
-        <w:jc w:val="both"/>
-      </w:pPr>
-      <w:r>
+        <w:lastRenderedPageBreak/>
         <w:t>Because the model depends on input combinations, a case may fall inside the range of each individual input and yet have inadequate support. Thus, held-out error and pairwise parameter coverage are compared with local simulation coverage in Figure 5. Individual input ranges conceal unsampled combinations, which are revealed by pairwise mapping. Only when comparable SPH cases are close by in the input space is a prediction regarded as interpolation.</w:t>
       </w:r>
     </w:p>
@@ -5060,7 +5098,6 @@
         <w:jc w:val="center"/>
       </w:pPr>
       <w:r>
-        <w:lastRenderedPageBreak/>
         <w:drawing>
           <wp:inline distT="0" distB="0" distL="0" distR="0" wp14:anchorId="0D989D59" wp14:editId="171DDAC3">
             <wp:extent cx="5943600" cy="3248025"/>
@@ -5650,27 +5687,51 @@
         <w:jc w:val="both"/>
       </w:pPr>
       <w:r>
-        <w:t>This demonstrates that the held-out model overpredicts the 1.6 Mars-radii scenario by 0.0825 BMF and underpredicts the 1.2 Mars-radii case by 0.0779 BMF. The local relationship has not been successfully learned because the errors are both substantial and have opposite signs. Therefore, a new instance in this region should not be believed just because its mass falls between sampled masses; instead, it should be verified with more SPH.</w:t>
-      </w:r>
+        <w:lastRenderedPageBreak/>
+        <w:t>This demonstrates that the held-out model overpredicts the 1.6 Mars-radii scenario by 0.0825 BMF and underpredicts the 1.2 Mars-radii case by 0.0779 BMF. The local relationship has not been successfully learned because the errors are both substantial and have opposite signs. Therefore, a new instance in this region should not be believed just because its mass falls between sampled masses</w:t>
+      </w:r>
+      <w:r>
+        <w:t>,</w:t>
+      </w:r>
+      <w:r>
+        <w:t xml:space="preserve"> instead it should be verified with more SPH.</w:t>
+      </w:r>
+    </w:p>
+    <w:p>
+      <w:pPr>
+        <w:pStyle w:val="Heading2"/>
+      </w:pPr>
+      <w:bookmarkStart w:id="47" w:name="_Toc238149747"/>
+      <w:bookmarkStart w:id="48" w:name="_Toc238575687"/>
+      <w:r>
+        <w:t>3.7 How the Model Supports SPH Decisions</w:t>
+      </w:r>
+      <w:bookmarkEnd w:id="47"/>
+      <w:bookmarkEnd w:id="48"/>
     </w:p>
     <w:p>
       <w:pPr>
         <w:spacing w:before="240" w:after="240" w:line="276" w:lineRule="auto"/>
         <w:jc w:val="both"/>
       </w:pPr>
-    </w:p>
-    <w:p>
-      <w:pPr>
-        <w:pStyle w:val="Heading2"/>
-      </w:pPr>
-      <w:bookmarkStart w:id="47" w:name="_Toc238149747"/>
-      <w:bookmarkStart w:id="48" w:name="_Toc238575687"/>
-      <w:r>
-        <w:lastRenderedPageBreak/>
-        <w:t>3.7 How the Model Supports SPH Decisions</w:t>
-      </w:r>
-      <w:bookmarkEnd w:id="47"/>
-      <w:bookmarkEnd w:id="48"/>
+      <w:r>
+        <w:t>So,</w:t>
+      </w:r>
+      <w:r>
+        <w:t xml:space="preserve"> what is the model </w:t>
+      </w:r>
+      <w:r>
+        <w:t>actually useful</w:t>
+      </w:r>
+      <w:r>
+        <w:t xml:space="preserve"> for? The screening process separates disruption from retention. </w:t>
+      </w:r>
+      <w:r>
+        <w:t>While BMF calculates the amount of material that is still attached to Mars, the largest-remnant fraction indicates whether the asteroid is largely intact, breaks apart somewhat, or is seriously disturbed. Strong disruption can nevertheless result in primarily fleeing debris, which is why both outcomes are distinct.</w:t>
+      </w:r>
+      <w:r>
+        <w:t xml:space="preserve"> </w:t>
+      </w:r>
     </w:p>
     <w:p>
       <w:pPr>
@@ -5678,23 +5739,26 @@
         <w:jc w:val="both"/>
       </w:pPr>
       <w:r>
-        <w:t>So,</w:t>
-      </w:r>
-      <w:r>
-        <w:t xml:space="preserve"> what is the model </w:t>
-      </w:r>
-      <w:r>
-        <w:t>actually useful</w:t>
-      </w:r>
-      <w:r>
-        <w:t xml:space="preserve"> for? The screening process separates disruption from retention. </w:t>
-      </w:r>
-      <w:r>
-        <w:t>While BMF calculates the amount of material that is still attached to Mars, the largest-remnant fraction indicates whether the asteroid is largely intact, breaks apart somewhat, or is seriously disturbed. Strong disruption can nevertheless result in primarily fleeing debris, which is why both outcomes are distinct.</w:t>
+        <w:t>The resulting screening workflow provides the breakup class, estimated Mars-bound mass, expected BMF, data coverage, and a recommendation about whether another SPH simulation is required.</w:t>
       </w:r>
       <w:r>
         <w:t xml:space="preserve"> </w:t>
       </w:r>
+      <w:r>
+        <w:t>While sparse, edge, transition, or doubtful instances should be examined with SPH, well-supported cases can be swiftly evaluated with ML.</w:t>
+      </w:r>
+    </w:p>
+    <w:p>
+      <w:pPr>
+        <w:pStyle w:val="Heading1"/>
+      </w:pPr>
+      <w:bookmarkStart w:id="49" w:name="_Toc238149748"/>
+      <w:bookmarkStart w:id="50" w:name="_Toc238575688"/>
+      <w:r>
+        <w:t>4. Discussion</w:t>
+      </w:r>
+      <w:bookmarkEnd w:id="49"/>
+      <w:bookmarkEnd w:id="50"/>
     </w:p>
     <w:p>
       <w:pPr>
@@ -5702,26 +5766,8 @@
         <w:jc w:val="both"/>
       </w:pPr>
       <w:r>
-        <w:t>The resulting screening workflow provides the breakup class, estimated Mars-bound mass, expected BMF, data coverage, and a recommendation about whether another SPH simulation is required.</w:t>
-      </w:r>
-      <w:r>
-        <w:t xml:space="preserve"> </w:t>
-      </w:r>
-      <w:r>
-        <w:t>While sparse, edge, transition, or doubtful instances should be examined with SPH, well-supported cases can be swiftly evaluated with ML.</w:t>
-      </w:r>
-    </w:p>
-    <w:p>
-      <w:pPr>
-        <w:pStyle w:val="Heading1"/>
-      </w:pPr>
-      <w:bookmarkStart w:id="49" w:name="_Toc238149748"/>
-      <w:bookmarkStart w:id="50" w:name="_Toc238575688"/>
-      <w:r>
-        <w:t>4. Discussion</w:t>
-      </w:r>
-      <w:bookmarkEnd w:id="49"/>
-      <w:bookmarkEnd w:id="50"/>
+        <w:t>The clearest periapsis and velocity trends are seen in the controlled experiments, while the matched comparisons show that the effects of spin and velocity vary with encounter conditions. The behaviour in Figure 3 is consistent with the other analyses: although most larger-periapsis cases have near-zero BMF, Figures 1, 4, and 5 show that non-zero retention can still occur under particular combinations of spin, velocity, and mass. This indicates that similar periapsis values can produce different outcomes depending on the full encounter conditions. These relationships are learned from SPH outputs and support interpretation rather than proving physical causality.</w:t>
+      </w:r>
     </w:p>
     <w:p>
       <w:pPr>
@@ -5729,7 +5775,7 @@
         <w:jc w:val="both"/>
       </w:pPr>
       <w:r>
-        <w:t>The clearest periapsis and velocity trends are seen in the controlled experiments, while the matched comparisons show that the effects of spin and velocity vary with encounter conditions. The behaviour in Figure 3 is consistent with the other analyses: although most larger-periapsis cases have near-zero BMF, Figures 1, 4, and 5 show that non-zero retention can still occur under particular combinations of spin, velocity, and mass. This indicates that similar periapsis values can produce different outcomes depending on the full encounter conditions. These relationships are learned from SPH outputs and support interpretation rather than proving physical causality.</w:t>
+        <w:t>The primary physical outcome is that each parameter's impact is contingent upon the other encounter conditions. Within those parameters, periapsis determines the overall strength of the tidal encounter, encounter speed influences the duration of the contact and the favourable capture, and mass and spin alter the outcome. The most obvious periapsis and speed directions are found in the controlled experiments. The paired simulations demonstrate how periapsis and spin state affect the magnitude of the spin and velocity impacts.</w:t>
       </w:r>
     </w:p>
     <w:p>
@@ -5738,7 +5784,7 @@
         <w:jc w:val="both"/>
       </w:pPr>
       <w:r>
-        <w:t>The primary physical outcome is that each parameter's impact is contingent upon the other encounter conditions. Within those parameters, periapsis determines the overall strength of the tidal encounter, encounter speed influences the duration of the contact and the favourable capture, and mass and spin alter the outcome. The most obvious periapsis and speed directions are found in the controlled experiments. The paired simulations demonstrate how periapsis and spin state affect the magnitude of the spin and velocity impacts.</w:t>
+        <w:t>Though these associations are acquired from SPH outputs rather than from physical laws, the ML model replicates general trends and reveals interactions throughout the archive. As a result, matched comparisons, controlled tests, and group validation support interpretation but do not prove causality.</w:t>
       </w:r>
     </w:p>
     <w:p>
@@ -5747,7 +5793,17 @@
         <w:jc w:val="both"/>
       </w:pPr>
       <w:r>
-        <w:t>Though these associations are acquired from SPH outputs rather than from physical laws, the ML model replicates general trends and reveals interactions throughout the archive. As a result, matched comparisons, controlled tests, and group validation support interpretation but do not prove causality.</w:t>
+        <w:lastRenderedPageBreak/>
+        <w:t>As a result, ML's usefulness is restricted. It can swiftly filter well-supported input combinations, identify transition zones, uncover situations that yield promising retained mass, and indicate areas where more simulation could yield valuable information. Long-term debris survivability, precise fragment shapes and distributions from BMF alone, and forecasts for inadequately sampled input combinations cannot all be determined by it. This is evident from the 10</w:t>
+      </w:r>
+      <w:r>
+        <w:rPr>
+          <w:vertAlign w:val="superscript"/>
+        </w:rPr>
+        <w:t>19.5</w:t>
+      </w:r>
+      <w:r>
+        <w:t xml:space="preserve"> kg example: when only two independent simulations support the local combination, being numerically inside the training range is insufficient.</w:t>
       </w:r>
     </w:p>
     <w:p>
@@ -5756,16 +5812,7 @@
         <w:jc w:val="both"/>
       </w:pPr>
       <w:r>
-        <w:t>As a result, ML's usefulness is restricted. It can swiftly filter well-supported input combinations, identify transition zones, uncover situations that yield promising retained mass, and indicate areas where more simulation could yield valuable information. Long-term debris survivability, precise fragment shapes and distributions from BMF alone, and forecasts for inadequately sampled input combinations cannot all be determined by it. This is evident from the 10</w:t>
-      </w:r>
-      <w:r>
-        <w:rPr>
-          <w:vertAlign w:val="superscript"/>
-        </w:rPr>
-        <w:t>19.5</w:t>
-      </w:r>
-      <w:r>
-        <w:t xml:space="preserve"> kg example: when only two independent simulations support the local combination, being numerically inside the training range is insufficient.</w:t>
+        <w:t>Different questions are addressed by the matching and ablation analysis. Although matching cases demonstrate that spin or velocity can become more significant under specific encounter settings, periapsis is generally the strongest.</w:t>
       </w:r>
     </w:p>
     <w:p>
@@ -5774,8 +5821,7 @@
         <w:jc w:val="both"/>
       </w:pPr>
       <w:r>
-        <w:lastRenderedPageBreak/>
-        <w:t>Different questions are addressed by the matching and ablation analysis. Although matching cases demonstrate that spin or velocity can become more significant under specific encounter settings, periapsis is generally the strongest.</w:t>
+        <w:t>Compared to BMF, fragmentation requires more prudence. Strong fragmentation is possible but not guaranteed by close periapsis, and the number of pieces is directly altered by the FoF connecting length. Therefore, rather than taking the place of BMF, fragment count and largest-remnant metrics offer additional information. Strong breakup does not always result in much bound debris, therefore the procedure separates breakup severity from Mars-bound retention.</w:t>
       </w:r>
     </w:p>
     <w:p>
@@ -5784,8 +5830,32 @@
         <w:jc w:val="both"/>
       </w:pPr>
       <w:r>
-        <w:t>Compared to BMF, fragmentation requires more prudence. Strong fragmentation is possible but not guaranteed by close periapsis, and the number of pieces is directly altered by the FoF connecting length. Therefore, rather than taking the place of BMF, fragment count and largest-remnant metrics offer additional information. Strong breakup does not always result in much bound debris, therefore the procedure separates breakup severity from Mars-bound retention.</w:t>
-      </w:r>
+        <w:t>All things considered, the ML model is a quick screening method for the current SPH archive. Poorly sampled cases, transition regions, and issues requiring certain fragment attributes still require SPH.</w:t>
+      </w:r>
+    </w:p>
+    <w:p>
+      <w:pPr>
+        <w:pStyle w:val="Heading1"/>
+      </w:pPr>
+      <w:bookmarkStart w:id="51" w:name="_Toc238149749"/>
+      <w:bookmarkStart w:id="52" w:name="_Toc238575689"/>
+      <w:r>
+        <w:t>5. Conclusions, Limitations and Future Work</w:t>
+      </w:r>
+      <w:bookmarkEnd w:id="51"/>
+      <w:bookmarkEnd w:id="52"/>
+    </w:p>
+    <w:p>
+      <w:pPr>
+        <w:pStyle w:val="Heading2"/>
+      </w:pPr>
+      <w:bookmarkStart w:id="53" w:name="_Toc238149750"/>
+      <w:bookmarkStart w:id="54" w:name="_Toc238575690"/>
+      <w:r>
+        <w:t>5.1 Conclusions and Answers to the Research Questions</w:t>
+      </w:r>
+      <w:bookmarkEnd w:id="53"/>
+      <w:bookmarkEnd w:id="54"/>
     </w:p>
     <w:p>
       <w:pPr>
@@ -5793,32 +5863,14 @@
         <w:jc w:val="both"/>
       </w:pPr>
       <w:r>
-        <w:t>All things considered, the ML model is a quick screening method for the current SPH archive. Poorly sampled cases, transition regions, and issues requiring certain fragment attributes still require SPH.</w:t>
-      </w:r>
-    </w:p>
-    <w:p>
-      <w:pPr>
-        <w:pStyle w:val="Heading1"/>
-      </w:pPr>
-      <w:bookmarkStart w:id="51" w:name="_Toc238149749"/>
-      <w:bookmarkStart w:id="52" w:name="_Toc238575689"/>
-      <w:r>
-        <w:t>5. Conclusions, Limitations and Future Work</w:t>
-      </w:r>
-      <w:bookmarkEnd w:id="51"/>
-      <w:bookmarkEnd w:id="52"/>
-    </w:p>
-    <w:p>
-      <w:pPr>
-        <w:pStyle w:val="Heading2"/>
-      </w:pPr>
-      <w:bookmarkStart w:id="53" w:name="_Toc238149750"/>
-      <w:bookmarkStart w:id="54" w:name="_Toc238575690"/>
-      <w:r>
-        <w:t>5.1 Conclusions and Answers to the Research Questions</w:t>
-      </w:r>
-      <w:bookmarkEnd w:id="53"/>
-      <w:bookmarkEnd w:id="54"/>
+        <w:t xml:space="preserve">This study sought to determine which inputs are most important for fragment creation and retained debris, how orbital and physical characteristics affect disruption and bound retention, and whether </w:t>
+      </w:r>
+      <w:r>
+        <w:t>ML</w:t>
+      </w:r>
+      <w:r>
+        <w:t xml:space="preserve"> can forecast outcomes while indicating when its predictions should be believed. Below is a summary of the responses.</w:t>
+      </w:r>
     </w:p>
     <w:p>
       <w:pPr>
@@ -5826,13 +5878,25 @@
         <w:jc w:val="both"/>
       </w:pPr>
       <w:r>
-        <w:t xml:space="preserve">This study sought to determine which inputs are most important for fragment creation and retained debris, how orbital and physical characteristics affect disruption and bound retention, and whether </w:t>
-      </w:r>
-      <w:r>
-        <w:t>ML</w:t>
-      </w:r>
-      <w:r>
-        <w:t xml:space="preserve"> can forecast outcomes while indicating when its predictions should be believed. Below is a summary of the responses.</w:t>
+        <w:t>Q</w:t>
+      </w:r>
+      <w:r>
+        <w:t>uestion 1:</w:t>
+      </w:r>
+      <w:r>
+        <w:t xml:space="preserve"> How do orbital and physical parameters </w:t>
+      </w:r>
+      <w:r>
+        <w:t>affect disruption and bound retention</w:t>
+      </w:r>
+      <w:r>
+        <w:t xml:space="preserve">? </w:t>
+      </w:r>
+      <w:r>
+        <w:t xml:space="preserve">Although the impact varies depending on the other inputs, closer and slower contacts typically retain more debris. In the representative controlled test, </w:t>
+      </w:r>
+      <w:r>
+        <w:t>predicted BMF generally decreases from roughly 27% at 1.2 Mars radii to approximately zero by about 2.5 Mars radii as periapsis increases. A similarly clear decline occurs as encounter speed increases, from roughly 25% at low velocity to approximately zero by about 1.2 km/s. Rather than being universal thresholds, these reactions are condition specific. Mass and spin alter the outcome, speed alters the encounter and capture conditions, and periapsis regulates tidal power.</w:t>
       </w:r>
     </w:p>
     <w:p>
@@ -5844,22 +5908,44 @@
         <w:t>Q</w:t>
       </w:r>
       <w:r>
-        <w:t>uestion 1:</w:t>
-      </w:r>
-      <w:r>
-        <w:t xml:space="preserve"> How do orbital and physical parameters </w:t>
-      </w:r>
-      <w:r>
-        <w:t>affect disruption and bound retention</w:t>
-      </w:r>
-      <w:r>
-        <w:t xml:space="preserve">? </w:t>
-      </w:r>
-      <w:r>
-        <w:t xml:space="preserve">Although the impact varies depending on the other inputs, closer and slower contacts typically retain more debris. In the representative controlled test, </w:t>
-      </w:r>
-      <w:r>
-        <w:t>predicted BMF generally decreases from roughly 27% at 1.2 Mars radii to approximately zero by about 2.5 Mars radii as periapsis increases. A similarly clear decline occurs as encounter speed increases, from roughly 25% at low velocity to approximately zero by about 1.2 km/s. Rather than being universal thresholds, these reactions are condition specific. Mass and spin alter the outcome, speed alters the encounter and capture conditions, and periapsis regulates tidal power.</w:t>
+        <w:t>uestion 2:</w:t>
+      </w:r>
+      <w:r>
+        <w:t xml:space="preserve"> </w:t>
+      </w:r>
+      <w:r>
+        <w:t>Which</w:t>
+      </w:r>
+      <w:r>
+        <w:t xml:space="preserve"> inputs matter most for retained debris? </w:t>
+      </w:r>
+      <w:r>
+        <w:t xml:space="preserve">There is no single universal ranking under all encounter conditions. </w:t>
+      </w:r>
+      <w:r>
+        <w:t xml:space="preserve">For BMF, the tuned Gradient Boosting input-removal analysis </w:t>
+      </w:r>
+      <w:r>
+        <w:lastRenderedPageBreak/>
+        <w:t xml:space="preserve">identifies periapsis as the strongest overall physical input, with its removal causing the largest decrease in performance (ΔR² = </w:t>
+      </w:r>
+      <w:r>
+        <w:t>-</w:t>
+      </w:r>
+      <w:r>
+        <w:t>0.574), followed by spin (</w:t>
+      </w:r>
+      <w:r>
+        <w:t>-</w:t>
+      </w:r>
+      <w:r>
+        <w:t>0.316) and velocity (</w:t>
+      </w:r>
+      <w:r>
+        <w:t>-</w:t>
+      </w:r>
+      <w:r>
+        <w:t>0.296). However, matched cases show that their relative importance changes locally.</w:t>
       </w:r>
     </w:p>
     <w:p>
@@ -5871,40 +5957,34 @@
         <w:t>Q</w:t>
       </w:r>
       <w:r>
-        <w:t>uestion 2:</w:t>
+        <w:t>uestion 3:</w:t>
       </w:r>
       <w:r>
         <w:t xml:space="preserve"> </w:t>
       </w:r>
       <w:r>
-        <w:t>Which</w:t>
-      </w:r>
-      <w:r>
-        <w:t xml:space="preserve"> inputs matter most for retained debris? </w:t>
-      </w:r>
-      <w:r>
-        <w:t xml:space="preserve">There is no single universal ranking under all encounter conditions. </w:t>
-      </w:r>
-      <w:r>
-        <w:t xml:space="preserve">For BMF, the tuned Gradient Boosting input-removal analysis identifies periapsis as the strongest overall physical input, with its removal causing the largest decrease in performance (ΔR² = </w:t>
-      </w:r>
-      <w:r>
-        <w:t>-</w:t>
-      </w:r>
-      <w:r>
-        <w:t>0.574), followed by spin (</w:t>
-      </w:r>
-      <w:r>
-        <w:t>-</w:t>
-      </w:r>
-      <w:r>
-        <w:t>0.316) and velocity (</w:t>
-      </w:r>
-      <w:r>
-        <w:t>-</w:t>
-      </w:r>
-      <w:r>
-        <w:t>0.296). However, matched cases show that their relative importance changes locally.</w:t>
+        <w:t>Can machine-learning models predict outcomes within the sampled data while showing when a prediction should or should not be trusted</w:t>
+      </w:r>
+      <w:r>
+        <w:t xml:space="preserve">? </w:t>
+      </w:r>
+      <w:r>
+        <w:t xml:space="preserve">Yes, in cases where the SPH archive supports comparable input combinations. The primary tuned Gradient Boosting model using the original </w:t>
+      </w:r>
+      <w:r>
+        <w:t>scenario</w:t>
+      </w:r>
+      <w:r>
+        <w:t xml:space="preserve"> inputs obtains a grouped cross-validated R² of 0.9234, MAE of 0.0159, and RMSE of 0.0257. Adding physics-derived features produces only a small further change to R² = 0.9240 and MAE = 0.0155, with RMSE unchanged at 0.0257, so the simpler tuned model is retained. Performance is not equally dependable everywhere, however. Despite the input values falling within the numerical training ranges, held-out errors increase to roughly 0.08 BMF, or 8 percentage points, in the sparsely sampled 10</w:t>
+      </w:r>
+      <w:r>
+        <w:rPr>
+          <w:vertAlign w:val="superscript"/>
+        </w:rPr>
+        <w:t>19.5</w:t>
+      </w:r>
+      <w:r>
+        <w:t xml:space="preserve"> kg example. This demonstrates that being within the overall input range is insufficient for a reliable prediction; comparable SPH cases must also exist nearby in the sampled parameter space. Thus, ML can support rapid screening and simulation prioritisation, while sparse, edge, transition, or poorly supported cases still require additional SPH investigation.</w:t>
       </w:r>
     </w:p>
     <w:p>
@@ -5913,42 +5993,20 @@
         <w:jc w:val="both"/>
       </w:pPr>
       <w:r>
-        <w:t>Q</w:t>
-      </w:r>
-      <w:r>
-        <w:t>uestion 3:</w:t>
-      </w:r>
-      <w:r>
-        <w:t xml:space="preserve"> </w:t>
-      </w:r>
-      <w:r>
-        <w:t>Can machine-learning models predict outcomes within the sampled data while showing when a prediction should or should not be trusted</w:t>
-      </w:r>
-      <w:r>
-        <w:t xml:space="preserve">? </w:t>
-      </w:r>
-      <w:r>
-        <w:t xml:space="preserve">Yes, in cases where the SPH archive supports comparable input combinations. The primary tuned Gradient Boosting model using the original </w:t>
-      </w:r>
-      <w:r>
-        <w:t>scenario</w:t>
-      </w:r>
-      <w:r>
-        <w:t xml:space="preserve"> inputs obtains a grouped cross-validated R² of 0.9234, MAE of 0.0159, and </w:t>
-      </w:r>
-      <w:r>
-        <w:lastRenderedPageBreak/>
-        <w:t>RMSE of 0.0257. Adding physics-derived features produces only a small further change to R² = 0.9240 and MAE = 0.0155, with RMSE unchanged at 0.0257, so the simpler tuned model is retained. Performance is not equally dependable everywhere, however. Despite the input values falling within the numerical training ranges, held-out errors increase to roughly 0.08 BMF, or 8 percentage points, in the sparsely sampled 10</w:t>
-      </w:r>
-      <w:r>
-        <w:rPr>
-          <w:vertAlign w:val="superscript"/>
-        </w:rPr>
-        <w:t>19.5</w:t>
-      </w:r>
-      <w:r>
-        <w:t xml:space="preserve"> kg example. This demonstrates that being within the overall input range is insufficient for a reliable prediction; comparable SPH cases must also exist nearby in the sampled parameter space. Thus, ML can support rapid screening and simulation prioritisation, while sparse, edge, transition, or poorly supported cases still require additional SPH investigation.</w:t>
-      </w:r>
+        <w:t>Overall, the project shows that tidal-disruption outcomes depend on interacting physical conditions rather than one universal ranking of parameters. Machine learning makes the existing SPH archive faster to explore, shows where predictions are well supported, and highlights where new simulations would be most useful. It complements SPH rather than replacing the simulation physics.</w:t>
+      </w:r>
+    </w:p>
+    <w:p>
+      <w:pPr>
+        <w:pStyle w:val="Heading2"/>
+      </w:pPr>
+      <w:bookmarkStart w:id="55" w:name="_Toc238149751"/>
+      <w:bookmarkStart w:id="56" w:name="_Toc238575691"/>
+      <w:r>
+        <w:t>5.2 Limitations</w:t>
+      </w:r>
+      <w:bookmarkEnd w:id="55"/>
+      <w:bookmarkEnd w:id="56"/>
     </w:p>
     <w:p>
       <w:pPr>
@@ -5956,20 +6014,8 @@
         <w:jc w:val="both"/>
       </w:pPr>
       <w:r>
-        <w:t>Overall, the project shows that tidal-disruption outcomes depend on interacting physical conditions rather than one universal ranking of parameters. Machine learning makes the existing SPH archive faster to explore, shows where predictions are well supported, and highlights where new simulations would be most useful. It complements SPH rather than replacing the simulation physics.</w:t>
-      </w:r>
-    </w:p>
-    <w:p>
-      <w:pPr>
-        <w:pStyle w:val="Heading2"/>
-      </w:pPr>
-      <w:bookmarkStart w:id="55" w:name="_Toc238149751"/>
-      <w:bookmarkStart w:id="56" w:name="_Toc238575691"/>
-      <w:r>
-        <w:t>5.2 Limitations</w:t>
-      </w:r>
-      <w:bookmarkEnd w:id="55"/>
-      <w:bookmarkEnd w:id="56"/>
+        <w:t>The simulation archive's short size and uneven sampling are its primary drawbacks. A single SPH simulation can be analysed in multiple ways, hence many rows are not independent physical evidence. Although it is unable to produce missing simulations, group validation keeps the test score from becoming unduly optimistic. Even when each individual input value falls between its reported minimum and maximum, predictions are still unclear for combinations that are poorly sampled, close to the data's edges, or outside the combinations observed during training.</w:t>
+      </w:r>
     </w:p>
     <w:p>
       <w:pPr>
@@ -5977,7 +6023,7 @@
         <w:jc w:val="both"/>
       </w:pPr>
       <w:r>
-        <w:t>The simulation archive's short size and uneven sampling are its primary drawbacks. A single SPH simulation can be analysed in multiple ways, hence many rows are not independent physical evidence. Although it is unable to produce missing simulations, group validation keeps the test score from becoming unduly optimistic. Even when each individual input value falls between its reported minimum and maximum, predictions are still unclear for combinations that are poorly sampled, close to the data's edges, or outside the combinations observed during training.</w:t>
+        <w:t xml:space="preserve">Additionally, instead of solving the physical laws directly, the ML model learns patterns from SPH results. It does not follow the subsequent orbits of fragments and does not impose conservation of mass, momentum, energy, or angular momentum. Therefore, a reliable BMF prediction cannot determine whether debris accumulates into moons, forms a disk, or endures for a long time. Additionally, fragment measurements are more sensitive to the FoF connecting length employed in post-processing and are noisier than BMF. </w:t>
       </w:r>
     </w:p>
     <w:p>
@@ -5986,8 +6032,30 @@
         <w:jc w:val="both"/>
       </w:pPr>
       <w:r>
-        <w:t xml:space="preserve">Additionally, instead of solving the physical laws directly, the ML model learns patterns from SPH results. It does not follow the subsequent orbits of fragments and does not impose conservation of mass, momentum, energy, or angular momentum. Therefore, a reliable BMF prediction cannot determine whether debris accumulates into moons, forms a disk, or endures for a long time. Additionally, fragment measurements are more sensitive to the FoF connecting length employed in post-processing and are noisier than BMF. </w:t>
-      </w:r>
+        <w:t xml:space="preserve">Higher grouped-validation scores are obtained by exploratory XGBoost and hurdle models, but more testing is necessary before they can take the place of the primary </w:t>
+      </w:r>
+      <w:r>
+        <w:t>Gradient Boosting</w:t>
+      </w:r>
+      <w:r>
+        <w:t xml:space="preserve">. Because </w:t>
+      </w:r>
+      <w:r>
+        <w:lastRenderedPageBreak/>
+        <w:t>outcome-derived quantities are not known prior to simulation, models that employ them are not appropriate for pre-SPH screening.</w:t>
+      </w:r>
+    </w:p>
+    <w:p>
+      <w:pPr>
+        <w:pStyle w:val="Heading2"/>
+      </w:pPr>
+      <w:bookmarkStart w:id="57" w:name="_Toc238149752"/>
+      <w:bookmarkStart w:id="58" w:name="_Toc238575692"/>
+      <w:r>
+        <w:t>5.3 Future Work</w:t>
+      </w:r>
+      <w:bookmarkEnd w:id="57"/>
+      <w:bookmarkEnd w:id="58"/>
     </w:p>
     <w:p>
       <w:pPr>
@@ -5995,44 +6063,13 @@
         <w:jc w:val="both"/>
       </w:pPr>
       <w:r>
-        <w:t xml:space="preserve">Higher grouped-validation scores are obtained by exploratory XGBoost and hurdle models, but more testing is necessary before they can take the place of the primary </w:t>
-      </w:r>
-      <w:r>
-        <w:t>Gradient Boosting</w:t>
-      </w:r>
-      <w:r>
-        <w:t>. Because outcome-derived quantities are not known prior to simulation, models that employ them are not appropriate for pre-SPH screening.</w:t>
-      </w:r>
-    </w:p>
-    <w:p>
-      <w:pPr>
-        <w:pStyle w:val="Heading2"/>
-      </w:pPr>
-      <w:bookmarkStart w:id="57" w:name="_Toc238149752"/>
-      <w:bookmarkStart w:id="58" w:name="_Toc238575692"/>
-      <w:r>
-        <w:t>5.3 Future Work</w:t>
-      </w:r>
-      <w:bookmarkEnd w:id="57"/>
-      <w:bookmarkEnd w:id="58"/>
-    </w:p>
-    <w:p>
-      <w:pPr>
-        <w:spacing w:before="240" w:after="240" w:line="276" w:lineRule="auto"/>
-        <w:jc w:val="both"/>
-      </w:pPr>
-      <w:r>
         <w:t xml:space="preserve">The highest priority for future work is to run new SPH simulations in poorly covered mass-periapsis-velocity-spin combinations, especially near the change between retained and zero BMF. More matched groups should </w:t>
       </w:r>
       <w:r>
         <w:t xml:space="preserve">repeat </w:t>
       </w:r>
       <w:r>
-        <w:t xml:space="preserve">comparison at other masses and resolutions while keeping </w:t>
-      </w:r>
-      <w:r>
-        <w:lastRenderedPageBreak/>
-        <w:t xml:space="preserve">processing choices fixed. </w:t>
+        <w:t xml:space="preserve">comparison at other masses and resolutions while keeping processing choices fixed. </w:t>
       </w:r>
       <w:r>
         <w:t>It would be possible to determine whether the stronger spin disparities also occur in other groups by reporting the BMF range together with the actual BMF values and the number of independent simulations. It would be more robust to test the model on whole new SPH runs created after training rather than repeatedly dividing the current library.</w:t>
@@ -6190,6 +6227,7 @@
         <w:rPr>
           <w:color w:val="000000" w:themeColor="text1"/>
         </w:rPr>
+        <w:lastRenderedPageBreak/>
         <w:t>Friedman, J. H. (2001). Greedy function approximation: A gradient boosting machine. Annals of Statistics, 29(5), 1189-1232. doi:10.1214/aos/1013203451.</w:t>
       </w:r>
     </w:p>
@@ -6222,7 +6260,6 @@
         <w:rPr>
           <w:color w:val="000000" w:themeColor="text1"/>
         </w:rPr>
-        <w:lastRenderedPageBreak/>
         <w:t>Kegerreis, J. A., Lissauer, J. J., Eke, V. R., Sandnes, T. D. &amp; Elphic, R. C. (2024). Origin of Mars’s moons by disruptive partial capture of an asteroid. Icarus, Article 116337. doi:10.1016/j.icarus.2024.116337.</w:t>
       </w:r>
     </w:p>

</xml_diff>

<commit_message>
docs: update conclusion and section 3.6
</commit_message>
<xml_diff>
--- a/deliverables/nny124-final-report.docx
+++ b/deliverables/nny124-final-report.docx
@@ -3049,19 +3049,25 @@
       <w:r>
         <w:t>retained debris; and (3) can machine-learning models predict outcomes within the sampled data while showing when a prediction should or should not be trusted?</w:t>
       </w:r>
+      <w:bookmarkStart w:id="9" w:name="_Toc238149732"/>
     </w:p>
     <w:p>
       <w:pPr>
         <w:pStyle w:val="Heading2"/>
       </w:pPr>
-      <w:bookmarkStart w:id="9" w:name="_Toc238149732"/>
+      <w:bookmarkStart w:id="10" w:name="_Toc238575672"/>
     </w:p>
     <w:p>
       <w:pPr>
         <w:pStyle w:val="Heading2"/>
       </w:pPr>
-      <w:bookmarkStart w:id="10" w:name="_Toc238575672"/>
-      <w:r>
+    </w:p>
+    <w:p>
+      <w:pPr>
+        <w:pStyle w:val="Heading2"/>
+      </w:pPr>
+      <w:r>
+        <w:lastRenderedPageBreak/>
         <w:t>1.2 Significance and Originality</w:t>
       </w:r>
       <w:bookmarkEnd w:id="9"/>
@@ -3073,7 +3079,6 @@
         <w:jc w:val="both"/>
       </w:pPr>
       <w:r>
-        <w:lastRenderedPageBreak/>
         <w:t xml:space="preserve">The work </w:t>
       </w:r>
       <w:r>
@@ -3176,17 +3181,14 @@
         <w:jc w:val="both"/>
       </w:pPr>
       <w:r>
+        <w:lastRenderedPageBreak/>
         <w:t>The particle-level SPH outputs are transformed into scalar outcomes through post-processing, creating a compact tabular dataset appropriate for machine learning</w:t>
       </w:r>
       <w:r>
         <w:t xml:space="preserve"> (ML)</w:t>
       </w:r>
       <w:r>
-        <w:t xml:space="preserve">. Because tree-based models perform well with tiny, nonlinear tabular datasets, this makes the problem a good fit for </w:t>
-      </w:r>
-      <w:r>
-        <w:lastRenderedPageBreak/>
-        <w:t>machine learning (Grinsztajn et al., 2022). In the past, outcomes from comparable SPH collision and giant-impact simulations have also been predicted using tree-based ML surrogate models (Cambioni et al., 2019; Timpe et al., 2020). They are still not widely used for asteroid tidal-disruption encounters, though.</w:t>
+        <w:t>. Because tree-based models perform well with tiny, nonlinear tabular datasets, this makes the problem a good fit for machine learning (Grinsztajn et al., 2022). In the past, outcomes from comparable SPH collision and giant-impact simulations have also been predicted using tree-based ML surrogate models (Cambioni et al., 2019; Timpe et al., 2020). They are still not widely used for asteroid tidal-disruption encounters, though.</w:t>
       </w:r>
     </w:p>
     <w:p>
@@ -3675,6 +3677,7 @@
               <w:jc w:val="both"/>
             </w:pPr>
             <w:r>
+              <w:lastRenderedPageBreak/>
               <w:t>Spin</w:t>
             </w:r>
           </w:p>
@@ -3688,11 +3691,7 @@
               <w:spacing w:before="240" w:after="240" w:line="276" w:lineRule="auto"/>
             </w:pPr>
             <w:r>
-              <w:t xml:space="preserve">No spin; equatorial x- or y-axis spin; prograde z-axis spin; retrograde </w:t>
-            </w:r>
-            <w:r>
-              <w:lastRenderedPageBreak/>
-              <w:t>z-axis spin; unevenly sampled</w:t>
+              <w:t>No spin; equatorial x- or y-axis spin; prograde z-axis spin; retrograde z-axis spin; unevenly sampled</w:t>
             </w:r>
           </w:p>
         </w:tc>
@@ -3706,7 +3705,6 @@
               <w:jc w:val="both"/>
             </w:pPr>
             <w:r>
-              <w:lastRenderedPageBreak/>
               <w:t>Rotation state of the asteroid. Spin can alter the disruption and bound-retention outcome, and the available spin states are unevenly sampled.</w:t>
             </w:r>
           </w:p>
@@ -3887,7 +3885,11 @@
         <w:jc w:val="both"/>
       </w:pPr>
       <w:r>
-        <w:t>For the prediction tasks, several baseline models were used. Logistic Regression models the probability of a case belonging to one of two classes from the input features, so it is used as a simple baseline for the BMF ≥ 10% classification task (Knauer et al., 2024). Random Forest combines many decision trees fitted to different samples of the data and averages their predictions, allowing it to capture nonlinear relationships while reducing sensitivity to individual cases (Breiman, 2001; Cambioni et al., 2019). Gradient Boosting also combines decision trees, but builds them sequentially so that each new tree reduces errors left by the previous trees. This can capture more detailed changes between encounter settings (Friedman, 2001; Valencia et al., 2019; Timpe et al., 2020).</w:t>
+        <w:t xml:space="preserve">For the prediction tasks, several baseline models were used. Logistic Regression models the probability of a case belonging to one of two classes from the input features, so it is used as a simple baseline for the BMF ≥ 10% classification task (Knauer et al., 2024). Random Forest combines many decision trees fitted to different samples of the data and averages their predictions, allowing it to capture nonlinear relationships while reducing sensitivity to individual cases </w:t>
+      </w:r>
+      <w:r>
+        <w:lastRenderedPageBreak/>
+        <w:t>(Breiman, 2001; Cambioni et al., 2019). Gradient Boosting also combines decision trees, but builds them sequentially so that each new tree reduces errors left by the previous trees. This can capture more detailed changes between encounter settings (Friedman, 2001; Valencia et al., 2019; Timpe et al., 2020).</w:t>
       </w:r>
     </w:p>
     <w:p>
@@ -3896,20 +3898,25 @@
         <w:jc w:val="both"/>
       </w:pPr>
       <w:r>
-        <w:lastRenderedPageBreak/>
         <w:t>To determine whether prediction performance could be improved beyond the baseline models, Gradient Boosting hyperparameters were tuned and physics-derived attributes calculated from the original s</w:t>
       </w:r>
       <w:r>
         <w:t xml:space="preserve">cenario </w:t>
       </w:r>
       <w:r>
-        <w:t>inputs were tested as a separate feature-engineering experiment. The tuned Gradient Boosting model using the original inputs was retained as the primary model because the derived features produced no meaningful additional gain (Appendix A</w:t>
+        <w:t>inputs were tested as a separate feature-engineering experiment</w:t>
+      </w:r>
+      <w:r>
+        <w:t xml:space="preserve">. All the hyperparameters and physics-derived attributes can be seen in </w:t>
+      </w:r>
+      <w:r>
+        <w:t>Appendix A</w:t>
       </w:r>
       <w:r>
         <w:t>, Tables A1-A2</w:t>
       </w:r>
       <w:r>
-        <w:t>).</w:t>
+        <w:t>.</w:t>
       </w:r>
     </w:p>
     <w:p>
@@ -4002,7 +4009,11 @@
         <w:jc w:val="both"/>
       </w:pPr>
       <w:r>
-        <w:t>The method also determines whether a new setup is comparable to SPH simulations that are already in the archive because model accuracy alone cannot demonstrate the reliability of each individual forecast because an overall score can conceal areas where the model has insufficient data or produces larger errors. When there are multiple independent SPH simulations and a low held-out prediction error in the surrounding area, predictions are more reliable. When the input combination is outside the sampled region, close to the edge of the available data, or poorly sampled, predictions are deemed less accurate. Figure 5 and section 3.6 provide an analysis of these inspections.</w:t>
+        <w:t xml:space="preserve">The method also determines whether a new setup is comparable to SPH simulations that are already in the archive because model accuracy alone cannot demonstrate the reliability of each individual forecast because an overall score can conceal areas where the model has insufficient data or produces larger errors. When there are multiple independent SPH simulations and a low </w:t>
+      </w:r>
+      <w:r>
+        <w:lastRenderedPageBreak/>
+        <w:t>held-out prediction error in the surrounding area, predictions are more reliable. When the input combination is outside the sampled region, close to the edge of the available data, or poorly sampled, predictions are deemed less accurate. Figure 5 and section 3.6 provide an analysis of these inspections.</w:t>
       </w:r>
     </w:p>
     <w:p>
@@ -4011,7 +4022,6 @@
         <w:jc w:val="both"/>
       </w:pPr>
       <w:r>
-        <w:lastRenderedPageBreak/>
         <w:t>The final decision then separates two questions: (1) how strongly the asteroid breaks up, and (2) how much material remains bound to Mars. Breakup is described by the largest-remnant fraction f</w:t>
       </w:r>
       <w:r>
@@ -4260,7 +4270,11 @@
         <w:jc w:val="both"/>
       </w:pPr>
       <w:r>
-        <w:t xml:space="preserve">Although close interactions do not always result in strong fragmentation or high BMF, Figure 1 illustrates that both fragmentation and bound retention typically decrease as periapsis increases. The mean BMF rises with tiny periapsis and falls with increasing encounter speed. The relative impacts also vary throughout the sampling range: separation between spin states becomes more apparent around 1.7-2.0 Mars radii, whereas velocity differences are more noticeable at roughly 1.1-1.6 Mars radii. </w:t>
+        <w:t xml:space="preserve">Although close interactions do not always result in strong fragmentation or high BMF, Figure 1 illustrates that both fragmentation and bound retention typically decrease as periapsis increases. The mean BMF rises with tiny periapsis and falls with increasing encounter speed. The relative </w:t>
+      </w:r>
+      <w:r>
+        <w:lastRenderedPageBreak/>
+        <w:t xml:space="preserve">impacts also vary throughout the sampling range: separation between spin states becomes more apparent around 1.7-2.0 Mars radii, whereas velocity differences are more noticeable at roughly 1.1-1.6 Mars radii. </w:t>
       </w:r>
       <w:r>
         <w:t>Some prograde-spin cases retain non-zero BMF to larger periapsis, although these regions are more sparsely sampled.</w:t>
@@ -4272,7 +4286,6 @@
         <w:jc w:val="both"/>
       </w:pPr>
       <w:r>
-        <w:lastRenderedPageBreak/>
         <w:t>The combined BMF graph is highly irregular because it has simulations from different asteroid-mass regimes, and separating the mass cases shows that this apparent scatter shows that the bound mass is regime-depend</w:t>
       </w:r>
       <w:r>
@@ -4403,6 +4416,7 @@
         <w:jc w:val="center"/>
       </w:pPr>
       <w:r>
+        <w:lastRenderedPageBreak/>
         <w:drawing>
           <wp:inline distT="0" distB="0" distL="0" distR="0" wp14:anchorId="3675A28B" wp14:editId="4E9415DE">
             <wp:extent cx="3915084" cy="2714625"/>
@@ -4489,7 +4503,6 @@
       <w:bookmarkStart w:id="34" w:name="_Toc238149743"/>
       <w:bookmarkStart w:id="35" w:name="_Toc238575683"/>
       <w:r>
-        <w:lastRenderedPageBreak/>
         <w:t>3.3 Model Performance and Screening Use</w:t>
       </w:r>
       <w:bookmarkEnd w:id="34"/>
@@ -4667,6 +4680,7 @@
         <w:jc w:val="both"/>
       </w:pPr>
       <w:r>
+        <w:lastRenderedPageBreak/>
         <w:t>A different response is required for fragmentation. The most extreme fragmentation in the SPH data requires very small periapsis, yet a close encounter does not ensure significant breakdown. FoF connecting length has a direct impact on fragment count as well. This analysis does not provide a single, straightforward global ranking for fragmentation because of this. While the actual fragment pattern depends on the entire encounter and how fragments are gathered during post-processing, periapsis indicates where the largest disruption may occur.</w:t>
       </w:r>
     </w:p>
@@ -4698,7 +4712,6 @@
         <w:jc w:val="center"/>
       </w:pPr>
       <w:r>
-        <w:lastRenderedPageBreak/>
         <w:drawing>
           <wp:inline distT="0" distB="0" distL="0" distR="0" wp14:anchorId="4F709962" wp14:editId="6A63C568">
             <wp:extent cx="5943600" cy="4037330"/>
@@ -4811,6 +4824,7 @@
           <w:noProof w:val="0"/>
           <w:lang w:val="en-US"/>
         </w:rPr>
+        <w:lastRenderedPageBreak/>
         <w:t>Figure 3 compares controlled profiles in which one scenario input is varied while the others are fixed to a representative, well-supported combination. The fixed conditions may differ between panels, so the profiles show conditional responses rather than directly comparable effect sizes.</w:t>
       </w:r>
     </w:p>
@@ -4881,7 +4895,6 @@
         <w:jc w:val="center"/>
       </w:pPr>
       <w:r>
-        <w:lastRenderedPageBreak/>
         <w:drawing>
           <wp:inline distT="0" distB="0" distL="0" distR="0" wp14:anchorId="13192738" wp14:editId="4176F7E7">
             <wp:extent cx="5942960" cy="2514600"/>
@@ -5048,7 +5061,11 @@
         <w:jc w:val="both"/>
       </w:pPr>
       <w:r>
-        <w:t>Figure 4 shows that the magnitude of both spin and velocity effects changes with periapsis and the surrounding encounter conditions. Neither parameter has a constant effect across the sampled range: spin produces larger BMF differences in some regimes</w:t>
+        <w:t xml:space="preserve">Figure 4 shows that the magnitude of both spin and velocity effects changes with periapsis and the surrounding encounter conditions. Neither parameter has a constant effect across the sampled </w:t>
+      </w:r>
+      <w:r>
+        <w:lastRenderedPageBreak/>
+        <w:t>range: spin produces larger BMF differences in some regimes</w:t>
       </w:r>
       <w:r>
         <w:t>/predominates under some situations</w:t>
@@ -5087,7 +5104,6 @@
         <w:jc w:val="both"/>
       </w:pPr>
       <w:r>
-        <w:lastRenderedPageBreak/>
         <w:t>Because the model depends on input combinations, a case may fall inside the range of each individual input and yet have inadequate support. Thus, held-out error and pairwise parameter coverage are compared with local simulation coverage in Figure 5. Individual input ranges conceal unsampled combinations, which are revealed by pairwise mapping. Only when comparable SPH cases are close by in the input space is a prediction regarded as interpolation.</w:t>
       </w:r>
     </w:p>
@@ -5219,23 +5235,67 @@
     </w:p>
     <w:p>
       <w:pPr>
-        <w:spacing w:before="240" w:after="240" w:line="276" w:lineRule="auto"/>
         <w:jc w:val="both"/>
       </w:pPr>
-      <w:commentRangeStart w:id="46"/>
-      <w:r>
-        <w:t>A specific illustration of this issue for the sparsely sampled 10</w:t>
-      </w:r>
-      <w:r>
-        <w:rPr>
-          <w:vertAlign w:val="superscript"/>
-        </w:rPr>
-        <w:t>19.5</w:t>
-      </w:r>
-      <w:r>
-        <w:t xml:space="preserve"> kg asteroid mass is provided in Table 2. At periapsis 1.2 and 1.6 Mars radii, when five post-processing rows are provided but only one independent physical SPH simulation supports each periapsis, it compares the true BMF, held-out prediction, and absolute error.</w:t>
-      </w:r>
-    </w:p>
+      <w:bookmarkStart w:id="46" w:name="_Toc238151451"/>
+      <w:commentRangeStart w:id="47"/>
+      <w:r>
+        <w:lastRenderedPageBreak/>
+        <w:t xml:space="preserve">A </w:t>
+      </w:r>
+      <w:r>
+        <w:t>specific case</w:t>
+      </w:r>
+      <w:r>
+        <w:t xml:space="preserve"> of this issue </w:t>
+      </w:r>
+      <w:r>
+        <w:t>can be seen from this</w:t>
+      </w:r>
+      <w:r>
+        <w:t xml:space="preserve"> two sparsely sampled periapsis-velocity cells in Table 2. At a fixed periapsis of 1.4 Mars radii, the </w:t>
+      </w:r>
+      <w:r>
+        <w:t>v</w:t>
+      </w:r>
+      <w:r>
+        <w:rPr>
+          <w:vertAlign w:val="subscript"/>
+        </w:rPr>
+        <w:t>∞</w:t>
+      </w:r>
+      <w:r>
+        <w:t xml:space="preserve"> = 0.8</w:t>
+      </w:r>
+      <w:r>
+        <w:rPr>
+          <w:rFonts w:ascii="infinity" w:hAnsi="infinity"/>
+        </w:rPr>
+        <w:t xml:space="preserve"> </w:t>
+      </w:r>
+      <w:r>
+        <w:t>and</w:t>
+      </w:r>
+      <w:r>
+        <w:t xml:space="preserve"> 1.0</w:t>
+      </w:r>
+      <w:r>
+        <w:t xml:space="preserve"> km/s cells each contain only one unique physical SPH simulation </w:t>
+      </w:r>
+      <w:r>
+        <w:t xml:space="preserve">(see </w:t>
+      </w:r>
+      <w:r>
+        <w:t>Figure 5</w:t>
+      </w:r>
+      <w:r>
+        <w:t>)</w:t>
+      </w:r>
+      <w:r>
+        <w:t>. The table compares the observed BMF, held-out prediction, and absolute error.</w:t>
+      </w:r>
+    </w:p>
+    <w:p/>
     <w:p>
       <w:pPr>
         <w:pStyle w:val="Caption"/>
@@ -5246,7 +5306,6 @@
           <w:szCs w:val="20"/>
         </w:rPr>
       </w:pPr>
-      <w:bookmarkStart w:id="47" w:name="_Toc238151451"/>
       <w:r>
         <w:rPr>
           <w:sz w:val="20"/>
@@ -5294,38 +5353,30 @@
           <w:sz w:val="20"/>
           <w:szCs w:val="20"/>
         </w:rPr>
-        <w:t>.  Failure case at asteroid mass 10</w:t>
-      </w:r>
+        <w:t xml:space="preserve">. </w:t>
+      </w:r>
+      <w:bookmarkEnd w:id="46"/>
       <w:r>
         <w:rPr>
           <w:sz w:val="20"/>
           <w:szCs w:val="20"/>
-          <w:vertAlign w:val="superscript"/>
-        </w:rPr>
-        <w:t>19.5</w:t>
+        </w:rPr>
+        <w:t xml:space="preserve">Sparse failure case at periapsis 1.4 Mars radii: both velocity cells are within </w:t>
       </w:r>
       <w:r>
         <w:rPr>
           <w:sz w:val="20"/>
           <w:szCs w:val="20"/>
         </w:rPr>
-        <w:t xml:space="preserve"> kg: the mass is within the sampled range, </w:t>
+        <w:br/>
       </w:r>
       <w:r>
         <w:rPr>
           <w:sz w:val="20"/>
           <w:szCs w:val="20"/>
         </w:rPr>
-        <w:br/>
-      </w:r>
-      <w:r>
-        <w:rPr>
-          <w:sz w:val="20"/>
-          <w:szCs w:val="20"/>
-        </w:rPr>
-        <w:t>but only two unique physical SPH simulations support these cases.</w:t>
-      </w:r>
-      <w:bookmarkEnd w:id="47"/>
+        <w:t>the sampled range but contain only one unique physical SPH simulation.</w:t>
+      </w:r>
     </w:p>
     <w:tbl>
       <w:tblPr>
@@ -5378,7 +5429,7 @@
                 <w:b/>
                 <w:bCs/>
               </w:rPr>
-              <w:t>Periapsis</w:t>
+              <w:t>Velocity</w:t>
             </w:r>
           </w:p>
         </w:tc>
@@ -5507,7 +5558,7 @@
               <w:jc w:val="both"/>
             </w:pPr>
             <w:r>
-              <w:t>1.2</w:t>
+              <w:t>0.8</w:t>
             </w:r>
           </w:p>
         </w:tc>
@@ -5525,7 +5576,7 @@
               <w:jc w:val="both"/>
             </w:pPr>
             <w:r>
-              <w:t>0.496411</w:t>
+              <w:t>0.150849</w:t>
             </w:r>
           </w:p>
         </w:tc>
@@ -5543,7 +5594,7 @@
               <w:jc w:val="both"/>
             </w:pPr>
             <w:r>
-              <w:t>0.5042</w:t>
+              <w:t>0.103632</w:t>
             </w:r>
           </w:p>
         </w:tc>
@@ -5561,7 +5612,7 @@
               <w:jc w:val="both"/>
             </w:pPr>
             <w:r>
-              <w:t>0.0077</w:t>
+              <w:t>0.0472</w:t>
             </w:r>
           </w:p>
         </w:tc>
@@ -5579,7 +5630,7 @@
               <w:jc w:val="both"/>
             </w:pPr>
             <w:r>
-              <w:t>Overpredicts</w:t>
+              <w:t>Undepredicts</w:t>
             </w:r>
           </w:p>
         </w:tc>
@@ -5604,7 +5655,7 @@
               <w:jc w:val="both"/>
             </w:pPr>
             <w:r>
-              <w:t>1.6</w:t>
+              <w:t>1.0</w:t>
             </w:r>
           </w:p>
         </w:tc>
@@ -5622,7 +5673,7 @@
               <w:jc w:val="both"/>
             </w:pPr>
             <w:r>
-              <w:t>0.426741</w:t>
+              <w:t>0.023327</w:t>
             </w:r>
           </w:p>
         </w:tc>
@@ -5640,7 +5691,7 @@
               <w:jc w:val="both"/>
             </w:pPr>
             <w:r>
-              <w:t>0.4658</w:t>
+              <w:t>0.095684</w:t>
             </w:r>
           </w:p>
         </w:tc>
@@ -5658,7 +5709,7 @@
               <w:jc w:val="both"/>
             </w:pPr>
             <w:r>
-              <w:t>0.039</w:t>
+              <w:t>0.0724</w:t>
             </w:r>
           </w:p>
         </w:tc>
@@ -5682,29 +5733,88 @@
         </w:tc>
       </w:tr>
     </w:tbl>
+    <w:commentRangeEnd w:id="47"/>
     <w:p>
       <w:pPr>
         <w:spacing w:before="240" w:after="240" w:line="276" w:lineRule="auto"/>
         <w:jc w:val="both"/>
       </w:pPr>
-      <w:r>
-        <w:lastRenderedPageBreak/>
-        <w:t>This demonstrates that the held-out model overpredicts the 1.6 Mars-radii scenario by 0.0825 BMF and underpredicts the 1.2 Mars-radii case by 0.0779 BMF. The local relationship has not been successfully learned because the errors are both substantial and have opposite signs. Therefore, a new instance in this region should not be believed just because its mass falls between sampled masses</w:t>
-      </w:r>
-      <w:r>
-        <w:t>,</w:t>
-      </w:r>
-      <w:r>
-        <w:t xml:space="preserve"> instead it should be verified with more SPH.</w:t>
-      </w:r>
-      <w:commentRangeEnd w:id="46"/>
       <w:r>
         <w:rPr>
           <w:rStyle w:val="CommentReference"/>
           <w:sz w:val="24"/>
           <w:szCs w:val="24"/>
         </w:rPr>
-        <w:commentReference w:id="46"/>
+        <w:commentReference w:id="47"/>
+      </w:r>
+      <w:r>
+        <w:t>The held-out model underpredicts the</w:t>
+      </w:r>
+      <w:r>
+        <w:t xml:space="preserve"> </w:t>
+      </w:r>
+      <w:r>
+        <w:t>v</w:t>
+      </w:r>
+      <w:r>
+        <w:rPr>
+          <w:vertAlign w:val="subscript"/>
+        </w:rPr>
+        <w:t>∞</w:t>
+      </w:r>
+      <w:r>
+        <w:t xml:space="preserve"> </w:t>
+      </w:r>
+      <w:r>
+        <w:t xml:space="preserve">= 0.8 </w:t>
+      </w:r>
+      <w:r>
+        <w:t xml:space="preserve">km/s case by 0.0472 </w:t>
+      </w:r>
+      <w:r>
+        <w:t>(</w:t>
+      </w:r>
+      <w:r>
+        <w:t>4.7 percentage points</w:t>
+      </w:r>
+      <w:r>
+        <w:t>)</w:t>
+      </w:r>
+      <w:r>
+        <w:t>, but overpredicts the adjacent</w:t>
+      </w:r>
+      <w:r>
+        <w:t xml:space="preserve"> </w:t>
+      </w:r>
+      <w:r>
+        <w:t>v</w:t>
+      </w:r>
+      <w:r>
+        <w:rPr>
+          <w:vertAlign w:val="subscript"/>
+        </w:rPr>
+        <w:t>∞</w:t>
+      </w:r>
+      <w:r>
+        <w:t xml:space="preserve"> = </w:t>
+      </w:r>
+      <w:r>
+        <w:t>1.0</w:t>
+      </w:r>
+      <w:r>
+        <w:t xml:space="preserve"> km/s case by 0.0724 BM</w:t>
+      </w:r>
+      <w:r>
+        <w:t xml:space="preserve"> (</w:t>
+      </w:r>
+      <w:r>
+        <w:t>7.2 percentage points</w:t>
+      </w:r>
+      <w:r>
+        <w:t>)</w:t>
+      </w:r>
+      <w:r>
+        <w:t>. The opposite-sign errors in two neighbouring cells with minimal SPH coverage indicate that the local velocity relationship is not reliably learned in this region. Therefore, being within the overall sampled input range does not guarantee a reliable prediction, and additional SPH simulations would be useful in such sparsely sampled regions.</w:t>
       </w:r>
     </w:p>
     <w:p>
@@ -5782,7 +5892,11 @@
         <w:t>decreases the</w:t>
       </w:r>
       <w:r>
-        <w:t xml:space="preserve"> BMF, Figures 1, 4, and 5 show that retention can still occur under particular combinations of spin, velocity, and mass. This indicates that similar periapsis values can produce different outcomes depending on the full encounter conditions. These relationships are learned from SPH outputs and support interpretation rather than proving physical causality.</w:t>
+        <w:t xml:space="preserve"> BMF, Figures 1, 4, and 5 show that retention can still occur under particular combinations of spin, velocity, and mass. This indicates that similar periapsis values can produce </w:t>
+      </w:r>
+      <w:r>
+        <w:lastRenderedPageBreak/>
+        <w:t>different outcomes depending on the full encounter conditions. These relationships are learned from SPH outputs and support interpretation rather than proving physical causality.</w:t>
       </w:r>
     </w:p>
     <w:p>
@@ -5809,7 +5923,6 @@
         <w:jc w:val="both"/>
       </w:pPr>
       <w:r>
-        <w:lastRenderedPageBreak/>
         <w:t>As a result, ML's usefulness is restricted. It can swiftly filter well-supported input combinations, identify transition zones, uncover situations that yield promising retained mass, and indicate areas where more simulation could yield valuable information. Long-term debris survivability, precise fragment shapes and distributions from BMF alone, and forecasts for inadequately sampled input combinations cannot all be determined by it. This is evident from the 10</w:t>
       </w:r>
       <w:r>
@@ -5897,6 +6010,7 @@
         <w:jc w:val="both"/>
       </w:pPr>
       <w:r>
+        <w:lastRenderedPageBreak/>
         <w:t xml:space="preserve">This study sought to determine which inputs are most important for fragment creation and retained debris, how orbital and physical characteristics affect disruption and bound retention, and whether </w:t>
       </w:r>
       <w:r>
@@ -5975,11 +6089,7 @@
         <w:t>velocity</w:t>
       </w:r>
       <w:r>
-        <w:t xml:space="preserve"> as the strongest overall physical input, with its removal causing the largest </w:t>
-      </w:r>
-      <w:r>
-        <w:lastRenderedPageBreak/>
-        <w:t xml:space="preserve">decrease in performance (ΔR² = </w:t>
+        <w:t xml:space="preserve"> as the strongest overall physical input, with its removal causing the largest decrease in performance (ΔR² = </w:t>
       </w:r>
       <w:r>
         <w:t>-0.508</w:t>
@@ -6062,27 +6172,11 @@
       <w:r>
         <w:t xml:space="preserve">. </w:t>
       </w:r>
-      <w:commentRangeStart w:id="56"/>
-      <w:r>
-        <w:t>Despite the input values falling within the numerical training ranges, held-out errors increase to roughly 0.08 BMF, or 8 percentage points, in the sparsely sampled 10</w:t>
-      </w:r>
-      <w:r>
-        <w:rPr>
-          <w:vertAlign w:val="superscript"/>
-        </w:rPr>
-        <w:t>19.5</w:t>
-      </w:r>
-      <w:r>
-        <w:t xml:space="preserve"> kg example. </w:t>
-      </w:r>
-      <w:commentRangeEnd w:id="56"/>
-      <w:r>
-        <w:rPr>
-          <w:rStyle w:val="CommentReference"/>
-          <w:sz w:val="24"/>
-          <w:szCs w:val="24"/>
-        </w:rPr>
-        <w:commentReference w:id="56"/>
+      <w:r>
+        <w:t>Despite the input values falling within the numerical training ranges, held-out errors could reach about 7.2 percentage points at periapsis 1.4 Mars radii in a sparsely sampled region.</w:t>
+      </w:r>
+      <w:r>
+        <w:t xml:space="preserve"> </w:t>
       </w:r>
       <w:r>
         <w:t>This demonstrates that being within the overall input range is insufficient for a reliable prediction; comparable SPH cases must also exist nearby in the sampled parameter space. Thus, ML can support rapid screening and simulation prioritisation, while sparse, edge, transition, or poorly supported cases still require additional SPH investigation.</w:t>
@@ -6101,13 +6195,13 @@
       <w:pPr>
         <w:pStyle w:val="Heading2"/>
       </w:pPr>
-      <w:bookmarkStart w:id="57" w:name="_Toc238149751"/>
-      <w:bookmarkStart w:id="58" w:name="_Toc238575691"/>
+      <w:bookmarkStart w:id="56" w:name="_Toc238149751"/>
+      <w:bookmarkStart w:id="57" w:name="_Toc238575691"/>
       <w:r>
         <w:t>5.2 Limitations</w:t>
       </w:r>
+      <w:bookmarkEnd w:id="56"/>
       <w:bookmarkEnd w:id="57"/>
-      <w:bookmarkEnd w:id="58"/>
     </w:p>
     <w:p>
       <w:pPr>
@@ -6115,7 +6209,11 @@
         <w:jc w:val="both"/>
       </w:pPr>
       <w:r>
-        <w:t>The simulation archive's short size and uneven sampling are its primary drawbacks. A single SPH simulation can be analysed in multiple ways, hence many rows are not independent physical evidence. Although it is unable to produce missing simulations, group validation keeps the test score from becoming unduly optimistic. Even when each individual input value falls between its reported minimum and maximum, predictions are still unclear for combinations that are poorly sampled, close to the data's edges, or outside the combinations observed during training.</w:t>
+        <w:t xml:space="preserve">The simulation archive's short size and uneven sampling are its primary drawbacks. A single SPH simulation can be analysed in multiple ways, hence many rows are not independent physical </w:t>
+      </w:r>
+      <w:r>
+        <w:lastRenderedPageBreak/>
+        <w:t>evidence. Although it is unable to produce missing simulations, group validation keeps the test score from becoming unduly optimistic. Even when each individual input value falls between its reported minimum and maximum, predictions are still unclear for combinations that are poorly sampled, close to the data's edges, or outside the combinations observed during training.</w:t>
       </w:r>
     </w:p>
     <w:p>
@@ -6131,13 +6229,13 @@
       <w:pPr>
         <w:pStyle w:val="Heading2"/>
       </w:pPr>
-      <w:bookmarkStart w:id="59" w:name="_Toc238149752"/>
-      <w:bookmarkStart w:id="60" w:name="_Toc238575692"/>
+      <w:bookmarkStart w:id="58" w:name="_Toc238149752"/>
+      <w:bookmarkStart w:id="59" w:name="_Toc238575692"/>
       <w:r>
         <w:t>5.3 Future Work</w:t>
       </w:r>
+      <w:bookmarkEnd w:id="58"/>
       <w:bookmarkEnd w:id="59"/>
-      <w:bookmarkEnd w:id="60"/>
     </w:p>
     <w:p>
       <w:pPr>
@@ -6145,11 +6243,7 @@
         <w:jc w:val="both"/>
       </w:pPr>
       <w:r>
-        <w:t xml:space="preserve">The highest priority for future work is to run new SPH simulations in poorly covered mass-periapsis-velocity-spin combinations, especially near the change between retained and zero BMF. </w:t>
-      </w:r>
-      <w:r>
-        <w:lastRenderedPageBreak/>
-        <w:t xml:space="preserve">More matched groups should </w:t>
+        <w:t xml:space="preserve">The highest priority for future work is to run new SPH simulations in poorly covered mass-periapsis-velocity-spin combinations, especially near the change between retained and zero BMF. More matched groups should </w:t>
       </w:r>
       <w:r>
         <w:t xml:space="preserve">repeat </w:t>
@@ -6175,18 +6269,18 @@
       <w:r>
         <w:t>. Stronger physical limitations, multi-output prediction, and uncertainty estimates are possible additional enhancements.</w:t>
       </w:r>
-      <w:bookmarkStart w:id="61" w:name="_Toc238149753"/>
+      <w:bookmarkStart w:id="60" w:name="_Toc238149753"/>
     </w:p>
     <w:p>
       <w:pPr>
         <w:pStyle w:val="Heading1"/>
       </w:pPr>
-      <w:bookmarkStart w:id="62" w:name="_Toc238575693"/>
+      <w:bookmarkStart w:id="61" w:name="_Toc238575693"/>
       <w:r>
         <w:t>References</w:t>
       </w:r>
+      <w:bookmarkEnd w:id="60"/>
       <w:bookmarkEnd w:id="61"/>
-      <w:bookmarkEnd w:id="62"/>
     </w:p>
     <w:p>
       <w:pPr>
@@ -6265,6 +6359,7 @@
         <w:rPr>
           <w:color w:val="000000" w:themeColor="text1"/>
         </w:rPr>
+        <w:lastRenderedPageBreak/>
         <w:t>Chen, T. &amp; Guestrin, C. (2016). XGBoost: A scalable tree boosting system. Proceedings of the 22nd ACM SIGKDD International Conference on Knowledge Discovery and Data Mining, 785-794.</w:t>
       </w:r>
     </w:p>
@@ -6345,7 +6440,6 @@
         <w:rPr>
           <w:color w:val="000000" w:themeColor="text1"/>
         </w:rPr>
-        <w:lastRenderedPageBreak/>
         <w:t>Kegerreis, J. A., Lissauer, J. J., Eke, V. R., Sandnes, T. D. &amp; Elphic, R. C. (2024). Origin of Mars’s moons by disruptive partial capture of an asteroid. Icarus, Article 116337. doi:10.1016/j.icarus.2024.116337.</w:t>
       </w:r>
     </w:p>
@@ -6458,6 +6552,7 @@
         <w:rPr>
           <w:color w:val="000000" w:themeColor="text1"/>
         </w:rPr>
+        <w:lastRenderedPageBreak/>
         <w:t>Villaescusa-Navarro, F. et al. (2021). The CAMELS project: Cosmology and Astrophysics with MachinE Learning Simulations. arXiv:2010.00619.</w:t>
       </w:r>
     </w:p>
@@ -6506,14 +6601,14 @@
       <w:pPr>
         <w:pStyle w:val="Heading1"/>
       </w:pPr>
-      <w:bookmarkStart w:id="63" w:name="_Toc238149754"/>
-      <w:bookmarkStart w:id="64" w:name="_Toc238575694"/>
+      <w:bookmarkStart w:id="62" w:name="_Toc238149754"/>
+      <w:bookmarkStart w:id="63" w:name="_Toc238575694"/>
       <w:r>
         <w:lastRenderedPageBreak/>
         <w:t>Appendix A. Supporting Model Results</w:t>
       </w:r>
+      <w:bookmarkEnd w:id="62"/>
       <w:bookmarkEnd w:id="63"/>
-      <w:bookmarkEnd w:id="64"/>
     </w:p>
     <w:p>
       <w:pPr>
@@ -8015,141 +8110,15 @@
           <w:sz w:val="20"/>
           <w:szCs w:val="20"/>
         </w:rPr>
-        <w:lastRenderedPageBreak/>
         <w:br/>
       </w:r>
-    </w:p>
-    <w:p>
-      <w:pPr>
-        <w:keepNext/>
-        <w:spacing w:line="276" w:lineRule="auto"/>
-        <w:jc w:val="center"/>
-        <w:rPr>
-          <w:color w:val="000000" w:themeColor="text1"/>
-        </w:rPr>
-      </w:pPr>
-      <w:r>
-        <w:rPr>
-          <w:color w:val="000000" w:themeColor="text1"/>
-        </w:rPr>
-        <w:drawing>
-          <wp:inline distT="0" distB="0" distL="0" distR="0" wp14:anchorId="710CCD18" wp14:editId="7476EF07">
-            <wp:extent cx="5943600" cy="4037330"/>
-            <wp:effectExtent l="0" t="0" r="0" b="1270"/>
-            <wp:docPr id="239110468" name="Picture 1"/>
-            <wp:cNvGraphicFramePr>
-              <a:graphicFrameLocks xmlns:a="http://schemas.openxmlformats.org/drawingml/2006/main" noChangeAspect="1"/>
-            </wp:cNvGraphicFramePr>
-            <a:graphic xmlns:a="http://schemas.openxmlformats.org/drawingml/2006/main">
-              <a:graphicData uri="http://schemas.openxmlformats.org/drawingml/2006/picture">
-                <pic:pic xmlns:pic="http://schemas.openxmlformats.org/drawingml/2006/picture">
-                  <pic:nvPicPr>
-                    <pic:cNvPr id="239110468" name=""/>
-                    <pic:cNvPicPr/>
-                  </pic:nvPicPr>
-                  <pic:blipFill>
-                    <a:blip r:embed="rId17"/>
-                    <a:stretch>
-                      <a:fillRect/>
-                    </a:stretch>
-                  </pic:blipFill>
-                  <pic:spPr>
-                    <a:xfrm>
-                      <a:off x="0" y="0"/>
-                      <a:ext cx="5943600" cy="4037330"/>
-                    </a:xfrm>
-                    <a:prstGeom prst="rect">
-                      <a:avLst/>
-                    </a:prstGeom>
-                  </pic:spPr>
-                </pic:pic>
-              </a:graphicData>
-            </a:graphic>
-          </wp:inline>
-        </w:drawing>
-      </w:r>
-    </w:p>
-    <w:p>
-      <w:pPr>
-        <w:keepNext/>
-        <w:spacing w:line="276" w:lineRule="auto"/>
-        <w:jc w:val="center"/>
-        <w:rPr>
-          <w:i/>
-          <w:iCs/>
-          <w:color w:val="000000" w:themeColor="text1"/>
-          <w:sz w:val="20"/>
-          <w:szCs w:val="20"/>
-        </w:rPr>
-      </w:pPr>
-      <w:r>
-        <w:rPr>
-          <w:i/>
-          <w:iCs/>
-          <w:color w:val="000000" w:themeColor="text1"/>
-          <w:sz w:val="20"/>
-          <w:szCs w:val="20"/>
-        </w:rPr>
-        <w:t>Figure A</w:t>
-      </w:r>
-      <w:r>
-        <w:rPr>
-          <w:i/>
-          <w:iCs/>
-          <w:color w:val="000000" w:themeColor="text1"/>
-          <w:sz w:val="20"/>
-          <w:szCs w:val="20"/>
-        </w:rPr>
-        <w:t>1</w:t>
-      </w:r>
-      <w:r>
-        <w:rPr>
-          <w:i/>
-          <w:iCs/>
-          <w:color w:val="000000" w:themeColor="text1"/>
-          <w:sz w:val="20"/>
-          <w:szCs w:val="20"/>
-        </w:rPr>
-        <w:t>. Gradient Boosting predictions beyond the observed SPH parameter ranges.</w:t>
-      </w:r>
-    </w:p>
-    <w:p>
-      <w:pPr>
-        <w:keepNext/>
-        <w:spacing w:line="276" w:lineRule="auto"/>
-        <w:jc w:val="both"/>
-        <w:rPr>
-          <w:color w:val="000000" w:themeColor="text1"/>
-        </w:rPr>
-      </w:pPr>
     </w:p>
     <w:p>
       <w:pPr>
         <w:spacing w:after="160" w:line="278" w:lineRule="auto"/>
         <w:jc w:val="both"/>
       </w:pPr>
-      <w:r>
-        <w:t xml:space="preserve">The shaded central regions indicate the ranges represented by the corresponding SPH </w:t>
-      </w:r>
-      <w:r>
-        <w:t>results</w:t>
-      </w:r>
-      <w:r>
-        <w:t xml:space="preserve">. Outside these ranges, the tree-based model does not extrapolate a physical trend. Instead, it continues to use partitions learned from the training data, producing stepwise or constant predictions, as seen most clearly for periapsis, velocity, and spin. </w:t>
-      </w:r>
-      <w:r>
-        <w:t xml:space="preserve">For mass, the prediction keeps increasing slightly beyond the observed range because the higher mass values still cross different learned tree thresholds. Farther outside the range, the values fall into the same tree regions, so the prediction becomes nearly constant. </w:t>
-      </w:r>
-      <w:bookmarkStart w:id="65" w:name="_Toc238149755"/>
-      <w:r>
-        <w:t>This happens sooner for the other parameter sweeps, where out-of-range values quickly enter the same terminal tree regions and further changes no longer affect the prediction. These out-of-range predictions should therefore not be interpreted as physical trends.</w:t>
-      </w:r>
-    </w:p>
-    <w:p>
-      <w:pPr>
-        <w:spacing w:after="160" w:line="278" w:lineRule="auto"/>
-        <w:jc w:val="both"/>
-      </w:pPr>
+      <w:bookmarkStart w:id="64" w:name="_Toc238149755"/>
     </w:p>
     <w:p>
       <w:pPr>
@@ -8559,7 +8528,19 @@
               <w:rPr>
                 <w:color w:val="000000" w:themeColor="text1"/>
               </w:rPr>
-              <w:t>Increased R² by 0.0092 </w:t>
+              <w:t>Increased R² by 0.0</w:t>
+            </w:r>
+            <w:r>
+              <w:rPr>
+                <w:color w:val="000000" w:themeColor="text1"/>
+              </w:rPr>
+              <w:t>66</w:t>
+            </w:r>
+            <w:r>
+              <w:rPr>
+                <w:color w:val="000000" w:themeColor="text1"/>
+              </w:rPr>
+              <w:t> </w:t>
             </w:r>
           </w:p>
         </w:tc>
@@ -9210,7 +9191,7 @@
               <w:rPr>
                 <w:color w:val="000000" w:themeColor="text1"/>
               </w:rPr>
-              <w:t>Increased R² by 0.001 (spin frequency) and 0.002 (inverse periapsis)</w:t>
+              <w:t xml:space="preserve">Increased R² by 0.001 </w:t>
             </w:r>
           </w:p>
         </w:tc>
@@ -10093,7 +10074,13 @@
               <w:rPr>
                 <w:color w:val="000000" w:themeColor="text1"/>
               </w:rPr>
-              <w:t>Increased R² by 0.002</w:t>
+              <w:t>Increased R² by 0.00</w:t>
+            </w:r>
+            <w:r>
+              <w:rPr>
+                <w:color w:val="000000" w:themeColor="text1"/>
+              </w:rPr>
+              <w:t>9</w:t>
             </w:r>
           </w:p>
         </w:tc>
@@ -10886,6 +10873,133 @@
         </w:rPr>
       </w:pPr>
     </w:p>
+    <w:p>
+      <w:pPr>
+        <w:spacing w:before="100" w:beforeAutospacing="1" w:after="100" w:afterAutospacing="1"/>
+        <w:jc w:val="both"/>
+        <w:rPr>
+          <w:noProof w:val="0"/>
+          <w:lang w:val="en-US"/>
+        </w:rPr>
+      </w:pPr>
+    </w:p>
+    <w:p>
+      <w:pPr>
+        <w:keepNext/>
+        <w:spacing w:line="276" w:lineRule="auto"/>
+        <w:jc w:val="center"/>
+        <w:rPr>
+          <w:color w:val="000000" w:themeColor="text1"/>
+        </w:rPr>
+      </w:pPr>
+      <w:r>
+        <w:rPr>
+          <w:color w:val="000000" w:themeColor="text1"/>
+        </w:rPr>
+        <w:lastRenderedPageBreak/>
+        <w:drawing>
+          <wp:inline distT="0" distB="0" distL="0" distR="0" wp14:anchorId="23ECAAF8" wp14:editId="49679F6B">
+            <wp:extent cx="5943600" cy="4037330"/>
+            <wp:effectExtent l="0" t="0" r="0" b="1270"/>
+            <wp:docPr id="239110468" name="Picture 1"/>
+            <wp:cNvGraphicFramePr>
+              <a:graphicFrameLocks xmlns:a="http://schemas.openxmlformats.org/drawingml/2006/main" noChangeAspect="1"/>
+            </wp:cNvGraphicFramePr>
+            <a:graphic xmlns:a="http://schemas.openxmlformats.org/drawingml/2006/main">
+              <a:graphicData uri="http://schemas.openxmlformats.org/drawingml/2006/picture">
+                <pic:pic xmlns:pic="http://schemas.openxmlformats.org/drawingml/2006/picture">
+                  <pic:nvPicPr>
+                    <pic:cNvPr id="239110468" name=""/>
+                    <pic:cNvPicPr/>
+                  </pic:nvPicPr>
+                  <pic:blipFill>
+                    <a:blip r:embed="rId17"/>
+                    <a:stretch>
+                      <a:fillRect/>
+                    </a:stretch>
+                  </pic:blipFill>
+                  <pic:spPr>
+                    <a:xfrm>
+                      <a:off x="0" y="0"/>
+                      <a:ext cx="5943600" cy="4037330"/>
+                    </a:xfrm>
+                    <a:prstGeom prst="rect">
+                      <a:avLst/>
+                    </a:prstGeom>
+                  </pic:spPr>
+                </pic:pic>
+              </a:graphicData>
+            </a:graphic>
+          </wp:inline>
+        </w:drawing>
+      </w:r>
+    </w:p>
+    <w:p>
+      <w:pPr>
+        <w:keepNext/>
+        <w:spacing w:line="276" w:lineRule="auto"/>
+        <w:jc w:val="center"/>
+        <w:rPr>
+          <w:i/>
+          <w:iCs/>
+          <w:color w:val="000000" w:themeColor="text1"/>
+          <w:sz w:val="20"/>
+          <w:szCs w:val="20"/>
+        </w:rPr>
+      </w:pPr>
+      <w:r>
+        <w:rPr>
+          <w:i/>
+          <w:iCs/>
+          <w:color w:val="000000" w:themeColor="text1"/>
+          <w:sz w:val="20"/>
+          <w:szCs w:val="20"/>
+        </w:rPr>
+        <w:t>Figure A1. Gradient Boosting predictions beyond the observed SPH parameter ranges.</w:t>
+      </w:r>
+    </w:p>
+    <w:p>
+      <w:pPr>
+        <w:keepNext/>
+        <w:spacing w:line="276" w:lineRule="auto"/>
+        <w:jc w:val="both"/>
+        <w:rPr>
+          <w:color w:val="000000" w:themeColor="text1"/>
+        </w:rPr>
+      </w:pPr>
+    </w:p>
+    <w:p>
+      <w:pPr>
+        <w:spacing w:after="160" w:line="278" w:lineRule="auto"/>
+        <w:jc w:val="both"/>
+      </w:pPr>
+      <w:r>
+        <w:t xml:space="preserve">The shaded central regions indicate the ranges represented by the corresponding SPH results. Outside these ranges, the tree-based model does not extrapolate a physical trend. Instead, it continues to use partitions learned from the training data, producing stepwise or constant predictions, as seen most clearly for periapsis, velocity, and spin. For mass, the prediction keeps increasing slightly beyond the observed range because the higher mass values still cross different learned tree thresholds. Farther outside the range, the values fall into the same tree regions, so the prediction becomes nearly constant. </w:t>
+      </w:r>
+      <w:r>
+        <w:t>This happens sooner for the other parameter sweeps, where out-of-range values quickly enter the same terminal tree regions and further changes no longer affect the prediction. These out-of-range predictions should therefore not be interpreted as physical trends.</w:t>
+      </w:r>
+    </w:p>
+    <w:p>
+      <w:pPr>
+        <w:spacing w:before="100" w:beforeAutospacing="1" w:after="100" w:afterAutospacing="1"/>
+        <w:jc w:val="both"/>
+        <w:rPr>
+          <w:noProof w:val="0"/>
+          <w:lang w:val="en-US"/>
+        </w:rPr>
+      </w:pPr>
+    </w:p>
+    <w:p>
+      <w:pPr>
+        <w:spacing w:before="100" w:beforeAutospacing="1" w:after="100" w:afterAutospacing="1"/>
+        <w:jc w:val="both"/>
+        <w:rPr>
+          <w:noProof w:val="0"/>
+          <w:lang w:val="en-US"/>
+        </w:rPr>
+      </w:pPr>
+    </w:p>
     <w:p/>
     <w:p>
       <w:pPr>
@@ -10896,20 +11010,21 @@
       <w:pPr>
         <w:pStyle w:val="Heading1"/>
       </w:pPr>
-      <w:bookmarkStart w:id="66" w:name="_Toc238149756"/>
-      <w:bookmarkStart w:id="67" w:name="_Toc238575695"/>
+      <w:bookmarkStart w:id="65" w:name="_Toc238149756"/>
+      <w:bookmarkStart w:id="66" w:name="_Toc238575695"/>
+      <w:bookmarkEnd w:id="64"/>
+      <w:r>
+        <w:lastRenderedPageBreak/>
+        <w:t xml:space="preserve">Appendix </w:t>
+      </w:r>
+      <w:r>
+        <w:t>B</w:t>
+      </w:r>
+      <w:r>
+        <w:t>. AI acknowledgement Statement</w:t>
+      </w:r>
       <w:bookmarkEnd w:id="65"/>
-      <w:r>
-        <w:t xml:space="preserve">Appendix </w:t>
-      </w:r>
-      <w:r>
-        <w:t>B</w:t>
-      </w:r>
-      <w:r>
-        <w:t>. AI acknowledgement Statement</w:t>
-      </w:r>
       <w:bookmarkEnd w:id="66"/>
-      <w:bookmarkEnd w:id="67"/>
     </w:p>
     <w:p>
       <w:pPr>
@@ -11005,7 +11120,7 @@
       </w:r>
     </w:p>
   </w:comment>
-  <w:comment w:id="46" w:author="Kristy Natasha" w:date="2026-08-26T11:27:00Z" w:initials="KN">
+  <w:comment w:id="47" w:author="Kristy Natasha" w:date="2026-08-26T11:27:00Z" w:initials="KN">
     <w:p>
       <w:r>
         <w:rPr>
@@ -11021,24 +11136,6 @@
         <w:t>need tp change (new failure for underprediction)</w:t>
       </w:r>
     </w:p>
-  </w:comment>
-  <w:comment w:id="56" w:author="Kristy Natasha" w:date="2026-08-26T11:20:00Z" w:initials="KN">
-    <w:p>
-      <w:r>
-        <w:rPr>
-          <w:rStyle w:val="CommentReference"/>
-        </w:rPr>
-        <w:annotationRef/>
-      </w:r>
-      <w:r>
-        <w:rPr>
-          <w:sz w:val="20"/>
-          <w:szCs w:val="20"/>
-        </w:rPr>
-        <w:t>need to change</w:t>
-      </w:r>
-    </w:p>
-    <w:p/>
   </w:comment>
 </w:comments>
 </file>
@@ -11046,8 +11143,7 @@
 <file path=word/commentsExtended.xml><?xml version="1.0" encoding="utf-8"?>
 <w15:commentsEx xmlns:wpc="http://schemas.microsoft.com/office/word/2010/wordprocessingCanvas" xmlns:cx="http://schemas.microsoft.com/office/drawing/2014/chartex" xmlns:cx1="http://schemas.microsoft.com/office/drawing/2015/9/8/chartex" xmlns:cx2="http://schemas.microsoft.com/office/drawing/2015/10/21/chartex" xmlns:cx3="http://schemas.microsoft.com/office/drawing/2016/5/9/chartex" xmlns:cx4="http://schemas.microsoft.com/office/drawing/2016/5/10/chartex" xmlns:cx5="http://schemas.microsoft.com/office/drawing/2016/5/11/chartex" xmlns:cx6="http://schemas.microsoft.com/office/drawing/2016/5/12/chartex" xmlns:cx7="http://schemas.microsoft.com/office/drawing/2016/5/13/chartex" xmlns:cx8="http://schemas.microsoft.com/office/drawing/2016/5/14/chartex" xmlns:mc="http://schemas.openxmlformats.org/markup-compatibility/2006" xmlns:m="http://schemas.openxmlformats.org/officeDocument/2006/math" xmlns:aink="http://schemas.microsoft.com/office/drawing/2016/ink" xmlns:am3d="http://schemas.microsoft.com/office/drawing/2017/model3d" xmlns:oel="http://schemas.microsoft.com/office/2019/extlst" xmlns:r="http://schemas.openxmlformats.org/officeDocument/2006/relationships" xmlns:wp14="http://schemas.microsoft.com/office/word/2010/wordprocessingDrawing" xmlns:wp="http://schemas.openxmlformats.org/drawingml/2006/wordprocessingDrawing" xmlns:wpg="http://schemas.microsoft.com/office/word/2010/wordprocessingGroup" xmlns:wpi="http://schemas.microsoft.com/office/word/2010/wordprocessingInk" xmlns:wps="http://schemas.microsoft.com/office/word/2010/wordprocessingShape" xmlns:o="urn:schemas-microsoft-com:office:office" xmlns:v="urn:schemas-microsoft-com:vml" xmlns:w10="urn:schemas-microsoft-com:office:word" xmlns:w="http://schemas.openxmlformats.org/wordprocessingml/2006/main" xmlns:w14="http://schemas.microsoft.com/office/word/2010/wordml" xmlns:w15="http://schemas.microsoft.com/office/word/2012/wordml" xmlns:w16cex="http://schemas.microsoft.com/office/word/2018/wordml/cex" xmlns:w16cid="http://schemas.microsoft.com/office/word/2016/wordml/cid" xmlns:w16="http://schemas.microsoft.com/office/word/2018/wordml" xmlns:w16sdtdh="http://schemas.microsoft.com/office/word/2020/wordml/sdtdatahash" xmlns:w16sdtfl="http://schemas.microsoft.com/office/word/2024/wordml/sdtformatlock" xmlns:w16se="http://schemas.microsoft.com/office/word/2015/wordml/symex" xmlns:w16du="http://schemas.microsoft.com/office/word/2023/wordml/word16du" xmlns:wne="http://schemas.microsoft.com/office/word/2006/wordml" mc:Ignorable="w14 w15 w16se w16cid w16 w16cex w16sdtdh w16sdtfl w16du wp14">
   <w15:commentEx w15:paraId="4AA38294" w15:done="1"/>
-  <w15:commentEx w15:paraId="7A52081E" w15:done="0"/>
-  <w15:commentEx w15:paraId="38EE9842" w15:done="0"/>
+  <w15:commentEx w15:paraId="7A52081E" w15:done="1"/>
 </w15:commentsEx>
 </file>
 
@@ -11055,7 +11151,6 @@
 <w16cex:commentsExtensible xmlns:wpc="http://schemas.microsoft.com/office/word/2010/wordprocessingCanvas" xmlns:cx="http://schemas.microsoft.com/office/drawing/2014/chartex" xmlns:cx1="http://schemas.microsoft.com/office/drawing/2015/9/8/chartex" xmlns:cx2="http://schemas.microsoft.com/office/drawing/2015/10/21/chartex" xmlns:cx3="http://schemas.microsoft.com/office/drawing/2016/5/9/chartex" xmlns:cx4="http://schemas.microsoft.com/office/drawing/2016/5/10/chartex" xmlns:cx5="http://schemas.microsoft.com/office/drawing/2016/5/11/chartex" xmlns:cx6="http://schemas.microsoft.com/office/drawing/2016/5/12/chartex" xmlns:cx7="http://schemas.microsoft.com/office/drawing/2016/5/13/chartex" xmlns:cx8="http://schemas.microsoft.com/office/drawing/2016/5/14/chartex" xmlns:cr="http://schemas.microsoft.com/office/comments/2020/reactions" xmlns:mc="http://schemas.openxmlformats.org/markup-compatibility/2006" xmlns:m="http://schemas.openxmlformats.org/officeDocument/2006/math" xmlns:aink="http://schemas.microsoft.com/office/drawing/2016/ink" xmlns:am3d="http://schemas.microsoft.com/office/drawing/2017/model3d" xmlns:oel="http://schemas.microsoft.com/office/2019/extlst" xmlns:r="http://schemas.openxmlformats.org/officeDocument/2006/relationships" xmlns:wp14="http://schemas.microsoft.com/office/word/2010/wordprocessingDrawing" xmlns:wp="http://schemas.openxmlformats.org/drawingml/2006/wordprocessingDrawing" xmlns:wpg="http://schemas.microsoft.com/office/word/2010/wordprocessingGroup" xmlns:wpi="http://schemas.microsoft.com/office/word/2010/wordprocessingInk" xmlns:wps="http://schemas.microsoft.com/office/word/2010/wordprocessingShape" xmlns:o="urn:schemas-microsoft-com:office:office" xmlns:v="urn:schemas-microsoft-com:vml" xmlns:w10="urn:schemas-microsoft-com:office:word" xmlns:w="http://schemas.openxmlformats.org/wordprocessingml/2006/main" xmlns:w14="http://schemas.microsoft.com/office/word/2010/wordml" xmlns:w15="http://schemas.microsoft.com/office/word/2012/wordml" xmlns:w16cex="http://schemas.microsoft.com/office/word/2018/wordml/cex" xmlns:w16cid="http://schemas.microsoft.com/office/word/2016/wordml/cid" xmlns:w16="http://schemas.microsoft.com/office/word/2018/wordml" xmlns:w16sdtdh="http://schemas.microsoft.com/office/word/2020/wordml/sdtdatahash" xmlns:w16sdtfl="http://schemas.microsoft.com/office/word/2024/wordml/sdtformatlock" xmlns:w16se="http://schemas.microsoft.com/office/word/2015/wordml/symex" xmlns:w16du="http://schemas.microsoft.com/office/word/2023/wordml/word16du" xmlns:wne="http://schemas.microsoft.com/office/word/2006/wordml" mc:Ignorable="w14 w15 w16se w16cid w16 w16cex w16sdtdh w16sdtfl cr w16du wp14">
   <w16cex:commentExtensible w16cex:durableId="1E48CB65" w16cex:dateUtc="2026-08-19T19:25:00Z"/>
   <w16cex:commentExtensible w16cex:durableId="660CA60B" w16cex:dateUtc="2026-08-26T10:27:00Z"/>
-  <w16cex:commentExtensible w16cex:durableId="184D8184" w16cex:dateUtc="2026-08-26T10:20:00Z"/>
 </w16cex:commentsExtensible>
 </file>
 
@@ -11063,7 +11158,6 @@
 <w16cid:commentsIds xmlns:wpc="http://schemas.microsoft.com/office/word/2010/wordprocessingCanvas" xmlns:cx="http://schemas.microsoft.com/office/drawing/2014/chartex" xmlns:cx1="http://schemas.microsoft.com/office/drawing/2015/9/8/chartex" xmlns:cx2="http://schemas.microsoft.com/office/drawing/2015/10/21/chartex" xmlns:cx3="http://schemas.microsoft.com/office/drawing/2016/5/9/chartex" xmlns:cx4="http://schemas.microsoft.com/office/drawing/2016/5/10/chartex" xmlns:cx5="http://schemas.microsoft.com/office/drawing/2016/5/11/chartex" xmlns:cx6="http://schemas.microsoft.com/office/drawing/2016/5/12/chartex" xmlns:cx7="http://schemas.microsoft.com/office/drawing/2016/5/13/chartex" xmlns:cx8="http://schemas.microsoft.com/office/drawing/2016/5/14/chartex" xmlns:mc="http://schemas.openxmlformats.org/markup-compatibility/2006" xmlns:m="http://schemas.openxmlformats.org/officeDocument/2006/math" xmlns:aink="http://schemas.microsoft.com/office/drawing/2016/ink" xmlns:am3d="http://schemas.microsoft.com/office/drawing/2017/model3d" xmlns:oel="http://schemas.microsoft.com/office/2019/extlst" xmlns:r="http://schemas.openxmlformats.org/officeDocument/2006/relationships" xmlns:wp14="http://schemas.microsoft.com/office/word/2010/wordprocessingDrawing" xmlns:wp="http://schemas.openxmlformats.org/drawingml/2006/wordprocessingDrawing" xmlns:wpg="http://schemas.microsoft.com/office/word/2010/wordprocessingGroup" xmlns:wpi="http://schemas.microsoft.com/office/word/2010/wordprocessingInk" xmlns:wps="http://schemas.microsoft.com/office/word/2010/wordprocessingShape" xmlns:o="urn:schemas-microsoft-com:office:office" xmlns:v="urn:schemas-microsoft-com:vml" xmlns:w10="urn:schemas-microsoft-com:office:word" xmlns:w="http://schemas.openxmlformats.org/wordprocessingml/2006/main" xmlns:w14="http://schemas.microsoft.com/office/word/2010/wordml" xmlns:w15="http://schemas.microsoft.com/office/word/2012/wordml" xmlns:w16cex="http://schemas.microsoft.com/office/word/2018/wordml/cex" xmlns:w16cid="http://schemas.microsoft.com/office/word/2016/wordml/cid" xmlns:w16="http://schemas.microsoft.com/office/word/2018/wordml" xmlns:w16sdtdh="http://schemas.microsoft.com/office/word/2020/wordml/sdtdatahash" xmlns:w16sdtfl="http://schemas.microsoft.com/office/word/2024/wordml/sdtformatlock" xmlns:w16se="http://schemas.microsoft.com/office/word/2015/wordml/symex" xmlns:w16du="http://schemas.microsoft.com/office/word/2023/wordml/word16du" xmlns:wne="http://schemas.microsoft.com/office/word/2006/wordml" mc:Ignorable="w14 w15 w16se w16cid w16 w16cex w16sdtdh w16sdtfl w16du wp14">
   <w16cid:commentId w16cid:paraId="4AA38294" w16cid:durableId="1E48CB65"/>
   <w16cid:commentId w16cid:paraId="7A52081E" w16cid:durableId="660CA60B"/>
-  <w16cid:commentId w16cid:paraId="38EE9842" w16cid:durableId="184D8184"/>
 </w16cid:commentsIds>
 </file>
 

</xml_diff>

<commit_message>
docs: final report docs & pdf (word count checked)
</commit_message>
<xml_diff>
--- a/deliverables/nny124-final-report.docx
+++ b/deliverables/nny124-final-report.docx
@@ -2086,7 +2086,7 @@
           <w:rPr>
             <w:webHidden/>
           </w:rPr>
-          <w:t>17</w:t>
+          <w:t>18</w:t>
         </w:r>
         <w:r>
           <w:rPr>
@@ -2655,7 +2655,7 @@
           <w:rPr>
             <w:webHidden/>
           </w:rPr>
-          <w:t>11</w:t>
+          <w:t>12</w:t>
         </w:r>
         <w:r>
           <w:rPr>
@@ -2733,7 +2733,7 @@
           <w:rPr>
             <w:webHidden/>
           </w:rPr>
-          <w:t>12</w:t>
+          <w:t>13</w:t>
         </w:r>
         <w:r>
           <w:rPr>
@@ -2763,7 +2763,19 @@
           <w:rPr>
             <w:rStyle w:val="Hyperlink"/>
           </w:rPr>
-          <w:t>Figure 5. Coverage, held-out error, and observed BMF across the sampled parameter space. Panels (a,d) show unique physical SPH simulation counts, panels (b,e) show mean held-out absolute error, and panels (c,f) show mean observed BMF with unique simulation counts overlaid. Grey indicates no SPH data. In the observed-BMF panels, light blue indicates mean observed BMF = 0, while other colours indicate mean observed BMF &gt; 0.</w:t>
+          <w:t>Figure 5. Coverage, held-out error, and observed BMF across the sampled parameter space. Panels (a,d) show unique physical SPH simu</w:t>
+        </w:r>
+        <w:r>
+          <w:rPr>
+            <w:rStyle w:val="Hyperlink"/>
+          </w:rPr>
+          <w:t>l</w:t>
+        </w:r>
+        <w:r>
+          <w:rPr>
+            <w:rStyle w:val="Hyperlink"/>
+          </w:rPr>
+          <w:t>ation counts, panels (b,e) show mean held-out absolute error, and panels (c,f) show mean observed BMF with unique simulation counts overlaid. Grey indicates no SPH data. In the observed-BMF panels, light blue indicates mean observed BMF = 0, while other colours indicate mean observed BMF &gt; 0.</w:t>
         </w:r>
         <w:r>
           <w:rPr>
@@ -2798,7 +2810,7 @@
           <w:rPr>
             <w:webHidden/>
           </w:rPr>
-          <w:t>13</w:t>
+          <w:t>14</w:t>
         </w:r>
         <w:r>
           <w:rPr>
@@ -2928,7 +2940,7 @@
           <w:sz w:val="20"/>
           <w:szCs w:val="20"/>
         </w:rPr>
-        <w:t xml:space="preserve">. Adding the tested physics-derived features does not improve the tuned Gradient Boosting model, so the simpler tuned raw-input model is retained. The models are assessed using grouped cross-validation. In a controlled set, predicted BMF generally decreases from roughly 0.48 at 1.2 Mars radii to roughly 0.12 at 3.0 Mars radii. A similarly clear decline occurs as encounter speed increases, from roughly 0.45 at low velocity to near zero by about 1.2-1.4 km/s. Overall, velocity has the strongest model dependence, followed by periapsis and spin, although their relative importance varies with encounter conditions. Matched comparisons further show that the effects of spin and velocity vary with the encounter conditions. </w:t>
+        <w:t xml:space="preserve"> Adding the tested physics-derived features does not improve the tuned Gradient Boosting model, so the simpler tuned raw-input model is retained. The models are assessed using grouped cross-validation. In a controlled set, predicted BMF generally decreases from roughly 0.48 at 1.2 Mars radii to roughly 0.12 at 3.0 Mars radii. A similarly clear decline occurs as encounter speed increases, from roughly 0.45 at low velocity to near zero by about 1.2-1.4 km/s. Overall, velocity has the strongest model dependence, followed by periapsis and spin, although their relative importance varies with encounter conditions. Matched comparisons further show that the effects of spin and velocity vary with the encounter conditions. </w:t>
       </w:r>
       <w:r>
         <w:rPr>
@@ -4405,9 +4417,9 @@
       <w:r>
         <w:lastRenderedPageBreak/>
         <w:drawing>
-          <wp:inline distT="0" distB="0" distL="0" distR="0" wp14:anchorId="2102FAF4" wp14:editId="42A9619A">
-            <wp:extent cx="3766458" cy="2611572"/>
-            <wp:effectExtent l="0" t="0" r="5715" b="5080"/>
+          <wp:inline distT="0" distB="0" distL="0" distR="0" wp14:anchorId="2102FAF4" wp14:editId="5A2173B1">
+            <wp:extent cx="3680750" cy="2552145"/>
+            <wp:effectExtent l="0" t="0" r="2540" b="635"/>
             <wp:docPr id="883879966" name="Picture 1"/>
             <wp:cNvGraphicFramePr>
               <a:graphicFrameLocks xmlns:a="http://schemas.openxmlformats.org/drawingml/2006/main" noChangeAspect="1"/>
@@ -4428,7 +4440,7 @@
                   <pic:spPr>
                     <a:xfrm>
                       <a:off x="0" y="0"/>
-                      <a:ext cx="3800512" cy="2635184"/>
+                      <a:ext cx="3722642" cy="2581192"/>
                     </a:xfrm>
                     <a:prstGeom prst="rect">
                       <a:avLst/>
@@ -4717,11 +4729,10 @@
         <w:jc w:val="center"/>
       </w:pPr>
       <w:r>
-        <w:lastRenderedPageBreak/>
         <w:drawing>
-          <wp:inline distT="0" distB="0" distL="0" distR="0" wp14:anchorId="4F709962" wp14:editId="6A63C568">
-            <wp:extent cx="5943600" cy="4037330"/>
-            <wp:effectExtent l="0" t="0" r="0" b="1270"/>
+          <wp:inline distT="0" distB="0" distL="0" distR="0" wp14:anchorId="4F709962" wp14:editId="4DF1EFCC">
+            <wp:extent cx="5231757" cy="3553794"/>
+            <wp:effectExtent l="0" t="0" r="1270" b="2540"/>
             <wp:docPr id="47297538" name="Picture 1"/>
             <wp:cNvGraphicFramePr>
               <a:graphicFrameLocks xmlns:a="http://schemas.openxmlformats.org/drawingml/2006/main" noChangeAspect="1"/>
@@ -4742,7 +4753,7 @@
                   <pic:spPr>
                     <a:xfrm>
                       <a:off x="0" y="0"/>
-                      <a:ext cx="5943600" cy="4037330"/>
+                      <a:ext cx="5239083" cy="3558770"/>
                     </a:xfrm>
                     <a:prstGeom prst="rect">
                       <a:avLst/>
@@ -4830,6 +4841,7 @@
           <w:noProof w:val="0"/>
           <w:lang w:val="en-US"/>
         </w:rPr>
+        <w:lastRenderedPageBreak/>
         <w:t>Figure 3 compares controlled profiles in which one scenario input is varied while the others are fixed to a representative, well-supported combination. The fixed conditions may differ between panels, so the profiles show conditional responses rather than directly comparable effect sizes.</w:t>
       </w:r>
     </w:p>
@@ -4900,11 +4912,10 @@
         <w:jc w:val="center"/>
       </w:pPr>
       <w:r>
-        <w:lastRenderedPageBreak/>
         <w:drawing>
-          <wp:inline distT="0" distB="0" distL="0" distR="0" wp14:anchorId="13192738" wp14:editId="29D00D5C">
-            <wp:extent cx="5704114" cy="2413539"/>
-            <wp:effectExtent l="0" t="0" r="0" b="0"/>
+          <wp:inline distT="0" distB="0" distL="0" distR="0" wp14:anchorId="13192738" wp14:editId="37D664B4">
+            <wp:extent cx="5393802" cy="2282239"/>
+            <wp:effectExtent l="0" t="0" r="3810" b="3810"/>
             <wp:docPr id="681598251" name="Picture 1"/>
             <wp:cNvGraphicFramePr>
               <a:graphicFrameLocks xmlns:a="http://schemas.openxmlformats.org/drawingml/2006/main" noChangeAspect="1"/>
@@ -4926,7 +4937,7 @@
                   <pic:spPr bwMode="auto">
                     <a:xfrm>
                       <a:off x="0" y="0"/>
-                      <a:ext cx="5718210" cy="2419503"/>
+                      <a:ext cx="5424014" cy="2295022"/>
                     </a:xfrm>
                     <a:prstGeom prst="rect">
                       <a:avLst/>
@@ -5073,7 +5084,11 @@
         <w:t>/predominates under some situations</w:t>
       </w:r>
       <w:r>
-        <w:t>, while velocity produces larger differences in others. These findings support the importance of regime-dependent parameters, so the overall ablation ranking should not be interpreted as universal.</w:t>
+        <w:t xml:space="preserve">, </w:t>
+      </w:r>
+      <w:r>
+        <w:lastRenderedPageBreak/>
+        <w:t>while velocity produces larger differences in others. These findings support the importance of regime-dependent parameters, so the overall ablation ranking should not be interpreted as universal.</w:t>
       </w:r>
       <w:r>
         <w:t xml:space="preserve"> </w:t>
@@ -5106,11 +5121,7 @@
         <w:jc w:val="both"/>
       </w:pPr>
       <w:r>
-        <w:t xml:space="preserve">Because the model depends on input combinations, a case may fall inside the range of each individual input and yet have inadequate support. Thus, held-out error and pairwise parameter </w:t>
-      </w:r>
-      <w:r>
-        <w:lastRenderedPageBreak/>
-        <w:t>coverage are compared with local simulation coverage in Figure 5. Individual input ranges conceal unsampled combinations, which are revealed by pairwise mapping. Only when comparable SPH cases are close by in the input space is a prediction regarded as interpolation.</w:t>
+        <w:t>Because the model depends on input combinations, a case may fall inside the range of each individual input and yet have inadequate support. Thus, held-out error and pairwise parameter coverage are compared with local simulation coverage in Figure 5. Individual input ranges conceal unsampled combinations, which are revealed by pairwise mapping. Only when comparable SPH cases are close by in the input space is a prediction regarded as interpolation.</w:t>
       </w:r>
     </w:p>
     <w:p>
@@ -5288,7 +5299,11 @@
         <w:t xml:space="preserve"> 1.0</w:t>
       </w:r>
       <w:r>
-        <w:t xml:space="preserve"> km/s cells each contain only one unique physical SPH simulation </w:t>
+        <w:t xml:space="preserve"> km/s cells each contain </w:t>
+      </w:r>
+      <w:r>
+        <w:lastRenderedPageBreak/>
+        <w:t xml:space="preserve">only one unique physical SPH simulation </w:t>
       </w:r>
       <w:r>
         <w:t xml:space="preserve">(see </w:t>
@@ -5824,11 +5839,7 @@
         <w:t>)</w:t>
       </w:r>
       <w:r>
-        <w:t xml:space="preserve">. The opposite-sign errors in two neighbouring cells with minimal SPH coverage indicate that the local velocity relationship is </w:t>
-      </w:r>
-      <w:r>
-        <w:lastRenderedPageBreak/>
-        <w:t>not reliably learned in this region. Therefore, being within the overall sampled input range does not guarantee a reliable prediction, and additional SPH simulations would be useful in such sparsely sampled regions.</w:t>
+        <w:t>. The opposite-sign errors in two neighbouring cells with minimal SPH coverage indicate that the local velocity relationship is not reliably learned in this region. Therefore, being within the overall sampled input range does not guarantee a reliable prediction, and additional SPH simulations would be useful in such sparsely sampled regions.</w:t>
       </w:r>
     </w:p>
     <w:p>
@@ -5915,6 +5926,7 @@
         <w:jc w:val="both"/>
       </w:pPr>
       <w:r>
+        <w:lastRenderedPageBreak/>
         <w:t>The primary physical outcome is that each parameter's impact is contingent upon the other encounter conditions. Within those parameters, periapsis determines the overall strength of the tidal encounter, encounter speed influences the duration of the contact and the favourable capture, and mass and spin alter the outcome. The most obvious periapsis and speed directions are found in the controlled experiments. The paired simulations demonstrate how periapsis and spin state affect the magnitude of the spin and velocity impacts.</w:t>
       </w:r>
     </w:p>
@@ -5933,11 +5945,7 @@
         <w:jc w:val="both"/>
       </w:pPr>
       <w:r>
-        <w:t xml:space="preserve">As a result, ML's usefulness is restricted. It can swiftly filter well-supported input combinations, identify transition zones, uncover situations that yield promising retained mass, and indicate areas where more simulation could yield valuable information. Long-term debris survivability, precise </w:t>
-      </w:r>
-      <w:r>
-        <w:lastRenderedPageBreak/>
-        <w:t xml:space="preserve">fragment shapes and distributions from BMF alone, and forecasts for inadequately sampled input combinations cannot all be determined by it. </w:t>
+        <w:t xml:space="preserve">As a result, ML's usefulness is restricted. It can swiftly filter well-supported input combinations, identify transition zones, uncover situations that yield promising retained mass, and indicate areas where more simulation could yield valuable information. Long-term debris survivability, precise fragment shapes and distributions from BMF alone, and forecasts for inadequately sampled input combinations cannot all be determined by it. </w:t>
       </w:r>
       <w:r>
         <w:t>This is evident from the sparse periapsis-velocity example at 1.4 Mars radii: even though the input values fall within the training ranges, minimal local simulation coverage is associated with larger held-out errors.</w:t>
@@ -6033,6 +6041,7 @@
         <w:jc w:val="both"/>
       </w:pPr>
       <w:r>
+        <w:lastRenderedPageBreak/>
         <w:t>Q</w:t>
       </w:r>
       <w:r>
@@ -6126,7 +6135,6 @@
         <w:jc w:val="both"/>
       </w:pPr>
       <w:r>
-        <w:lastRenderedPageBreak/>
         <w:t>Q</w:t>
       </w:r>
       <w:r>
@@ -6226,6 +6234,7 @@
         <w:jc w:val="both"/>
       </w:pPr>
       <w:r>
+        <w:lastRenderedPageBreak/>
         <w:t xml:space="preserve">Additionally, instead of solving the physical laws directly, the ML model learns patterns from SPH results. It does not follow the subsequent orbits of fragments and does not impose conservation of mass, momentum, energy, or angular momentum. Therefore, a reliable BMF prediction cannot determine whether debris accumulates into moons, forms a disk, or endures for a long time. Additionally, fragment measurements are more sensitive to the FoF connecting length employed in post-processing and are noisier than BMF. </w:t>
       </w:r>
     </w:p>
@@ -6256,11 +6265,7 @@
         <w:t xml:space="preserve">comparison at other masses and resolutions while keeping processing choices fixed. </w:t>
       </w:r>
       <w:r>
-        <w:t xml:space="preserve">It would be possible to determine whether the stronger spin disparities also occur in other groups by reporting the BMF range together with the actual BMF values and </w:t>
-      </w:r>
-      <w:r>
-        <w:lastRenderedPageBreak/>
-        <w:t>the number of independent simulations. It would be more robust to test the model on whole new SPH runs created after training rather than repeatedly dividing the current library.</w:t>
+        <w:t>It would be possible to determine whether the stronger spin disparities also occur in other groups by reporting the BMF range together with the actual BMF values and the number of independent simulations. It would be more robust to test the model on whole new SPH runs created after training rather than repeatedly dividing the current library.</w:t>
       </w:r>
       <w:r>
         <w:t xml:space="preserve"> </w:t>
@@ -6296,7 +6301,43 @@
         <w:pStyle w:val="Heading1"/>
       </w:pPr>
       <w:bookmarkStart w:id="63" w:name="_Toc238639516"/>
-      <w:r>
+    </w:p>
+    <w:p>
+      <w:pPr>
+        <w:pStyle w:val="Heading1"/>
+      </w:pPr>
+    </w:p>
+    <w:p>
+      <w:pPr>
+        <w:pStyle w:val="Heading1"/>
+      </w:pPr>
+    </w:p>
+    <w:p>
+      <w:pPr>
+        <w:pStyle w:val="Heading1"/>
+      </w:pPr>
+    </w:p>
+    <w:p>
+      <w:pPr>
+        <w:pStyle w:val="Heading1"/>
+      </w:pPr>
+    </w:p>
+    <w:p>
+      <w:pPr>
+        <w:pStyle w:val="Heading1"/>
+      </w:pPr>
+    </w:p>
+    <w:p>
+      <w:pPr>
+        <w:pStyle w:val="Heading1"/>
+      </w:pPr>
+    </w:p>
+    <w:p>
+      <w:pPr>
+        <w:pStyle w:val="Heading1"/>
+      </w:pPr>
+      <w:r>
+        <w:lastRenderedPageBreak/>
         <w:t>References</w:t>
       </w:r>
       <w:bookmarkEnd w:id="62"/>
@@ -6443,7 +6484,6 @@
         <w:rPr>
           <w:color w:val="000000" w:themeColor="text1"/>
         </w:rPr>
-        <w:lastRenderedPageBreak/>
         <w:t>Grinsztajn, L., Oyallon, E. &amp; Varoquaux, G. (2022). Why do tree-based models still outperform deep learning on tabular data? Advances in Neural Information Processing Systems, 35.</w:t>
       </w:r>
     </w:p>
@@ -6508,6 +6548,7 @@
         <w:rPr>
           <w:color w:val="000000" w:themeColor="text1"/>
         </w:rPr>
+        <w:lastRenderedPageBreak/>
         <w:t>Prokhorenkova, L., Gusev, G., Vorobev, A., Dorogush, A. V. &amp; Gulin, A. (2018). CatBoost: unbiased boosting with categorical features. Advances in Neural Information Processing Systems, 31.</w:t>
       </w:r>
     </w:p>
@@ -7040,7 +7081,6 @@
               <w:bottom w:w="100" w:type="dxa"/>
               <w:right w:w="100" w:type="dxa"/>
             </w:tcMar>
-            <w:hideMark/>
           </w:tcPr>
           <w:p>
             <w:pPr>
@@ -7052,10 +7092,290 @@
               <w:rPr>
                 <w:lang w:val="en-US"/>
               </w:rPr>
-              <w:t>Baseline Gradient Boosting (GB)</w:t>
-            </w:r>
-          </w:p>
-        </w:tc>
+              <w:t>Tuned RF</w:t>
+            </w:r>
+          </w:p>
+        </w:tc>
+        <w:tc>
+          <w:tcPr>
+            <w:tcW w:w="0" w:type="auto"/>
+            <w:tcBorders>
+              <w:top w:val="single" w:sz="8" w:space="0" w:color="000000"/>
+              <w:left w:val="single" w:sz="8" w:space="0" w:color="000000"/>
+              <w:bottom w:val="single" w:sz="8" w:space="0" w:color="000000"/>
+              <w:right w:val="single" w:sz="8" w:space="0" w:color="000000"/>
+            </w:tcBorders>
+            <w:tcMar>
+              <w:top w:w="100" w:type="dxa"/>
+              <w:left w:w="100" w:type="dxa"/>
+              <w:bottom w:w="100" w:type="dxa"/>
+              <w:right w:w="100" w:type="dxa"/>
+            </w:tcMar>
+          </w:tcPr>
+          <w:p>
+            <w:pPr>
+              <w:rPr>
+                <w:lang w:val="en-US"/>
+              </w:rPr>
+            </w:pPr>
+            <w:r>
+              <w:rPr>
+                <w:lang w:val="en-US"/>
+              </w:rPr>
+              <w:t>0.9318</w:t>
+            </w:r>
+          </w:p>
+        </w:tc>
+        <w:tc>
+          <w:tcPr>
+            <w:tcW w:w="0" w:type="auto"/>
+            <w:tcBorders>
+              <w:top w:val="single" w:sz="8" w:space="0" w:color="000000"/>
+              <w:left w:val="single" w:sz="8" w:space="0" w:color="000000"/>
+              <w:bottom w:val="single" w:sz="8" w:space="0" w:color="000000"/>
+              <w:right w:val="single" w:sz="8" w:space="0" w:color="000000"/>
+            </w:tcBorders>
+            <w:tcMar>
+              <w:top w:w="100" w:type="dxa"/>
+              <w:left w:w="100" w:type="dxa"/>
+              <w:bottom w:w="100" w:type="dxa"/>
+              <w:right w:w="100" w:type="dxa"/>
+            </w:tcMar>
+          </w:tcPr>
+          <w:p>
+            <w:pPr>
+              <w:rPr>
+                <w:lang w:val="en-US"/>
+              </w:rPr>
+            </w:pPr>
+            <w:r>
+              <w:rPr>
+                <w:lang w:val="en-US"/>
+              </w:rPr>
+              <w:t>0.027</w:t>
+            </w:r>
+          </w:p>
+        </w:tc>
+        <w:tc>
+          <w:tcPr>
+            <w:tcW w:w="0" w:type="auto"/>
+            <w:tcBorders>
+              <w:top w:val="single" w:sz="8" w:space="0" w:color="000000"/>
+              <w:left w:val="single" w:sz="8" w:space="0" w:color="000000"/>
+              <w:bottom w:val="single" w:sz="8" w:space="0" w:color="000000"/>
+              <w:right w:val="single" w:sz="8" w:space="0" w:color="000000"/>
+            </w:tcBorders>
+            <w:tcMar>
+              <w:top w:w="100" w:type="dxa"/>
+              <w:left w:w="100" w:type="dxa"/>
+              <w:bottom w:w="100" w:type="dxa"/>
+              <w:right w:w="100" w:type="dxa"/>
+            </w:tcMar>
+          </w:tcPr>
+          <w:p>
+            <w:pPr>
+              <w:rPr>
+                <w:lang w:val="en-US"/>
+              </w:rPr>
+            </w:pPr>
+            <w:r>
+              <w:rPr>
+                <w:lang w:val="en-US"/>
+              </w:rPr>
+              <w:t>0.0403</w:t>
+            </w:r>
+          </w:p>
+        </w:tc>
+        <w:tc>
+          <w:tcPr>
+            <w:tcW w:w="3239" w:type="dxa"/>
+            <w:tcBorders>
+              <w:top w:val="single" w:sz="8" w:space="0" w:color="000000"/>
+              <w:left w:val="single" w:sz="8" w:space="0" w:color="000000"/>
+              <w:bottom w:val="single" w:sz="8" w:space="0" w:color="000000"/>
+              <w:right w:val="single" w:sz="8" w:space="0" w:color="000000"/>
+            </w:tcBorders>
+            <w:tcMar>
+              <w:top w:w="100" w:type="dxa"/>
+              <w:left w:w="100" w:type="dxa"/>
+              <w:bottom w:w="100" w:type="dxa"/>
+              <w:right w:w="100" w:type="dxa"/>
+            </w:tcMar>
+          </w:tcPr>
+          <w:p>
+            <w:pPr>
+              <w:rPr>
+                <w:lang w:val="en-US"/>
+              </w:rPr>
+            </w:pPr>
+            <w:r>
+              <w:rPr>
+                <w:lang w:val="en-US"/>
+              </w:rPr>
+              <w:t>Tuned model</w:t>
+            </w:r>
+          </w:p>
+        </w:tc>
+      </w:tr>
+      <w:tr>
+        <w:trPr>
+          <w:tblHeader/>
+        </w:trPr>
+        <w:tc>
+          <w:tcPr>
+            <w:tcW w:w="0" w:type="auto"/>
+            <w:tcBorders>
+              <w:top w:val="single" w:sz="8" w:space="0" w:color="000000"/>
+              <w:left w:val="single" w:sz="8" w:space="0" w:color="000000"/>
+              <w:bottom w:val="single" w:sz="8" w:space="0" w:color="000000"/>
+              <w:right w:val="single" w:sz="8" w:space="0" w:color="000000"/>
+            </w:tcBorders>
+            <w:tcMar>
+              <w:top w:w="100" w:type="dxa"/>
+              <w:left w:w="100" w:type="dxa"/>
+              <w:bottom w:w="100" w:type="dxa"/>
+              <w:right w:w="100" w:type="dxa"/>
+            </w:tcMar>
+          </w:tcPr>
+          <w:p>
+            <w:pPr>
+              <w:rPr>
+                <w:lang w:val="en-US"/>
+              </w:rPr>
+            </w:pPr>
+            <w:r>
+              <w:rPr>
+                <w:lang w:val="en-US"/>
+              </w:rPr>
+              <w:t>Tuned RF + derived features</w:t>
+            </w:r>
+          </w:p>
+        </w:tc>
+        <w:tc>
+          <w:tcPr>
+            <w:tcW w:w="0" w:type="auto"/>
+            <w:tcBorders>
+              <w:top w:val="single" w:sz="8" w:space="0" w:color="000000"/>
+              <w:left w:val="single" w:sz="8" w:space="0" w:color="000000"/>
+              <w:bottom w:val="single" w:sz="8" w:space="0" w:color="000000"/>
+              <w:right w:val="single" w:sz="8" w:space="0" w:color="000000"/>
+            </w:tcBorders>
+            <w:tcMar>
+              <w:top w:w="100" w:type="dxa"/>
+              <w:left w:w="100" w:type="dxa"/>
+              <w:bottom w:w="100" w:type="dxa"/>
+              <w:right w:w="100" w:type="dxa"/>
+            </w:tcMar>
+          </w:tcPr>
+          <w:p>
+            <w:pPr>
+              <w:rPr>
+                <w:lang w:val="en-US"/>
+              </w:rPr>
+            </w:pPr>
+            <w:r>
+              <w:rPr>
+                <w:lang w:val="en-US"/>
+              </w:rPr>
+              <w:t>0.9376</w:t>
+            </w:r>
+          </w:p>
+        </w:tc>
+        <w:tc>
+          <w:tcPr>
+            <w:tcW w:w="0" w:type="auto"/>
+            <w:tcBorders>
+              <w:top w:val="single" w:sz="8" w:space="0" w:color="000000"/>
+              <w:left w:val="single" w:sz="8" w:space="0" w:color="000000"/>
+              <w:bottom w:val="single" w:sz="8" w:space="0" w:color="000000"/>
+              <w:right w:val="single" w:sz="8" w:space="0" w:color="000000"/>
+            </w:tcBorders>
+            <w:tcMar>
+              <w:top w:w="100" w:type="dxa"/>
+              <w:left w:w="100" w:type="dxa"/>
+              <w:bottom w:w="100" w:type="dxa"/>
+              <w:right w:w="100" w:type="dxa"/>
+            </w:tcMar>
+          </w:tcPr>
+          <w:p>
+            <w:pPr>
+              <w:rPr>
+                <w:lang w:val="en-US"/>
+              </w:rPr>
+            </w:pPr>
+            <w:r>
+              <w:rPr>
+                <w:lang w:val="en-US"/>
+              </w:rPr>
+              <w:t>0.0268</w:t>
+            </w:r>
+          </w:p>
+        </w:tc>
+        <w:tc>
+          <w:tcPr>
+            <w:tcW w:w="0" w:type="auto"/>
+            <w:tcBorders>
+              <w:top w:val="single" w:sz="8" w:space="0" w:color="000000"/>
+              <w:left w:val="single" w:sz="8" w:space="0" w:color="000000"/>
+              <w:bottom w:val="single" w:sz="8" w:space="0" w:color="000000"/>
+              <w:right w:val="single" w:sz="8" w:space="0" w:color="000000"/>
+            </w:tcBorders>
+            <w:tcMar>
+              <w:top w:w="100" w:type="dxa"/>
+              <w:left w:w="100" w:type="dxa"/>
+              <w:bottom w:w="100" w:type="dxa"/>
+              <w:right w:w="100" w:type="dxa"/>
+            </w:tcMar>
+          </w:tcPr>
+          <w:p>
+            <w:pPr>
+              <w:rPr>
+                <w:lang w:val="en-US"/>
+              </w:rPr>
+            </w:pPr>
+            <w:r>
+              <w:rPr>
+                <w:lang w:val="en-US"/>
+              </w:rPr>
+              <w:t>0.0385</w:t>
+            </w:r>
+          </w:p>
+        </w:tc>
+        <w:tc>
+          <w:tcPr>
+            <w:tcW w:w="3239" w:type="dxa"/>
+            <w:tcBorders>
+              <w:top w:val="single" w:sz="8" w:space="0" w:color="000000"/>
+              <w:left w:val="single" w:sz="8" w:space="0" w:color="000000"/>
+              <w:bottom w:val="single" w:sz="8" w:space="0" w:color="000000"/>
+              <w:right w:val="single" w:sz="8" w:space="0" w:color="000000"/>
+            </w:tcBorders>
+            <w:tcMar>
+              <w:top w:w="100" w:type="dxa"/>
+              <w:left w:w="100" w:type="dxa"/>
+              <w:bottom w:w="100" w:type="dxa"/>
+              <w:right w:w="100" w:type="dxa"/>
+            </w:tcMar>
+          </w:tcPr>
+          <w:p>
+            <w:pPr>
+              <w:rPr>
+                <w:lang w:val="en-US"/>
+              </w:rPr>
+            </w:pPr>
+            <w:r>
+              <w:rPr>
+                <w:lang w:val="en-US"/>
+              </w:rPr>
+              <w:t>Slightly improved performance</w:t>
+            </w:r>
+          </w:p>
+        </w:tc>
+      </w:tr>
+      <w:tr>
+        <w:trPr>
+          <w:tblHeader/>
+        </w:trPr>
         <w:tc>
           <w:tcPr>
             <w:tcW w:w="0" w:type="auto"/>
@@ -7083,7 +7403,7 @@
               <w:rPr>
                 <w:lang w:val="en-US"/>
               </w:rPr>
-              <w:t>0.9262</w:t>
+              <w:t>Baseline Gradient Boosting (GB)</w:t>
             </w:r>
           </w:p>
         </w:tc>
@@ -7114,7 +7434,7 @@
               <w:rPr>
                 <w:lang w:val="en-US"/>
               </w:rPr>
-              <w:t>0.0296</w:t>
+              <w:t>0.9262</w:t>
             </w:r>
           </w:p>
         </w:tc>
@@ -7145,6 +7465,37 @@
               <w:rPr>
                 <w:lang w:val="en-US"/>
               </w:rPr>
+              <w:t>0.0296</w:t>
+            </w:r>
+          </w:p>
+        </w:tc>
+        <w:tc>
+          <w:tcPr>
+            <w:tcW w:w="0" w:type="auto"/>
+            <w:tcBorders>
+              <w:top w:val="single" w:sz="8" w:space="0" w:color="000000"/>
+              <w:left w:val="single" w:sz="8" w:space="0" w:color="000000"/>
+              <w:bottom w:val="single" w:sz="8" w:space="0" w:color="000000"/>
+              <w:right w:val="single" w:sz="8" w:space="0" w:color="000000"/>
+            </w:tcBorders>
+            <w:tcMar>
+              <w:top w:w="100" w:type="dxa"/>
+              <w:left w:w="100" w:type="dxa"/>
+              <w:bottom w:w="100" w:type="dxa"/>
+              <w:right w:w="100" w:type="dxa"/>
+            </w:tcMar>
+            <w:hideMark/>
+          </w:tcPr>
+          <w:p>
+            <w:pPr>
+              <w:rPr>
+                <w:lang w:val="en-US"/>
+              </w:rPr>
+            </w:pPr>
+            <w:r>
+              <w:rPr>
+                <w:lang w:val="en-US"/>
+              </w:rPr>
               <w:t>0.0419</w:t>
             </w:r>
           </w:p>
@@ -7205,11 +7556,15 @@
           <w:p>
             <w:pPr>
               <w:rPr>
+                <w:b/>
+                <w:bCs/>
                 <w:lang w:val="en-US"/>
               </w:rPr>
             </w:pPr>
             <w:r>
               <w:rPr>
+                <w:b/>
+                <w:bCs/>
                 <w:lang w:val="en-US"/>
               </w:rPr>
               <w:t>Tuned GB</w:t>
@@ -7236,11 +7591,15 @@
           <w:p>
             <w:pPr>
               <w:rPr>
+                <w:b/>
+                <w:bCs/>
                 <w:lang w:val="en-US"/>
               </w:rPr>
             </w:pPr>
             <w:r>
               <w:rPr>
+                <w:b/>
+                <w:bCs/>
                 <w:lang w:val="en-US"/>
               </w:rPr>
               <w:t>0.9328</w:t>
@@ -7267,11 +7626,15 @@
           <w:p>
             <w:pPr>
               <w:rPr>
+                <w:b/>
+                <w:bCs/>
                 <w:lang w:val="en-US"/>
               </w:rPr>
             </w:pPr>
             <w:r>
               <w:rPr>
+                <w:b/>
+                <w:bCs/>
                 <w:lang w:val="en-US"/>
               </w:rPr>
               <w:t>0.0277</w:t>
@@ -7298,11 +7661,15 @@
           <w:p>
             <w:pPr>
               <w:rPr>
+                <w:b/>
+                <w:bCs/>
                 <w:lang w:val="en-US"/>
               </w:rPr>
             </w:pPr>
             <w:r>
               <w:rPr>
+                <w:b/>
+                <w:bCs/>
                 <w:lang w:val="en-US"/>
               </w:rPr>
               <w:t>0.0400</w:t>
@@ -7329,11 +7696,15 @@
           <w:p>
             <w:pPr>
               <w:rPr>
+                <w:b/>
+                <w:bCs/>
                 <w:lang w:val="en-US"/>
               </w:rPr>
             </w:pPr>
             <w:r>
               <w:rPr>
+                <w:b/>
+                <w:bCs/>
                 <w:lang w:val="en-US"/>
               </w:rPr>
               <w:t xml:space="preserve">Main model </w:t>
@@ -7403,7 +7774,7 @@
               <w:rPr>
                 <w:lang w:val="en-US"/>
               </w:rPr>
-              <w:t>0.9376</w:t>
+              <w:t>0.9253</w:t>
             </w:r>
           </w:p>
         </w:tc>
@@ -7434,7 +7805,7 @@
               <w:rPr>
                 <w:lang w:val="en-US"/>
               </w:rPr>
-              <w:t>0.0268</w:t>
+              <w:t>0.0298</w:t>
             </w:r>
           </w:p>
         </w:tc>
@@ -7465,7 +7836,7 @@
               <w:rPr>
                 <w:lang w:val="en-US"/>
               </w:rPr>
-              <w:t>0.0385</w:t>
+              <w:t>0.0421</w:t>
             </w:r>
           </w:p>
         </w:tc>
@@ -7496,7 +7867,7 @@
               <w:rPr>
                 <w:lang w:val="en-US"/>
               </w:rPr>
-              <w:t>No meaningful gain</w:t>
+              <w:t>Slightly reduced performance</w:t>
             </w:r>
           </w:p>
         </w:tc>
@@ -7526,6 +7897,103 @@
         <w:t xml:space="preserve"> </w:t>
       </w:r>
       <w:bookmarkStart w:id="66" w:name="_Toc238149755"/>
+      <w:r>
+        <w:rPr>
+          <w:noProof w:val="0"/>
+          <w:lang w:val="en-US"/>
+        </w:rPr>
+        <w:t>Tuning Gradient Boosting improves performance to R² = 0.9328, MAE = 0.0277, and RMSE = 0.0400. Adding the tested derived features to Gradient Boosting slightly reduces performance. Although Random Forest with derived features achieves slightly higher predictive performance (R² = 0.9376, MAE = 0.0268, RMSE = 0.0385), the tuned Gradient Boosting model using the original scenario inputs is retained as the primary model because it achieves comparable performance without requiring additional derived inputs.</w:t>
+      </w:r>
+    </w:p>
+    <w:p>
+      <w:pPr>
+        <w:spacing w:before="240" w:after="100" w:afterAutospacing="1"/>
+        <w:jc w:val="both"/>
+        <w:rPr>
+          <w:noProof w:val="0"/>
+          <w:lang w:val="en-US"/>
+        </w:rPr>
+      </w:pPr>
+    </w:p>
+    <w:p>
+      <w:pPr>
+        <w:spacing w:before="240" w:after="100" w:afterAutospacing="1"/>
+        <w:jc w:val="both"/>
+        <w:rPr>
+          <w:noProof w:val="0"/>
+          <w:lang w:val="en-US"/>
+        </w:rPr>
+      </w:pPr>
+    </w:p>
+    <w:p>
+      <w:pPr>
+        <w:spacing w:before="240" w:after="100" w:afterAutospacing="1"/>
+        <w:jc w:val="both"/>
+        <w:rPr>
+          <w:noProof w:val="0"/>
+          <w:lang w:val="en-US"/>
+        </w:rPr>
+      </w:pPr>
+    </w:p>
+    <w:p>
+      <w:pPr>
+        <w:spacing w:before="240" w:after="100" w:afterAutospacing="1"/>
+        <w:jc w:val="both"/>
+        <w:rPr>
+          <w:noProof w:val="0"/>
+          <w:lang w:val="en-US"/>
+        </w:rPr>
+      </w:pPr>
+    </w:p>
+    <w:p>
+      <w:pPr>
+        <w:spacing w:before="240" w:after="100" w:afterAutospacing="1"/>
+        <w:jc w:val="both"/>
+        <w:rPr>
+          <w:noProof w:val="0"/>
+          <w:lang w:val="en-US"/>
+        </w:rPr>
+      </w:pPr>
+    </w:p>
+    <w:p>
+      <w:pPr>
+        <w:spacing w:before="240" w:after="100" w:afterAutospacing="1"/>
+        <w:jc w:val="both"/>
+        <w:rPr>
+          <w:noProof w:val="0"/>
+          <w:lang w:val="en-US"/>
+        </w:rPr>
+      </w:pPr>
+    </w:p>
+    <w:p>
+      <w:pPr>
+        <w:spacing w:before="240" w:after="100" w:afterAutospacing="1"/>
+        <w:jc w:val="both"/>
+        <w:rPr>
+          <w:noProof w:val="0"/>
+          <w:lang w:val="en-US"/>
+        </w:rPr>
+      </w:pPr>
+    </w:p>
+    <w:p>
+      <w:pPr>
+        <w:spacing w:before="240" w:after="100" w:afterAutospacing="1"/>
+        <w:jc w:val="both"/>
+        <w:rPr>
+          <w:noProof w:val="0"/>
+          <w:lang w:val="en-US"/>
+        </w:rPr>
+      </w:pPr>
+    </w:p>
+    <w:p>
+      <w:pPr>
+        <w:spacing w:before="240" w:after="100" w:afterAutospacing="1"/>
+        <w:jc w:val="both"/>
+        <w:rPr>
+          <w:noProof w:val="0"/>
+          <w:lang w:val="en-US"/>
+        </w:rPr>
+      </w:pPr>
     </w:p>
     <w:p>
       <w:pPr>
@@ -7544,6 +8012,7 @@
           <w:sz w:val="20"/>
           <w:szCs w:val="20"/>
         </w:rPr>
+        <w:lastRenderedPageBreak/>
         <w:br/>
       </w:r>
       <w:r>
@@ -7564,7 +8033,27 @@
           <w:sz w:val="20"/>
           <w:szCs w:val="20"/>
         </w:rPr>
-        <w:t>. Model tuning parameters and physics-derived features investigated.</w:t>
+        <w:t>. Model tuning parameters and physics-derived features investigated</w:t>
+      </w:r>
+      <w:r>
+        <w:rPr>
+          <w:i/>
+          <w:iCs/>
+          <w:color w:val="000000" w:themeColor="text1"/>
+          <w:sz w:val="20"/>
+          <w:szCs w:val="20"/>
+        </w:rPr>
+        <w:t xml:space="preserve"> for gradient boosting model</w:t>
+      </w:r>
+      <w:r>
+        <w:rPr>
+          <w:i/>
+          <w:iCs/>
+          <w:color w:val="000000" w:themeColor="text1"/>
+          <w:sz w:val="20"/>
+          <w:szCs w:val="20"/>
+        </w:rPr>
+        <w:t>.</w:t>
       </w:r>
     </w:p>
     <w:tbl>
@@ -8586,7 +9075,13 @@
               <w:rPr>
                 <w:color w:val="000000" w:themeColor="text1"/>
               </w:rPr>
-              <w:t xml:space="preserve">Increased R² by 0.001 </w:t>
+              <w:t>Decreased</w:t>
+            </w:r>
+            <w:r>
+              <w:rPr>
+                <w:color w:val="000000" w:themeColor="text1"/>
+              </w:rPr>
+              <w:t xml:space="preserve"> R² by 0.001 </w:t>
             </w:r>
           </w:p>
         </w:tc>
@@ -9463,7 +9958,13 @@
               <w:rPr>
                 <w:color w:val="000000" w:themeColor="text1"/>
               </w:rPr>
-              <w:t>Increased R² by 0.00</w:t>
+              <w:t xml:space="preserve">Decreased </w:t>
+            </w:r>
+            <w:r>
+              <w:rPr>
+                <w:color w:val="000000" w:themeColor="text1"/>
+              </w:rPr>
+              <w:t>R² by 0.00</w:t>
             </w:r>
             <w:r>
               <w:rPr>
@@ -10256,10 +10757,41 @@
           <w:lang w:val="en-US"/>
         </w:rPr>
       </w:pPr>
+    </w:p>
+    <w:p>
+      <w:pPr>
+        <w:spacing w:before="100" w:beforeAutospacing="1" w:after="100" w:afterAutospacing="1"/>
+        <w:jc w:val="center"/>
+        <w:rPr>
+          <w:noProof w:val="0"/>
+          <w:lang w:val="en-US"/>
+        </w:rPr>
+      </w:pPr>
+    </w:p>
+    <w:p>
+      <w:pPr>
+        <w:spacing w:before="100" w:beforeAutospacing="1" w:after="100" w:afterAutospacing="1"/>
+        <w:jc w:val="center"/>
+        <w:rPr>
+          <w:noProof w:val="0"/>
+          <w:lang w:val="en-US"/>
+        </w:rPr>
+      </w:pPr>
+    </w:p>
+    <w:p>
+      <w:pPr>
+        <w:spacing w:before="100" w:beforeAutospacing="1" w:after="100" w:afterAutospacing="1"/>
+        <w:jc w:val="center"/>
+        <w:rPr>
+          <w:noProof w:val="0"/>
+          <w:lang w:val="en-US"/>
+        </w:rPr>
+      </w:pPr>
       <w:r>
         <w:rPr>
           <w:color w:val="000000" w:themeColor="text1"/>
         </w:rPr>
+        <w:lastRenderedPageBreak/>
         <w:drawing>
           <wp:inline distT="0" distB="0" distL="0" distR="0" wp14:anchorId="23ECAAF8" wp14:editId="0C5D4E7F">
             <wp:extent cx="4550229" cy="3090850"/>
@@ -10342,6 +10874,48 @@
       <w:r>
         <w:t>This happens sooner for the other parameter sweeps, where out-of-range values quickly enter the same terminal tree regions and further changes no longer affect the prediction. These out-of-range predictions should therefore not be interpreted as physical trends.</w:t>
       </w:r>
+    </w:p>
+    <w:p>
+      <w:pPr>
+        <w:spacing w:after="160" w:line="278" w:lineRule="auto"/>
+        <w:jc w:val="both"/>
+      </w:pPr>
+    </w:p>
+    <w:p>
+      <w:pPr>
+        <w:spacing w:after="160" w:line="278" w:lineRule="auto"/>
+        <w:jc w:val="both"/>
+      </w:pPr>
+    </w:p>
+    <w:p>
+      <w:pPr>
+        <w:spacing w:after="160" w:line="278" w:lineRule="auto"/>
+        <w:jc w:val="both"/>
+      </w:pPr>
+    </w:p>
+    <w:p>
+      <w:pPr>
+        <w:spacing w:after="160" w:line="278" w:lineRule="auto"/>
+        <w:jc w:val="both"/>
+      </w:pPr>
+    </w:p>
+    <w:p>
+      <w:pPr>
+        <w:spacing w:after="160" w:line="278" w:lineRule="auto"/>
+        <w:jc w:val="both"/>
+      </w:pPr>
+    </w:p>
+    <w:p>
+      <w:pPr>
+        <w:spacing w:after="160" w:line="278" w:lineRule="auto"/>
+        <w:jc w:val="both"/>
+      </w:pPr>
+    </w:p>
+    <w:p>
+      <w:pPr>
+        <w:spacing w:after="160" w:line="278" w:lineRule="auto"/>
+        <w:jc w:val="both"/>
+      </w:pPr>
     </w:p>
     <w:p>
       <w:pPr>

</xml_diff>

<commit_message>
docs: update final report fixed typo grammar etc
</commit_message>
<xml_diff>
--- a/deliverables/nny124-final-report.docx
+++ b/deliverables/nny124-final-report.docx
@@ -2999,7 +2999,13 @@
         <w:jc w:val="both"/>
       </w:pPr>
       <w:r>
-        <w:t xml:space="preserve">The origin of Phobos and Deimos, the moons of Mars, is still a mystery. A close asteroid contact with Mars is one suggested route. </w:t>
+        <w:t xml:space="preserve">The origin of Phobos and Deimos, the moons of Mars, is still a mystery. A close asteroid </w:t>
+      </w:r>
+      <w:r>
+        <w:t xml:space="preserve">encounter </w:t>
+      </w:r>
+      <w:r>
+        <w:t xml:space="preserve">with Mars is one suggested route. </w:t>
       </w:r>
       <w:r>
         <w:t>During a sufficiently close encounter, differences in Mars's gravitational pull across the asteroid can produce strong tidal forces that deform or disrupt it</w:t>
@@ -3183,7 +3189,13 @@
         <w:t>So, by</w:t>
       </w:r>
       <w:r>
-        <w:t xml:space="preserve"> demonstrating that a close asteroid contact with Mars can tidally destroy the asteroid while trapping part of its debris, Kegerreis et al. (2024) offer a significant alternative creation pathway. The current project is directly motivated by this. Although their simulations demonstrate significant amounts of bound debris across various periapsis, velocity, mass, and spin settings, each new configuration necessitates a new simulation. This study investigates whether an ML model that screens new configurations prior to SPH execution can be trained using the current archive.</w:t>
+        <w:t xml:space="preserve"> demonstrating that a close asteroid contact with Mars can tidally </w:t>
+      </w:r>
+      <w:r>
+        <w:t>disrupt</w:t>
+      </w:r>
+      <w:r>
+        <w:t xml:space="preserve"> the asteroid while trapping part of its debris, Kegerreis et al. (2024) offer a significant alternative creation pathway. The current project is directly motivated by this. Although their simulations demonstrate significant amounts of bound debris across various periapsis, velocity, mass, and spin settings, each new configuration necessitates a new simulation. This study investigates whether an ML model that screens new configurations prior to SPH execution can be trained using the current archive.</w:t>
       </w:r>
     </w:p>
     <w:p>
@@ -4282,7 +4294,13 @@
       </w:pPr>
       <w:r>
         <w:lastRenderedPageBreak/>
-        <w:t xml:space="preserve">Although close interactions do not always result in strong fragmentation or high BMF, Figure 1 illustrates that both fragmentation and bound retention typically decrease as periapsis increases. The mean BMF rises with tiny periapsis and falls with increasing encounter speed. The relative impacts also vary throughout the sampling range: separation between spin states becomes more apparent around 1.7-2.0 Mars radii, whereas velocity differences are more noticeable at roughly 1.1-1.6 Mars radii. </w:t>
+        <w:t xml:space="preserve">Although close interactions do not always result in strong fragmentation or high BMF, Figure 1 illustrates that both fragmentation and bound retention typically decrease as periapsis increases. The mean BMF rises with </w:t>
+      </w:r>
+      <w:r>
+        <w:t>small</w:t>
+      </w:r>
+      <w:r>
+        <w:t xml:space="preserve"> periapsis and falls with increasing encounter speed. The relative impacts also vary throughout the sampling range: separation between spin states becomes more apparent around 1.7-2.0 Mars radii, whereas velocity differences are more noticeable at roughly 1.1-1.6 Mars radii. </w:t>
       </w:r>
       <w:r>
         <w:t>Some prograde-spin cases retain non-zero BMF to larger periapsis, although these regions are more sparsely sampled.</w:t>
@@ -4390,7 +4408,13 @@
         <w:jc w:val="both"/>
       </w:pPr>
       <w:r>
-        <w:t>It was previously demonstrated that fragmentation and BMF do not follow a single, straightforward input trend, thus I want to see if relevant physical parameters can more accurately characterize this behaviour. To provide a single physically significant measure of the orbit shape and enable retention to be analysed using the entire encounter trajectory rather than as distinct factors, periapsis and encounter speed are combined to form an encounter eccentricity.</w:t>
+        <w:t xml:space="preserve">It was previously demonstrated that fragmentation and BMF do not follow a single, straightforward input trend, </w:t>
+      </w:r>
+      <w:r>
+        <w:t>so</w:t>
+      </w:r>
+      <w:r>
+        <w:t xml:space="preserve"> I want to see if relevant physical parameters can more accurately characterize this behaviour. To provide a single physically significant measure of the orbit shape and enable retention to be analysed using the entire encounter trajectory rather than as distinct factors, periapsis and encounter speed are combined to form an encounter eccentricity.</w:t>
       </w:r>
     </w:p>
     <w:p>
@@ -4609,11 +4633,32 @@
         <w:t xml:space="preserve">(Appendix A, Tables A1-A2). </w:t>
       </w:r>
       <w:r>
-        <w:t>Adding the tested physics-derived features does not improve the tuned Gradient Boosting model, so the model using the original scenario inputs is retained.</w:t>
+        <w:t>Adding the tested physics-derived features does not improve the tuned Gradient Boosting model. Random Forest with derived features achieves slightly higher predictive performance (</w:t>
+      </w:r>
+      <w:r>
+        <w:t xml:space="preserve">R² </w:t>
+      </w:r>
+      <w:r>
+        <w:t>=</w:t>
       </w:r>
       <w:r>
         <w:t xml:space="preserve"> </w:t>
       </w:r>
+      <w:r>
+        <w:t>0.9376), but the tuned Gradient Boosting model using the original scenario inputs is retained as the primary model because its performance is comparable without requiring additional derived features.</w:t>
+      </w:r>
+    </w:p>
+    <w:p>
+      <w:pPr>
+        <w:spacing w:before="240" w:after="240" w:line="276" w:lineRule="auto"/>
+        <w:jc w:val="both"/>
+      </w:pPr>
+    </w:p>
+    <w:p>
+      <w:pPr>
+        <w:spacing w:before="240" w:after="240" w:line="276" w:lineRule="auto"/>
+        <w:jc w:val="both"/>
+      </w:pPr>
     </w:p>
     <w:p>
       <w:pPr>
@@ -4621,21 +4666,12 @@
       </w:pPr>
       <w:bookmarkStart w:id="37" w:name="_Toc238149744"/>
       <w:bookmarkStart w:id="38" w:name="_Toc238639507"/>
-      <w:commentRangeStart w:id="39"/>
-      <w:r>
+      <w:r>
+        <w:lastRenderedPageBreak/>
         <w:t>3.4 Overall Physical Parameter Importance</w:t>
       </w:r>
       <w:bookmarkEnd w:id="37"/>
       <w:bookmarkEnd w:id="38"/>
-      <w:commentRangeEnd w:id="39"/>
-      <w:r>
-        <w:rPr>
-          <w:rStyle w:val="CommentReference"/>
-          <w:sz w:val="24"/>
-          <w:szCs w:val="24"/>
-        </w:rPr>
-        <w:commentReference w:id="39"/>
-      </w:r>
     </w:p>
     <w:p>
       <w:pPr>
@@ -4679,11 +4715,7 @@
         <w:t>246</w:t>
       </w:r>
       <w:r>
-        <w:t xml:space="preserve">. These </w:t>
-      </w:r>
-      <w:r>
-        <w:lastRenderedPageBreak/>
-        <w:t xml:space="preserve">values are separate ablation experiments and should not be added together. They display the degree to which the model depends on each input, not whether increasing that input directly raises or lowers BMF. </w:t>
+        <w:t xml:space="preserve">. These values are separate ablation experiments and should not be added together. They display the degree to which the model depends on each input, not whether increasing that input directly raises or lowers BMF. </w:t>
       </w:r>
       <w:r>
         <w:t>Velocity has the strongest overall model dependence, followed by periapsis and spin, although this order may vary locally.</w:t>
@@ -4705,13 +4737,13 @@
       <w:pPr>
         <w:pStyle w:val="Heading2"/>
       </w:pPr>
-      <w:bookmarkStart w:id="40" w:name="_Toc238149745"/>
-      <w:bookmarkStart w:id="41" w:name="_Toc238639508"/>
+      <w:bookmarkStart w:id="39" w:name="_Toc238149745"/>
+      <w:bookmarkStart w:id="40" w:name="_Toc238639508"/>
       <w:r>
         <w:t>3.5 Checking Physical Trends and Condition-Dependent Effects</w:t>
       </w:r>
+      <w:bookmarkEnd w:id="39"/>
       <w:bookmarkEnd w:id="40"/>
-      <w:bookmarkEnd w:id="41"/>
     </w:p>
     <w:p>
       <w:pPr>
@@ -4729,6 +4761,7 @@
         <w:jc w:val="center"/>
       </w:pPr>
       <w:r>
+        <w:lastRenderedPageBreak/>
         <w:drawing>
           <wp:inline distT="0" distB="0" distL="0" distR="0" wp14:anchorId="4F709962" wp14:editId="4DF1EFCC">
             <wp:extent cx="5231757" cy="3553794"/>
@@ -4745,7 +4778,7 @@
                     <pic:cNvPicPr/>
                   </pic:nvPicPr>
                   <pic:blipFill>
-                    <a:blip r:embed="rId14"/>
+                    <a:blip r:embed="rId10"/>
                     <a:stretch>
                       <a:fillRect/>
                     </a:stretch>
@@ -4775,7 +4808,7 @@
           <w:szCs w:val="28"/>
         </w:rPr>
       </w:pPr>
-      <w:bookmarkStart w:id="42" w:name="_Toc238639526"/>
+      <w:bookmarkStart w:id="41" w:name="_Toc238639526"/>
       <w:r>
         <w:rPr>
           <w:sz w:val="20"/>
@@ -4825,7 +4858,7 @@
         </w:rPr>
         <w:t>. BMF checks where one input changes at a time. Dots are available SPH simulation results and curves show tuned Gradient Boosting predictions with the other inputs fixed. Blue background shows the interpolation range, while red background shows the extrapolation range.</w:t>
       </w:r>
-      <w:bookmarkEnd w:id="42"/>
+      <w:bookmarkEnd w:id="41"/>
     </w:p>
     <w:p>
       <w:pPr>
@@ -4841,7 +4874,6 @@
           <w:noProof w:val="0"/>
           <w:lang w:val="en-US"/>
         </w:rPr>
-        <w:lastRenderedPageBreak/>
         <w:t>Figure 3 compares controlled profiles in which one scenario input is varied while the others are fixed to a representative, well-supported combination. The fixed conditions may differ between panels, so the profiles show conditional responses rather than directly comparable effect sizes.</w:t>
       </w:r>
     </w:p>
@@ -4912,6 +4944,7 @@
         <w:jc w:val="center"/>
       </w:pPr>
       <w:r>
+        <w:lastRenderedPageBreak/>
         <w:drawing>
           <wp:inline distT="0" distB="0" distL="0" distR="0" wp14:anchorId="13192738" wp14:editId="37D664B4">
             <wp:extent cx="5393802" cy="2282239"/>
@@ -4928,7 +4961,7 @@
                     <pic:cNvPicPr/>
                   </pic:nvPicPr>
                   <pic:blipFill rotWithShape="1">
-                    <a:blip r:embed="rId15"/>
+                    <a:blip r:embed="rId11"/>
                     <a:srcRect t="13040" b="12919"/>
                     <a:stretch>
                       <a:fillRect/>
@@ -4967,7 +5000,7 @@
           <w:szCs w:val="28"/>
         </w:rPr>
       </w:pPr>
-      <w:bookmarkStart w:id="43" w:name="_Toc238639527"/>
+      <w:bookmarkStart w:id="42" w:name="_Toc238639527"/>
       <w:r>
         <w:rPr>
           <w:sz w:val="20"/>
@@ -5043,7 +5076,7 @@
         </w:rPr>
         <w:t>. Left: BMF range across spin states with velocity fixed. Right: BMF range across velocities with spin fixed. These ranges show how strongly outcomes differ within this subset; they do not show direction or prove causation.</w:t>
       </w:r>
-      <w:bookmarkEnd w:id="43"/>
+      <w:bookmarkEnd w:id="42"/>
     </w:p>
     <w:p>
       <w:pPr>
@@ -5069,7 +5102,31 @@
         <w:t>velocity</w:t>
       </w:r>
       <w:r>
-        <w:t xml:space="preserve"> falls within the same range across all possible velocities. A higher ΔBMF indicates that, in certain circumstances, altering that parameter has a greater impact on the retained mass. </w:t>
+        <w:t xml:space="preserve"> </w:t>
+      </w:r>
+      <w:r>
+        <w:t>shows</w:t>
+      </w:r>
+      <w:r>
+        <w:t xml:space="preserve"> </w:t>
+      </w:r>
+      <w:r>
+        <w:t xml:space="preserve">the </w:t>
+      </w:r>
+      <w:r>
+        <w:t xml:space="preserve">range </w:t>
+      </w:r>
+      <w:r>
+        <w:t xml:space="preserve">in BMF </w:t>
+      </w:r>
+      <w:r>
+        <w:t xml:space="preserve">across </w:t>
+      </w:r>
+      <w:r>
+        <w:t xml:space="preserve">the available </w:t>
+      </w:r>
+      <w:r>
+        <w:t xml:space="preserve">velocities. A higher ΔBMF indicates that, in certain circumstances, altering that parameter has a greater impact on the retained mass. </w:t>
       </w:r>
     </w:p>
     <w:p>
@@ -5081,30 +5138,35 @@
         <w:t>Figure 4 shows that the magnitude of both spin and velocity effects changes with periapsis and the surrounding encounter conditions. Neither parameter has a constant effect across the sampled range: spin produces larger BMF differences in some regimes</w:t>
       </w:r>
       <w:r>
-        <w:t>/predominates under some situations</w:t>
-      </w:r>
-      <w:r>
-        <w:t xml:space="preserve">, </w:t>
-      </w:r>
-      <w:r>
-        <w:lastRenderedPageBreak/>
-        <w:t>while velocity produces larger differences in others. These findings support the importance of regime-dependent parameters, so the overall ablation ranking should not be interpreted as universal.</w:t>
-      </w:r>
-      <w:r>
         <w:t xml:space="preserve"> </w:t>
       </w:r>
+      <w:r>
+        <w:t>/</w:t>
+      </w:r>
+      <w:r>
+        <w:t xml:space="preserve"> </w:t>
+      </w:r>
+      <w:r>
+        <w:t>predominates under some situations</w:t>
+      </w:r>
+      <w:r>
+        <w:t>, while velocity produces larger differences in others. These findings support the importance of regime-dependent parameters, so the overall ablation ranking should not be interpreted as universal.</w:t>
+      </w:r>
+      <w:r>
+        <w:t xml:space="preserve"> </w:t>
+      </w:r>
     </w:p>
     <w:p>
       <w:pPr>
         <w:pStyle w:val="Heading2"/>
       </w:pPr>
-      <w:bookmarkStart w:id="44" w:name="_Toc238149746"/>
-      <w:bookmarkStart w:id="45" w:name="_Toc238639509"/>
+      <w:bookmarkStart w:id="43" w:name="_Toc238149746"/>
+      <w:bookmarkStart w:id="44" w:name="_Toc238639509"/>
       <w:r>
         <w:t>3.6 Where the Model Can and Cannot Be Trusted</w:t>
       </w:r>
+      <w:bookmarkEnd w:id="43"/>
       <w:bookmarkEnd w:id="44"/>
-      <w:bookmarkEnd w:id="45"/>
     </w:p>
     <w:p>
       <w:pPr>
@@ -5121,7 +5183,11 @@
         <w:jc w:val="both"/>
       </w:pPr>
       <w:r>
-        <w:t>Because the model depends on input combinations, a case may fall inside the range of each individual input and yet have inadequate support. Thus, held-out error and pairwise parameter coverage are compared with local simulation coverage in Figure 5. Individual input ranges conceal unsampled combinations, which are revealed by pairwise mapping. Only when comparable SPH cases are close by in the input space is a prediction regarded as interpolation.</w:t>
+        <w:t xml:space="preserve">Because the model depends on input combinations, a case may fall inside the range of each individual input and yet have inadequate support. Thus, held-out error and pairwise parameter </w:t>
+      </w:r>
+      <w:r>
+        <w:lastRenderedPageBreak/>
+        <w:t>coverage are compared with local simulation coverage in Figure 5. Individual input ranges conceal unsampled combinations, which are revealed by pairwise mapping. Only when comparable SPH cases are close by in the input space is a prediction regarded as interpolation.</w:t>
       </w:r>
     </w:p>
     <w:p>
@@ -5147,7 +5213,7 @@
                     <pic:cNvPicPr/>
                   </pic:nvPicPr>
                   <pic:blipFill>
-                    <a:blip r:embed="rId16"/>
+                    <a:blip r:embed="rId12"/>
                     <a:stretch>
                       <a:fillRect/>
                     </a:stretch>
@@ -5177,7 +5243,7 @@
           <w:szCs w:val="20"/>
         </w:rPr>
       </w:pPr>
-      <w:bookmarkStart w:id="46" w:name="_Toc238639528"/>
+      <w:bookmarkStart w:id="45" w:name="_Toc238639528"/>
       <w:r>
         <w:rPr>
           <w:sz w:val="20"/>
@@ -5248,14 +5314,13 @@
         </w:rPr>
         <w:t>Panels (a,d) show unique physical SPH simulation counts, panels (b,e) show mean held-out absolute error, and panels (c,f) show mean observed BMF with unique simulation counts overlaid. Grey indicates no SPH data. In the observed-BMF panels, light blue indicates mean observed BMF = 0, while other colours indicate mean observed BMF &gt; 0.</w:t>
       </w:r>
-      <w:bookmarkEnd w:id="46"/>
+      <w:bookmarkEnd w:id="45"/>
     </w:p>
     <w:p>
       <w:pPr>
         <w:jc w:val="both"/>
       </w:pPr>
-      <w:bookmarkStart w:id="47" w:name="_Toc238151451"/>
-      <w:commentRangeStart w:id="48"/>
+      <w:bookmarkStart w:id="46" w:name="_Toc238151451"/>
       <w:r>
         <w:t xml:space="preserve">A </w:t>
       </w:r>
@@ -5299,11 +5364,7 @@
         <w:t xml:space="preserve"> 1.0</w:t>
       </w:r>
       <w:r>
-        <w:t xml:space="preserve"> km/s cells each contain </w:t>
-      </w:r>
-      <w:r>
-        <w:lastRenderedPageBreak/>
-        <w:t xml:space="preserve">only one unique physical SPH simulation </w:t>
+        <w:t xml:space="preserve"> km/s cells each contain only one unique physical SPH simulation </w:t>
       </w:r>
       <w:r>
         <w:t xml:space="preserve">(see </w:t>
@@ -5329,7 +5390,7 @@
           <w:szCs w:val="20"/>
         </w:rPr>
       </w:pPr>
-      <w:bookmarkStart w:id="49" w:name="_Toc238639576"/>
+      <w:bookmarkStart w:id="47" w:name="_Toc238639576"/>
       <w:r>
         <w:rPr>
           <w:sz w:val="20"/>
@@ -5379,7 +5440,7 @@
         </w:rPr>
         <w:t xml:space="preserve">. </w:t>
       </w:r>
-      <w:bookmarkEnd w:id="47"/>
+      <w:bookmarkEnd w:id="46"/>
       <w:r>
         <w:rPr>
           <w:sz w:val="20"/>
@@ -5401,7 +5462,7 @@
         </w:rPr>
         <w:t>the sampled range but contain only one unique physical SPH simulation.</w:t>
       </w:r>
-      <w:bookmarkEnd w:id="49"/>
+      <w:bookmarkEnd w:id="47"/>
     </w:p>
     <w:tbl>
       <w:tblPr>
@@ -5764,21 +5825,12 @@
         </w:tc>
       </w:tr>
     </w:tbl>
-    <w:commentRangeEnd w:id="48"/>
     <w:p>
       <w:pPr>
         <w:spacing w:before="240" w:after="240" w:line="276" w:lineRule="auto"/>
         <w:jc w:val="both"/>
       </w:pPr>
       <w:r>
-        <w:rPr>
-          <w:rStyle w:val="CommentReference"/>
-          <w:sz w:val="24"/>
-          <w:szCs w:val="24"/>
-        </w:rPr>
-        <w:commentReference w:id="48"/>
-      </w:r>
-      <w:r>
         <w:t>The held-out model underpredicts the</w:t>
       </w:r>
       <w:r>
@@ -5839,17 +5891,72 @@
         <w:t>)</w:t>
       </w:r>
       <w:r>
-        <w:t>. The opposite-sign errors in two neighbouring cells with minimal SPH coverage indicate that the local velocity relationship is not reliably learned in this region. Therefore, being within the overall sampled input range does not guarantee a reliable prediction, and additional SPH simulations would be useful in such sparsely sampled regions.</w:t>
+        <w:t xml:space="preserve">. The opposite-sign errors in two neighbouring cells with minimal SPH coverage indicate that the local velocity relationship is </w:t>
+      </w:r>
+      <w:r>
+        <w:lastRenderedPageBreak/>
+        <w:t>not reliably learned in this region. Therefore, being within the overall sampled input range does not guarantee a reliable prediction, and additional SPH simulations would be useful in such sparsely sampled regions.</w:t>
       </w:r>
     </w:p>
     <w:p>
       <w:pPr>
         <w:pStyle w:val="Heading2"/>
       </w:pPr>
-      <w:bookmarkStart w:id="50" w:name="_Toc238149747"/>
-      <w:bookmarkStart w:id="51" w:name="_Toc238639510"/>
+      <w:bookmarkStart w:id="48" w:name="_Toc238149747"/>
+      <w:bookmarkStart w:id="49" w:name="_Toc238639510"/>
       <w:r>
         <w:t>3.7 How the Model Supports SPH Decisions</w:t>
+      </w:r>
+      <w:bookmarkEnd w:id="48"/>
+      <w:bookmarkEnd w:id="49"/>
+    </w:p>
+    <w:p>
+      <w:pPr>
+        <w:spacing w:before="240" w:after="240" w:line="276" w:lineRule="auto"/>
+        <w:jc w:val="both"/>
+      </w:pPr>
+      <w:r>
+        <w:t>So,</w:t>
+      </w:r>
+      <w:r>
+        <w:t xml:space="preserve"> what is the model </w:t>
+      </w:r>
+      <w:r>
+        <w:t>actually useful</w:t>
+      </w:r>
+      <w:r>
+        <w:t xml:space="preserve"> for? The screening process separates disruption from retention. </w:t>
+      </w:r>
+      <w:r>
+        <w:t>While BMF calculates the amount of material that is still attached to Mars, the largest-remnant fraction indicates whether the asteroid is largely intact, breaks apart somewhat, or is seriously disturbed. Strong disruption can nevertheless result in primarily fleeing debris, which is why both outcomes are distinct.</w:t>
+      </w:r>
+      <w:r>
+        <w:t xml:space="preserve"> </w:t>
+      </w:r>
+    </w:p>
+    <w:p>
+      <w:pPr>
+        <w:spacing w:before="240" w:after="240" w:line="276" w:lineRule="auto"/>
+        <w:jc w:val="both"/>
+      </w:pPr>
+      <w:r>
+        <w:t>The resulting screening workflow provides the breakup class, estimated Mars-bound mass, expected BMF, data coverage, and a recommendation about whether another SPH simulation is required.</w:t>
+      </w:r>
+      <w:r>
+        <w:t xml:space="preserve"> </w:t>
+      </w:r>
+      <w:r>
+        <w:t>While sparse, edge, transition, or doubtful instances should be examined with SPH, well-supported cases can be swiftly evaluated with ML.</w:t>
+      </w:r>
+    </w:p>
+    <w:p>
+      <w:pPr>
+        <w:pStyle w:val="Heading1"/>
+      </w:pPr>
+      <w:bookmarkStart w:id="50" w:name="_Toc238149748"/>
+      <w:bookmarkStart w:id="51" w:name="_Toc238639511"/>
+      <w:r>
+        <w:t>4. Discussion</w:t>
       </w:r>
       <w:bookmarkEnd w:id="50"/>
       <w:bookmarkEnd w:id="51"/>
@@ -5860,22 +5967,13 @@
         <w:jc w:val="both"/>
       </w:pPr>
       <w:r>
-        <w:t>So,</w:t>
-      </w:r>
-      <w:r>
-        <w:t xml:space="preserve"> what is the model </w:t>
-      </w:r>
-      <w:r>
-        <w:t>actually useful</w:t>
-      </w:r>
-      <w:r>
-        <w:t xml:space="preserve"> for? The screening process separates disruption from retention. </w:t>
-      </w:r>
-      <w:r>
-        <w:t>While BMF calculates the amount of material that is still attached to Mars, the largest-remnant fraction indicates whether the asteroid is largely intact, breaks apart somewhat, or is seriously disturbed. Strong disruption can nevertheless result in primarily fleeing debris, which is why both outcomes are distinct.</w:t>
-      </w:r>
-      <w:r>
-        <w:t xml:space="preserve"> </w:t>
+        <w:t xml:space="preserve">The clearest periapsis and velocity trends are seen in the controlled experiments, while the matched comparisons show that the effects of spin and velocity vary with encounter conditions. The behaviour in Figure 3 is consistent with the other analyses: </w:t>
+      </w:r>
+      <w:r>
+        <w:t>although BMF generally decreases at larger periapsis</w:t>
+      </w:r>
+      <w:r>
+        <w:t>, Figures 1, 4, and 5 show that retention can still occur under particular combinations of spin, velocity, and mass. This indicates that similar periapsis values can produce different outcomes depending on the full encounter conditions. These relationships are learned from SPH outputs and support interpretation rather than proving physical causality.</w:t>
       </w:r>
     </w:p>
     <w:p>
@@ -5884,40 +5982,116 @@
         <w:jc w:val="both"/>
       </w:pPr>
       <w:r>
-        <w:t>The resulting screening workflow provides the breakup class, estimated Mars-bound mass, expected BMF, data coverage, and a recommendation about whether another SPH simulation is required.</w:t>
-      </w:r>
-      <w:r>
-        <w:t xml:space="preserve"> </w:t>
-      </w:r>
-      <w:r>
-        <w:t>While sparse, edge, transition, or doubtful instances should be examined with SPH, well-supported cases can be swiftly evaluated with ML.</w:t>
+        <w:t>The primary physical outcome is that each parameter's impact is contingent upon the other encounter conditions. Within those parameters, periapsis determines the overall strength of the tidal encounter, encounter speed influences the duration of the contact and the favourable capture, and mass and spin alter the outcome. The most obvious periapsis and speed directions are found in the controlled experiments. The paired simulations demonstrate how periapsis and spin state affect the magnitude of the spin and velocity impacts.</w:t>
+      </w:r>
+    </w:p>
+    <w:p>
+      <w:pPr>
+        <w:spacing w:before="240" w:after="240" w:line="276" w:lineRule="auto"/>
+        <w:jc w:val="both"/>
+      </w:pPr>
+      <w:r>
+        <w:t>Though these associations are acquired from SPH outputs rather than from physical laws, the ML model replicates general trends and reveals interactions throughout the archive. As a result, matched comparisons, controlled tests, and group validation support interpretation but do not prove causality.</w:t>
+      </w:r>
+    </w:p>
+    <w:p>
+      <w:pPr>
+        <w:spacing w:before="240" w:after="240" w:line="276" w:lineRule="auto"/>
+        <w:jc w:val="both"/>
+      </w:pPr>
+      <w:r>
+        <w:t xml:space="preserve">As a result, ML's usefulness is restricted. It can swiftly filter well-supported input combinations, identify transition zones, uncover situations that yield promising retained mass, and indicate areas where more simulation could yield valuable information. Long-term debris survivability, precise </w:t>
+      </w:r>
+      <w:r>
+        <w:lastRenderedPageBreak/>
+        <w:t xml:space="preserve">fragment shapes and distributions from BMF alone, and forecasts for inadequately sampled input combinations cannot all be determined by it. </w:t>
+      </w:r>
+      <w:r>
+        <w:t>This is evident from the sparse periapsis-velocity example at 1.4 Mars radii: even though the input values fall within the training ranges, minimal local simulation coverage is associated with larger held-out errors.</w:t>
+      </w:r>
+    </w:p>
+    <w:p>
+      <w:pPr>
+        <w:spacing w:before="240" w:after="240" w:line="276" w:lineRule="auto"/>
+        <w:jc w:val="both"/>
+      </w:pPr>
+      <w:r>
+        <w:t xml:space="preserve">Different questions are addressed by the matching and ablation analysis. Although matching cases demonstrate that </w:t>
+      </w:r>
+      <w:r>
+        <w:t>periapsis</w:t>
+      </w:r>
+      <w:r>
+        <w:t xml:space="preserve"> or </w:t>
+      </w:r>
+      <w:r>
+        <w:t>spin</w:t>
+      </w:r>
+      <w:r>
+        <w:t xml:space="preserve"> can become more significant under specific encounter settings, </w:t>
+      </w:r>
+      <w:r>
+        <w:t xml:space="preserve">velocity </w:t>
+      </w:r>
+      <w:r>
+        <w:t>is generally the strongest.</w:t>
+      </w:r>
+    </w:p>
+    <w:p>
+      <w:pPr>
+        <w:spacing w:before="240" w:after="240" w:line="276" w:lineRule="auto"/>
+        <w:jc w:val="both"/>
+      </w:pPr>
+      <w:r>
+        <w:t>Compared to BMF, fragmentation requires more prudence. Strong fragmentation is possible but not guaranteed by close periapsis, and the number of pieces is directly altered by the FoF connecting length. Therefore, rather than taking the place of BMF, fragment count and largest-remnant metrics offer additional information. Strong breakup does not always result in much bound debris, therefore the procedure separates breakup severity from Mars-bound retention.</w:t>
+      </w:r>
+    </w:p>
+    <w:p>
+      <w:pPr>
+        <w:spacing w:before="240" w:after="240" w:line="276" w:lineRule="auto"/>
+        <w:jc w:val="both"/>
+      </w:pPr>
+      <w:r>
+        <w:t>All things considered, the ML model is a quick screening method for the current SPH archive. Poorly sampled cases, transition regions, and issues requiring certain fragment attributes still require SPH.</w:t>
       </w:r>
     </w:p>
     <w:p>
       <w:pPr>
         <w:pStyle w:val="Heading1"/>
       </w:pPr>
-      <w:bookmarkStart w:id="52" w:name="_Toc238149748"/>
-      <w:bookmarkStart w:id="53" w:name="_Toc238639511"/>
-      <w:r>
-        <w:t>4. Discussion</w:t>
+      <w:bookmarkStart w:id="52" w:name="_Toc238149749"/>
+      <w:bookmarkStart w:id="53" w:name="_Toc238639512"/>
+      <w:r>
+        <w:t>5. Conclusions, Limitations and Future Work</w:t>
       </w:r>
       <w:bookmarkEnd w:id="52"/>
       <w:bookmarkEnd w:id="53"/>
     </w:p>
     <w:p>
       <w:pPr>
+        <w:pStyle w:val="Heading2"/>
+      </w:pPr>
+      <w:bookmarkStart w:id="54" w:name="_Toc238149750"/>
+      <w:bookmarkStart w:id="55" w:name="_Toc238639513"/>
+      <w:r>
+        <w:t>5.1 Conclusions and Answers to the Research Questions</w:t>
+      </w:r>
+      <w:bookmarkEnd w:id="54"/>
+      <w:bookmarkEnd w:id="55"/>
+    </w:p>
+    <w:p>
+      <w:pPr>
         <w:spacing w:before="240" w:after="240" w:line="276" w:lineRule="auto"/>
         <w:jc w:val="both"/>
       </w:pPr>
       <w:r>
-        <w:t xml:space="preserve">The clearest periapsis and velocity trends are seen in the controlled experiments, while the matched comparisons show that the effects of spin and velocity vary with encounter conditions. The behaviour in Figure 3 is consistent with the other analyses: </w:t>
-      </w:r>
-      <w:r>
-        <w:t>although BMF generally decreases at larger periapsis</w:t>
-      </w:r>
-      <w:r>
-        <w:t>, Figures 1, 4, and 5 show that retention can still occur under particular combinations of spin, velocity, and mass. This indicates that similar periapsis values can produce different outcomes depending on the full encounter conditions. These relationships are learned from SPH outputs and support interpretation rather than proving physical causality.</w:t>
+        <w:t xml:space="preserve">This study sought to determine which inputs are most important for fragment creation and retained debris, how orbital and physical characteristics affect disruption and bound retention, and whether </w:t>
+      </w:r>
+      <w:r>
+        <w:t>ML</w:t>
+      </w:r>
+      <w:r>
+        <w:t xml:space="preserve"> can forecast outcomes while indicating when its predictions should be believed. Below is a summary of the responses.</w:t>
       </w:r>
     </w:p>
     <w:p>
@@ -5926,8 +6100,37 @@
         <w:jc w:val="both"/>
       </w:pPr>
       <w:r>
-        <w:lastRenderedPageBreak/>
-        <w:t>The primary physical outcome is that each parameter's impact is contingent upon the other encounter conditions. Within those parameters, periapsis determines the overall strength of the tidal encounter, encounter speed influences the duration of the contact and the favourable capture, and mass and spin alter the outcome. The most obvious periapsis and speed directions are found in the controlled experiments. The paired simulations demonstrate how periapsis and spin state affect the magnitude of the spin and velocity impacts.</w:t>
+        <w:t>Q</w:t>
+      </w:r>
+      <w:r>
+        <w:t>uestion 1:</w:t>
+      </w:r>
+      <w:r>
+        <w:t xml:space="preserve"> How do orbital and physical parameters </w:t>
+      </w:r>
+      <w:r>
+        <w:t>affect disruption and bound retention</w:t>
+      </w:r>
+      <w:r>
+        <w:t xml:space="preserve">? </w:t>
+      </w:r>
+      <w:r>
+        <w:t xml:space="preserve">Although the impact varies depending on the other inputs, closer and slower contacts typically retain more debris. In the representative controlled test, </w:t>
+      </w:r>
+      <w:r>
+        <w:t xml:space="preserve">predicted BMF generally decreases from </w:t>
+      </w:r>
+      <w:r>
+        <w:t>roughly 48% at 1.2 Mars radii to roughly 12% at 3.0 Mars radii</w:t>
+      </w:r>
+      <w:r>
+        <w:t xml:space="preserve">. A similarly clear decline occurs as encounter speed increases, from </w:t>
+      </w:r>
+      <w:r>
+        <w:t>roughly 45% at low velocity to near zero by about 1.2-1.4 km/s</w:t>
+      </w:r>
+      <w:r>
+        <w:t>. Rather than being universal thresholds, these reactions are condition specific. Mass and spin alter the outcome, speed alters the encounter and capture conditions, and periapsis regulates tidal power.</w:t>
       </w:r>
     </w:p>
     <w:p>
@@ -5936,7 +6139,52 @@
         <w:jc w:val="both"/>
       </w:pPr>
       <w:r>
-        <w:t>Though these associations are acquired from SPH outputs rather than from physical laws, the ML model replicates general trends and reveals interactions throughout the archive. As a result, matched comparisons, controlled tests, and group validation support interpretation but do not prove causality.</w:t>
+        <w:t>Q</w:t>
+      </w:r>
+      <w:r>
+        <w:t>uestion 2:</w:t>
+      </w:r>
+      <w:r>
+        <w:t xml:space="preserve"> </w:t>
+      </w:r>
+      <w:r>
+        <w:t>Which</w:t>
+      </w:r>
+      <w:r>
+        <w:t xml:space="preserve"> inputs matter most for retained debris? </w:t>
+      </w:r>
+      <w:r>
+        <w:t xml:space="preserve">There is no single universal ranking under all encounter conditions. </w:t>
+      </w:r>
+      <w:r>
+        <w:t xml:space="preserve">For BMF, the tuned Gradient Boosting input-removal analysis identifies </w:t>
+      </w:r>
+      <w:r>
+        <w:t>velocity</w:t>
+      </w:r>
+      <w:r>
+        <w:t xml:space="preserve"> as the strongest overall physical input, with its removal causing the largest decrease in performance (ΔR² = </w:t>
+      </w:r>
+      <w:r>
+        <w:t>-0.508</w:t>
+      </w:r>
+      <w:r>
+        <w:t xml:space="preserve">), followed by </w:t>
+      </w:r>
+      <w:r>
+        <w:t>periapsis (-0.466)</w:t>
+      </w:r>
+      <w:r>
+        <w:t xml:space="preserve"> </w:t>
+      </w:r>
+      <w:r>
+        <w:t xml:space="preserve">and </w:t>
+      </w:r>
+      <w:r>
+        <w:t>spin (-0.246)</w:t>
+      </w:r>
+      <w:r>
+        <w:t>. However, matched cases show that their relative importance changes locally.</w:t>
       </w:r>
     </w:p>
     <w:p>
@@ -5945,10 +6193,80 @@
         <w:jc w:val="both"/>
       </w:pPr>
       <w:r>
-        <w:t xml:space="preserve">As a result, ML's usefulness is restricted. It can swiftly filter well-supported input combinations, identify transition zones, uncover situations that yield promising retained mass, and indicate areas where more simulation could yield valuable information. Long-term debris survivability, precise fragment shapes and distributions from BMF alone, and forecasts for inadequately sampled input combinations cannot all be determined by it. </w:t>
-      </w:r>
-      <w:r>
-        <w:t>This is evident from the sparse periapsis-velocity example at 1.4 Mars radii: even though the input values fall within the training ranges, minimal local simulation coverage is associated with larger held-out errors.</w:t>
+        <w:lastRenderedPageBreak/>
+        <w:t>Q</w:t>
+      </w:r>
+      <w:r>
+        <w:t>uestion 3:</w:t>
+      </w:r>
+      <w:r>
+        <w:t xml:space="preserve"> </w:t>
+      </w:r>
+      <w:r>
+        <w:t>Can machine-learning models predict outcomes within the sampled data while showing when a prediction should or should not be trusted</w:t>
+      </w:r>
+      <w:r>
+        <w:t xml:space="preserve">? </w:t>
+      </w:r>
+      <w:r>
+        <w:t xml:space="preserve">Yes, in cases where the SPH archive supports comparable input combinations. The primary tuned Gradient Boosting model using the original </w:t>
+      </w:r>
+      <w:r>
+        <w:t>scenario</w:t>
+      </w:r>
+      <w:r>
+        <w:t xml:space="preserve"> inputs obtains a grouped cross-validated R² of </w:t>
+      </w:r>
+      <w:r>
+        <w:t>0.9328</w:t>
+      </w:r>
+      <w:r>
+        <w:t xml:space="preserve">, MAE of </w:t>
+      </w:r>
+      <w:r>
+        <w:t>0.0277</w:t>
+      </w:r>
+      <w:r>
+        <w:t xml:space="preserve">, and RMSE of </w:t>
+      </w:r>
+      <w:r>
+        <w:t>0.04</w:t>
+      </w:r>
+      <w:r>
+        <w:t xml:space="preserve">. </w:t>
+      </w:r>
+      <w:r>
+        <w:t>The tested physics-derived features do not improve the tuned</w:t>
+      </w:r>
+      <w:r>
+        <w:t xml:space="preserve"> Gradient Boosting</w:t>
+      </w:r>
+      <w:r>
+        <w:t xml:space="preserve"> model, so the simpler </w:t>
+      </w:r>
+      <w:r>
+        <w:t xml:space="preserve">Gradient Boosting </w:t>
+      </w:r>
+      <w:r>
+        <w:t>model using the original scenario inputs is retained.</w:t>
+      </w:r>
+      <w:r>
+        <w:t xml:space="preserve"> However, p</w:t>
+      </w:r>
+      <w:r>
+        <w:t>erformance is not equally dependable everywhere</w:t>
+      </w:r>
+      <w:r>
+        <w:t xml:space="preserve">. </w:t>
+      </w:r>
+      <w:r>
+        <w:t>Despite the input values falling within the numerical training ranges, held-out errors could reach about 7.2 percentage points at periapsis 1.4 Mars radii in a sparsely sampled region.</w:t>
+      </w:r>
+      <w:r>
+        <w:t xml:space="preserve"> </w:t>
+      </w:r>
+      <w:r>
+        <w:t>This demonstrates that being within the overall input range is insufficient for a reliable prediction; comparable SPH cases must also exist nearby in the sampled parameter space. Thus, ML can support rapid screening and simulation prioritisation, while sparse, edge, transition, or poorly supported cases still require additional SPH investigation.</w:t>
       </w:r>
     </w:p>
     <w:p>
@@ -5957,26 +6275,20 @@
         <w:jc w:val="both"/>
       </w:pPr>
       <w:r>
-        <w:t xml:space="preserve">Different questions are addressed by the matching and ablation analysis. Although matching cases demonstrate that </w:t>
-      </w:r>
-      <w:r>
-        <w:t>periapsis</w:t>
-      </w:r>
-      <w:r>
-        <w:t xml:space="preserve"> or </w:t>
-      </w:r>
-      <w:r>
-        <w:t>spin</w:t>
-      </w:r>
-      <w:r>
-        <w:t xml:space="preserve"> can become more significant under specific encounter settings, </w:t>
-      </w:r>
-      <w:r>
-        <w:t xml:space="preserve">velocity </w:t>
-      </w:r>
-      <w:r>
-        <w:t>is generally the strongest.</w:t>
-      </w:r>
+        <w:t>Overall, the project shows that tidal-disruption outcomes depend on interacting physical conditions rather than one universal ranking of parameters. Machine learning makes the existing SPH archive faster to explore, shows where predictions are well supported, and highlights where new simulations would be most useful. It complements SPH rather than replacing the simulation physics.</w:t>
+      </w:r>
+    </w:p>
+    <w:p>
+      <w:pPr>
+        <w:pStyle w:val="Heading2"/>
+      </w:pPr>
+      <w:bookmarkStart w:id="56" w:name="_Toc238149751"/>
+      <w:bookmarkStart w:id="57" w:name="_Toc238639514"/>
+      <w:r>
+        <w:t>5.2 Limitations</w:t>
+      </w:r>
+      <w:bookmarkEnd w:id="56"/>
+      <w:bookmarkEnd w:id="57"/>
     </w:p>
     <w:p>
       <w:pPr>
@@ -5984,7 +6296,7 @@
         <w:jc w:val="both"/>
       </w:pPr>
       <w:r>
-        <w:t>Compared to BMF, fragmentation requires more prudence. Strong fragmentation is possible but not guaranteed by close periapsis, and the number of pieces is directly altered by the FoF connecting length. Therefore, rather than taking the place of BMF, fragment count and largest-remnant metrics offer additional information. Strong breakup does not always result in much bound debris, therefore the procedure separates breakup severity from Mars-bound retention.</w:t>
+        <w:t>The simulation archive's short size and uneven sampling are its primary drawbacks. A single SPH simulation can be analysed in multiple ways, hence many rows are not independent physical evidence. Although it is unable to produce missing simulations, group validation keeps the test score from becoming unduly optimistic. Even when each individual input value falls between its reported minimum and maximum, predictions are still unclear for combinations that are poorly sampled, close to the data's edges, or outside the combinations observed during training.</w:t>
       </w:r>
     </w:p>
     <w:p>
@@ -5993,32 +6305,20 @@
         <w:jc w:val="both"/>
       </w:pPr>
       <w:r>
-        <w:t>All things considered, the ML model is a quick screening method for the current SPH archive. Poorly sampled cases, transition regions, and issues requiring certain fragment attributes still require SPH.</w:t>
-      </w:r>
-    </w:p>
-    <w:p>
-      <w:pPr>
-        <w:pStyle w:val="Heading1"/>
-      </w:pPr>
-      <w:bookmarkStart w:id="54" w:name="_Toc238149749"/>
-      <w:bookmarkStart w:id="55" w:name="_Toc238639512"/>
-      <w:r>
-        <w:t>5. Conclusions, Limitations and Future Work</w:t>
-      </w:r>
-      <w:bookmarkEnd w:id="54"/>
-      <w:bookmarkEnd w:id="55"/>
+        <w:t xml:space="preserve">Additionally, instead of solving the physical laws directly, the ML model learns patterns from SPH results. It does not follow the subsequent orbits of fragments and does not impose conservation of mass, momentum, energy, or angular momentum. Therefore, a reliable BMF prediction cannot determine whether debris accumulates into moons, forms a disk, or endures for a long time. Additionally, fragment measurements are more sensitive to the FoF connecting length employed in post-processing and are noisier than BMF. </w:t>
+      </w:r>
     </w:p>
     <w:p>
       <w:pPr>
         <w:pStyle w:val="Heading2"/>
       </w:pPr>
-      <w:bookmarkStart w:id="56" w:name="_Toc238149750"/>
-      <w:bookmarkStart w:id="57" w:name="_Toc238639513"/>
-      <w:r>
-        <w:t>5.1 Conclusions and Answers to the Research Questions</w:t>
-      </w:r>
-      <w:bookmarkEnd w:id="56"/>
-      <w:bookmarkEnd w:id="57"/>
+      <w:bookmarkStart w:id="58" w:name="_Toc238149752"/>
+      <w:bookmarkStart w:id="59" w:name="_Toc238639515"/>
+      <w:r>
+        <w:t>5.3 Future Work</w:t>
+      </w:r>
+      <w:bookmarkEnd w:id="58"/>
+      <w:bookmarkEnd w:id="59"/>
     </w:p>
     <w:p>
       <w:pPr>
@@ -6026,13 +6326,26 @@
         <w:jc w:val="both"/>
       </w:pPr>
       <w:r>
-        <w:t xml:space="preserve">This study sought to determine which inputs are most important for fragment creation and retained debris, how orbital and physical characteristics affect disruption and bound retention, and whether </w:t>
-      </w:r>
-      <w:r>
-        <w:t>ML</w:t>
-      </w:r>
-      <w:r>
-        <w:t xml:space="preserve"> can forecast outcomes while indicating when its predictions should be believed. Below is a summary of the responses.</w:t>
+        <w:t xml:space="preserve">The highest priority for future work is to run new SPH simulations in poorly covered mass-periapsis-velocity-spin combinations, especially near the change between retained and zero BMF. More matched groups should </w:t>
+      </w:r>
+      <w:r>
+        <w:t xml:space="preserve">repeat </w:t>
+      </w:r>
+      <w:r>
+        <w:t xml:space="preserve">comparison at other masses and resolutions while keeping processing choices fixed. </w:t>
+      </w:r>
+      <w:r>
+        <w:t xml:space="preserve">It would be possible to determine whether the stronger spin disparities </w:t>
+      </w:r>
+      <w:r>
+        <w:lastRenderedPageBreak/>
+        <w:t>also occur in other groups by reporting the BMF range together with the actual BMF values and the number of independent simulations</w:t>
+      </w:r>
+      <w:r>
+        <w:t>.</w:t>
+      </w:r>
+      <w:r>
+        <w:t xml:space="preserve"> </w:t>
       </w:r>
     </w:p>
     <w:p>
@@ -6041,38 +6354,7 @@
         <w:jc w:val="both"/>
       </w:pPr>
       <w:r>
-        <w:lastRenderedPageBreak/>
-        <w:t>Q</w:t>
-      </w:r>
-      <w:r>
-        <w:t>uestion 1:</w:t>
-      </w:r>
-      <w:r>
-        <w:t xml:space="preserve"> How do orbital and physical parameters </w:t>
-      </w:r>
-      <w:r>
-        <w:t>affect disruption and bound retention</w:t>
-      </w:r>
-      <w:r>
-        <w:t xml:space="preserve">? </w:t>
-      </w:r>
-      <w:r>
-        <w:t xml:space="preserve">Although the impact varies depending on the other inputs, closer and slower contacts typically retain more debris. In the representative controlled test, </w:t>
-      </w:r>
-      <w:r>
-        <w:t xml:space="preserve">predicted BMF generally decreases from </w:t>
-      </w:r>
-      <w:r>
-        <w:t>roughly 48% at 1.2 Mars radii to roughly 12% at 3.0 Mars radii</w:t>
-      </w:r>
-      <w:r>
-        <w:t xml:space="preserve">. A similarly clear decline occurs as encounter speed increases, from </w:t>
-      </w:r>
-      <w:r>
-        <w:t>roughly 45% at low velocity to near zero by about 1.2-1.4 km/s</w:t>
-      </w:r>
-      <w:r>
-        <w:t>. Rather than being universal thresholds, these reactions are condition specific. Mass and spin alter the outcome, speed alters the encounter and capture conditions, and periapsis regulates tidal power.</w:t>
+        <w:t>It would be more robust to test the model on whole new SPH runs created after training rather than repeatedly dividing the current library. A practical future workflow would then add validated new SPH outcomes to the training dataset and periodically retrain the surrogate model, allowing newly simulated regions to improve subsequent predictions. Training the tuned Gradient Boosting model takes approximately 7 seconds on the macOS arm64 machine used in this study for the current 407-row training dataset, so repeated retraining would be computationally inexpensive.</w:t>
       </w:r>
     </w:p>
     <w:p>
@@ -6081,272 +6363,166 @@
         <w:jc w:val="both"/>
       </w:pPr>
       <w:r>
-        <w:t>Q</w:t>
-      </w:r>
-      <w:r>
-        <w:t>uestion 2:</w:t>
-      </w:r>
-      <w:r>
-        <w:t xml:space="preserve"> </w:t>
-      </w:r>
-      <w:r>
-        <w:t>Which</w:t>
-      </w:r>
-      <w:r>
-        <w:t xml:space="preserve"> inputs matter most for retained debris? </w:t>
-      </w:r>
-      <w:r>
-        <w:t xml:space="preserve">There is no single universal ranking under all encounter conditions. </w:t>
-      </w:r>
-      <w:r>
-        <w:t xml:space="preserve">For BMF, the tuned Gradient Boosting input-removal analysis identifies </w:t>
-      </w:r>
-      <w:r>
-        <w:t>velocity</w:t>
-      </w:r>
-      <w:r>
-        <w:t xml:space="preserve"> as the strongest overall physical input, with its removal causing the largest decrease in performance (ΔR² = </w:t>
-      </w:r>
-      <w:r>
-        <w:t>-0.508</w:t>
-      </w:r>
-      <w:r>
-        <w:t xml:space="preserve">), followed by </w:t>
-      </w:r>
-      <w:r>
-        <w:t>periapsis (-0.466)</w:t>
-      </w:r>
-      <w:r>
-        <w:t xml:space="preserve"> </w:t>
-      </w:r>
-      <w:r>
-        <w:t xml:space="preserve">and </w:t>
-      </w:r>
-      <w:r>
-        <w:t>spin (-0.246)</w:t>
-      </w:r>
-      <w:r>
-        <w:t>. However, matched cases show that their relative importance changes locally.</w:t>
-      </w:r>
+        <w:t xml:space="preserve">Future research should enhance automatic identification of input combinations with inadequate support and per-prediction reliability estimates. Before updating the current model, new SPH simulations should be used to test exploratory </w:t>
+      </w:r>
+      <w:r>
+        <w:t>models</w:t>
+      </w:r>
+      <w:r>
+        <w:t>. Stronger physical limitations, multi-output prediction, and uncertainty estimates are possible additional enhancements.</w:t>
+      </w:r>
+      <w:bookmarkStart w:id="60" w:name="_Toc238149753"/>
+      <w:bookmarkStart w:id="61" w:name="_Toc238639516"/>
     </w:p>
     <w:p>
       <w:pPr>
         <w:spacing w:before="240" w:after="240" w:line="276" w:lineRule="auto"/>
         <w:jc w:val="both"/>
       </w:pPr>
-      <w:r>
-        <w:t>Q</w:t>
-      </w:r>
-      <w:r>
-        <w:t>uestion 3:</w:t>
-      </w:r>
-      <w:r>
-        <w:t xml:space="preserve"> </w:t>
-      </w:r>
-      <w:r>
-        <w:t>Can machine-learning models predict outcomes within the sampled data while showing when a prediction should or should not be trusted</w:t>
-      </w:r>
-      <w:r>
-        <w:t xml:space="preserve">? </w:t>
-      </w:r>
-      <w:r>
-        <w:t xml:space="preserve">Yes, in cases where the SPH archive supports comparable input combinations. The primary tuned Gradient Boosting model using the original </w:t>
-      </w:r>
-      <w:r>
-        <w:t>scenario</w:t>
-      </w:r>
-      <w:r>
-        <w:t xml:space="preserve"> inputs obtains a grouped cross-validated R² of </w:t>
-      </w:r>
-      <w:r>
-        <w:t>0.9328</w:t>
-      </w:r>
-      <w:r>
-        <w:t xml:space="preserve">, MAE of </w:t>
-      </w:r>
-      <w:r>
-        <w:t>0.0277</w:t>
-      </w:r>
-      <w:r>
-        <w:t xml:space="preserve">, and RMSE of </w:t>
-      </w:r>
-      <w:r>
-        <w:t>0.04</w:t>
-      </w:r>
-      <w:r>
-        <w:t xml:space="preserve">. </w:t>
-      </w:r>
-      <w:r>
-        <w:t>The tested physics-derived features do not improve the tuned model, so the simpler model using the original scenario inputs is retained.</w:t>
-      </w:r>
-      <w:r>
-        <w:t xml:space="preserve"> However, p</w:t>
-      </w:r>
-      <w:r>
-        <w:t>erformance is not equally dependable everywhere</w:t>
-      </w:r>
-      <w:r>
-        <w:t xml:space="preserve">. </w:t>
-      </w:r>
-      <w:r>
-        <w:t>Despite the input values falling within the numerical training ranges, held-out errors could reach about 7.2 percentage points at periapsis 1.4 Mars radii in a sparsely sampled region.</w:t>
-      </w:r>
-      <w:r>
-        <w:t xml:space="preserve"> </w:t>
-      </w:r>
-      <w:r>
-        <w:t>This demonstrates that being within the overall input range is insufficient for a reliable prediction; comparable SPH cases must also exist nearby in the sampled parameter space. Thus, ML can support rapid screening and simulation prioritisation, while sparse, edge, transition, or poorly supported cases still require additional SPH investigation.</w:t>
-      </w:r>
-    </w:p>
-    <w:p>
-      <w:pPr>
-        <w:spacing w:before="240" w:after="240" w:line="276" w:lineRule="auto"/>
-        <w:jc w:val="both"/>
-      </w:pPr>
-      <w:r>
-        <w:t>Overall, the project shows that tidal-disruption outcomes depend on interacting physical conditions rather than one universal ranking of parameters. Machine learning makes the existing SPH archive faster to explore, shows where predictions are well supported, and highlights where new simulations would be most useful. It complements SPH rather than replacing the simulation physics.</w:t>
-      </w:r>
-    </w:p>
-    <w:p>
-      <w:pPr>
-        <w:pStyle w:val="Heading2"/>
-      </w:pPr>
-      <w:bookmarkStart w:id="58" w:name="_Toc238149751"/>
-      <w:bookmarkStart w:id="59" w:name="_Toc238639514"/>
-      <w:r>
-        <w:t>5.2 Limitations</w:t>
-      </w:r>
-      <w:bookmarkEnd w:id="58"/>
-      <w:bookmarkEnd w:id="59"/>
-    </w:p>
-    <w:p>
-      <w:pPr>
-        <w:spacing w:before="240" w:after="240" w:line="276" w:lineRule="auto"/>
-        <w:jc w:val="both"/>
-      </w:pPr>
-      <w:r>
-        <w:t>The simulation archive's short size and uneven sampling are its primary drawbacks. A single SPH simulation can be analysed in multiple ways, hence many rows are not independent physical evidence. Although it is unable to produce missing simulations, group validation keeps the test score from becoming unduly optimistic. Even when each individual input value falls between its reported minimum and maximum, predictions are still unclear for combinations that are poorly sampled, close to the data's edges, or outside the combinations observed during training.</w:t>
-      </w:r>
-    </w:p>
-    <w:p>
-      <w:pPr>
-        <w:spacing w:before="240" w:after="240" w:line="276" w:lineRule="auto"/>
-        <w:jc w:val="both"/>
-      </w:pPr>
-      <w:r>
-        <w:lastRenderedPageBreak/>
-        <w:t xml:space="preserve">Additionally, instead of solving the physical laws directly, the ML model learns patterns from SPH results. It does not follow the subsequent orbits of fragments and does not impose conservation of mass, momentum, energy, or angular momentum. Therefore, a reliable BMF prediction cannot determine whether debris accumulates into moons, forms a disk, or endures for a long time. Additionally, fragment measurements are more sensitive to the FoF connecting length employed in post-processing and are noisier than BMF. </w:t>
-      </w:r>
-    </w:p>
-    <w:p>
-      <w:pPr>
-        <w:pStyle w:val="Heading2"/>
-      </w:pPr>
-      <w:bookmarkStart w:id="60" w:name="_Toc238149752"/>
-      <w:bookmarkStart w:id="61" w:name="_Toc238639515"/>
-      <w:r>
-        <w:t>5.3 Future Work</w:t>
+    </w:p>
+    <w:p>
+      <w:pPr>
+        <w:pStyle w:val="Heading1"/>
+      </w:pPr>
+      <w:r>
+        <w:t>References</w:t>
       </w:r>
       <w:bookmarkEnd w:id="60"/>
       <w:bookmarkEnd w:id="61"/>
     </w:p>
     <w:p>
       <w:pPr>
-        <w:spacing w:before="240" w:after="240" w:line="276" w:lineRule="auto"/>
+        <w:spacing w:before="240" w:after="160" w:line="276" w:lineRule="auto"/>
+        <w:ind w:left="450" w:hanging="450"/>
         <w:jc w:val="both"/>
-      </w:pPr>
-      <w:r>
-        <w:t xml:space="preserve">The highest priority for future work is to run new SPH simulations in poorly covered mass-periapsis-velocity-spin combinations, especially near the change between retained and zero BMF. More matched groups should </w:t>
-      </w:r>
-      <w:r>
-        <w:t xml:space="preserve">repeat </w:t>
-      </w:r>
-      <w:r>
-        <w:t xml:space="preserve">comparison at other masses and resolutions while keeping processing choices fixed. </w:t>
-      </w:r>
-      <w:r>
-        <w:t>It would be possible to determine whether the stronger spin disparities also occur in other groups by reporting the BMF range together with the actual BMF values and the number of independent simulations. It would be more robust to test the model on whole new SPH runs created after training rather than repeatedly dividing the current library.</w:t>
-      </w:r>
-      <w:r>
-        <w:t xml:space="preserve"> </w:t>
-      </w:r>
-    </w:p>
-    <w:p>
-      <w:pPr>
-        <w:spacing w:before="240" w:after="240" w:line="276" w:lineRule="auto"/>
+        <w:rPr>
+          <w:color w:val="000000" w:themeColor="text1"/>
+        </w:rPr>
+      </w:pPr>
+      <w:r>
+        <w:rPr>
+          <w:color w:val="000000" w:themeColor="text1"/>
+        </w:rPr>
+        <w:t>Bagheri, A., Khan, A., Efroimsky, M., Kruglyakov, M. &amp; Giardini, D. (2021). Dynamical evidence for Phobos and Deimos as remnants of a disrupted common progenitor. Nature Astronomy, 5, 539-543. doi:10.1038/s41550-021-01306-2.</w:t>
+      </w:r>
+    </w:p>
+    <w:p>
+      <w:pPr>
+        <w:spacing w:before="240" w:after="160" w:line="276" w:lineRule="auto"/>
+        <w:ind w:left="450" w:hanging="450"/>
         <w:jc w:val="both"/>
-      </w:pPr>
-      <w:r>
-        <w:t>It would be more robust to test the model on whole new SPH runs created after training rather than repeatedly dividing the current library. A practical future workflow would then add validated new SPH outcomes to the training dataset and periodically retrain the surrogate model, allowing newly simulated regions to improve subsequent predictions. Training the tuned Gradient Boosting model takes approximately 7 seconds on the macOS arm64 machine used in this study for the current 407-row training dataset, so repeated retraining would be computationally inexpensive.</w:t>
-      </w:r>
-    </w:p>
-    <w:p>
-      <w:pPr>
-        <w:spacing w:before="240" w:after="240" w:line="276" w:lineRule="auto"/>
+        <w:rPr>
+          <w:color w:val="000000" w:themeColor="text1"/>
+        </w:rPr>
+      </w:pPr>
+      <w:r>
+        <w:rPr>
+          <w:color w:val="000000" w:themeColor="text1"/>
+        </w:rPr>
+        <w:t>Breiman, L. (2001). Random forests. Machine Learning, 45, 5-32. doi:10.1023/A:1010933404324.</w:t>
+      </w:r>
+    </w:p>
+    <w:p>
+      <w:pPr>
+        <w:spacing w:before="240" w:after="160" w:line="276" w:lineRule="auto"/>
+        <w:ind w:left="450" w:hanging="450"/>
         <w:jc w:val="both"/>
-      </w:pPr>
-      <w:r>
-        <w:t xml:space="preserve">Future research should enhance automatic identification of input combinations with inadequate support and per-prediction reliability estimates. Before updating the current model, new SPH simulations should be used to test exploratory </w:t>
-      </w:r>
-      <w:r>
-        <w:t>models</w:t>
-      </w:r>
-      <w:r>
-        <w:t>. Stronger physical limitations, multi-output prediction, and uncertainty estimates are possible additional enhancements.</w:t>
-      </w:r>
-      <w:bookmarkStart w:id="62" w:name="_Toc238149753"/>
-    </w:p>
-    <w:p>
-      <w:pPr>
-        <w:pStyle w:val="Heading1"/>
-      </w:pPr>
-      <w:bookmarkStart w:id="63" w:name="_Toc238639516"/>
-    </w:p>
-    <w:p>
-      <w:pPr>
-        <w:pStyle w:val="Heading1"/>
-      </w:pPr>
-    </w:p>
-    <w:p>
-      <w:pPr>
-        <w:pStyle w:val="Heading1"/>
-      </w:pPr>
-    </w:p>
-    <w:p>
-      <w:pPr>
-        <w:pStyle w:val="Heading1"/>
-      </w:pPr>
-    </w:p>
-    <w:p>
-      <w:pPr>
-        <w:pStyle w:val="Heading1"/>
-      </w:pPr>
-    </w:p>
-    <w:p>
-      <w:pPr>
-        <w:pStyle w:val="Heading1"/>
-      </w:pPr>
-    </w:p>
-    <w:p>
-      <w:pPr>
-        <w:pStyle w:val="Heading1"/>
-      </w:pPr>
-    </w:p>
-    <w:p>
-      <w:pPr>
-        <w:pStyle w:val="Heading1"/>
-      </w:pPr>
-      <w:r>
+        <w:rPr>
+          <w:color w:val="000000" w:themeColor="text1"/>
+        </w:rPr>
+      </w:pPr>
+      <w:r>
+        <w:rPr>
+          <w:color w:val="000000" w:themeColor="text1"/>
+        </w:rPr>
+        <w:t>Cambioni, S., Asphaug, E., Emsenhuber, A., Gabriel, T. S. J., Furfaro, R. &amp; Schwartz, S. R. (2019). Realistic on-the-fly outcomes of planetary collisions: Machine learning applied to simulations of giant impacts. The Astrophysical Journal, 875(1), 40. doi:10.3847/1538-4357/ab0e8a.</w:t>
+      </w:r>
+    </w:p>
+    <w:p>
+      <w:pPr>
+        <w:spacing w:before="240" w:after="160" w:line="276" w:lineRule="auto"/>
+        <w:ind w:left="450" w:hanging="450"/>
+        <w:jc w:val="both"/>
+        <w:rPr>
+          <w:color w:val="000000" w:themeColor="text1"/>
+        </w:rPr>
+      </w:pPr>
+      <w:r>
+        <w:rPr>
+          <w:color w:val="000000" w:themeColor="text1"/>
+        </w:rPr>
+        <w:t>Canup, R. M. &amp; Salmon, J. (2018). Origin of Phobos and Deimos by the impact of a Vesta-to-Ceres sized body with Mars. Science Advances, 4(4), eaar6887. doi:10.1126/sciadv.aar6887.</w:t>
+      </w:r>
+    </w:p>
+    <w:p>
+      <w:pPr>
+        <w:spacing w:before="240" w:after="160" w:line="276" w:lineRule="auto"/>
+        <w:ind w:left="450" w:hanging="450"/>
+        <w:jc w:val="both"/>
+        <w:rPr>
+          <w:color w:val="000000" w:themeColor="text1"/>
+        </w:rPr>
+      </w:pPr>
+      <w:r>
+        <w:rPr>
+          <w:color w:val="000000" w:themeColor="text1"/>
+        </w:rPr>
+        <w:t>Citron, R. I., Genda, H. &amp; Ida, S. (2015). Formation of Phobos and Deimos via a giant impact. Icarus, 252, 334-338. doi:10.1016/j.icarus.2015.02.011.</w:t>
+      </w:r>
+    </w:p>
+    <w:p>
+      <w:pPr>
+        <w:spacing w:before="240" w:after="160" w:line="276" w:lineRule="auto"/>
+        <w:ind w:left="450" w:hanging="450"/>
+        <w:jc w:val="both"/>
+        <w:rPr>
+          <w:color w:val="000000" w:themeColor="text1"/>
+        </w:rPr>
+      </w:pPr>
+      <w:r>
+        <w:rPr>
+          <w:color w:val="000000" w:themeColor="text1"/>
+        </w:rPr>
+        <w:t>Friedman, J. H. (2001). Greedy function approximation: A gradient boosting machine. Annals of Statistics, 29(5), 1189-1232. doi:10.1214/aos/1013203451.</w:t>
+      </w:r>
+    </w:p>
+    <w:p>
+      <w:pPr>
+        <w:spacing w:before="240" w:after="160" w:line="276" w:lineRule="auto"/>
+        <w:ind w:left="450" w:hanging="450"/>
+        <w:jc w:val="both"/>
+        <w:rPr>
+          <w:color w:val="000000" w:themeColor="text1"/>
+        </w:rPr>
+      </w:pPr>
+      <w:r>
+        <w:rPr>
+          <w:color w:val="000000" w:themeColor="text1"/>
+        </w:rPr>
+        <w:t>Grinsztajn, L., Oyallon, E. &amp; Varoquaux, G. (2022). Why do tree-based models still outperform deep learning on tabular data? Advances in Neural Information Processing Systems, 35.</w:t>
+      </w:r>
+    </w:p>
+    <w:p>
+      <w:pPr>
+        <w:spacing w:before="240" w:after="160" w:line="276" w:lineRule="auto"/>
+        <w:ind w:left="450" w:hanging="450"/>
+        <w:jc w:val="both"/>
+        <w:rPr>
+          <w:color w:val="000000" w:themeColor="text1"/>
+        </w:rPr>
+      </w:pPr>
+      <w:r>
+        <w:rPr>
+          <w:color w:val="000000" w:themeColor="text1"/>
+        </w:rPr>
         <w:lastRenderedPageBreak/>
-        <w:t>References</w:t>
-      </w:r>
-      <w:bookmarkEnd w:id="62"/>
-      <w:bookmarkEnd w:id="63"/>
-    </w:p>
-    <w:p>
-      <w:pPr>
-        <w:spacing w:before="360" w:after="80"/>
-        <w:ind w:left="340" w:hanging="340"/>
+        <w:t>Kegerreis, J. A., Lissauer, J. J., Eke, V. R., Sandnes, T. D. &amp; Elphic, R. C. (2024). Origin of Mars’s moons by disruptive partial capture of an asteroid. Icarus, Article 116337. doi:10.1016/j.icarus.2024.116337.</w:t>
+      </w:r>
+    </w:p>
+    <w:p>
+      <w:pPr>
+        <w:spacing w:before="240" w:after="160" w:line="276" w:lineRule="auto"/>
+        <w:ind w:left="450" w:hanging="450"/>
         <w:jc w:val="both"/>
         <w:rPr>
           <w:color w:val="000000" w:themeColor="text1"/>
@@ -6356,13 +6532,13 @@
         <w:rPr>
           <w:color w:val="000000" w:themeColor="text1"/>
         </w:rPr>
-        <w:t>Bagheri, A., Khan, A., Efroimsky, M., Kruglyakov, M. &amp; Giardini, D. (2021). Dynamical evidence for Phobos and Deimos as remnants of a disrupted common progenitor. Nature Astronomy, 5, 539-543. doi:10.1038/s41550-021-01306-2.</w:t>
-      </w:r>
-    </w:p>
-    <w:p>
-      <w:pPr>
-        <w:spacing w:before="360" w:after="80"/>
-        <w:ind w:left="340" w:hanging="340"/>
+        <w:t>Knauer, R. &amp; Rodner, E. (2024). Squeezing Lemons with Hammers: An Evaluation of AutoML and Tabular Deep Learning for Data-Scarce Classification Applications. ICLR 2024 Workshop on Practical ML for Low Resource Settings.</w:t>
+      </w:r>
+    </w:p>
+    <w:p>
+      <w:pPr>
+        <w:spacing w:before="240" w:after="160" w:line="276" w:lineRule="auto"/>
+        <w:ind w:left="450" w:hanging="450"/>
         <w:jc w:val="both"/>
         <w:rPr>
           <w:color w:val="000000" w:themeColor="text1"/>
@@ -6372,13 +6548,13 @@
         <w:rPr>
           <w:color w:val="000000" w:themeColor="text1"/>
         </w:rPr>
-        <w:t>Breiman, L. (2001). Random forests. Machine Learning, 45, 5-32. doi:10.1023/A:1010933404324.</w:t>
-      </w:r>
-    </w:p>
-    <w:p>
-      <w:pPr>
-        <w:spacing w:before="360" w:after="80"/>
-        <w:ind w:left="340" w:hanging="340"/>
+        <w:t>More, S., Kravtsov, A. V., Dalal, N. &amp; Gottlöber, S. (2011). The overdensity and masses of the friends-of-friends halos and universality of the halo mass function. The Astrophysical Journal Supplement Series, 195(1), 4. doi:10.1088/0067-0049/195/1/4.</w:t>
+      </w:r>
+    </w:p>
+    <w:p>
+      <w:pPr>
+        <w:spacing w:before="240" w:after="160" w:line="276" w:lineRule="auto"/>
+        <w:ind w:left="450" w:hanging="450"/>
         <w:jc w:val="both"/>
         <w:rPr>
           <w:color w:val="000000" w:themeColor="text1"/>
@@ -6388,13 +6564,13 @@
         <w:rPr>
           <w:color w:val="000000" w:themeColor="text1"/>
         </w:rPr>
-        <w:t>Brunton, S. L., Noack, B. R. &amp; Koumoutsakos, P. (2020). Machine learning for fluid mechanics. Annual Review of Fluid Mechanics, 52, 477-508. doi:10.1146/annurev-fluid-010719-060214.</w:t>
-      </w:r>
-    </w:p>
-    <w:p>
-      <w:pPr>
-        <w:spacing w:before="360" w:after="80"/>
-        <w:ind w:left="340" w:hanging="340"/>
+        <w:t>Price, D. J. (2012). Smoothed particle hydrodynamics and magnetohydrodynamics. Journal of Computational Physics, 231(3), 759-794. doi:10.1016/j.jcp.2010.12.011.</w:t>
+      </w:r>
+    </w:p>
+    <w:p>
+      <w:pPr>
+        <w:spacing w:before="240" w:after="160" w:line="276" w:lineRule="auto"/>
+        <w:ind w:left="450" w:hanging="450"/>
         <w:jc w:val="both"/>
         <w:rPr>
           <w:color w:val="000000" w:themeColor="text1"/>
@@ -6404,13 +6580,13 @@
         <w:rPr>
           <w:color w:val="000000" w:themeColor="text1"/>
         </w:rPr>
-        <w:t>Canup, R. M. &amp; Salmon, J. (2018). Origin of Phobos and Deimos by the impact of a Vesta-to-Ceres sized body with Mars. Science Advances, 4(4), eaar6887. doi:10.1126/sciadv.aar6887.</w:t>
-      </w:r>
-    </w:p>
-    <w:p>
-      <w:pPr>
-        <w:spacing w:before="360" w:after="80"/>
-        <w:ind w:left="340" w:hanging="340"/>
+        <w:t>Richardson, D. C., Bottke, W. F. Jr. &amp; Love, S. G. (1998). Tidal distortion and disruption of Earth-crossing asteroids. Icarus, 134, 47-76.</w:t>
+      </w:r>
+    </w:p>
+    <w:p>
+      <w:pPr>
+        <w:spacing w:before="240" w:after="160" w:line="276" w:lineRule="auto"/>
+        <w:ind w:left="450" w:hanging="450"/>
         <w:jc w:val="both"/>
         <w:rPr>
           <w:color w:val="000000" w:themeColor="text1"/>
@@ -6420,13 +6596,13 @@
         <w:rPr>
           <w:color w:val="000000" w:themeColor="text1"/>
         </w:rPr>
-        <w:t>Chen, T. &amp; Guestrin, C. (2016). XGBoost: A scalable tree boosting system. Proceedings of the 22nd ACM SIGKDD International Conference on Knowledge Discovery and Data Mining, 785-794.</w:t>
-      </w:r>
-    </w:p>
-    <w:p>
-      <w:pPr>
-        <w:spacing w:before="360" w:after="80"/>
-        <w:ind w:left="340" w:hanging="340"/>
+        <w:t>Rosenblatt, P., Charnoz, S., Dunseath, K. M., Terao-Dunseath, M. &amp; Trinh, A. (2016). Accretion of Phobos and Deimos in an extended debris disc stirred by transient moons. Nature Geoscience, 9, 581-583. doi:10.1038/ngeo2742.</w:t>
+      </w:r>
+    </w:p>
+    <w:p>
+      <w:pPr>
+        <w:spacing w:before="240" w:after="160" w:line="276" w:lineRule="auto"/>
+        <w:ind w:left="450" w:hanging="450"/>
         <w:jc w:val="both"/>
         <w:rPr>
           <w:color w:val="000000" w:themeColor="text1"/>
@@ -6436,13 +6612,13 @@
         <w:rPr>
           <w:color w:val="000000" w:themeColor="text1"/>
         </w:rPr>
-        <w:t>Citron, R. I., Genda, H. &amp; Ida, S. (2015). Formation of Phobos and Deimos via a giant impact. Icarus, 252, 334-338. doi:10.1016/j.icarus.2015.02.011.</w:t>
-      </w:r>
-    </w:p>
-    <w:p>
-      <w:pPr>
-        <w:spacing w:before="360" w:after="80"/>
-        <w:ind w:left="340" w:hanging="340"/>
+        <w:t>Timpe, M. L., Han Veiga, M., Knabenhans, M., Stadel, J. &amp; Marelli, S. (2020). Machine learning applied to simulations of collisions between rotating, differentiated planets. Computational Astrophysics and Cosmology, 7, 2. doi:10.1186/s40668-020-00034-6.</w:t>
+      </w:r>
+    </w:p>
+    <w:p>
+      <w:pPr>
+        <w:spacing w:before="240" w:after="160" w:line="276" w:lineRule="auto"/>
+        <w:ind w:left="450" w:hanging="450"/>
         <w:jc w:val="both"/>
         <w:rPr>
           <w:color w:val="000000" w:themeColor="text1"/>
@@ -6452,189 +6628,14 @@
         <w:rPr>
           <w:color w:val="000000" w:themeColor="text1"/>
         </w:rPr>
-        <w:t>Duan, T., Anand, A., Ding, D. Y., Thai, K. K., Basu, S., Ng, A. &amp; Schuler, A. (2020). NGBoost: Natural Gradient Boosting for Probabilistic Prediction. Proceedings of the 37th International Conference on Machine Learning, PMLR 119, 2690-2700.</w:t>
-      </w:r>
-    </w:p>
-    <w:p>
-      <w:pPr>
-        <w:spacing w:before="360" w:after="80"/>
-        <w:ind w:left="340" w:hanging="340"/>
+        <w:t>Valencia, D., Paracha, E. &amp; Jackson, A. P. (2019). Can a machine learn the outcome of planetary collisions? The Astrophysical Journal, 882(1), 35. doi:10.3847/1538-4357/ab2bfb.</w:t>
+      </w:r>
+    </w:p>
+    <w:p>
+      <w:pPr>
+        <w:spacing w:before="240" w:after="160" w:line="276" w:lineRule="auto"/>
+        <w:ind w:left="450" w:hanging="450"/>
         <w:jc w:val="both"/>
-        <w:rPr>
-          <w:color w:val="000000" w:themeColor="text1"/>
-        </w:rPr>
-      </w:pPr>
-      <w:r>
-        <w:rPr>
-          <w:color w:val="000000" w:themeColor="text1"/>
-        </w:rPr>
-        <w:t>Friedman, J. H. (2001). Greedy function approximation: A gradient boosting machine. Annals of Statistics, 29(5), 1189-1232. doi:10.1214/aos/1013203451.</w:t>
-      </w:r>
-    </w:p>
-    <w:p>
-      <w:pPr>
-        <w:spacing w:before="360" w:after="80"/>
-        <w:ind w:left="340" w:hanging="340"/>
-        <w:jc w:val="both"/>
-        <w:rPr>
-          <w:color w:val="000000" w:themeColor="text1"/>
-        </w:rPr>
-      </w:pPr>
-      <w:r>
-        <w:rPr>
-          <w:color w:val="000000" w:themeColor="text1"/>
-        </w:rPr>
-        <w:t>Grinsztajn, L., Oyallon, E. &amp; Varoquaux, G. (2022). Why do tree-based models still outperform deep learning on tabular data? Advances in Neural Information Processing Systems, 35.</w:t>
-      </w:r>
-    </w:p>
-    <w:p>
-      <w:pPr>
-        <w:spacing w:before="360" w:after="80"/>
-        <w:ind w:left="340" w:hanging="340"/>
-        <w:jc w:val="both"/>
-        <w:rPr>
-          <w:color w:val="000000" w:themeColor="text1"/>
-        </w:rPr>
-      </w:pPr>
-      <w:r>
-        <w:rPr>
-          <w:color w:val="000000" w:themeColor="text1"/>
-        </w:rPr>
-        <w:t>Kegerreis, J. A., Lissauer, J. J., Eke, V. R., Sandnes, T. D. &amp; Elphic, R. C. (2024). Origin of Mars’s moons by disruptive partial capture of an asteroid. Icarus, Article 116337. doi:10.1016/j.icarus.2024.116337.</w:t>
-      </w:r>
-    </w:p>
-    <w:p>
-      <w:pPr>
-        <w:spacing w:before="360" w:after="80"/>
-        <w:ind w:left="340" w:hanging="340"/>
-        <w:jc w:val="both"/>
-        <w:rPr>
-          <w:color w:val="000000" w:themeColor="text1"/>
-        </w:rPr>
-      </w:pPr>
-      <w:r>
-        <w:rPr>
-          <w:color w:val="000000" w:themeColor="text1"/>
-        </w:rPr>
-        <w:t>More, S., Kravtsov, A. V., Dalal, N. &amp; Gottlöber, S. (2011). The overdensity and masses of the friends-of-friends halos and universality of the halo mass function. The Astrophysical Journal Supplement Series, 195(1), 4. doi:10.1088/0067-0049/195/1/4.</w:t>
-      </w:r>
-    </w:p>
-    <w:p>
-      <w:pPr>
-        <w:spacing w:before="360" w:after="80"/>
-        <w:ind w:left="340" w:hanging="340"/>
-        <w:jc w:val="both"/>
-        <w:rPr>
-          <w:color w:val="000000" w:themeColor="text1"/>
-        </w:rPr>
-      </w:pPr>
-      <w:r>
-        <w:rPr>
-          <w:color w:val="000000" w:themeColor="text1"/>
-        </w:rPr>
-        <w:t>Price, D. J. (2012). Smoothed particle hydrodynamics and magnetohydrodynamics. Journal of Computational Physics, 231(3), 759-794. doi:10.1016/j.jcp.2010.12.011.</w:t>
-      </w:r>
-    </w:p>
-    <w:p>
-      <w:pPr>
-        <w:spacing w:before="360" w:after="80"/>
-        <w:ind w:left="340" w:hanging="340"/>
-        <w:jc w:val="both"/>
-        <w:rPr>
-          <w:color w:val="000000" w:themeColor="text1"/>
-        </w:rPr>
-      </w:pPr>
-      <w:r>
-        <w:rPr>
-          <w:color w:val="000000" w:themeColor="text1"/>
-        </w:rPr>
-        <w:lastRenderedPageBreak/>
-        <w:t>Prokhorenkova, L., Gusev, G., Vorobev, A., Dorogush, A. V. &amp; Gulin, A. (2018). CatBoost: unbiased boosting with categorical features. Advances in Neural Information Processing Systems, 31.</w:t>
-      </w:r>
-    </w:p>
-    <w:p>
-      <w:pPr>
-        <w:spacing w:before="360" w:after="80"/>
-        <w:ind w:left="340" w:hanging="340"/>
-        <w:jc w:val="both"/>
-        <w:rPr>
-          <w:color w:val="000000" w:themeColor="text1"/>
-        </w:rPr>
-      </w:pPr>
-      <w:r>
-        <w:rPr>
-          <w:color w:val="000000" w:themeColor="text1"/>
-        </w:rPr>
-        <w:t>Raissi, M., Perdikaris, P. &amp; Karniadakis, G. E. (2019). Physics-informed neural networks: A deep learning framework for solving forward and inverse problems involving nonlinear partial differential equations. Journal of Computational Physics, 378, 686-707. doi:10.1016/j.jcp.2018.10.045.</w:t>
-      </w:r>
-    </w:p>
-    <w:p>
-      <w:pPr>
-        <w:spacing w:before="360" w:after="80"/>
-        <w:ind w:left="340" w:hanging="340"/>
-        <w:jc w:val="both"/>
-        <w:rPr>
-          <w:color w:val="000000" w:themeColor="text1"/>
-        </w:rPr>
-      </w:pPr>
-      <w:r>
-        <w:rPr>
-          <w:color w:val="000000" w:themeColor="text1"/>
-        </w:rPr>
-        <w:t>Richardson, D. C., Bottke, W. F. Jr. &amp; Love, S. G. (1998). Tidal distortion and disruption of Earth-crossing asteroids. Icarus, 134, 47-76.</w:t>
-      </w:r>
-    </w:p>
-    <w:p>
-      <w:pPr>
-        <w:spacing w:before="360" w:after="80"/>
-        <w:ind w:left="340" w:hanging="340"/>
-        <w:jc w:val="both"/>
-        <w:rPr>
-          <w:color w:val="000000" w:themeColor="text1"/>
-        </w:rPr>
-      </w:pPr>
-      <w:r>
-        <w:rPr>
-          <w:color w:val="000000" w:themeColor="text1"/>
-        </w:rPr>
-        <w:t>Rosenblatt, P., Charnoz, S., Dunseath, K. M., Terao-Dunseath, M. &amp; Trinh, A. (2016). Accretion of Phobos and Deimos in an extended debris disc stirred by transient moons. Nature Geoscience, 9, 581-583. doi:10.1038/ngeo2742.</w:t>
-      </w:r>
-    </w:p>
-    <w:p>
-      <w:pPr>
-        <w:spacing w:before="360" w:after="80"/>
-        <w:ind w:left="340" w:hanging="340"/>
-        <w:jc w:val="both"/>
-        <w:rPr>
-          <w:color w:val="000000" w:themeColor="text1"/>
-        </w:rPr>
-      </w:pPr>
-      <w:r>
-        <w:rPr>
-          <w:color w:val="000000" w:themeColor="text1"/>
-        </w:rPr>
-        <w:t>Villaescusa-Navarro, F. et al. (2021). The CAMELS project: Cosmology and Astrophysics with MachinE Learning Simulations. arXiv:2010.00619.</w:t>
-      </w:r>
-    </w:p>
-    <w:p>
-      <w:pPr>
-        <w:spacing w:before="360" w:after="80"/>
-        <w:ind w:left="340" w:hanging="340"/>
-        <w:jc w:val="both"/>
-        <w:rPr>
-          <w:color w:val="000000" w:themeColor="text1"/>
-        </w:rPr>
-      </w:pPr>
-      <w:r>
-        <w:rPr>
-          <w:color w:val="000000" w:themeColor="text1"/>
-        </w:rPr>
-        <w:t>Walsh, K. J. &amp; Richardson, D. C. (2006). Binary near-Earth asteroid formation: Rubble pile model of tidal disruptions. Icarus, 180(1), 201-216. doi:10.1016/j.icarus.2005.08.015.</w:t>
-      </w:r>
-    </w:p>
-    <w:p>
-      <w:pPr>
-        <w:spacing w:before="240" w:after="160"/>
         <w:rPr>
           <w:rFonts w:eastAsiaTheme="majorEastAsia"/>
           <w:b/>
@@ -6648,6 +6649,12 @@
       </w:pPr>
       <w:r>
         <w:rPr>
+          <w:color w:val="000000" w:themeColor="text1"/>
+        </w:rPr>
+        <w:t>Walsh, K. J. &amp; Richardson, D. C. (2006). Binary near-Earth asteroid formation: Rubble pile model of tidal disruptions. Icarus, 180(1), 201-216. doi:10.1016/j.icarus.2005.08.015.</w:t>
+      </w:r>
+      <w:r>
+        <w:rPr>
           <w:b/>
           <w:bCs/>
           <w:color w:val="000000" w:themeColor="text1"/>
@@ -6661,14 +6668,14 @@
       <w:pPr>
         <w:pStyle w:val="Heading1"/>
       </w:pPr>
-      <w:bookmarkStart w:id="64" w:name="_Toc238149754"/>
-      <w:bookmarkStart w:id="65" w:name="_Toc238639517"/>
+      <w:bookmarkStart w:id="62" w:name="_Toc238149754"/>
+      <w:bookmarkStart w:id="63" w:name="_Toc238639517"/>
       <w:r>
         <w:lastRenderedPageBreak/>
         <w:t>Appendix A. Supporting Model Results</w:t>
       </w:r>
-      <w:bookmarkEnd w:id="64"/>
-      <w:bookmarkEnd w:id="65"/>
+      <w:bookmarkEnd w:id="62"/>
+      <w:bookmarkEnd w:id="63"/>
     </w:p>
     <w:p>
       <w:pPr>
@@ -6701,7 +6708,7 @@
           <w:sz w:val="20"/>
           <w:szCs w:val="20"/>
         </w:rPr>
-        <w:t>. Comparison of BMF regression models using five-fold GroupKFold by physical SPH simulation, including exploratory advanced models to show the potential for further performance improvement in future work.</w:t>
+        <w:t>. Comparison of BMF regression models using five-fold GroupKFold by physical SPH simulation</w:t>
       </w:r>
     </w:p>
     <w:tbl>
@@ -7896,104 +7903,63 @@
         </w:rPr>
         <w:t xml:space="preserve"> </w:t>
       </w:r>
-      <w:bookmarkStart w:id="66" w:name="_Toc238149755"/>
+      <w:bookmarkStart w:id="64" w:name="_Toc238149755"/>
       <w:r>
         <w:rPr>
           <w:noProof w:val="0"/>
           <w:lang w:val="en-US"/>
         </w:rPr>
-        <w:t>Tuning Gradient Boosting improves performance to R² = 0.9328, MAE = 0.0277, and RMSE = 0.0400. Adding the tested derived features to Gradient Boosting slightly reduces performance. Although Random Forest with derived features achieves slightly higher predictive performance (R² = 0.9376, MAE = 0.0268, RMSE = 0.0385), the tuned Gradient Boosting model using the original scenario inputs is retained as the primary model because it achieves comparable performance without requiring additional derived inputs.</w:t>
-      </w:r>
-    </w:p>
-    <w:p>
-      <w:pPr>
-        <w:spacing w:before="240" w:after="100" w:afterAutospacing="1"/>
-        <w:jc w:val="both"/>
+        <w:t xml:space="preserve">Tuning Gradient Boosting improves </w:t>
+      </w:r>
+      <w:r>
         <w:rPr>
           <w:noProof w:val="0"/>
           <w:lang w:val="en-US"/>
         </w:rPr>
-      </w:pPr>
-    </w:p>
-    <w:p>
-      <w:pPr>
-        <w:spacing w:before="240" w:after="100" w:afterAutospacing="1"/>
-        <w:jc w:val="both"/>
+        <w:t>performance, while a</w:t>
+      </w:r>
+      <w:r>
         <w:rPr>
           <w:noProof w:val="0"/>
           <w:lang w:val="en-US"/>
         </w:rPr>
-      </w:pPr>
-    </w:p>
-    <w:p>
-      <w:pPr>
-        <w:spacing w:before="240" w:after="100" w:afterAutospacing="1"/>
-        <w:jc w:val="both"/>
+        <w:t xml:space="preserve">dding the tested derived features to Gradient Boosting slightly reduces performance. </w:t>
+      </w:r>
+      <w:r>
         <w:rPr>
           <w:noProof w:val="0"/>
           <w:lang w:val="en-US"/>
         </w:rPr>
-      </w:pPr>
-    </w:p>
-    <w:p>
-      <w:pPr>
-        <w:spacing w:before="240" w:after="100" w:afterAutospacing="1"/>
-        <w:jc w:val="both"/>
+        <w:t>To restate from Section 3.3, a</w:t>
+      </w:r>
+      <w:r>
         <w:rPr>
           <w:noProof w:val="0"/>
           <w:lang w:val="en-US"/>
         </w:rPr>
-      </w:pPr>
-    </w:p>
-    <w:p>
-      <w:pPr>
-        <w:spacing w:before="240" w:after="100" w:afterAutospacing="1"/>
-        <w:jc w:val="both"/>
+        <w:t>lthough Random Forest with derived features achieves slightly higher predictive performance</w:t>
+      </w:r>
+      <w:r>
         <w:rPr>
           <w:noProof w:val="0"/>
           <w:lang w:val="en-US"/>
         </w:rPr>
-      </w:pPr>
-    </w:p>
-    <w:p>
-      <w:pPr>
-        <w:spacing w:before="240" w:after="100" w:afterAutospacing="1"/>
-        <w:jc w:val="both"/>
+        <w:t xml:space="preserve">, </w:t>
+      </w:r>
+      <w:r>
         <w:rPr>
           <w:noProof w:val="0"/>
           <w:lang w:val="en-US"/>
         </w:rPr>
-      </w:pPr>
-    </w:p>
-    <w:p>
-      <w:pPr>
-        <w:spacing w:before="240" w:after="100" w:afterAutospacing="1"/>
-        <w:jc w:val="both"/>
+        <w:t xml:space="preserve">the tuned Gradient Boosting model using the original scenario inputs is retained as the primary model because it achieves comparable performance without requiring additional derived </w:t>
+      </w:r>
+      <w:r>
         <w:rPr>
           <w:noProof w:val="0"/>
           <w:lang w:val="en-US"/>
         </w:rPr>
-      </w:pPr>
-    </w:p>
-    <w:p>
-      <w:pPr>
-        <w:spacing w:before="240" w:after="100" w:afterAutospacing="1"/>
-        <w:jc w:val="both"/>
-        <w:rPr>
-          <w:noProof w:val="0"/>
-          <w:lang w:val="en-US"/>
-        </w:rPr>
-      </w:pPr>
-    </w:p>
-    <w:p>
-      <w:pPr>
-        <w:spacing w:before="240" w:after="100" w:afterAutospacing="1"/>
-        <w:jc w:val="both"/>
-        <w:rPr>
-          <w:noProof w:val="0"/>
-          <w:lang w:val="en-US"/>
-        </w:rPr>
-      </w:pPr>
+        <w:t>features.</w:t>
+      </w:r>
     </w:p>
     <w:p>
       <w:pPr>
@@ -8012,7 +7978,6 @@
           <w:sz w:val="20"/>
           <w:szCs w:val="20"/>
         </w:rPr>
-        <w:lastRenderedPageBreak/>
         <w:br/>
       </w:r>
       <w:r>
@@ -8033,7 +7998,7 @@
           <w:sz w:val="20"/>
           <w:szCs w:val="20"/>
         </w:rPr>
-        <w:t>. Model tuning parameters and physics-derived features investigated</w:t>
+        <w:t xml:space="preserve">. </w:t>
       </w:r>
       <w:r>
         <w:rPr>
@@ -8043,17 +8008,7 @@
           <w:sz w:val="20"/>
           <w:szCs w:val="20"/>
         </w:rPr>
-        <w:t xml:space="preserve"> for gradient boosting model</w:t>
-      </w:r>
-      <w:r>
-        <w:rPr>
-          <w:i/>
-          <w:iCs/>
-          <w:color w:val="000000" w:themeColor="text1"/>
-          <w:sz w:val="20"/>
-          <w:szCs w:val="20"/>
-        </w:rPr>
-        <w:t>.</w:t>
+        <w:t>Model tuning parameters and physics-derived features investigated for the Gradient Boosting model.</w:t>
       </w:r>
     </w:p>
     <w:tbl>
@@ -8419,6 +8374,12 @@
                 <w:color w:val="000000" w:themeColor="text1"/>
               </w:rPr>
               <w:t>Increased R² by 0.0</w:t>
+            </w:r>
+            <w:r>
+              <w:rPr>
+                <w:color w:val="000000" w:themeColor="text1"/>
+              </w:rPr>
+              <w:t>0</w:t>
             </w:r>
             <w:r>
               <w:rPr>
@@ -10741,7 +10702,6 @@
     <w:p>
       <w:pPr>
         <w:spacing w:before="100" w:beforeAutospacing="1" w:after="100" w:afterAutospacing="1"/>
-        <w:jc w:val="center"/>
         <w:rPr>
           <w:noProof w:val="0"/>
           <w:lang w:val="en-US"/>
@@ -10757,41 +10717,10 @@
           <w:lang w:val="en-US"/>
         </w:rPr>
       </w:pPr>
-    </w:p>
-    <w:p>
-      <w:pPr>
-        <w:spacing w:before="100" w:beforeAutospacing="1" w:after="100" w:afterAutospacing="1"/>
-        <w:jc w:val="center"/>
-        <w:rPr>
-          <w:noProof w:val="0"/>
-          <w:lang w:val="en-US"/>
-        </w:rPr>
-      </w:pPr>
-    </w:p>
-    <w:p>
-      <w:pPr>
-        <w:spacing w:before="100" w:beforeAutospacing="1" w:after="100" w:afterAutospacing="1"/>
-        <w:jc w:val="center"/>
-        <w:rPr>
-          <w:noProof w:val="0"/>
-          <w:lang w:val="en-US"/>
-        </w:rPr>
-      </w:pPr>
-    </w:p>
-    <w:p>
-      <w:pPr>
-        <w:spacing w:before="100" w:beforeAutospacing="1" w:after="100" w:afterAutospacing="1"/>
-        <w:jc w:val="center"/>
-        <w:rPr>
-          <w:noProof w:val="0"/>
-          <w:lang w:val="en-US"/>
-        </w:rPr>
-      </w:pPr>
       <w:r>
         <w:rPr>
           <w:color w:val="000000" w:themeColor="text1"/>
         </w:rPr>
-        <w:lastRenderedPageBreak/>
         <w:drawing>
           <wp:inline distT="0" distB="0" distL="0" distR="0" wp14:anchorId="23ECAAF8" wp14:editId="0C5D4E7F">
             <wp:extent cx="4550229" cy="3090850"/>
@@ -10808,7 +10737,7 @@
                     <pic:cNvPicPr/>
                   </pic:nvPicPr>
                   <pic:blipFill>
-                    <a:blip r:embed="rId17"/>
+                    <a:blip r:embed="rId13"/>
                     <a:stretch>
                       <a:fillRect/>
                     </a:stretch>
@@ -10869,7 +10798,11 @@
         <w:jc w:val="both"/>
       </w:pPr>
       <w:r>
-        <w:t xml:space="preserve">The shaded central regions indicate the ranges represented by the corresponding SPH results. Outside these ranges, the tree-based model does not extrapolate a physical trend. Instead, it continues to use partitions learned from the training data, producing stepwise or constant predictions, as seen most clearly for periapsis, velocity, and spin. For mass, the prediction keeps increasing slightly beyond the observed range because the higher mass values still cross different learned tree thresholds. Farther outside the range, the values fall into the same tree regions, so the prediction becomes nearly constant. </w:t>
+        <w:t xml:space="preserve">The shaded central regions indicate the ranges represented by the corresponding SPH results. Outside these ranges, the tree-based model does not extrapolate a physical trend. Instead, it continues to use partitions learned from the training data, producing stepwise or constant predictions, as seen most clearly for periapsis, velocity, and spin. For mass, the prediction keeps increasing slightly beyond the observed range because the higher mass values still cross different </w:t>
+      </w:r>
+      <w:r>
+        <w:lastRenderedPageBreak/>
+        <w:t xml:space="preserve">learned tree thresholds. Farther outside the range, the values fall into the same tree regions, so the prediction becomes nearly constant. </w:t>
       </w:r>
       <w:r>
         <w:t>This happens sooner for the other parameter sweeps, where out-of-range values quickly enter the same terminal tree regions and further changes no longer affect the prediction. These out-of-range predictions should therefore not be interpreted as physical trends.</w:t>
@@ -10883,65 +10816,22 @@
     </w:p>
     <w:p>
       <w:pPr>
-        <w:spacing w:after="160" w:line="278" w:lineRule="auto"/>
-        <w:jc w:val="both"/>
-      </w:pPr>
-    </w:p>
-    <w:p>
-      <w:pPr>
-        <w:spacing w:after="160" w:line="278" w:lineRule="auto"/>
-        <w:jc w:val="both"/>
-      </w:pPr>
-    </w:p>
-    <w:p>
-      <w:pPr>
-        <w:spacing w:after="160" w:line="278" w:lineRule="auto"/>
-        <w:jc w:val="both"/>
-      </w:pPr>
-    </w:p>
-    <w:p>
-      <w:pPr>
-        <w:spacing w:after="160" w:line="278" w:lineRule="auto"/>
-        <w:jc w:val="both"/>
-      </w:pPr>
-    </w:p>
-    <w:p>
-      <w:pPr>
-        <w:spacing w:after="160" w:line="278" w:lineRule="auto"/>
-        <w:jc w:val="both"/>
-      </w:pPr>
-    </w:p>
-    <w:p>
-      <w:pPr>
-        <w:spacing w:after="160" w:line="278" w:lineRule="auto"/>
-        <w:jc w:val="both"/>
-      </w:pPr>
-    </w:p>
-    <w:p>
-      <w:pPr>
-        <w:spacing w:after="160" w:line="278" w:lineRule="auto"/>
-        <w:jc w:val="both"/>
-      </w:pPr>
-    </w:p>
-    <w:p>
-      <w:pPr>
         <w:pStyle w:val="Heading1"/>
       </w:pPr>
-      <w:bookmarkStart w:id="67" w:name="_Toc238149756"/>
-      <w:bookmarkStart w:id="68" w:name="_Toc238639518"/>
+      <w:bookmarkStart w:id="65" w:name="_Toc238149756"/>
+      <w:bookmarkStart w:id="66" w:name="_Toc238639518"/>
+      <w:bookmarkEnd w:id="64"/>
+      <w:r>
+        <w:t xml:space="preserve">Appendix </w:t>
+      </w:r>
+      <w:r>
+        <w:t>B</w:t>
+      </w:r>
+      <w:r>
+        <w:t>. AI acknowledgement Statement</w:t>
+      </w:r>
+      <w:bookmarkEnd w:id="65"/>
       <w:bookmarkEnd w:id="66"/>
-      <w:r>
-        <w:lastRenderedPageBreak/>
-        <w:t xml:space="preserve">Appendix </w:t>
-      </w:r>
-      <w:r>
-        <w:t>B</w:t>
-      </w:r>
-      <w:r>
-        <w:t>. AI acknowledgement Statement</w:t>
-      </w:r>
-      <w:bookmarkEnd w:id="67"/>
-      <w:bookmarkEnd w:id="68"/>
     </w:p>
     <w:p>
       <w:pPr>
@@ -10959,8 +10849,8 @@
       </w:r>
     </w:p>
     <w:sectPr>
-      <w:footerReference w:type="even" r:id="rId18"/>
-      <w:footerReference w:type="default" r:id="rId19"/>
+      <w:footerReference w:type="even" r:id="rId14"/>
+      <w:footerReference w:type="default" r:id="rId15"/>
       <w:pgSz w:w="12240" w:h="15840"/>
       <w:pgMar w:top="1440" w:right="1440" w:bottom="1440" w:left="1440" w:header="720" w:footer="720" w:gutter="0"/>
       <w:pgNumType w:start="0"/>
@@ -10970,112 +10860,6 @@
     </w:sectPr>
   </w:body>
 </w:document>
-</file>
-
-<file path=word/comments.xml><?xml version="1.0" encoding="utf-8"?>
-<w:comments xmlns:wpc="http://schemas.microsoft.com/office/word/2010/wordprocessingCanvas" xmlns:cx="http://schemas.microsoft.com/office/drawing/2014/chartex" xmlns:cx1="http://schemas.microsoft.com/office/drawing/2015/9/8/chartex" xmlns:cx2="http://schemas.microsoft.com/office/drawing/2015/10/21/chartex" xmlns:cx3="http://schemas.microsoft.com/office/drawing/2016/5/9/chartex" xmlns:cx4="http://schemas.microsoft.com/office/drawing/2016/5/10/chartex" xmlns:cx5="http://schemas.microsoft.com/office/drawing/2016/5/11/chartex" xmlns:cx6="http://schemas.microsoft.com/office/drawing/2016/5/12/chartex" xmlns:cx7="http://schemas.microsoft.com/office/drawing/2016/5/13/chartex" xmlns:cx8="http://schemas.microsoft.com/office/drawing/2016/5/14/chartex" xmlns:mc="http://schemas.openxmlformats.org/markup-compatibility/2006" xmlns:m="http://schemas.openxmlformats.org/officeDocument/2006/math" xmlns:aink="http://schemas.microsoft.com/office/drawing/2016/ink" xmlns:am3d="http://schemas.microsoft.com/office/drawing/2017/model3d" xmlns:oel="http://schemas.microsoft.com/office/2019/extlst" xmlns:r="http://schemas.openxmlformats.org/officeDocument/2006/relationships" xmlns:wp14="http://schemas.microsoft.com/office/word/2010/wordprocessingDrawing" xmlns:wp="http://schemas.openxmlformats.org/drawingml/2006/wordprocessingDrawing" xmlns:wpg="http://schemas.microsoft.com/office/word/2010/wordprocessingGroup" xmlns:wpi="http://schemas.microsoft.com/office/word/2010/wordprocessingInk" xmlns:wps="http://schemas.microsoft.com/office/word/2010/wordprocessingShape" xmlns:o="urn:schemas-microsoft-com:office:office" xmlns:v="urn:schemas-microsoft-com:vml" xmlns:w10="urn:schemas-microsoft-com:office:word" xmlns:w="http://schemas.openxmlformats.org/wordprocessingml/2006/main" xmlns:w14="http://schemas.microsoft.com/office/word/2010/wordml" xmlns:w15="http://schemas.microsoft.com/office/word/2012/wordml" xmlns:w16cex="http://schemas.microsoft.com/office/word/2018/wordml/cex" xmlns:w16cid="http://schemas.microsoft.com/office/word/2016/wordml/cid" xmlns:w16="http://schemas.microsoft.com/office/word/2018/wordml" xmlns:w16sdtdh="http://schemas.microsoft.com/office/word/2020/wordml/sdtdatahash" xmlns:w16sdtfl="http://schemas.microsoft.com/office/word/2024/wordml/sdtformatlock" xmlns:w16se="http://schemas.microsoft.com/office/word/2015/wordml/symex" xmlns:w16du="http://schemas.microsoft.com/office/word/2023/wordml/word16du" xmlns:wne="http://schemas.microsoft.com/office/word/2006/wordml" mc:Ignorable="w14 w15 w16se w16cid w16 w16cex w16sdtdh w16sdtfl w16du wp14">
-  <w:comment w:id="39" w:author="Kristy Natasha" w:date="2026-08-19T20:25:00Z" w:initials="KN">
-    <w:p>
-      <w:r>
-        <w:rPr>
-          <w:rStyle w:val="CommentReference"/>
-        </w:rPr>
-        <w:annotationRef/>
-      </w:r>
-      <w:r>
-        <w:rPr>
-          <w:sz w:val="20"/>
-          <w:szCs w:val="20"/>
-        </w:rPr>
-        <w:t>Overall Parameter Importance</w:t>
-      </w:r>
-    </w:p>
-    <w:p>
-      <w:r>
-        <w:rPr>
-          <w:sz w:val="20"/>
-          <w:szCs w:val="20"/>
-        </w:rPr>
-        <w:t>Removing periapsis: ΔR² = −0.574</w:t>
-      </w:r>
-    </w:p>
-    <w:p>
-      <w:r>
-        <w:rPr>
-          <w:sz w:val="20"/>
-          <w:szCs w:val="20"/>
-        </w:rPr>
-        <w:t>Removing velocity: ΔR² = −0.296</w:t>
-      </w:r>
-    </w:p>
-    <w:p>
-      <w:r>
-        <w:rPr>
-          <w:sz w:val="20"/>
-          <w:szCs w:val="20"/>
-        </w:rPr>
-        <w:t>Removing spin: ΔR² = −0.316</w:t>
-      </w:r>
-    </w:p>
-    <w:p/>
-    <w:p>
-      <w:r>
-        <w:rPr>
-          <w:sz w:val="20"/>
-          <w:szCs w:val="20"/>
-        </w:rPr>
-        <w:t>Overall Rule</w:t>
-      </w:r>
-    </w:p>
-    <w:p>
-      <w:r>
-        <w:rPr>
-          <w:sz w:val="20"/>
-          <w:szCs w:val="20"/>
-        </w:rPr>
-        <w:t>periapsis &gt; spin &gt; velocity</w:t>
-      </w:r>
-    </w:p>
-  </w:comment>
-  <w:comment w:id="48" w:author="Kristy Natasha" w:date="2026-08-26T11:27:00Z" w:initials="KN">
-    <w:p>
-      <w:r>
-        <w:rPr>
-          <w:rStyle w:val="CommentReference"/>
-        </w:rPr>
-        <w:annotationRef/>
-      </w:r>
-      <w:r>
-        <w:rPr>
-          <w:sz w:val="20"/>
-          <w:szCs w:val="20"/>
-        </w:rPr>
-        <w:t>need tp change (new failure for underprediction)</w:t>
-      </w:r>
-    </w:p>
-  </w:comment>
-</w:comments>
-</file>
-
-<file path=word/commentsExtended.xml><?xml version="1.0" encoding="utf-8"?>
-<w15:commentsEx xmlns:wpc="http://schemas.microsoft.com/office/word/2010/wordprocessingCanvas" xmlns:cx="http://schemas.microsoft.com/office/drawing/2014/chartex" xmlns:cx1="http://schemas.microsoft.com/office/drawing/2015/9/8/chartex" xmlns:cx2="http://schemas.microsoft.com/office/drawing/2015/10/21/chartex" xmlns:cx3="http://schemas.microsoft.com/office/drawing/2016/5/9/chartex" xmlns:cx4="http://schemas.microsoft.com/office/drawing/2016/5/10/chartex" xmlns:cx5="http://schemas.microsoft.com/office/drawing/2016/5/11/chartex" xmlns:cx6="http://schemas.microsoft.com/office/drawing/2016/5/12/chartex" xmlns:cx7="http://schemas.microsoft.com/office/drawing/2016/5/13/chartex" xmlns:cx8="http://schemas.microsoft.com/office/drawing/2016/5/14/chartex" xmlns:mc="http://schemas.openxmlformats.org/markup-compatibility/2006" xmlns:m="http://schemas.openxmlformats.org/officeDocument/2006/math" xmlns:aink="http://schemas.microsoft.com/office/drawing/2016/ink" xmlns:am3d="http://schemas.microsoft.com/office/drawing/2017/model3d" xmlns:oel="http://schemas.microsoft.com/office/2019/extlst" xmlns:r="http://schemas.openxmlformats.org/officeDocument/2006/relationships" xmlns:wp14="http://schemas.microsoft.com/office/word/2010/wordprocessingDrawing" xmlns:wp="http://schemas.openxmlformats.org/drawingml/2006/wordprocessingDrawing" xmlns:wpg="http://schemas.microsoft.com/office/word/2010/wordprocessingGroup" xmlns:wpi="http://schemas.microsoft.com/office/word/2010/wordprocessingInk" xmlns:wps="http://schemas.microsoft.com/office/word/2010/wordprocessingShape" xmlns:o="urn:schemas-microsoft-com:office:office" xmlns:v="urn:schemas-microsoft-com:vml" xmlns:w10="urn:schemas-microsoft-com:office:word" xmlns:w="http://schemas.openxmlformats.org/wordprocessingml/2006/main" xmlns:w14="http://schemas.microsoft.com/office/word/2010/wordml" xmlns:w15="http://schemas.microsoft.com/office/word/2012/wordml" xmlns:w16cex="http://schemas.microsoft.com/office/word/2018/wordml/cex" xmlns:w16cid="http://schemas.microsoft.com/office/word/2016/wordml/cid" xmlns:w16="http://schemas.microsoft.com/office/word/2018/wordml" xmlns:w16sdtdh="http://schemas.microsoft.com/office/word/2020/wordml/sdtdatahash" xmlns:w16sdtfl="http://schemas.microsoft.com/office/word/2024/wordml/sdtformatlock" xmlns:w16se="http://schemas.microsoft.com/office/word/2015/wordml/symex" xmlns:w16du="http://schemas.microsoft.com/office/word/2023/wordml/word16du" xmlns:wne="http://schemas.microsoft.com/office/word/2006/wordml" mc:Ignorable="w14 w15 w16se w16cid w16 w16cex w16sdtdh w16sdtfl w16du wp14">
-  <w15:commentEx w15:paraId="4AA38294" w15:done="1"/>
-  <w15:commentEx w15:paraId="7A52081E" w15:done="1"/>
-</w15:commentsEx>
-</file>
-
-<file path=word/commentsExtensible.xml><?xml version="1.0" encoding="utf-8"?>
-<w16cex:commentsExtensible xmlns:wpc="http://schemas.microsoft.com/office/word/2010/wordprocessingCanvas" xmlns:cx="http://schemas.microsoft.com/office/drawing/2014/chartex" xmlns:cx1="http://schemas.microsoft.com/office/drawing/2015/9/8/chartex" xmlns:cx2="http://schemas.microsoft.com/office/drawing/2015/10/21/chartex" xmlns:cx3="http://schemas.microsoft.com/office/drawing/2016/5/9/chartex" xmlns:cx4="http://schemas.microsoft.com/office/drawing/2016/5/10/chartex" xmlns:cx5="http://schemas.microsoft.com/office/drawing/2016/5/11/chartex" xmlns:cx6="http://schemas.microsoft.com/office/drawing/2016/5/12/chartex" xmlns:cx7="http://schemas.microsoft.com/office/drawing/2016/5/13/chartex" xmlns:cx8="http://schemas.microsoft.com/office/drawing/2016/5/14/chartex" xmlns:cr="http://schemas.microsoft.com/office/comments/2020/reactions" xmlns:mc="http://schemas.openxmlformats.org/markup-compatibility/2006" xmlns:m="http://schemas.openxmlformats.org/officeDocument/2006/math" xmlns:aink="http://schemas.microsoft.com/office/drawing/2016/ink" xmlns:am3d="http://schemas.microsoft.com/office/drawing/2017/model3d" xmlns:oel="http://schemas.microsoft.com/office/2019/extlst" xmlns:r="http://schemas.openxmlformats.org/officeDocument/2006/relationships" xmlns:wp14="http://schemas.microsoft.com/office/word/2010/wordprocessingDrawing" xmlns:wp="http://schemas.openxmlformats.org/drawingml/2006/wordprocessingDrawing" xmlns:wpg="http://schemas.microsoft.com/office/word/2010/wordprocessingGroup" xmlns:wpi="http://schemas.microsoft.com/office/word/2010/wordprocessingInk" xmlns:wps="http://schemas.microsoft.com/office/word/2010/wordprocessingShape" xmlns:o="urn:schemas-microsoft-com:office:office" xmlns:v="urn:schemas-microsoft-com:vml" xmlns:w10="urn:schemas-microsoft-com:office:word" xmlns:w="http://schemas.openxmlformats.org/wordprocessingml/2006/main" xmlns:w14="http://schemas.microsoft.com/office/word/2010/wordml" xmlns:w15="http://schemas.microsoft.com/office/word/2012/wordml" xmlns:w16cex="http://schemas.microsoft.com/office/word/2018/wordml/cex" xmlns:w16cid="http://schemas.microsoft.com/office/word/2016/wordml/cid" xmlns:w16="http://schemas.microsoft.com/office/word/2018/wordml" xmlns:w16sdtdh="http://schemas.microsoft.com/office/word/2020/wordml/sdtdatahash" xmlns:w16sdtfl="http://schemas.microsoft.com/office/word/2024/wordml/sdtformatlock" xmlns:w16se="http://schemas.microsoft.com/office/word/2015/wordml/symex" xmlns:w16du="http://schemas.microsoft.com/office/word/2023/wordml/word16du" xmlns:wne="http://schemas.microsoft.com/office/word/2006/wordml" mc:Ignorable="w14 w15 w16se w16cid w16 w16cex w16sdtdh w16sdtfl cr w16du wp14">
-  <w16cex:commentExtensible w16cex:durableId="1E48CB65" w16cex:dateUtc="2026-08-19T19:25:00Z"/>
-  <w16cex:commentExtensible w16cex:durableId="660CA60B" w16cex:dateUtc="2026-08-26T10:27:00Z"/>
-</w16cex:commentsExtensible>
-</file>
-
-<file path=word/commentsIds.xml><?xml version="1.0" encoding="utf-8"?>
-<w16cid:commentsIds xmlns:wpc="http://schemas.microsoft.com/office/word/2010/wordprocessingCanvas" xmlns:cx="http://schemas.microsoft.com/office/drawing/2014/chartex" xmlns:cx1="http://schemas.microsoft.com/office/drawing/2015/9/8/chartex" xmlns:cx2="http://schemas.microsoft.com/office/drawing/2015/10/21/chartex" xmlns:cx3="http://schemas.microsoft.com/office/drawing/2016/5/9/chartex" xmlns:cx4="http://schemas.microsoft.com/office/drawing/2016/5/10/chartex" xmlns:cx5="http://schemas.microsoft.com/office/drawing/2016/5/11/chartex" xmlns:cx6="http://schemas.microsoft.com/office/drawing/2016/5/12/chartex" xmlns:cx7="http://schemas.microsoft.com/office/drawing/2016/5/13/chartex" xmlns:cx8="http://schemas.microsoft.com/office/drawing/2016/5/14/chartex" xmlns:mc="http://schemas.openxmlformats.org/markup-compatibility/2006" xmlns:m="http://schemas.openxmlformats.org/officeDocument/2006/math" xmlns:aink="http://schemas.microsoft.com/office/drawing/2016/ink" xmlns:am3d="http://schemas.microsoft.com/office/drawing/2017/model3d" xmlns:oel="http://schemas.microsoft.com/office/2019/extlst" xmlns:r="http://schemas.openxmlformats.org/officeDocument/2006/relationships" xmlns:wp14="http://schemas.microsoft.com/office/word/2010/wordprocessingDrawing" xmlns:wp="http://schemas.openxmlformats.org/drawingml/2006/wordprocessingDrawing" xmlns:wpg="http://schemas.microsoft.com/office/word/2010/wordprocessingGroup" xmlns:wpi="http://schemas.microsoft.com/office/word/2010/wordprocessingInk" xmlns:wps="http://schemas.microsoft.com/office/word/2010/wordprocessingShape" xmlns:o="urn:schemas-microsoft-com:office:office" xmlns:v="urn:schemas-microsoft-com:vml" xmlns:w10="urn:schemas-microsoft-com:office:word" xmlns:w="http://schemas.openxmlformats.org/wordprocessingml/2006/main" xmlns:w14="http://schemas.microsoft.com/office/word/2010/wordml" xmlns:w15="http://schemas.microsoft.com/office/word/2012/wordml" xmlns:w16cex="http://schemas.microsoft.com/office/word/2018/wordml/cex" xmlns:w16cid="http://schemas.microsoft.com/office/word/2016/wordml/cid" xmlns:w16="http://schemas.microsoft.com/office/word/2018/wordml" xmlns:w16sdtdh="http://schemas.microsoft.com/office/word/2020/wordml/sdtdatahash" xmlns:w16sdtfl="http://schemas.microsoft.com/office/word/2024/wordml/sdtformatlock" xmlns:w16se="http://schemas.microsoft.com/office/word/2015/wordml/symex" xmlns:w16du="http://schemas.microsoft.com/office/word/2023/wordml/word16du" xmlns:wne="http://schemas.microsoft.com/office/word/2006/wordml" mc:Ignorable="w14 w15 w16se w16cid w16 w16cex w16sdtdh w16sdtfl w16du wp14">
-  <w16cid:commentId w16cid:paraId="4AA38294" w16cid:durableId="1E48CB65"/>
-  <w16cid:commentId w16cid:paraId="7A52081E" w16cid:durableId="660CA60B"/>
-</w16cid:commentsIds>
 </file>
 
 <file path=word/endnotes.xml><?xml version="1.0" encoding="utf-8"?>
@@ -11295,14 +11079,6 @@
     </w:p>
   </w:footnote>
 </w:footnotes>
-</file>
-
-<file path=word/people.xml><?xml version="1.0" encoding="utf-8"?>
-<w15:people xmlns:wpc="http://schemas.microsoft.com/office/word/2010/wordprocessingCanvas" xmlns:cx="http://schemas.microsoft.com/office/drawing/2014/chartex" xmlns:cx1="http://schemas.microsoft.com/office/drawing/2015/9/8/chartex" xmlns:cx2="http://schemas.microsoft.com/office/drawing/2015/10/21/chartex" xmlns:cx3="http://schemas.microsoft.com/office/drawing/2016/5/9/chartex" xmlns:cx4="http://schemas.microsoft.com/office/drawing/2016/5/10/chartex" xmlns:cx5="http://schemas.microsoft.com/office/drawing/2016/5/11/chartex" xmlns:cx6="http://schemas.microsoft.com/office/drawing/2016/5/12/chartex" xmlns:cx7="http://schemas.microsoft.com/office/drawing/2016/5/13/chartex" xmlns:cx8="http://schemas.microsoft.com/office/drawing/2016/5/14/chartex" xmlns:mc="http://schemas.openxmlformats.org/markup-compatibility/2006" xmlns:m="http://schemas.openxmlformats.org/officeDocument/2006/math" xmlns:aink="http://schemas.microsoft.com/office/drawing/2016/ink" xmlns:am3d="http://schemas.microsoft.com/office/drawing/2017/model3d" xmlns:oel="http://schemas.microsoft.com/office/2019/extlst" xmlns:r="http://schemas.openxmlformats.org/officeDocument/2006/relationships" xmlns:wp14="http://schemas.microsoft.com/office/word/2010/wordprocessingDrawing" xmlns:wp="http://schemas.openxmlformats.org/drawingml/2006/wordprocessingDrawing" xmlns:wpg="http://schemas.microsoft.com/office/word/2010/wordprocessingGroup" xmlns:wpi="http://schemas.microsoft.com/office/word/2010/wordprocessingInk" xmlns:wps="http://schemas.microsoft.com/office/word/2010/wordprocessingShape" xmlns:o="urn:schemas-microsoft-com:office:office" xmlns:v="urn:schemas-microsoft-com:vml" xmlns:w10="urn:schemas-microsoft-com:office:word" xmlns:w="http://schemas.openxmlformats.org/wordprocessingml/2006/main" xmlns:w14="http://schemas.microsoft.com/office/word/2010/wordml" xmlns:w15="http://schemas.microsoft.com/office/word/2012/wordml" xmlns:w16cex="http://schemas.microsoft.com/office/word/2018/wordml/cex" xmlns:w16cid="http://schemas.microsoft.com/office/word/2016/wordml/cid" xmlns:w16="http://schemas.microsoft.com/office/word/2018/wordml" xmlns:w16sdtdh="http://schemas.microsoft.com/office/word/2020/wordml/sdtdatahash" xmlns:w16sdtfl="http://schemas.microsoft.com/office/word/2024/wordml/sdtformatlock" xmlns:w16se="http://schemas.microsoft.com/office/word/2015/wordml/symex" xmlns:w16du="http://schemas.microsoft.com/office/word/2023/wordml/word16du" xmlns:wne="http://schemas.microsoft.com/office/word/2006/wordml" mc:Ignorable="w14 w15 w16se w16cid w16 w16cex w16sdtdh w16sdtfl w16du wp14">
-  <w15:person w15:author="Kristy Natasha">
-    <w15:presenceInfo w15:providerId="Windows Live" w15:userId="ad2cc11aa85b65bf"/>
-  </w15:person>
-</w15:people>
 </file>
 
 <file path=word/styles.xml><?xml version="1.0" encoding="utf-8"?>

</xml_diff>

<commit_message>
docs: update remove unecessary wording for word limit
</commit_message>
<xml_diff>
--- a/deliverables/nny124-final-report.docx
+++ b/deliverables/nny124-final-report.docx
@@ -348,38 +348,22 @@
         <w:pStyle w:val="Heading1"/>
       </w:pPr>
       <w:bookmarkStart w:id="0" w:name="_Toc238151068"/>
-      <w:bookmarkStart w:id="1" w:name="_Toc238639490"/>
+      <w:bookmarkStart w:id="1" w:name="_Toc238714721"/>
+      <w:bookmarkStart w:id="2" w:name="_Toc238714813"/>
       <w:r>
         <w:lastRenderedPageBreak/>
         <w:t>Table of Contents</w:t>
       </w:r>
       <w:bookmarkEnd w:id="0"/>
       <w:bookmarkEnd w:id="1"/>
-      <w:r>
-        <w:rPr>
-          <w:b w:val="0"/>
-          <w:bCs w:val="0"/>
-          <w:sz w:val="24"/>
-          <w:szCs w:val="24"/>
-        </w:rPr>
+      <w:bookmarkEnd w:id="2"/>
+      <w:r>
         <w:fldChar w:fldCharType="begin"/>
       </w:r>
       <w:r>
-        <w:rPr>
-          <w:b w:val="0"/>
-          <w:bCs w:val="0"/>
-          <w:sz w:val="24"/>
-          <w:szCs w:val="24"/>
-        </w:rPr>
         <w:instrText xml:space="preserve"> TOC \o "1-3" \h \z \u </w:instrText>
       </w:r>
       <w:r>
-        <w:rPr>
-          <w:b w:val="0"/>
-          <w:bCs w:val="0"/>
-          <w:sz w:val="24"/>
-          <w:szCs w:val="24"/>
-        </w:rPr>
         <w:fldChar w:fldCharType="separate"/>
       </w:r>
     </w:p>
@@ -396,12 +380,12 @@
           <w14:ligatures w14:val="standardContextual"/>
         </w:rPr>
       </w:pPr>
-      <w:hyperlink w:anchor="_Toc238639490" w:history="1">
+      <w:hyperlink w:anchor="_Toc238714814" w:history="1">
         <w:r>
           <w:rPr>
             <w:rStyle w:val="Hyperlink"/>
           </w:rPr>
-          <w:t>Table of Contents</w:t>
+          <w:t>List of Tables</w:t>
         </w:r>
         <w:r>
           <w:rPr>
@@ -419,7 +403,7 @@
           <w:rPr>
             <w:webHidden/>
           </w:rPr>
-          <w:instrText xml:space="preserve"> PAGEREF _Toc238639490 \h </w:instrText>
+          <w:instrText xml:space="preserve"> PAGEREF _Toc238714814 \h </w:instrText>
         </w:r>
         <w:r>
           <w:rPr>
@@ -436,7 +420,7 @@
           <w:rPr>
             <w:webHidden/>
           </w:rPr>
-          <w:t>1</w:t>
+          <w:t>2</w:t>
         </w:r>
         <w:r>
           <w:rPr>
@@ -459,12 +443,12 @@
           <w14:ligatures w14:val="standardContextual"/>
         </w:rPr>
       </w:pPr>
-      <w:hyperlink w:anchor="_Toc238639491" w:history="1">
+      <w:hyperlink w:anchor="_Toc238714815" w:history="1">
         <w:r>
           <w:rPr>
             <w:rStyle w:val="Hyperlink"/>
           </w:rPr>
-          <w:t>List of Tables</w:t>
+          <w:t>List of Figures</w:t>
         </w:r>
         <w:r>
           <w:rPr>
@@ -482,7 +466,7 @@
           <w:rPr>
             <w:webHidden/>
           </w:rPr>
-          <w:instrText xml:space="preserve"> PAGEREF _Toc238639491 \h </w:instrText>
+          <w:instrText xml:space="preserve"> PAGEREF _Toc238714815 \h </w:instrText>
         </w:r>
         <w:r>
           <w:rPr>
@@ -522,12 +506,12 @@
           <w14:ligatures w14:val="standardContextual"/>
         </w:rPr>
       </w:pPr>
-      <w:hyperlink w:anchor="_Toc238639492" w:history="1">
+      <w:hyperlink w:anchor="_Toc238714816" w:history="1">
         <w:r>
           <w:rPr>
             <w:rStyle w:val="Hyperlink"/>
           </w:rPr>
-          <w:t>List of Figures</w:t>
+          <w:t>1. Introduction</w:t>
         </w:r>
         <w:r>
           <w:rPr>
@@ -545,7 +529,7 @@
           <w:rPr>
             <w:webHidden/>
           </w:rPr>
-          <w:instrText xml:space="preserve"> PAGEREF _Toc238639492 \h </w:instrText>
+          <w:instrText xml:space="preserve"> PAGEREF _Toc238714816 \h </w:instrText>
         </w:r>
         <w:r>
           <w:rPr>
@@ -562,7 +546,196 @@
           <w:rPr>
             <w:webHidden/>
           </w:rPr>
-          <w:t>2</w:t>
+          <w:t>3</w:t>
+        </w:r>
+        <w:r>
+          <w:rPr>
+            <w:webHidden/>
+          </w:rPr>
+          <w:fldChar w:fldCharType="end"/>
+        </w:r>
+      </w:hyperlink>
+    </w:p>
+    <w:p>
+      <w:pPr>
+        <w:pStyle w:val="TOC2"/>
+        <w:tabs>
+          <w:tab w:val="right" w:leader="dot" w:pos="9350"/>
+        </w:tabs>
+        <w:rPr>
+          <w:rFonts w:asciiTheme="minorHAnsi" w:eastAsiaTheme="minorEastAsia" w:hAnsiTheme="minorHAnsi" w:cstheme="minorBidi"/>
+          <w:kern w:val="2"/>
+          <w:lang w:val="en-US"/>
+          <w14:ligatures w14:val="standardContextual"/>
+        </w:rPr>
+      </w:pPr>
+      <w:hyperlink w:anchor="_Toc238714817" w:history="1">
+        <w:r>
+          <w:rPr>
+            <w:rStyle w:val="Hyperlink"/>
+          </w:rPr>
+          <w:t>1.1 Research Problem and Questions</w:t>
+        </w:r>
+        <w:r>
+          <w:rPr>
+            <w:webHidden/>
+          </w:rPr>
+          <w:tab/>
+        </w:r>
+        <w:r>
+          <w:rPr>
+            <w:webHidden/>
+          </w:rPr>
+          <w:fldChar w:fldCharType="begin"/>
+        </w:r>
+        <w:r>
+          <w:rPr>
+            <w:webHidden/>
+          </w:rPr>
+          <w:instrText xml:space="preserve"> PAGEREF _Toc238714817 \h </w:instrText>
+        </w:r>
+        <w:r>
+          <w:rPr>
+            <w:webHidden/>
+          </w:rPr>
+        </w:r>
+        <w:r>
+          <w:rPr>
+            <w:webHidden/>
+          </w:rPr>
+          <w:fldChar w:fldCharType="separate"/>
+        </w:r>
+        <w:r>
+          <w:rPr>
+            <w:webHidden/>
+          </w:rPr>
+          <w:t>3</w:t>
+        </w:r>
+        <w:r>
+          <w:rPr>
+            <w:webHidden/>
+          </w:rPr>
+          <w:fldChar w:fldCharType="end"/>
+        </w:r>
+      </w:hyperlink>
+    </w:p>
+    <w:p>
+      <w:pPr>
+        <w:pStyle w:val="TOC2"/>
+        <w:tabs>
+          <w:tab w:val="right" w:leader="dot" w:pos="9350"/>
+        </w:tabs>
+        <w:rPr>
+          <w:rFonts w:asciiTheme="minorHAnsi" w:eastAsiaTheme="minorEastAsia" w:hAnsiTheme="minorHAnsi" w:cstheme="minorBidi"/>
+          <w:kern w:val="2"/>
+          <w:lang w:val="en-US"/>
+          <w14:ligatures w14:val="standardContextual"/>
+        </w:rPr>
+      </w:pPr>
+      <w:hyperlink w:anchor="_Toc238714818" w:history="1">
+        <w:r>
+          <w:rPr>
+            <w:rStyle w:val="Hyperlink"/>
+          </w:rPr>
+          <w:t>1.2 Significance and Originality</w:t>
+        </w:r>
+        <w:r>
+          <w:rPr>
+            <w:webHidden/>
+          </w:rPr>
+          <w:tab/>
+        </w:r>
+        <w:r>
+          <w:rPr>
+            <w:webHidden/>
+          </w:rPr>
+          <w:fldChar w:fldCharType="begin"/>
+        </w:r>
+        <w:r>
+          <w:rPr>
+            <w:webHidden/>
+          </w:rPr>
+          <w:instrText xml:space="preserve"> PAGEREF _Toc238714818 \h </w:instrText>
+        </w:r>
+        <w:r>
+          <w:rPr>
+            <w:webHidden/>
+          </w:rPr>
+        </w:r>
+        <w:r>
+          <w:rPr>
+            <w:webHidden/>
+          </w:rPr>
+          <w:fldChar w:fldCharType="separate"/>
+        </w:r>
+        <w:r>
+          <w:rPr>
+            <w:webHidden/>
+          </w:rPr>
+          <w:t>4</w:t>
+        </w:r>
+        <w:r>
+          <w:rPr>
+            <w:webHidden/>
+          </w:rPr>
+          <w:fldChar w:fldCharType="end"/>
+        </w:r>
+      </w:hyperlink>
+    </w:p>
+    <w:p>
+      <w:pPr>
+        <w:pStyle w:val="TOC2"/>
+        <w:tabs>
+          <w:tab w:val="right" w:leader="dot" w:pos="9350"/>
+        </w:tabs>
+        <w:rPr>
+          <w:rFonts w:asciiTheme="minorHAnsi" w:eastAsiaTheme="minorEastAsia" w:hAnsiTheme="minorHAnsi" w:cstheme="minorBidi"/>
+          <w:kern w:val="2"/>
+          <w:lang w:val="en-US"/>
+          <w14:ligatures w14:val="standardContextual"/>
+        </w:rPr>
+      </w:pPr>
+      <w:hyperlink w:anchor="_Toc238714819" w:history="1">
+        <w:r>
+          <w:rPr>
+            <w:rStyle w:val="Hyperlink"/>
+          </w:rPr>
+          <w:t>1.3 Literature Review and Research Gaps</w:t>
+        </w:r>
+        <w:r>
+          <w:rPr>
+            <w:webHidden/>
+          </w:rPr>
+          <w:tab/>
+        </w:r>
+        <w:r>
+          <w:rPr>
+            <w:webHidden/>
+          </w:rPr>
+          <w:fldChar w:fldCharType="begin"/>
+        </w:r>
+        <w:r>
+          <w:rPr>
+            <w:webHidden/>
+          </w:rPr>
+          <w:instrText xml:space="preserve"> PAGEREF _Toc238714819 \h </w:instrText>
+        </w:r>
+        <w:r>
+          <w:rPr>
+            <w:webHidden/>
+          </w:rPr>
+        </w:r>
+        <w:r>
+          <w:rPr>
+            <w:webHidden/>
+          </w:rPr>
+          <w:fldChar w:fldCharType="separate"/>
+        </w:r>
+        <w:r>
+          <w:rPr>
+            <w:webHidden/>
+          </w:rPr>
+          <w:t>4</w:t>
         </w:r>
         <w:r>
           <w:rPr>
@@ -585,12 +758,12 @@
           <w14:ligatures w14:val="standardContextual"/>
         </w:rPr>
       </w:pPr>
-      <w:hyperlink w:anchor="_Toc238639493" w:history="1">
+      <w:hyperlink w:anchor="_Toc238714820" w:history="1">
         <w:r>
           <w:rPr>
             <w:rStyle w:val="Hyperlink"/>
           </w:rPr>
-          <w:t>1. Introduction</w:t>
+          <w:t>2. Methodology</w:t>
         </w:r>
         <w:r>
           <w:rPr>
@@ -608,7 +781,7 @@
           <w:rPr>
             <w:webHidden/>
           </w:rPr>
-          <w:instrText xml:space="preserve"> PAGEREF _Toc238639493 \h </w:instrText>
+          <w:instrText xml:space="preserve"> PAGEREF _Toc238714820 \h </w:instrText>
         </w:r>
         <w:r>
           <w:rPr>
@@ -625,7 +798,7 @@
           <w:rPr>
             <w:webHidden/>
           </w:rPr>
-          <w:t>3</w:t>
+          <w:t>5</w:t>
         </w:r>
         <w:r>
           <w:rPr>
@@ -648,12 +821,12 @@
           <w14:ligatures w14:val="standardContextual"/>
         </w:rPr>
       </w:pPr>
-      <w:hyperlink w:anchor="_Toc238639494" w:history="1">
+      <w:hyperlink w:anchor="_Toc238714821" w:history="1">
         <w:r>
           <w:rPr>
             <w:rStyle w:val="Hyperlink"/>
           </w:rPr>
-          <w:t>1.1 Research Problem and Questions</w:t>
+          <w:t>2.1 Data Archive, Inputs, and Post-Processing</w:t>
         </w:r>
         <w:r>
           <w:rPr>
@@ -671,7 +844,7 @@
           <w:rPr>
             <w:webHidden/>
           </w:rPr>
-          <w:instrText xml:space="preserve"> PAGEREF _Toc238639494 \h </w:instrText>
+          <w:instrText xml:space="preserve"> PAGEREF _Toc238714821 \h </w:instrText>
         </w:r>
         <w:r>
           <w:rPr>
@@ -688,7 +861,7 @@
           <w:rPr>
             <w:webHidden/>
           </w:rPr>
-          <w:t>3</w:t>
+          <w:t>5</w:t>
         </w:r>
         <w:r>
           <w:rPr>
@@ -711,12 +884,12 @@
           <w14:ligatures w14:val="standardContextual"/>
         </w:rPr>
       </w:pPr>
-      <w:hyperlink w:anchor="_Toc238639495" w:history="1">
+      <w:hyperlink w:anchor="_Toc238714822" w:history="1">
         <w:r>
           <w:rPr>
             <w:rStyle w:val="Hyperlink"/>
           </w:rPr>
-          <w:t>1.2 Significance and Originality</w:t>
+          <w:t>2.2 Prediction Model Choices and Rationale</w:t>
         </w:r>
         <w:r>
           <w:rPr>
@@ -734,7 +907,7 @@
           <w:rPr>
             <w:webHidden/>
           </w:rPr>
-          <w:instrText xml:space="preserve"> PAGEREF _Toc238639495 \h </w:instrText>
+          <w:instrText xml:space="preserve"> PAGEREF _Toc238714822 \h </w:instrText>
         </w:r>
         <w:r>
           <w:rPr>
@@ -751,7 +924,7 @@
           <w:rPr>
             <w:webHidden/>
           </w:rPr>
-          <w:t>4</w:t>
+          <w:t>6</w:t>
         </w:r>
         <w:r>
           <w:rPr>
@@ -774,12 +947,12 @@
           <w14:ligatures w14:val="standardContextual"/>
         </w:rPr>
       </w:pPr>
-      <w:hyperlink w:anchor="_Toc238639496" w:history="1">
+      <w:hyperlink w:anchor="_Toc238714823" w:history="1">
         <w:r>
           <w:rPr>
             <w:rStyle w:val="Hyperlink"/>
           </w:rPr>
-          <w:t>1.3 Literature Review and Research Gaps</w:t>
+          <w:t>2.3 Model Testing and Performance Metrics</w:t>
         </w:r>
         <w:r>
           <w:rPr>
@@ -797,7 +970,7 @@
           <w:rPr>
             <w:webHidden/>
           </w:rPr>
-          <w:instrText xml:space="preserve"> PAGEREF _Toc238639496 \h </w:instrText>
+          <w:instrText xml:space="preserve"> PAGEREF _Toc238714823 \h </w:instrText>
         </w:r>
         <w:r>
           <w:rPr>
@@ -814,7 +987,133 @@
           <w:rPr>
             <w:webHidden/>
           </w:rPr>
-          <w:t>4</w:t>
+          <w:t>7</w:t>
+        </w:r>
+        <w:r>
+          <w:rPr>
+            <w:webHidden/>
+          </w:rPr>
+          <w:fldChar w:fldCharType="end"/>
+        </w:r>
+      </w:hyperlink>
+    </w:p>
+    <w:p>
+      <w:pPr>
+        <w:pStyle w:val="TOC2"/>
+        <w:tabs>
+          <w:tab w:val="right" w:leader="dot" w:pos="9350"/>
+        </w:tabs>
+        <w:rPr>
+          <w:rFonts w:asciiTheme="minorHAnsi" w:eastAsiaTheme="minorEastAsia" w:hAnsiTheme="minorHAnsi" w:cstheme="minorBidi"/>
+          <w:kern w:val="2"/>
+          <w:lang w:val="en-US"/>
+          <w14:ligatures w14:val="standardContextual"/>
+        </w:rPr>
+      </w:pPr>
+      <w:hyperlink w:anchor="_Toc238714824" w:history="1">
+        <w:r>
+          <w:rPr>
+            <w:rStyle w:val="Hyperlink"/>
+          </w:rPr>
+          <w:t>2.4 How the Physical Effects Were Analysed</w:t>
+        </w:r>
+        <w:r>
+          <w:rPr>
+            <w:webHidden/>
+          </w:rPr>
+          <w:tab/>
+        </w:r>
+        <w:r>
+          <w:rPr>
+            <w:webHidden/>
+          </w:rPr>
+          <w:fldChar w:fldCharType="begin"/>
+        </w:r>
+        <w:r>
+          <w:rPr>
+            <w:webHidden/>
+          </w:rPr>
+          <w:instrText xml:space="preserve"> PAGEREF _Toc238714824 \h </w:instrText>
+        </w:r>
+        <w:r>
+          <w:rPr>
+            <w:webHidden/>
+          </w:rPr>
+        </w:r>
+        <w:r>
+          <w:rPr>
+            <w:webHidden/>
+          </w:rPr>
+          <w:fldChar w:fldCharType="separate"/>
+        </w:r>
+        <w:r>
+          <w:rPr>
+            <w:webHidden/>
+          </w:rPr>
+          <w:t>7</w:t>
+        </w:r>
+        <w:r>
+          <w:rPr>
+            <w:webHidden/>
+          </w:rPr>
+          <w:fldChar w:fldCharType="end"/>
+        </w:r>
+      </w:hyperlink>
+    </w:p>
+    <w:p>
+      <w:pPr>
+        <w:pStyle w:val="TOC2"/>
+        <w:tabs>
+          <w:tab w:val="right" w:leader="dot" w:pos="9350"/>
+        </w:tabs>
+        <w:rPr>
+          <w:rFonts w:asciiTheme="minorHAnsi" w:eastAsiaTheme="minorEastAsia" w:hAnsiTheme="minorHAnsi" w:cstheme="minorBidi"/>
+          <w:kern w:val="2"/>
+          <w:lang w:val="en-US"/>
+          <w14:ligatures w14:val="standardContextual"/>
+        </w:rPr>
+      </w:pPr>
+      <w:hyperlink w:anchor="_Toc238714825" w:history="1">
+        <w:r>
+          <w:rPr>
+            <w:rStyle w:val="Hyperlink"/>
+          </w:rPr>
+          <w:t>2.5 When to Trust the Model</w:t>
+        </w:r>
+        <w:r>
+          <w:rPr>
+            <w:webHidden/>
+          </w:rPr>
+          <w:tab/>
+        </w:r>
+        <w:r>
+          <w:rPr>
+            <w:webHidden/>
+          </w:rPr>
+          <w:fldChar w:fldCharType="begin"/>
+        </w:r>
+        <w:r>
+          <w:rPr>
+            <w:webHidden/>
+          </w:rPr>
+          <w:instrText xml:space="preserve"> PAGEREF _Toc238714825 \h </w:instrText>
+        </w:r>
+        <w:r>
+          <w:rPr>
+            <w:webHidden/>
+          </w:rPr>
+        </w:r>
+        <w:r>
+          <w:rPr>
+            <w:webHidden/>
+          </w:rPr>
+          <w:fldChar w:fldCharType="separate"/>
+        </w:r>
+        <w:r>
+          <w:rPr>
+            <w:webHidden/>
+          </w:rPr>
+          <w:t>7</w:t>
         </w:r>
         <w:r>
           <w:rPr>
@@ -837,12 +1136,12 @@
           <w14:ligatures w14:val="standardContextual"/>
         </w:rPr>
       </w:pPr>
-      <w:hyperlink w:anchor="_Toc238639497" w:history="1">
+      <w:hyperlink w:anchor="_Toc238714826" w:history="1">
         <w:r>
           <w:rPr>
             <w:rStyle w:val="Hyperlink"/>
           </w:rPr>
-          <w:t>2. Methodology</w:t>
+          <w:t>3. Results</w:t>
         </w:r>
         <w:r>
           <w:rPr>
@@ -860,7 +1159,7 @@
           <w:rPr>
             <w:webHidden/>
           </w:rPr>
-          <w:instrText xml:space="preserve"> PAGEREF _Toc238639497 \h </w:instrText>
+          <w:instrText xml:space="preserve"> PAGEREF _Toc238714826 \h </w:instrText>
         </w:r>
         <w:r>
           <w:rPr>
@@ -877,7 +1176,7 @@
           <w:rPr>
             <w:webHidden/>
           </w:rPr>
-          <w:t>5</w:t>
+          <w:t>8</w:t>
         </w:r>
         <w:r>
           <w:rPr>
@@ -900,12 +1199,12 @@
           <w14:ligatures w14:val="standardContextual"/>
         </w:rPr>
       </w:pPr>
-      <w:hyperlink w:anchor="_Toc238639498" w:history="1">
+      <w:hyperlink w:anchor="_Toc238714827" w:history="1">
         <w:r>
           <w:rPr>
             <w:rStyle w:val="Hyperlink"/>
           </w:rPr>
-          <w:t>2.1 Data Archive, Inputs, and Post-Processing</w:t>
+          <w:t>3.1 Exploratory Physical Trends</w:t>
         </w:r>
         <w:r>
           <w:rPr>
@@ -923,7 +1222,7 @@
           <w:rPr>
             <w:webHidden/>
           </w:rPr>
-          <w:instrText xml:space="preserve"> PAGEREF _Toc238639498 \h </w:instrText>
+          <w:instrText xml:space="preserve"> PAGEREF _Toc238714827 \h </w:instrText>
         </w:r>
         <w:r>
           <w:rPr>
@@ -940,7 +1239,7 @@
           <w:rPr>
             <w:webHidden/>
           </w:rPr>
-          <w:t>5</w:t>
+          <w:t>8</w:t>
         </w:r>
         <w:r>
           <w:rPr>
@@ -963,12 +1262,12 @@
           <w14:ligatures w14:val="standardContextual"/>
         </w:rPr>
       </w:pPr>
-      <w:hyperlink w:anchor="_Toc238639499" w:history="1">
+      <w:hyperlink w:anchor="_Toc238714828" w:history="1">
         <w:r>
           <w:rPr>
             <w:rStyle w:val="Hyperlink"/>
           </w:rPr>
-          <w:t>2.2 Prediction Model Choices and Rationale</w:t>
+          <w:t>3.2 Eccentricity and Bound Retention</w:t>
         </w:r>
         <w:r>
           <w:rPr>
@@ -986,7 +1285,7 @@
           <w:rPr>
             <w:webHidden/>
           </w:rPr>
-          <w:instrText xml:space="preserve"> PAGEREF _Toc238639499 \h </w:instrText>
+          <w:instrText xml:space="preserve"> PAGEREF _Toc238714828 \h </w:instrText>
         </w:r>
         <w:r>
           <w:rPr>
@@ -1003,7 +1302,7 @@
           <w:rPr>
             <w:webHidden/>
           </w:rPr>
-          <w:t>6</w:t>
+          <w:t>9</w:t>
         </w:r>
         <w:r>
           <w:rPr>
@@ -1026,12 +1325,12 @@
           <w14:ligatures w14:val="standardContextual"/>
         </w:rPr>
       </w:pPr>
-      <w:hyperlink w:anchor="_Toc238639500" w:history="1">
+      <w:hyperlink w:anchor="_Toc238714829" w:history="1">
         <w:r>
           <w:rPr>
             <w:rStyle w:val="Hyperlink"/>
           </w:rPr>
-          <w:t>2.3 Model Testing and Performance Metrics</w:t>
+          <w:t>3.3 Model Performance and Screening Use</w:t>
         </w:r>
         <w:r>
           <w:rPr>
@@ -1049,7 +1348,7 @@
           <w:rPr>
             <w:webHidden/>
           </w:rPr>
-          <w:instrText xml:space="preserve"> PAGEREF _Toc238639500 \h </w:instrText>
+          <w:instrText xml:space="preserve"> PAGEREF _Toc238714829 \h </w:instrText>
         </w:r>
         <w:r>
           <w:rPr>
@@ -1066,7 +1365,7 @@
           <w:rPr>
             <w:webHidden/>
           </w:rPr>
-          <w:t>7</w:t>
+          <w:t>10</w:t>
         </w:r>
         <w:r>
           <w:rPr>
@@ -1089,12 +1388,12 @@
           <w14:ligatures w14:val="standardContextual"/>
         </w:rPr>
       </w:pPr>
-      <w:hyperlink w:anchor="_Toc238639501" w:history="1">
+      <w:hyperlink w:anchor="_Toc238714830" w:history="1">
         <w:r>
           <w:rPr>
             <w:rStyle w:val="Hyperlink"/>
           </w:rPr>
-          <w:t>2.4 How the Physical Effects Were Analysed</w:t>
+          <w:t>3.4 Overall Physical Parameter Importance</w:t>
         </w:r>
         <w:r>
           <w:rPr>
@@ -1112,7 +1411,7 @@
           <w:rPr>
             <w:webHidden/>
           </w:rPr>
-          <w:instrText xml:space="preserve"> PAGEREF _Toc238639501 \h </w:instrText>
+          <w:instrText xml:space="preserve"> PAGEREF _Toc238714830 \h </w:instrText>
         </w:r>
         <w:r>
           <w:rPr>
@@ -1129,7 +1428,7 @@
           <w:rPr>
             <w:webHidden/>
           </w:rPr>
-          <w:t>7</w:t>
+          <w:t>11</w:t>
         </w:r>
         <w:r>
           <w:rPr>
@@ -1152,12 +1451,12 @@
           <w14:ligatures w14:val="standardContextual"/>
         </w:rPr>
       </w:pPr>
-      <w:hyperlink w:anchor="_Toc238639502" w:history="1">
+      <w:hyperlink w:anchor="_Toc238714831" w:history="1">
         <w:r>
           <w:rPr>
             <w:rStyle w:val="Hyperlink"/>
           </w:rPr>
-          <w:t>2.5 When to Trust the Model</w:t>
+          <w:t>3.5 Checking Physical Trends and Condition-Dependent Effects</w:t>
         </w:r>
         <w:r>
           <w:rPr>
@@ -1175,7 +1474,7 @@
           <w:rPr>
             <w:webHidden/>
           </w:rPr>
-          <w:instrText xml:space="preserve"> PAGEREF _Toc238639502 \h </w:instrText>
+          <w:instrText xml:space="preserve"> PAGEREF _Toc238714831 \h </w:instrText>
         </w:r>
         <w:r>
           <w:rPr>
@@ -1192,7 +1491,133 @@
           <w:rPr>
             <w:webHidden/>
           </w:rPr>
-          <w:t>7</w:t>
+          <w:t>11</w:t>
+        </w:r>
+        <w:r>
+          <w:rPr>
+            <w:webHidden/>
+          </w:rPr>
+          <w:fldChar w:fldCharType="end"/>
+        </w:r>
+      </w:hyperlink>
+    </w:p>
+    <w:p>
+      <w:pPr>
+        <w:pStyle w:val="TOC2"/>
+        <w:tabs>
+          <w:tab w:val="right" w:leader="dot" w:pos="9350"/>
+        </w:tabs>
+        <w:rPr>
+          <w:rFonts w:asciiTheme="minorHAnsi" w:eastAsiaTheme="minorEastAsia" w:hAnsiTheme="minorHAnsi" w:cstheme="minorBidi"/>
+          <w:kern w:val="2"/>
+          <w:lang w:val="en-US"/>
+          <w14:ligatures w14:val="standardContextual"/>
+        </w:rPr>
+      </w:pPr>
+      <w:hyperlink w:anchor="_Toc238714832" w:history="1">
+        <w:r>
+          <w:rPr>
+            <w:rStyle w:val="Hyperlink"/>
+          </w:rPr>
+          <w:t>3.6 Where the Model Can and Cannot Be Trusted</w:t>
+        </w:r>
+        <w:r>
+          <w:rPr>
+            <w:webHidden/>
+          </w:rPr>
+          <w:tab/>
+        </w:r>
+        <w:r>
+          <w:rPr>
+            <w:webHidden/>
+          </w:rPr>
+          <w:fldChar w:fldCharType="begin"/>
+        </w:r>
+        <w:r>
+          <w:rPr>
+            <w:webHidden/>
+          </w:rPr>
+          <w:instrText xml:space="preserve"> PAGEREF _Toc238714832 \h </w:instrText>
+        </w:r>
+        <w:r>
+          <w:rPr>
+            <w:webHidden/>
+          </w:rPr>
+        </w:r>
+        <w:r>
+          <w:rPr>
+            <w:webHidden/>
+          </w:rPr>
+          <w:fldChar w:fldCharType="separate"/>
+        </w:r>
+        <w:r>
+          <w:rPr>
+            <w:webHidden/>
+          </w:rPr>
+          <w:t>13</w:t>
+        </w:r>
+        <w:r>
+          <w:rPr>
+            <w:webHidden/>
+          </w:rPr>
+          <w:fldChar w:fldCharType="end"/>
+        </w:r>
+      </w:hyperlink>
+    </w:p>
+    <w:p>
+      <w:pPr>
+        <w:pStyle w:val="TOC2"/>
+        <w:tabs>
+          <w:tab w:val="right" w:leader="dot" w:pos="9350"/>
+        </w:tabs>
+        <w:rPr>
+          <w:rFonts w:asciiTheme="minorHAnsi" w:eastAsiaTheme="minorEastAsia" w:hAnsiTheme="minorHAnsi" w:cstheme="minorBidi"/>
+          <w:kern w:val="2"/>
+          <w:lang w:val="en-US"/>
+          <w14:ligatures w14:val="standardContextual"/>
+        </w:rPr>
+      </w:pPr>
+      <w:hyperlink w:anchor="_Toc238714833" w:history="1">
+        <w:r>
+          <w:rPr>
+            <w:rStyle w:val="Hyperlink"/>
+          </w:rPr>
+          <w:t>3.7 How the Model Supports SPH Decisions</w:t>
+        </w:r>
+        <w:r>
+          <w:rPr>
+            <w:webHidden/>
+          </w:rPr>
+          <w:tab/>
+        </w:r>
+        <w:r>
+          <w:rPr>
+            <w:webHidden/>
+          </w:rPr>
+          <w:fldChar w:fldCharType="begin"/>
+        </w:r>
+        <w:r>
+          <w:rPr>
+            <w:webHidden/>
+          </w:rPr>
+          <w:instrText xml:space="preserve"> PAGEREF _Toc238714833 \h </w:instrText>
+        </w:r>
+        <w:r>
+          <w:rPr>
+            <w:webHidden/>
+          </w:rPr>
+        </w:r>
+        <w:r>
+          <w:rPr>
+            <w:webHidden/>
+          </w:rPr>
+          <w:fldChar w:fldCharType="separate"/>
+        </w:r>
+        <w:r>
+          <w:rPr>
+            <w:webHidden/>
+          </w:rPr>
+          <w:t>15</w:t>
         </w:r>
         <w:r>
           <w:rPr>
@@ -1215,12 +1640,12 @@
           <w14:ligatures w14:val="standardContextual"/>
         </w:rPr>
       </w:pPr>
-      <w:hyperlink w:anchor="_Toc238639503" w:history="1">
+      <w:hyperlink w:anchor="_Toc238714834" w:history="1">
         <w:r>
           <w:rPr>
             <w:rStyle w:val="Hyperlink"/>
           </w:rPr>
-          <w:t>3. Results</w:t>
+          <w:t>4. Discussion</w:t>
         </w:r>
         <w:r>
           <w:rPr>
@@ -1238,7 +1663,7 @@
           <w:rPr>
             <w:webHidden/>
           </w:rPr>
-          <w:instrText xml:space="preserve"> PAGEREF _Toc238639503 \h </w:instrText>
+          <w:instrText xml:space="preserve"> PAGEREF _Toc238714834 \h </w:instrText>
         </w:r>
         <w:r>
           <w:rPr>
@@ -1255,7 +1680,70 @@
           <w:rPr>
             <w:webHidden/>
           </w:rPr>
-          <w:t>8</w:t>
+          <w:t>15</w:t>
+        </w:r>
+        <w:r>
+          <w:rPr>
+            <w:webHidden/>
+          </w:rPr>
+          <w:fldChar w:fldCharType="end"/>
+        </w:r>
+      </w:hyperlink>
+    </w:p>
+    <w:p>
+      <w:pPr>
+        <w:pStyle w:val="TOC1"/>
+        <w:tabs>
+          <w:tab w:val="right" w:leader="dot" w:pos="9350"/>
+        </w:tabs>
+        <w:rPr>
+          <w:rFonts w:asciiTheme="minorHAnsi" w:eastAsiaTheme="minorEastAsia" w:hAnsiTheme="minorHAnsi" w:cstheme="minorBidi"/>
+          <w:kern w:val="2"/>
+          <w:lang w:val="en-US"/>
+          <w14:ligatures w14:val="standardContextual"/>
+        </w:rPr>
+      </w:pPr>
+      <w:hyperlink w:anchor="_Toc238714835" w:history="1">
+        <w:r>
+          <w:rPr>
+            <w:rStyle w:val="Hyperlink"/>
+          </w:rPr>
+          <w:t>5. Conclusions, Limitations and Future Work</w:t>
+        </w:r>
+        <w:r>
+          <w:rPr>
+            <w:webHidden/>
+          </w:rPr>
+          <w:tab/>
+        </w:r>
+        <w:r>
+          <w:rPr>
+            <w:webHidden/>
+          </w:rPr>
+          <w:fldChar w:fldCharType="begin"/>
+        </w:r>
+        <w:r>
+          <w:rPr>
+            <w:webHidden/>
+          </w:rPr>
+          <w:instrText xml:space="preserve"> PAGEREF _Toc238714835 \h </w:instrText>
+        </w:r>
+        <w:r>
+          <w:rPr>
+            <w:webHidden/>
+          </w:rPr>
+        </w:r>
+        <w:r>
+          <w:rPr>
+            <w:webHidden/>
+          </w:rPr>
+          <w:fldChar w:fldCharType="separate"/>
+        </w:r>
+        <w:r>
+          <w:rPr>
+            <w:webHidden/>
+          </w:rPr>
+          <w:t>16</w:t>
         </w:r>
         <w:r>
           <w:rPr>
@@ -1278,12 +1766,12 @@
           <w14:ligatures w14:val="standardContextual"/>
         </w:rPr>
       </w:pPr>
-      <w:hyperlink w:anchor="_Toc238639504" w:history="1">
+      <w:hyperlink w:anchor="_Toc238714836" w:history="1">
         <w:r>
           <w:rPr>
             <w:rStyle w:val="Hyperlink"/>
           </w:rPr>
-          <w:t>3.1 Exploratory Physical Trends</w:t>
+          <w:t>5.1 Conclusions and Answers to the Research Questions</w:t>
         </w:r>
         <w:r>
           <w:rPr>
@@ -1301,7 +1789,7 @@
           <w:rPr>
             <w:webHidden/>
           </w:rPr>
-          <w:instrText xml:space="preserve"> PAGEREF _Toc238639504 \h </w:instrText>
+          <w:instrText xml:space="preserve"> PAGEREF _Toc238714836 \h </w:instrText>
         </w:r>
         <w:r>
           <w:rPr>
@@ -1318,7 +1806,7 @@
           <w:rPr>
             <w:webHidden/>
           </w:rPr>
-          <w:t>8</w:t>
+          <w:t>16</w:t>
         </w:r>
         <w:r>
           <w:rPr>
@@ -1341,12 +1829,12 @@
           <w14:ligatures w14:val="standardContextual"/>
         </w:rPr>
       </w:pPr>
-      <w:hyperlink w:anchor="_Toc238639505" w:history="1">
+      <w:hyperlink w:anchor="_Toc238714837" w:history="1">
         <w:r>
           <w:rPr>
             <w:rStyle w:val="Hyperlink"/>
           </w:rPr>
-          <w:t>3.2 Eccentricity and Bound Retention</w:t>
+          <w:t>5.2 Limitations</w:t>
         </w:r>
         <w:r>
           <w:rPr>
@@ -1364,7 +1852,7 @@
           <w:rPr>
             <w:webHidden/>
           </w:rPr>
-          <w:instrText xml:space="preserve"> PAGEREF _Toc238639505 \h </w:instrText>
+          <w:instrText xml:space="preserve"> PAGEREF _Toc238714837 \h </w:instrText>
         </w:r>
         <w:r>
           <w:rPr>
@@ -1381,7 +1869,7 @@
           <w:rPr>
             <w:webHidden/>
           </w:rPr>
-          <w:t>9</w:t>
+          <w:t>17</w:t>
         </w:r>
         <w:r>
           <w:rPr>
@@ -1404,12 +1892,12 @@
           <w14:ligatures w14:val="standardContextual"/>
         </w:rPr>
       </w:pPr>
-      <w:hyperlink w:anchor="_Toc238639506" w:history="1">
+      <w:hyperlink w:anchor="_Toc238714838" w:history="1">
         <w:r>
           <w:rPr>
             <w:rStyle w:val="Hyperlink"/>
           </w:rPr>
-          <w:t>3.3 Model Performance and Screening Use</w:t>
+          <w:t>5.3 Future Work</w:t>
         </w:r>
         <w:r>
           <w:rPr>
@@ -1427,7 +1915,7 @@
           <w:rPr>
             <w:webHidden/>
           </w:rPr>
-          <w:instrText xml:space="preserve"> PAGEREF _Toc238639506 \h </w:instrText>
+          <w:instrText xml:space="preserve"> PAGEREF _Toc238714838 \h </w:instrText>
         </w:r>
         <w:r>
           <w:rPr>
@@ -1444,7 +1932,7 @@
           <w:rPr>
             <w:webHidden/>
           </w:rPr>
-          <w:t>10</w:t>
+          <w:t>17</w:t>
         </w:r>
         <w:r>
           <w:rPr>
@@ -1456,7 +1944,7 @@
     </w:p>
     <w:p>
       <w:pPr>
-        <w:pStyle w:val="TOC2"/>
+        <w:pStyle w:val="TOC1"/>
         <w:tabs>
           <w:tab w:val="right" w:leader="dot" w:pos="9350"/>
         </w:tabs>
@@ -1467,12 +1955,12 @@
           <w14:ligatures w14:val="standardContextual"/>
         </w:rPr>
       </w:pPr>
-      <w:hyperlink w:anchor="_Toc238639507" w:history="1">
+      <w:hyperlink w:anchor="_Toc238714839" w:history="1">
         <w:r>
           <w:rPr>
             <w:rStyle w:val="Hyperlink"/>
           </w:rPr>
-          <w:t>3.4 Overall Physical Parameter Importance</w:t>
+          <w:t>References</w:t>
         </w:r>
         <w:r>
           <w:rPr>
@@ -1490,7 +1978,7 @@
           <w:rPr>
             <w:webHidden/>
           </w:rPr>
-          <w:instrText xml:space="preserve"> PAGEREF _Toc238639507 \h </w:instrText>
+          <w:instrText xml:space="preserve"> PAGEREF _Toc238714839 \h </w:instrText>
         </w:r>
         <w:r>
           <w:rPr>
@@ -1507,7 +1995,7 @@
           <w:rPr>
             <w:webHidden/>
           </w:rPr>
-          <w:t>10</w:t>
+          <w:t>18</w:t>
         </w:r>
         <w:r>
           <w:rPr>
@@ -1519,7 +2007,7 @@
     </w:p>
     <w:p>
       <w:pPr>
-        <w:pStyle w:val="TOC2"/>
+        <w:pStyle w:val="TOC1"/>
         <w:tabs>
           <w:tab w:val="right" w:leader="dot" w:pos="9350"/>
         </w:tabs>
@@ -1530,12 +2018,12 @@
           <w14:ligatures w14:val="standardContextual"/>
         </w:rPr>
       </w:pPr>
-      <w:hyperlink w:anchor="_Toc238639508" w:history="1">
+      <w:hyperlink w:anchor="_Toc238714840" w:history="1">
         <w:r>
           <w:rPr>
             <w:rStyle w:val="Hyperlink"/>
           </w:rPr>
-          <w:t>3.5 Checking Physical Trends and Condition-Dependent Effects</w:t>
+          <w:t>Appendix A. Supporting Model Results</w:t>
         </w:r>
         <w:r>
           <w:rPr>
@@ -1553,7 +2041,7 @@
           <w:rPr>
             <w:webHidden/>
           </w:rPr>
-          <w:instrText xml:space="preserve"> PAGEREF _Toc238639508 \h </w:instrText>
+          <w:instrText xml:space="preserve"> PAGEREF _Toc238714840 \h </w:instrText>
         </w:r>
         <w:r>
           <w:rPr>
@@ -1570,7 +2058,7 @@
           <w:rPr>
             <w:webHidden/>
           </w:rPr>
-          <w:t>11</w:t>
+          <w:t>20</w:t>
         </w:r>
         <w:r>
           <w:rPr>
@@ -1582,7 +2070,7 @@
     </w:p>
     <w:p>
       <w:pPr>
-        <w:pStyle w:val="TOC2"/>
+        <w:pStyle w:val="TOC1"/>
         <w:tabs>
           <w:tab w:val="right" w:leader="dot" w:pos="9350"/>
         </w:tabs>
@@ -1593,12 +2081,12 @@
           <w14:ligatures w14:val="standardContextual"/>
         </w:rPr>
       </w:pPr>
-      <w:hyperlink w:anchor="_Toc238639509" w:history="1">
+      <w:hyperlink w:anchor="_Toc238714841" w:history="1">
         <w:r>
           <w:rPr>
             <w:rStyle w:val="Hyperlink"/>
           </w:rPr>
-          <w:t>3.6 Where the Model Can and Cannot Be Trusted</w:t>
+          <w:t>Appendix B. AI acknowledgement Statement</w:t>
         </w:r>
         <w:r>
           <w:rPr>
@@ -1616,7 +2104,7 @@
           <w:rPr>
             <w:webHidden/>
           </w:rPr>
-          <w:instrText xml:space="preserve"> PAGEREF _Toc238639509 \h </w:instrText>
+          <w:instrText xml:space="preserve"> PAGEREF _Toc238714841 \h </w:instrText>
         </w:r>
         <w:r>
           <w:rPr>
@@ -1633,7 +2121,7 @@
           <w:rPr>
             <w:webHidden/>
           </w:rPr>
-          <w:t>13</w:t>
+          <w:t>22</w:t>
         </w:r>
         <w:r>
           <w:rPr>
@@ -1645,599 +2133,28 @@
     </w:p>
     <w:p>
       <w:pPr>
-        <w:pStyle w:val="TOC2"/>
-        <w:tabs>
-          <w:tab w:val="right" w:leader="dot" w:pos="9350"/>
-        </w:tabs>
-        <w:rPr>
-          <w:rFonts w:asciiTheme="minorHAnsi" w:eastAsiaTheme="minorEastAsia" w:hAnsiTheme="minorHAnsi" w:cstheme="minorBidi"/>
-          <w:kern w:val="2"/>
-          <w:lang w:val="en-US"/>
-          <w14:ligatures w14:val="standardContextual"/>
-        </w:rPr>
-      </w:pPr>
-      <w:hyperlink w:anchor="_Toc238639510" w:history="1">
-        <w:r>
-          <w:rPr>
-            <w:rStyle w:val="Hyperlink"/>
-          </w:rPr>
-          <w:t>3.7 How the Model Supports SPH Decisions</w:t>
-        </w:r>
-        <w:r>
-          <w:rPr>
-            <w:webHidden/>
-          </w:rPr>
-          <w:tab/>
-        </w:r>
-        <w:r>
-          <w:rPr>
-            <w:webHidden/>
-          </w:rPr>
-          <w:fldChar w:fldCharType="begin"/>
-        </w:r>
-        <w:r>
-          <w:rPr>
-            <w:webHidden/>
-          </w:rPr>
-          <w:instrText xml:space="preserve"> PAGEREF _Toc238639510 \h </w:instrText>
-        </w:r>
-        <w:r>
-          <w:rPr>
-            <w:webHidden/>
-          </w:rPr>
-        </w:r>
-        <w:r>
-          <w:rPr>
-            <w:webHidden/>
-          </w:rPr>
-          <w:fldChar w:fldCharType="separate"/>
-        </w:r>
-        <w:r>
-          <w:rPr>
-            <w:webHidden/>
-          </w:rPr>
-          <w:t>14</w:t>
-        </w:r>
-        <w:r>
-          <w:rPr>
-            <w:webHidden/>
-          </w:rPr>
-          <w:fldChar w:fldCharType="end"/>
-        </w:r>
-      </w:hyperlink>
-    </w:p>
-    <w:p>
-      <w:pPr>
-        <w:pStyle w:val="TOC1"/>
-        <w:tabs>
-          <w:tab w:val="right" w:leader="dot" w:pos="9350"/>
-        </w:tabs>
-        <w:rPr>
-          <w:rFonts w:asciiTheme="minorHAnsi" w:eastAsiaTheme="minorEastAsia" w:hAnsiTheme="minorHAnsi" w:cstheme="minorBidi"/>
-          <w:kern w:val="2"/>
-          <w:lang w:val="en-US"/>
-          <w14:ligatures w14:val="standardContextual"/>
-        </w:rPr>
-      </w:pPr>
-      <w:hyperlink w:anchor="_Toc238639511" w:history="1">
-        <w:r>
-          <w:rPr>
-            <w:rStyle w:val="Hyperlink"/>
-          </w:rPr>
-          <w:t>4. Discussion</w:t>
-        </w:r>
-        <w:r>
-          <w:rPr>
-            <w:webHidden/>
-          </w:rPr>
-          <w:tab/>
-        </w:r>
-        <w:r>
-          <w:rPr>
-            <w:webHidden/>
-          </w:rPr>
-          <w:fldChar w:fldCharType="begin"/>
-        </w:r>
-        <w:r>
-          <w:rPr>
-            <w:webHidden/>
-          </w:rPr>
-          <w:instrText xml:space="preserve"> PAGEREF _Toc238639511 \h </w:instrText>
-        </w:r>
-        <w:r>
-          <w:rPr>
-            <w:webHidden/>
-          </w:rPr>
-        </w:r>
-        <w:r>
-          <w:rPr>
-            <w:webHidden/>
-          </w:rPr>
-          <w:fldChar w:fldCharType="separate"/>
-        </w:r>
-        <w:r>
-          <w:rPr>
-            <w:webHidden/>
-          </w:rPr>
-          <w:t>14</w:t>
-        </w:r>
-        <w:r>
-          <w:rPr>
-            <w:webHidden/>
-          </w:rPr>
-          <w:fldChar w:fldCharType="end"/>
-        </w:r>
-      </w:hyperlink>
-    </w:p>
-    <w:p>
-      <w:pPr>
-        <w:pStyle w:val="TOC1"/>
-        <w:tabs>
-          <w:tab w:val="right" w:leader="dot" w:pos="9350"/>
-        </w:tabs>
-        <w:rPr>
-          <w:rFonts w:asciiTheme="minorHAnsi" w:eastAsiaTheme="minorEastAsia" w:hAnsiTheme="minorHAnsi" w:cstheme="minorBidi"/>
-          <w:kern w:val="2"/>
-          <w:lang w:val="en-US"/>
-          <w14:ligatures w14:val="standardContextual"/>
-        </w:rPr>
-      </w:pPr>
-      <w:hyperlink w:anchor="_Toc238639512" w:history="1">
-        <w:r>
-          <w:rPr>
-            <w:rStyle w:val="Hyperlink"/>
-          </w:rPr>
-          <w:t>5. Conclusions, Limitations and Future Work</w:t>
-        </w:r>
-        <w:r>
-          <w:rPr>
-            <w:webHidden/>
-          </w:rPr>
-          <w:tab/>
-        </w:r>
-        <w:r>
-          <w:rPr>
-            <w:webHidden/>
-          </w:rPr>
-          <w:fldChar w:fldCharType="begin"/>
-        </w:r>
-        <w:r>
-          <w:rPr>
-            <w:webHidden/>
-          </w:rPr>
-          <w:instrText xml:space="preserve"> PAGEREF _Toc238639512 \h </w:instrText>
-        </w:r>
-        <w:r>
-          <w:rPr>
-            <w:webHidden/>
-          </w:rPr>
-        </w:r>
-        <w:r>
-          <w:rPr>
-            <w:webHidden/>
-          </w:rPr>
-          <w:fldChar w:fldCharType="separate"/>
-        </w:r>
-        <w:r>
-          <w:rPr>
-            <w:webHidden/>
-          </w:rPr>
-          <w:t>15</w:t>
-        </w:r>
-        <w:r>
-          <w:rPr>
-            <w:webHidden/>
-          </w:rPr>
-          <w:fldChar w:fldCharType="end"/>
-        </w:r>
-      </w:hyperlink>
-    </w:p>
-    <w:p>
-      <w:pPr>
-        <w:pStyle w:val="TOC2"/>
-        <w:tabs>
-          <w:tab w:val="right" w:leader="dot" w:pos="9350"/>
-        </w:tabs>
-        <w:rPr>
-          <w:rFonts w:asciiTheme="minorHAnsi" w:eastAsiaTheme="minorEastAsia" w:hAnsiTheme="minorHAnsi" w:cstheme="minorBidi"/>
-          <w:kern w:val="2"/>
-          <w:lang w:val="en-US"/>
-          <w14:ligatures w14:val="standardContextual"/>
-        </w:rPr>
-      </w:pPr>
-      <w:hyperlink w:anchor="_Toc238639513" w:history="1">
-        <w:r>
-          <w:rPr>
-            <w:rStyle w:val="Hyperlink"/>
-          </w:rPr>
-          <w:t>5.1 Conclusions and Answers to the Research Questions</w:t>
-        </w:r>
-        <w:r>
-          <w:rPr>
-            <w:webHidden/>
-          </w:rPr>
-          <w:tab/>
-        </w:r>
-        <w:r>
-          <w:rPr>
-            <w:webHidden/>
-          </w:rPr>
-          <w:fldChar w:fldCharType="begin"/>
-        </w:r>
-        <w:r>
-          <w:rPr>
-            <w:webHidden/>
-          </w:rPr>
-          <w:instrText xml:space="preserve"> PAGEREF _Toc238639513 \h </w:instrText>
-        </w:r>
-        <w:r>
-          <w:rPr>
-            <w:webHidden/>
-          </w:rPr>
-        </w:r>
-        <w:r>
-          <w:rPr>
-            <w:webHidden/>
-          </w:rPr>
-          <w:fldChar w:fldCharType="separate"/>
-        </w:r>
-        <w:r>
-          <w:rPr>
-            <w:webHidden/>
-          </w:rPr>
-          <w:t>15</w:t>
-        </w:r>
-        <w:r>
-          <w:rPr>
-            <w:webHidden/>
-          </w:rPr>
-          <w:fldChar w:fldCharType="end"/>
-        </w:r>
-      </w:hyperlink>
-    </w:p>
-    <w:p>
-      <w:pPr>
-        <w:pStyle w:val="TOC2"/>
-        <w:tabs>
-          <w:tab w:val="right" w:leader="dot" w:pos="9350"/>
-        </w:tabs>
-        <w:rPr>
-          <w:rFonts w:asciiTheme="minorHAnsi" w:eastAsiaTheme="minorEastAsia" w:hAnsiTheme="minorHAnsi" w:cstheme="minorBidi"/>
-          <w:kern w:val="2"/>
-          <w:lang w:val="en-US"/>
-          <w14:ligatures w14:val="standardContextual"/>
-        </w:rPr>
-      </w:pPr>
-      <w:hyperlink w:anchor="_Toc238639514" w:history="1">
-        <w:r>
-          <w:rPr>
-            <w:rStyle w:val="Hyperlink"/>
-          </w:rPr>
-          <w:t>5.2 Limitations</w:t>
-        </w:r>
-        <w:r>
-          <w:rPr>
-            <w:webHidden/>
-          </w:rPr>
-          <w:tab/>
-        </w:r>
-        <w:r>
-          <w:rPr>
-            <w:webHidden/>
-          </w:rPr>
-          <w:fldChar w:fldCharType="begin"/>
-        </w:r>
-        <w:r>
-          <w:rPr>
-            <w:webHidden/>
-          </w:rPr>
-          <w:instrText xml:space="preserve"> PAGEREF _Toc238639514 \h </w:instrText>
-        </w:r>
-        <w:r>
-          <w:rPr>
-            <w:webHidden/>
-          </w:rPr>
-        </w:r>
-        <w:r>
-          <w:rPr>
-            <w:webHidden/>
-          </w:rPr>
-          <w:fldChar w:fldCharType="separate"/>
-        </w:r>
-        <w:r>
-          <w:rPr>
-            <w:webHidden/>
-          </w:rPr>
-          <w:t>16</w:t>
-        </w:r>
-        <w:r>
-          <w:rPr>
-            <w:webHidden/>
-          </w:rPr>
-          <w:fldChar w:fldCharType="end"/>
-        </w:r>
-      </w:hyperlink>
-    </w:p>
-    <w:p>
-      <w:pPr>
-        <w:pStyle w:val="TOC2"/>
-        <w:tabs>
-          <w:tab w:val="right" w:leader="dot" w:pos="9350"/>
-        </w:tabs>
-        <w:rPr>
-          <w:rFonts w:asciiTheme="minorHAnsi" w:eastAsiaTheme="minorEastAsia" w:hAnsiTheme="minorHAnsi" w:cstheme="minorBidi"/>
-          <w:kern w:val="2"/>
-          <w:lang w:val="en-US"/>
-          <w14:ligatures w14:val="standardContextual"/>
-        </w:rPr>
-      </w:pPr>
-      <w:hyperlink w:anchor="_Toc238639515" w:history="1">
-        <w:r>
-          <w:rPr>
-            <w:rStyle w:val="Hyperlink"/>
-          </w:rPr>
-          <w:t>5.3 Future Work</w:t>
-        </w:r>
-        <w:r>
-          <w:rPr>
-            <w:webHidden/>
-          </w:rPr>
-          <w:tab/>
-        </w:r>
-        <w:r>
-          <w:rPr>
-            <w:webHidden/>
-          </w:rPr>
-          <w:fldChar w:fldCharType="begin"/>
-        </w:r>
-        <w:r>
-          <w:rPr>
-            <w:webHidden/>
-          </w:rPr>
-          <w:instrText xml:space="preserve"> PAGEREF _Toc238639515 \h </w:instrText>
-        </w:r>
-        <w:r>
-          <w:rPr>
-            <w:webHidden/>
-          </w:rPr>
-        </w:r>
-        <w:r>
-          <w:rPr>
-            <w:webHidden/>
-          </w:rPr>
-          <w:fldChar w:fldCharType="separate"/>
-        </w:r>
-        <w:r>
-          <w:rPr>
-            <w:webHidden/>
-          </w:rPr>
-          <w:t>17</w:t>
-        </w:r>
-        <w:r>
-          <w:rPr>
-            <w:webHidden/>
-          </w:rPr>
-          <w:fldChar w:fldCharType="end"/>
-        </w:r>
-      </w:hyperlink>
-    </w:p>
-    <w:p>
-      <w:pPr>
-        <w:pStyle w:val="TOC1"/>
-        <w:tabs>
-          <w:tab w:val="right" w:leader="dot" w:pos="9350"/>
-        </w:tabs>
-        <w:rPr>
-          <w:rFonts w:asciiTheme="minorHAnsi" w:eastAsiaTheme="minorEastAsia" w:hAnsiTheme="minorHAnsi" w:cstheme="minorBidi"/>
-          <w:kern w:val="2"/>
-          <w:lang w:val="en-US"/>
-          <w14:ligatures w14:val="standardContextual"/>
-        </w:rPr>
-      </w:pPr>
-      <w:hyperlink w:anchor="_Toc238639516" w:history="1">
-        <w:r>
-          <w:rPr>
-            <w:rStyle w:val="Hyperlink"/>
-          </w:rPr>
-          <w:t>References</w:t>
-        </w:r>
-        <w:r>
-          <w:rPr>
-            <w:webHidden/>
-          </w:rPr>
-          <w:tab/>
-        </w:r>
-        <w:r>
-          <w:rPr>
-            <w:webHidden/>
-          </w:rPr>
-          <w:fldChar w:fldCharType="begin"/>
-        </w:r>
-        <w:r>
-          <w:rPr>
-            <w:webHidden/>
-          </w:rPr>
-          <w:instrText xml:space="preserve"> PAGEREF _Toc238639516 \h </w:instrText>
-        </w:r>
-        <w:r>
-          <w:rPr>
-            <w:webHidden/>
-          </w:rPr>
-        </w:r>
-        <w:r>
-          <w:rPr>
-            <w:webHidden/>
-          </w:rPr>
-          <w:fldChar w:fldCharType="separate"/>
-        </w:r>
-        <w:r>
-          <w:rPr>
-            <w:webHidden/>
-          </w:rPr>
-          <w:t>18</w:t>
-        </w:r>
-        <w:r>
-          <w:rPr>
-            <w:webHidden/>
-          </w:rPr>
-          <w:fldChar w:fldCharType="end"/>
-        </w:r>
-      </w:hyperlink>
-    </w:p>
-    <w:p>
-      <w:pPr>
-        <w:pStyle w:val="TOC1"/>
-        <w:tabs>
-          <w:tab w:val="right" w:leader="dot" w:pos="9350"/>
-        </w:tabs>
-        <w:rPr>
-          <w:rFonts w:asciiTheme="minorHAnsi" w:eastAsiaTheme="minorEastAsia" w:hAnsiTheme="minorHAnsi" w:cstheme="minorBidi"/>
-          <w:kern w:val="2"/>
-          <w:lang w:val="en-US"/>
-          <w14:ligatures w14:val="standardContextual"/>
-        </w:rPr>
-      </w:pPr>
-      <w:hyperlink w:anchor="_Toc238639517" w:history="1">
-        <w:r>
-          <w:rPr>
-            <w:rStyle w:val="Hyperlink"/>
-          </w:rPr>
-          <w:t>Appendix A. Supporting Model Results</w:t>
-        </w:r>
-        <w:r>
-          <w:rPr>
-            <w:webHidden/>
-          </w:rPr>
-          <w:tab/>
-        </w:r>
-        <w:r>
-          <w:rPr>
-            <w:webHidden/>
-          </w:rPr>
-          <w:fldChar w:fldCharType="begin"/>
-        </w:r>
-        <w:r>
-          <w:rPr>
-            <w:webHidden/>
-          </w:rPr>
-          <w:instrText xml:space="preserve"> PAGEREF _Toc238639517 \h </w:instrText>
-        </w:r>
-        <w:r>
-          <w:rPr>
-            <w:webHidden/>
-          </w:rPr>
-        </w:r>
-        <w:r>
-          <w:rPr>
-            <w:webHidden/>
-          </w:rPr>
-          <w:fldChar w:fldCharType="separate"/>
-        </w:r>
-        <w:r>
-          <w:rPr>
-            <w:webHidden/>
-          </w:rPr>
-          <w:t>20</w:t>
-        </w:r>
-        <w:r>
-          <w:rPr>
-            <w:webHidden/>
-          </w:rPr>
-          <w:fldChar w:fldCharType="end"/>
-        </w:r>
-      </w:hyperlink>
-    </w:p>
-    <w:p>
-      <w:pPr>
-        <w:pStyle w:val="TOC1"/>
-        <w:tabs>
-          <w:tab w:val="right" w:leader="dot" w:pos="9350"/>
-        </w:tabs>
-        <w:rPr>
-          <w:rFonts w:asciiTheme="minorHAnsi" w:eastAsiaTheme="minorEastAsia" w:hAnsiTheme="minorHAnsi" w:cstheme="minorBidi"/>
-          <w:kern w:val="2"/>
-          <w:lang w:val="en-US"/>
-          <w14:ligatures w14:val="standardContextual"/>
-        </w:rPr>
-      </w:pPr>
-      <w:hyperlink w:anchor="_Toc238639518" w:history="1">
-        <w:r>
-          <w:rPr>
-            <w:rStyle w:val="Hyperlink"/>
-          </w:rPr>
-          <w:t>Appendix B. AI acknowledgement Statement</w:t>
-        </w:r>
-        <w:r>
-          <w:rPr>
-            <w:webHidden/>
-          </w:rPr>
-          <w:tab/>
-        </w:r>
-        <w:r>
-          <w:rPr>
-            <w:webHidden/>
-          </w:rPr>
-          <w:fldChar w:fldCharType="begin"/>
-        </w:r>
-        <w:r>
-          <w:rPr>
-            <w:webHidden/>
-          </w:rPr>
-          <w:instrText xml:space="preserve"> PAGEREF _Toc238639518 \h </w:instrText>
-        </w:r>
-        <w:r>
-          <w:rPr>
-            <w:webHidden/>
-          </w:rPr>
-        </w:r>
-        <w:r>
-          <w:rPr>
-            <w:webHidden/>
-          </w:rPr>
-          <w:fldChar w:fldCharType="separate"/>
-        </w:r>
-        <w:r>
-          <w:rPr>
-            <w:webHidden/>
-          </w:rPr>
-          <w:t>23</w:t>
-        </w:r>
-        <w:r>
-          <w:rPr>
-            <w:webHidden/>
-          </w:rPr>
-          <w:fldChar w:fldCharType="end"/>
-        </w:r>
-      </w:hyperlink>
-    </w:p>
-    <w:p>
-      <w:pPr>
         <w:pStyle w:val="Heading1"/>
       </w:pPr>
       <w:r>
-        <w:rPr>
-          <w:b w:val="0"/>
-          <w:bCs w:val="0"/>
-          <w:sz w:val="24"/>
-          <w:szCs w:val="24"/>
-        </w:rPr>
         <w:fldChar w:fldCharType="end"/>
       </w:r>
     </w:p>
     <w:p/>
+    <w:p/>
     <w:p>
       <w:pPr>
         <w:pStyle w:val="Heading1"/>
       </w:pPr>
-      <w:bookmarkStart w:id="2" w:name="_Toc238639491"/>
+      <w:bookmarkStart w:id="3" w:name="_Toc238714722"/>
+      <w:bookmarkStart w:id="4" w:name="_Toc238714814"/>
       <w:r>
         <w:lastRenderedPageBreak/>
         <w:t>List of Tables</w:t>
       </w:r>
-      <w:bookmarkEnd w:id="2"/>
-    </w:p>
-    <w:bookmarkStart w:id="3" w:name="_Toc238639492"/>
-    <w:bookmarkStart w:id="4" w:name="_Toc238149729"/>
+      <w:bookmarkEnd w:id="3"/>
+      <w:bookmarkEnd w:id="4"/>
+    </w:p>
+    <w:bookmarkStart w:id="5" w:name="_Toc238149729"/>
     <w:p>
       <w:pPr>
         <w:pStyle w:val="TableofFigures"/>
@@ -2332,7 +2249,43 @@
           <w:rPr>
             <w:rStyle w:val="Hyperlink"/>
           </w:rPr>
-          <w:t>Table 2. Sparse failure case at periapsis 1.4 Mars radii: both velocity cells are within  the sampled range but contain only one unique physical SPH simulation.</w:t>
+          <w:t xml:space="preserve">Table 2. Sparse failure case at periapsis 1.4 Mars radii: both velocity cells are within  the sampled range but contain </w:t>
+        </w:r>
+        <w:r>
+          <w:rPr>
+            <w:rStyle w:val="Hyperlink"/>
+          </w:rPr>
+          <w:t>o</w:t>
+        </w:r>
+        <w:r>
+          <w:rPr>
+            <w:rStyle w:val="Hyperlink"/>
+          </w:rPr>
+          <w:t>nly one</w:t>
+        </w:r>
+        <w:r>
+          <w:rPr>
+            <w:rStyle w:val="Hyperlink"/>
+          </w:rPr>
+          <w:t xml:space="preserve"> </w:t>
+        </w:r>
+        <w:r>
+          <w:rPr>
+            <w:rStyle w:val="Hyperlink"/>
+          </w:rPr>
+          <w:t>u</w:t>
+        </w:r>
+        <w:r>
+          <w:rPr>
+            <w:rStyle w:val="Hyperlink"/>
+          </w:rPr>
+          <w:t>n</w:t>
+        </w:r>
+        <w:r>
+          <w:rPr>
+            <w:rStyle w:val="Hyperlink"/>
+          </w:rPr>
+          <w:t>ique physical SPH simulation.</w:t>
         </w:r>
         <w:r>
           <w:rPr>
@@ -2388,10 +2341,13 @@
         </w:rPr>
         <w:fldChar w:fldCharType="end"/>
       </w:r>
+      <w:bookmarkStart w:id="6" w:name="_Toc238714723"/>
+      <w:bookmarkStart w:id="7" w:name="_Toc238714815"/>
       <w:r>
         <w:t>List of Figures</w:t>
       </w:r>
-      <w:bookmarkEnd w:id="3"/>
+      <w:bookmarkEnd w:id="6"/>
+      <w:bookmarkEnd w:id="7"/>
     </w:p>
     <w:p>
       <w:pPr>
@@ -2435,7 +2391,7 @@
         </w:rPr>
         <w:fldChar w:fldCharType="separate"/>
       </w:r>
-      <w:hyperlink w:anchor="_Toc238639524" w:history="1">
+      <w:hyperlink w:anchor="_Toc238714895" w:history="1">
         <w:r>
           <w:rPr>
             <w:rStyle w:val="Hyperlink"/>
@@ -2484,7 +2440,7 @@
           <w:rPr>
             <w:webHidden/>
           </w:rPr>
-          <w:instrText xml:space="preserve"> PAGEREF _Toc238639524 \h </w:instrText>
+          <w:instrText xml:space="preserve"> PAGEREF _Toc238714895 \h </w:instrText>
         </w:r>
         <w:r>
           <w:rPr>
@@ -2526,7 +2482,7 @@
           <w14:ligatures w14:val="standardContextual"/>
         </w:rPr>
       </w:pPr>
-      <w:hyperlink w:anchor="_Toc238639525" w:history="1">
+      <w:hyperlink w:anchor="_Toc238714896" w:history="1">
         <w:r>
           <w:rPr>
             <w:rStyle w:val="Hyperlink"/>
@@ -2549,7 +2505,7 @@
           <w:rPr>
             <w:webHidden/>
           </w:rPr>
-          <w:instrText xml:space="preserve"> PAGEREF _Toc238639525 \h </w:instrText>
+          <w:instrText xml:space="preserve"> PAGEREF _Toc238714896 \h </w:instrText>
         </w:r>
         <w:r>
           <w:rPr>
@@ -2591,12 +2547,12 @@
           <w14:ligatures w14:val="standardContextual"/>
         </w:rPr>
       </w:pPr>
-      <w:hyperlink w:anchor="_Toc238639526" w:history="1">
+      <w:hyperlink w:anchor="_Toc238714897" w:history="1">
         <w:r>
           <w:rPr>
             <w:rStyle w:val="Hyperlink"/>
           </w:rPr>
-          <w:t>Figure 3. BMF checks where one input changes at a time. Dots are available SPH simulation results and curves show tuned Gradient Boosting predictions with the other inputs fixed. Blue background shows the interpolation range, while red background shows the extrapolation range.</w:t>
+          <w:t>Figure 3. (a-d) BMF checks where one input changes at a time. Dots are available SPH simulation results and curves show tuned Gradient Boosting predictions with the other inputs fixed. Blue background shows the interpolation range, while red background shows the extrapolation range.</w:t>
         </w:r>
         <w:r>
           <w:rPr>
@@ -2614,7 +2570,7 @@
           <w:rPr>
             <w:webHidden/>
           </w:rPr>
-          <w:instrText xml:space="preserve"> PAGEREF _Toc238639526 \h </w:instrText>
+          <w:instrText xml:space="preserve"> PAGEREF _Toc238714897 \h </w:instrText>
         </w:r>
         <w:r>
           <w:rPr>
@@ -2656,25 +2612,12 @@
           <w14:ligatures w14:val="standardContextual"/>
         </w:rPr>
       </w:pPr>
-      <w:hyperlink w:anchor="_Toc238639527" w:history="1">
+      <w:hyperlink w:anchor="_Toc238714898" w:history="1">
         <w:r>
           <w:rPr>
             <w:rStyle w:val="Hyperlink"/>
           </w:rPr>
-          <w:t>Figure 4. BMF differences within the matched 10</w:t>
-        </w:r>
-        <w:r>
-          <w:rPr>
-            <w:rStyle w:val="Hyperlink"/>
-            <w:vertAlign w:val="superscript"/>
-          </w:rPr>
-          <w:t>20</w:t>
-        </w:r>
-        <w:r>
-          <w:rPr>
-            <w:rStyle w:val="Hyperlink"/>
-          </w:rPr>
-          <w:t xml:space="preserve"> kg. Left: BMF range across spin states with velocity fixed. Right: BMF range across velocities with spin fixed. These ranges show how strongly outcomes differ within this subset; they do not show direction or prove causation.</w:t>
+          <w:t>Figure 4. BMF differences if with (a) same spin but different velocity, (b) same velocity but different spin. These ranges show how global aberage cannot show this regime dependence: one input can look moderate overall but become a strong local separator in some regions..</w:t>
         </w:r>
         <w:r>
           <w:rPr>
@@ -2692,7 +2635,7 @@
           <w:rPr>
             <w:webHidden/>
           </w:rPr>
-          <w:instrText xml:space="preserve"> PAGEREF _Toc238639527 \h </w:instrText>
+          <w:instrText xml:space="preserve"> PAGEREF _Toc238714898 \h </w:instrText>
         </w:r>
         <w:r>
           <w:rPr>
@@ -2734,7 +2677,7 @@
           <w14:ligatures w14:val="standardContextual"/>
         </w:rPr>
       </w:pPr>
-      <w:hyperlink w:anchor="_Toc238639528" w:history="1">
+      <w:hyperlink w:anchor="_Toc238714899" w:history="1">
         <w:r>
           <w:rPr>
             <w:rStyle w:val="Hyperlink"/>
@@ -2757,7 +2700,7 @@
           <w:rPr>
             <w:webHidden/>
           </w:rPr>
-          <w:instrText xml:space="preserve"> PAGEREF _Toc238639528 \h </w:instrText>
+          <w:instrText xml:space="preserve"> PAGEREF _Toc238714899 \h </w:instrText>
         </w:r>
         <w:r>
           <w:rPr>
@@ -2844,7 +2787,7 @@
         <w:lastRenderedPageBreak/>
         <w:t>Abstract</w:t>
       </w:r>
-      <w:bookmarkEnd w:id="4"/>
+      <w:bookmarkEnd w:id="5"/>
     </w:p>
     <w:p>
       <w:pPr>
@@ -2857,7 +2800,7 @@
           <w:szCs w:val="20"/>
         </w:rPr>
       </w:pPr>
-      <w:bookmarkStart w:id="5" w:name="_Toc238149730"/>
+      <w:bookmarkStart w:id="8" w:name="_Toc238149730"/>
       <w:r>
         <w:rPr>
           <w:i/>
@@ -2974,24 +2917,28 @@
       <w:pPr>
         <w:pStyle w:val="Heading1"/>
       </w:pPr>
-      <w:bookmarkStart w:id="6" w:name="_Toc238639493"/>
+      <w:bookmarkStart w:id="9" w:name="_Toc238714724"/>
+      <w:bookmarkStart w:id="10" w:name="_Toc238714816"/>
       <w:r>
         <w:t>1. Introduction</w:t>
       </w:r>
-      <w:bookmarkEnd w:id="5"/>
-      <w:bookmarkEnd w:id="6"/>
+      <w:bookmarkEnd w:id="8"/>
+      <w:bookmarkEnd w:id="9"/>
+      <w:bookmarkEnd w:id="10"/>
     </w:p>
     <w:p>
       <w:pPr>
         <w:pStyle w:val="Heading2"/>
       </w:pPr>
-      <w:bookmarkStart w:id="7" w:name="_Toc238149731"/>
-      <w:bookmarkStart w:id="8" w:name="_Toc238639494"/>
+      <w:bookmarkStart w:id="11" w:name="_Toc238149731"/>
+      <w:bookmarkStart w:id="12" w:name="_Toc238714725"/>
+      <w:bookmarkStart w:id="13" w:name="_Toc238714817"/>
       <w:r>
         <w:t>1.1 Research Problem and Questions</w:t>
       </w:r>
-      <w:bookmarkEnd w:id="7"/>
-      <w:bookmarkEnd w:id="8"/>
+      <w:bookmarkEnd w:id="11"/>
+      <w:bookmarkEnd w:id="12"/>
+      <w:bookmarkEnd w:id="13"/>
     </w:p>
     <w:p>
       <w:pPr>
@@ -3082,7 +3029,7 @@
       <w:r>
         <w:t>retained debris; and (3) can machine-learning models predict outcomes within the sampled data while showing when a prediction should or should not be trusted?</w:t>
       </w:r>
-      <w:bookmarkStart w:id="9" w:name="_Toc238149732"/>
+      <w:bookmarkStart w:id="14" w:name="_Toc238149732"/>
     </w:p>
     <w:p>
       <w:pPr>
@@ -3098,12 +3045,14 @@
       <w:pPr>
         <w:pStyle w:val="Heading2"/>
       </w:pPr>
-      <w:bookmarkStart w:id="10" w:name="_Toc238639495"/>
+      <w:bookmarkStart w:id="15" w:name="_Toc238714726"/>
+      <w:bookmarkStart w:id="16" w:name="_Toc238714818"/>
       <w:r>
         <w:t>1.2 Significance and Originality</w:t>
       </w:r>
-      <w:bookmarkEnd w:id="9"/>
-      <w:bookmarkEnd w:id="10"/>
+      <w:bookmarkEnd w:id="14"/>
+      <w:bookmarkEnd w:id="15"/>
+      <w:bookmarkEnd w:id="16"/>
     </w:p>
     <w:p>
       <w:pPr>
@@ -3148,13 +3097,15 @@
       <w:pPr>
         <w:pStyle w:val="Heading2"/>
       </w:pPr>
-      <w:bookmarkStart w:id="11" w:name="_Toc238149733"/>
-      <w:bookmarkStart w:id="12" w:name="_Toc238639496"/>
+      <w:bookmarkStart w:id="17" w:name="_Toc238149733"/>
+      <w:bookmarkStart w:id="18" w:name="_Toc238714727"/>
+      <w:bookmarkStart w:id="19" w:name="_Toc238714819"/>
       <w:r>
         <w:t>1.3 Literature Review and Research Gaps</w:t>
       </w:r>
-      <w:bookmarkEnd w:id="11"/>
-      <w:bookmarkEnd w:id="12"/>
+      <w:bookmarkEnd w:id="17"/>
+      <w:bookmarkEnd w:id="18"/>
+      <w:bookmarkEnd w:id="19"/>
     </w:p>
     <w:p>
       <w:pPr>
@@ -3204,7 +3155,13 @@
         <w:jc w:val="both"/>
       </w:pPr>
       <w:r>
-        <w:t xml:space="preserve">Since SPH is used to simulate these tidal-disruption scenarios, it is also crucial to comprehend how the simulation data are generated and handled. Because SPH is a mesh-free Lagrangian approach, computational particles follow the motion of the material they represent (Price, 2012). It is therefore appropriate for significant deformation and fragmentation. However, the subsequent processing of the simulation also affects the measured pieces. Here, post-processing techniques like friends-of-friends (FoF) use a selected connecting length to group </w:t>
+        <w:t xml:space="preserve">Since SPH is used to simulate these tidal-disruption scenarios, it is also crucial to comprehend how the simulation data are generated and handled. Because SPH is a mesh-free Lagrangian approach, computational particles follow the motion of the material they represent (Price, 2012). It is therefore appropriate for significant deformation and fragmentation. However, </w:t>
+      </w:r>
+      <w:r>
+        <w:t xml:space="preserve">the </w:t>
+      </w:r>
+      <w:r>
+        <w:t xml:space="preserve">processing of the simulation also affects the measured pieces. Here, post-processing techniques like friends-of-friends (FoF) use a selected connecting length to group </w:t>
       </w:r>
       <w:r>
         <w:t>neighbouring</w:t>
@@ -3233,25 +3190,29 @@
       <w:pPr>
         <w:pStyle w:val="Heading1"/>
       </w:pPr>
-      <w:bookmarkStart w:id="13" w:name="_Toc238149734"/>
-      <w:bookmarkStart w:id="14" w:name="_Toc238639497"/>
+      <w:bookmarkStart w:id="20" w:name="_Toc238149734"/>
+      <w:bookmarkStart w:id="21" w:name="_Toc238714728"/>
+      <w:bookmarkStart w:id="22" w:name="_Toc238714820"/>
       <w:r>
         <w:t>2. Methodology</w:t>
       </w:r>
-      <w:bookmarkEnd w:id="13"/>
-      <w:bookmarkEnd w:id="14"/>
+      <w:bookmarkEnd w:id="20"/>
+      <w:bookmarkEnd w:id="21"/>
+      <w:bookmarkEnd w:id="22"/>
     </w:p>
     <w:p>
       <w:pPr>
         <w:pStyle w:val="Heading2"/>
       </w:pPr>
-      <w:bookmarkStart w:id="15" w:name="_Toc238149735"/>
-      <w:bookmarkStart w:id="16" w:name="_Toc238639498"/>
+      <w:bookmarkStart w:id="23" w:name="_Toc238149735"/>
+      <w:bookmarkStart w:id="24" w:name="_Toc238714729"/>
+      <w:bookmarkStart w:id="25" w:name="_Toc238714821"/>
       <w:r>
         <w:t>2.1 Data Archive, Inputs, and Post-Processing</w:t>
       </w:r>
-      <w:bookmarkEnd w:id="15"/>
-      <w:bookmarkEnd w:id="16"/>
+      <w:bookmarkEnd w:id="23"/>
+      <w:bookmarkEnd w:id="24"/>
+      <w:bookmarkEnd w:id="25"/>
     </w:p>
     <w:p>
       <w:pPr>
@@ -3324,8 +3285,8 @@
           <w:szCs w:val="20"/>
         </w:rPr>
       </w:pPr>
-      <w:bookmarkStart w:id="17" w:name="_Toc238151450"/>
-      <w:bookmarkStart w:id="18" w:name="_Toc238639575"/>
+      <w:bookmarkStart w:id="26" w:name="_Toc238151450"/>
+      <w:bookmarkStart w:id="27" w:name="_Toc238639575"/>
       <w:r>
         <w:rPr>
           <w:color w:val="000000" w:themeColor="text1"/>
@@ -3398,8 +3359,8 @@
         </w:rPr>
         <w:t>.</w:t>
       </w:r>
-      <w:bookmarkEnd w:id="17"/>
-      <w:bookmarkEnd w:id="18"/>
+      <w:bookmarkEnd w:id="26"/>
+      <w:bookmarkEnd w:id="27"/>
     </w:p>
     <w:tbl>
       <w:tblPr>
@@ -3893,13 +3854,15 @@
       <w:pPr>
         <w:pStyle w:val="Heading2"/>
       </w:pPr>
-      <w:bookmarkStart w:id="19" w:name="_Toc238149736"/>
-      <w:bookmarkStart w:id="20" w:name="_Toc238639499"/>
+      <w:bookmarkStart w:id="28" w:name="_Toc238149736"/>
+      <w:bookmarkStart w:id="29" w:name="_Toc238714730"/>
+      <w:bookmarkStart w:id="30" w:name="_Toc238714822"/>
       <w:r>
         <w:t>2.2 Prediction Model Choices and Rationale</w:t>
       </w:r>
-      <w:bookmarkEnd w:id="19"/>
-      <w:bookmarkEnd w:id="20"/>
+      <w:bookmarkEnd w:id="28"/>
+      <w:bookmarkEnd w:id="29"/>
+      <w:bookmarkEnd w:id="30"/>
     </w:p>
     <w:p>
       <w:pPr>
@@ -3925,31 +3888,28 @@
     </w:p>
     <w:p>
       <w:pPr>
+        <w:spacing w:after="240" w:line="276" w:lineRule="auto"/>
+        <w:jc w:val="both"/>
+      </w:pPr>
+      <w:bookmarkStart w:id="31" w:name="_Toc238149737"/>
+      <w:bookmarkStart w:id="32" w:name="_Toc238714731"/>
+      <w:r>
+        <w:t>To determine whether prediction performance could be improved beyond the baseline models, Gradient Boosting hyperparameters were tuned and physics-derived attributes calculated from the original scenario inputs were tested as a separate feature-engineering experiment. These included squared encounter speed, inverse periapsis, spin frequency, asteroid radius, encounter eccentricity, periapsis-speed interaction, and estimated time spent within selected Mars-centred radii. The full hyperparameters and definitions of the physics-derived attributes are provided in Appendix A, Tables A1-A2.</w:t>
+      </w:r>
+      <w:bookmarkEnd w:id="32"/>
+    </w:p>
+    <w:p>
+      <w:pPr>
         <w:pStyle w:val="Heading2"/>
-        <w:rPr>
-          <w:b w:val="0"/>
-          <w:bCs w:val="0"/>
-        </w:rPr>
-      </w:pPr>
-      <w:bookmarkStart w:id="21" w:name="_Toc238149737"/>
-      <w:bookmarkStart w:id="22" w:name="_Toc238639500"/>
-      <w:r>
-        <w:rPr>
-          <w:b w:val="0"/>
-          <w:bCs w:val="0"/>
-        </w:rPr>
-        <w:t>To determine whether prediction performance could be improved beyond the baseline models, Gradient Boosting hyperparameters were tuned and physics-derived attributes calculated from the original scenario inputs were tested as a separate feature-engineering experiment. These included squared encounter speed, inverse periapsis, spin frequency, asteroid radius, encounter eccentricity, periapsis-speed interaction, and estimated time spent within selected Mars-centred radii. The full hyperparameters and definitions of the physics-derived attributes are provided in Appendix A, Tables A1-A2.</w:t>
-      </w:r>
-    </w:p>
-    <w:p>
-      <w:pPr>
-        <w:pStyle w:val="Heading2"/>
-      </w:pPr>
+      </w:pPr>
+      <w:bookmarkStart w:id="33" w:name="_Toc238714732"/>
+      <w:bookmarkStart w:id="34" w:name="_Toc238714823"/>
       <w:r>
         <w:t>2.3 Model Testing and Performance Metrics</w:t>
       </w:r>
-      <w:bookmarkEnd w:id="21"/>
-      <w:bookmarkEnd w:id="22"/>
+      <w:bookmarkEnd w:id="31"/>
+      <w:bookmarkEnd w:id="33"/>
+      <w:bookmarkEnd w:id="34"/>
     </w:p>
     <w:p>
       <w:pPr>
@@ -3982,13 +3942,15 @@
       <w:pPr>
         <w:pStyle w:val="Heading2"/>
       </w:pPr>
-      <w:bookmarkStart w:id="23" w:name="_Toc238149738"/>
-      <w:bookmarkStart w:id="24" w:name="_Toc238639501"/>
+      <w:bookmarkStart w:id="35" w:name="_Toc238149738"/>
+      <w:bookmarkStart w:id="36" w:name="_Toc238714733"/>
+      <w:bookmarkStart w:id="37" w:name="_Toc238714824"/>
       <w:r>
         <w:t>2.4 How the Physical Effects Were Analysed</w:t>
       </w:r>
-      <w:bookmarkEnd w:id="23"/>
-      <w:bookmarkEnd w:id="24"/>
+      <w:bookmarkEnd w:id="35"/>
+      <w:bookmarkEnd w:id="36"/>
+      <w:bookmarkEnd w:id="37"/>
     </w:p>
     <w:p>
       <w:pPr>
@@ -4018,13 +3980,15 @@
       <w:pPr>
         <w:pStyle w:val="Heading2"/>
       </w:pPr>
-      <w:bookmarkStart w:id="25" w:name="_Toc238149739"/>
-      <w:bookmarkStart w:id="26" w:name="_Toc238639502"/>
+      <w:bookmarkStart w:id="38" w:name="_Toc238149739"/>
+      <w:bookmarkStart w:id="39" w:name="_Toc238714734"/>
+      <w:bookmarkStart w:id="40" w:name="_Toc238714825"/>
       <w:r>
         <w:t>2.5 When to Trust the Model</w:t>
       </w:r>
-      <w:bookmarkEnd w:id="25"/>
-      <w:bookmarkEnd w:id="26"/>
+      <w:bookmarkEnd w:id="38"/>
+      <w:bookmarkEnd w:id="39"/>
+      <w:bookmarkEnd w:id="40"/>
     </w:p>
     <w:p>
       <w:pPr>
@@ -4092,30 +4056,34 @@
       <w:r>
         <w:t xml:space="preserve">, this is important because severe breakup can still leave almost no material bound to Mars (Richardson et al., 1998; Walsh &amp; Richardson, 2006). </w:t>
       </w:r>
-      <w:bookmarkStart w:id="27" w:name="_Toc238149740"/>
+      <w:bookmarkStart w:id="41" w:name="_Toc238149740"/>
     </w:p>
     <w:p>
       <w:pPr>
         <w:pStyle w:val="Heading1"/>
       </w:pPr>
-      <w:bookmarkStart w:id="28" w:name="_Toc238639503"/>
+      <w:bookmarkStart w:id="42" w:name="_Toc238714735"/>
+      <w:bookmarkStart w:id="43" w:name="_Toc238714826"/>
       <w:r>
         <w:t>3. Results</w:t>
       </w:r>
-      <w:bookmarkEnd w:id="27"/>
-      <w:bookmarkEnd w:id="28"/>
+      <w:bookmarkEnd w:id="41"/>
+      <w:bookmarkEnd w:id="42"/>
+      <w:bookmarkEnd w:id="43"/>
     </w:p>
     <w:p>
       <w:pPr>
         <w:pStyle w:val="Heading2"/>
       </w:pPr>
-      <w:bookmarkStart w:id="29" w:name="_Toc238149741"/>
-      <w:bookmarkStart w:id="30" w:name="_Toc238639504"/>
+      <w:bookmarkStart w:id="44" w:name="_Toc238149741"/>
+      <w:bookmarkStart w:id="45" w:name="_Toc238714736"/>
+      <w:bookmarkStart w:id="46" w:name="_Toc238714827"/>
       <w:r>
         <w:t>3.1 Exploratory Physical Trends</w:t>
       </w:r>
-      <w:bookmarkEnd w:id="29"/>
-      <w:bookmarkEnd w:id="30"/>
+      <w:bookmarkEnd w:id="44"/>
+      <w:bookmarkEnd w:id="45"/>
+      <w:bookmarkEnd w:id="46"/>
     </w:p>
     <w:p>
       <w:pPr>
@@ -4170,7 +4138,7 @@
           <w:szCs w:val="20"/>
         </w:rPr>
       </w:pPr>
-      <w:bookmarkStart w:id="31" w:name="_Toc238639524"/>
+      <w:bookmarkStart w:id="47" w:name="_Toc238714895"/>
       <w:r>
         <w:rPr>
           <w:sz w:val="20"/>
@@ -4285,7 +4253,7 @@
         </w:rPr>
         <w:t>, showing that the combined scatter includes distinct retention regimes.</w:t>
       </w:r>
-      <w:bookmarkEnd w:id="31"/>
+      <w:bookmarkEnd w:id="47"/>
     </w:p>
     <w:p>
       <w:pPr>
@@ -4430,13 +4398,15 @@
       <w:pPr>
         <w:pStyle w:val="Heading2"/>
       </w:pPr>
-      <w:bookmarkStart w:id="32" w:name="_Toc238149742"/>
-      <w:bookmarkStart w:id="33" w:name="_Toc238639505"/>
+      <w:bookmarkStart w:id="48" w:name="_Toc238149742"/>
+      <w:bookmarkStart w:id="49" w:name="_Toc238714737"/>
+      <w:bookmarkStart w:id="50" w:name="_Toc238714828"/>
       <w:r>
         <w:t>3.2 Eccentricity and Bound Retention</w:t>
       </w:r>
-      <w:bookmarkEnd w:id="32"/>
-      <w:bookmarkEnd w:id="33"/>
+      <w:bookmarkEnd w:id="48"/>
+      <w:bookmarkEnd w:id="49"/>
+      <w:bookmarkEnd w:id="50"/>
     </w:p>
     <w:p>
       <w:pPr>
@@ -4531,7 +4501,7 @@
           <w:szCs w:val="24"/>
         </w:rPr>
       </w:pPr>
-      <w:bookmarkStart w:id="34" w:name="_Toc238639525"/>
+      <w:bookmarkStart w:id="51" w:name="_Toc238714896"/>
       <w:r>
         <w:t xml:space="preserve">Figure </w:t>
       </w:r>
@@ -4562,19 +4532,21 @@
       <w:r>
         <w:t>Strong and non-zero retention quickly disappears as the encounter becomes more hyperbolic.</w:t>
       </w:r>
-      <w:bookmarkEnd w:id="34"/>
+      <w:bookmarkEnd w:id="51"/>
     </w:p>
     <w:p>
       <w:pPr>
         <w:pStyle w:val="Heading2"/>
       </w:pPr>
-      <w:bookmarkStart w:id="35" w:name="_Toc238149743"/>
-      <w:bookmarkStart w:id="36" w:name="_Toc238639506"/>
+      <w:bookmarkStart w:id="52" w:name="_Toc238149743"/>
+      <w:bookmarkStart w:id="53" w:name="_Toc238714738"/>
+      <w:bookmarkStart w:id="54" w:name="_Toc238714829"/>
       <w:r>
         <w:t>3.3 Model Performance and Screening Use</w:t>
       </w:r>
-      <w:bookmarkEnd w:id="35"/>
-      <w:bookmarkEnd w:id="36"/>
+      <w:bookmarkEnd w:id="52"/>
+      <w:bookmarkEnd w:id="53"/>
+      <w:bookmarkEnd w:id="54"/>
     </w:p>
     <w:p>
       <w:pPr>
@@ -4703,14 +4675,16 @@
       <w:pPr>
         <w:pStyle w:val="Heading2"/>
       </w:pPr>
-      <w:bookmarkStart w:id="37" w:name="_Toc238149744"/>
-      <w:bookmarkStart w:id="38" w:name="_Toc238639507"/>
+      <w:bookmarkStart w:id="55" w:name="_Toc238149744"/>
+      <w:bookmarkStart w:id="56" w:name="_Toc238714739"/>
+      <w:bookmarkStart w:id="57" w:name="_Toc238714830"/>
       <w:r>
         <w:lastRenderedPageBreak/>
         <w:t>3.4 Overall Physical Parameter Importance</w:t>
       </w:r>
-      <w:bookmarkEnd w:id="37"/>
-      <w:bookmarkEnd w:id="38"/>
+      <w:bookmarkEnd w:id="55"/>
+      <w:bookmarkEnd w:id="56"/>
+      <w:bookmarkEnd w:id="57"/>
     </w:p>
     <w:p>
       <w:pPr>
@@ -4779,13 +4753,15 @@
       <w:pPr>
         <w:pStyle w:val="Heading2"/>
       </w:pPr>
-      <w:bookmarkStart w:id="39" w:name="_Toc238149745"/>
-      <w:bookmarkStart w:id="40" w:name="_Toc238639508"/>
+      <w:bookmarkStart w:id="58" w:name="_Toc238149745"/>
+      <w:bookmarkStart w:id="59" w:name="_Toc238714740"/>
+      <w:bookmarkStart w:id="60" w:name="_Toc238714831"/>
       <w:r>
         <w:t>3.5 Checking Physical Trends and Condition-Dependent Effects</w:t>
       </w:r>
-      <w:bookmarkEnd w:id="39"/>
-      <w:bookmarkEnd w:id="40"/>
+      <w:bookmarkEnd w:id="58"/>
+      <w:bookmarkEnd w:id="59"/>
+      <w:bookmarkEnd w:id="60"/>
     </w:p>
     <w:p>
       <w:pPr>
@@ -4850,7 +4826,7 @@
           <w:szCs w:val="28"/>
         </w:rPr>
       </w:pPr>
-      <w:bookmarkStart w:id="41" w:name="_Toc238639526"/>
+      <w:bookmarkStart w:id="61" w:name="_Toc238714897"/>
       <w:r>
         <w:rPr>
           <w:sz w:val="20"/>
@@ -4898,9 +4874,23 @@
           <w:sz w:val="20"/>
           <w:szCs w:val="20"/>
         </w:rPr>
-        <w:t>. BMF checks where one input changes at a time. Dots are available SPH simulation results and curves show tuned Gradient Boosting predictions with the other inputs fixed. Blue background shows the interpolation range, while red background shows the extrapolation range.</w:t>
-      </w:r>
-      <w:bookmarkEnd w:id="41"/>
+        <w:t xml:space="preserve">. </w:t>
+      </w:r>
+      <w:r>
+        <w:rPr>
+          <w:sz w:val="20"/>
+          <w:szCs w:val="20"/>
+        </w:rPr>
+        <w:t xml:space="preserve">(a-d) </w:t>
+      </w:r>
+      <w:r>
+        <w:rPr>
+          <w:sz w:val="20"/>
+          <w:szCs w:val="20"/>
+        </w:rPr>
+        <w:t>BMF checks where one input changes at a time. Dots are available SPH simulation results and curves show tuned Gradient Boosting predictions with the other inputs fixed. Blue background shows the interpolation range, while red background shows the extrapolation range.</w:t>
+      </w:r>
+      <w:bookmarkEnd w:id="61"/>
     </w:p>
     <w:p>
       <w:pPr>
@@ -5061,7 +5051,7 @@
           <w:szCs w:val="20"/>
         </w:rPr>
       </w:pPr>
-      <w:bookmarkStart w:id="42" w:name="_Toc238639527"/>
+      <w:bookmarkStart w:id="62" w:name="_Toc238714898"/>
       <w:r>
         <w:rPr>
           <w:sz w:val="20"/>
@@ -5146,8 +5136,8 @@
         </w:rPr>
         <w:t>.</w:t>
       </w:r>
-    </w:p>
-    <w:bookmarkEnd w:id="42"/>
+      <w:bookmarkEnd w:id="62"/>
+    </w:p>
     <w:p>
       <w:pPr>
         <w:spacing w:before="240" w:after="240" w:line="276" w:lineRule="auto"/>
@@ -5230,13 +5220,15 @@
       <w:pPr>
         <w:pStyle w:val="Heading2"/>
       </w:pPr>
-      <w:bookmarkStart w:id="43" w:name="_Toc238149746"/>
-      <w:bookmarkStart w:id="44" w:name="_Toc238639509"/>
+      <w:bookmarkStart w:id="63" w:name="_Toc238149746"/>
+      <w:bookmarkStart w:id="64" w:name="_Toc238714741"/>
+      <w:bookmarkStart w:id="65" w:name="_Toc238714832"/>
       <w:r>
         <w:t>3.6 Where the Model Can and Cannot Be Trusted</w:t>
       </w:r>
-      <w:bookmarkEnd w:id="43"/>
-      <w:bookmarkEnd w:id="44"/>
+      <w:bookmarkEnd w:id="63"/>
+      <w:bookmarkEnd w:id="64"/>
+      <w:bookmarkEnd w:id="65"/>
     </w:p>
     <w:p>
       <w:pPr>
@@ -5373,7 +5365,7 @@
           <w:szCs w:val="20"/>
         </w:rPr>
       </w:pPr>
-      <w:bookmarkStart w:id="45" w:name="_Toc238639528"/>
+      <w:bookmarkStart w:id="66" w:name="_Toc238714899"/>
       <w:r>
         <w:rPr>
           <w:sz w:val="20"/>
@@ -5444,13 +5436,13 @@
         </w:rPr>
         <w:t>Panels (a,d) show unique physical SPH simulation counts, panels (b,e) show mean held-out absolute error, and panels (c,f) show mean observed BMF with unique simulation counts overlaid. Grey indicates no SPH data. In the observed-BMF panels, light blue indicates mean observed BMF = 0, while other colours indicate mean observed BMF &gt; 0.</w:t>
       </w:r>
-      <w:bookmarkEnd w:id="45"/>
+      <w:bookmarkEnd w:id="66"/>
     </w:p>
     <w:p>
       <w:pPr>
         <w:jc w:val="both"/>
       </w:pPr>
-      <w:bookmarkStart w:id="46" w:name="_Toc238151451"/>
+      <w:bookmarkStart w:id="67" w:name="_Toc238151451"/>
       <w:r>
         <w:t xml:space="preserve">A specific </w:t>
       </w:r>
@@ -5496,7 +5488,7 @@
           <w:szCs w:val="20"/>
         </w:rPr>
       </w:pPr>
-      <w:bookmarkStart w:id="47" w:name="_Toc238639576"/>
+      <w:bookmarkStart w:id="68" w:name="_Toc238639576"/>
       <w:r>
         <w:rPr>
           <w:sz w:val="20"/>
@@ -5546,7 +5538,7 @@
         </w:rPr>
         <w:t xml:space="preserve">. </w:t>
       </w:r>
-      <w:bookmarkEnd w:id="46"/>
+      <w:bookmarkEnd w:id="67"/>
       <w:r>
         <w:rPr>
           <w:sz w:val="20"/>
@@ -5568,7 +5560,7 @@
         </w:rPr>
         <w:t>the sampled range but contain only one unique physical SPH simulation.</w:t>
       </w:r>
-      <w:bookmarkEnd w:id="47"/>
+      <w:bookmarkEnd w:id="68"/>
     </w:p>
     <w:tbl>
       <w:tblPr>
@@ -5966,13 +5958,15 @@
       <w:pPr>
         <w:pStyle w:val="Heading2"/>
       </w:pPr>
-      <w:bookmarkStart w:id="48" w:name="_Toc238149747"/>
-      <w:bookmarkStart w:id="49" w:name="_Toc238639510"/>
+      <w:bookmarkStart w:id="69" w:name="_Toc238149747"/>
+      <w:bookmarkStart w:id="70" w:name="_Toc238714742"/>
+      <w:bookmarkStart w:id="71" w:name="_Toc238714833"/>
       <w:r>
         <w:t>3.7 How the Model Supports SPH Decisions</w:t>
       </w:r>
-      <w:bookmarkEnd w:id="48"/>
-      <w:bookmarkEnd w:id="49"/>
+      <w:bookmarkEnd w:id="69"/>
+      <w:bookmarkEnd w:id="70"/>
+      <w:bookmarkEnd w:id="71"/>
     </w:p>
     <w:p>
       <w:pPr>
@@ -6017,13 +6011,15 @@
       <w:pPr>
         <w:pStyle w:val="Heading1"/>
       </w:pPr>
-      <w:bookmarkStart w:id="50" w:name="_Toc238149748"/>
-      <w:bookmarkStart w:id="51" w:name="_Toc238639511"/>
+      <w:bookmarkStart w:id="72" w:name="_Toc238149748"/>
+      <w:bookmarkStart w:id="73" w:name="_Toc238714743"/>
+      <w:bookmarkStart w:id="74" w:name="_Toc238714834"/>
       <w:r>
         <w:t>4. Discussion</w:t>
       </w:r>
-      <w:bookmarkEnd w:id="50"/>
-      <w:bookmarkEnd w:id="51"/>
+      <w:bookmarkEnd w:id="72"/>
+      <w:bookmarkEnd w:id="73"/>
+      <w:bookmarkEnd w:id="74"/>
     </w:p>
     <w:p>
       <w:pPr>
@@ -6171,25 +6167,29 @@
       <w:pPr>
         <w:pStyle w:val="Heading1"/>
       </w:pPr>
-      <w:bookmarkStart w:id="52" w:name="_Toc238149749"/>
-      <w:bookmarkStart w:id="53" w:name="_Toc238639512"/>
+      <w:bookmarkStart w:id="75" w:name="_Toc238149749"/>
+      <w:bookmarkStart w:id="76" w:name="_Toc238714744"/>
+      <w:bookmarkStart w:id="77" w:name="_Toc238714835"/>
       <w:r>
         <w:t>5. Conclusions, Limitations and Future Work</w:t>
       </w:r>
-      <w:bookmarkEnd w:id="52"/>
-      <w:bookmarkEnd w:id="53"/>
+      <w:bookmarkEnd w:id="75"/>
+      <w:bookmarkEnd w:id="76"/>
+      <w:bookmarkEnd w:id="77"/>
     </w:p>
     <w:p>
       <w:pPr>
         <w:pStyle w:val="Heading2"/>
       </w:pPr>
-      <w:bookmarkStart w:id="54" w:name="_Toc238149750"/>
-      <w:bookmarkStart w:id="55" w:name="_Toc238639513"/>
+      <w:bookmarkStart w:id="78" w:name="_Toc238149750"/>
+      <w:bookmarkStart w:id="79" w:name="_Toc238714745"/>
+      <w:bookmarkStart w:id="80" w:name="_Toc238714836"/>
       <w:r>
         <w:t>5.1 Conclusions and Answers to the Research Questions</w:t>
       </w:r>
-      <w:bookmarkEnd w:id="54"/>
-      <w:bookmarkEnd w:id="55"/>
+      <w:bookmarkEnd w:id="78"/>
+      <w:bookmarkEnd w:id="79"/>
+      <w:bookmarkEnd w:id="80"/>
     </w:p>
     <w:p>
       <w:pPr>
@@ -6387,20 +6387,22 @@
         <w:jc w:val="both"/>
       </w:pPr>
       <w:r>
-        <w:t>Overall, the project shows that tidal-disruption outcomes depend on interacting physical conditions rather than one universal ranking of parameters. Machine learning makes the existing SPH archive faster to explore, shows where predictions are well supported, and highlights where new simulations would be most useful. It complements SPH rather than replacing the simulation physics.</w:t>
+        <w:t xml:space="preserve">Overall, the project shows that tidal-disruption outcomes depend on interacting physical conditions rather than one universal ranking of parameters. Machine learning makes the existing SPH archive faster to explore, shows where predictions are well supported, and highlights where new simulations would be most useful. </w:t>
       </w:r>
     </w:p>
     <w:p>
       <w:pPr>
         <w:pStyle w:val="Heading2"/>
       </w:pPr>
-      <w:bookmarkStart w:id="56" w:name="_Toc238149751"/>
-      <w:bookmarkStart w:id="57" w:name="_Toc238639514"/>
+      <w:bookmarkStart w:id="81" w:name="_Toc238149751"/>
+      <w:bookmarkStart w:id="82" w:name="_Toc238714746"/>
+      <w:bookmarkStart w:id="83" w:name="_Toc238714837"/>
       <w:r>
         <w:t>5.2 Limitations</w:t>
       </w:r>
-      <w:bookmarkEnd w:id="56"/>
-      <w:bookmarkEnd w:id="57"/>
+      <w:bookmarkEnd w:id="81"/>
+      <w:bookmarkEnd w:id="82"/>
+      <w:bookmarkEnd w:id="83"/>
     </w:p>
     <w:p>
       <w:pPr>
@@ -6424,13 +6426,15 @@
       <w:pPr>
         <w:pStyle w:val="Heading2"/>
       </w:pPr>
-      <w:bookmarkStart w:id="58" w:name="_Toc238149752"/>
-      <w:bookmarkStart w:id="59" w:name="_Toc238639515"/>
+      <w:bookmarkStart w:id="84" w:name="_Toc238149752"/>
+      <w:bookmarkStart w:id="85" w:name="_Toc238714747"/>
+      <w:bookmarkStart w:id="86" w:name="_Toc238714838"/>
       <w:r>
         <w:t>5.3 Future Work</w:t>
       </w:r>
-      <w:bookmarkEnd w:id="58"/>
-      <w:bookmarkEnd w:id="59"/>
+      <w:bookmarkEnd w:id="84"/>
+      <w:bookmarkEnd w:id="85"/>
+      <w:bookmarkEnd w:id="86"/>
     </w:p>
     <w:p>
       <w:pPr>
@@ -6466,7 +6470,7 @@
         <w:jc w:val="both"/>
       </w:pPr>
       <w:r>
-        <w:t>It would be more robust to test the model on whole new SPH runs created after training rather than repeatedly dividing the current library. A practical future workflow would then add validated new SPH outcomes to the training dataset and periodically retrain the surrogate model, allowing newly simulated regions to improve subsequent predictions. Training the tuned Gradient Boosting model takes approximately 7 seconds on the macOS arm64 machine used in this study for the current 407-row training dataset, so repeated retraining would be computationally inexpensive.</w:t>
+        <w:t>It would be more robust to test the model on whole new SPH runs created after training rather than repeatedly dividing the current library. A practical future workflow would then add validated new SPH outcomes to the training dataset and periodically retrain the surrogate model, allowing newly simulated regions to improve predictions. Training the tuned Gradient Boosting model takes approximately 7 seconds on the macOS arm64 machine used in this study for the current 407-row training dataset, so repeated retraining would be computationally inexpensive.</w:t>
       </w:r>
     </w:p>
     <w:p>
@@ -6483,8 +6487,7 @@
       <w:r>
         <w:t>. Stronger physical limitations, multi-output prediction, and uncertainty estimates are possible additional enhancements.</w:t>
       </w:r>
-      <w:bookmarkStart w:id="60" w:name="_Toc238149753"/>
-      <w:bookmarkStart w:id="61" w:name="_Toc238639516"/>
+      <w:bookmarkStart w:id="87" w:name="_Toc238149753"/>
     </w:p>
     <w:p>
       <w:pPr>
@@ -6496,11 +6499,14 @@
       <w:pPr>
         <w:pStyle w:val="Heading1"/>
       </w:pPr>
+      <w:bookmarkStart w:id="88" w:name="_Toc238714748"/>
+      <w:bookmarkStart w:id="89" w:name="_Toc238714839"/>
       <w:r>
         <w:t>References</w:t>
       </w:r>
-      <w:bookmarkEnd w:id="60"/>
-      <w:bookmarkEnd w:id="61"/>
+      <w:bookmarkEnd w:id="87"/>
+      <w:bookmarkEnd w:id="88"/>
+      <w:bookmarkEnd w:id="89"/>
     </w:p>
     <w:p>
       <w:pPr>
@@ -6780,14 +6786,16 @@
       <w:pPr>
         <w:pStyle w:val="Heading1"/>
       </w:pPr>
-      <w:bookmarkStart w:id="62" w:name="_Toc238149754"/>
-      <w:bookmarkStart w:id="63" w:name="_Toc238639517"/>
+      <w:bookmarkStart w:id="90" w:name="_Toc238149754"/>
+      <w:bookmarkStart w:id="91" w:name="_Toc238714749"/>
+      <w:bookmarkStart w:id="92" w:name="_Toc238714840"/>
       <w:r>
         <w:lastRenderedPageBreak/>
         <w:t>Appendix A. Supporting Model Results</w:t>
       </w:r>
-      <w:bookmarkEnd w:id="62"/>
-      <w:bookmarkEnd w:id="63"/>
+      <w:bookmarkEnd w:id="90"/>
+      <w:bookmarkEnd w:id="91"/>
+      <w:bookmarkEnd w:id="92"/>
     </w:p>
     <w:p>
       <w:pPr>
@@ -8015,7 +8023,7 @@
         </w:rPr>
         <w:t xml:space="preserve"> </w:t>
       </w:r>
-      <w:bookmarkStart w:id="64" w:name="_Toc238149755"/>
+      <w:bookmarkStart w:id="93" w:name="_Toc238149755"/>
       <w:r>
         <w:rPr>
           <w:noProof w:val="0"/>
@@ -10945,9 +10953,10 @@
       <w:pPr>
         <w:pStyle w:val="Heading1"/>
       </w:pPr>
-      <w:bookmarkStart w:id="65" w:name="_Toc238149756"/>
-      <w:bookmarkStart w:id="66" w:name="_Toc238639518"/>
-      <w:bookmarkEnd w:id="64"/>
+      <w:bookmarkStart w:id="94" w:name="_Toc238149756"/>
+      <w:bookmarkStart w:id="95" w:name="_Toc238714750"/>
+      <w:bookmarkStart w:id="96" w:name="_Toc238714841"/>
+      <w:bookmarkEnd w:id="93"/>
       <w:r>
         <w:t xml:space="preserve">Appendix </w:t>
       </w:r>
@@ -10957,8 +10966,9 @@
       <w:r>
         <w:t>. AI acknowledgement Statement</w:t>
       </w:r>
-      <w:bookmarkEnd w:id="65"/>
-      <w:bookmarkEnd w:id="66"/>
+      <w:bookmarkEnd w:id="94"/>
+      <w:bookmarkEnd w:id="95"/>
+      <w:bookmarkEnd w:id="96"/>
     </w:p>
     <w:p>
       <w:pPr>

</xml_diff>

<commit_message>
docs: update pdf final report minor styling formatting
</commit_message>
<xml_diff>
--- a/deliverables/nny124-final-report.docx
+++ b/deliverables/nny124-final-report.docx
@@ -4456,9 +4456,9 @@
       <w:r>
         <w:lastRenderedPageBreak/>
         <w:drawing>
-          <wp:inline distT="0" distB="0" distL="0" distR="0" wp14:anchorId="2102FAF4" wp14:editId="5A2173B1">
-            <wp:extent cx="3680750" cy="2552145"/>
-            <wp:effectExtent l="0" t="0" r="2540" b="635"/>
+          <wp:inline distT="0" distB="0" distL="0" distR="0" wp14:anchorId="2102FAF4" wp14:editId="1F85BE6D">
+            <wp:extent cx="3526972" cy="2445519"/>
+            <wp:effectExtent l="0" t="0" r="3810" b="5715"/>
             <wp:docPr id="883879966" name="Picture 1"/>
             <wp:cNvGraphicFramePr>
               <a:graphicFrameLocks xmlns:a="http://schemas.openxmlformats.org/drawingml/2006/main" noChangeAspect="1"/>
@@ -4479,7 +4479,7 @@
                   <pic:spPr>
                     <a:xfrm>
                       <a:off x="0" y="0"/>
-                      <a:ext cx="3722642" cy="2581192"/>
+                      <a:ext cx="3574036" cy="2478152"/>
                     </a:xfrm>
                     <a:prstGeom prst="rect">
                       <a:avLst/>
@@ -5006,9 +5006,9 @@
       <w:r>
         <w:lastRenderedPageBreak/>
         <w:drawing>
-          <wp:inline distT="0" distB="0" distL="0" distR="0" wp14:anchorId="0EDD68A6" wp14:editId="1AF25E39">
-            <wp:extent cx="5619807" cy="2689412"/>
-            <wp:effectExtent l="0" t="0" r="0" b="3175"/>
+          <wp:inline distT="0" distB="0" distL="0" distR="0" wp14:anchorId="0EDD68A6" wp14:editId="583DAF68">
+            <wp:extent cx="4561609" cy="2091856"/>
+            <wp:effectExtent l="0" t="0" r="0" b="3810"/>
             <wp:docPr id="516701728" name="Picture 1"/>
             <wp:cNvGraphicFramePr>
               <a:graphicFrameLocks xmlns:a="http://schemas.openxmlformats.org/drawingml/2006/main" noChangeAspect="1"/>
@@ -5029,7 +5029,7 @@
                   <pic:spPr>
                     <a:xfrm>
                       <a:off x="0" y="0"/>
-                      <a:ext cx="5633725" cy="2696072"/>
+                      <a:ext cx="4601258" cy="2110038"/>
                     </a:xfrm>
                     <a:prstGeom prst="rect">
                       <a:avLst/>
@@ -5287,7 +5287,6 @@
         <w:jc w:val="both"/>
       </w:pPr>
       <w:r>
-        <w:lastRenderedPageBreak/>
         <w:t>Because the model depends on input combinations, a case may fall inside the range of each individual input and yet</w:t>
       </w:r>
       <w:r>
@@ -5319,6 +5318,7 @@
         <w:jc w:val="center"/>
       </w:pPr>
       <w:r>
+        <w:lastRenderedPageBreak/>
         <w:drawing>
           <wp:inline distT="0" distB="0" distL="0" distR="0" wp14:anchorId="6A9540B4" wp14:editId="327DB7D4">
             <wp:extent cx="5943600" cy="3055620"/>
@@ -5947,11 +5947,7 @@
         <w:t>∞</w:t>
       </w:r>
       <w:r>
-        <w:t xml:space="preserve"> = 1.0 km/s case by 0.0724 (7.2 percentage points). The opposite-sign errors in two neighbouring cells with minimal SPH coverage indicate that the local velocity relationship is </w:t>
-      </w:r>
-      <w:r>
-        <w:lastRenderedPageBreak/>
-        <w:t>not reliably learned in this region. Therefore, being within the overall sampled input range does not guarantee a reliable prediction, and additional SPH simulations would be useful in such sparsely sampled regions.</w:t>
+        <w:t xml:space="preserve"> = 1.0 km/s case by 0.0724 (7.2 percentage points). The opposite-sign errors in two neighbouring cells with minimal SPH coverage indicate that the local velocity relationship is not reliably learned in this region. Therefore, being within the overall sampled input range does not guarantee a reliable prediction, and additional SPH simulations would be useful in such sparsely sampled regions.</w:t>
       </w:r>
     </w:p>
     <w:p>
@@ -5974,6 +5970,7 @@
         <w:jc w:val="both"/>
       </w:pPr>
       <w:r>
+        <w:lastRenderedPageBreak/>
         <w:t>So,</w:t>
       </w:r>
       <w:r>
@@ -6069,11 +6066,7 @@
         <w:t xml:space="preserve">Because of this, the use of ML is still restricted, but it still has the capability to filter well-supported input combinations, identify regimes, and even uncover scenarios that could give promising retained mass. </w:t>
       </w:r>
       <w:r>
-        <w:t xml:space="preserve">However, further conditions such as long-term debris survivability or the precise </w:t>
-      </w:r>
-      <w:r>
-        <w:lastRenderedPageBreak/>
-        <w:t>fragments shapes and distribution cannot be be decided from the BMF score alone. This is evident from the periapsis-velocity example at 1.4 Mars radii previously discussed in section 3.6, even though the input values are next to each other and stillf all within the training ranges, areas with minimum simulation coverage is still associate with larger held-out errors.</w:t>
+        <w:t>However, further conditions such as long-term debris survivability or the precise fragments shapes and distribution cannot be be decided from the BMF score alone. This is evident from the periapsis-velocity example at 1.4 Mars radii previously discussed in section 3.6, even though the input values are next to each other and stillf all within the training ranges, areas with minimum simulation coverage is still associate with larger held-out errors.</w:t>
       </w:r>
     </w:p>
     <w:p>
@@ -6082,6 +6075,7 @@
         <w:jc w:val="both"/>
       </w:pPr>
       <w:r>
+        <w:lastRenderedPageBreak/>
         <w:t xml:space="preserve">Different questions are addressed by the matching and ablation analysis. Although matching cases demonstrate that </w:t>
       </w:r>
       <w:r>
@@ -6305,41 +6299,44 @@
         <w:jc w:val="both"/>
       </w:pPr>
       <w:r>
+        <w:t>Q</w:t>
+      </w:r>
+      <w:r>
+        <w:t>uestion 3:</w:t>
+      </w:r>
+      <w:r>
+        <w:t xml:space="preserve"> </w:t>
+      </w:r>
+      <w:r>
+        <w:t>Can machine-learning models predict outcomes within the sampled data while showing when a prediction should or should not be trusted</w:t>
+      </w:r>
+      <w:r>
+        <w:t xml:space="preserve">? </w:t>
+      </w:r>
+      <w:r>
+        <w:t xml:space="preserve">Yes, in cases where the SPH archive supports comparable input combinations. The primary tuned Gradient Boosting model using the original </w:t>
+      </w:r>
+      <w:r>
+        <w:t>scenario</w:t>
+      </w:r>
+      <w:r>
+        <w:t xml:space="preserve"> inputs obtains a grouped cross-validated R² of </w:t>
+      </w:r>
+      <w:r>
+        <w:t>0.9328</w:t>
+      </w:r>
+      <w:r>
+        <w:t xml:space="preserve">, MAE of </w:t>
+      </w:r>
+      <w:r>
+        <w:t>0.0277</w:t>
+      </w:r>
+      <w:r>
+        <w:t xml:space="preserve">, and </w:t>
+      </w:r>
+      <w:r>
         <w:lastRenderedPageBreak/>
-        <w:t>Q</w:t>
-      </w:r>
-      <w:r>
-        <w:t>uestion 3:</w:t>
-      </w:r>
-      <w:r>
-        <w:t xml:space="preserve"> </w:t>
-      </w:r>
-      <w:r>
-        <w:t>Can machine-learning models predict outcomes within the sampled data while showing when a prediction should or should not be trusted</w:t>
-      </w:r>
-      <w:r>
-        <w:t xml:space="preserve">? </w:t>
-      </w:r>
-      <w:r>
-        <w:t xml:space="preserve">Yes, in cases where the SPH archive supports comparable input combinations. The primary tuned Gradient Boosting model using the original </w:t>
-      </w:r>
-      <w:r>
-        <w:t>scenario</w:t>
-      </w:r>
-      <w:r>
-        <w:t xml:space="preserve"> inputs obtains a grouped cross-validated R² of </w:t>
-      </w:r>
-      <w:r>
-        <w:t>0.9328</w:t>
-      </w:r>
-      <w:r>
-        <w:t xml:space="preserve">, MAE of </w:t>
-      </w:r>
-      <w:r>
-        <w:t>0.0277</w:t>
-      </w:r>
-      <w:r>
-        <w:t xml:space="preserve">, and RMSE of </w:t>
+        <w:t xml:space="preserve">RMSE of </w:t>
       </w:r>
       <w:r>
         <w:t>0.04</w:t>
@@ -6451,11 +6448,7 @@
         <w:t xml:space="preserve">comparison at other masses and resolutions while keeping processing choices fixed. </w:t>
       </w:r>
       <w:r>
-        <w:t xml:space="preserve">It would be possible to determine whether the stronger spin disparities </w:t>
-      </w:r>
-      <w:r>
-        <w:lastRenderedPageBreak/>
-        <w:t>also occur in other groups by reporting the BMF range together with the actual BMF values and the number of independent simulations</w:t>
+        <w:t>It would be possible to determine whether the stronger spin disparities also occur in other groups by reporting the BMF range together with the actual BMF values and the number of independent simulations</w:t>
       </w:r>
       <w:r>
         <w:t>.</w:t>
@@ -6470,7 +6463,11 @@
         <w:jc w:val="both"/>
       </w:pPr>
       <w:r>
-        <w:t>It would be more robust to test the model on whole new SPH runs created after training rather than repeatedly dividing the current library. A practical future workflow would then add validated new SPH outcomes to the training dataset and periodically retrain the surrogate model, allowing newly simulated regions to improve predictions. Training the tuned Gradient Boosting model takes approximately 7 seconds on the macOS arm64 machine used in this study for the current 407-row training dataset, so repeated retraining would be computationally inexpensive.</w:t>
+        <w:t xml:space="preserve">It would be more robust to test the model on whole new SPH runs created after training rather than repeatedly dividing the current library. A practical future workflow would then add validated new </w:t>
+      </w:r>
+      <w:r>
+        <w:lastRenderedPageBreak/>
+        <w:t>SPH outcomes to the training dataset and periodically retrain the surrogate model, allowing newly simulated regions to improve predictions. Training the tuned Gradient Boosting model takes approximately 7 seconds on the macOS arm64 machine used in this study for the current 407-row training dataset, so repeated retraining would be computationally inexpensive.</w:t>
       </w:r>
     </w:p>
     <w:p>
@@ -6633,7 +6630,6 @@
         <w:rPr>
           <w:color w:val="000000" w:themeColor="text1"/>
         </w:rPr>
-        <w:lastRenderedPageBreak/>
         <w:t>Kegerreis, J. A., Lissauer, J. J., Eke, V. R., Sandnes, T. D. &amp; Elphic, R. C. (2024). Origin of Mars’s moons by disruptive partial capture of an asteroid. Icarus, Article 116337. doi:10.1016/j.icarus.2024.116337.</w:t>
       </w:r>
     </w:p>
@@ -6666,6 +6662,7 @@
         <w:rPr>
           <w:color w:val="000000" w:themeColor="text1"/>
         </w:rPr>
+        <w:lastRenderedPageBreak/>
         <w:t>More, S., Kravtsov, A. V., Dalal, N. &amp; Gottlöber, S. (2011). The overdensity and masses of the friends-of-friends halos and universality of the halo mass function. The Astrophysical Journal Supplement Series, 195(1), 4. doi:10.1088/0067-0049/195/1/4.</w:t>
       </w:r>
     </w:p>

</xml_diff>